<commit_message>
Remove human evaluation and document simplified studio tests
</commit_message>
<xml_diff>
--- a/paper/manuscript.inha.docx
+++ b/paper/manuscript.inha.docx
@@ -76,7 +76,7 @@
         <w:t xml:space="preserve">요약: </w:t>
       </w:r>
       <w:r>
-        <w:t>이미지 편집 시스템에서 사용자는 옷, 배경, 액세서리를 여러 차례 수정하면서 얼굴은 유지되기를 기대한다. 그러나 앞선 생성물을 다음 입력으로 사용하는 방식에서는 요청하지 않은 얼굴 변화가 누적될 수 있다. 본 연구는 이러한 변화를 최초 원본에 누적 요구사항을 적용하는 방식과 비교하고, 원본과의 수치적 거리 및 사람이 판단하는 열화·보존의 관계를 탐색한다. 초기 실험은 합성 인물 6명과 순차 편집 7경로를 포함하며, 후속 실험은 이 중 3명의 인물에 대해 98개 출력을 생성하였다. 후속 최종 이미지 12개에는 자동 지표, 한 명의 사람 평가, 사람 결과를 제공하지 않은 별도 AI 평가를 연결하였다. 세 인물의 후속 비교에서 일괄 편집은 순차 편집보다 평균 얼굴 LPIPS가 낮았고, 사람은 일괄 결과 6개 모두와 순차 결과 6개 중 1개의 얼굴이 유지되었다고 평가하였다. 다만 AI와 사람의 열화 등급 정확 일치는 4/12에 그쳤다. 별도의 FLUX.2 Klein 4B 실험에서도 두 시드 평균 얼굴 LPIPS는 일괄 0.091313, 순차 0.124455였으나, 추가 피부 내부 영역 분석에서는 원시 MAE의 우열이 달라졌다. 따라서 원본 기반 생성은 본 조건에서 유망한 전략이지만, 원본 거리 감소를 곧바로 피부 열화 감소나 보편적인 얼굴 보존 성공으로 해석할 수 없다. 결과를 바탕으로 최초 원본과 누적 편집 상태를 분리하여 관리하는 로컬 편집기를 구현하였다.</w:t>
+        <w:t>이미지 편집 시스템에서 앞선 생성물을 다음 입력으로 사용하면 요청하지 않은 얼굴 변화가 누적될 수 있다. 본 연구는 순차 편집과 최초 원본에 누적 요구사항을 적용하는 재생성을 비교한다. 초기 실험은 합성 인물 6명과 순차 7경로, 후속 통제 실험은 기존 3인물의 98개 출력을 포함한다. 얼굴 MAE·SSIM·LPIPS, 피부 내부 영역 및 별도 AI 등급으로 분석하였다. 세 인물의 후속 비교에서 일괄 편집의 평균 얼굴 LPIPS가 순차보다 낮았다. 별도 FLUX.2 Klein 4B 실험의 두 시드 평균 LPIPS는 일괄 0.091313, 순차 0.124455였으나 피부 원시 MAE는 일부 설정에서 반대 방향이었다. 최초 원본과 누적 요구를 분리하는 웹 편집기를 구현하고, 실제 생성·설정 저장·버전 복원 및 알려진 요청 35개의 회귀 검사를 수행하였다. 이 결과는 제한된 조건에서의 입력 정책 및 구현 검증이며 지각적 품질이나 보편적인 얼굴 보존의 검증을 의미하지 않는다.</w:t>
       </w:r>
     </w:p>
     <w:p>
@@ -90,7 +90,7 @@
         <w:t xml:space="preserve">Abstract: </w:t>
       </w:r>
       <w:r>
-        <w:t>Sequential image editing may change facial regions even when the requested modifications concern clothing, backgrounds, or accessories. We compare feeding previous outputs into subsequent edits with regenerating from the original image and accumulated requirements. The initial study includes six synthetic identities and seven sequential trajectories. Follow-up controls produced 98 outputs from three of these identities; 12 selected final images were assessed using automatic metrics, one human pilot rater, and a separate AI session without access to human ratings. Batch editing yielded lower mean facial LPIPS for all three identities. The human rater judged facial appearance preserved in all six batch outputs and one of six sequential outputs, while exact human–AI degradation agreement was only 4/12. In a separate FLUX.2 Klein 4B comparison with two seeds, mean facial LPIPS was 0.091313 for batch editing and 0.124455 for sequential editing. Post-hoc skin-region analysis, however, reversed the ranking under raw MAE in some settings. These exploratory findings support original-referenced generation as a promising workflow under the tested conditions, while distinguishing reference distance, skin degradation, appearance preservation, and instruction fulfillment. A local editor implements this workflow by storing the original image separately from accumulated editing requirements.</w:t>
+        <w:t>We compare sequential image editing with regeneration from the original image and accumulated requirements. Experiments include six synthetic identities, 98 follow-up outputs from three identities, automatic image metrics and separate AI ratings. Batch editing produced lower mean facial LPIPS in the tested follow-up comparisons. A local FLUX.2 Klein 4B comparison yielded mean LPIPS of 0.091313 for batch and 0.124455 for sequential editing, while raw skin MAE reversed the ranking in some settings. A web editor implemented the workflow. Recorded checks covered real generation, state changes, version restoration and 35 known request regression cases. These exploratory results do not establish general perceptual quality or user satisfaction.</w:t>
       </w:r>
     </w:p>
     <w:p>
@@ -139,7 +139,7 @@
         <w:jc w:val="both"/>
       </w:pPr>
       <w:r>
-        <w:t>다중 턴 이미지 편집과 내용 보존은 기존 연구에서도 다뤄진 문제다[1–3]. 따라서 본 연구는 누적 변화 자체를 최초로 발견하거나 새로운 생성 모델을 제안한다고 주장하지 않는다. 대신 제한된 실제 편집 과정에서 입력 전달 방식, 측정 영역, 자동 지표, 사람·AI 판정 사이에 어떤 차이가 나타나는지 확인한다. 특히 색과 위치의 변화가 포함된 원본 거리를 피부 열화의 직접 측정값으로 취급할 때 발생하는 해석 문제에 초점을 둔다.</w:t>
+        <w:t>다중 턴 이미지 편집과 내용 보존은 기존 연구에서도 다뤄진 문제다[1–3]. 따라서 본 연구는 누적 변화 자체를 최초로 발견하거나 새로운 생성 모델을 제안한다고 주장하지 않는다. 대신 제한된 실제 편집 과정에서 입력 전달 방식, 측정 영역, 자동 지표, AI 판정 사이에 어떤 차이가 나타나는지 확인한다. 특히 색과 위치의 변화가 포함된 원본 거리를 피부 열화의 직접 측정값으로 취급할 때 발생하는 해석 문제에 초점을 둔다.</w:t>
       </w:r>
     </w:p>
     <w:p>
@@ -147,7 +147,7 @@
         <w:jc w:val="both"/>
       </w:pPr>
       <w:r>
-        <w:t>연구 질문은 다음과 같다. 첫째, 이전 결과를 입력으로 쓰는 순차 편집과 최초 원본을 참조하는 생성은 얼굴 원본 거리에서 어떤 차이를 보이는가? 둘째, 그 차이는 편집 순서, 무변경 반복, 측정 영역 및 위치 보정에 따라 유지되는가? 셋째, 자동 지표와 AI 등급은 사람이 판단한 열화 및 보존과 어느 정도 일치하는가? 넷째, 관찰된 결과를 사용자의 연속 요청을 처리하는 시스템 설계에 어떻게 반영할 수 있는가?</w:t>
+        <w:t>연구 질문은 다음과 같다. 첫째, 이전 결과를 입력으로 쓰는 순차 편집과 최초 원본을 참조하는 생성은 얼굴 원본 거리에서 어떤 차이를 보이는가? 둘째, 그 차이는 편집 순서, 무변경 반복, 측정 영역 및 위치 보정에 따라 유지되는가? 셋째, 얼굴 전체 거리와 피부 내부 지표의 비교 방향은 일치하는가? 넷째, 관찰된 결과를 사용자의 연속 요청을 처리하는 시스템 설계에 어떻게 반영할 수 있는가?</w:t>
       </w:r>
     </w:p>
     <w:p>
@@ -155,7 +155,7 @@
         <w:jc w:val="both"/>
       </w:pPr>
       <w:r>
-        <w:t>본 연구의 기여는 세 가지다. 입력 정책과 후속 통제 실험을 연결한 탐색적 기록을 제시하고, 거리·열화·보존·요청 이행을 분리하여 결과를 해석하며, 피부 내부 영역에서 기존 결론에 불리한 결과까지 포함하는 민감도 분석을 제공한다. 표본 규모와 평가자의 독립성에는 제한이 있으므로 결과는 가설 형성 및 후속 실험 설계의 근거로 사용한다.</w:t>
+        <w:t>본 연구의 기여는 세 가지다. 입력 정책과 후속 통제 실험을 연결한 탐색적 기록을 제시하고, 거리·열화·보존·요청 이행을 분리하여 결과를 해석하며, 피부 내부 영역에서 기존 결론에 불리한 결과까지 포함하는 민감도 분석을 제공한다. 표본 규모와 생성 조건에는 제한이 있으므로 결과는 가설 형성 및 후속 실험 설계의 근거로 사용한다.</w:t>
       </w:r>
     </w:p>
     <w:p>
@@ -179,7 +179,7 @@
         <w:jc w:val="both"/>
       </w:pPr>
       <w:r>
-        <w:t>GIE-Bench는 지시 이행과 보존 평가를 구분하며[4], EdiVal-Agent는 지시 이행, 내용 일관성, 시각 품질을 다차원으로 평가한다[3]. 본 연구에서도 얼굴 열화 등급과 얼굴 유지 여부를 별도 항목으로 유지한다. 요청한 편집의 달성 여부 역시 원본 거리로 대체하지 않는다.</w:t>
+        <w:t>GIE-Bench는 지시 이행과 보존 평가를 구분하며[4], EdiVal-Agent는 지시 이행, 내용 일관성, 시각 품질을 다차원으로 평가한다[3]. 본 연구는 자동 거리와 AI 열화 등급을 구분한다. 요청한 편집의 달성 여부 역시 원본 거리로 대체하지 않는다.</w:t>
       </w:r>
     </w:p>
     <w:p>
@@ -211,7 +211,7 @@
         <w:jc w:val="both"/>
       </w:pPr>
       <w:r>
-        <w:t>인물 P01–P06은 합성 이미지다. 초기 순차 편집은 6명에 대해 7경로를 구성하며 P03에 두 경로가 있다. 정책 비교 기록에는 20경로와 확인된 198단계 출력이 있지만, 일부 경로가 동일한 출력을 공유하므로 이를 198개의 독립 관측으로 취급하지 않는다. 완료된 10단계 경로는 19개다. 확장 계획의 신규 27회 중 25회가 성공했고, P05의 1회 개입 경로 9단계는 도구 차단, 10단계는 미실행으로 기록했다. 실패를 임의의 품질 점수로 대체하지 않았다. 단계별 자동 분석과 최종 사람 평가의 범위도 서로 다르다.</w:t>
+        <w:t>인물 P01–P06은 합성 이미지다. 초기 순차 편집은 6명에 대해 7경로를 구성하며 P03에 두 경로가 있다. 정책 비교 기록에는 20경로와 확인된 198단계 출력이 있지만, 일부 경로가 동일한 출력을 공유하므로 이를 198개의 독립 관측으로 취급하지 않는다. 완료된 10단계 경로는 19개다. 확장 계획의 신규 27회 중 25회가 성공했고, P05의 1회 개입 경로 9단계는 도구 차단, 10단계는 미실행으로 기록했다. 실패를 임의의 품질 점수로 대체하지 않았다. 단계별 자동 분석과 AI 평가의 범위는 서로 다르다.</w:t>
       </w:r>
     </w:p>
     <w:p>
@@ -311,7 +311,7 @@
                 <w:b/>
                 <w:sz w:val="16"/>
               </w:rPr>
-              <w:t>사람·AI 평가 범위</w:t>
+              <w:t>AI 평가 범위</w:t>
             </w:r>
           </w:p>
         </w:tc>
@@ -370,7 +370,7 @@
                 <w:b w:val="0"/>
                 <w:sz w:val="16"/>
               </w:rPr>
-              <w:t>AI 고유 111개·두 세션; 사람 최종 고유 16개</w:t>
+              <w:t>AI 고유 111개·두 세션</w:t>
             </w:r>
           </w:p>
         </w:tc>
@@ -429,7 +429,7 @@
                 <w:b w:val="0"/>
                 <w:sz w:val="16"/>
               </w:rPr>
-              <w:t>선정 최종 12개에 사람 1명과 별도 AI 1세션</w:t>
+              <w:t>선정 최종 12개에 별도 AI 1세션</w:t>
             </w:r>
           </w:p>
         </w:tc>
@@ -488,7 +488,7 @@
                 <w:b w:val="0"/>
                 <w:sz w:val="16"/>
               </w:rPr>
-              <w:t>자동 지표; 독립 사람·AI 등급 없음</w:t>
+              <w:t>자동 지표; 독립 AI 등급 없음</w:t>
             </w:r>
           </w:p>
         </w:tc>
@@ -578,7 +578,7 @@
         <w:jc w:val="both"/>
       </w:pPr>
       <w:r>
-        <w:t>초기 수치 분석 113개 중 두 개는 개입 전 후보이며 AI 평가 111개에 포함되지 않는다. 후속 12개는 98개의 부분집합이다. 원본 대 원본 대조, 재평가 문항, 개발용 생성 이미지는 독립 연구 표본으로 더하지 않는다. 초기 생성기는 도구 기반 이미지 생성 시스템이며 정확한 백엔드 모델 버전과 시드는 확보되지 않았다. 따라서 이 부분의 재현성은 보존된 입력·출력·프롬프트·분석 기록에 한정된다.</w:t>
+        <w:t>초기 수치 분석 113개 중 두 개는 개입 전 후보이며 AI 평가 111개에 포함되지 않는다. 후속 12개는 98개의 부분집합이다. 원본 대 원본 대조, 개발용 생성 이미지는 독립 연구 표본으로 더하지 않는다. 초기 생성기는 도구 기반 이미지 생성 시스템이며 정확한 백엔드 모델 버전과 시드는 확보되지 않았다. 따라서 이 부분의 재현성은 보존된 입력·출력·프롬프트·분석 기록에 한정된다.</w:t>
       </w:r>
     </w:p>
     <w:p>
@@ -650,7 +650,7 @@
         <w:pStyle w:val="Heading2"/>
       </w:pPr>
       <w:r>
-        <w:t>4. 사람 평가와 AI 평가</w:t>
+        <w:t>4. AI 평가</w:t>
       </w:r>
     </w:p>
     <w:p>
@@ -658,15 +658,7 @@
         <w:jc w:val="both"/>
       </w:pPr>
       <w:r>
-        <w:t>얼굴 열화 항목은 인위적인 피부 무늬·형태 왜곡을 대상으로 하며 원래의 주름·점과 조명·색조·배치 변화는 구별한다. 등급은 없음(0), 약함(1), 뚜렷함(2), 심함(3)의 순서 척도로 평가하고, 얼굴 보존은 미유지(0), 부분 유지(1), 유지(2)로 구분한다. 초기 최종 이미지 16개와 후속 12개는 한 명의 예비 평가에 근거한다. 후속 평가자는 연구 결과와 가설에 노출되었으며, 두 열화 응답을 다시 확인한 뒤 각각 0에서 1로 변경하였다. 최초 응답과 재평가 기록은 보존하였고 본문은 재평가 반영 값을 사용한다. 재평가를 독립 관측으로 취급하지 않는다.</w:t>
-      </w:r>
-    </w:p>
-    <w:p>
-      <w:pPr>
-        <w:jc w:val="both"/>
-      </w:pPr>
-      <w:r>
-        <w:t>초기 AI 평가는 같은 기반 모델의 두 세션이 고유 111개 출력을 평가한 것이다. 세션별 원본 대조 10개와 숨은 반복 12개를 추가하였다. 후속 AI는 사람 결과·지표·방법명을 제공하지 않은 별도 세션에서 12개 후보와 원본 대조 3개를 평가하였다. 비교판 표시 문제로 처음 판정하지 못한 두 이미지는 개별 PNG 확인 후 평가하였으며 최초 기록을 남겼다. 이는 새로운 모델 간 검증이나 독립된 두 번째 사람 평가가 아니다.</w:t>
+        <w:t>AI 열화 등급은 없음(0), 약함(1), 뚜렷함(2), 심함(3)이다. 초기 AI 평가는 같은 기반 모델의 두 세션이 고유 111개 출력을 평가한 것이다. 원본 대조 10개와 숨은 반복 12개를 세션별로 추가하였다. 후속 평가는 별도 세션에서 익명 최종 후보 12개와 원본 대조 3개를 평가하였다. 비교판에서 판정하기 어려웠던 두 이미지는 개별 PNG 확인 후 판정하였으며 최초 기록을 보존했다. 동일 기반 모델의 세션 결과는 모델 다양성이나 지각적 타당성의 독립 검증이 아니다.</w:t>
       </w:r>
     </w:p>
     <w:p>
@@ -707,14 +699,6 @@
       </w:pPr>
       <w:r>
         <w:t>1. 초기 순차 경로와 원본 기반 정책</w:t>
-      </w:r>
-    </w:p>
-    <w:p>
-      <w:pPr>
-        <w:jc w:val="both"/>
-      </w:pPr>
-      <w:r>
-        <w:t>초기 순차 최종 7개를 사람은 모두 열화 3과 보존 0으로 평가하였다. 원본 기반 최종 6개는 열화 0 또는 1, 보존 2였다. 완료된 1회 개입 최종 2개는 보존 0이었고, 3단계마다 개입한 최종 1개는 보존 1이었다. 이는 중간 한 번의 개선만으로 이후 결과를 보장할 수 없음을 보여주지만, 정책별 표본 수가 다르므로 모집단 성공률로 해석할 수 없다.</w:t>
       </w:r>
     </w:p>
     <w:p>
@@ -1793,7 +1777,7 @@
         <w:pStyle w:val="Heading2"/>
       </w:pPr>
       <w:r>
-        <w:t>3. 사람과 AI의 일치 및 지표 관계</w:t>
+        <w:t>3. AI 등급</w:t>
       </w:r>
     </w:p>
     <w:p>
@@ -1801,7 +1785,7 @@
         <w:jc w:val="both"/>
       </w:pPr>
       <w:r>
-        <w:t>후속 12개 이미지에서 일괄 결과의 사람 열화 등급은 0이 2개, 1이 4개였고, 순차 결과는 1이 4개, 2가 2개였다. 얼굴 보존은 일괄 6/6, 순차 1/6이 유지였다. 인물·반복으로 대응한 여섯 쌍에서 일괄의 열화 등급이 더 낮은 쌍은 4개, 같은 쌍은 2개였다. 보존에서는 일괄이 더 높은 쌍이 5개, 같은 쌍이 1개였다.</w:t>
+        <w:t>후속 12개 이미지의 별도 AI 평가는 일괄 결과에서 약함 6개, 순차 결과에서 뚜렷함 2개와 심함 4개였다. 원본 대조 3개는 모두 0점이었다. 이 12개는 3인물의 반복 관측이며 98개 전체의 평가 결과가 아니다.</w:t>
       </w:r>
     </w:p>
     <w:p>
@@ -1812,7 +1796,7 @@
         <w:jc w:val="center"/>
       </w:pPr>
       <w:r>
-        <w:t>표 4. 후속 사람·AI 평가</w:t>
+        <w:t>표 4. 후속 AI 평가</w:t>
       </w:r>
     </w:p>
     <w:tbl>
@@ -1902,124 +1886,6 @@
         <w:tc>
           <w:tcPr>
             <w:tcW w:type="dxa" w:w="1523"/>
-          </w:tcPr>
-          <w:p>
-            <w:pPr>
-              <w:spacing w:after="60" w:before="60" w:line="240" w:lineRule="auto"/>
-              <w:ind w:firstLine="0"/>
-            </w:pPr>
-            <w:r>
-              <w:rPr>
-                <w:b w:val="0"/>
-                <w:sz w:val="16"/>
-              </w:rPr>
-              <w:t>사람 열화</w:t>
-            </w:r>
-          </w:p>
-        </w:tc>
-        <w:tc>
-          <w:tcPr>
-            <w:tcW w:type="dxa" w:w="1523"/>
-          </w:tcPr>
-          <w:p>
-            <w:pPr>
-              <w:spacing w:after="60" w:before="60" w:line="240" w:lineRule="auto"/>
-              <w:ind w:firstLine="0"/>
-            </w:pPr>
-            <w:r>
-              <w:rPr>
-                <w:b w:val="0"/>
-                <w:sz w:val="16"/>
-              </w:rPr>
-              <w:t>없음 2, 약함 4</w:t>
-            </w:r>
-          </w:p>
-        </w:tc>
-        <w:tc>
-          <w:tcPr>
-            <w:tcW w:type="dxa" w:w="1523"/>
-          </w:tcPr>
-          <w:p>
-            <w:pPr>
-              <w:spacing w:after="60" w:before="60" w:line="240" w:lineRule="auto"/>
-              <w:ind w:firstLine="0"/>
-            </w:pPr>
-            <w:r>
-              <w:rPr>
-                <w:b w:val="0"/>
-                <w:sz w:val="16"/>
-              </w:rPr>
-              <w:t>약함 4, 뚜렷함 2</w:t>
-            </w:r>
-          </w:p>
-        </w:tc>
-      </w:tr>
-      <w:tr>
-        <w:trPr>
-          <w:cantSplit/>
-        </w:trPr>
-        <w:tc>
-          <w:tcPr>
-            <w:tcW w:type="dxa" w:w="1523"/>
-          </w:tcPr>
-          <w:p>
-            <w:pPr>
-              <w:spacing w:after="60" w:before="60" w:line="240" w:lineRule="auto"/>
-              <w:ind w:firstLine="0"/>
-            </w:pPr>
-            <w:r>
-              <w:rPr>
-                <w:b w:val="0"/>
-                <w:sz w:val="16"/>
-              </w:rPr>
-              <w:t>사람 보존</w:t>
-            </w:r>
-          </w:p>
-        </w:tc>
-        <w:tc>
-          <w:tcPr>
-            <w:tcW w:type="dxa" w:w="1523"/>
-          </w:tcPr>
-          <w:p>
-            <w:pPr>
-              <w:spacing w:after="60" w:before="60" w:line="240" w:lineRule="auto"/>
-              <w:ind w:firstLine="0"/>
-            </w:pPr>
-            <w:r>
-              <w:rPr>
-                <w:b w:val="0"/>
-                <w:sz w:val="16"/>
-              </w:rPr>
-              <w:t>유지 6</w:t>
-            </w:r>
-          </w:p>
-        </w:tc>
-        <w:tc>
-          <w:tcPr>
-            <w:tcW w:type="dxa" w:w="1523"/>
-          </w:tcPr>
-          <w:p>
-            <w:pPr>
-              <w:spacing w:after="60" w:before="60" w:line="240" w:lineRule="auto"/>
-              <w:ind w:firstLine="0"/>
-            </w:pPr>
-            <w:r>
-              <w:rPr>
-                <w:b w:val="0"/>
-                <w:sz w:val="16"/>
-              </w:rPr>
-              <w:t>유지 1, 미유지 5</w:t>
-            </w:r>
-          </w:p>
-        </w:tc>
-      </w:tr>
-      <w:tr>
-        <w:trPr>
-          <w:cantSplit/>
-        </w:trPr>
-        <w:tc>
-          <w:tcPr>
-            <w:tcW w:type="dxa" w:w="1523"/>
             <w:tcBorders>
               <w:bottom w:val="single" w:sz="5"/>
             </w:tcBorders>
@@ -2087,23 +1953,7 @@
         <w:jc w:val="both"/>
       </w:pPr>
       <w:r>
-        <w:t>후속 AI와 사람의 열화 등급은 정확히 4/12, 한 등급 이내에서 10/12 일치했으며 Spearman 순위 상관은 0.639였다. 원본 대조 3개는 모두 AI 등급 0이었다. 방법 간 방향에는 일치가 있지만 절대 등급에는 차이가 있으므로 AI를 사람 평가의 대체물로 결론 내릴 수 없다.</w:t>
-      </w:r>
-    </w:p>
-    <w:p>
-      <w:pPr>
-        <w:jc w:val="both"/>
-      </w:pPr>
-      <w:r>
-        <w:t>초기 AI 두 세션은 고유 111개에서 99/111(89.19%) 정확 일치, 등급 2 이상 이진 기준에서 107/111(96.40%) 일치를 보였으며 선형 가중 κ는 0.897이었다. 숨은 반복 정확 일치는 각각 11/12와 12/12, 원본 대조는 각각 10/10이었다. 이는 같은 기반 모델의 세션 일관성에 관한 결과이며 사람 간 신뢰도나 모델 다양성의 증거가 아니다.</w:t>
-      </w:r>
-    </w:p>
-    <w:p>
-      <w:pPr>
-        <w:jc w:val="both"/>
-      </w:pPr>
-      <w:r>
-        <w:t>후속 사람 열화와 얼굴 MAE, SSIM, LPIPS의 순위 상관은 각각 −0.125, −0.334, 0.502였다. 보존과의 상관은 −0.416, 0.661, −0.710이었다. 특히 MAE와 열화 사이의 약한 반대 방향 관계는 수치 거리를 열화 척도로 단순 치환하기 어렵다는 점을 보여준다. 이 상관들은 3인물의 종속된 12개 출력과 한 사람에 대한 기술 통계다.</w:t>
+        <w:t>초기 AI 두 세션은 고유 111개에서 99/111(89.19%) 정확 일치, 등급 2 이상 기준에서 107/111(96.40%) 일치를 보였으며 선형 가중 κ는 0.897이었다. 숨은 반복 정확 일치는 각각 11/12와 12/12, 원본 대조는 각각 10/10이었다. 같은 기반 모델의 세션 일관성에 대한 기술 통계이며 AI 등급을 실제 지각 품질의 정답으로 해석하지 않는다.</w:t>
       </w:r>
     </w:p>
     <w:p>
@@ -3878,6 +3728,46 @@
     </w:p>
     <w:p>
       <w:pPr>
+        <w:pStyle w:val="Heading2"/>
+      </w:pPr>
+      <w:r>
+        <w:t>1. 웹 편집기 테스트 결과</w:t>
+      </w:r>
+    </w:p>
+    <w:p>
+      <w:pPr>
+        <w:jc w:val="both"/>
+      </w:pPr>
+      <w:r>
+        <w:t>웹 편집기는 로컬 주소 http://localhost:8770 에서 실행한다. 저장된 실행 검증에서 한국어 요청 반영, 최초 원본 기반 이미지 생성, PNG 결과 조회, 수동 설정 저장, 이미지·설정 버전 복원, 오래된 수정 요청의 거부를 확인했다. 실제 생성 1회의 기록 시간은 95.28초다. 이 단일 실행 시간을 평균 응답 속도로 해석하지 않는다.</w:t>
+      </w:r>
+    </w:p>
+    <w:p>
+      <w:pPr>
+        <w:jc w:val="both"/>
+      </w:pPr>
+      <w:r>
+        <w:t>요청 해석 수정 후 한국어 14개·영어 14개와 추가 7개, 총 35개에서 기대 상태 또는 안전한 보류 응답을 확인했다. 35/35는 알려진 개발 사례의 회귀 검사이며 자유 문장에 대한 일반 정확도가 아니다. 사전에 없는 설산 배경 요청 1개는 실제 Qwen3 4B 경로에서 배경만 갱신하고 다른 설정을 유지했다. 생성·복원 테스트와 요청 회귀 검사는 서로 다른 검증이다.</w:t>
+      </w:r>
+    </w:p>
+    <w:p>
+      <w:pPr>
+        <w:jc w:val="both"/>
+      </w:pPr>
+      <w:r>
+        <w:t>사용 화면은 이미지 업로드, 수정 요청, 이미지 생성, 다운로드와 버전 선택 중심으로 구성했다. 세부 설정은 접어서 필요할 때 열도록 하고, 요청 이력의 반복 설명을 줄였다. 이는 개발자의 화면 수정이며 실제 사용자 대상 사용성 실험을 수행한 결과가 아니다. 사이트의 생성 테스트 이미지는 연구 정책 비교 표본에 합산하지 않았다.</w:t>
+      </w:r>
+    </w:p>
+    <w:p>
+      <w:pPr>
+        <w:jc w:val="both"/>
+      </w:pPr>
+      <w:r>
+        <w:t>2026년 9월 13일 UI 변경 후 브라우저에서 “셔츠는 남색으로, 배경은 바다로 바꿔줘”를 입력하였다. 셔츠 navy·배경 ocean·핀 original 상태가 적용되었고, 실제 생성 1회는 101.26초에 완료되었다. 출력 표시와 다운로드 링크를 확인한 뒤 셔츠 설정을 변경·저장하고, 이전 버전 선택으로 이미지와 남색·바다 설정이 복원됨을 확인했다. 이 단일 개발 점검은 사용자 만족도나 처리 시간의 평균 성능을 추정하지 않는다.</w:t>
+      </w:r>
+    </w:p>
+    <w:p>
+      <w:pPr>
         <w:pStyle w:val="Heading1"/>
       </w:pPr>
       <w:r>
@@ -3889,7 +3779,7 @@
         <w:jc w:val="both"/>
       </w:pPr>
       <w:r>
-        <w:t>첫째, 원본 기반 생성은 본 조건에서 얼굴 원본 거리와 사람의 보존 판정에 유리했다. 무변경 반복에서도 거리가 증가했다는 점을 함께 보면, 연속 요구를 기억하는 텍스트 상태와 생성 이미지의 입력 연결을 분리하는 설계는 합리적이다. 다만 복잡한 공간 관계나 직전 출력의 우연한 세부를 유지해야 하는 작업에서는 최초 원본만으로 그 요구를 충분히 표현하지 못할 수 있다. 이 연구는 그러한 작업을 비교하지 않았다.</w:t>
+        <w:t>첫째, 원본 기반 생성은 본 조건에서 얼굴 원본 거리에서 유리했다. 무변경 반복에서도 거리가 증가했다는 점을 함께 보면, 연속 요구를 기억하는 텍스트 상태와 생성 이미지의 입력 연결을 분리하는 설계는 합리적이다. 다만 복잡한 공간 관계나 직전 출력의 우연한 세부를 유지해야 하는 작업에서는 최초 원본만으로 그 요구를 충분히 표현하지 못할 수 있다. 이 연구는 그러한 작업을 비교하지 않았다.</w:t>
       </w:r>
     </w:p>
     <w:p>
@@ -3897,7 +3787,7 @@
         <w:jc w:val="both"/>
       </w:pPr>
       <w:r>
-        <w:t>둘째, 측정 영역과 지표의 선택은 결론의 범위를 바꾼다. 얼굴 사각형의 거리, 피부 평균 색, 세부 고주파 성분, 사람이 본 열화는 서로 다른 측면이다. 새 피부 MAE의 반대 결과를 제외하고 얼굴 LPIPS만 제시하면 보존 효과를 과장할 수 있다. 반대로 색 차이가 작다는 이유로 순차 결과의 피부 구조가 더 잘 유지되었다고 단정하는 것도 적절하지 않다.</w:t>
+        <w:t>둘째, 측정 영역과 지표의 선택은 결론의 범위를 바꾼다. 얼굴 사각형의 거리, 피부 평균 색, 세부 고주파 성분, 지각적 열화는 서로 다른 측면이다. 새 피부 MAE의 반대 결과를 제외하고 얼굴 LPIPS만 제시하면 보존 효과를 과장할 수 있다. 반대로 색 차이가 작다는 이유로 순차 결과의 피부 구조가 더 잘 유지되었다고 단정하는 것도 적절하지 않다.</w:t>
       </w:r>
     </w:p>
     <w:p>
@@ -3905,7 +3795,7 @@
         <w:jc w:val="both"/>
       </w:pPr>
       <w:r>
-        <w:t>셋째, 평가자는 한 명이며 연구 결과에 노출되었다. 후속 재평가 역시 피드백 이후 수행되었다. 사람 결과는 예비 판단으로만 해석해야 한다. AI 입력 분리는 사람 결과를 직접 따라 매기는 위험을 줄이지만 AI의 독립적인 타당성을 확립하지 않는다. 같은 기반 모델의 두 세션 일치율이 높아도 편향을 공유할 수 있다.</w:t>
+        <w:t>셋째, AI는 같은 기반 모델의 편향을 공유할 수 있다. 사용자 지각 품질과 사용성은 검증하지 않았다. 세션 간 일치율이 높아도 독립적인 품질 타당성의 증거가 되지 않는다.</w:t>
       </w:r>
     </w:p>
     <w:p>
@@ -3921,7 +3811,7 @@
         <w:jc w:val="both"/>
       </w:pPr>
       <w:r>
-        <w:t>다섯째, 로컬 민감도 분석은 결과를 본 뒤 수행했다. 여러 설정의 전체 보고와 재계산 검증은 선택적 보고를 줄이지만 사전 등록을 대신하지 못한다. 후속 확증 실험에서는 가설·ROI·주 지표·허용 실패·시드·제외 기준을 미리 고정하고, 새 인물과 새 요청을 사용해야 한다. 사람 평가에서는 결과를 보지 않은 복수 평가자가 무작위 익명 비교를 수행하고, 열화·보존·요청 이행을 별도로 판정해야 한다. 통계 분석은 인물 및 반복의 군집 구조를 반영해야 한다.</w:t>
+        <w:t>다섯째, 로컬 민감도 분석은 결과를 본 뒤 수행했다. 여러 설정의 전체 보고와 재계산 검증은 선택적 보고를 줄이지만 사전 등록을 대신하지 못한다. 후속 확증 실험에서는 가설·ROI·주 지표·허용 실패·시드·제외 기준을 미리 고정하고, 새 인물과 새 요청을 사용해야 한다. 통계 분석은 인물 및 반복의 군집 구조를 반영해야 한다.</w:t>
       </w:r>
     </w:p>
     <w:p>
@@ -3937,7 +3827,7 @@
         <w:jc w:val="both"/>
       </w:pPr>
       <w:r>
-        <w:t>본 탐색적 연구에서는 비얼굴 편집을 순차 수행할 때 최초 원본과의 얼굴 차이가 누적되는 사례를 관찰하였고, 원본 기반 또는 일괄 생성이 여러 비교에서 더 작은 얼굴 거리와 더 높은 예비 보존 판정을 보였다. 그러나 사람과 AI의 절대 열화 등급은 충분히 일치하지 않았으며, 추가 피부 내부 분석에서는 원시 MAE의 우열이 역전되었다. 실용적으로는 최초 원본과 누적 요구사항을 함께 관리하는 구조가 유망하지만, 연구적으로는 거리 감소·피부 열화 감소·얼굴 보존·요청 이행을 구별하는 평가가 필요하다. 본 결과는 보편적인 우월성이나 자동 열화 감지기의 검증보다 후속 확증 실험의 근거를 제공한다.</w:t>
+        <w:t>본 탐색적 연구에서 순차 편집은 최초 원본과의 얼굴 차이가 누적되는 사례를 보였으며, 원본 기반 또는 일괄 생성은 여러 비교에서 더 작은 얼굴 거리를 보였다. 피부 원시 MAE의 우열은 일부 설정에서 반대여서 모든 보존 지표의 우월성으로 확대할 수 없다. 최초 원본과 누적 요구사항을 관리하는 웹 편집기의 실제 생성과 상태 복원을 확인했지만 기능 테스트를 사용자 만족도나 지각적 품질의 검증으로 해석하지 않는다. 결과는 제한된 입력 정책의 비교와 후속 확증 실험의 근거다.</w:t>
       </w:r>
     </w:p>
     <w:p>

</xml_diff>

<commit_message>
Refine manuscript into concise academic prose
</commit_message>
<xml_diff>
--- a/paper/manuscript.inha.docx
+++ b/paper/manuscript.inha.docx
@@ -76,7 +76,7 @@
         <w:t xml:space="preserve">요약: </w:t>
       </w:r>
       <w:r>
-        <w:t>이미지 편집 시스템에서 앞선 생성물을 다음 입력으로 사용하면 요청하지 않은 얼굴 변화가 누적될 수 있다. 본 연구는 순차 편집과 최초 원본에 누적 요구사항을 적용하는 재생성을 비교한다. 초기 실험은 합성 인물 6명과 순차 7경로, 후속 통제 실험은 기존 3인물의 98개 출력을 포함한다. 얼굴 MAE·SSIM·LPIPS, 피부 내부 영역 및 별도 AI 등급으로 분석하였다. 세 인물의 후속 비교에서 일괄 편집의 평균 얼굴 LPIPS가 순차보다 낮았다. 별도 FLUX.2 Klein 4B 실험의 두 시드 평균 LPIPS는 일괄 0.091313, 순차 0.124455였으나 피부 원시 MAE는 일부 설정에서 반대 방향이었다. 최초 원본과 누적 요구를 분리하는 웹 편집기를 구현하고, 실제 생성·설정 저장·버전 복원 및 알려진 요청 35개의 회귀 검사를 수행하였다. 이 결과는 제한된 조건에서의 입력 정책 및 구현 검증이며 지각적 품질이나 보편적인 얼굴 보존의 검증을 의미하지 않는다.</w:t>
+        <w:t>이미지 편집 시스템에서 앞선 생성물을 다음 입력으로 사용하면 요청하지 않은 얼굴 변화가 누적될 수 있다. 본 연구는 순차 편집과 최초 원본에 누적 요구사항을 적용하는 재생성을 비교한다. 초기 실험은 합성 인물 6명과 순차 7경로, 후속 통제 실험은 기존 3인물의 98개 출력을 포함한다. 얼굴 MAE·SSIM·LPIPS, 피부 내부 영역 및 별도 AI 등급으로 분석하였다. 세 인물의 후속 비교에서 일괄 편집의 평균 얼굴 LPIPS가 순차보다 낮았다. 별도 FLUX.2 Klein 4B 실험의 두 시드 평균 LPIPS는 일괄 0.091313, 순차 0.124455였으나 피부 원시 MAE는 일부 설정에서 반대 방향이었다. 최초 원본과 누적 요구를 분리하는 웹 편집기를 구현하고, 실제 생성·설정 저장·버전 복원 및 알려진 요청 35개의 회귀 검사를 수행하였다. 실험 결과는 원본 기반 입력 정책의 효과가 측정 영역과 지표에 따라 달라짐을 보여주며, 누적 요구사항을 관리하는 편집기의 구현 근거를 제공한다.</w:t>
       </w:r>
     </w:p>
     <w:p>
@@ -90,7 +90,7 @@
         <w:t xml:space="preserve">Abstract: </w:t>
       </w:r>
       <w:r>
-        <w:t>We compare sequential image editing with regeneration from the original image and accumulated requirements. Experiments include six synthetic identities, 98 follow-up outputs from three identities, automatic image metrics and separate AI ratings. Batch editing produced lower mean facial LPIPS in the tested follow-up comparisons. A local FLUX.2 Klein 4B comparison yielded mean LPIPS of 0.091313 for batch and 0.124455 for sequential editing, while raw skin MAE reversed the ranking in some settings. A web editor implemented the workflow. Recorded checks covered real generation, state changes, version restoration and 35 known request regression cases. These exploratory results do not establish general perceptual quality or user satisfaction.</w:t>
+        <w:t>We compare sequential image editing with regeneration from the original image and accumulated requirements. Experiments include six synthetic identities, 98 follow-up outputs from three identities, automatic image metrics and separate AI ratings. Batch editing produced lower mean facial LPIPS in the tested follow-up comparisons. A local FLUX.2 Klein 4B comparison yielded mean LPIPS of 0.091313 for batch and 0.124455 for sequential editing, while raw skin MAE reversed the ranking in some settings. A web editor implemented the workflow. Recorded checks covered real generation, state changes, version restoration and 35 known request regression cases. The findings characterize the dependence of input-policy effects on measurement regions and support an editor that maintains accumulated editing requirements.</w:t>
       </w:r>
     </w:p>
     <w:p>
@@ -131,7 +131,7 @@
         <w:jc w:val="both"/>
       </w:pPr>
       <w:r>
-        <w:t>사용자가 인물 사진의 셔츠를 바꾸고, 배경을 바꾸고, 핀을 추가하는 과정에서 얼굴 수정은 명시적인 목표가 아니다. 그럼에도 생성형 편집기는 얼굴의 색조, 질감, 윤곽 또는 세부를 함께 바꿀 수 있다. 이러한 비목표 영역의 변화는 요청 이행과 별도로 측정해야 한다. 편집 결과가 요구된 배경을 갖추었더라도 얼굴이 유지되었다는 결론은 자동으로 성립하지 않는다.</w:t>
+        <w:t>인물 이미지 편집에서는 셔츠, 배경, 장신구를 변경하면서 얼굴을 유지하는 것이 주요 요구사항이다. 생성형 편집 과정에서 얼굴의 색조, 질감, 윤곽과 세부가 함께 변할 수 있으므로 요청한 요소의 변경과 얼굴 보존을 각각 평가할 필요가 있다.</w:t>
       </w:r>
     </w:p>
     <w:p>
@@ -139,7 +139,7 @@
         <w:jc w:val="both"/>
       </w:pPr>
       <w:r>
-        <w:t>다중 턴 이미지 편집과 내용 보존은 기존 연구에서도 다뤄진 문제다[1–3]. 따라서 본 연구는 누적 변화 자체를 최초로 발견하거나 새로운 생성 모델을 제안한다고 주장하지 않는다. 대신 제한된 실제 편집 과정에서 입력 전달 방식, 측정 영역, 자동 지표, AI 판정 사이에 어떤 차이가 나타나는지 확인한다. 특히 색과 위치의 변화가 포함된 원본 거리를 피부 열화의 직접 측정값으로 취급할 때 발생하는 해석 문제에 초점을 둔다.</w:t>
+        <w:t>다중 턴 이미지 편집과 내용 보존은 기존 연구에서도 다뤄진 문제다[1–3]. 본 연구는 생성기에 전달하는 입력 정책을 중심으로 입력 전달 방식, 측정 영역, 자동 지표, AI 판정 사이에 어떤 차이가 나타나는지 확인한다. 특히 색과 위치의 변화가 포함된 원본 거리를 피부 열화의 직접 측정값으로 취급할 때 발생하는 해석 문제에 초점을 둔다.</w:t>
       </w:r>
     </w:p>
     <w:p>
@@ -155,7 +155,7 @@
         <w:jc w:val="both"/>
       </w:pPr>
       <w:r>
-        <w:t>본 연구의 기여는 세 가지다. 입력 정책과 후속 통제 실험을 연결한 탐색적 기록을 제시하고, 거리·열화·보존·요청 이행을 분리하여 결과를 해석하며, 피부 내부 영역에서 기존 결론에 불리한 결과까지 포함하는 민감도 분석을 제공한다. 표본 규모와 생성 조건에는 제한이 있으므로 결과는 가설 형성 및 후속 실험 설계의 근거로 사용한다.</w:t>
+        <w:t>본 연구의 기여는 세 가지다. 입력 정책과 후속 통제 실험을 연결한 탐색적 기록을 제시하고, 거리·열화·보존·요청 이행을 분리하여 결과를 해석하며, 피부 내부 영역의 민감도 분석을 제공한다. 표본 규모와 생성 조건에는 제한이 있으므로 결과는 가설 형성 및 후속 실험 설계의 근거로 사용한다.</w:t>
       </w:r>
     </w:p>
     <w:p>
@@ -171,7 +171,7 @@
         <w:jc w:val="both"/>
       </w:pPr>
       <w:r>
-        <w:t>MagicBrush는 단일 턴과 다중 턴을 포함하는 사람 주석 기반 이미지 편집 데이터셋을 제시한다[1]. 이는 편집 성능을 한 번의 결과만으로 평가하기 어렵다는 배경을 제공한다. Multi-turn Consistent Image Editing은 다중 턴에서의 누적 오차와 내용 일관성을 모델 수준에서 다룬다[2]. 본 연구는 이러한 생성 알고리즘을 직접 재현하거나 경쟁 평가하지 않고, 사용 가능한 생성기의 입력을 구성하는 정책을 비교한다.</w:t>
+        <w:t>MagicBrush는 단일 턴과 다중 턴을 포함하는 사람 주석 기반 이미지 편집 데이터셋을 제시한다[1]. 이는 편집 성능을 한 번의 결과만으로 평가하기 어렵다는 배경을 제공한다. Multi-turn Consistent Image Editing은 다중 턴에서의 누적 오차와 내용 일관성을 모델 수준에서 다룬다[2]. 본 연구는 사용 가능한 생성기에서 직전 출력과 최초 원본을 참조하는 두 입력 정책을 비교한다.</w:t>
       </w:r>
     </w:p>
     <w:p>
@@ -179,7 +179,7 @@
         <w:jc w:val="both"/>
       </w:pPr>
       <w:r>
-        <w:t>GIE-Bench는 지시 이행과 보존 평가를 구분하며[4], EdiVal-Agent는 지시 이행, 내용 일관성, 시각 품질을 다차원으로 평가한다[3]. 본 연구는 자동 거리와 AI 열화 등급을 구분한다. 요청한 편집의 달성 여부 역시 원본 거리로 대체하지 않는다.</w:t>
+        <w:t>GIE-Bench는 지시 이행과 보존 평가를 구분하며[4], EdiVal-Agent는 지시 이행, 내용 일관성, 시각 품질을 다차원으로 평가한다[3]. 본 연구도 원본과의 수치적 거리, AI 열화 등급, 편집 요구의 이행을 별도 항목으로 다룬다.</w:t>
       </w:r>
     </w:p>
     <w:p>
@@ -187,7 +187,7 @@
         <w:jc w:val="both"/>
       </w:pPr>
       <w:r>
-        <w:t>SSIM은 구조적 유사도를, LPIPS는 학습된 특징 공간의 지각적 거리를 측정한다[5,6]. 두 지표 모두 본 연구에서 원본과 출력의 차이를 정량화하는 데 유용하지만, 측정값 자체가 특정 피부 결함의 진단이나 동일인 보존 판정은 아니다. MAE는 색 이동과 기하학적 어긋남에도 반응한다. 이에 따라 얼굴 사각형뿐 아니라 피부 내부 영역, 위치 보정, 평균 색 제거 분석을 함께 사용한다.</w:t>
+        <w:t>SSIM은 구조적 유사도를, LPIPS는 학습된 특징 공간의 지각적 거리를 측정한다[5,6]. 본 연구에서는 이들을 원본과 출력의 차이를 정량화하는 지표로 사용한다. MAE는 색 이동과 기하학적 어긋남에도 반응한다. 이에 따라 얼굴 사각형뿐 아니라 피부 내부 영역, 위치 보정, 평균 색 제거 분석을 함께 사용한다.</w:t>
       </w:r>
     </w:p>
     <w:p>
@@ -211,7 +211,7 @@
         <w:jc w:val="both"/>
       </w:pPr>
       <w:r>
-        <w:t>인물 P01–P06은 합성 이미지다. 초기 순차 편집은 6명에 대해 7경로를 구성하며 P03에 두 경로가 있다. 정책 비교 기록에는 20경로와 확인된 198단계 출력이 있지만, 일부 경로가 동일한 출력을 공유하므로 이를 198개의 독립 관측으로 취급하지 않는다. 완료된 10단계 경로는 19개다. 확장 계획의 신규 27회 중 25회가 성공했고, P05의 1회 개입 경로 9단계는 도구 차단, 10단계는 미실행으로 기록했다. 실패를 임의의 품질 점수로 대체하지 않았다. 단계별 자동 분석과 AI 평가의 범위는 서로 다르다.</w:t>
+        <w:t>인물 P01–P06은 합성 이미지다. 초기 순차 편집은 6명에 대해 7경로를 구성하며 P03에 두 경로가 있다. 정책 비교는 20경로의 198단계 출력을 포함하며, 경로 간 공유 출력과 동일 인물의 반복 관측을 구분하여 집계하였다. 완료된 10단계 경로는 19개다. 확장 계획의 신규 27회 중 25회가 성공했고, P05의 1회 개입 경로 9단계는 도구 차단, 10단계는 미실행으로 기록했다. 미완료 단계의 품질 점수는 결측으로 처리하였다. 분석별 자료 범위는 표 1에 제시하였다.</w:t>
       </w:r>
     </w:p>
     <w:p>
@@ -488,7 +488,7 @@
                 <w:b w:val="0"/>
                 <w:sz w:val="16"/>
               </w:rPr>
-              <w:t>자동 지표; 독립 AI 등급 없음</w:t>
+              <w:t>자동 지표 분석</w:t>
             </w:r>
           </w:p>
         </w:tc>
@@ -556,7 +556,7 @@
                 <w:b w:val="0"/>
                 <w:sz w:val="16"/>
               </w:rPr>
-              <w:t>새로운 생성이나 평가자 없음</w:t>
+              <w:t>기존 출력의 지표 재분석</w:t>
             </w:r>
           </w:p>
         </w:tc>
@@ -578,7 +578,7 @@
         <w:jc w:val="both"/>
       </w:pPr>
       <w:r>
-        <w:t>초기 수치 분석 113개 중 두 개는 개입 전 후보이며 AI 평가 111개에 포함되지 않는다. 후속 12개는 98개의 부분집합이다. 원본 대 원본 대조, 개발용 생성 이미지는 독립 연구 표본으로 더하지 않는다. 초기 생성기는 도구 기반 이미지 생성 시스템이며 정확한 백엔드 모델 버전과 시드는 확보되지 않았다. 따라서 이 부분의 재현성은 보존된 입력·출력·프롬프트·분석 기록에 한정된다.</w:t>
+        <w:t>초기 수치 분석은 확정 출력 111개와 개입 전 후보 2개를 포함하며, AI 평가는 확정 출력을 대상으로 하였다. 후속 AI 평가에는 98개 중 최종 출력 12개를 선정하였다. 원본 대조와 개발용 이미지는 검증용 자료로 별도 관리하였다. 초기 생성기는 도구 기반 이미지 생성 시스템이며 정확한 백엔드 모델 버전과 시드는 확보되지 않았다. 따라서 이 부분의 재현성은 보존된 입력·출력·프롬프트·분석 기록에 한정된다.</w:t>
       </w:r>
     </w:p>
     <w:p>
@@ -594,7 +594,7 @@
         <w:jc w:val="both"/>
       </w:pPr>
       <w:r>
-        <w:t>초기 10단계 과제는 귀걸이, 목걸이, 핀, 의상, 배경 등의 비얼굴 편집 및 후속 색·형태 변경으로 구성된다. 순차 정책은 직전 출력을 다음 입력으로 사용한다. 원본 기반 정책은 최초 입력에 해당 시점까지의 요구사항을 적용한다. 중간 1회 개입, 3단계마다 개입, 알람 기반 개입, 마지막 단계만 재생성하는 변형도 기록하였다. 공유 출력이 있는 정책 비교는 독립 반복 실험이 아니라 경로와 호출 비용의 비교로 해석한다.</w:t>
+        <w:t>초기 10단계 과제는 귀걸이, 목걸이, 핀, 의상, 배경 등의 비얼굴 편집 및 후속 색·형태 변경으로 구성된다. 순차 정책은 직전 출력을 다음 입력으로 사용한다. 원본 기반 정책은 최초 입력에 해당 시점까지의 요구사항을 적용한다. 중간 1회 개입, 3단계마다 개입, 알람 기반 개입, 마지막 단계만 재생성하는 변형도 기록하였다. 공유 출력이 있는 정책은 입력 경로와 호출 수를 비교하였다.</w:t>
       </w:r>
     </w:p>
     <w:p>
@@ -602,7 +602,7 @@
         <w:jc w:val="both"/>
       </w:pPr>
       <w:r>
-        <w:t>후속 실험에서는 셔츠, 배경, 핀의 최종 요구를 한 번에 적용하는 일괄 방식과 세 단계로 적용하는 순차 방식을 비교하였다. 최종 요구는 같지만 호출 수는 다르다. 따라서 이는 동일 계산 예산에서의 모델 성능 비교가 아니라 동일 최종 요구를 달성하는 작업 흐름의 비교다. 일괄 최종 생성 결과만으로 연속 상호작용의 모든 중간 상태까지 검증했다고 주장하지 않는다.</w:t>
+        <w:t>후속 실험에서는 셔츠, 배경, 핀의 최종 요구를 한 번에 적용하는 일괄 방식과 세 단계로 적용하는 순차 방식을 비교하였다. 동일한 최종 요구를 기준으로 최종 이미지의 지표와 각 작업 흐름의 호출 수를 비교하였다.</w:t>
       </w:r>
     </w:p>
     <w:p>
@@ -626,7 +626,7 @@
         <w:jc w:val="both"/>
       </w:pPr>
       <w:r>
-        <w:t>RGB를 [0,1] 범위로 정규화하여 원본과 출력 사이의 MAE를 계산한다. 얼굴 영역의 SSIM과 LPIPS(AlexNet, version 0.1)를 함께 보고하며 MAE·LPIPS는 낮을수록, SSIM은 높을수록 원본에 가깝다. 세 지표를 하나의 점수로 합치거나 열화 임계값을 사후 최적화하지 않는다. 얼굴 사각형에는 피부 외에 눈·머리카락 및 주변 내용이 포함될 수 있으므로 피부 내부 영역 분석을 별도로 수행한다.</w:t>
+        <w:t>RGB를 [0,1] 범위로 정규화하여 원본과 출력 사이의 MAE를 계산한다. 얼굴 영역의 SSIM과 LPIPS(AlexNet, version 0.1)를 함께 보고하며 MAE·LPIPS는 낮을수록, SSIM은 높을수록 원본에 가깝다. 각 지표의 연속값과 방법 간 차이를 분석한다. 얼굴 사각형에는 피부 외에 눈·머리카락 및 주변 내용이 포함될 수 있으므로 피부 내부 영역 분석을 별도로 수행한다.</w:t>
       </w:r>
     </w:p>
     <w:p>
@@ -634,7 +634,7 @@
         <w:jc w:val="both"/>
       </w:pPr>
       <w:r>
-        <w:t>위치 민감도 분석은 정규화 상호상관(NCC)을 이용한 정수 픽셀 평행이동으로 수행한다. 고해상도 후속 분석의 Gaussian sigma는 1, 3, 6이며 로컬 절반 해상도에서는 0.5, 1.5, 3을 사용한다. 영상 자체를 워핑하지 않고 대응 위치를 잘라 비교한다. 이 보정은 평행이동에만 대응하며 회전, 표정, 크기 또는 형태 변형을 제거하지 못한다.</w:t>
+        <w:t>위치 민감도 분석은 정규화 상호상관(NCC)을 이용한 정수 픽셀 평행이동으로 수행한다. 고해상도 후속 분석의 Gaussian sigma는 1, 3, 6이며 로컬 절반 해상도에서는 0.5, 1.5, 3을 사용한다. 원래 픽셀을 유지한 채 대응 위치의 영역을 잘라 비교하며, 보정 범위는 평행이동으로 한정한다.</w:t>
       </w:r>
     </w:p>
     <w:p>
@@ -642,7 +642,7 @@
         <w:jc w:val="both"/>
       </w:pPr>
       <w:r>
-        <w:t>피부 영역에는 원시 RGB MAE, SSIM, 고주파 성분 MAE 및 평균 RGB 제거 후 잔차 MAE를 사용한다. 픽셀 차이 d의 평균을 μ라 할 때 MSE는 mean(d²) = μ² + mean((d−μ)²)로 분해된다. 채널별 계산 후 평균하며, 이 항등식은 수치적으로 검산한다. 평균 색 성분은 통계적 분해 항이지 조명의 인과적 기여율이 아니다. MAE에는 같은 가법 분해를 적용하지 않는다.</w:t>
+        <w:t>피부 영역에는 원시 RGB MAE, SSIM, 고주파 성분 MAE 및 평균 RGB 제거 후 잔차 MAE를 사용한다. 픽셀 차이 d의 평균을 μ라 할 때 MSE는 mean(d²) = μ² + mean((d−μ)²)로 분해된다. 채널별 계산 후 평균하며, 이 항등식은 수치적으로 검산한다. 이 분해는 MSE에 적용하며, 평균 색 차이와 그 외 잔차의 크기를 정량화한다.</w:t>
       </w:r>
     </w:p>
     <w:p>
@@ -658,7 +658,7 @@
         <w:jc w:val="both"/>
       </w:pPr>
       <w:r>
-        <w:t>AI 열화 등급은 없음(0), 약함(1), 뚜렷함(2), 심함(3)이다. 초기 AI 평가는 같은 기반 모델의 두 세션이 고유 111개 출력을 평가한 것이다. 원본 대조 10개와 숨은 반복 12개를 세션별로 추가하였다. 후속 평가는 별도 세션에서 익명 최종 후보 12개와 원본 대조 3개를 평가하였다. 비교판에서 판정하기 어려웠던 두 이미지는 개별 PNG 확인 후 판정하였으며 최초 기록을 보존했다. 동일 기반 모델의 세션 결과는 모델 다양성이나 지각적 타당성의 독립 검증이 아니다.</w:t>
+        <w:t>AI 열화 등급은 없음(0), 약함(1), 뚜렷함(2), 심함(3)이다. 초기 AI 평가는 같은 기반 모델의 두 세션이 고유 111개 출력을 평가한 것이다. 원본 대조 10개와 숨은 반복 12개를 세션별로 추가하였다. 후속 평가는 별도 세션에서 익명 최종 후보 12개와 원본 대조 3개를 평가하였다. 비교판에서 판정하기 어려웠던 두 이미지는 개별 PNG 확인 후 판정하였으며 최초 기록을 보존했다. 세션 간 일치율로 동일 모델의 평가 일관성을 분석하였다.</w:t>
       </w:r>
     </w:p>
     <w:p>
@@ -674,7 +674,7 @@
         <w:jc w:val="both"/>
       </w:pPr>
       <w:r>
-        <w:t>로컬 비교는 FLUX.2 Klein 4B의 4비트 양자화 가중치와 MFLUX 0.19.1을 사용하였다[7,8]. 실행 환경은 Apple M1, 메모리 16 GB이며, 추론은 4스텝으로 설정하였다. P04 원본을 두 방법 모두 동일하게 512×768로 축소하고 시드 42와 314를 사용하였다. 각 순차 경로에서는 같은 시드를 유지하고, 반복 간 방법 실행 순서를 반대로 하였다. 결과 품질을 이유로 재시도하거나 좋은 결과만 선택하지 않았다.</w:t>
+        <w:t>로컬 비교는 FLUX.2 Klein 4B의 4비트 양자화 가중치와 MFLUX 0.19.1을 사용하였다[7,8]. 실행 환경은 Apple M1, 메모리 16 GB이며, 추론은 4스텝으로 설정하였다. P04 원본을 두 방법 모두 동일하게 512×768로 축소하고 시드 42와 314를 사용하였다. 각 순차 경로에서는 같은 시드를 유지하고, 반복 간 방법 실행 순서를 반대로 하였다. 각 호출의 첫 출력을 분석에 사용하였다.</w:t>
       </w:r>
     </w:p>
     <w:p>
@@ -682,7 +682,7 @@
         <w:jc w:val="both"/>
       </w:pPr>
       <w:r>
-        <w:t>후속 분석은 저장된 출력 해시, 입력 연결, ROI 및 지표 재계산으로 검증하였다. 새 로컬 민감도 분석은 고정 얼굴 결과를 본 이후 설계한 사후 분석이다. 모든 설정을 함께 보고하여 유리한 보정 설정만 선택하지 않았다. 소수 인물·시드와 종속 관측의 한계 때문에 모집단 유의확률이나 일반화 신뢰구간을 제시하지 않는다.</w:t>
+        <w:t>후속 분석은 저장된 출력 해시, 입력 연결, ROI 및 지표 재계산으로 검증하였다. 새 로컬 민감도 분석은 고정 얼굴 결과를 본 이후 설계한 사후 분석이다. 모든 보정 설정의 결과를 함께 제시하고, 인물과 시드별 기술 통계로 비교하였다.</w:t>
       </w:r>
     </w:p>
     <w:p>
@@ -706,7 +706,7 @@
         <w:jc w:val="both"/>
       </w:pPr>
       <w:r>
-        <w:t>P04의 10단계 경로 평균 LPIPS와 논리적 생성 호출 수를 표 2에 정리하였다. 호출 수는 실제 경과 시간이나 과금량과 동일하지 않다. 알람 방식은 원본 기반 방식과 확인된 출력 8개를 공유한다. 해당 알람은 탐색적 규칙이며 검증된 자동 감지기로 제안하지 않는다.</w:t>
+        <w:t>P04의 10단계 경로 평균 LPIPS와 논리적 생성 호출 수를 표 2에 정리하였다. 호출 수는 각 정책에 필요한 이미지 생성 횟수이다. 알람 방식은 원본 기반 방식과 확인된 출력 8개를 공유한다. 알람 조건에는 초기 실험에서 정한 탐색적 규칙을 사용하였다.</w:t>
       </w:r>
     </w:p>
     <w:p>
@@ -1302,7 +1302,7 @@
         <w:jc w:val="both"/>
       </w:pPr>
       <w:r>
-        <w:t>일곱 대응 최종 비교에서 고정 영역 지표는 각 지표별 6/7이 원본 기반에 유리했고 위치 보정 후에는 7/7이었다. P01의 고정 LPIPS는 순차 0.270484, 원본 기반 0.276156으로 반대 사례였다. 따라서 초기 자료만으로 모든 출력·모든 측정 설정에서 일괄적인 우월성을 주장할 수 없다.</w:t>
+        <w:t>일곱 대응 최종 비교에서 고정 영역 지표는 각 지표별 6/7이 원본 기반에 유리했고 위치 보정 후에는 7/7이었다. P01의 고정 LPIPS는 순차 0.270484, 원본 기반 0.276156으로 반대 사례였다. 원본 기반 방식의 이득은 인물과 위치 보정 조건에 따라 차이를 보였다.</w:t>
       </w:r>
     </w:p>
     <w:p>
@@ -1318,7 +1318,7 @@
         <w:jc w:val="both"/>
       </w:pPr>
       <w:r>
-        <w:t>세 인물의 후속 비교에서 일괄 방식의 평균 얼굴 LPIPS가 순차 방식보다 낮았다. 아래 P04 값은 편집 순서 실험의 일괄 및 셔츠→배경→핀 경로 비교이며, 별도 예비 분해 실험의 값과 혼합하지 않았다.</w:t>
+        <w:t>세 인물의 후속 비교에서 일괄 방식의 평균 얼굴 LPIPS가 순차 방식보다 낮았다. P04 값은 편집 순서 실험의 일괄 및 셔츠→배경→핀 경로를 기준으로 하였다.</w:t>
       </w:r>
     </w:p>
     <w:p>
@@ -1734,7 +1734,7 @@
         <w:pStyle w:val="Caption"/>
       </w:pPr>
       <w:r>
-        <w:t>그림 1. 동일 최종 요구에서의 얼굴 LPIPS 비교. 초기 생성기 세 인물과 로컬 모델 두 시드는 서로 다른 실험이며 수치를 합산하지 않는다.</w:t>
+        <w:t>그림 1. 동일 최종 요구에서의 얼굴 LPIPS 비교. 왼쪽은 초기 생성기의 세 인물별 평균, 오른쪽은 로컬 모델의 두 시드별 결과이다.</w:t>
       </w:r>
     </w:p>
     <w:p>
@@ -1753,7 +1753,7 @@
         <w:jc w:val="both"/>
       </w:pPr>
       <w:r>
-        <w:t>순서 실험에서는 지표와 반복을 가로지르는 하나의 보편적 최적 순서를 찾지 못하였다. 색·재질 요인 실험 역시 내용의 복잡도가 증가할수록 변화가 단조롭게 증가한다는 관계를 지지하지 않았다. P06의 원래 재질 조건에서도 요청하지 않은 흰 줄무늬가 생성된 사례가 있어, 비목표 얼굴 보존과 편집 요구의 정확한 이행을 별도 검사할 필요가 있다.</w:t>
+        <w:t>편집 순서의 상대적 성능은 지표와 반복에 따라 달랐으며, 색·재질 조건에 따른 얼굴 변화도 비단조적인 양상을 보였다. P06의 원래 재질 조건에서도 요청하지 않은 흰 줄무늬가 생성된 사례가 있어, 비목표 얼굴 보존과 편집 요구의 정확한 이행을 별도 검사할 필요가 있다.</w:t>
       </w:r>
     </w:p>
     <w:p>
@@ -1761,7 +1761,7 @@
         <w:jc w:val="both"/>
       </w:pPr>
       <w:r>
-        <w:t>무변경 반복 두 경로의 평균 얼굴 LPIPS는 1단계 0.020250에서 3단계 0.062738, 6단계 0.106249로 증가하였다. 고정 MAE와 LPIPS는 각 경로에서 단조 증가했지만 모든 지표에 대해 단조성을 주장하지 않는다. 이는 명시적인 추가 편집 없이도 반복 생성이 원본과의 차이를 누적시킬 수 있음을 보여준다.</w:t>
+        <w:t>무변경 반복 두 경로의 평균 얼굴 LPIPS는 1단계 0.020250에서 3단계 0.062738, 6단계 0.106249로 증가하였다. 고정 MAE와 LPIPS는 두 경로 모두에서 단조 증가하였다. 이는 명시적인 추가 편집 없이도 반복 생성이 원본과의 차이를 누적시킬 수 있음을 보여준다.</w:t>
       </w:r>
     </w:p>
     <w:p>
@@ -1769,7 +1769,7 @@
         <w:jc w:val="both"/>
       </w:pPr>
       <w:r>
-        <w:t>피부 분석은 얼굴 전체 수치의 해석을 제한한다. P04 단일 배경 편집의 피부 MAE는 0.049207로 셔츠 0.015323과 핀 0.014845보다 컸다. 그러나 배경 조건에서 피부 MSE의 87.8%는 평균 RGB 차이 성분이었으며, 평균 색 제거 후 MAE는 배경 0.014057, 셔츠 0.013909로 가까워졌다. 이 결과는 큰 원시 오차가 모두 피부 세부의 손상에 해당하지 않음을 시사한다.</w:t>
+        <w:t>피부 분석은 얼굴 전체 수치의 해석을 제한한다. P04 단일 배경 편집의 피부 MAE는 0.049207로 셔츠 0.015323과 핀 0.014845보다 컸다. 그러나 배경 조건에서 피부 MSE의 87.8%는 평균 RGB 차이 성분이었으며, 평균 색 제거 후 MAE는 배경 0.014057, 셔츠 0.013909로 가까워졌다. 이는 피부 원시 오차에 평균 색 이동이 크게 반영됨을 보여준다.</w:t>
       </w:r>
     </w:p>
     <w:p>
@@ -1785,7 +1785,7 @@
         <w:jc w:val="both"/>
       </w:pPr>
       <w:r>
-        <w:t>후속 12개 이미지의 별도 AI 평가는 일괄 결과에서 약함 6개, 순차 결과에서 뚜렷함 2개와 심함 4개였다. 원본 대조 3개는 모두 0점이었다. 이 12개는 3인물의 반복 관측이며 98개 전체의 평가 결과가 아니다.</w:t>
+        <w:t>후속 12개 이미지의 별도 AI 평가는 일괄 결과에서 약함 6개, 순차 결과에서 뚜렷함 2개와 심함 4개였다. 원본 대조 3개는 모두 0점이었다. 평가 대상은 세 인물에 대해 방법별로 두 번 생성한 최종 출력이다.</w:t>
       </w:r>
     </w:p>
     <w:p>
@@ -1953,7 +1953,7 @@
         <w:jc w:val="both"/>
       </w:pPr>
       <w:r>
-        <w:t>초기 AI 두 세션은 고유 111개에서 99/111(89.19%) 정확 일치, 등급 2 이상 기준에서 107/111(96.40%) 일치를 보였으며 선형 가중 κ는 0.897이었다. 숨은 반복 정확 일치는 각각 11/12와 12/12, 원본 대조는 각각 10/10이었다. 같은 기반 모델의 세션 일관성에 대한 기술 통계이며 AI 등급을 실제 지각 품질의 정답으로 해석하지 않는다.</w:t>
+        <w:t>초기 AI 두 세션은 고유 111개에서 99/111(89.19%) 정확 일치, 등급 2 이상 기준에서 107/111(96.40%) 일치를 보였으며 선형 가중 κ는 0.897이었다. 숨은 반복 정확 일치는 각각 11/12와 12/12, 원본 대조는 각각 10/10이었다. 이 수치는 동일 기반 모델의 세션 간 평가 일관성을 나타낸다.</w:t>
       </w:r>
     </w:p>
     <w:p>
@@ -1969,7 +1969,7 @@
         <w:jc w:val="both"/>
       </w:pPr>
       <w:r>
-        <w:t>로컬 모델의 두 시드에서 고정 얼굴 MAE·SSIM·LPIPS는 모두 일괄 방식에 유리하였다. 최종 요구는 남색 셔츠, 연한 파란 배경, 화면 기준 오른쪽의 은색 핀 하나였다. 실행자 관찰에서는 네 결과가 주요 요구를 갖추었으나 이는 독립적인 요청 이행 평가가 아니다.</w:t>
+        <w:t>로컬 모델의 두 시드에서 고정 얼굴 MAE·SSIM·LPIPS는 모두 일괄 방식에 유리하였다. 최종 요구는 남색 셔츠, 연한 파란 배경, 화면 기준 오른쪽의 은색 핀 하나였다. 실행 점검에서 네 결과 모두에 주요 편집 요소가 관찰되었다.</w:t>
       </w:r>
     </w:p>
     <w:p>
@@ -2565,7 +2565,7 @@
         <w:jc w:val="both"/>
       </w:pPr>
       <w:r>
-        <w:t>평균 LPIPS는 일괄이 순차보다 26.6% 낮았다. 경로 전체 시간 평균은 약 92.8초와 261.2초였다. 일괄은 한 호출, 순차는 세 호출이므로 이 시간 차이는 품질 개선 알고리즘의 계산 효율만을 측정한 결과가 아니다. 한 인물과 두 시드의 제한된 재현 사례이며 기존 생성기의 숫자와 합쳐 평균을 계산하지 않는다.</w:t>
+        <w:t>평균 LPIPS는 일괄이 순차보다 26.6% 낮았다. 두 시드의 평균 총 생성 시간은 일괄 92.8초, 순차 261.2초였다. 각 값은 동일한 최종 요구를 일괄 1회 또는 순차 3회의 호출로 처리한 작업 시간이다.</w:t>
       </w:r>
     </w:p>
     <w:p>
@@ -3691,7 +3691,7 @@
         <w:jc w:val="both"/>
       </w:pPr>
       <w:r>
-        <w:t>표는 두 시드의 평균이다. 얼굴 LPIPS와 SSIM, 피부 SSIM·고주파 MAE·잔차 MAE의 평균 방향은 모든 설정에서 일괄에 유리했다. 반면 피부 원시 MAE는 고정과 σ=3에서 순차가 더 낮았고, σ=0.5 및 1.5에서는 두 방법이 매우 가까웠다. 시드 42의 피부 MAE는 모든 설정에서 순차가 더 낮았다. 따라서 “모든 얼굴·피부 지표에서 일괄이 우수하다”는 해석은 성립하지 않는다. 피부의 색 차이와 세부 구조 차이를 함께 보고해야 한다.</w:t>
+        <w:t>표는 두 시드의 평균이다. 얼굴 LPIPS와 SSIM, 피부 SSIM·고주파 MAE·잔차 MAE의 평균 방향은 모든 설정에서 일괄에 유리했다. 반면 피부 원시 MAE는 고정과 σ=3에서 순차가 더 낮았고, σ=0.5 및 1.5에서는 두 방법이 매우 가까웠다. 시드 42의 피부 MAE는 모든 설정에서 순차가 더 낮았다. 피부 색 차이와 세부 구조 지표에서 비교 방향이 달라, 두 특성을 함께 고려할 필요가 있다.</w:t>
       </w:r>
     </w:p>
     <w:p>
@@ -3707,7 +3707,7 @@
         <w:jc w:val="both"/>
       </w:pPr>
       <w:r>
-        <w:t>관찰 결과를 바탕으로 최초 원본과 누적 편집 상태를 별도로 저장하는 로컬 편집기를 구현하였다. 사용자의 새 요청은 현재 상태에 대한 변경으로 해석하고, 생성 시에는 최초 원본과 갱신된 전체 요구를 사용한다. 예를 들어 셔츠 변경 다음에 배경 변경을 요청하면 두 요구를 함께 적용하여 최초 원본에서 다시 생성한다. 이전 출력은 결과 이력에 저장하되 다음 이미지의 입력으로 사용하지 않는다.</w:t>
+        <w:t>관찰 결과를 바탕으로 최초 원본과 누적 편집 상태를 별도로 저장하는 로컬 편집기를 구현하였다. 사용자의 새 요청은 현재 상태에 대한 변경으로 해석하고, 생성 시에는 최초 원본과 갱신된 전체 요구를 사용한다. 예를 들어 셔츠 변경 다음에 배경 변경을 요청하면 두 요구를 함께 적용하여 최초 원본에서 다시 생성한다. 이전 출력은 버전 이력으로 관리한다.</w:t>
       </w:r>
     </w:p>
     <w:p>
@@ -3715,7 +3715,7 @@
         <w:jc w:val="both"/>
       </w:pPr>
       <w:r>
-        <w:t>현재 지원 범위는 셔츠 색, 배경, 원형 핀이다. 상태와 이미지 버전을 함께 보존하여 되돌리기를 지원한다. 요청 해석은 정해진 동작 처리와 Qwen3 4B의 구조화 출력 보조로 구성하고, 모호한 취소·이전 시점 요청은 상태를 임의 변경하지 않고 버전을 선택하도록 한다. 이미지 모델과 언어 모델은 메모리 부담을 줄이기 위해 동시에 실행하지 않는다.</w:t>
+        <w:t>현재 지원 범위는 셔츠 색, 배경, 원형 핀이다. 상태와 이미지 버전을 함께 보존하여 되돌리기를 지원한다. 요청 해석은 정해진 동작 처리와 Qwen3 4B의 구조화 출력 보조로 구성하고, 모호한 취소·이전 시점 요청에는 버전 선택을 안내한다. 메모리 사용량을 줄이기 위해 언어 모델과 이미지 모델을 순차 실행한다.</w:t>
       </w:r>
     </w:p>
     <w:p>
@@ -3723,7 +3723,7 @@
         <w:jc w:val="both"/>
       </w:pPr>
       <w:r>
-        <w:t>한국어·영어 요청 35개와 연속 요청에 대한 검증은 개발 회귀 검사다. 이를 일반 자연어 이해 정확도나 전적으로 언어 모델이 해결한 성공률로 보고하지 않는다. 또한 이 구조는 누적 이미지 입력의 영향을 줄일 수 있지만 얼굴의 픽셀 보존, 임의 표현의 정확한 이해, 모든 중간 요구 이행을 보장하지 않는다. 시스템은 연구 가설의 적용 사례이며 새로운 기억 알고리즘이나 검증된 제품 효과의 증거가 아니다.</w:t>
+        <w:t>시스템 검증은 요구사항의 상태 갱신, 이미지 생성 및 버전 복원으로 구성하였다.</w:t>
       </w:r>
     </w:p>
     <w:p>
@@ -3739,7 +3739,7 @@
         <w:jc w:val="both"/>
       </w:pPr>
       <w:r>
-        <w:t>웹 편집기는 로컬 주소 http://localhost:8770 에서 실행한다. 저장된 실행 검증에서 한국어 요청 반영, 최초 원본 기반 이미지 생성, PNG 결과 조회, 수동 설정 저장, 이미지·설정 버전 복원, 오래된 수정 요청의 거부를 확인했다. 실제 생성 1회의 기록 시간은 95.28초다. 이 단일 실행 시간을 평균 응답 속도로 해석하지 않는다.</w:t>
+        <w:t xml:space="preserve">웹 편집기는 로컬 주소 http://localhost:8770 에서 실행한다. 저장된 실행 검증에서 한국어 요청 반영, 최초 원본 기반 이미지 생성, PNG 결과 조회, 수동 설정 저장, 이미지·설정 버전 복원, 오래된 수정 요청의 거부를 확인했다. 실제 생성 1회의 기록 시간은 95.28초다. </w:t>
       </w:r>
     </w:p>
     <w:p>
@@ -3747,7 +3747,7 @@
         <w:jc w:val="both"/>
       </w:pPr>
       <w:r>
-        <w:t>요청 해석 수정 후 한국어 14개·영어 14개와 추가 7개, 총 35개에서 기대 상태 또는 안전한 보류 응답을 확인했다. 35/35는 알려진 개발 사례의 회귀 검사이며 자유 문장에 대한 일반 정확도가 아니다. 사전에 없는 설산 배경 요청 1개는 실제 Qwen3 4B 경로에서 배경만 갱신하고 다른 설정을 유지했다. 생성·복원 테스트와 요청 회귀 검사는 서로 다른 검증이다.</w:t>
+        <w:t xml:space="preserve">요청 해석 수정 후 한국어 14개·영어 14개와 추가 7개, 총 35개에서 기대 상태 또는 안전한 보류 응답을 확인했다. 사전에 정의한 35개 회귀 검사 항목을 모두 통과하였다. 사전에 없는 설산 배경 요청 1개는 실제 Qwen3 4B 경로에서 배경만 갱신하고 다른 설정을 유지했다. </w:t>
       </w:r>
     </w:p>
     <w:p>
@@ -3755,7 +3755,7 @@
         <w:jc w:val="both"/>
       </w:pPr>
       <w:r>
-        <w:t>사용 화면은 이미지 업로드, 수정 요청, 이미지 생성, 다운로드와 버전 선택 중심으로 구성했다. 세부 설정은 접어서 필요할 때 열도록 하고, 요청 이력의 반복 설명을 줄였다. 이는 개발자의 화면 수정이며 실제 사용자 대상 사용성 실험을 수행한 결과가 아니다. 사이트의 생성 테스트 이미지는 연구 정책 비교 표본에 합산하지 않았다.</w:t>
+        <w:t>사용 화면은 이미지 업로드, 수정 요청, 이미지 생성, 다운로드와 버전 선택 중심으로 구성했다. 세부 설정은 접어서 필요할 때 열도록 하고, 요청 이력의 반복 설명을 줄였다. 화면 시험의 출력은 기능 검증 자료로 별도 관리하였다.</w:t>
       </w:r>
     </w:p>
     <w:p>
@@ -3763,7 +3763,7 @@
         <w:jc w:val="both"/>
       </w:pPr>
       <w:r>
-        <w:t>2026년 9월 13일 UI 변경 후 브라우저에서 “셔츠는 남색으로, 배경은 바다로 바꿔줘”를 입력하였다. 셔츠 navy·배경 ocean·핀 original 상태가 적용되었고, 실제 생성 1회는 101.26초에 완료되었다. 출력 표시와 다운로드 링크를 확인한 뒤 셔츠 설정을 변경·저장하고, 이전 버전 선택으로 이미지와 남색·바다 설정이 복원됨을 확인했다. 이 단일 개발 점검은 사용자 만족도나 처리 시간의 평균 성능을 추정하지 않는다.</w:t>
+        <w:t xml:space="preserve">2026년 9월 13일 UI 변경 후 브라우저에서 “셔츠는 남색으로, 배경은 바다로 바꿔줘”를 입력하였다. 셔츠 navy·배경 ocean·핀 original 상태가 적용되었고, 실제 생성 1회는 101.26초에 완료되었다. 출력 표시와 다운로드 링크를 확인한 뒤 셔츠 설정을 변경·저장하고, 이전 버전 선택으로 이미지와 남색·바다 설정이 복원됨을 확인했다. </w:t>
       </w:r>
     </w:p>
     <w:p>
@@ -3779,7 +3779,7 @@
         <w:jc w:val="both"/>
       </w:pPr>
       <w:r>
-        <w:t>첫째, 원본 기반 생성은 본 조건에서 얼굴 원본 거리에서 유리했다. 무변경 반복에서도 거리가 증가했다는 점을 함께 보면, 연속 요구를 기억하는 텍스트 상태와 생성 이미지의 입력 연결을 분리하는 설계는 합리적이다. 다만 복잡한 공간 관계나 직전 출력의 우연한 세부를 유지해야 하는 작업에서는 최초 원본만으로 그 요구를 충분히 표현하지 못할 수 있다. 이 연구는 그러한 작업을 비교하지 않았다.</w:t>
+        <w:t>원본 기반 생성은 여러 비교에서 순차 편집보다 낮은 얼굴 원본 거리를 보였다. 무변경 반복에서도 거리가 증가한 결과는 이전 생성물을 반복 입력하는 과정 자체가 변화 누적에 기여할 가능성을 시사한다. 이에 따라 연속 요청을 텍스트 상태로 관리하고 최초 원본에 적용하는 구조가 유효한 설계 방향으로 도출된다.</w:t>
       </w:r>
     </w:p>
     <w:p>
@@ -3787,7 +3787,7 @@
         <w:jc w:val="both"/>
       </w:pPr>
       <w:r>
-        <w:t>둘째, 측정 영역과 지표의 선택은 결론의 범위를 바꾼다. 얼굴 사각형의 거리, 피부 평균 색, 세부 고주파 성분, 지각적 열화는 서로 다른 측면이다. 새 피부 MAE의 반대 결과를 제외하고 얼굴 LPIPS만 제시하면 보존 효과를 과장할 수 있다. 반대로 색 차이가 작다는 이유로 순차 결과의 피부 구조가 더 잘 유지되었다고 단정하는 것도 적절하지 않다.</w:t>
+        <w:t>측정 영역에 따라 효과의 해석은 달라진다. 얼굴 전체 LPIPS는 일괄 방식에 유리했으나 피부 원시 MAE는 일부 조건에서 순차 방식이 더 낮았다. 피부 MSE의 평균 색 성분과 잔차를 분리한 결과도 색 이동과 세부 구조를 함께 분석할 필요성을 뒷받침한다.</w:t>
       </w:r>
     </w:p>
     <w:p>
@@ -3795,7 +3795,7 @@
         <w:jc w:val="both"/>
       </w:pPr>
       <w:r>
-        <w:t>셋째, AI는 같은 기반 모델의 편향을 공유할 수 있다. 사용자 지각 품질과 사용성은 검증하지 않았다. 세션 간 일치율이 높아도 독립적인 품질 타당성의 증거가 되지 않는다.</w:t>
+        <w:t>자료는 합성 인물 6명에 집중되어 있으며 후속 비교는 3명, 로컬 모델 비교는 1명과 두 시드로 구성되었다. 동일 인물의 반복과 정책 간 공유 출력에 따른 종속성이 존재한다. 초기 생성기의 백엔드 버전·시드 불확실성과 사후에 설계한 ROI 민감도 분석도 일반화를 제한한다. AI 등급은 동일 기반 모델의 편향을 공유할 수 있으며, 웹 편집기 검증 범위는 상태 처리와 생성·복원 기능이다.</w:t>
       </w:r>
     </w:p>
     <w:p>
@@ -3803,15 +3803,7 @@
         <w:jc w:val="both"/>
       </w:pPr>
       <w:r>
-        <w:t>넷째, 데이터는 합성 인물 6명과 제한된 비얼굴 과제에 집중되어 있다. 후속 반복은 주로 3명, 로컬 비교는 1명이다. 98개 출력이 98명의 독립 인물을 의미하지 않는다. 피부 유형·자세·표정·조명·해상도 및 실제 사용자 사진에 대한 일반화는 확인하지 않았다. 이미지 생성기의 버전 불확실성, 정책 간 공유 출력, 서로 다른 호출 예산도 해석을 제한한다.</w:t>
-      </w:r>
-    </w:p>
-    <w:p>
-      <w:pPr>
-        <w:jc w:val="both"/>
-      </w:pPr>
-      <w:r>
-        <w:t>다섯째, 로컬 민감도 분석은 결과를 본 뒤 수행했다. 여러 설정의 전체 보고와 재계산 검증은 선택적 보고를 줄이지만 사전 등록을 대신하지 못한다. 후속 확증 실험에서는 가설·ROI·주 지표·허용 실패·시드·제외 기준을 미리 고정하고, 새 인물과 새 요청을 사용해야 한다. 통계 분석은 인물 및 반복의 군집 구조를 반영해야 한다.</w:t>
+        <w:t>후속 연구에서는 새 인물과 편집 요청을 대상으로 가설, ROI, 주 지표, 시드 및 제외 기준을 사전에 고정하고 인물·반복의 군집 구조를 반영하여 분석할 필요가 있다. 실제 사진, 표정·자세 변경, 직전 출력의 세부 유지와 같은 과제로 범위를 확장하고 지각적 품질 및 사용성을 추가 검증할 수 있다.</w:t>
       </w:r>
     </w:p>
     <w:p>
@@ -3827,7 +3819,7 @@
         <w:jc w:val="both"/>
       </w:pPr>
       <w:r>
-        <w:t>본 탐색적 연구에서 순차 편집은 최초 원본과의 얼굴 차이가 누적되는 사례를 보였으며, 원본 기반 또는 일괄 생성은 여러 비교에서 더 작은 얼굴 거리를 보였다. 피부 원시 MAE의 우열은 일부 설정에서 반대여서 모든 보존 지표의 우월성으로 확대할 수 없다. 최초 원본과 누적 요구사항을 관리하는 웹 편집기의 실제 생성과 상태 복원을 확인했지만 기능 테스트를 사용자 만족도나 지각적 품질의 검증으로 해석하지 않는다. 결과는 제한된 입력 정책의 비교와 후속 확증 실험의 근거다.</w:t>
+        <w:t>본 연구는 반복 이미지 편집에서 직전 출력 기반 순차 방식과 최초 원본 기반 재생성을 비교하였다. 원본 기반 방식은 여러 조건에서 더 낮은 얼굴 거리를 보였으며, 무변경 반복에서도 원본과의 차이가 누적되었다. 피부 내부 지표의 비교 방향은 측정 조건에 따라 달라 원본 거리와 피부 세부 변화를 구분하는 분석이 필요하였다. 이러한 관찰을 바탕으로 최초 원본과 누적 요구사항을 관리하는 웹 편집기를 구현하고, 35개 요청 회귀 검사와 실제 이미지 생성·상태 복원 동작을 확인하였다.</w:t>
       </w:r>
     </w:p>
     <w:p>

</xml_diff>

<commit_message>
Add sequential and regeneration studio modes with measured comparison
</commit_message>
<xml_diff>
--- a/paper/manuscript.inha.docx
+++ b/paper/manuscript.inha.docx
@@ -76,7 +76,7 @@
         <w:t xml:space="preserve">요약: </w:t>
       </w:r>
       <w:r>
-        <w:t>이미지 편집 시스템에서 앞선 생성물을 다음 입력으로 사용하면 요청하지 않은 얼굴 변화가 누적될 수 있다. 본 연구는 순차 편집과 최초 원본에 누적 요구사항을 적용하는 재생성을 비교한다. 초기 실험은 합성 인물 6명과 순차 7경로, 후속 통제 실험은 기존 3인물의 98개 출력을 포함한다. 얼굴 MAE·SSIM·LPIPS, 피부 내부 영역 및 별도 AI 등급으로 분석하였다. 세 인물의 후속 비교에서 일괄 편집의 평균 얼굴 LPIPS가 순차보다 낮았다. 별도 FLUX.2 Klein 4B 실험의 두 시드 평균 LPIPS는 일괄 0.091313, 순차 0.124455였으나 피부 원시 MAE는 일부 설정에서 반대 방향이었다. 최초 원본과 누적 요구를 분리하는 웹 편집기를 구현하고, 실제 생성·설정 저장·버전 복원 및 알려진 요청 35개의 회귀 검사를 수행하였다. 실험 결과는 원본 기반 입력 정책의 효과가 측정 영역과 지표에 따라 달라짐을 보여주며, 누적 요구사항을 관리하는 편집기의 구현 근거를 제공한다.</w:t>
+        <w:t>이미지 편집 시스템에서 앞선 생성물을 다음 입력으로 사용하면 요청하지 않은 얼굴 변화가 누적될 수 있다. 본 연구는 순차 편집과 최초 원본에 누적 요구사항을 적용하는 재생성을 비교한다. 초기 실험은 합성 인물 6명과 순차 7경로, 후속 통제 실험은 기존 3인물의 98개 출력을 포함한다. 얼굴 MAE·SSIM·LPIPS, 피부 내부 영역 및 별도 AI 등급으로 분석하였다. 세 인물의 후속 비교에서 일괄 편집의 평균 얼굴 LPIPS가 순차보다 낮았다. 별도 FLUX.2 Klein 4B 실험의 두 시드 평균 LPIPS는 일괄 0.091313, 순차 0.124455였으나 피부 원시 MAE는 일부 설정에서 반대 방향이었다. 최초 원본과 누적 요구를 분리하는 웹 편집기를 구현하고, 실제 생성·설정 저장·버전 복원 및 알려진 요청 35개의 회귀 검사를 수행하였다. 웹 생성 경로의 두 시드 평균 얼굴 LPIPS는 일괄 0.081096, 순차 0.103531이었다. 실험 결과는 원본 기반 입력 정책의 효과가 측정 영역과 지표에 따라 달라짐을 보여주며, 누적 요구사항을 관리하는 편집기의 구현 근거를 제공한다.</w:t>
       </w:r>
     </w:p>
     <w:p>
@@ -90,7 +90,7 @@
         <w:t xml:space="preserve">Abstract: </w:t>
       </w:r>
       <w:r>
-        <w:t>We compare sequential image editing with regeneration from the original image and accumulated requirements. Experiments include six synthetic identities, 98 follow-up outputs from three identities, automatic image metrics and separate AI ratings. Batch editing produced lower mean facial LPIPS in the tested follow-up comparisons. A local FLUX.2 Klein 4B comparison yielded mean LPIPS of 0.091313 for batch and 0.124455 for sequential editing, while raw skin MAE reversed the ranking in some settings. A web editor implemented the workflow. Recorded checks covered real generation, state changes, version restoration and 35 known request regression cases. The findings characterize the dependence of input-policy effects on measurement regions and support an editor that maintains accumulated editing requirements.</w:t>
+        <w:t>We compare sequential image editing with regeneration from the original image and accumulated requirements. Experiments include six synthetic identities, 98 follow-up outputs from three identities, automatic image metrics and separate AI ratings. Batch editing produced lower mean facial LPIPS in the tested follow-up comparisons. A local FLUX.2 Klein 4B comparison yielded mean LPIPS of 0.091313 for batch and 0.124455 for sequential editing, while raw skin MAE reversed the ranking in some settings. A web editor implemented the workflow. Recorded checks covered real generation, state changes, version restoration and 35 known request regression cases. A separate website-path comparison yielded mean facial LPIPS of 0.081096 for batch and 0.103531 for sequential editing across two seeds. The findings characterize the dependence of input-policy effects on measurement regions and support an editor that maintains accumulated editing requirements.</w:t>
       </w:r>
     </w:p>
     <w:p>
@@ -500,6 +500,65 @@
         <w:tc>
           <w:tcPr>
             <w:tcW w:type="dxa" w:w="3213"/>
+          </w:tcPr>
+          <w:p>
+            <w:pPr>
+              <w:spacing w:after="60" w:before="60" w:line="240" w:lineRule="auto"/>
+              <w:ind w:firstLine="0"/>
+            </w:pPr>
+            <w:r>
+              <w:rPr>
+                <w:b w:val="0"/>
+                <w:sz w:val="16"/>
+              </w:rPr>
+              <w:t>로컬 ROI 민감도 분석</w:t>
+            </w:r>
+          </w:p>
+        </w:tc>
+        <w:tc>
+          <w:tcPr>
+            <w:tcW w:type="dxa" w:w="3213"/>
+          </w:tcPr>
+          <w:p>
+            <w:pPr>
+              <w:spacing w:after="60" w:before="60" w:line="240" w:lineRule="auto"/>
+              <w:ind w:firstLine="0"/>
+            </w:pPr>
+            <w:r>
+              <w:rPr>
+                <w:b w:val="0"/>
+                <w:sz w:val="16"/>
+              </w:rPr>
+              <w:t>위 8개 재분석, 최종 4개 별도 집계</w:t>
+            </w:r>
+          </w:p>
+        </w:tc>
+        <w:tc>
+          <w:tcPr>
+            <w:tcW w:type="dxa" w:w="3213"/>
+          </w:tcPr>
+          <w:p>
+            <w:pPr>
+              <w:spacing w:after="60" w:before="60" w:line="240" w:lineRule="auto"/>
+              <w:ind w:firstLine="0"/>
+            </w:pPr>
+            <w:r>
+              <w:rPr>
+                <w:b w:val="0"/>
+                <w:sz w:val="16"/>
+              </w:rPr>
+              <w:t>기존 출력의 지표 재분석</w:t>
+            </w:r>
+          </w:p>
+        </w:tc>
+      </w:tr>
+      <w:tr>
+        <w:trPr>
+          <w:cantSplit/>
+        </w:trPr>
+        <w:tc>
+          <w:tcPr>
+            <w:tcW w:type="dxa" w:w="3213"/>
             <w:tcBorders>
               <w:bottom w:val="single" w:sz="5"/>
             </w:tcBorders>
@@ -514,7 +573,7 @@
                 <w:b w:val="0"/>
                 <w:sz w:val="16"/>
               </w:rPr>
-              <w:t>로컬 ROI 민감도 분석</w:t>
+              <w:t>웹 편집기 정책 비교</w:t>
             </w:r>
           </w:p>
         </w:tc>
@@ -535,7 +594,7 @@
                 <w:b w:val="0"/>
                 <w:sz w:val="16"/>
               </w:rPr>
-              <w:t>위 8개 재분석, 최종 4개 별도 집계</w:t>
+              <w:t>P04, 2시드, 새 출력 8개·최종 4개</w:t>
             </w:r>
           </w:p>
         </w:tc>
@@ -556,7 +615,7 @@
                 <w:b w:val="0"/>
                 <w:sz w:val="16"/>
               </w:rPr>
-              <w:t>기존 출력의 지표 재분석</w:t>
+              <w:t>자동 지표 분석</w:t>
             </w:r>
           </w:p>
         </w:tc>
@@ -3707,7 +3766,7 @@
         <w:jc w:val="both"/>
       </w:pPr>
       <w:r>
-        <w:t>관찰 결과를 바탕으로 최초 원본과 누적 편집 상태를 별도로 저장하는 로컬 편집기를 구현하였다. 사용자의 새 요청은 현재 상태에 대한 변경으로 해석하고, 생성 시에는 최초 원본과 갱신된 전체 요구를 사용한다. 예를 들어 셔츠 변경 다음에 배경 변경을 요청하면 두 요구를 함께 적용하여 최초 원본에서 다시 생성한다. 이전 출력은 버전 이력으로 관리한다.</w:t>
+        <w:t>관찰 결과를 바탕으로 최초 원본과 누적 편집 상태를 별도로 저장하는 로컬 편집기를 구현하였다. 사용자의 새 요청은 현재 상태에 대한 변경으로 해석하고, 생성 방식은 일괄 재생성과 순차 생성 중 선택한다. 일괄 재생성은 최초 원본과 갱신된 전체 요구를 사용하고, 순차 생성은 현재 선택한 버전과 전체 요구를 사용한다. 예를 들어 셔츠 변경 다음에 배경 변경을 요청하면 두 요구를 함께 적용하여 최초 원본에서 다시 생성한다. 첫 순차 생성은 최초 원본에서 시작한다. 이전 출력은 버전 이력으로 관리하며, 과거 버전을 선택한 후 순차 생성하면 선택한 이미지에서 새 경로를 시작한다.</w:t>
       </w:r>
     </w:p>
     <w:p>
@@ -3739,7 +3798,7 @@
         <w:jc w:val="both"/>
       </w:pPr>
       <w:r>
-        <w:t xml:space="preserve">웹 편집기는 로컬 주소 http://localhost:8770 에서 실행한다. 저장된 실행 검증에서 한국어 요청 반영, 최초 원본 기반 이미지 생성, PNG 결과 조회, 수동 설정 저장, 이미지·설정 버전 복원, 오래된 수정 요청의 거부를 확인했다. 실제 생성 1회의 기록 시간은 95.28초다. </w:t>
+        <w:t>웹 편집기는 로컬 주소 http://localhost:8770 에서 실행한다. 저장된 실행 검증에서 한국어 요청 반영, 최초 원본 기반 이미지 생성, PNG 결과 조회, 수동 설정 저장, 이미지·설정 버전 복원, 오래된 수정 요청의 거부를 확인했다. 실제 생성 1회의 기록 시간은 95.28초다.</w:t>
       </w:r>
     </w:p>
     <w:p>
@@ -3747,7 +3806,7 @@
         <w:jc w:val="both"/>
       </w:pPr>
       <w:r>
-        <w:t xml:space="preserve">요청 해석 수정 후 한국어 14개·영어 14개와 추가 7개, 총 35개에서 기대 상태 또는 안전한 보류 응답을 확인했다. 사전에 정의한 35개 회귀 검사 항목을 모두 통과하였다. 사전에 없는 설산 배경 요청 1개는 실제 Qwen3 4B 경로에서 배경만 갱신하고 다른 설정을 유지했다. </w:t>
+        <w:t>요청 해석 수정 후 한국어 14개·영어 14개와 추가 7개, 총 35개에서 기대 상태 또는 안전한 보류 응답을 확인했다. 사전에 정의한 35개 회귀 검사 항목을 모두 통과하였다. 사전에 없는 설산 배경 요청 1개는 실제 Qwen3 4B 경로에서 배경만 갱신하고 다른 설정을 유지했다.</w:t>
       </w:r>
     </w:p>
     <w:p>
@@ -3755,7 +3814,7 @@
         <w:jc w:val="both"/>
       </w:pPr>
       <w:r>
-        <w:t>사용 화면은 이미지 업로드, 수정 요청, 이미지 생성, 다운로드와 버전 선택 중심으로 구성했다. 세부 설정은 접어서 필요할 때 열도록 하고, 요청 이력의 반복 설명을 줄였다. 화면 시험의 출력은 기능 검증 자료로 별도 관리하였다.</w:t>
+        <w:t>사용 화면은 이미지 업로드, 수정 요청, 생성 방식 선택, 이미지 생성, 다운로드와 버전 선택 중심으로 구성했다. 두 버전을 나란히 보는 결과 비교와 시드 저장을 지원하고, 버전마다 입력 이미지의 해시와 사용 시드를 기록한다. 세부 설정은 접어서 필요할 때 열도록 하고, 요청 이력의 반복 설명을 줄였다. 화면 시험의 출력은 기능 검증 자료로 별도 관리하였다.</w:t>
       </w:r>
     </w:p>
     <w:p>
@@ -3763,7 +3822,627 @@
         <w:jc w:val="both"/>
       </w:pPr>
       <w:r>
-        <w:t xml:space="preserve">2026년 9월 13일 UI 변경 후 브라우저에서 “셔츠는 남색으로, 배경은 바다로 바꿔줘”를 입력하였다. 셔츠 navy·배경 ocean·핀 original 상태가 적용되었고, 실제 생성 1회는 101.26초에 완료되었다. 출력 표시와 다운로드 링크를 확인한 뒤 셔츠 설정을 변경·저장하고, 이전 버전 선택으로 이미지와 남색·바다 설정이 복원됨을 확인했다. </w:t>
+        <w:t>2026년 9월 13일 UI 변경 후 브라우저에서 “셔츠는 남색으로, 배경은 바다로 바꿔줘”를 입력하였다. 셔츠 navy·배경 ocean·핀 original 상태가 적용되었고, 실제 생성 1회는 101.26초에 완료되었다. 출력 표시와 다운로드 링크를 확인한 뒤 셔츠 설정을 변경·저장하고, 이전 버전 선택으로 이미지와 남색·바다 설정이 복원됨을 확인했다.</w:t>
+      </w:r>
+    </w:p>
+    <w:p>
+      <w:pPr>
+        <w:pStyle w:val="Heading2"/>
+      </w:pPr>
+      <w:r>
+        <w:t>2. 웹 편집기의 입력 정책 비교</w:t>
+      </w:r>
+    </w:p>
+    <w:p>
+      <w:pPr>
+        <w:jc w:val="both"/>
+      </w:pPr>
+      <w:r>
+        <w:t>2026년 9월 14일 웹 화면과 동일한 HTTP 생성 경로에서 두 모드를 비교하였다. P04 원본, 시드 42·314, 512×768 해상도와 4스텝을 사용하고 남색 셔츠→옅은 파란 배경→은색 핀 순서로 요청하였다. 순차 방식은 각 요청 후 직전 출력을 입력으로 생성하고, 일괄 방식은 세 요청을 모은 뒤 최초 원본에서 한 번 생성하였다. 시드별 실행 순서를 반대로 하였으며 총 8개 출력 중 최종 4개를 비교하였다.</w:t>
+      </w:r>
+    </w:p>
+    <w:p>
+      <w:pPr>
+        <w:jc w:val="both"/>
+      </w:pPr>
+      <w:r>
+        <w:t>최종 상태와 프롬프트는 두 방식에서 같았다. 입력 스냅샷의 해시로 일괄 입력이 최초 원본이며 순차 2·3단계 입력이 직전 출력임을 검증하였다. 얼굴 ROI [176,44,336,224]와 LPIPS 주 지표는 생성 전에 고정하였다.</w:t>
+      </w:r>
+    </w:p>
+    <w:p>
+      <w:pPr>
+        <w:pStyle w:val="Caption"/>
+        <w:keepNext/>
+        <w:ind w:firstLine="0"/>
+        <w:jc w:val="center"/>
+      </w:pPr>
+      <w:r>
+        <w:t>표 7. 웹 편집기 두 모드의 최종 얼굴 지표</w:t>
+      </w:r>
+    </w:p>
+    <w:tbl>
+      <w:tblPr>
+        <w:tblW w:type="auto" w:w="0"/>
+        <w:tblLayout w:type="fixed"/>
+        <w:tblLook w:firstColumn="1" w:firstRow="1" w:lastColumn="0" w:lastRow="0" w:noHBand="0" w:noVBand="1" w:val="04A0"/>
+      </w:tblPr>
+      <w:tblGrid>
+        <w:gridCol w:w="1142"/>
+        <w:gridCol w:w="1142"/>
+        <w:gridCol w:w="1142"/>
+        <w:gridCol w:w="1142"/>
+      </w:tblGrid>
+      <w:tr>
+        <w:trPr>
+          <w:cantSplit/>
+          <w:tblHeader/>
+        </w:trPr>
+        <w:tc>
+          <w:tcPr>
+            <w:tcW w:type="dxa" w:w="1142"/>
+            <w:tcBorders>
+              <w:bottom w:val="single" w:sz="5"/>
+            </w:tcBorders>
+          </w:tcPr>
+          <w:p>
+            <w:pPr>
+              <w:spacing w:after="60" w:before="60" w:line="240" w:lineRule="auto"/>
+              <w:ind w:firstLine="0"/>
+            </w:pPr>
+            <w:r>
+              <w:rPr>
+                <w:b/>
+                <w:sz w:val="16"/>
+              </w:rPr>
+              <w:t>시드·방법</w:t>
+            </w:r>
+          </w:p>
+        </w:tc>
+        <w:tc>
+          <w:tcPr>
+            <w:tcW w:type="dxa" w:w="1142"/>
+            <w:tcBorders>
+              <w:bottom w:val="single" w:sz="5"/>
+            </w:tcBorders>
+          </w:tcPr>
+          <w:p>
+            <w:pPr>
+              <w:spacing w:after="60" w:before="60" w:line="240" w:lineRule="auto"/>
+              <w:ind w:firstLine="0"/>
+            </w:pPr>
+            <w:r>
+              <w:rPr>
+                <w:b/>
+                <w:sz w:val="16"/>
+              </w:rPr>
+              <w:t>MAE</w:t>
+            </w:r>
+          </w:p>
+        </w:tc>
+        <w:tc>
+          <w:tcPr>
+            <w:tcW w:type="dxa" w:w="1142"/>
+            <w:tcBorders>
+              <w:bottom w:val="single" w:sz="5"/>
+            </w:tcBorders>
+          </w:tcPr>
+          <w:p>
+            <w:pPr>
+              <w:spacing w:after="60" w:before="60" w:line="240" w:lineRule="auto"/>
+              <w:ind w:firstLine="0"/>
+            </w:pPr>
+            <w:r>
+              <w:rPr>
+                <w:b/>
+                <w:sz w:val="16"/>
+              </w:rPr>
+              <w:t>SSIM</w:t>
+            </w:r>
+          </w:p>
+        </w:tc>
+        <w:tc>
+          <w:tcPr>
+            <w:tcW w:type="dxa" w:w="1142"/>
+            <w:tcBorders>
+              <w:bottom w:val="single" w:sz="5"/>
+            </w:tcBorders>
+          </w:tcPr>
+          <w:p>
+            <w:pPr>
+              <w:spacing w:after="60" w:before="60" w:line="240" w:lineRule="auto"/>
+              <w:ind w:firstLine="0"/>
+            </w:pPr>
+            <w:r>
+              <w:rPr>
+                <w:b/>
+                <w:sz w:val="16"/>
+              </w:rPr>
+              <w:t>LPIPS</w:t>
+            </w:r>
+          </w:p>
+        </w:tc>
+      </w:tr>
+      <w:tr>
+        <w:trPr>
+          <w:cantSplit/>
+        </w:trPr>
+        <w:tc>
+          <w:tcPr>
+            <w:tcW w:type="dxa" w:w="1142"/>
+          </w:tcPr>
+          <w:p>
+            <w:pPr>
+              <w:spacing w:after="60" w:before="60" w:line="240" w:lineRule="auto"/>
+              <w:ind w:firstLine="0"/>
+            </w:pPr>
+            <w:r>
+              <w:rPr>
+                <w:b w:val="0"/>
+                <w:sz w:val="16"/>
+              </w:rPr>
+              <w:t>42 일괄</w:t>
+            </w:r>
+          </w:p>
+        </w:tc>
+        <w:tc>
+          <w:tcPr>
+            <w:tcW w:type="dxa" w:w="1142"/>
+          </w:tcPr>
+          <w:p>
+            <w:pPr>
+              <w:spacing w:after="60" w:before="60" w:line="240" w:lineRule="auto"/>
+              <w:ind w:firstLine="0"/>
+            </w:pPr>
+            <w:r>
+              <w:rPr>
+                <w:b w:val="0"/>
+                <w:sz w:val="16"/>
+              </w:rPr>
+              <w:t>0.120129</w:t>
+            </w:r>
+          </w:p>
+        </w:tc>
+        <w:tc>
+          <w:tcPr>
+            <w:tcW w:type="dxa" w:w="1142"/>
+          </w:tcPr>
+          <w:p>
+            <w:pPr>
+              <w:spacing w:after="60" w:before="60" w:line="240" w:lineRule="auto"/>
+              <w:ind w:firstLine="0"/>
+            </w:pPr>
+            <w:r>
+              <w:rPr>
+                <w:b w:val="0"/>
+                <w:sz w:val="16"/>
+              </w:rPr>
+              <w:t>0.865709</w:t>
+            </w:r>
+          </w:p>
+        </w:tc>
+        <w:tc>
+          <w:tcPr>
+            <w:tcW w:type="dxa" w:w="1142"/>
+          </w:tcPr>
+          <w:p>
+            <w:pPr>
+              <w:spacing w:after="60" w:before="60" w:line="240" w:lineRule="auto"/>
+              <w:ind w:firstLine="0"/>
+            </w:pPr>
+            <w:r>
+              <w:rPr>
+                <w:b w:val="0"/>
+                <w:sz w:val="16"/>
+              </w:rPr>
+              <w:t>0.081454</w:t>
+            </w:r>
+          </w:p>
+        </w:tc>
+      </w:tr>
+      <w:tr>
+        <w:trPr>
+          <w:cantSplit/>
+        </w:trPr>
+        <w:tc>
+          <w:tcPr>
+            <w:tcW w:type="dxa" w:w="1142"/>
+          </w:tcPr>
+          <w:p>
+            <w:pPr>
+              <w:spacing w:after="60" w:before="60" w:line="240" w:lineRule="auto"/>
+              <w:ind w:firstLine="0"/>
+            </w:pPr>
+            <w:r>
+              <w:rPr>
+                <w:b w:val="0"/>
+                <w:sz w:val="16"/>
+              </w:rPr>
+              <w:t>42 순차</w:t>
+            </w:r>
+          </w:p>
+        </w:tc>
+        <w:tc>
+          <w:tcPr>
+            <w:tcW w:type="dxa" w:w="1142"/>
+          </w:tcPr>
+          <w:p>
+            <w:pPr>
+              <w:spacing w:after="60" w:before="60" w:line="240" w:lineRule="auto"/>
+              <w:ind w:firstLine="0"/>
+            </w:pPr>
+            <w:r>
+              <w:rPr>
+                <w:b w:val="0"/>
+                <w:sz w:val="16"/>
+              </w:rPr>
+              <w:t>0.123059</w:t>
+            </w:r>
+          </w:p>
+        </w:tc>
+        <w:tc>
+          <w:tcPr>
+            <w:tcW w:type="dxa" w:w="1142"/>
+          </w:tcPr>
+          <w:p>
+            <w:pPr>
+              <w:spacing w:after="60" w:before="60" w:line="240" w:lineRule="auto"/>
+              <w:ind w:firstLine="0"/>
+            </w:pPr>
+            <w:r>
+              <w:rPr>
+                <w:b w:val="0"/>
+                <w:sz w:val="16"/>
+              </w:rPr>
+              <w:t>0.790706</w:t>
+            </w:r>
+          </w:p>
+        </w:tc>
+        <w:tc>
+          <w:tcPr>
+            <w:tcW w:type="dxa" w:w="1142"/>
+          </w:tcPr>
+          <w:p>
+            <w:pPr>
+              <w:spacing w:after="60" w:before="60" w:line="240" w:lineRule="auto"/>
+              <w:ind w:firstLine="0"/>
+            </w:pPr>
+            <w:r>
+              <w:rPr>
+                <w:b w:val="0"/>
+                <w:sz w:val="16"/>
+              </w:rPr>
+              <w:t>0.102202</w:t>
+            </w:r>
+          </w:p>
+        </w:tc>
+      </w:tr>
+      <w:tr>
+        <w:trPr>
+          <w:cantSplit/>
+        </w:trPr>
+        <w:tc>
+          <w:tcPr>
+            <w:tcW w:type="dxa" w:w="1142"/>
+          </w:tcPr>
+          <w:p>
+            <w:pPr>
+              <w:spacing w:after="60" w:before="60" w:line="240" w:lineRule="auto"/>
+              <w:ind w:firstLine="0"/>
+            </w:pPr>
+            <w:r>
+              <w:rPr>
+                <w:b w:val="0"/>
+                <w:sz w:val="16"/>
+              </w:rPr>
+              <w:t>314 일괄</w:t>
+            </w:r>
+          </w:p>
+        </w:tc>
+        <w:tc>
+          <w:tcPr>
+            <w:tcW w:type="dxa" w:w="1142"/>
+          </w:tcPr>
+          <w:p>
+            <w:pPr>
+              <w:spacing w:after="60" w:before="60" w:line="240" w:lineRule="auto"/>
+              <w:ind w:firstLine="0"/>
+            </w:pPr>
+            <w:r>
+              <w:rPr>
+                <w:b w:val="0"/>
+                <w:sz w:val="16"/>
+              </w:rPr>
+              <w:t>0.127843</w:t>
+            </w:r>
+          </w:p>
+        </w:tc>
+        <w:tc>
+          <w:tcPr>
+            <w:tcW w:type="dxa" w:w="1142"/>
+          </w:tcPr>
+          <w:p>
+            <w:pPr>
+              <w:spacing w:after="60" w:before="60" w:line="240" w:lineRule="auto"/>
+              <w:ind w:firstLine="0"/>
+            </w:pPr>
+            <w:r>
+              <w:rPr>
+                <w:b w:val="0"/>
+                <w:sz w:val="16"/>
+              </w:rPr>
+              <w:t>0.856951</w:t>
+            </w:r>
+          </w:p>
+        </w:tc>
+        <w:tc>
+          <w:tcPr>
+            <w:tcW w:type="dxa" w:w="1142"/>
+          </w:tcPr>
+          <w:p>
+            <w:pPr>
+              <w:spacing w:after="60" w:before="60" w:line="240" w:lineRule="auto"/>
+              <w:ind w:firstLine="0"/>
+            </w:pPr>
+            <w:r>
+              <w:rPr>
+                <w:b w:val="0"/>
+                <w:sz w:val="16"/>
+              </w:rPr>
+              <w:t>0.080738</w:t>
+            </w:r>
+          </w:p>
+        </w:tc>
+      </w:tr>
+      <w:tr>
+        <w:trPr>
+          <w:cantSplit/>
+        </w:trPr>
+        <w:tc>
+          <w:tcPr>
+            <w:tcW w:type="dxa" w:w="1142"/>
+          </w:tcPr>
+          <w:p>
+            <w:pPr>
+              <w:spacing w:after="60" w:before="60" w:line="240" w:lineRule="auto"/>
+              <w:ind w:firstLine="0"/>
+            </w:pPr>
+            <w:r>
+              <w:rPr>
+                <w:b w:val="0"/>
+                <w:sz w:val="16"/>
+              </w:rPr>
+              <w:t>314 순차</w:t>
+            </w:r>
+          </w:p>
+        </w:tc>
+        <w:tc>
+          <w:tcPr>
+            <w:tcW w:type="dxa" w:w="1142"/>
+          </w:tcPr>
+          <w:p>
+            <w:pPr>
+              <w:spacing w:after="60" w:before="60" w:line="240" w:lineRule="auto"/>
+              <w:ind w:firstLine="0"/>
+            </w:pPr>
+            <w:r>
+              <w:rPr>
+                <w:b w:val="0"/>
+                <w:sz w:val="16"/>
+              </w:rPr>
+              <w:t>0.139762</w:t>
+            </w:r>
+          </w:p>
+        </w:tc>
+        <w:tc>
+          <w:tcPr>
+            <w:tcW w:type="dxa" w:w="1142"/>
+          </w:tcPr>
+          <w:p>
+            <w:pPr>
+              <w:spacing w:after="60" w:before="60" w:line="240" w:lineRule="auto"/>
+              <w:ind w:firstLine="0"/>
+            </w:pPr>
+            <w:r>
+              <w:rPr>
+                <w:b w:val="0"/>
+                <w:sz w:val="16"/>
+              </w:rPr>
+              <w:t>0.772908</w:t>
+            </w:r>
+          </w:p>
+        </w:tc>
+        <w:tc>
+          <w:tcPr>
+            <w:tcW w:type="dxa" w:w="1142"/>
+          </w:tcPr>
+          <w:p>
+            <w:pPr>
+              <w:spacing w:after="60" w:before="60" w:line="240" w:lineRule="auto"/>
+              <w:ind w:firstLine="0"/>
+            </w:pPr>
+            <w:r>
+              <w:rPr>
+                <w:b w:val="0"/>
+                <w:sz w:val="16"/>
+              </w:rPr>
+              <w:t>0.104861</w:t>
+            </w:r>
+          </w:p>
+        </w:tc>
+      </w:tr>
+      <w:tr>
+        <w:trPr>
+          <w:cantSplit/>
+        </w:trPr>
+        <w:tc>
+          <w:tcPr>
+            <w:tcW w:type="dxa" w:w="1142"/>
+          </w:tcPr>
+          <w:p>
+            <w:pPr>
+              <w:spacing w:after="60" w:before="60" w:line="240" w:lineRule="auto"/>
+              <w:ind w:firstLine="0"/>
+            </w:pPr>
+            <w:r>
+              <w:rPr>
+                <w:b w:val="0"/>
+                <w:sz w:val="16"/>
+              </w:rPr>
+              <w:t>일괄 평균</w:t>
+            </w:r>
+          </w:p>
+        </w:tc>
+        <w:tc>
+          <w:tcPr>
+            <w:tcW w:type="dxa" w:w="1142"/>
+          </w:tcPr>
+          <w:p>
+            <w:pPr>
+              <w:spacing w:after="60" w:before="60" w:line="240" w:lineRule="auto"/>
+              <w:ind w:firstLine="0"/>
+            </w:pPr>
+            <w:r>
+              <w:rPr>
+                <w:b w:val="0"/>
+                <w:sz w:val="16"/>
+              </w:rPr>
+              <w:t>0.123986</w:t>
+            </w:r>
+          </w:p>
+        </w:tc>
+        <w:tc>
+          <w:tcPr>
+            <w:tcW w:type="dxa" w:w="1142"/>
+          </w:tcPr>
+          <w:p>
+            <w:pPr>
+              <w:spacing w:after="60" w:before="60" w:line="240" w:lineRule="auto"/>
+              <w:ind w:firstLine="0"/>
+            </w:pPr>
+            <w:r>
+              <w:rPr>
+                <w:b w:val="0"/>
+                <w:sz w:val="16"/>
+              </w:rPr>
+              <w:t>0.861330</w:t>
+            </w:r>
+          </w:p>
+        </w:tc>
+        <w:tc>
+          <w:tcPr>
+            <w:tcW w:type="dxa" w:w="1142"/>
+          </w:tcPr>
+          <w:p>
+            <w:pPr>
+              <w:spacing w:after="60" w:before="60" w:line="240" w:lineRule="auto"/>
+              <w:ind w:firstLine="0"/>
+            </w:pPr>
+            <w:r>
+              <w:rPr>
+                <w:b w:val="0"/>
+                <w:sz w:val="16"/>
+              </w:rPr>
+              <w:t>0.081096</w:t>
+            </w:r>
+          </w:p>
+        </w:tc>
+      </w:tr>
+      <w:tr>
+        <w:trPr>
+          <w:cantSplit/>
+        </w:trPr>
+        <w:tc>
+          <w:tcPr>
+            <w:tcW w:type="dxa" w:w="1142"/>
+            <w:tcBorders>
+              <w:bottom w:val="single" w:sz="5"/>
+            </w:tcBorders>
+          </w:tcPr>
+          <w:p>
+            <w:pPr>
+              <w:spacing w:after="60" w:before="60" w:line="240" w:lineRule="auto"/>
+              <w:ind w:firstLine="0"/>
+            </w:pPr>
+            <w:r>
+              <w:rPr>
+                <w:b w:val="0"/>
+                <w:sz w:val="16"/>
+              </w:rPr>
+              <w:t>순차 평균</w:t>
+            </w:r>
+          </w:p>
+        </w:tc>
+        <w:tc>
+          <w:tcPr>
+            <w:tcW w:type="dxa" w:w="1142"/>
+            <w:tcBorders>
+              <w:bottom w:val="single" w:sz="5"/>
+            </w:tcBorders>
+          </w:tcPr>
+          <w:p>
+            <w:pPr>
+              <w:spacing w:after="60" w:before="60" w:line="240" w:lineRule="auto"/>
+              <w:ind w:firstLine="0"/>
+            </w:pPr>
+            <w:r>
+              <w:rPr>
+                <w:b w:val="0"/>
+                <w:sz w:val="16"/>
+              </w:rPr>
+              <w:t>0.131411</w:t>
+            </w:r>
+          </w:p>
+        </w:tc>
+        <w:tc>
+          <w:tcPr>
+            <w:tcW w:type="dxa" w:w="1142"/>
+            <w:tcBorders>
+              <w:bottom w:val="single" w:sz="5"/>
+            </w:tcBorders>
+          </w:tcPr>
+          <w:p>
+            <w:pPr>
+              <w:spacing w:after="60" w:before="60" w:line="240" w:lineRule="auto"/>
+              <w:ind w:firstLine="0"/>
+            </w:pPr>
+            <w:r>
+              <w:rPr>
+                <w:b w:val="0"/>
+                <w:sz w:val="16"/>
+              </w:rPr>
+              <w:t>0.781807</w:t>
+            </w:r>
+          </w:p>
+        </w:tc>
+        <w:tc>
+          <w:tcPr>
+            <w:tcW w:type="dxa" w:w="1142"/>
+            <w:tcBorders>
+              <w:bottom w:val="single" w:sz="5"/>
+            </w:tcBorders>
+          </w:tcPr>
+          <w:p>
+            <w:pPr>
+              <w:spacing w:after="60" w:before="60" w:line="240" w:lineRule="auto"/>
+              <w:ind w:firstLine="0"/>
+            </w:pPr>
+            <w:r>
+              <w:rPr>
+                <w:b w:val="0"/>
+                <w:sz w:val="16"/>
+              </w:rPr>
+              <w:t>0.103531</w:t>
+            </w:r>
+          </w:p>
+        </w:tc>
+      </w:tr>
+    </w:tbl>
+    <w:p>
+      <w:pPr>
+        <w:jc w:val="both"/>
+      </w:pPr>
+      <w:r>
+        <w:t>두 시드 모두 일괄 방식의 MAE·LPIPS가 낮고 SSIM이 높았다. 평균 LPIPS는 일괄 0.081096, 순차 0.103531로 일괄이 21.7% 낮았다. 최종 네 이미지에서 남색 셔츠, 옅은 파란 배경과 핀 하나를 확인하였다. 모델 로딩과 저장을 포함한 평균 경로 처리 시간은 일괄 1회 115.1초, 순차 3회 합계 373.4초였다. 본 비교는 한 합성 인물·두 시드의 사이트 실행 결과이며 4.4절의 명령줄 실험과 별도로 집계하였다.</w:t>
       </w:r>
     </w:p>
     <w:p>
@@ -3795,7 +4474,7 @@
         <w:jc w:val="both"/>
       </w:pPr>
       <w:r>
-        <w:t>자료는 합성 인물 6명에 집중되어 있으며 후속 비교는 3명, 로컬 모델 비교는 1명과 두 시드로 구성되었다. 동일 인물의 반복과 정책 간 공유 출력에 따른 종속성이 존재한다. 초기 생성기의 백엔드 버전·시드 불확실성과 사후에 설계한 ROI 민감도 분석도 일반화를 제한한다. AI 등급은 동일 기반 모델의 편향을 공유할 수 있으며, 웹 편집기 검증 범위는 상태 처리와 생성·복원 기능이다.</w:t>
+        <w:t>자료는 합성 인물 6명에 집중되어 있으며 후속 비교는 3명, 로컬 모델 비교는 1명과 두 시드로 구성되었다. 동일 인물의 반복과 정책 간 공유 출력에 따른 종속성이 존재한다. 초기 생성기의 백엔드 버전·시드 불확실성과 사후에 설계한 ROI 민감도 분석도 일반화를 제한한다. AI 등급은 동일 기반 모델의 편향을 공유할 수 있으며, 웹 편집기에서는 상태 처리와 생성·복원 기능 및 동일 인물·두 시드의 입력 정책을 검증하였다.</w:t>
       </w:r>
     </w:p>
     <w:p>
@@ -3819,7 +4498,7 @@
         <w:jc w:val="both"/>
       </w:pPr>
       <w:r>
-        <w:t>본 연구는 반복 이미지 편집에서 직전 출력 기반 순차 방식과 최초 원본 기반 재생성을 비교하였다. 원본 기반 방식은 여러 조건에서 더 낮은 얼굴 거리를 보였으며, 무변경 반복에서도 원본과의 차이가 누적되었다. 피부 내부 지표의 비교 방향은 측정 조건에 따라 달라 원본 거리와 피부 세부 변화를 구분하는 분석이 필요하였다. 이러한 관찰을 바탕으로 최초 원본과 누적 요구사항을 관리하는 웹 편집기를 구현하고, 35개 요청 회귀 검사와 실제 이미지 생성·상태 복원 동작을 확인하였다.</w:t>
+        <w:t>본 연구는 반복 이미지 편집에서 직전 출력 기반 순차 방식과 최초 원본 기반 재생성을 비교하였다. 원본 기반 방식은 여러 조건에서 더 낮은 얼굴 거리를 보였으며, 무변경 반복에서도 원본과의 차이가 누적되었다. 피부 내부 지표의 비교 방향은 측정 조건에 따라 달라 원본 거리와 피부 세부 변화를 구분하는 분석이 필요하였다. 이러한 관찰을 바탕으로 최초 원본과 누적 요구사항을 관리하는 웹 편집기를 구현하고, 35개 요청 회귀 검사와 실제 이미지 생성·상태 복원 동작을 확인하였다. 웹 편집기의 두 시드 비교에서도 일괄 방식은 순차보다 낮은 얼굴 MAE·LPIPS와 높은 SSIM을 보였다.</w:t>
       </w:r>
     </w:p>
     <w:p>

</xml_diff>

<commit_message>
Trim paper and slides to core comparison results
</commit_message>
<xml_diff>
--- a/paper/manuscript.inha.docx
+++ b/paper/manuscript.inha.docx
@@ -76,7 +76,7 @@
         <w:t xml:space="preserve">요약: </w:t>
       </w:r>
       <w:r>
-        <w:t>이미지 편집 시스템에서 앞선 생성물을 다음 입력으로 사용하면 요청하지 않은 얼굴 변화가 누적될 수 있다. 본 연구는 순차 편집과 최초 원본에 누적 요구사항을 적용하는 재생성을 비교한다. 초기 실험은 합성 인물 6명과 순차 7경로, 후속 통제 실험은 기존 3인물의 98개 출력을 포함한다. 얼굴 MAE·SSIM·LPIPS, 피부 내부 영역 및 별도 AI 등급으로 분석하였다. 세 인물의 후속 비교에서 일괄 편집의 평균 얼굴 LPIPS가 순차보다 낮았다. 별도 FLUX.2 Klein 4B 실험의 두 시드 평균 LPIPS는 일괄 0.091313, 순차 0.124455였으나 피부 원시 MAE는 일부 설정에서 반대 방향이었다. 최초 원본과 누적 요구를 분리하는 웹 편집기를 구현하고, 실제 생성·설정 저장·버전 복원 및 알려진 요청 35개의 회귀 검사를 수행하였다. 웹 생성 경로의 두 시드 평균 얼굴 LPIPS는 일괄 0.081096, 순차 0.103531이었다. 실험 결과는 원본 기반 입력 정책의 효과가 측정 영역과 지표에 따라 달라짐을 보여주며, 누적 요구사항을 관리하는 편집기의 구현 근거를 제공한다.</w:t>
+        <w:t>이미지 편집 시스템에서 앞선 생성물을 다음 입력으로 사용하면 요청하지 않은 얼굴 변화가 누적될 수 있다. 본 연구는 순차 편집과 최초 원본에 누적 요구사항을 적용하는 재생성을 비교한다. 초기 실험은 합성 인물 6명과 순차 7경로, 후속 통제 실험은 기존 3인물의 98개 출력을 포함한다. 얼굴 MAE·SSIM·LPIPS, 피부 내부 영역 및 별도 AI 등급으로 분석하였다. 세 인물의 후속 비교에서 일괄 편집의 평균 얼굴 LPIPS가 순차보다 낮았다. 별도 FLUX.2 Klein 4B 실험의 두 시드 평균 LPIPS는 일괄 0.091313, 순차 0.124455였으나 피부 원시 MAE는 일부 설정에서 반대 방향이었다. 최초 원본과 누적 요구를 분리하는 웹 편집기를 구현하였다. 웹 생성 경로의 두 시드 평균 얼굴 LPIPS는 일괄 0.081096, 순차 0.103531이었다. 실험 결과는 원본 기반 입력 정책의 효과가 측정 영역과 지표에 따라 달라짐을 보여주며, 누적 요구사항을 관리하는 편집기의 구현 근거를 제공한다.</w:t>
       </w:r>
     </w:p>
     <w:p>
@@ -90,7 +90,7 @@
         <w:t xml:space="preserve">Abstract: </w:t>
       </w:r>
       <w:r>
-        <w:t>We compare sequential image editing with regeneration from the original image and accumulated requirements. Experiments include six synthetic identities, 98 follow-up outputs from three identities, automatic image metrics and separate AI ratings. Batch editing produced lower mean facial LPIPS in the tested follow-up comparisons. A local FLUX.2 Klein 4B comparison yielded mean LPIPS of 0.091313 for batch and 0.124455 for sequential editing, while raw skin MAE reversed the ranking in some settings. A web editor implemented the workflow. Recorded checks covered real generation, state changes, version restoration and 35 known request regression cases. A separate website-path comparison yielded mean facial LPIPS of 0.081096 for batch and 0.103531 for sequential editing across two seeds. The findings characterize the dependence of input-policy effects on measurement regions and support an editor that maintains accumulated editing requirements.</w:t>
+        <w:t>We compare sequential image editing with regeneration from the original image and accumulated requirements. Experiments include six synthetic identities, 98 follow-up outputs from three identities, automatic image metrics and separate AI ratings. Batch editing produced lower mean facial LPIPS in the tested follow-up comparisons. A local FLUX.2 Klein 4B comparison yielded mean LPIPS of 0.091313 for batch and 0.124455 for sequential editing, while raw skin MAE reversed the ranking in some settings. A web editor implemented the workflow. A separate website-path comparison yielded mean facial LPIPS of 0.081096 for batch and 0.103531 for sequential editing across two seeds. The findings characterize the dependence of input-policy effects on measurement regions and support an editor that maintains accumulated editing requirements.</w:t>
       </w:r>
     </w:p>
     <w:p>
@@ -211,7 +211,7 @@
         <w:jc w:val="both"/>
       </w:pPr>
       <w:r>
-        <w:t>인물 P01–P06은 합성 이미지다. 초기 순차 편집은 6명에 대해 7경로를 구성하며 P03에 두 경로가 있다. 정책 비교는 20경로의 198단계 출력을 포함하며, 경로 간 공유 출력과 동일 인물의 반복 관측을 구분하여 집계하였다. 완료된 10단계 경로는 19개다. 확장 계획의 신규 27회 중 25회가 성공했고, P05의 1회 개입 경로 9단계는 도구 차단, 10단계는 미실행으로 기록했다. 미완료 단계의 품질 점수는 결측으로 처리하였다. 분석별 자료 범위는 표 1에 제시하였다.</w:t>
+        <w:t>인물 P01–P06은 합성 이미지다. 초기 순차 편집은 6명에 대해 7경로를 구성하며 P03에 두 경로가 있다. 정책 비교는 20경로의 198단계 출력을 포함한다. 경로 간 공유 출력과 동일 인물의 반복 관측을 구분하고, 미완료 단계는 결측으로 처리하였다. 분석별 자료 범위는 표 1에 제시하였다.</w:t>
       </w:r>
     </w:p>
     <w:p>
@@ -717,7 +717,7 @@
         <w:jc w:val="both"/>
       </w:pPr>
       <w:r>
-        <w:t>AI 열화 등급은 없음(0), 약함(1), 뚜렷함(2), 심함(3)이다. 초기 AI 평가는 같은 기반 모델의 두 세션이 고유 111개 출력을 평가한 것이다. 원본 대조 10개와 숨은 반복 12개를 세션별로 추가하였다. 후속 평가는 별도 세션에서 익명 최종 후보 12개와 원본 대조 3개를 평가하였다. 비교판에서 판정하기 어려웠던 두 이미지는 개별 PNG 확인 후 판정하였으며 최초 기록을 보존했다. 세션 간 일치율로 동일 모델의 평가 일관성을 분석하였다.</w:t>
+        <w:t>AI 열화 등급은 없음(0), 약함(1), 뚜렷함(2), 심함(3)이다. 초기 AI 평가는 같은 기반 모델의 두 세션이 고유 111개 출력을 평가한 것이다. 원본 대조 10개와 숨은 반복 12개를 세션별로 추가하였다. 후속 평가는 별도 세션에서 익명 최종 후보 12개와 원본 대조 3개를 평가하였다.  세션 간 일치율로 동일 모델의 평가 일관성을 분석하였다.</w:t>
       </w:r>
     </w:p>
     <w:p>
@@ -741,7 +741,7 @@
         <w:jc w:val="both"/>
       </w:pPr>
       <w:r>
-        <w:t>후속 분석은 저장된 출력 해시, 입력 연결, ROI 및 지표 재계산으로 검증하였다. 새 로컬 민감도 분석은 고정 얼굴 결과를 본 이후 설계한 사후 분석이다. 모든 보정 설정의 결과를 함께 제시하고, 인물과 시드별 기술 통계로 비교하였다.</w:t>
+        <w:t>로컬 영역 민감도 분석은 고정 얼굴 결과를 확인한 후 설계한 사후 분석이다. 모든 보정 설정을 인물과 시드별 기술 통계로 비교하였다.</w:t>
       </w:r>
     </w:p>
     <w:p>
@@ -2012,7 +2012,7 @@
         <w:jc w:val="both"/>
       </w:pPr>
       <w:r>
-        <w:t>초기 AI 두 세션은 고유 111개에서 99/111(89.19%) 정확 일치, 등급 2 이상 기준에서 107/111(96.40%) 일치를 보였으며 선형 가중 κ는 0.897이었다. 숨은 반복 정확 일치는 각각 11/12와 12/12, 원본 대조는 각각 10/10이었다. 이 수치는 동일 기반 모델의 세션 간 평가 일관성을 나타낸다.</w:t>
+        <w:t>초기 AI 두 세션의 정확 일치율은 89.19%, 선형 가중 κ는 0.897이었다.</w:t>
       </w:r>
     </w:p>
     <w:p>
@@ -2632,7 +2632,7 @@
         <w:pStyle w:val="Heading2"/>
       </w:pPr>
       <w:r>
-        <w:t>5. 추가 사후 분석: 영역과 위치 보정</w:t>
+        <w:t>5. 영역과 위치 보정에 따른 차이</w:t>
       </w:r>
     </w:p>
     <w:p>
@@ -2640,7 +2640,7 @@
         <w:jc w:val="both"/>
       </w:pPr>
       <w:r>
-        <w:t>로컬 얼굴 ROI는 [176,44,336,224]이며 피부 영역은 이마 [226,72,284,89], 화면 왼쪽 볼 [206,132,224,153], 오른쪽 볼 [286,132,302,153]이다. 피부 좌표는 기존 고해상도 P04 영역의 정확한 절반이다. NCC 탐색 범위는 ±32픽셀로 설정했다. 원본 대조, 알려진 평행이동 회복, 기존 고정 얼굴 수치 재현 및 MSE 분해 항등식을 검증했으며 탐색 경계에 닿은 사례는 없었다.</w:t>
+        <w:t xml:space="preserve">로컬 얼굴 ROI는 [176,44,336,224]이며 피부 영역은 이마 [226,72,284,89], 화면 왼쪽 볼 [206,132,224,153], 오른쪽 볼 [286,132,302,153]이다. 피부 좌표는 기존 고해상도 P04 영역의 정확한 절반이다. NCC 탐색 범위는 ±32픽셀로 설정했다. </w:t>
       </w:r>
     </w:p>
     <w:p>
@@ -3766,7 +3766,7 @@
         <w:jc w:val="both"/>
       </w:pPr>
       <w:r>
-        <w:t>관찰 결과를 바탕으로 최초 원본과 누적 편집 상태를 별도로 저장하는 로컬 편집기를 구현하였다. 사용자의 새 요청은 현재 상태에 대한 변경으로 해석하고, 생성 방식은 일괄 재생성과 순차 생성 중 선택한다. 일괄 재생성은 최초 원본과 갱신된 전체 요구를 사용하고, 순차 생성은 현재 선택한 버전과 전체 요구를 사용한다. 예를 들어 셔츠 변경 다음에 배경 변경을 요청하면 두 요구를 함께 적용하여 최초 원본에서 다시 생성한다. 첫 순차 생성은 최초 원본에서 시작한다. 이전 출력은 버전 이력으로 관리하며, 과거 버전을 선택한 후 순차 생성하면 선택한 이미지에서 새 경로를 시작한다.</w:t>
+        <w:t>관찰 결과를 바탕으로 최초 원본과 누적 편집 상태를 별도로 저장하는 로컬 편집기를 구현하였다. 사용자의 새 요청은 현재 상태에 대한 변경으로 해석하고, 생성 방식은 일괄 재생성과 순차 생성 중 선택한다. 일괄 재생성은 최초 원본과 갱신된 전체 요구를 사용하고, 순차 생성은 현재 선택한 버전과 전체 요구를 사용한다.  첫 순차 생성은 최초 원본에서 시작한다. 이전 출력은 버전 이력으로 관리하며, 과거 버전을 선택한 후 순차 생성하면 선택한 이미지에서 새 경로를 시작한다.</w:t>
       </w:r>
     </w:p>
     <w:p>
@@ -3774,7 +3774,15 @@
         <w:jc w:val="both"/>
       </w:pPr>
       <w:r>
-        <w:t>현재 지원 범위는 셔츠 색, 배경, 원형 핀이다. 상태와 이미지 버전을 함께 보존하여 되돌리기를 지원한다. 요청 해석은 정해진 동작 처리와 Qwen3 4B의 구조화 출력 보조로 구성하고, 모호한 취소·이전 시점 요청에는 버전 선택을 안내한다. 메모리 사용량을 줄이기 위해 언어 모델과 이미지 모델을 순차 실행한다.</w:t>
+        <w:t>지원 범위는 셔츠 색, 배경, 원형 핀이다. 상태와 이미지 버전을 함께 보존하여 되돌리기를 지원한다. 요청 해석은 정해진 동작 처리와 Qwen3 4B의 구조화 출력 보조로 구성하고, 모호한 취소·이전 시점 요청에는 버전 선택을 안내한다. 메모리 사용량을 줄이기 위해 언어 모델과 이미지 모델을 순차 실행한다.</w:t>
+      </w:r>
+    </w:p>
+    <w:p>
+      <w:pPr>
+        <w:pStyle w:val="Heading2"/>
+      </w:pPr>
+      <w:r>
+        <w:t>1. 웹 편집기의 입력 정책 비교</w:t>
       </w:r>
     </w:p>
     <w:p>
@@ -3782,63 +3790,7 @@
         <w:jc w:val="both"/>
       </w:pPr>
       <w:r>
-        <w:t>시스템 검증은 요구사항의 상태 갱신, 이미지 생성 및 버전 복원으로 구성하였다.</w:t>
-      </w:r>
-    </w:p>
-    <w:p>
-      <w:pPr>
-        <w:pStyle w:val="Heading2"/>
-      </w:pPr>
-      <w:r>
-        <w:t>1. 웹 편집기 테스트 결과</w:t>
-      </w:r>
-    </w:p>
-    <w:p>
-      <w:pPr>
-        <w:jc w:val="both"/>
-      </w:pPr>
-      <w:r>
-        <w:t>웹 편집기는 로컬 주소 http://localhost:8770 에서 실행한다. 저장된 실행 검증에서 한국어 요청 반영, 최초 원본 기반 이미지 생성, PNG 결과 조회, 수동 설정 저장, 이미지·설정 버전 복원, 오래된 수정 요청의 거부를 확인했다. 실제 생성 1회의 기록 시간은 95.28초다.</w:t>
-      </w:r>
-    </w:p>
-    <w:p>
-      <w:pPr>
-        <w:jc w:val="both"/>
-      </w:pPr>
-      <w:r>
-        <w:t>요청 해석 수정 후 한국어 14개·영어 14개와 추가 7개, 총 35개에서 기대 상태 또는 안전한 보류 응답을 확인했다. 사전에 정의한 35개 회귀 검사 항목을 모두 통과하였다. 사전에 없는 설산 배경 요청 1개는 실제 Qwen3 4B 경로에서 배경만 갱신하고 다른 설정을 유지했다.</w:t>
-      </w:r>
-    </w:p>
-    <w:p>
-      <w:pPr>
-        <w:jc w:val="both"/>
-      </w:pPr>
-      <w:r>
-        <w:t>사용 화면은 이미지 업로드, 수정 요청, 생성 방식 선택, 이미지 생성, 다운로드와 버전 선택 중심으로 구성했다. 두 버전을 나란히 보는 결과 비교와 시드 저장을 지원하고, 버전마다 입력 이미지의 해시와 사용 시드를 기록한다. 세부 설정은 접어서 필요할 때 열도록 하고, 요청 이력의 반복 설명을 줄였다. 화면 시험의 출력은 기능 검증 자료로 별도 관리하였다.</w:t>
-      </w:r>
-    </w:p>
-    <w:p>
-      <w:pPr>
-        <w:jc w:val="both"/>
-      </w:pPr>
-      <w:r>
-        <w:t>2026년 9월 13일 UI 변경 후 브라우저에서 “셔츠는 남색으로, 배경은 바다로 바꿔줘”를 입력하였다. 셔츠 navy·배경 ocean·핀 original 상태가 적용되었고, 실제 생성 1회는 101.26초에 완료되었다. 출력 표시와 다운로드 링크를 확인한 뒤 셔츠 설정을 변경·저장하고, 이전 버전 선택으로 이미지와 남색·바다 설정이 복원됨을 확인했다.</w:t>
-      </w:r>
-    </w:p>
-    <w:p>
-      <w:pPr>
-        <w:pStyle w:val="Heading2"/>
-      </w:pPr>
-      <w:r>
-        <w:t>2. 웹 편집기의 입력 정책 비교</w:t>
-      </w:r>
-    </w:p>
-    <w:p>
-      <w:pPr>
-        <w:jc w:val="both"/>
-      </w:pPr>
-      <w:r>
-        <w:t>2026년 9월 14일 웹 화면과 동일한 HTTP 생성 경로에서 두 모드를 비교하였다. P04 원본, 시드 42·314, 512×768 해상도와 4스텝을 사용하고 남색 셔츠→옅은 파란 배경→은색 핀 순서로 요청하였다. 순차 방식은 각 요청 후 직전 출력을 입력으로 생성하고, 일괄 방식은 세 요청을 모은 뒤 최초 원본에서 한 번 생성하였다. 시드별 실행 순서를 반대로 하였으며 총 8개 출력 중 최종 4개를 비교하였다.</w:t>
+        <w:t>웹 화면과 동일한 HTTP 생성 경로에서 두 모드를 비교하였다. P04 원본, 시드 42·314, 512×768 해상도와 4스텝을 사용하고 남색 셔츠→옅은 파란 배경→은색 핀 순서로 요청하였다. 순차 방식은 각 요청 후 직전 출력을 입력으로 생성하고, 일괄 방식은 세 요청을 모은 뒤 최초 원본에서 한 번 생성하였다. 시드별 실행 순서를 반대로 하였으며 총 8개 출력 중 최종 4개를 비교하였다.</w:t>
       </w:r>
     </w:p>
     <w:p>
@@ -4474,7 +4426,7 @@
         <w:jc w:val="both"/>
       </w:pPr>
       <w:r>
-        <w:t>자료는 합성 인물 6명에 집중되어 있으며 후속 비교는 3명, 로컬 모델 비교는 1명과 두 시드로 구성되었다. 동일 인물의 반복과 정책 간 공유 출력에 따른 종속성이 존재한다. 초기 생성기의 백엔드 버전·시드 불확실성과 사후에 설계한 ROI 민감도 분석도 일반화를 제한한다. AI 등급은 동일 기반 모델의 편향을 공유할 수 있으며, 웹 편집기에서는 상태 처리와 생성·복원 기능 및 동일 인물·두 시드의 입력 정책을 검증하였다.</w:t>
+        <w:t>자료는 합성 인물 6명에 집중되어 있으며 후속 비교는 3명, 로컬 모델 비교는 1명과 두 시드로 구성되었다. 동일 인물의 반복과 정책 간 공유 출력에 따른 종속성이 존재한다. 초기 생성기의 백엔드 버전·시드 불확실성과 사후에 설계한 ROI 민감도 분석도 일반화를 제한한다. AI 등급은 동일 기반 모델의 편향을 공유할 수 있으며, 웹 편집기 비교는 한 인물과 두 시드에 한정된다.</w:t>
       </w:r>
     </w:p>
     <w:p>
@@ -4498,7 +4450,7 @@
         <w:jc w:val="both"/>
       </w:pPr>
       <w:r>
-        <w:t>본 연구는 반복 이미지 편집에서 직전 출력 기반 순차 방식과 최초 원본 기반 재생성을 비교하였다. 원본 기반 방식은 여러 조건에서 더 낮은 얼굴 거리를 보였으며, 무변경 반복에서도 원본과의 차이가 누적되었다. 피부 내부 지표의 비교 방향은 측정 조건에 따라 달라 원본 거리와 피부 세부 변화를 구분하는 분석이 필요하였다. 이러한 관찰을 바탕으로 최초 원본과 누적 요구사항을 관리하는 웹 편집기를 구현하고, 35개 요청 회귀 검사와 실제 이미지 생성·상태 복원 동작을 확인하였다. 웹 편집기의 두 시드 비교에서도 일괄 방식은 순차보다 낮은 얼굴 MAE·LPIPS와 높은 SSIM을 보였다.</w:t>
+        <w:t>본 연구는 반복 이미지 편집에서 직전 출력 기반 순차 방식과 최초 원본 기반 재생성을 비교하였다. 원본 기반 방식은 여러 조건에서 더 낮은 얼굴 거리를 보였으며, 무변경 반복에서도 원본과의 차이가 누적되었다. 피부 내부 지표의 비교 방향은 측정 조건에 따라 달라 원본 거리와 피부 세부 변화를 구분하는 분석이 필요하였다. 최초 원본과 누적 요구사항을 관리하는 웹 편집기를 구현하였다. 웹 편집기의 두 시드 비교에서도 일괄 방식은 순차보다 낮은 얼굴 MAE·LPIPS와 높은 SSIM을 보였다.</w:t>
       </w:r>
     </w:p>
     <w:p>

</xml_diff>

<commit_message>
Complete six-person studio policy comparison
</commit_message>
<xml_diff>
--- a/paper/manuscript.inha.docx
+++ b/paper/manuscript.inha.docx
@@ -76,7 +76,7 @@
         <w:t xml:space="preserve">요약: </w:t>
       </w:r>
       <w:r>
-        <w:t>이미지 편집 시스템에서 앞선 생성물을 다음 입력으로 사용하면 요청하지 않은 얼굴 변화가 누적될 수 있다. 본 연구는 순차 편집과 최초 원본에 누적 요구사항을 적용하는 재생성을 비교한다. 초기 실험은 합성 인물 6명과 순차 7경로, 후속 통제 실험은 기존 3인물의 98개 출력을 포함한다. 얼굴 MAE·SSIM·LPIPS, 피부 내부 영역 및 별도 AI 등급으로 분석하였다. 세 인물의 후속 비교에서 일괄 편집의 평균 얼굴 LPIPS가 순차보다 낮았다. 별도 FLUX.2 Klein 4B 실험의 두 시드 평균 LPIPS는 일괄 0.091313, 순차 0.124455였으나 피부 원시 MAE는 일부 설정에서 반대 방향이었다. 최초 원본과 누적 요구를 분리하는 웹 편집기를 구현하였다. 웹 생성 경로의 두 시드 평균 얼굴 LPIPS는 일괄 0.081096, 순차 0.103531이었다. 실험 결과는 원본 기반 입력 정책의 효과가 측정 영역과 지표에 따라 달라짐을 보여주며, 누적 요구사항을 관리하는 편집기의 구현 근거를 제공한다.</w:t>
+        <w:t>이미지 편집 시스템에서 앞선 생성물을 다음 입력으로 사용하면 요청하지 않은 얼굴 변화가 누적될 수 있다. 본 연구는 순차 편집과 최초 원본에 누적 요구사항을 적용하는 재생성을 비교한다. 초기 실험은 합성 인물 6명과 순차 7경로, 후속 통제 실험은 기존 3인물의 98개 출력을 포함한다. 얼굴 MAE·SSIM·LPIPS, 피부 내부 영역 및 별도 AI 등급으로 분석하였다. 세 인물의 후속 비교에서 일괄 편집의 평균 얼굴 LPIPS가 순차보다 낮았다. 별도 FLUX.2 Klein 4B 실험의 두 시드 평균 LPIPS는 일괄 0.091313, 순차 0.124455였으나 피부 원시 MAE는 일부 설정에서 반대 방향이었다. 최초 원본과 누적 요구를 분리하는 웹 편집기를 구현하였다. 웹 생성 경로를 합성 인물 6명·3시드로 확장한 18쌍에서 평균 얼굴 LPIPS는 일괄 0.087120, 순차 0.108710이었으며, 일괄 방식이 18쌍 모두 낮았다. 실험 결과는 원본 기반 입력 정책의 효과가 측정 영역과 지표에 따라 달라짐을 보여주며, 누적 요구사항을 관리하는 편집기의 구현 근거를 제공한다.</w:t>
       </w:r>
     </w:p>
     <w:p>
@@ -90,7 +90,7 @@
         <w:t xml:space="preserve">Abstract: </w:t>
       </w:r>
       <w:r>
-        <w:t>We compare sequential image editing with regeneration from the original image and accumulated requirements. Experiments include six synthetic identities, 98 follow-up outputs from three identities, automatic image metrics and separate AI ratings. Batch editing produced lower mean facial LPIPS in the tested follow-up comparisons. A local FLUX.2 Klein 4B comparison yielded mean LPIPS of 0.091313 for batch and 0.124455 for sequential editing, while raw skin MAE reversed the ranking in some settings. A web editor implemented the workflow. A separate website-path comparison yielded mean facial LPIPS of 0.081096 for batch and 0.103531 for sequential editing across two seeds. The findings characterize the dependence of input-policy effects on measurement regions and support an editor that maintains accumulated editing requirements.</w:t>
+        <w:t>We compare sequential image editing with regeneration from the original image and accumulated requirements. Experiments include six synthetic identities, 98 follow-up outputs from three identities, automatic image metrics and separate AI ratings. Batch editing produced lower mean facial LPIPS in the tested follow-up comparisons. A local FLUX.2 Klein 4B comparison yielded mean LPIPS of 0.091313 for batch and 0.124455 for sequential editing, while raw skin MAE reversed the ranking in some settings. A web editor implemented the workflow. In a six-identity, three-seed website-path comparison, mean facial LPIPS was 0.087120 for batch and 0.108710 for sequential editing across 18 pairs. The findings characterize the dependence of input-policy effects on measurement regions and support an editor that maintains accumulated editing requirements.</w:t>
       </w:r>
     </w:p>
     <w:p>
@@ -594,7 +594,7 @@
                 <w:b w:val="0"/>
                 <w:sz w:val="16"/>
               </w:rPr>
-              <w:t>P04, 2시드, 새 출력 8개·최종 4개</w:t>
+              <w:t>P04 예비 2시드·8개 출력; 6인물 확장 3시드·72개 출력</w:t>
             </w:r>
           </w:p>
         </w:tc>
@@ -2640,7 +2640,7 @@
         <w:jc w:val="both"/>
       </w:pPr>
       <w:r>
-        <w:t xml:space="preserve">로컬 얼굴 ROI는 [176,44,336,224]이며 피부 영역은 이마 [226,72,284,89], 화면 왼쪽 볼 [206,132,224,153], 오른쪽 볼 [286,132,302,153]이다. 피부 좌표는 기존 고해상도 P04 영역의 정확한 절반이다. NCC 탐색 범위는 ±32픽셀로 설정했다. </w:t>
+        <w:t>로컬 얼굴 ROI는 [176,44,336,224]이며 피부 영역은 이마 [226,72,284,89], 화면 왼쪽 볼 [206,132,224,153], 오른쪽 볼 [286,132,302,153]이다. 피부 좌표는 기존 고해상도 P04 영역의 정확한 절반이다. NCC 탐색 범위는 ±32픽셀로 설정했다.</w:t>
       </w:r>
     </w:p>
     <w:p>
@@ -4394,7 +4394,15 @@
         <w:jc w:val="both"/>
       </w:pPr>
       <w:r>
-        <w:t>두 시드 모두 일괄 방식의 MAE·LPIPS가 낮고 SSIM이 높았다. 평균 LPIPS는 일괄 0.081096, 순차 0.103531로 일괄이 21.7% 낮았다. 최종 네 이미지에서 남색 셔츠, 옅은 파란 배경과 핀 하나를 확인하였다. 모델 로딩과 저장을 포함한 평균 경로 처리 시간은 일괄 1회 115.1초, 순차 3회 합계 373.4초였다. 본 비교는 한 합성 인물·두 시드의 사이트 실행 결과이며 4.4절의 명령줄 실험과 별도로 집계하였다.</w:t>
+        <w:t>두 시드 모두 일괄 방식의 MAE·LPIPS가 낮고 SSIM이 높았다. 평균 LPIPS는 일괄 0.081096, 순차 0.103531로 일괄이 21.7% 낮았다. 최종 네 이미지에서 남색 셔츠, 옅은 파란 배경과 핀 하나를 확인하였다. 모델 로딩과 저장을 포함한 평균 경로 처리 시간은 일괄 1회 115.1초, 순차 3회 합계 373.4초였다. 이 표는 한 합성 인물·두 시드의 예비 비교다.</w:t>
+      </w:r>
+    </w:p>
+    <w:p>
+      <w:pPr>
+        <w:jc w:val="both"/>
+      </w:pPr>
+      <w:r>
+        <w:t>같은 웹 생성 경로를 P01–P06의 합성 인물 6명과 시드 42·314·2026으로 확장하였다. 인물·시드마다 순차 생성 3회와 원본 기반 일괄 재생성 1회를 실행해 72개 출력을 얻었다. 최종 18쌍에서 평균 얼굴 MAE는 일괄 0.134223·순차 0.138753, SSIM은 0.846176·0.768563, LPIPS는 0.087120·0.108710이었다. 일괄 방식의 평균 LPIPS는 순차보다 19.9% 낮았다. LPIPS와 SSIM은 18쌍 모두 일괄 방식에 유리했고 MAE는 14쌍에서 일괄 방식에 유리했다. 비교 이미지에서 남색 셔츠, 옅은 파란 배경과 작은 핀을 확인하였다. 일부 순차 출력은 소매 길이 등 요청하지 않은 옷 형태가 달라졌다. 인물별 얼굴 ROI는 기존 실험에서 고정한 좌표를 해상도에 맞춰 축소했고, 입력 이미지 계보와 최종 프롬프트 일치를 검증하였다. 세 시드는 인물 내 반복 관측이다. 얼굴 원본 거리의 우세를 요청 이행이나 전체 화질의 우세로 해석하지 않았다.</w:t>
       </w:r>
     </w:p>
     <w:p>
@@ -4426,7 +4434,7 @@
         <w:jc w:val="both"/>
       </w:pPr>
       <w:r>
-        <w:t>자료는 합성 인물 6명에 집중되어 있으며 후속 비교는 3명, 로컬 모델 비교는 1명과 두 시드로 구성되었다. 동일 인물의 반복과 정책 간 공유 출력에 따른 종속성이 존재한다. 초기 생성기의 백엔드 버전·시드 불확실성과 사후에 설계한 ROI 민감도 분석도 일반화를 제한한다. AI 등급은 동일 기반 모델의 편향을 공유할 수 있으며, 웹 편집기 비교는 한 인물과 두 시드에 한정된다.</w:t>
+        <w:t>자료는 합성 인물 6명에 집중되어 있으며 후속 비교는 3명, 웹 편집기 확대 비교는 기존 6명과 인물당 세 시드로 구성되었다. 동일 인물의 반복과 정책 간 공유 출력에 따른 종속성이 존재한다. 초기 생성기의 백엔드 버전·시드 불확실성과 사후에 설계한 ROI 민감도 분석도 일반화를 제한한다. AI 등급은 동일 기반 모델의 편향을 공유할 수 있다. 웹 편집기 확대 비교는 단일 모델과 동일한 세 편집 요청에 한정된다.</w:t>
       </w:r>
     </w:p>
     <w:p>
@@ -4450,7 +4458,7 @@
         <w:jc w:val="both"/>
       </w:pPr>
       <w:r>
-        <w:t>본 연구는 반복 이미지 편집에서 직전 출력 기반 순차 방식과 최초 원본 기반 재생성을 비교하였다. 원본 기반 방식은 여러 조건에서 더 낮은 얼굴 거리를 보였으며, 무변경 반복에서도 원본과의 차이가 누적되었다. 피부 내부 지표의 비교 방향은 측정 조건에 따라 달라 원본 거리와 피부 세부 변화를 구분하는 분석이 필요하였다. 최초 원본과 누적 요구사항을 관리하는 웹 편집기를 구현하였다. 웹 편집기의 두 시드 비교에서도 일괄 방식은 순차보다 낮은 얼굴 MAE·LPIPS와 높은 SSIM을 보였다.</w:t>
+        <w:t>본 연구는 반복 이미지 편집에서 직전 출력 기반 순차 방식과 최초 원본 기반 재생성을 비교하였다. 원본 기반 방식은 여러 조건에서 더 낮은 얼굴 거리를 보였으며, 무변경 반복에서도 원본과의 차이가 누적되었다. 피부 내부 지표의 비교 방향은 측정 조건에 따라 달라 원본 거리와 피부 세부 변화를 구분하는 분석이 필요하였다. 최초 원본과 누적 요구사항을 관리하는 웹 편집기를 구현하였다. 웹 편집기의 6인물·18쌍 비교에서 일괄 방식은 순차보다 평균 얼굴 MAE·LPIPS가 낮고 SSIM이 높았다. LPIPS와 SSIM은 모든 쌍에서 같은 방향이었다.</w:t>
       </w:r>
     </w:p>
     <w:p>

</xml_diff>

<commit_message>
Align paper and slides with six-person experiment scope
</commit_message>
<xml_diff>
--- a/paper/manuscript.inha.docx
+++ b/paper/manuscript.inha.docx
@@ -4434,15 +4434,7 @@
         <w:jc w:val="both"/>
       </w:pPr>
       <w:r>
-        <w:t>자료는 합성 인물 6명에 집중되어 있으며 후속 비교는 3명, 웹 편집기 확대 비교는 기존 6명과 인물당 세 시드로 구성되었다. 동일 인물의 반복과 정책 간 공유 출력에 따른 종속성이 존재한다. 초기 생성기의 백엔드 버전·시드 불확실성과 사후에 설계한 ROI 민감도 분석도 일반화를 제한한다. AI 등급은 동일 기반 모델의 편향을 공유할 수 있다. 웹 편집기 확대 비교는 단일 모델과 동일한 세 편집 요청에 한정된다.</w:t>
-      </w:r>
-    </w:p>
-    <w:p>
-      <w:pPr>
-        <w:jc w:val="both"/>
-      </w:pPr>
-      <w:r>
-        <w:t>후속 연구에서는 새 인물과 편집 요청을 대상으로 가설, ROI, 주 지표, 시드 및 제외 기준을 사전에 고정하고 인물·반복의 군집 구조를 반영하여 분석할 필요가 있다. 실제 사진, 표정·자세 변경, 직전 출력의 세부 유지와 같은 과제로 범위를 확장하고 지각적 품질 및 사용성을 추가 검증할 수 있다.</w:t>
+        <w:t>자료는 합성 인물 6명에 집중되어 있으며 후속 비교는 그중 3명, 웹 편집기 확대 비교는 기존 6명과 인물당 세 시드로 구성되었다. 동일 인물의 반복과 정책 간 공유 출력에 따른 종속성이 존재한다. 초기 생성기의 백엔드 버전·시드 불확실성과 사후에 설계한 ROI 민감도 분석도 해석 범위를 제한한다. AI 등급은 동일 기반 모델의 편향을 공유할 수 있다. 웹 편집기 확대 비교 결과는 해당 6명의 가상 인물, 단일 모델, 동일한 세 편집 요청 및 얼굴 거리 지표에 적용된다.</w:t>
       </w:r>
     </w:p>
     <w:p>

</xml_diff>

<commit_message>
Tighten research prose and slide conclusion
</commit_message>
<xml_diff>
--- a/paper/manuscript.inha.docx
+++ b/paper/manuscript.inha.docx
@@ -76,7 +76,7 @@
         <w:t xml:space="preserve">요약: </w:t>
       </w:r>
       <w:r>
-        <w:t>이미지 편집 시스템에서 앞선 생성물을 다음 입력으로 사용하면 요청하지 않은 얼굴 변화가 누적될 수 있다. 본 연구는 순차 편집과 최초 원본에 누적 요구사항을 적용하는 재생성을 비교한다. 초기 실험은 합성 인물 6명과 순차 7경로, 후속 통제 실험은 기존 3인물의 98개 출력을 포함한다. 얼굴 MAE·SSIM·LPIPS, 피부 내부 영역 및 별도 AI 등급으로 분석하였다. 세 인물의 후속 비교에서 일괄 편집의 평균 얼굴 LPIPS가 순차보다 낮았다. 별도 FLUX.2 Klein 4B 실험의 두 시드 평균 LPIPS는 일괄 0.091313, 순차 0.124455였으나 피부 원시 MAE는 일부 설정에서 반대 방향이었다. 최초 원본과 누적 요구를 분리하는 웹 편집기를 구현하였다. 웹 생성 경로를 합성 인물 6명·3시드로 확장한 18쌍에서 평균 얼굴 LPIPS는 일괄 0.087120, 순차 0.108710이었으며, 일괄 방식이 18쌍 모두 낮았다. 실험 결과는 원본 기반 입력 정책의 효과가 측정 영역과 지표에 따라 달라짐을 보여주며, 누적 요구사항을 관리하는 편집기의 구현 근거를 제공한다.</w:t>
+        <w:t>이미지 편집 시스템에서 앞선 생성물을 다음 입력으로 사용하면 요청하지 않은 얼굴 변화가 누적될 수 있다. 본 연구는 순차 편집과 최초 원본에 누적 요구사항을 적용하는 재생성을 비교한다. 초기 실험은 합성 인물 6명과 순차 7경로, 후속 통제 실험은 기존 3인물의 98개 출력을 포함한다. 얼굴 MAE·SSIM·LPIPS, 피부 내부 영역 및 별도 AI 등급으로 분석하였다. 세 인물의 후속 비교에서 일괄 편집의 평균 얼굴 LPIPS가 순차보다 낮았다. 별도 FLUX.2 Klein 4B 실험의 두 시드 평균 LPIPS는 일괄 0.091313, 순차 0.124455였으나 피부 원시 MAE는 일부 설정에서 반대 방향이었다. 최초 원본과 누적 요구를 분리하는 웹 편집기를 구현하였다. 웹 생성 경로를 합성 인물 6명·3시드로 확장한 18쌍에서 평균 얼굴 LPIPS는 일괄 0.087120, 순차 0.108710이었으며, 일괄 방식이 18쌍 모두 낮았다.</w:t>
       </w:r>
     </w:p>
     <w:p>
@@ -90,7 +90,7 @@
         <w:t xml:space="preserve">Abstract: </w:t>
       </w:r>
       <w:r>
-        <w:t>We compare sequential image editing with regeneration from the original image and accumulated requirements. Experiments include six synthetic identities, 98 follow-up outputs from three identities, automatic image metrics and separate AI ratings. Batch editing produced lower mean facial LPIPS in the tested follow-up comparisons. A local FLUX.2 Klein 4B comparison yielded mean LPIPS of 0.091313 for batch and 0.124455 for sequential editing, while raw skin MAE reversed the ranking in some settings. A web editor implemented the workflow. In a six-identity, three-seed website-path comparison, mean facial LPIPS was 0.087120 for batch and 0.108710 for sequential editing across 18 pairs. The findings characterize the dependence of input-policy effects on measurement regions and support an editor that maintains accumulated editing requirements.</w:t>
+        <w:t xml:space="preserve">We compare sequential image editing with regeneration from the original image and accumulated requirements. Experiments include six synthetic identities, 98 follow-up outputs from three identities, automatic image metrics and separate AI ratings. Batch editing produced lower mean facial LPIPS in the tested follow-up comparisons. A local FLUX.2 Klein 4B comparison yielded mean LPIPS of 0.091313 for batch and 0.124455 for sequential editing, while raw skin MAE reversed the ranking in some settings. A web editor implemented the workflow. In a six-identity, three-seed website-path comparison, mean facial LPIPS was 0.087120 for batch and 0.108710 for sequential editing across 18 pairs. </w:t>
       </w:r>
     </w:p>
     <w:p>
@@ -155,7 +155,7 @@
         <w:jc w:val="both"/>
       </w:pPr>
       <w:r>
-        <w:t>본 연구의 기여는 세 가지다. 입력 정책과 후속 통제 실험을 연결한 탐색적 기록을 제시하고, 거리·열화·보존·요청 이행을 분리하여 결과를 해석하며, 피부 내부 영역의 민감도 분석을 제공한다. 표본 규모와 생성 조건에는 제한이 있으므로 결과는 가설 형성 및 후속 실험 설계의 근거로 사용한다.</w:t>
+        <w:t>본 연구는 직전 출력과 최초 원본을 사용하는 두 입력 정책을 비교하고, 얼굴 전체 거리와 피부 내부 지표가 다른 방향을 보이는 사례를 분석하며, 누적 요청을 관리하는 웹 편집기에 두 방식을 구현하였다.</w:t>
       </w:r>
     </w:p>
     <w:p>
@@ -4402,7 +4402,7 @@
         <w:jc w:val="both"/>
       </w:pPr>
       <w:r>
-        <w:t>같은 웹 생성 경로를 P01–P06의 합성 인물 6명과 시드 42·314·2026으로 확장하였다. 인물·시드마다 순차 생성 3회와 원본 기반 일괄 재생성 1회를 실행해 72개 출력을 얻었다. 최종 18쌍에서 평균 얼굴 MAE는 일괄 0.134223·순차 0.138753, SSIM은 0.846176·0.768563, LPIPS는 0.087120·0.108710이었다. 일괄 방식의 평균 LPIPS는 순차보다 19.9% 낮았다. LPIPS와 SSIM은 18쌍 모두 일괄 방식에 유리했고 MAE는 14쌍에서 일괄 방식에 유리했다. 비교 이미지에서 남색 셔츠, 옅은 파란 배경과 작은 핀을 확인하였다. 일부 순차 출력은 소매 길이 등 요청하지 않은 옷 형태가 달라졌다. 인물별 얼굴 ROI는 기존 실험에서 고정한 좌표를 해상도에 맞춰 축소했고, 입력 이미지 계보와 최종 프롬프트 일치를 검증하였다. 세 시드는 인물 내 반복 관측이다. 얼굴 원본 거리의 우세를 요청 이행이나 전체 화질의 우세로 해석하지 않았다.</w:t>
+        <w:t>같은 웹 생성 경로를 P01–P06의 합성 인물 6명과 시드 42·314·2026으로 확장하였다. 인물·시드마다 순차 생성 3회와 원본 기반 일괄 재생성 1회를 실행해 72개 출력을 얻었다. 최종 18쌍에서 평균 얼굴 MAE는 일괄 0.134223·순차 0.138753, SSIM은 0.846176·0.768563, LPIPS는 0.087120·0.108710이었다. 일괄 방식의 평균 LPIPS는 순차보다 19.9% 낮았다. LPIPS와 SSIM은 18쌍 모두 일괄 방식에 유리했고 MAE는 14쌍에서 일괄 방식에 유리했다. 비교 이미지에서 남색 셔츠, 옅은 파란 배경과 작은 핀을 확인하였다. 일부 순차 출력은 소매 길이 등 요청하지 않은 옷 형태가 달라졌다. 인물별 얼굴 ROI는 기존 실험에서 고정한 좌표를 해상도에 맞춰 축소했고, 입력 이미지 계보와 최종 프롬프트 일치를 검증하였다. 세 시드는 인물 내 반복 관측이다.</w:t>
       </w:r>
     </w:p>
     <w:p>
@@ -4434,7 +4434,7 @@
         <w:jc w:val="both"/>
       </w:pPr>
       <w:r>
-        <w:t>자료는 합성 인물 6명에 집중되어 있으며 후속 비교는 그중 3명, 웹 편집기 확대 비교는 기존 6명과 인물당 세 시드로 구성되었다. 동일 인물의 반복과 정책 간 공유 출력에 따른 종속성이 존재한다. 초기 생성기의 백엔드 버전·시드 불확실성과 사후에 설계한 ROI 민감도 분석도 해석 범위를 제한한다. AI 등급은 동일 기반 모델의 편향을 공유할 수 있다. 웹 편집기 확대 비교 결과는 해당 6명의 가상 인물, 단일 모델, 동일한 세 편집 요청 및 얼굴 거리 지표에 적용된다.</w:t>
+        <w:t>웹 편집기 비교에는 합성 인물 6명과 인물당 세 번의 생성 반복을 사용했다. 후속 통제 비교에는 그중 3명이 포함되었다. 동일 인물의 반복과 정책 간 공유 출력은 종속된 관측값이다. 초기 생성기의 백엔드 버전과 시드는 확보되지 않았고, AI 등급은 동일 기반 모델의 편향을 공유할 수 있다. ROI 민감도 분석은 결과를 확인한 뒤 설계했다.</w:t>
       </w:r>
     </w:p>
     <w:p>

</xml_diff>

<commit_message>
Add ArcFace identity preservation analysis
</commit_message>
<xml_diff>
--- a/paper/manuscript.inha.docx
+++ b/paper/manuscript.inha.docx
@@ -76,7 +76,7 @@
         <w:t xml:space="preserve">요약: </w:t>
       </w:r>
       <w:r>
-        <w:t>이미지 편집 시스템에서 앞선 생성물을 다음 입력으로 사용하면 요청하지 않은 얼굴 변화가 누적될 수 있다. 본 연구는 순차 편집과 최초 원본에 누적 요구사항을 적용하는 재생성을 비교한다. 초기 실험은 합성 인물 6명과 순차 7경로, 후속 통제 실험은 기존 3인물의 98개 출력을 포함한다. 얼굴 MAE·SSIM·LPIPS, 피부 내부 영역 및 별도 AI 등급으로 분석하였다. 세 인물의 후속 비교에서 일괄 편집의 평균 얼굴 LPIPS가 순차보다 낮았다. 별도 FLUX.2 Klein 4B 실험의 두 시드 평균 LPIPS는 일괄 0.091313, 순차 0.124455였으나 피부 원시 MAE는 일부 설정에서 반대 방향이었다. 최초 원본과 누적 요구를 분리하는 웹 편집기를 구현하였다. 웹 생성 경로를 합성 인물 6명·3시드로 확장한 18쌍에서 평균 얼굴 LPIPS는 일괄 0.087120, 순차 0.108710이었으며, 일괄 방식이 18쌍 모두 낮았다.</w:t>
+        <w:t>이미지 편집 시스템에서 앞선 생성물을 다음 입력으로 사용하면 요청하지 않은 얼굴 변화가 누적될 수 있다. 본 연구는 순차 편집과 최초 원본에 누적 요구사항을 적용하는 재생성을 비교한다. 초기 실험은 합성 인물 6명과 순차 7경로, 후속 통제 실험은 기존 3인물의 98개 출력을 포함한다. 얼굴 MAE·SSIM·LPIPS, 피부 내부 영역 및 별도 AI 등급으로 분석하였다. 세 인물의 후속 비교에서 일괄 편집의 평균 얼굴 LPIPS가 순차보다 낮았다. 별도 FLUX.2 Klein 4B 실험의 두 시드 평균 LPIPS는 일괄 0.091313, 순차 0.124455였으나 피부 원시 MAE는 일부 설정에서 반대 방향이었다. 최초 원본과 누적 요구를 분리하는 웹 편집기를 구현하였다. 웹 생성 경로를 합성 인물 6명·3시드로 확장한 18쌍에서 평균 얼굴 LPIPS는 일괄 0.087120, 순차 0.108710이었으며, 일괄 방식이 18쌍 모두 낮았다. 원본 대비 ArcFace 코사인 유사도는 일괄 0.922054, 순차 0.713703이며 18쌍 모두 일괄 방식이 높았다.</w:t>
       </w:r>
     </w:p>
     <w:p>
@@ -90,7 +90,7 @@
         <w:t xml:space="preserve">Abstract: </w:t>
       </w:r>
       <w:r>
-        <w:t xml:space="preserve">We compare sequential image editing with regeneration from the original image and accumulated requirements. Experiments include six synthetic identities, 98 follow-up outputs from three identities, automatic image metrics and separate AI ratings. Batch editing produced lower mean facial LPIPS in the tested follow-up comparisons. A local FLUX.2 Klein 4B comparison yielded mean LPIPS of 0.091313 for batch and 0.124455 for sequential editing, while raw skin MAE reversed the ranking in some settings. A web editor implemented the workflow. In a six-identity, three-seed website-path comparison, mean facial LPIPS was 0.087120 for batch and 0.108710 for sequential editing across 18 pairs. </w:t>
+        <w:t>We compare sequential image editing with regeneration from the original image and accumulated requirements. Experiments include six synthetic identities, 98 follow-up outputs from three identities, automatic image metrics and separate AI ratings. Batch editing produced lower mean facial LPIPS in the tested follow-up comparisons. A local FLUX.2 Klein 4B comparison yielded mean LPIPS of 0.091313 for batch and 0.124455 for sequential editing, while raw skin MAE reversed the ranking in some settings. A web editor implemented the workflow. In a six-identity, three-seed website-path comparison, mean facial LPIPS was 0.087120 for batch and 0.108710 for sequential editing across 18 pairs. Mean ArcFace cosine similarity to the original was 0.922054 for regeneration and 0.713703 for sequential editing, with higher similarity for regeneration in all 18 pairs.</w:t>
       </w:r>
     </w:p>
     <w:p>
@@ -188,6 +188,14 @@
       </w:pPr>
       <w:r>
         <w:t>SSIM은 구조적 유사도를, LPIPS는 학습된 특징 공간의 지각적 거리를 측정한다[5,6]. 본 연구에서는 이들을 원본과 출력의 차이를 정량화하는 지표로 사용한다. MAE는 색 이동과 기하학적 어긋남에도 반응한다. 이에 따라 얼굴 사각형뿐 아니라 피부 내부 영역, 위치 보정, 평균 색 제거 분석을 함께 사용한다.</w:t>
+      </w:r>
+    </w:p>
+    <w:p>
+      <w:pPr>
+        <w:jc w:val="both"/>
+      </w:pPr>
+      <w:r>
+        <w:t>ArcFace는 각도 마진으로 학습한 얼굴 인식 임베딩을 통해 얼굴 정체성 특징을 비교한다[9]. 본 연구는 원본과 출력의 512차원 임베딩 사이 코사인 유사도를 얼굴 특징 보존 지표로 사용한다.</w:t>
       </w:r>
     </w:p>
     <w:p>
@@ -686,6 +694,14 @@
       </w:pPr>
       <w:r>
         <w:t>RGB를 [0,1] 범위로 정규화하여 원본과 출력 사이의 MAE를 계산한다. 얼굴 영역의 SSIM과 LPIPS(AlexNet, version 0.1)를 함께 보고하며 MAE·LPIPS는 낮을수록, SSIM은 높을수록 원본에 가깝다. 각 지표의 연속값과 방법 간 차이를 분석한다. 얼굴 사각형에는 피부 외에 눈·머리카락 및 주변 내용이 포함될 수 있으므로 피부 내부 영역 분석을 별도로 수행한다.</w:t>
+      </w:r>
+    </w:p>
+    <w:p>
+      <w:pPr>
+        <w:jc w:val="both"/>
+      </w:pPr>
+      <w:r>
+        <w:t>웹 생성 경로의 6인물·18쌍에는 InsightFace 0.7.3 `buffalo_l`을 적용하였다. 640×640 검출과 5점 얼굴 정렬 후 `w600k_r50` 모델의 512차원 임베딩을 추출하고, 원본과 최종 출력 사이 코사인 유사도를 계산하였다. 42개 입력에서 모두 얼굴 하나가 검출되었다. 사전학습 가중치는 비상업적 연구 용도로 제공된다.</w:t>
       </w:r>
     </w:p>
     <w:p>
@@ -4402,7 +4418,7 @@
         <w:jc w:val="both"/>
       </w:pPr>
       <w:r>
-        <w:t>같은 웹 생성 경로를 P01–P06의 합성 인물 6명과 시드 42·314·2026으로 확장하였다. 인물·시드마다 순차 생성 3회와 원본 기반 일괄 재생성 1회를 실행해 72개 출력을 얻었다. 최종 18쌍에서 평균 얼굴 MAE는 일괄 0.134223·순차 0.138753, SSIM은 0.846176·0.768563, LPIPS는 0.087120·0.108710이었다. 일괄 방식의 평균 LPIPS는 순차보다 19.9% 낮았다. LPIPS와 SSIM은 18쌍 모두 일괄 방식에 유리했고 MAE는 14쌍에서 일괄 방식에 유리했다. 비교 이미지에서 남색 셔츠, 옅은 파란 배경과 작은 핀을 확인하였다. 일부 순차 출력은 소매 길이 등 요청하지 않은 옷 형태가 달라졌다. 인물별 얼굴 ROI는 기존 실험에서 고정한 좌표를 해상도에 맞춰 축소했고, 입력 이미지 계보와 최종 프롬프트 일치를 검증하였다. 세 시드는 인물 내 반복 관측이다.</w:t>
+        <w:t>같은 웹 생성 경로를 P01–P06의 합성 인물 6명과 시드 42·314·2026으로 확장하였다. 인물·시드마다 순차 생성 3회와 원본 기반 일괄 재생성 1회를 실행해 72개 출력을 얻었다. 최종 18쌍에서 평균 얼굴 MAE는 일괄 0.134223·순차 0.138753, SSIM은 0.846176·0.768563, LPIPS는 0.087120·0.108710이었다. 일괄 방식의 평균 LPIPS는 순차보다 19.9% 낮았다. LPIPS와 SSIM은 18쌍 모두 일괄 방식에 유리했고 MAE는 14쌍에서 일괄 방식에 유리했다. 원본 대비 ArcFace 코사인 유사도는 일괄 0.922054, 순차 0.713703으로 평균 차이는 0.208351이었다. 18쌍 모두와 인물별 평균 6명 모두에서 일괄 방식이 높았다. 비교 이미지에서 남색 셔츠, 옅은 파란 배경과 작은 핀을 확인하였다. 일부 순차 출력은 소매 길이 등 요청하지 않은 옷 형태가 달라졌다. 인물별 얼굴 ROI는 기존 실험에서 고정한 좌표를 해상도에 맞춰 축소했고, 입력 이미지 계보와 최종 프롬프트 일치를 검증하였다. 세 시드는 인물 내 반복 관측이다.</w:t>
       </w:r>
     </w:p>
     <w:p>
@@ -4418,7 +4434,7 @@
         <w:jc w:val="both"/>
       </w:pPr>
       <w:r>
-        <w:t>원본 기반 생성은 여러 비교에서 순차 편집보다 낮은 얼굴 원본 거리를 보였다. 무변경 반복에서도 거리가 증가한 결과는 이전 생성물을 반복 입력하는 과정 자체가 변화 누적에 기여할 가능성을 시사한다. 이에 따라 연속 요청을 텍스트 상태로 관리하고 최초 원본에 적용하는 구조가 유효한 설계 방향으로 도출된다.</w:t>
+        <w:t>원본 기반 생성은 여러 비교에서 순차 편집보다 낮은 얼굴 원본 거리를 보였다. ArcFace에서도 원본 기반 재생성의 얼굴 특징 유사도가 18쌍 모두 높았다. 무변경 반복에서도 거리가 증가한 결과는 이전 생성물을 반복 입력하는 과정 자체가 변화 누적에 기여할 가능성을 시사한다. 이에 따라 연속 요청을 텍스트 상태로 관리하고 최초 원본에 적용하는 구조가 유효한 설계 방향으로 도출된다.</w:t>
       </w:r>
     </w:p>
     <w:p>
@@ -4450,7 +4466,7 @@
         <w:jc w:val="both"/>
       </w:pPr>
       <w:r>
-        <w:t>본 연구는 반복 이미지 편집에서 직전 출력 기반 순차 방식과 최초 원본 기반 재생성을 비교하였다. 원본 기반 방식은 여러 조건에서 더 낮은 얼굴 거리를 보였으며, 무변경 반복에서도 원본과의 차이가 누적되었다. 피부 내부 지표의 비교 방향은 측정 조건에 따라 달라 원본 거리와 피부 세부 변화를 구분하는 분석이 필요하였다. 최초 원본과 누적 요구사항을 관리하는 웹 편집기를 구현하였다. 웹 편집기의 6인물·18쌍 비교에서 일괄 방식은 순차보다 평균 얼굴 MAE·LPIPS가 낮고 SSIM이 높았다. LPIPS와 SSIM은 모든 쌍에서 같은 방향이었다.</w:t>
+        <w:t>본 연구는 반복 이미지 편집에서 직전 출력 기반 순차 방식과 최초 원본 기반 재생성을 비교하였다. 원본 기반 방식은 여러 조건에서 더 낮은 얼굴 거리를 보였으며, 무변경 반복에서도 원본과의 차이가 누적되었다. 피부 내부 지표의 비교 방향은 측정 조건에 따라 달라 원본 거리와 피부 세부 변화를 구분하는 분석이 필요하였다. 최초 원본과 누적 요구사항을 관리하는 웹 편집기를 구현하였다. 웹 편집기의 6인물·18쌍 비교에서 일괄 방식은 순차보다 평균 얼굴 MAE·LPIPS가 낮고 SSIM과 ArcFace 얼굴 특징 유사도가 높았다. LPIPS·SSIM·ArcFace는 모든 쌍에서 같은 방향이었다.</w:t>
       </w:r>
     </w:p>
     <w:p>
@@ -4539,6 +4555,16 @@
       </w:pPr>
       <w:r>
         <w:t>[8] MFLUX Community. MFLUX: FLUX.2 Implementation and Documentation. Software version used: 0.19.1. https://github.com/mflux-community/mflux</w:t>
+      </w:r>
+    </w:p>
+    <w:p>
+      <w:pPr>
+        <w:keepLines/>
+        <w:ind w:firstLine="0"/>
+        <w:jc w:val="both"/>
+      </w:pPr>
+      <w:r>
+        <w:t>[9] J. Deng, J. Guo, N. Xue, and S. Zafeiriou. ArcFace: Additive Angular Margin Loss for Deep Face Recognition. CVPR, 2019. https://openaccess.thecvf.com/content_CVPR_2019/html/Deng_ArcFace_Additive_Angular_Margin_Loss_for_Deep_Face_Recognition_CVPR_2019_paper.html</w:t>
       </w:r>
     </w:p>
     <w:sectPr>
@@ -4934,7 +4960,7 @@
       <w:ind w:firstLine="170"/>
     </w:pPr>
     <w:rPr>
-      <w:rFonts w:ascii="Times New Roman" w:hAnsi="Times New Roman" w:eastAsia="Noto Serif CJK KR"/>
+      <w:rFonts w:ascii="Times New Roman" w:hAnsi="Times New Roman" w:eastAsia="KoPubWorldBatang"/>
       <w:color w:val="000000"/>
       <w:sz w:val="20"/>
     </w:rPr>
@@ -5000,7 +5026,7 @@
       <w:outlineLvl w:val="0"/>
     </w:pPr>
     <w:rPr>
-      <w:rFonts w:cstheme="majorBidi" w:ascii="Noto Sans CJK KR" w:hAnsi="Noto Sans CJK KR" w:eastAsia="Noto Sans CJK KR"/>
+      <w:rFonts w:cstheme="majorBidi" w:ascii="KoPubWorldDotum" w:hAnsi="KoPubWorldDotum" w:eastAsia="KoPubWorldDotum"/>
       <w:b/>
       <w:bCs/>
       <w:color w:val="000000"/>
@@ -5025,7 +5051,7 @@
       <w:outlineLvl w:val="1"/>
     </w:pPr>
     <w:rPr>
-      <w:rFonts w:cstheme="majorBidi" w:ascii="Noto Sans CJK KR" w:hAnsi="Noto Sans CJK KR" w:eastAsia="Noto Sans CJK KR"/>
+      <w:rFonts w:cstheme="majorBidi" w:ascii="KoPubWorldDotum" w:hAnsi="KoPubWorldDotum" w:eastAsia="KoPubWorldDotum"/>
       <w:b/>
       <w:bCs/>
       <w:color w:val="000000"/>
@@ -5288,7 +5314,7 @@
       <w:contextualSpacing/>
     </w:pPr>
     <w:rPr>
-      <w:rFonts w:cstheme="majorBidi" w:ascii="Times New Roman" w:hAnsi="Times New Roman" w:eastAsia="Noto Sans CJK KR"/>
+      <w:rFonts w:cstheme="majorBidi" w:ascii="Times New Roman" w:hAnsi="Times New Roman" w:eastAsia="KoPubWorldDotum"/>
       <w:b/>
       <w:color w:val="000000"/>
       <w:spacing w:val="5"/>
@@ -5327,7 +5353,7 @@
       <w:ind w:firstLine="0"/>
     </w:pPr>
     <w:rPr>
-      <w:rFonts w:cstheme="majorBidi" w:ascii="Times New Roman" w:hAnsi="Times New Roman" w:eastAsia="Noto Serif CJK KR"/>
+      <w:rFonts w:cstheme="majorBidi" w:ascii="Times New Roman" w:hAnsi="Times New Roman" w:eastAsia="KoPubWorldBatang"/>
       <w:b/>
       <w:i w:val="0"/>
       <w:iCs/>
@@ -5733,7 +5759,7 @@
       <w:spacing w:line="240" w:lineRule="auto"/>
     </w:pPr>
     <w:rPr>
-      <w:rFonts w:ascii="Times New Roman" w:hAnsi="Times New Roman" w:eastAsia="Noto Serif CJK KR"/>
+      <w:rFonts w:ascii="Times New Roman" w:hAnsi="Times New Roman" w:eastAsia="KoPubWorldBatang"/>
       <w:b/>
       <w:bCs/>
       <w:color w:val="000000"/>

</xml_diff>

<commit_message>
Align project documentation and provenance
</commit_message>
<xml_diff>
--- a/paper/manuscript.inha.docx
+++ b/paper/manuscript.inha.docx
@@ -76,7 +76,7 @@
         <w:t xml:space="preserve">요약: </w:t>
       </w:r>
       <w:r>
-        <w:t>이미지 편집 시스템에서 앞선 생성물을 다음 입력으로 사용하면 요청하지 않은 얼굴 변화가 누적될 수 있다. 본 연구는 순차 편집과 최초 원본에 누적 요구사항을 적용하는 재생성을 비교한다. 초기 실험은 합성 인물 6명과 순차 7경로, 후속 통제 실험은 기존 3인물의 98개 출력을 포함한다. 얼굴 MAE·SSIM·LPIPS, 피부 내부 영역 및 별도 AI 등급으로 분석하였다. 세 인물의 후속 비교에서 일괄 편집의 평균 얼굴 LPIPS가 순차보다 낮았다. 별도 FLUX.2 Klein 4B 실험의 두 시드 평균 LPIPS는 일괄 0.091313, 순차 0.124455였으나 피부 원시 MAE는 일부 설정에서 반대 방향이었다. 최초 원본과 누적 요구를 분리하는 웹 편집기를 구현하였다. 웹 생성 경로를 합성 인물 6명·3시드로 확장한 18쌍에서 평균 얼굴 LPIPS는 일괄 0.087120, 순차 0.108710이었으며, 일괄 방식이 18쌍 모두 낮았다. 원본 대비 ArcFace 코사인 유사도는 일괄 0.922054, 순차 0.713703이며 18쌍 모두 일괄 방식이 높았다.</w:t>
+        <w:t>이미지 편집 시스템에서 앞선 생성물을 다음 입력으로 사용하면 요청하지 않은 얼굴 변화가 누적될 수 있다. 본 연구는 순차 편집과 최초 원본에 누적 요구사항을 적용하는 재생성을 비교한다. 초기 실험은 합성 인물 6명과 순차 7경로, 후속 통제 실험은 기존 3인물의 98개 출력을 포함한다. 얼굴 MAE·SSIM·LPIPS, 피부 내부 영역 및 별도 AI 등급으로 분석하였다. 세 인물의 후속 비교에서 일괄 편집의 평균 얼굴 LPIPS가 순차보다 낮았다. 별도 FLUX.2 Klein 4B 실험의 두 시드 평균 LPIPS는 일괄 0.091313, 순차 0.124455였으나 피부 원시 MAE는 일부 설정에서 반대 방향이었다. 최초 원본과 누적 요구를 분리하는 웹 편집기를 구현하였다. 웹 생성 경로를 합성 인물 6명에게 세 번씩 적용한 18쌍에서 평균 얼굴 LPIPS는 일괄 0.087120, 순차 0.108710이었으며, 일괄 방식이 18쌍 모두 낮았다. 원본 대비 ArcFace 코사인 유사도는 일괄 0.922054, 순차 0.713703이며 18쌍 모두 일괄 방식이 높았다.</w:t>
       </w:r>
     </w:p>
     <w:p>
@@ -90,7 +90,7 @@
         <w:t xml:space="preserve">Abstract: </w:t>
       </w:r>
       <w:r>
-        <w:t>We compare sequential image editing with regeneration from the original image and accumulated requirements. Experiments include six synthetic identities, 98 follow-up outputs from three identities, automatic image metrics and separate AI ratings. Batch editing produced lower mean facial LPIPS in the tested follow-up comparisons. A local FLUX.2 Klein 4B comparison yielded mean LPIPS of 0.091313 for batch and 0.124455 for sequential editing, while raw skin MAE reversed the ranking in some settings. A web editor implemented the workflow. In a six-identity, three-seed website-path comparison, mean facial LPIPS was 0.087120 for batch and 0.108710 for sequential editing across 18 pairs. Mean ArcFace cosine similarity to the original was 0.922054 for regeneration and 0.713703 for sequential editing, with higher similarity for regeneration in all 18 pairs.</w:t>
+        <w:t>We compare sequential image editing with regeneration from the original image and accumulated requirements. Experiments include six synthetic identities, 98 follow-up outputs from three identities, automatic image metrics and separate AI ratings. Batch editing produced lower mean facial LPIPS in the tested follow-up comparisons. A local FLUX.2 Klein 4B comparison yielded mean LPIPS of 0.091313 for batch and 0.124455 for sequential editing, while raw skin MAE reversed the ranking in some settings. A web editor implemented the workflow. In a six-identity website-path comparison with three repetitions per identity, mean facial LPIPS was 0.087120 for batch and 0.108710 for sequential editing across 18 pairs. Mean ArcFace cosine similarity to the original was 0.922054 for regeneration and 0.713703 for sequential editing, with higher similarity for regeneration in all 18 pairs.</w:t>
       </w:r>
     </w:p>
     <w:p>
@@ -602,7 +602,7 @@
                 <w:b w:val="0"/>
                 <w:sz w:val="16"/>
               </w:rPr>
-              <w:t>P04 예비 2시드·8개 출력; 6인물 확장 3시드·72개 출력</w:t>
+              <w:t>P04 예비 2시드·8개 출력; 6인물 확장, 인물당 3회·72개 출력</w:t>
             </w:r>
           </w:p>
         </w:tc>
@@ -4418,7 +4418,7 @@
         <w:jc w:val="both"/>
       </w:pPr>
       <w:r>
-        <w:t>같은 웹 생성 경로를 P01–P06의 합성 인물 6명과 시드 42·314·2026으로 확장하였다. 인물·시드마다 순차 생성 3회와 원본 기반 일괄 재생성 1회를 실행해 72개 출력을 얻었다. 최종 18쌍에서 평균 얼굴 MAE는 일괄 0.134223·순차 0.138753, SSIM은 0.846176·0.768563, LPIPS는 0.087120·0.108710이었다. 일괄 방식의 평균 LPIPS는 순차보다 19.9% 낮았다. LPIPS와 SSIM은 18쌍 모두 일괄 방식에 유리했고 MAE는 14쌍에서 일괄 방식에 유리했다. 원본 대비 ArcFace 코사인 유사도는 일괄 0.922054, 순차 0.713703으로 평균 차이는 0.208351이었다. 18쌍 모두와 인물별 평균 6명 모두에서 일괄 방식이 높았다. 비교 이미지에서 남색 셔츠, 옅은 파란 배경과 작은 핀을 확인하였다. 일부 순차 출력은 소매 길이 등 요청하지 않은 옷 형태가 달라졌다. 인물별 얼굴 ROI는 기존 실험에서 고정한 좌표를 해상도에 맞춰 축소했고, 입력 이미지 계보와 최종 프롬프트 일치를 검증하였다. 세 시드는 인물 내 반복 관측이다.</w:t>
+        <w:t>같은 웹 생성 경로를 P01–P06의 합성 인물 6명에게 세 번씩 적용하였다. 각 반복에서 순차 생성 3회와 원본 기반 일괄 재생성 1회를 실행해 72개 출력을 얻었다. 최종 18쌍에서 평균 얼굴 MAE는 일괄 0.134223·순차 0.138753, SSIM은 0.846176·0.768563, LPIPS는 0.087120·0.108710이었다. 일괄 방식의 평균 LPIPS는 순차보다 19.9% 낮았다. LPIPS와 SSIM은 18쌍 모두 일괄 방식에 유리했고 MAE는 14쌍에서 일괄 방식에 유리했다. 원본 대비 ArcFace 코사인 유사도는 일괄 0.922054, 순차 0.713703으로 평균 차이는 0.208351이었다. 18쌍 모두와 인물별 평균 6명 모두에서 일괄 방식이 높았다. 비교 이미지에서 남색 셔츠, 옅은 파란 배경과 작은 핀을 확인하였다. 일부 순차 출력은 소매 길이 등 요청하지 않은 옷 형태가 달라졌다. 인물별 얼굴 ROI는 기존 실험에서 고정한 좌표를 해상도에 맞춰 축소했고, 입력 이미지 계보와 최종 프롬프트 일치를 검증하였다. 세 회는 인물 내 반복 관측이다.</w:t>
       </w:r>
     </w:p>
     <w:p>

</xml_diff>

<commit_message>
Align initial experiments and research artifacts to six runs
</commit_message>
<xml_diff>
--- a/paper/manuscript.inha.docx
+++ b/paper/manuscript.inha.docx
@@ -76,7 +76,7 @@
         <w:t xml:space="preserve">요약: </w:t>
       </w:r>
       <w:r>
-        <w:t>이미지 편집 시스템에서 앞선 생성물을 다음 입력으로 사용하면 요청하지 않은 얼굴 변화가 누적될 수 있다. 본 연구는 순차 편집과 최초 원본에 누적 요구사항을 적용하는 재생성을 비교한다. 초기 실험은 합성 인물 6명과 순차 7경로, 후속 통제 실험은 기존 3인물의 98개 출력을 포함한다. 얼굴 MAE·SSIM·LPIPS, 피부 내부 영역 및 별도 AI 등급으로 분석하였다. 세 인물의 후속 비교에서 일괄 편집의 평균 얼굴 LPIPS가 순차보다 낮았다. 별도 FLUX.2 Klein 4B 실험의 두 시드 평균 LPIPS는 일괄 0.091313, 순차 0.124455였으나 피부 원시 MAE는 일부 설정에서 반대 방향이었다. 최초 원본과 누적 요구를 분리하는 웹 편집기를 구현하였다. 웹 생성 경로를 합성 인물 6명에게 세 번씩 적용한 18쌍에서 평균 얼굴 LPIPS는 일괄 0.087120, 순차 0.108710이었으며, 일괄 방식이 18쌍 모두 낮았다. 원본 대비 ArcFace 코사인 유사도는 일괄 0.922054, 순차 0.713703이며 18쌍 모두 일괄 방식이 높았다.</w:t>
+        <w:t>이미지 편집 시스템에서 앞선 생성물을 다음 입력으로 사용하면 요청하지 않은 얼굴 변화가 누적될 수 있다. 본 연구는 순차 편집과 최초 원본에 누적 요구사항을 적용하는 재생성을 비교한다. 초기 실험은 합성 인물 6명과 인물별 순차 1경로, 후속 통제 실험은 기존 3인물의 98개 출력을 포함한다. 얼굴 MAE·SSIM·LPIPS, 피부 내부 영역 및 별도 AI 등급으로 분석하였다. 세 인물의 후속 비교에서 일괄 편집의 평균 얼굴 LPIPS가 순차보다 낮았다. 별도 FLUX.2 Klein 4B 실험의 두 시드 평균 LPIPS는 일괄 0.091313, 순차 0.124455였으나 피부 원시 MAE는 일부 설정에서 반대 방향이었다. 최초 원본과 누적 요구를 분리하는 웹 편집기를 구현하였다. 웹 생성 경로를 합성 인물 6명에게 세 번씩 적용한 18쌍에서 평균 얼굴 LPIPS는 일괄 0.087120, 순차 0.108710이었으며, 일괄 방식이 18쌍 모두 낮았다. 원본 대비 ArcFace 코사인 유사도는 일괄 0.922054, 순차 0.713703이며 18쌍 모두 일괄 방식이 높았다.</w:t>
       </w:r>
     </w:p>
     <w:p>
@@ -219,7 +219,7 @@
         <w:jc w:val="both"/>
       </w:pPr>
       <w:r>
-        <w:t>인물 P01–P06은 합성 이미지다. 초기 순차 편집은 6명에 대해 7경로를 구성하며 P03에 두 경로가 있다. 정책 비교는 20경로의 198단계 출력을 포함한다. 경로 간 공유 출력과 동일 인물의 반복 관측을 구분하고, 미완료 단계는 결측으로 처리하였다. 분석별 자료 범위는 표 1에 제시하였다.</w:t>
+        <w:t>인물 P01–P06은 합성 이미지다. 초기 순차 편집은 6명에 대해 인물별 한 번씩 총 6경로를 구성한다. 정책 비교는 18경로의 178단계 출력을 포함한다. 경로 간 공유 출력을 구분하고, 미완료 단계는 결측으로 처리하였다. 분석별 자료 범위는 표 1에 제시하였다.</w:t>
       </w:r>
     </w:p>
     <w:p>
@@ -360,7 +360,7 @@
                 <w:b w:val="0"/>
                 <w:sz w:val="16"/>
               </w:rPr>
-              <w:t>6인물, 순차 7경로; 수치 분석 고유 113개</w:t>
+              <w:t>6인물, 순차 6경로; 수치 분석 고유 103개</w:t>
             </w:r>
           </w:p>
         </w:tc>
@@ -378,7 +378,7 @@
                 <w:b w:val="0"/>
                 <w:sz w:val="16"/>
               </w:rPr>
-              <w:t>AI 고유 111개·두 세션</w:t>
+              <w:t>AI 고유 101개·두 세션</w:t>
             </w:r>
           </w:p>
         </w:tc>
@@ -645,7 +645,7 @@
         <w:jc w:val="both"/>
       </w:pPr>
       <w:r>
-        <w:t>초기 수치 분석은 확정 출력 111개와 개입 전 후보 2개를 포함하며, AI 평가는 확정 출력을 대상으로 하였다. 후속 AI 평가에는 98개 중 최종 출력 12개를 선정하였다. 원본 대조와 개발용 이미지는 검증용 자료로 별도 관리하였다. 초기 생성기는 도구 기반 이미지 생성 시스템이며 정확한 백엔드 모델 버전과 시드는 확보되지 않았다. 따라서 이 부분의 재현성은 보존된 입력·출력·프롬프트·분석 기록에 한정된다.</w:t>
+        <w:t>초기 수치 분석은 확정 출력 101개와 개입 전 후보 2개를 포함하며, AI 평가는 확정 출력을 대상으로 하였다. 후속 AI 평가에는 98개 중 최종 출력 12개를 선정하였다. 원본 대조와 개발용 이미지는 검증용 자료로 별도 관리하였다. 초기 생성기는 도구 기반 이미지 생성 시스템이며 정확한 백엔드 모델 버전과 시드는 확보되지 않았다. 따라서 이 부분의 재현성은 보존된 입력·출력·프롬프트·분석 기록에 한정된다.</w:t>
       </w:r>
     </w:p>
     <w:p>
@@ -733,7 +733,7 @@
         <w:jc w:val="both"/>
       </w:pPr>
       <w:r>
-        <w:t>AI 열화 등급은 없음(0), 약함(1), 뚜렷함(2), 심함(3)이다. 초기 AI 평가는 같은 기반 모델의 두 세션이 고유 111개 출력을 평가한 것이다. 원본 대조 10개와 숨은 반복 12개를 세션별로 추가하였다. 후속 평가는 별도 세션에서 익명 최종 후보 12개와 원본 대조 3개를 평가하였다.  세션 간 일치율로 동일 모델의 평가 일관성을 분석하였다.</w:t>
+        <w:t>AI 열화 등급은 없음(0), 약함(1), 뚜렷함(2), 심함(3)이다. 초기 AI 평가는 같은 기반 모델의 두 세션이 고유 101개 출력을 평가한 것이다. 원본 대조 10개와 숨은 반복 10개를 세션별로 추가하였다. 후속 평가는 별도 세션에서 익명 최종 후보 12개와 원본 대조 3개를 평가하였다.  세션 간 일치율로 동일 모델의 평가 일관성을 분석하였다.</w:t>
       </w:r>
     </w:p>
     <w:p>
@@ -1377,7 +1377,7 @@
         <w:jc w:val="both"/>
       </w:pPr>
       <w:r>
-        <w:t>일곱 대응 최종 비교에서 고정 영역 지표는 각 지표별 6/7이 원본 기반에 유리했고 위치 보정 후에는 7/7이었다. P01의 고정 LPIPS는 순차 0.270484, 원본 기반 0.276156으로 반대 사례였다. 원본 기반 방식의 이득은 인물과 위치 보정 조건에 따라 차이를 보였다.</w:t>
+        <w:t>여섯 대응 최종 비교에서 고정 영역 지표는 각 지표별 5/6이 원본 기반에 유리했고 위치 보정 후에는 6/6이었다. P01의 고정 LPIPS는 순차 0.270484, 원본 기반 0.276156으로 반대 사례였다. 원본 기반 방식의 이득은 인물과 위치 보정 조건에 따라 차이를 보였다.</w:t>
       </w:r>
     </w:p>
     <w:p>
@@ -2028,7 +2028,7 @@
         <w:jc w:val="both"/>
       </w:pPr>
       <w:r>
-        <w:t>초기 AI 두 세션의 정확 일치율은 89.19%, 선형 가중 κ는 0.897이었다.</w:t>
+        <w:t>초기 AI 두 세션의 정확 일치율은 90.10%, 선형 가중 κ는 0.908이었다.</w:t>
       </w:r>
     </w:p>
     <w:p>

</xml_diff>

<commit_message>
Simplify research prose and refresh publication artifacts
</commit_message>
<xml_diff>
--- a/paper/manuscript.inha.docx
+++ b/paper/manuscript.inha.docx
@@ -645,7 +645,7 @@
         <w:jc w:val="both"/>
       </w:pPr>
       <w:r>
-        <w:t>초기 수치 분석은 확정 출력 101개와 개입 전 후보 2개를 포함하며, AI 평가는 확정 출력을 대상으로 하였다. 후속 AI 평가에는 98개 중 최종 출력 12개를 선정하였다. 원본 대조와 개발용 이미지는 검증용 자료로 별도 관리하였다. 초기 생성기는 도구 기반 이미지 생성 시스템이며 정확한 백엔드 모델 버전과 시드는 확보되지 않았다. 따라서 이 부분의 재현성은 보존된 입력·출력·프롬프트·분석 기록에 한정된다.</w:t>
+        <w:t>초기 수치 분석은 확정 출력 101개와 개입 전 후보 2개를 포함하며, AI 평가는 확정 출력을 대상으로 하였다. 후속 AI 평가에는 98개 중 최종 출력 12개를 선정하였다. 원본 대조와 개발용 이미지는 검증용 자료로 별도 관리하였다. 초기 도구 기반 생성기의 재현 범위는 보존된 입력·출력·프롬프트·분석 기록이다.</w:t>
       </w:r>
     </w:p>
     <w:p>
@@ -677,7 +677,7 @@
         <w:jc w:val="both"/>
       </w:pPr>
       <w:r>
-        <w:t>98개 후속 출력은 예비 분해 실험 14개, 편집 순서 실험 38개, P05·P06 재현 16개, 색·재질 요인 실험 24개, 무변경 반복 연장 6개로 구성된다. 순서 실험은 세 편집의 여섯 순열을 포함한다. 무변경 반복은 요청 내용이 추가되지 않아도 생성 반복 자체가 변화를 유발하는지 확인하는 대조다.</w:t>
+        <w:t>98개 후속 출력은 예비 분해 실험 14개, 편집 순서 실험 38개, P05·P06 재현 16개, 색·재질 요인 실험 24개, 무변경 반복 연장 6개로 구성된다. 순서 실험은 세 편집의 여섯 순열을 포함한다. 무변경 반복은 동일한 요청으로 생성을 반복할 때의 변화를 확인하는 대조다.</w:t>
       </w:r>
     </w:p>
     <w:p>
@@ -1844,7 +1844,7 @@
         <w:jc w:val="both"/>
       </w:pPr>
       <w:r>
-        <w:t>피부 분석은 얼굴 전체 수치의 해석을 제한한다. P04 단일 배경 편집의 피부 MAE는 0.049207로 셔츠 0.015323과 핀 0.014845보다 컸다. 그러나 배경 조건에서 피부 MSE의 87.8%는 평균 RGB 차이 성분이었으며, 평균 색 제거 후 MAE는 배경 0.014057, 셔츠 0.013909로 가까워졌다. 이는 피부 원시 오차에 평균 색 이동이 크게 반영됨을 보여준다.</w:t>
+        <w:t>피부 분석으로 색 이동과 세부 구조 변화를 구분했다. P04 단일 배경 편집의 피부 MAE는 0.049207로 셔츠 0.015323과 핀 0.014845보다 컸다. 배경 조건에서 피부 MSE의 87.8%는 평균 RGB 차이 성분이었으며, 평균 색 제거 후 MAE는 배경 0.014057, 셔츠 0.013909로 가까워졌다. 이는 피부 원시 오차에 평균 색 이동이 크게 반영됨을 보여준다.</w:t>
       </w:r>
     </w:p>
     <w:p>

</xml_diff>

<commit_message>
docs: simplify editing terminology across research and paper
</commit_message>
<xml_diff>
--- a/paper/manuscript.inha.docx
+++ b/paper/manuscript.inha.docx
@@ -76,7 +76,7 @@
         <w:t xml:space="preserve">요약: </w:t>
       </w:r>
       <w:r>
-        <w:t>이미지 편집 시스템에서 앞선 생성물을 다음 입력으로 사용하면 요청하지 않은 얼굴 변화가 누적될 수 있다. 본 연구는 순차 편집과 최초 원본에 누적 요구사항을 적용하는 재생성을 비교한다. 초기 실험은 합성 인물 6명과 인물별 순차 1경로, 후속 통제 실험은 기존 3인물의 98개 출력을 포함한다. 얼굴 MAE·SSIM·LPIPS, 피부 내부 영역 및 별도 AI 등급으로 분석하였다. 세 인물의 후속 비교에서 일괄 편집의 평균 얼굴 LPIPS가 순차보다 낮았다. 별도 FLUX.2 Klein 4B 실험의 두 시드 평균 LPIPS는 일괄 0.091313, 순차 0.124455였으나 피부 원시 MAE는 일부 설정에서 반대 방향이었다. 최초 원본과 누적 요구를 분리하는 웹 편집기를 구현하였다. 웹 생성 경로를 합성 인물 6명에게 세 번씩 적용한 18쌍에서 평균 얼굴 LPIPS는 일괄 0.087120, 순차 0.108710이었으며, 일괄 방식이 18쌍 모두 낮았다. 원본 대비 ArcFace 코사인 유사도는 일괄 0.922054, 순차 0.713703이며 18쌍 모두 일괄 방식이 높았다.</w:t>
+        <w:t>이미지 편집 시스템에서 앞선 생성물을 다음 입력으로 사용하면 요청하지 않은 얼굴 변화가 누적될 수 있다. 본 연구는 순차 편집과 최초 원본에 누적 요구사항을 적용하는 재생성을 비교한다. 초기 실험에서는 합성 인물 6명에게 각각 10단계 순차 편집을 진행했다. 후속 통제 실험은 기존 3인물의 98개 출력을 포함한다. 얼굴 MAE·SSIM·LPIPS, 피부 내부 영역 및 별도 AI 등급으로 분석하였다. 세 인물의 후속 비교에서 일괄 편집의 평균 얼굴 LPIPS가 순차보다 낮았다. 별도 FLUX.2 Klein 4B 실험의 두 시드 평균 LPIPS는 일괄 0.091313, 순차 0.124455였으나 피부 원시 MAE는 일부 설정에서 반대 방향이었다. 최초 원본과 누적 요구를 분리하는 웹 편집기를 구현하였다. 웹 편집기에서 합성 인물 6명에게 두 편집 방식을 세 번씩 적용한 18쌍에서 평균 얼굴 LPIPS는 일괄 0.087120, 순차 0.108710이었으며, 일괄 방식이 18쌍 모두 낮았다. 원본 대비 ArcFace 코사인 유사도는 일괄 0.922054, 순차 0.713703이며 18쌍 모두 일괄 방식이 높았다.</w:t>
       </w:r>
     </w:p>
     <w:p>
@@ -90,7 +90,7 @@
         <w:t xml:space="preserve">Abstract: </w:t>
       </w:r>
       <w:r>
-        <w:t>We compare sequential image editing with regeneration from the original image and accumulated requirements. Experiments include six synthetic identities, 98 follow-up outputs from three identities, automatic image metrics and separate AI ratings. Batch editing produced lower mean facial LPIPS in the tested follow-up comparisons. A local FLUX.2 Klein 4B comparison yielded mean LPIPS of 0.091313 for batch and 0.124455 for sequential editing, while raw skin MAE reversed the ranking in some settings. A web editor implemented the workflow. In a six-identity website-path comparison with three repetitions per identity, mean facial LPIPS was 0.087120 for batch and 0.108710 for sequential editing across 18 pairs. Mean ArcFace cosine similarity to the original was 0.922054 for regeneration and 0.713703 for sequential editing, with higher similarity for regeneration in all 18 pairs.</w:t>
+        <w:t>We compare sequential image editing with regeneration from the original image and accumulated requirements. Experiments include six synthetic identities, 98 follow-up outputs from three identities, automatic image metrics and separate AI ratings. Batch editing produced lower mean facial LPIPS in the tested follow-up comparisons. A local FLUX.2 Klein 4B comparison yielded mean LPIPS of 0.091313 for batch and 0.124455 for sequential editing, while raw skin MAE reversed the ranking in some settings. A web editor implemented the workflow. In a six-identity web-editor comparison with three repetitions per identity, mean facial LPIPS was 0.087120 for batch and 0.108710 for sequential editing across 18 pairs. Mean ArcFace cosine similarity to the original was 0.922054 for regeneration and 0.713703 for sequential editing, with higher similarity for regeneration in all 18 pairs.</w:t>
       </w:r>
     </w:p>
     <w:p>
@@ -219,7 +219,7 @@
         <w:jc w:val="both"/>
       </w:pPr>
       <w:r>
-        <w:t>인물 P01–P06은 합성 이미지다. 초기 순차 편집은 6명에 대해 인물별 한 번씩 총 6경로를 구성한다. 정책 비교는 18경로의 178단계 출력을 포함한다. 경로 간 공유 출력을 구분하고, 미완료 단계는 결측으로 처리하였다. 분석별 자료 범위는 표 1에 제시하였다.</w:t>
+        <w:t>인물 P01–P06은 합성 이미지다. 초기 실험에서는 6명에게 각각 10단계 순차 편집을 한 번씩 진행했다. 정책 비교는 인물과 편집 방식을 조합한 18개 실험의 178단계 출력을 포함한다. 편집 과정 간 공유 출력을 구분하고, 미완료 단계는 결측으로 처리하였다. 분석별 자료 범위는 표 1에 제시하였다.</w:t>
       </w:r>
     </w:p>
     <w:p>
@@ -360,7 +360,7 @@
                 <w:b w:val="0"/>
                 <w:sz w:val="16"/>
               </w:rPr>
-              <w:t>6인물, 순차 6경로; 수치 분석 고유 103개</w:t>
+              <w:t>6명 × 각 10단계 순차 편집; 수치 분석 고유 103개</w:t>
             </w:r>
           </w:p>
         </w:tc>
@@ -661,7 +661,7 @@
         <w:jc w:val="both"/>
       </w:pPr>
       <w:r>
-        <w:t>초기 10단계 과제는 귀걸이, 목걸이, 핀, 의상, 배경 등의 비얼굴 편집 및 후속 색·형태 변경으로 구성된다. 순차 정책은 직전 출력을 다음 입력으로 사용한다. 원본 기반 정책은 최초 입력에 해당 시점까지의 요구사항을 적용한다. 중간 1회 개입, 3단계마다 개입, 알람 기반 개입, 마지막 단계만 재생성하는 변형도 기록하였다. 공유 출력이 있는 정책은 입력 경로와 호출 수를 비교하였다.</w:t>
+        <w:t>초기 10단계 과제는 귀걸이, 목걸이, 핀, 의상, 배경 등의 비얼굴 편집 및 후속 색·형태 변경으로 구성된다. 순차 정책은 직전 출력을 다음 입력으로 사용한다. 원본 기반 정책은 최초 입력에 해당 시점까지의 요구사항을 적용한다. 중간 1회 개입, 3단계마다 개입, 알람 기반 개입, 마지막 단계만 재생성하는 변형도 기록하였다. 공유 출력이 있는 정책은 단계별 입력 이미지와 호출 수를 비교하였다.</w:t>
       </w:r>
     </w:p>
     <w:p>
@@ -701,7 +701,7 @@
         <w:jc w:val="both"/>
       </w:pPr>
       <w:r>
-        <w:t>웹 생성 경로의 6인물·18쌍에는 InsightFace 0.7.3 `buffalo_l`을 적용하였다. 640×640 검출과 5점 얼굴 정렬 후 `w600k_r50` 모델의 512차원 임베딩을 추출하고, 원본과 최종 출력 사이 코사인 유사도를 계산하였다. 42개 입력에서 모두 얼굴 하나가 검출되었다. 사전학습 가중치는 비상업적 연구 용도로 제공된다.</w:t>
+        <w:t>웹 편집기 실험의 6인물·18쌍에는 InsightFace 0.7.3 `buffalo_l`을 적용하였다. 640×640 검출과 5점 얼굴 정렬 후 `w600k_r50` 모델의 512차원 임베딩을 추출하고, 원본과 최종 출력 사이 코사인 유사도를 계산하였다. 42개 입력에서 모두 얼굴 하나가 검출되었다. 사전학습 가중치는 비상업적 연구 용도로 제공된다.</w:t>
       </w:r>
     </w:p>
     <w:p>
@@ -749,7 +749,7 @@
         <w:jc w:val="both"/>
       </w:pPr>
       <w:r>
-        <w:t>로컬 비교는 FLUX.2 Klein 4B의 4비트 양자화 가중치와 MFLUX 0.19.1을 사용하였다[7,8]. 실행 환경은 Apple M1, 메모리 16 GB이며, 추론은 4스텝으로 설정하였다. P04 원본을 두 방법 모두 동일하게 512×768로 축소하고 시드 42와 314를 사용하였다. 각 순차 경로에서는 같은 시드를 유지하고, 반복 간 방법 실행 순서를 반대로 하였다. 각 호출의 첫 출력을 분석에 사용하였다.</w:t>
+        <w:t>로컬 비교는 FLUX.2 Klein 4B의 4비트 양자화 가중치와 MFLUX 0.19.1을 사용하였다[7,8]. 실행 환경은 Apple M1, 메모리 16 GB이며, 추론은 4스텝으로 설정하였다. P04 원본을 두 방법 모두 동일하게 512×768로 축소하고 시드 42와 314를 사용하였다. 각 순차 편집 과정에서는 같은 시드를 유지하고, 반복 간 방법 실행 순서를 반대로 하였다. 각 호출의 첫 출력을 분석에 사용하였다.</w:t>
       </w:r>
     </w:p>
     <w:p>
@@ -773,7 +773,7 @@
         <w:pStyle w:val="Heading2"/>
       </w:pPr>
       <w:r>
-        <w:t>1. 초기 순차 경로와 원본 기반 정책</w:t>
+        <w:t>1. 초기 순차 편집 과정과 원본 기반 정책</w:t>
       </w:r>
     </w:p>
     <w:p>
@@ -781,7 +781,7 @@
         <w:jc w:val="both"/>
       </w:pPr>
       <w:r>
-        <w:t>P04의 10단계 경로 평균 LPIPS와 논리적 생성 호출 수를 표 2에 정리하였다. 호출 수는 각 정책에 필요한 이미지 생성 횟수이다. 알람 방식은 원본 기반 방식과 확인된 출력 8개를 공유한다. 알람 조건에는 초기 실험에서 정한 탐색적 규칙을 사용하였다.</w:t>
+        <w:t>P04의 10단계 평균 LPIPS와 논리적 생성 호출 수를 표 2에 정리하였다. 호출 수는 각 정책에 필요한 이미지 생성 횟수이다. 알람 방식은 원본 기반 방식과 확인된 출력 8개를 공유한다. 알람 조건에는 초기 실험에서 정한 탐색적 규칙을 사용하였다.</w:t>
       </w:r>
     </w:p>
     <w:p>
@@ -1393,7 +1393,7 @@
         <w:jc w:val="both"/>
       </w:pPr>
       <w:r>
-        <w:t>세 인물의 후속 비교에서 일괄 방식의 평균 얼굴 LPIPS가 순차 방식보다 낮았다. P04 값은 편집 순서 실험의 일괄 및 셔츠→배경→핀 경로를 기준으로 하였다.</w:t>
+        <w:t>세 인물의 후속 비교에서 일괄 방식의 평균 얼굴 LPIPS가 순차 방식보다 낮았다. P04 값은 편집 순서 실험의 일괄 및 셔츠→배경→핀 편집 순서를 기준으로 하였다.</w:t>
       </w:r>
     </w:p>
     <w:p>
@@ -1836,7 +1836,7 @@
         <w:jc w:val="both"/>
       </w:pPr>
       <w:r>
-        <w:t>무변경 반복 두 경로의 평균 얼굴 LPIPS는 1단계 0.020250에서 3단계 0.062738, 6단계 0.106249로 증가하였다. 고정 MAE와 LPIPS는 두 경로 모두에서 단조 증가하였다. 이는 명시적인 추가 편집 없이도 반복 생성이 원본과의 차이를 누적시킬 수 있음을 보여준다.</w:t>
+        <w:t>변경 없이 재생성을 6단계씩 두 번 진행한 실험의 평균 얼굴 LPIPS는 1단계 0.020250에서 3단계 0.062738, 6단계 0.106249로 증가하였다. 고정 MAE와 LPIPS는 두 실험 모두에서 단조 증가하였다. 이는 명시적인 추가 편집 없이도 반복 생성이 원본과의 차이를 누적시킬 수 있음을 보여준다.</w:t>
       </w:r>
     </w:p>
     <w:p>
@@ -3782,7 +3782,7 @@
         <w:jc w:val="both"/>
       </w:pPr>
       <w:r>
-        <w:t>관찰 결과를 바탕으로 최초 원본과 누적 편집 상태를 별도로 저장하는 로컬 편집기를 구현하였다. 사용자의 새 요청은 현재 상태에 대한 변경으로 해석하고, 생성 방식은 일괄 재생성과 순차 생성 중 선택한다. 일괄 재생성은 최초 원본과 갱신된 전체 요구를 사용하고, 순차 생성은 현재 선택한 버전과 전체 요구를 사용한다.  첫 순차 생성은 최초 원본에서 시작한다. 이전 출력은 버전 이력으로 관리하며, 과거 버전을 선택한 후 순차 생성하면 선택한 이미지에서 새 경로를 시작한다.</w:t>
+        <w:t>관찰 결과를 바탕으로 최초 원본과 누적 편집 상태를 별도로 저장하는 로컬 편집기를 구현하였다. 사용자의 새 요청은 현재 상태에 대한 변경으로 해석하고, 생성 방식은 일괄 재생성과 순차 생성 중 선택한다. 일괄 재생성은 최초 원본과 갱신된 전체 요구를 사용하고, 순차 생성은 현재 선택한 버전과 전체 요구를 사용한다.  첫 순차 생성은 최초 원본에서 시작한다. 이전 출력은 버전 이력으로 관리하며, 과거 버전을 선택한 후 순차 생성하면 선택한 이미지에서 새 편집 과정을 시작한다.</w:t>
       </w:r>
     </w:p>
     <w:p>
@@ -3806,7 +3806,7 @@
         <w:jc w:val="both"/>
       </w:pPr>
       <w:r>
-        <w:t>웹 화면과 동일한 HTTP 생성 경로에서 두 모드를 비교하였다. P04 원본, 시드 42·314, 512×768 해상도와 4스텝을 사용하고 남색 셔츠→옅은 파란 배경→은색 핀 순서로 요청하였다. 순차 방식은 각 요청 후 직전 출력을 입력으로 생성하고, 일괄 방식은 세 요청을 모은 뒤 최초 원본에서 한 번 생성하였다. 시드별 실행 순서를 반대로 하였으며 총 8개 출력 중 최종 4개를 비교하였다.</w:t>
+        <w:t>웹 화면과 동일한 HTTP 생성 기능에서 두 모드를 비교하였다. P04 원본, 시드 42·314, 512×768 해상도와 4스텝을 사용하고 남색 셔츠→옅은 파란 배경→은색 핀 순서로 요청하였다. 순차 방식은 각 요청 후 직전 출력을 입력으로 생성하고, 일괄 방식은 세 요청을 모은 뒤 최초 원본에서 한 번 생성하였다. 시드별 실행 순서를 반대로 하였으며 총 8개 출력 중 최종 4개를 비교하였다.</w:t>
       </w:r>
     </w:p>
     <w:p>
@@ -4410,7 +4410,7 @@
         <w:jc w:val="both"/>
       </w:pPr>
       <w:r>
-        <w:t>두 시드 모두 일괄 방식의 MAE·LPIPS가 낮고 SSIM이 높았다. 평균 LPIPS는 일괄 0.081096, 순차 0.103531로 일괄이 21.7% 낮았다. 최종 네 이미지에서 남색 셔츠, 옅은 파란 배경과 핀 하나를 확인하였다. 모델 로딩과 저장을 포함한 평균 경로 처리 시간은 일괄 1회 115.1초, 순차 3회 합계 373.4초였다. 이 표는 한 합성 인물·두 시드의 예비 비교다.</w:t>
+        <w:t>두 시드 모두 일괄 방식의 MAE·LPIPS가 낮고 SSIM이 높았다. 평균 LPIPS는 일괄 0.081096, 순차 0.103531로 일괄이 21.7% 낮았다. 최종 네 이미지에서 남색 셔츠, 옅은 파란 배경과 핀 하나를 확인하였다. 모델 로딩과 저장을 포함한 평균 전체 처리 시간은 일괄 1회 115.1초, 순차 3회 합계 373.4초였다. 이 표는 한 합성 인물·두 시드의 예비 비교다.</w:t>
       </w:r>
     </w:p>
     <w:p>
@@ -4418,7 +4418,7 @@
         <w:jc w:val="both"/>
       </w:pPr>
       <w:r>
-        <w:t>같은 웹 생성 경로를 P01–P06의 합성 인물 6명에게 세 번씩 적용하였다. 각 반복에서 순차 생성 3회와 원본 기반 일괄 재생성 1회를 실행해 72개 출력을 얻었다. 최종 18쌍에서 평균 얼굴 MAE는 일괄 0.134223·순차 0.138753, SSIM은 0.846176·0.768563, LPIPS는 0.087120·0.108710이었다. 일괄 방식의 평균 LPIPS는 순차보다 19.9% 낮았다. LPIPS와 SSIM은 18쌍 모두 일괄 방식에 유리했고 MAE는 14쌍에서 일괄 방식에 유리했다. 원본 대비 ArcFace 코사인 유사도는 일괄 0.922054, 순차 0.713703으로 평균 차이는 0.208351이었다. 18쌍 모두와 인물별 평균 6명 모두에서 일괄 방식이 높았다. 비교 이미지에서 남색 셔츠, 옅은 파란 배경과 작은 핀을 확인하였다. 일부 순차 출력은 소매 길이 등 요청하지 않은 옷 형태가 달라졌다. 인물별 얼굴 ROI는 기존 실험에서 고정한 좌표를 해상도에 맞춰 축소했고, 입력 이미지 계보와 최종 프롬프트 일치를 검증하였다. 세 회는 인물 내 반복 관측이다.</w:t>
+        <w:t>같은 웹 편집기에서 P01–P06의 합성 인물 6명에게 두 편집 방식을 세 번씩 적용하였다. 각 반복에서 순차 생성 3회와 원본 기반 일괄 재생성 1회를 실행해 72개 출력을 얻었다. 최종 18쌍에서 평균 얼굴 MAE는 일괄 0.134223·순차 0.138753, SSIM은 0.846176·0.768563, LPIPS는 0.087120·0.108710이었다. 일괄 방식의 평균 LPIPS는 순차보다 19.9% 낮았다. LPIPS와 SSIM은 18쌍 모두 일괄 방식에 유리했고 MAE는 14쌍에서 일괄 방식에 유리했다. 원본 대비 ArcFace 코사인 유사도는 일괄 0.922054, 순차 0.713703으로 평균 차이는 0.208351이었다. 18쌍 모두와 인물별 평균 6명 모두에서 일괄 방식이 높았다. 비교 이미지에서 남색 셔츠, 옅은 파란 배경과 작은 핀을 확인하였다. 일부 순차 출력은 소매 길이 등 요청하지 않은 옷 형태가 달라졌다. 인물별 얼굴 ROI는 기존 실험에서 고정한 좌표를 해상도에 맞춰 축소했고, 입력 이미지 계보와 최종 프롬프트 일치를 검증하였다. 세 회는 인물 내 반복 관측이다.</w:t>
       </w:r>
     </w:p>
     <w:p>

</xml_diff>

<commit_message>
Complete structured-control analysis and align verified paper and slides
</commit_message>
<xml_diff>
--- a/paper/manuscript.inha.docx
+++ b/paper/manuscript.inha.docx
@@ -65,7 +65,7 @@
         <w:t xml:space="preserve">요약: </w:t>
       </w:r>
       <w:r>
-        <w:t>반복적인 인물 이미지 편집에는 이전 출력의 변형이 누적되는 문제와, 수정·취소가 섞인 대화에서 최종 요구를 잘못 종합하는 문제가 있다. 본 연구는 두 문제를 분리해 비교했다. 첫째, 합성 인물 6명에 세 편집을 세 번씩 적용하여 순차 편집과 최초 원본 기반 재생성의 최종 출력 18쌍을 비교했다. 원본 대비 ArcFace 얼굴 특징 유사도는 재생성 0.922, 순차 편집 0.714였고 재생성이 18쌍 모두 높았다. 얼굴 LPIPS는 각각 0.087과 0.109였다. 둘째, 공개 사진의 실제 인물 6명에게 8턴 편집 이력 3종을 적용하고 두 시드와 세 프롬프트 전달 방법으로 이미지 108장을 비교했다. 최종 목표 6항목의 충족은 대화 전체 전달 96/216, 언어 모델의 최종 프롬프트 종합 168/216, 정확한 최종 상태를 제공한 상한 기준 199/216이었다. 그러나 종합 프롬프트의 원본 대비 얼굴 유사도는 0.585로 다른 두 방법의 0.733, 0.735보다 낮았다. 취소된 조건이 프롬프트에 남은 사례와 정확한 상태를 줘도 핀 위치를 틀린 사례가 나타났다. 결과는 원본 입력 정책, 최종 요구 상태 관리, 이미지 생성의 세부 제어를 각각 평가해야 함을 보여 준다. 이 결과는 단일 생성 모델, 소수 인물, 단일 평가자의 탐색적 비교이다.</w:t>
+        <w:t>반복 인물 이미지 편집에서는 생성물의 변형 누적과 대화의 최종 요구 추출 오류를 구분해야 한다. 합성 인물 6명의 최종 출력 18쌍에서 원본 기반 재생성의 평균 ArcFace는 0.922로 순차 편집의 0.714보다 높았다. 별도의 실제 인물 6명·8턴 대화 3종·두 시드 비교에서는 자연어 에이전트 종합이 전체 대화 전달보다 목표 충족을 높였지만(168/216 대 96/216) 얼굴 유사도는 낮았다(0.585 대 0.733). 취소 요청 처리의 후속 실험에서는 새 대화 4종으로 96장을 생성하고, 새 요청의 변경 항목을 추출해 코드로 갱신하는 방법을 평가했다. 1차 AI 목표 충족은 자연어 종합 194/288에서 상태 갱신 240/288로, 평균 ArcFace는 0.586에서 0.675로 높아졌다. 다만 한 대화에서는 배경·소품 교체를 놓쳐 상태 갱신의 목표 점수가 더 낮았다. 2차 AI는 257/288과 261/288로 작은 차이를 보였으며, 두 AI의 핀 항목 일치는 34/96에 그쳤다. 전체 대화 상태 추출의 추가 48개 조건에서는 1차·2차 목표 충족이 127/288·142/288로 낮았지만 ArcFace는 0.847로 높았다. 형식 오류로 편집을 수행하지 않은 출력도 포함되어 얼굴 유사도만으로 성공을 판단할 수 없었다. 결과는 최종 요구 관리와 이미지 생성 제어, 평가 신뢰도를 함께 검토할 필요성을 보여 준다. 단일 생성 모델과 소수 인물, 개발자 작성 대화에 한정된 탐색적 연구이며 독립 인간 평가는 확보하지 않았다.</w:t>
       </w:r>
     </w:p>
     <w:p>
@@ -79,7 +79,7 @@
         <w:t xml:space="preserve">Abstract: </w:t>
       </w:r>
       <w:r>
-        <w:t>Iterative portrait editing faces two distinct challenges: changes can accumulate when prior outputs are reused, and revised or cancelled requests can be misrepresented in the final prompt. We evaluated both. In 18 paired comparisons from six synthetic identities, original-referenced regeneration achieved higher mean ArcFace similarity than sequential editing (0.922 versus 0.714) and lower facial LPIPS (0.087 versus 0.109). In a separate study with six real-person photos, three eight-turn histories, two seeds, and three prompt strategies, an agent-synthesized prompt satisfied 168 of 216 final goals, compared with 96 for full-history prompting and 199 for an oracle final-state prompt. However, the agent method had lower mean ArcFace similarity (0.585) than both full-history (0.733) and oracle-state (0.735) prompting. Cancelled conditions persisted in one agent prompt, while precise pin placement remained difficult even with the oracle state. These exploratory results distinguish image-input policy, final-state extraction, and image-model control; they do not establish generalization beyond the tested people, histories, and model.</w:t>
+        <w:t>Iterative portrait editing requires separating accumulated image changes from errors in extracting the final request. Across 18 final-output pairs from six synthetic identities, original-referenced regeneration achieved higher mean ArcFace similarity than sequential editing (0.922 versus 0.714). With six real-person photos, three eight-turn dialogues and two seeds, natural-language agent synthesis improved goal fulfillment over full-history prompting (168/216 versus 96/216), but reduced facial similarity (0.585 versus 0.733). A follow-up comparison generated 96 images using four new dialogues and the same photos. Extracting changes from each new request and applying them to a stored six-slot state increased primary AI goal ratings from 194/288 to 240/288 and mean ArcFace from 0.586 to 0.675. However, missed background and prop replacements worsened one dialogue. A second AI showed a smaller difference, 257/288 versus 261/288; agreement on pin judgments was only 34/96. A post-hoc whole-history structured extraction control suffered JSON format failures and achieved 127/288 and 142/288 goals under the two AI evaluators despite higher ArcFace (0.847). Its 48 conditions contained 36 distinct RGB images. These exploratory findings support joint assessment of request management, facial preservation and attribute fulfillment. Different instructions, call counts and evaluation phases prevent isolating a causal state-management effect. The study uses one image model, six real-person photos and developer-written dialogues, without independent human evaluation.</w:t>
       </w:r>
     </w:p>
     <w:p>
@@ -117,7 +117,7 @@
         <w:jc w:val="both"/>
       </w:pPr>
       <w:r>
-        <w:t>본 연구의 질문은 두 가지다. 첫째, 같은 최종 요구에서 직전 출력을 잇는 방식과 최초 원본에서 재생성하는 방식은 얼굴 보존에 어떤 차이가 있는가? 둘째, 수정과 취소가 포함된 대화의 최종 프롬프트를 어떻게 구성해야 목표를 반영하며, 그 과정에서 얼굴 보존은 어떻게 달라지는가? 첫 질문에는 합성 인물의 쌍별 정책 비교를, 둘째에는 실제 인물의 대화 종합 비교를 사용한다. 두 실험의 인물과 편집 과제가 다르므로 결과를 합산하거나 하나의 인과 효과로 해석하지 않는다.</w:t>
+        <w:t>본 연구의 질문은 두 가지다. 첫째, 같은 최종 요구에서 직전 출력을 잇는 방식과 최초 원본에서 재생성하는 방식은 얼굴 보존에 어떤 차이가 있는가? 둘째, 수정과 취소가 포함된 대화의 최종 프롬프트를 어떻게 구성해야 목표를 반영하며, 그 과정에서 얼굴 보존은 어떻게 달라지는가? 첫 질문에는 합성 인물의 쌍별 정책 비교를 사용한다. 둘째에는 실제 인물의 대화 종합 비교와 새 요청마다 상태를 갱신하는 후속 비교, 전체 대화에서 구조화된 상태를 추출하는 추가 대조를 사용한다. 서로 다른 과제의 결과를 합산하거나 하나의 인과 효과로 해석하지 않는다.</w:t>
       </w:r>
     </w:p>
     <w:p>
@@ -134,6 +134,30 @@
       </w:pPr>
       <w:r>
         <w:t>MagicBrush는 단일·다중 턴 지시 편집 자료를 제공한다[1]. LPIPS는 심층 특징을 이용한 지각적 거리 지표이며[2], ArcFace는 얼굴 인식 임베딩의 특징 비교에 사용된다[3]. 본 연구에서는 LPIPS를 원본과 최종 얼굴 영역의 거리로, ArcFace 코사인 유사도를 얼굴 특징 보존의 대리 지표로 사용한다. 두 지표만으로 편집 요청의 충족 여부를 판정하지 않고 별도 육안 점수를 기록한다.</w:t>
+      </w:r>
+    </w:p>
+    <w:p>
+      <w:pPr>
+        <w:jc w:val="both"/>
+      </w:pPr>
+      <w:r>
+        <w:t>대화 상태 추적에서는 변경할 항목을 선택하고 나머지 값을 이전 턴에서 유지하는 접근이 연구되었다. Guo 등은 갱신 대상 선택과 값 생성을 나누고, 선택되지 않은 항목의 이전 값을 유지했다[4]. 본 연구의 자동 상태 갱신은 이와 관련된 상태 관리 원리를 제한된 인물 편집 항목에 적용한다. 항목별 상태 관리 자체를 새로운 알고리즘으로 주장하기보다, 최종 프롬프트 종합 및 이미지 생성과 연결했을 때의 효과와 오류를 평가한다.</w:t>
+      </w:r>
+    </w:p>
+    <w:p>
+      <w:pPr>
+        <w:jc w:val="both"/>
+      </w:pPr>
+      <w:r>
+        <w:t>Hao 등의 Promptist는 사용자 입력을 이미지 모델에 적합한 프롬프트로 바꾸기 위해 지도 학습과 강화 학습을 사용하고, 사용자 의도를 유지하면서 이미지의 미적 품질을 높이는 목적을 다뤘다[5]. 본 연구는 모델을 추가 학습하지 않고 고정된 언어 모델로 수정·취소 이력의 최종 상태를 추출한다. 프롬프트 문장의 품질과 대화의 최신 요구를 유지하는 능력을 구분해 평가한다.</w:t>
+      </w:r>
+    </w:p>
+    <w:p>
+      <w:pPr>
+        <w:jc w:val="both"/>
+      </w:pPr>
+      <w:r>
+        <w:t>Huang 등의 T2I-CompBench는 색·형태·질감의 속성 결합과 공간 관계, 복합 구성을 별도 과제로 평가했다[6]. 이 구분은 핀의 색·형태·좌우를 한꺼번에 충족해야 하는 본 연구의 항목과 관련된다. 얼굴 유사도나 전체적인 이미지 인상만으로 해당 목표의 달성을 판단하기 어려워 목표 항목별 점수를 함께 보고한다. 본 연구의 대화와 이미지는 별도로 작성·생성한 자료이며 해당 벤치마크의 점수와 직접 비교하지 않는다.</w:t>
       </w:r>
     </w:p>
     <w:p>
@@ -197,7 +221,7 @@
         <w:jc w:val="both"/>
       </w:pPr>
       <w:r>
-        <w:t>평가자는 방법명을 가린 비교판에서 최종 목표 6항목을 각 이미지에 대해 충족(1), 미충족(0), 판단 어려움으로 채점했다. 판단 어려움은 성공으로 계산하지 않았다. 얼굴은 InsightFace buffalo_l로 검출·정렬한 뒤 원본–출력 ArcFace 코사인 유사도를 구했다. 108장 모두 한 얼굴이 검출되었다. 한 명의 평가자가 채점했으며 R01–H2–시드42의 한 세트는 가림 전 이미지가 노출된 예외가 있다. 분석의 독립 단위는 6명이고 이력·시드는 인물 내 반복이다.</w:t>
+        <w:t>방법명을 가린 비교판에서 최종 목표 6항목을 각 이미지에 대해 충족(1), 미충족(0), 판단 어려움으로 채점했다. 판단 어려움은 성공으로 계산하지 않았다. 얼굴은 InsightFace buffalo_l로 검출·정렬한 뒤 원본–출력 ArcFace 코사인 유사도를 구했다. 108장 모두 한 얼굴이 검출되었다. 평가 원기록은 운영자의 단일 시각 판정으로 되어 있으며, 독립 인간 평가를 확인할 자료는 없다. R01–H2–시드42의 한 세트는 가림 전 이미지가 노출된 예외가 있다. 분석의 독립 단위는 6명이고 이력·시드는 인물 내 반복이다.</w:t>
       </w:r>
     </w:p>
     <w:p>
@@ -205,7 +229,7 @@
         <w:pStyle w:val="Heading2"/>
       </w:pPr>
       <w:r>
-        <w:t>3. 재현 조건과 자료 사용</w:t>
+        <w:t>3. 자동 요구 상태 갱신의 후속 비교</w:t>
       </w:r>
     </w:p>
     <w:p>
@@ -213,7 +237,127 @@
         <w:jc w:val="both"/>
       </w:pPr>
       <w:r>
-        <w:t>두 실험의 입력 정책, 프롬프트, 시드, 출력 해시, 점수 및 검증 기록은 저장소에 보존했다. 실제 인물 사진의 출처와 사용 범위도 기록했다. 공개 사진의 편집 허용과 연구 대상자의 별도 동의는 다른 문제이므로, 본문에는 실제 인물의 식별 가능한 비교 이미지를 싣지 않았다. 초상권·모델 이용 조건을 별도로 확인해야 외부 공개 범위를 확장할 수 있다.</w:t>
+        <w:t>기존 H1–H3에서 확인한 취소 처리 문제를 검증하기 위해 새 대화 U1–U4를 고정했다. 각 대화는 8턴이며 재킷, 상의, 핀, 목걸이, 배경, 배경 소품의 여섯 항목을 다룬다. 삭제, 교체, 재추가와 ‘제거하지 말라’는 요청을 포함한다. 개발 중 사용한 T1–T4와는 별도이지만 같은 개발자가 제한 어휘로 작성한 대화이므로 독립적으로 수집한 사용자 자료는 아니다.</w:t>
+      </w:r>
+    </w:p>
+    <w:p>
+      <w:pPr>
+        <w:jc w:val="both"/>
+      </w:pPr>
+      <w:r>
+        <w:t>자동 상태 갱신은 Qwen3 4B가 새 요청 하나에서 변경 항목과 값을 JSON으로 추출하고, 코드가 이전 상태에 적용하는 방식이다(그림 1). 언어 모델에는 과거 상태를 제공하지 않는다. 코드는 지원 항목과 값, 요청에 등장하는 색·종류·위치 단어를 확인하며 삭제값과 미변경 항목을 유지한다. 검증 실패 시 한 번 재시도하고 다시 실패하면 이전 상태를 유지하며 거부 기록을 남긴다. 최신 여섯 항목만 정해진 문장으로 바꿔 최종 이미지 프롬프트를 만든다. 범위가 정해진 어휘 검사는 문장의 의미를 완전히 검증하지 못한다.</w:t>
+      </w:r>
+    </w:p>
+    <w:p>
+      <w:pPr>
+        <w:keepNext/>
+        <w:spacing w:line="240" w:lineRule="auto"/>
+      </w:pPr>
+      <w:r>
+        <w:drawing>
+          <wp:inline xmlns:a="http://schemas.openxmlformats.org/drawingml/2006/main" xmlns:pic="http://schemas.openxmlformats.org/drawingml/2006/picture">
+            <wp:extent cx="6048000" cy="2290909"/>
+            <wp:docPr id="1" name="Picture 1"/>
+            <wp:cNvGraphicFramePr>
+              <a:graphicFrameLocks noChangeAspect="1"/>
+            </wp:cNvGraphicFramePr>
+            <a:graphic>
+              <a:graphicData uri="http://schemas.openxmlformats.org/drawingml/2006/picture">
+                <pic:pic>
+                  <pic:nvPicPr>
+                    <pic:cNvPr id="0" name="state-update.png"/>
+                    <pic:cNvPicPr/>
+                  </pic:nvPicPr>
+                  <pic:blipFill>
+                    <a:blip r:embed="rId9"/>
+                    <a:stretch>
+                      <a:fillRect/>
+                    </a:stretch>
+                  </pic:blipFill>
+                  <pic:spPr>
+                    <a:xfrm>
+                      <a:off x="0" y="0"/>
+                      <a:ext cx="6048000" cy="2290909"/>
+                    </a:xfrm>
+                    <a:prstGeom prst="rect"/>
+                  </pic:spPr>
+                </pic:pic>
+              </a:graphicData>
+            </a:graphic>
+          </wp:inline>
+        </w:drawing>
+      </w:r>
+    </w:p>
+    <w:p>
+      <w:pPr>
+        <w:pStyle w:val="Caption"/>
+      </w:pPr>
+      <w:r>
+        <w:t>그림 1. 새 요청의 변경 추출과 코드 기반 상태 갱신</w:t>
+      </w:r>
+    </w:p>
+    <w:p>
+      <w:pPr>
+        <w:jc w:val="both"/>
+      </w:pPr>
+      <w:r>
+        <w:t>비교 대상은 기존의 전체 대화 초안 작성·대조 2회 방식이다. 실제 인물 R01–R06, 대화 4종, 시드 42·314, 두 방법으로 96개 조건과 최종 48쌍을 설계했다. 최초 원본, 이미지 모델과 생성 스텝은 이전 실제 인물 실험과 같다. 자동 프롬프트를 모두 고정한 뒤 정답 상태와 비교하며, 오류가 있는 프롬프트도 그대로 생성에 사용한다. 두 방법은 언어 모델 호출 수가 달라 시스템 전체의 비교로 해석하고 호출 수와 처리 시간을 함께 기록한다.</w:t>
+      </w:r>
+    </w:p>
+    <w:p>
+      <w:pPr>
+        <w:jc w:val="both"/>
+      </w:pPr>
+      <w:r>
+        <w:t>최종 이미지의 여섯 목표는 방법명을 가린 Codex 시각 판정과 별도 로컬 Qwen2.5-VL 3B 판정으로 평가한다. 두 판정의 점수와 일치율을 각각 보고하고, 판단 불가 항목은 성공으로 계산하지 않는다. 두 평가 모두 AI 평가이며 독립 인간 평가는 확보하지 않았다. 얼굴 유사도는 모든 시각 점수를 기록한 뒤 결합한다. 반복 관측의 독립 단위는 인물 6명이며, 대화 수가 4종이라는 한계도 함께 고려한다.</w:t>
+      </w:r>
+    </w:p>
+    <w:p>
+      <w:pPr>
+        <w:pStyle w:val="Heading2"/>
+      </w:pPr>
+      <w:r>
+        <w:t>4. 전체 대화에서 상태를 추출하는 추가 대조</w:t>
+      </w:r>
+    </w:p>
+    <w:p>
+      <w:pPr>
+        <w:jc w:val="both"/>
+      </w:pPr>
+      <w:r>
+        <w:t>자동 상태 갱신과 자연어 종합의 차이에는 누적 상태 관리뿐 아니라 출력 형식, 지시문, 호출 수의 차이도 포함된다. 이를 더 구체적으로 해석하기 위해 전체 대화에서 최종 여섯 항목을 한 번에 추출하는 대조를 설계했다. 같은 Qwen3 4B가 첫 호출에서 최종 JSON 상태를 작성하고, 두 번째 호출에서 원래 대화와 대조한다. 두 호출 모두 온도 0, 최대 700토큰이며 예시 정답은 제공하지 않는다. 두 번째 출력이 형식상 유효하면 사용하고, 그렇지 않으면 첫 번째 유효 출력으로 되돌린다. 둘 다 실패하면 모든 항목을 원본 유지로 설정하고 실패를 기록한다. 최종 상태를 이미지 프롬프트로 바꾸는 코드는 자동 상태 갱신과 같다.</w:t>
+      </w:r>
+    </w:p>
+    <w:p>
+      <w:pPr>
+        <w:jc w:val="both"/>
+      </w:pPr>
+      <w:r>
+        <w:t>이 대조는 U1 일부 이미지와 상태 추출 오류를 확인한 뒤 사전 명세했으며, 기존 U1–U4를 재사용하는 후속 진단이다. 새로운 대화에 대한 독립 일반화 검증이나 상태 관리 한 요소만의 인과 효과로 해석하지 않는다. 같은 인물 6명, 대화 4종, 시드 2개인 48개 조건을 추가 비교한다. 원본·프롬프트 바이트·이미지 모델·스텝·크기·시드가 모두 같은 기존 출력은 해시를 확인해 재사용하며, 해당 이미지의 기존 평가도 연결한다. 재사용 이미지를 새로운 독립 반복으로 세지 않고 새 생성 수와 추가 비용을 분리한다. PNG의 기록 정보가 달라도 실제 이미지가 같을 수 있으므로 크기와 RGB 픽셀의 해시도 별도로 계산한다. 동일 픽셀 결과가 서로 다른 대화 조건에 나타나면 조건별 목표를 각각 평가하되 고유 이미지 수와 구분한다. 새로운 출력에는 같은 목표와 두 AI 평가자를 적용한다. 기존 이미지를 본 이력이 있어 완전한 신규 가림 평가로 주장하지 않는다.</w:t>
+      </w:r>
+    </w:p>
+    <w:p>
+      <w:pPr>
+        <w:jc w:val="both"/>
+      </w:pPr>
+      <w:r>
+        <w:t>추가 대조의 1차 AI 점수는 후속 대화형 평가에서 기록하고 기존 두 방법의 점수는 이전 기록을 연결한다. 따라서 세 방법 모두를 같은 시점의 단일 고정 대화형 모델로 새로 채점한 비교는 아니다. 2차 로컬 평가에서는 기존과 같은 모델 버전과 평가 문구를 사용하며 두 평가 결과를 분리해 보고한다.</w:t>
+      </w:r>
+    </w:p>
+    <w:p>
+      <w:pPr>
+        <w:pStyle w:val="Heading2"/>
+      </w:pPr>
+      <w:r>
+        <w:t>5. 재현 조건과 자료 사용</w:t>
+      </w:r>
+    </w:p>
+    <w:p>
+      <w:pPr>
+        <w:jc w:val="both"/>
+      </w:pPr>
+      <w:r>
+        <w:t>각 실험의 입력 정책, 프롬프트, 시드, 출력 해시, 점수 및 검증 기록은 저장소에 보존한다. 실제 인물 사진의 출처와 사용 범위도 기록했다. 공개 사진의 편집 허용과 연구 대상자의 별도 동의는 다른 문제이므로, 본문에는 실제 인물의 식별 가능한 비교 이미지를 싣지 않았다. 초상권·모델 이용 조건을 별도로 확인해야 외부 공개 범위를 확장할 수 있다.</w:t>
       </w:r>
     </w:p>
     <w:p>
@@ -2066,6 +2210,1529 @@
     </w:p>
     <w:p>
       <w:pPr>
+        <w:pStyle w:val="Heading2"/>
+      </w:pPr>
+      <w:r>
+        <w:t>3. 자동 상태 갱신의 효과와 실패</w:t>
+      </w:r>
+    </w:p>
+    <w:p>
+      <w:pPr>
+        <w:jc w:val="both"/>
+      </w:pPr>
+      <w:r>
+        <w:t>U1–U4의 48쌍에서 1차 AI 평가의 목표 충족은 자연어 에이전트 종합 194/288(67.4%), 자동 상태 갱신 240/288(83.3%)이었다. 원본 대비 평균 ArcFace는 각각 0.585593과 0.675335였다. 취소된 항목만 보면 각각 26/72와 72/72였다. 취소 항목의 개선은 전체 목표의 완전한 달성과는 다르다. 이 점수는 방법명을 가린 AI 판정이며 인간 평가 결과가 아니다.</w:t>
+      </w:r>
+    </w:p>
+    <w:p>
+      <w:pPr>
+        <w:pStyle w:val="Caption"/>
+        <w:keepNext/>
+        <w:ind w:firstLine="0"/>
+        <w:jc w:val="center"/>
+      </w:pPr>
+      <w:r>
+        <w:t>표 5. 자동 상태 갱신의 목표 충족과 얼굴 유사도</w:t>
+      </w:r>
+    </w:p>
+    <w:tbl>
+      <w:tblPr>
+        <w:tblW w:type="auto" w:w="0"/>
+        <w:tblLayout w:type="fixed"/>
+        <w:tblLook w:firstColumn="1" w:firstRow="1" w:lastColumn="0" w:lastRow="0" w:noHBand="0" w:noVBand="1" w:val="04A0"/>
+      </w:tblPr>
+      <w:tblGrid>
+        <w:gridCol w:w="1928"/>
+        <w:gridCol w:w="1928"/>
+        <w:gridCol w:w="1928"/>
+        <w:gridCol w:w="1928"/>
+        <w:gridCol w:w="1928"/>
+      </w:tblGrid>
+      <w:tr>
+        <w:trPr>
+          <w:cantSplit/>
+          <w:tblHeader/>
+        </w:trPr>
+        <w:tc>
+          <w:tcPr>
+            <w:tcW w:type="dxa" w:w="1928"/>
+            <w:tcBorders>
+              <w:bottom w:val="single" w:sz="5"/>
+            </w:tcBorders>
+          </w:tcPr>
+          <w:p>
+            <w:pPr>
+              <w:spacing w:after="60" w:before="60" w:line="240" w:lineRule="auto"/>
+              <w:ind w:firstLine="0"/>
+            </w:pPr>
+            <w:r>
+              <w:rPr>
+                <w:b/>
+                <w:sz w:val="16"/>
+              </w:rPr>
+              <w:t>방법</w:t>
+            </w:r>
+          </w:p>
+        </w:tc>
+        <w:tc>
+          <w:tcPr>
+            <w:tcW w:type="dxa" w:w="1928"/>
+            <w:tcBorders>
+              <w:bottom w:val="single" w:sz="5"/>
+            </w:tcBorders>
+          </w:tcPr>
+          <w:p>
+            <w:pPr>
+              <w:spacing w:after="60" w:before="60" w:line="240" w:lineRule="auto"/>
+              <w:ind w:firstLine="0"/>
+            </w:pPr>
+            <w:r>
+              <w:rPr>
+                <w:b/>
+                <w:sz w:val="16"/>
+              </w:rPr>
+              <w:t>1차 AI 목표</w:t>
+            </w:r>
+          </w:p>
+        </w:tc>
+        <w:tc>
+          <w:tcPr>
+            <w:tcW w:type="dxa" w:w="1928"/>
+            <w:tcBorders>
+              <w:bottom w:val="single" w:sz="5"/>
+            </w:tcBorders>
+          </w:tcPr>
+          <w:p>
+            <w:pPr>
+              <w:spacing w:after="60" w:before="60" w:line="240" w:lineRule="auto"/>
+              <w:ind w:firstLine="0"/>
+            </w:pPr>
+            <w:r>
+              <w:rPr>
+                <w:b/>
+                <w:sz w:val="16"/>
+              </w:rPr>
+              <w:t>2차 AI 목표</w:t>
+            </w:r>
+          </w:p>
+        </w:tc>
+        <w:tc>
+          <w:tcPr>
+            <w:tcW w:type="dxa" w:w="1928"/>
+            <w:tcBorders>
+              <w:bottom w:val="single" w:sz="5"/>
+            </w:tcBorders>
+          </w:tcPr>
+          <w:p>
+            <w:pPr>
+              <w:spacing w:after="60" w:before="60" w:line="240" w:lineRule="auto"/>
+              <w:ind w:firstLine="0"/>
+            </w:pPr>
+            <w:r>
+              <w:rPr>
+                <w:b/>
+                <w:sz w:val="16"/>
+              </w:rPr>
+              <w:t>1차 AI 취소 목표</w:t>
+            </w:r>
+          </w:p>
+        </w:tc>
+        <w:tc>
+          <w:tcPr>
+            <w:tcW w:type="dxa" w:w="1928"/>
+            <w:tcBorders>
+              <w:bottom w:val="single" w:sz="5"/>
+            </w:tcBorders>
+          </w:tcPr>
+          <w:p>
+            <w:pPr>
+              <w:spacing w:after="60" w:before="60" w:line="240" w:lineRule="auto"/>
+              <w:ind w:firstLine="0"/>
+            </w:pPr>
+            <w:r>
+              <w:rPr>
+                <w:b/>
+                <w:sz w:val="16"/>
+              </w:rPr>
+              <w:t>ArcFace ↑</w:t>
+            </w:r>
+          </w:p>
+        </w:tc>
+      </w:tr>
+      <w:tr>
+        <w:trPr>
+          <w:cantSplit/>
+        </w:trPr>
+        <w:tc>
+          <w:tcPr>
+            <w:tcW w:type="dxa" w:w="1928"/>
+          </w:tcPr>
+          <w:p>
+            <w:pPr>
+              <w:spacing w:after="60" w:before="60" w:line="240" w:lineRule="auto"/>
+              <w:ind w:firstLine="0"/>
+            </w:pPr>
+            <w:r>
+              <w:rPr>
+                <w:b w:val="0"/>
+                <w:sz w:val="16"/>
+              </w:rPr>
+              <w:t>에이전트 종합</w:t>
+            </w:r>
+          </w:p>
+        </w:tc>
+        <w:tc>
+          <w:tcPr>
+            <w:tcW w:type="dxa" w:w="1928"/>
+          </w:tcPr>
+          <w:p>
+            <w:pPr>
+              <w:spacing w:after="60" w:before="60" w:line="240" w:lineRule="auto"/>
+              <w:ind w:firstLine="0"/>
+            </w:pPr>
+            <w:r>
+              <w:rPr>
+                <w:b w:val="0"/>
+                <w:sz w:val="16"/>
+              </w:rPr>
+              <w:t>194/288</w:t>
+            </w:r>
+          </w:p>
+        </w:tc>
+        <w:tc>
+          <w:tcPr>
+            <w:tcW w:type="dxa" w:w="1928"/>
+          </w:tcPr>
+          <w:p>
+            <w:pPr>
+              <w:spacing w:after="60" w:before="60" w:line="240" w:lineRule="auto"/>
+              <w:ind w:firstLine="0"/>
+            </w:pPr>
+            <w:r>
+              <w:rPr>
+                <w:b w:val="0"/>
+                <w:sz w:val="16"/>
+              </w:rPr>
+              <w:t>257/288</w:t>
+            </w:r>
+          </w:p>
+        </w:tc>
+        <w:tc>
+          <w:tcPr>
+            <w:tcW w:type="dxa" w:w="1928"/>
+          </w:tcPr>
+          <w:p>
+            <w:pPr>
+              <w:spacing w:after="60" w:before="60" w:line="240" w:lineRule="auto"/>
+              <w:ind w:firstLine="0"/>
+            </w:pPr>
+            <w:r>
+              <w:rPr>
+                <w:b w:val="0"/>
+                <w:sz w:val="16"/>
+              </w:rPr>
+              <w:t>26/72</w:t>
+            </w:r>
+          </w:p>
+        </w:tc>
+        <w:tc>
+          <w:tcPr>
+            <w:tcW w:type="dxa" w:w="1928"/>
+          </w:tcPr>
+          <w:p>
+            <w:pPr>
+              <w:spacing w:after="60" w:before="60" w:line="240" w:lineRule="auto"/>
+              <w:ind w:firstLine="0"/>
+            </w:pPr>
+            <w:r>
+              <w:rPr>
+                <w:b w:val="0"/>
+                <w:sz w:val="16"/>
+              </w:rPr>
+              <w:t>0.585593</w:t>
+            </w:r>
+          </w:p>
+        </w:tc>
+      </w:tr>
+      <w:tr>
+        <w:trPr>
+          <w:cantSplit/>
+        </w:trPr>
+        <w:tc>
+          <w:tcPr>
+            <w:tcW w:type="dxa" w:w="1928"/>
+            <w:tcBorders>
+              <w:bottom w:val="single" w:sz="5"/>
+            </w:tcBorders>
+          </w:tcPr>
+          <w:p>
+            <w:pPr>
+              <w:spacing w:after="60" w:before="60" w:line="240" w:lineRule="auto"/>
+              <w:ind w:firstLine="0"/>
+            </w:pPr>
+            <w:r>
+              <w:rPr>
+                <w:b w:val="0"/>
+                <w:sz w:val="16"/>
+              </w:rPr>
+              <w:t>자동 상태 갱신</w:t>
+            </w:r>
+          </w:p>
+        </w:tc>
+        <w:tc>
+          <w:tcPr>
+            <w:tcW w:type="dxa" w:w="1928"/>
+            <w:tcBorders>
+              <w:bottom w:val="single" w:sz="5"/>
+            </w:tcBorders>
+          </w:tcPr>
+          <w:p>
+            <w:pPr>
+              <w:spacing w:after="60" w:before="60" w:line="240" w:lineRule="auto"/>
+              <w:ind w:firstLine="0"/>
+            </w:pPr>
+            <w:r>
+              <w:rPr>
+                <w:b w:val="0"/>
+                <w:sz w:val="16"/>
+              </w:rPr>
+              <w:t>240/288</w:t>
+            </w:r>
+          </w:p>
+        </w:tc>
+        <w:tc>
+          <w:tcPr>
+            <w:tcW w:type="dxa" w:w="1928"/>
+            <w:tcBorders>
+              <w:bottom w:val="single" w:sz="5"/>
+            </w:tcBorders>
+          </w:tcPr>
+          <w:p>
+            <w:pPr>
+              <w:spacing w:after="60" w:before="60" w:line="240" w:lineRule="auto"/>
+              <w:ind w:firstLine="0"/>
+            </w:pPr>
+            <w:r>
+              <w:rPr>
+                <w:b w:val="0"/>
+                <w:sz w:val="16"/>
+              </w:rPr>
+              <w:t>261/288</w:t>
+            </w:r>
+          </w:p>
+        </w:tc>
+        <w:tc>
+          <w:tcPr>
+            <w:tcW w:type="dxa" w:w="1928"/>
+            <w:tcBorders>
+              <w:bottom w:val="single" w:sz="5"/>
+            </w:tcBorders>
+          </w:tcPr>
+          <w:p>
+            <w:pPr>
+              <w:spacing w:after="60" w:before="60" w:line="240" w:lineRule="auto"/>
+              <w:ind w:firstLine="0"/>
+            </w:pPr>
+            <w:r>
+              <w:rPr>
+                <w:b w:val="0"/>
+                <w:sz w:val="16"/>
+              </w:rPr>
+              <w:t>72/72</w:t>
+            </w:r>
+          </w:p>
+        </w:tc>
+        <w:tc>
+          <w:tcPr>
+            <w:tcW w:type="dxa" w:w="1928"/>
+            <w:tcBorders>
+              <w:bottom w:val="single" w:sz="5"/>
+            </w:tcBorders>
+          </w:tcPr>
+          <w:p>
+            <w:pPr>
+              <w:spacing w:after="60" w:before="60" w:line="240" w:lineRule="auto"/>
+              <w:ind w:firstLine="0"/>
+            </w:pPr>
+            <w:r>
+              <w:rPr>
+                <w:b w:val="0"/>
+                <w:sz w:val="16"/>
+              </w:rPr>
+              <w:t>0.675335</w:t>
+            </w:r>
+          </w:p>
+        </w:tc>
+      </w:tr>
+    </w:tbl>
+    <w:p>
+      <w:pPr>
+        <w:jc w:val="both"/>
+      </w:pPr>
+      <w:r>
+        <w:t>인물별로 묶은 1차 목표 충족과 얼굴 유사도는 6명 모두 자동 상태 갱신이 높았다(표 6). 그러나 인물은 6명이고 같은 네 대화를 반복하므로, 이를 새로운 대화 전반의 성능 보장으로 해석하지 않는다.</w:t>
+      </w:r>
+    </w:p>
+    <w:p>
+      <w:pPr>
+        <w:pStyle w:val="Caption"/>
+        <w:keepNext/>
+        <w:ind w:firstLine="0"/>
+        <w:jc w:val="center"/>
+      </w:pPr>
+      <w:r>
+        <w:t>표 6. 새 대화의 인물별 비교</w:t>
+      </w:r>
+    </w:p>
+    <w:tbl>
+      <w:tblPr>
+        <w:tblW w:type="auto" w:w="0"/>
+        <w:tblLayout w:type="fixed"/>
+        <w:tblLook w:firstColumn="1" w:firstRow="1" w:lastColumn="0" w:lastRow="0" w:noHBand="0" w:noVBand="1" w:val="04A0"/>
+      </w:tblPr>
+      <w:tblGrid>
+        <w:gridCol w:w="1928"/>
+        <w:gridCol w:w="1928"/>
+        <w:gridCol w:w="1928"/>
+        <w:gridCol w:w="1928"/>
+        <w:gridCol w:w="1928"/>
+      </w:tblGrid>
+      <w:tr>
+        <w:trPr>
+          <w:cantSplit/>
+          <w:tblHeader/>
+        </w:trPr>
+        <w:tc>
+          <w:tcPr>
+            <w:tcW w:type="dxa" w:w="1928"/>
+            <w:tcBorders>
+              <w:bottom w:val="single" w:sz="5"/>
+            </w:tcBorders>
+          </w:tcPr>
+          <w:p>
+            <w:pPr>
+              <w:spacing w:after="60" w:before="60" w:line="240" w:lineRule="auto"/>
+              <w:ind w:firstLine="0"/>
+            </w:pPr>
+            <w:r>
+              <w:rPr>
+                <w:b/>
+                <w:sz w:val="16"/>
+              </w:rPr>
+              <w:t>인물</w:t>
+            </w:r>
+          </w:p>
+        </w:tc>
+        <w:tc>
+          <w:tcPr>
+            <w:tcW w:type="dxa" w:w="1928"/>
+            <w:tcBorders>
+              <w:bottom w:val="single" w:sz="5"/>
+            </w:tcBorders>
+          </w:tcPr>
+          <w:p>
+            <w:pPr>
+              <w:spacing w:after="60" w:before="60" w:line="240" w:lineRule="auto"/>
+              <w:ind w:firstLine="0"/>
+            </w:pPr>
+            <w:r>
+              <w:rPr>
+                <w:b/>
+                <w:sz w:val="16"/>
+              </w:rPr>
+              <w:t>종합 목표</w:t>
+            </w:r>
+          </w:p>
+        </w:tc>
+        <w:tc>
+          <w:tcPr>
+            <w:tcW w:type="dxa" w:w="1928"/>
+            <w:tcBorders>
+              <w:bottom w:val="single" w:sz="5"/>
+            </w:tcBorders>
+          </w:tcPr>
+          <w:p>
+            <w:pPr>
+              <w:spacing w:after="60" w:before="60" w:line="240" w:lineRule="auto"/>
+              <w:ind w:firstLine="0"/>
+            </w:pPr>
+            <w:r>
+              <w:rPr>
+                <w:b/>
+                <w:sz w:val="16"/>
+              </w:rPr>
+              <w:t>상태 갱신 목표</w:t>
+            </w:r>
+          </w:p>
+        </w:tc>
+        <w:tc>
+          <w:tcPr>
+            <w:tcW w:type="dxa" w:w="1928"/>
+            <w:tcBorders>
+              <w:bottom w:val="single" w:sz="5"/>
+            </w:tcBorders>
+          </w:tcPr>
+          <w:p>
+            <w:pPr>
+              <w:spacing w:after="60" w:before="60" w:line="240" w:lineRule="auto"/>
+              <w:ind w:firstLine="0"/>
+            </w:pPr>
+            <w:r>
+              <w:rPr>
+                <w:b/>
+                <w:sz w:val="16"/>
+              </w:rPr>
+              <w:t>종합 ArcFace</w:t>
+            </w:r>
+          </w:p>
+        </w:tc>
+        <w:tc>
+          <w:tcPr>
+            <w:tcW w:type="dxa" w:w="1928"/>
+            <w:tcBorders>
+              <w:bottom w:val="single" w:sz="5"/>
+            </w:tcBorders>
+          </w:tcPr>
+          <w:p>
+            <w:pPr>
+              <w:spacing w:after="60" w:before="60" w:line="240" w:lineRule="auto"/>
+              <w:ind w:firstLine="0"/>
+            </w:pPr>
+            <w:r>
+              <w:rPr>
+                <w:b/>
+                <w:sz w:val="16"/>
+              </w:rPr>
+              <w:t>상태 갱신 ArcFace</w:t>
+            </w:r>
+          </w:p>
+        </w:tc>
+      </w:tr>
+      <w:tr>
+        <w:trPr>
+          <w:cantSplit/>
+        </w:trPr>
+        <w:tc>
+          <w:tcPr>
+            <w:tcW w:type="dxa" w:w="1928"/>
+          </w:tcPr>
+          <w:p>
+            <w:pPr>
+              <w:spacing w:after="60" w:before="60" w:line="240" w:lineRule="auto"/>
+              <w:ind w:firstLine="0"/>
+            </w:pPr>
+            <w:r>
+              <w:rPr>
+                <w:b w:val="0"/>
+                <w:sz w:val="16"/>
+              </w:rPr>
+              <w:t>R01</w:t>
+            </w:r>
+          </w:p>
+        </w:tc>
+        <w:tc>
+          <w:tcPr>
+            <w:tcW w:type="dxa" w:w="1928"/>
+          </w:tcPr>
+          <w:p>
+            <w:pPr>
+              <w:spacing w:after="60" w:before="60" w:line="240" w:lineRule="auto"/>
+              <w:ind w:firstLine="0"/>
+            </w:pPr>
+            <w:r>
+              <w:rPr>
+                <w:b w:val="0"/>
+                <w:sz w:val="16"/>
+              </w:rPr>
+              <w:t>33/48</w:t>
+            </w:r>
+          </w:p>
+        </w:tc>
+        <w:tc>
+          <w:tcPr>
+            <w:tcW w:type="dxa" w:w="1928"/>
+          </w:tcPr>
+          <w:p>
+            <w:pPr>
+              <w:spacing w:after="60" w:before="60" w:line="240" w:lineRule="auto"/>
+              <w:ind w:firstLine="0"/>
+            </w:pPr>
+            <w:r>
+              <w:rPr>
+                <w:b w:val="0"/>
+                <w:sz w:val="16"/>
+              </w:rPr>
+              <w:t>40/48</w:t>
+            </w:r>
+          </w:p>
+        </w:tc>
+        <w:tc>
+          <w:tcPr>
+            <w:tcW w:type="dxa" w:w="1928"/>
+          </w:tcPr>
+          <w:p>
+            <w:pPr>
+              <w:spacing w:after="60" w:before="60" w:line="240" w:lineRule="auto"/>
+              <w:ind w:firstLine="0"/>
+            </w:pPr>
+            <w:r>
+              <w:rPr>
+                <w:b w:val="0"/>
+                <w:sz w:val="16"/>
+              </w:rPr>
+              <w:t>0.352</w:t>
+            </w:r>
+          </w:p>
+        </w:tc>
+        <w:tc>
+          <w:tcPr>
+            <w:tcW w:type="dxa" w:w="1928"/>
+          </w:tcPr>
+          <w:p>
+            <w:pPr>
+              <w:spacing w:after="60" w:before="60" w:line="240" w:lineRule="auto"/>
+              <w:ind w:firstLine="0"/>
+            </w:pPr>
+            <w:r>
+              <w:rPr>
+                <w:b w:val="0"/>
+                <w:sz w:val="16"/>
+              </w:rPr>
+              <w:t>0.377</w:t>
+            </w:r>
+          </w:p>
+        </w:tc>
+      </w:tr>
+      <w:tr>
+        <w:trPr>
+          <w:cantSplit/>
+        </w:trPr>
+        <w:tc>
+          <w:tcPr>
+            <w:tcW w:type="dxa" w:w="1928"/>
+          </w:tcPr>
+          <w:p>
+            <w:pPr>
+              <w:spacing w:after="60" w:before="60" w:line="240" w:lineRule="auto"/>
+              <w:ind w:firstLine="0"/>
+            </w:pPr>
+            <w:r>
+              <w:rPr>
+                <w:b w:val="0"/>
+                <w:sz w:val="16"/>
+              </w:rPr>
+              <w:t>R02</w:t>
+            </w:r>
+          </w:p>
+        </w:tc>
+        <w:tc>
+          <w:tcPr>
+            <w:tcW w:type="dxa" w:w="1928"/>
+          </w:tcPr>
+          <w:p>
+            <w:pPr>
+              <w:spacing w:after="60" w:before="60" w:line="240" w:lineRule="auto"/>
+              <w:ind w:firstLine="0"/>
+            </w:pPr>
+            <w:r>
+              <w:rPr>
+                <w:b w:val="0"/>
+                <w:sz w:val="16"/>
+              </w:rPr>
+              <w:t>33/48</w:t>
+            </w:r>
+          </w:p>
+        </w:tc>
+        <w:tc>
+          <w:tcPr>
+            <w:tcW w:type="dxa" w:w="1928"/>
+          </w:tcPr>
+          <w:p>
+            <w:pPr>
+              <w:spacing w:after="60" w:before="60" w:line="240" w:lineRule="auto"/>
+              <w:ind w:firstLine="0"/>
+            </w:pPr>
+            <w:r>
+              <w:rPr>
+                <w:b w:val="0"/>
+                <w:sz w:val="16"/>
+              </w:rPr>
+              <w:t>40/48</w:t>
+            </w:r>
+          </w:p>
+        </w:tc>
+        <w:tc>
+          <w:tcPr>
+            <w:tcW w:type="dxa" w:w="1928"/>
+          </w:tcPr>
+          <w:p>
+            <w:pPr>
+              <w:spacing w:after="60" w:before="60" w:line="240" w:lineRule="auto"/>
+              <w:ind w:firstLine="0"/>
+            </w:pPr>
+            <w:r>
+              <w:rPr>
+                <w:b w:val="0"/>
+                <w:sz w:val="16"/>
+              </w:rPr>
+              <w:t>0.708</w:t>
+            </w:r>
+          </w:p>
+        </w:tc>
+        <w:tc>
+          <w:tcPr>
+            <w:tcW w:type="dxa" w:w="1928"/>
+          </w:tcPr>
+          <w:p>
+            <w:pPr>
+              <w:spacing w:after="60" w:before="60" w:line="240" w:lineRule="auto"/>
+              <w:ind w:firstLine="0"/>
+            </w:pPr>
+            <w:r>
+              <w:rPr>
+                <w:b w:val="0"/>
+                <w:sz w:val="16"/>
+              </w:rPr>
+              <w:t>0.805</w:t>
+            </w:r>
+          </w:p>
+        </w:tc>
+      </w:tr>
+      <w:tr>
+        <w:trPr>
+          <w:cantSplit/>
+        </w:trPr>
+        <w:tc>
+          <w:tcPr>
+            <w:tcW w:type="dxa" w:w="1928"/>
+          </w:tcPr>
+          <w:p>
+            <w:pPr>
+              <w:spacing w:after="60" w:before="60" w:line="240" w:lineRule="auto"/>
+              <w:ind w:firstLine="0"/>
+            </w:pPr>
+            <w:r>
+              <w:rPr>
+                <w:b w:val="0"/>
+                <w:sz w:val="16"/>
+              </w:rPr>
+              <w:t>R03</w:t>
+            </w:r>
+          </w:p>
+        </w:tc>
+        <w:tc>
+          <w:tcPr>
+            <w:tcW w:type="dxa" w:w="1928"/>
+          </w:tcPr>
+          <w:p>
+            <w:pPr>
+              <w:spacing w:after="60" w:before="60" w:line="240" w:lineRule="auto"/>
+              <w:ind w:firstLine="0"/>
+            </w:pPr>
+            <w:r>
+              <w:rPr>
+                <w:b w:val="0"/>
+                <w:sz w:val="16"/>
+              </w:rPr>
+              <w:t>32/48</w:t>
+            </w:r>
+          </w:p>
+        </w:tc>
+        <w:tc>
+          <w:tcPr>
+            <w:tcW w:type="dxa" w:w="1928"/>
+          </w:tcPr>
+          <w:p>
+            <w:pPr>
+              <w:spacing w:after="60" w:before="60" w:line="240" w:lineRule="auto"/>
+              <w:ind w:firstLine="0"/>
+            </w:pPr>
+            <w:r>
+              <w:rPr>
+                <w:b w:val="0"/>
+                <w:sz w:val="16"/>
+              </w:rPr>
+              <w:t>40/48</w:t>
+            </w:r>
+          </w:p>
+        </w:tc>
+        <w:tc>
+          <w:tcPr>
+            <w:tcW w:type="dxa" w:w="1928"/>
+          </w:tcPr>
+          <w:p>
+            <w:pPr>
+              <w:spacing w:after="60" w:before="60" w:line="240" w:lineRule="auto"/>
+              <w:ind w:firstLine="0"/>
+            </w:pPr>
+            <w:r>
+              <w:rPr>
+                <w:b w:val="0"/>
+                <w:sz w:val="16"/>
+              </w:rPr>
+              <w:t>0.666</w:t>
+            </w:r>
+          </w:p>
+        </w:tc>
+        <w:tc>
+          <w:tcPr>
+            <w:tcW w:type="dxa" w:w="1928"/>
+          </w:tcPr>
+          <w:p>
+            <w:pPr>
+              <w:spacing w:after="60" w:before="60" w:line="240" w:lineRule="auto"/>
+              <w:ind w:firstLine="0"/>
+            </w:pPr>
+            <w:r>
+              <w:rPr>
+                <w:b w:val="0"/>
+                <w:sz w:val="16"/>
+              </w:rPr>
+              <w:t>0.765</w:t>
+            </w:r>
+          </w:p>
+        </w:tc>
+      </w:tr>
+      <w:tr>
+        <w:trPr>
+          <w:cantSplit/>
+        </w:trPr>
+        <w:tc>
+          <w:tcPr>
+            <w:tcW w:type="dxa" w:w="1928"/>
+          </w:tcPr>
+          <w:p>
+            <w:pPr>
+              <w:spacing w:after="60" w:before="60" w:line="240" w:lineRule="auto"/>
+              <w:ind w:firstLine="0"/>
+            </w:pPr>
+            <w:r>
+              <w:rPr>
+                <w:b w:val="0"/>
+                <w:sz w:val="16"/>
+              </w:rPr>
+              <w:t>R04</w:t>
+            </w:r>
+          </w:p>
+        </w:tc>
+        <w:tc>
+          <w:tcPr>
+            <w:tcW w:type="dxa" w:w="1928"/>
+          </w:tcPr>
+          <w:p>
+            <w:pPr>
+              <w:spacing w:after="60" w:before="60" w:line="240" w:lineRule="auto"/>
+              <w:ind w:firstLine="0"/>
+            </w:pPr>
+            <w:r>
+              <w:rPr>
+                <w:b w:val="0"/>
+                <w:sz w:val="16"/>
+              </w:rPr>
+              <w:t>32/48</w:t>
+            </w:r>
+          </w:p>
+        </w:tc>
+        <w:tc>
+          <w:tcPr>
+            <w:tcW w:type="dxa" w:w="1928"/>
+          </w:tcPr>
+          <w:p>
+            <w:pPr>
+              <w:spacing w:after="60" w:before="60" w:line="240" w:lineRule="auto"/>
+              <w:ind w:firstLine="0"/>
+            </w:pPr>
+            <w:r>
+              <w:rPr>
+                <w:b w:val="0"/>
+                <w:sz w:val="16"/>
+              </w:rPr>
+              <w:t>40/48</w:t>
+            </w:r>
+          </w:p>
+        </w:tc>
+        <w:tc>
+          <w:tcPr>
+            <w:tcW w:type="dxa" w:w="1928"/>
+          </w:tcPr>
+          <w:p>
+            <w:pPr>
+              <w:spacing w:after="60" w:before="60" w:line="240" w:lineRule="auto"/>
+              <w:ind w:firstLine="0"/>
+            </w:pPr>
+            <w:r>
+              <w:rPr>
+                <w:b w:val="0"/>
+                <w:sz w:val="16"/>
+              </w:rPr>
+              <w:t>0.374</w:t>
+            </w:r>
+          </w:p>
+        </w:tc>
+        <w:tc>
+          <w:tcPr>
+            <w:tcW w:type="dxa" w:w="1928"/>
+          </w:tcPr>
+          <w:p>
+            <w:pPr>
+              <w:spacing w:after="60" w:before="60" w:line="240" w:lineRule="auto"/>
+              <w:ind w:firstLine="0"/>
+            </w:pPr>
+            <w:r>
+              <w:rPr>
+                <w:b w:val="0"/>
+                <w:sz w:val="16"/>
+              </w:rPr>
+              <w:t>0.506</w:t>
+            </w:r>
+          </w:p>
+        </w:tc>
+      </w:tr>
+      <w:tr>
+        <w:trPr>
+          <w:cantSplit/>
+        </w:trPr>
+        <w:tc>
+          <w:tcPr>
+            <w:tcW w:type="dxa" w:w="1928"/>
+          </w:tcPr>
+          <w:p>
+            <w:pPr>
+              <w:spacing w:after="60" w:before="60" w:line="240" w:lineRule="auto"/>
+              <w:ind w:firstLine="0"/>
+            </w:pPr>
+            <w:r>
+              <w:rPr>
+                <w:b w:val="0"/>
+                <w:sz w:val="16"/>
+              </w:rPr>
+              <w:t>R05</w:t>
+            </w:r>
+          </w:p>
+        </w:tc>
+        <w:tc>
+          <w:tcPr>
+            <w:tcW w:type="dxa" w:w="1928"/>
+          </w:tcPr>
+          <w:p>
+            <w:pPr>
+              <w:spacing w:after="60" w:before="60" w:line="240" w:lineRule="auto"/>
+              <w:ind w:firstLine="0"/>
+            </w:pPr>
+            <w:r>
+              <w:rPr>
+                <w:b w:val="0"/>
+                <w:sz w:val="16"/>
+              </w:rPr>
+              <w:t>32/48</w:t>
+            </w:r>
+          </w:p>
+        </w:tc>
+        <w:tc>
+          <w:tcPr>
+            <w:tcW w:type="dxa" w:w="1928"/>
+          </w:tcPr>
+          <w:p>
+            <w:pPr>
+              <w:spacing w:after="60" w:before="60" w:line="240" w:lineRule="auto"/>
+              <w:ind w:firstLine="0"/>
+            </w:pPr>
+            <w:r>
+              <w:rPr>
+                <w:b w:val="0"/>
+                <w:sz w:val="16"/>
+              </w:rPr>
+              <w:t>40/48</w:t>
+            </w:r>
+          </w:p>
+        </w:tc>
+        <w:tc>
+          <w:tcPr>
+            <w:tcW w:type="dxa" w:w="1928"/>
+          </w:tcPr>
+          <w:p>
+            <w:pPr>
+              <w:spacing w:after="60" w:before="60" w:line="240" w:lineRule="auto"/>
+              <w:ind w:firstLine="0"/>
+            </w:pPr>
+            <w:r>
+              <w:rPr>
+                <w:b w:val="0"/>
+                <w:sz w:val="16"/>
+              </w:rPr>
+              <w:t>0.774</w:t>
+            </w:r>
+          </w:p>
+        </w:tc>
+        <w:tc>
+          <w:tcPr>
+            <w:tcW w:type="dxa" w:w="1928"/>
+          </w:tcPr>
+          <w:p>
+            <w:pPr>
+              <w:spacing w:after="60" w:before="60" w:line="240" w:lineRule="auto"/>
+              <w:ind w:firstLine="0"/>
+            </w:pPr>
+            <w:r>
+              <w:rPr>
+                <w:b w:val="0"/>
+                <w:sz w:val="16"/>
+              </w:rPr>
+              <w:t>0.838</w:t>
+            </w:r>
+          </w:p>
+        </w:tc>
+      </w:tr>
+      <w:tr>
+        <w:trPr>
+          <w:cantSplit/>
+        </w:trPr>
+        <w:tc>
+          <w:tcPr>
+            <w:tcW w:type="dxa" w:w="1928"/>
+            <w:tcBorders>
+              <w:bottom w:val="single" w:sz="5"/>
+            </w:tcBorders>
+          </w:tcPr>
+          <w:p>
+            <w:pPr>
+              <w:spacing w:after="60" w:before="60" w:line="240" w:lineRule="auto"/>
+              <w:ind w:firstLine="0"/>
+            </w:pPr>
+            <w:r>
+              <w:rPr>
+                <w:b w:val="0"/>
+                <w:sz w:val="16"/>
+              </w:rPr>
+              <w:t>R06</w:t>
+            </w:r>
+          </w:p>
+        </w:tc>
+        <w:tc>
+          <w:tcPr>
+            <w:tcW w:type="dxa" w:w="1928"/>
+            <w:tcBorders>
+              <w:bottom w:val="single" w:sz="5"/>
+            </w:tcBorders>
+          </w:tcPr>
+          <w:p>
+            <w:pPr>
+              <w:spacing w:after="60" w:before="60" w:line="240" w:lineRule="auto"/>
+              <w:ind w:firstLine="0"/>
+            </w:pPr>
+            <w:r>
+              <w:rPr>
+                <w:b w:val="0"/>
+                <w:sz w:val="16"/>
+              </w:rPr>
+              <w:t>32/48</w:t>
+            </w:r>
+          </w:p>
+        </w:tc>
+        <w:tc>
+          <w:tcPr>
+            <w:tcW w:type="dxa" w:w="1928"/>
+            <w:tcBorders>
+              <w:bottom w:val="single" w:sz="5"/>
+            </w:tcBorders>
+          </w:tcPr>
+          <w:p>
+            <w:pPr>
+              <w:spacing w:after="60" w:before="60" w:line="240" w:lineRule="auto"/>
+              <w:ind w:firstLine="0"/>
+            </w:pPr>
+            <w:r>
+              <w:rPr>
+                <w:b w:val="0"/>
+                <w:sz w:val="16"/>
+              </w:rPr>
+              <w:t>40/48</w:t>
+            </w:r>
+          </w:p>
+        </w:tc>
+        <w:tc>
+          <w:tcPr>
+            <w:tcW w:type="dxa" w:w="1928"/>
+            <w:tcBorders>
+              <w:bottom w:val="single" w:sz="5"/>
+            </w:tcBorders>
+          </w:tcPr>
+          <w:p>
+            <w:pPr>
+              <w:spacing w:after="60" w:before="60" w:line="240" w:lineRule="auto"/>
+              <w:ind w:firstLine="0"/>
+            </w:pPr>
+            <w:r>
+              <w:rPr>
+                <w:b w:val="0"/>
+                <w:sz w:val="16"/>
+              </w:rPr>
+              <w:t>0.641</w:t>
+            </w:r>
+          </w:p>
+        </w:tc>
+        <w:tc>
+          <w:tcPr>
+            <w:tcW w:type="dxa" w:w="1928"/>
+            <w:tcBorders>
+              <w:bottom w:val="single" w:sz="5"/>
+            </w:tcBorders>
+          </w:tcPr>
+          <w:p>
+            <w:pPr>
+              <w:spacing w:after="60" w:before="60" w:line="240" w:lineRule="auto"/>
+              <w:ind w:firstLine="0"/>
+            </w:pPr>
+            <w:r>
+              <w:rPr>
+                <w:b w:val="0"/>
+                <w:sz w:val="16"/>
+              </w:rPr>
+              <w:t>0.760</w:t>
+            </w:r>
+          </w:p>
+        </w:tc>
+      </w:tr>
+    </w:tbl>
+    <w:p>
+      <w:pPr>
+        <w:jc w:val="both"/>
+      </w:pPr>
+      <w:r>
+        <w:t>2차 AI 목표 충족은 자연어 종합 257/288, 자동 상태 갱신 261/288로 방법 간 차이가 작았다(표 5). 두 AI의 항목별 일치는 470/576(81.6%)였으나 핀 항목은 34/96(35.4%)였고, 2차 AI만 성공으로 판정한 핀 항목은 61개였다. 2차 평가에는 형식 파싱 실패가 없었지만, 유효한 JSON이 정확한 판정을 보장하지 않았다. 목표 충족 개선의 크기는 평가자에 민감하며, 두 AI가 큰 개선을 일관되게 재현했다고 주장할 수 없다.</w:t>
+      </w:r>
+    </w:p>
+    <w:p>
+      <w:pPr>
+        <w:jc w:val="both"/>
+      </w:pPr>
+      <w:r>
+        <w:t>대화별로는 U1에서 13/72 대 72/72, U2에서 60/72 대 60/72, U3에서 62/72 대 72/72, U4에서 59/72 대 36/72였다(에이전트 종합 대 자동 상태 갱신). U4에서는 자동 상태 갱신이 배경과 소품 교체를 놓쳐 이전의 도서관과 조명을 유지했다. 따라서 전체 평균의 개선을 모든 대화에서의 우위로 해석할 수 없다. U2와 U4의 핀 항목은 두 방법 모두 각 0/12였으며, 정확한 상태 전달과 이미지 생성기의 위치·형태 제어는 별도 문제로 남았다.</w:t>
+      </w:r>
+    </w:p>
+    <w:p>
+      <w:pPr>
+        <w:jc w:val="both"/>
+      </w:pPr>
+      <w:r>
+        <w:t>자동 상태 추출은 전체 턴의 항목에서 186/192, 변경 대상 항목에서 50/52, 여섯 항목이 모두 맞는 턴에서 29/32를 기록했다. 최종 상태는 22/24항목, 대화 단위로는 3/4가 정확했다. 지원 값과 요청 단어를 검사하는 코드만으로 모든 의미 오류를 막지는 못했다. 네 대화의 프롬프트 준비에는 자연어 종합 8회·106.2초, 자동 상태 갱신 33회·242.3초가 기록되었다. 준비된 프롬프트는 인물과 시드에 걸쳐 재사용했다. 시간은 완료된 준비 기록의 합이며, 중단된 준비 작업과 모델 로딩을 포함한 전체 벽시계 시간이나 비용 우위를 뜻하지 않는다.</w:t>
+      </w:r>
+    </w:p>
+    <w:p>
+      <w:pPr>
+        <w:jc w:val="both"/>
+      </w:pPr>
+      <w:r>
+        <w:t>평가 과정의 예외도 보존했다. 첫 여섯 비교 뒤 대화형 AI의 모델 설정이 바뀌어 1차 평가 전체를 단일 고정 모델의 판정으로 볼 수 없다. 또한 방법 공개 전에 비교판 경계를 추가해 확인한 결과, 옆 이미지의 책장을 잘못 귀속했던 배경 점수 두 항목을 수정했다. 2차 고정 AI에서는 설명에 재킷이나 핀이 있다고 쓰면서 ‘없음’ 목표를 충족으로 채점하는 모순 사례가 관찰되었다. 원문과 점수를 변경하지 않으며, 이 보조 판정을 정확성의 독립 검증으로 해석하지 않는다.</w:t>
+      </w:r>
+    </w:p>
+    <w:p>
+      <w:pPr>
+        <w:pStyle w:val="Heading2"/>
+      </w:pPr>
+      <w:r>
+        <w:t>4. 전체 대화 상태 추출의 형식 오류와 목표 충족</w:t>
+      </w:r>
+    </w:p>
+    <w:p>
+      <w:pPr>
+        <w:jc w:val="both"/>
+      </w:pPr>
+      <w:r>
+        <w:t>전체 대화에서 여섯 항목을 추출하는 추가 대조의 최종 상태는 10/24항목이 정확했고, 여섯 항목 모두 맞는 대화는 0/4였다. U1은 재킷 제거를 놓쳤고 U4는 배경 교체를 놓쳐 각각 5/6항목이 맞았다. U2·U3에서는 두 호출 모두 항목 값으로 문자열 대신 배열을 반환했다. 미리 정한 형식 검증을 통과하지 못해 모든 항목을 원본 유지로 설정했고 각각 0/6을 기록했다. 이 실패 처리를 포함한 프롬프트를 그대로 이미지 생성에 사용했다.</w:t>
+      </w:r>
+    </w:p>
+    <w:p>
+      <w:pPr>
+        <w:jc w:val="both"/>
+      </w:pPr>
+      <w:r>
+        <w:t>U2의 배열에는 요구된 값과 원본 유지 값이 함께 있었고, U3에는 하나의 값을 담은 배열이 있었다. 따라서 최종 상태 점수에는 대화 이해뿐 아니라 출력 형식 준수와 실패 처리 규칙의 영향이 포함된다. 허용 값 목록을 제시한 지시를 모델이 출력 배열로 해석했을 가능성도 있다. 결과를 본 뒤 배열의 첫 값을 취하거나 프롬프트를 고쳐 재채점하지 않았다. 이 대조만으로 점진적 상태 갱신 자체가 전체 대화 추출보다 우수하다고 결론 내릴 수 없다.</w:t>
+      </w:r>
+    </w:p>
+    <w:p>
+      <w:pPr>
+        <w:jc w:val="both"/>
+      </w:pPr>
+      <w:r>
+        <w:t>추가 48개 조건은 모두 새로 생성했고 기존 실험 출력의 정확한 재사용은 0개였다. 다만 U2·U3에 같은 원본 유지 프롬프트가 적용되어 같은 인물·시드에서 픽셀이 동일한 12쌍이 생겼다. PNG 기록 정보를 제외한 고유 RGB 이미지는 36종이다. 이 반복을 새로운 독립 표본으로 취급하지 않는다. 1차 AI 목표 충족은 127/288이며 목걸이 한 항목은 판단 불가로 기록했다. 48장 모두 얼굴 하나가 검출됐고 평균 ArcFace는 0.846995였다. 목표 반영은 낮으면서 얼굴 유사도는 높아, 얼굴 지표만으로 편집 시스템을 우수하다고 평가할 수 없음을 보여 준다.</w:t>
+      </w:r>
+    </w:p>
+    <w:p>
+      <w:pPr>
+        <w:pStyle w:val="Caption"/>
+        <w:keepNext/>
+        <w:ind w:firstLine="0"/>
+        <w:jc w:val="center"/>
+      </w:pPr>
+      <w:r>
+        <w:t>표 7. 전체 대화 상태 추출을 포함한 추가 대조</w:t>
+      </w:r>
+    </w:p>
+    <w:tbl>
+      <w:tblPr>
+        <w:tblW w:type="auto" w:w="0"/>
+        <w:tblLayout w:type="fixed"/>
+        <w:tblLook w:firstColumn="1" w:firstRow="1" w:lastColumn="0" w:lastRow="0" w:noHBand="0" w:noVBand="1" w:val="04A0"/>
+      </w:tblPr>
+      <w:tblGrid>
+        <w:gridCol w:w="2409"/>
+        <w:gridCol w:w="2409"/>
+        <w:gridCol w:w="2409"/>
+        <w:gridCol w:w="2409"/>
+      </w:tblGrid>
+      <w:tr>
+        <w:trPr>
+          <w:cantSplit/>
+          <w:tblHeader/>
+        </w:trPr>
+        <w:tc>
+          <w:tcPr>
+            <w:tcW w:type="dxa" w:w="2409"/>
+            <w:tcBorders>
+              <w:bottom w:val="single" w:sz="5"/>
+            </w:tcBorders>
+          </w:tcPr>
+          <w:p>
+            <w:pPr>
+              <w:spacing w:after="60" w:before="60" w:line="240" w:lineRule="auto"/>
+              <w:ind w:firstLine="0"/>
+            </w:pPr>
+            <w:r>
+              <w:rPr>
+                <w:b/>
+                <w:sz w:val="16"/>
+              </w:rPr>
+              <w:t>방법</w:t>
+            </w:r>
+          </w:p>
+        </w:tc>
+        <w:tc>
+          <w:tcPr>
+            <w:tcW w:type="dxa" w:w="2409"/>
+            <w:tcBorders>
+              <w:bottom w:val="single" w:sz="5"/>
+            </w:tcBorders>
+          </w:tcPr>
+          <w:p>
+            <w:pPr>
+              <w:spacing w:after="60" w:before="60" w:line="240" w:lineRule="auto"/>
+              <w:ind w:firstLine="0"/>
+            </w:pPr>
+            <w:r>
+              <w:rPr>
+                <w:b/>
+                <w:sz w:val="16"/>
+              </w:rPr>
+              <w:t>1차 AI 목표</w:t>
+            </w:r>
+          </w:p>
+        </w:tc>
+        <w:tc>
+          <w:tcPr>
+            <w:tcW w:type="dxa" w:w="2409"/>
+            <w:tcBorders>
+              <w:bottom w:val="single" w:sz="5"/>
+            </w:tcBorders>
+          </w:tcPr>
+          <w:p>
+            <w:pPr>
+              <w:spacing w:after="60" w:before="60" w:line="240" w:lineRule="auto"/>
+              <w:ind w:firstLine="0"/>
+            </w:pPr>
+            <w:r>
+              <w:rPr>
+                <w:b/>
+                <w:sz w:val="16"/>
+              </w:rPr>
+              <w:t>2차 AI 목표</w:t>
+            </w:r>
+          </w:p>
+        </w:tc>
+        <w:tc>
+          <w:tcPr>
+            <w:tcW w:type="dxa" w:w="2409"/>
+            <w:tcBorders>
+              <w:bottom w:val="single" w:sz="5"/>
+            </w:tcBorders>
+          </w:tcPr>
+          <w:p>
+            <w:pPr>
+              <w:spacing w:after="60" w:before="60" w:line="240" w:lineRule="auto"/>
+              <w:ind w:firstLine="0"/>
+            </w:pPr>
+            <w:r>
+              <w:rPr>
+                <w:b/>
+                <w:sz w:val="16"/>
+              </w:rPr>
+              <w:t>ArcFace ↑</w:t>
+            </w:r>
+          </w:p>
+        </w:tc>
+      </w:tr>
+      <w:tr>
+        <w:trPr>
+          <w:cantSplit/>
+        </w:trPr>
+        <w:tc>
+          <w:tcPr>
+            <w:tcW w:type="dxa" w:w="2409"/>
+          </w:tcPr>
+          <w:p>
+            <w:pPr>
+              <w:spacing w:after="60" w:before="60" w:line="240" w:lineRule="auto"/>
+              <w:ind w:firstLine="0"/>
+            </w:pPr>
+            <w:r>
+              <w:rPr>
+                <w:b w:val="0"/>
+                <w:sz w:val="16"/>
+              </w:rPr>
+              <w:t>에이전트 종합</w:t>
+            </w:r>
+          </w:p>
+        </w:tc>
+        <w:tc>
+          <w:tcPr>
+            <w:tcW w:type="dxa" w:w="2409"/>
+          </w:tcPr>
+          <w:p>
+            <w:pPr>
+              <w:spacing w:after="60" w:before="60" w:line="240" w:lineRule="auto"/>
+              <w:ind w:firstLine="0"/>
+            </w:pPr>
+            <w:r>
+              <w:rPr>
+                <w:b w:val="0"/>
+                <w:sz w:val="16"/>
+              </w:rPr>
+              <w:t>194/288</w:t>
+            </w:r>
+          </w:p>
+        </w:tc>
+        <w:tc>
+          <w:tcPr>
+            <w:tcW w:type="dxa" w:w="2409"/>
+          </w:tcPr>
+          <w:p>
+            <w:pPr>
+              <w:spacing w:after="60" w:before="60" w:line="240" w:lineRule="auto"/>
+              <w:ind w:firstLine="0"/>
+            </w:pPr>
+            <w:r>
+              <w:rPr>
+                <w:b w:val="0"/>
+                <w:sz w:val="16"/>
+              </w:rPr>
+              <w:t>257/288</w:t>
+            </w:r>
+          </w:p>
+        </w:tc>
+        <w:tc>
+          <w:tcPr>
+            <w:tcW w:type="dxa" w:w="2409"/>
+          </w:tcPr>
+          <w:p>
+            <w:pPr>
+              <w:spacing w:after="60" w:before="60" w:line="240" w:lineRule="auto"/>
+              <w:ind w:firstLine="0"/>
+            </w:pPr>
+            <w:r>
+              <w:rPr>
+                <w:b w:val="0"/>
+                <w:sz w:val="16"/>
+              </w:rPr>
+              <w:t>0.585593</w:t>
+            </w:r>
+          </w:p>
+        </w:tc>
+      </w:tr>
+      <w:tr>
+        <w:trPr>
+          <w:cantSplit/>
+        </w:trPr>
+        <w:tc>
+          <w:tcPr>
+            <w:tcW w:type="dxa" w:w="2409"/>
+          </w:tcPr>
+          <w:p>
+            <w:pPr>
+              <w:spacing w:after="60" w:before="60" w:line="240" w:lineRule="auto"/>
+              <w:ind w:firstLine="0"/>
+            </w:pPr>
+            <w:r>
+              <w:rPr>
+                <w:b w:val="0"/>
+                <w:sz w:val="16"/>
+              </w:rPr>
+              <w:t>자동 상태 갱신</w:t>
+            </w:r>
+          </w:p>
+        </w:tc>
+        <w:tc>
+          <w:tcPr>
+            <w:tcW w:type="dxa" w:w="2409"/>
+          </w:tcPr>
+          <w:p>
+            <w:pPr>
+              <w:spacing w:after="60" w:before="60" w:line="240" w:lineRule="auto"/>
+              <w:ind w:firstLine="0"/>
+            </w:pPr>
+            <w:r>
+              <w:rPr>
+                <w:b w:val="0"/>
+                <w:sz w:val="16"/>
+              </w:rPr>
+              <w:t>240/288</w:t>
+            </w:r>
+          </w:p>
+        </w:tc>
+        <w:tc>
+          <w:tcPr>
+            <w:tcW w:type="dxa" w:w="2409"/>
+          </w:tcPr>
+          <w:p>
+            <w:pPr>
+              <w:spacing w:after="60" w:before="60" w:line="240" w:lineRule="auto"/>
+              <w:ind w:firstLine="0"/>
+            </w:pPr>
+            <w:r>
+              <w:rPr>
+                <w:b w:val="0"/>
+                <w:sz w:val="16"/>
+              </w:rPr>
+              <w:t>261/288</w:t>
+            </w:r>
+          </w:p>
+        </w:tc>
+        <w:tc>
+          <w:tcPr>
+            <w:tcW w:type="dxa" w:w="2409"/>
+          </w:tcPr>
+          <w:p>
+            <w:pPr>
+              <w:spacing w:after="60" w:before="60" w:line="240" w:lineRule="auto"/>
+              <w:ind w:firstLine="0"/>
+            </w:pPr>
+            <w:r>
+              <w:rPr>
+                <w:b w:val="0"/>
+                <w:sz w:val="16"/>
+              </w:rPr>
+              <w:t>0.675335</w:t>
+            </w:r>
+          </w:p>
+        </w:tc>
+      </w:tr>
+      <w:tr>
+        <w:trPr>
+          <w:cantSplit/>
+        </w:trPr>
+        <w:tc>
+          <w:tcPr>
+            <w:tcW w:type="dxa" w:w="2409"/>
+            <w:tcBorders>
+              <w:bottom w:val="single" w:sz="5"/>
+            </w:tcBorders>
+          </w:tcPr>
+          <w:p>
+            <w:pPr>
+              <w:spacing w:after="60" w:before="60" w:line="240" w:lineRule="auto"/>
+              <w:ind w:firstLine="0"/>
+            </w:pPr>
+            <w:r>
+              <w:rPr>
+                <w:b w:val="0"/>
+                <w:sz w:val="16"/>
+              </w:rPr>
+              <w:t>전체 대화 상태 추출</w:t>
+            </w:r>
+          </w:p>
+        </w:tc>
+        <w:tc>
+          <w:tcPr>
+            <w:tcW w:type="dxa" w:w="2409"/>
+            <w:tcBorders>
+              <w:bottom w:val="single" w:sz="5"/>
+            </w:tcBorders>
+          </w:tcPr>
+          <w:p>
+            <w:pPr>
+              <w:spacing w:after="60" w:before="60" w:line="240" w:lineRule="auto"/>
+              <w:ind w:firstLine="0"/>
+            </w:pPr>
+            <w:r>
+              <w:rPr>
+                <w:b w:val="0"/>
+                <w:sz w:val="16"/>
+              </w:rPr>
+              <w:t>127/288</w:t>
+            </w:r>
+          </w:p>
+        </w:tc>
+        <w:tc>
+          <w:tcPr>
+            <w:tcW w:type="dxa" w:w="2409"/>
+            <w:tcBorders>
+              <w:bottom w:val="single" w:sz="5"/>
+            </w:tcBorders>
+          </w:tcPr>
+          <w:p>
+            <w:pPr>
+              <w:spacing w:after="60" w:before="60" w:line="240" w:lineRule="auto"/>
+              <w:ind w:firstLine="0"/>
+            </w:pPr>
+            <w:r>
+              <w:rPr>
+                <w:b w:val="0"/>
+                <w:sz w:val="16"/>
+              </w:rPr>
+              <w:t>142/288</w:t>
+            </w:r>
+          </w:p>
+        </w:tc>
+        <w:tc>
+          <w:tcPr>
+            <w:tcW w:type="dxa" w:w="2409"/>
+            <w:tcBorders>
+              <w:bottom w:val="single" w:sz="5"/>
+            </w:tcBorders>
+          </w:tcPr>
+          <w:p>
+            <w:pPr>
+              <w:spacing w:after="60" w:before="60" w:line="240" w:lineRule="auto"/>
+              <w:ind w:firstLine="0"/>
+            </w:pPr>
+            <w:r>
+              <w:rPr>
+                <w:b w:val="0"/>
+                <w:sz w:val="16"/>
+              </w:rPr>
+              <w:t>0.846995</w:t>
+            </w:r>
+          </w:p>
+        </w:tc>
+      </w:tr>
+    </w:tbl>
+    <w:p>
+      <w:pPr>
+        <w:jc w:val="both"/>
+      </w:pPr>
+      <w:r>
+        <w:t>세 방법을 연결한 결과는 표 7과 같다. 기존 두 방법의 이미지와 점수는 변경하지 않았다. 추가 대조의 2차 AI 목표 충족도 142/288로 낮았으나, 재킷이 있다고 설명하면서 ‘재킷 없음’을 성공으로 채점하는 모순은 다시 관찰됐다. 2차 평가의 JSON 파싱 실패는 0개였다. 기존 결과를 포함한 두 AI의 항목 일치는 693/863이고 한 항목은 1차 판단 불가로 일치율에서 제외했다. 이는 서로 다른 시점의 평가와 기존 점수 재사용을 포함한 기술적 집계이며 정확성 검증은 아니다.</w:t>
+      </w:r>
+    </w:p>
+    <w:p>
+      <w:pPr>
+        <w:jc w:val="both"/>
+      </w:pPr>
+      <w:r>
+        <w:t>추가 대조의 프롬프트 준비는 8회 호출·61.4초였고 이미지 생성 기록의 합은 5,428.7초였다. 상태 갱신보다 준비 호출 수가 적지만, 형식 실패와 원본 유지 처리까지 포함하므로 비용과 목표 반영을 함께 봐야 한다. 특히 U2·U3의 평균 ArcFace는 모두 0.919로 높았지만 요청된 편집 대부분은 반영되지 않았다. 구조화된 형식만 지정해도 올바른 최종 요구가 보장되지 않으며, 실패 시 원본 유지가 얼굴 지표를 높이는 결과를 만들 수 있다.</w:t>
+      </w:r>
+    </w:p>
+    <w:p>
+      <w:pPr>
         <w:pStyle w:val="Heading1"/>
       </w:pPr>
       <w:r>
@@ -2077,7 +3744,7 @@
         <w:jc w:val="both"/>
       </w:pPr>
       <w:r>
-        <w:t>두 비교는 반복 편집의 서로 다른 실패 지점을 보여 준다. 합성 인물 실험에서는 원본을 다시 입력하는 편집 정책이 얼굴 특징 보존에 유리했다. 실제 인물 실험에서는 동일한 원본을 사용해도 프롬프트 구성에 따라 최종 목표와 얼굴 특징이 서로 다른 방향으로 움직였다. 정확한 최종 상태의 높은 점수는 상태 추출과 취소 처리의 중요성을 드러내지만, 이를 실제 에이전트 성능으로 해석할 수 없다. H3의 과거 조건 잔존은 단순한 대화 요약이 최종 상태 관리와 다름을 보여 준다. H2의 핀 위치 실패는 상태 관리 이후에도 이미지 생성기의 속성·위치 제어 검사가 필요함을 보여 준다.</w:t>
+        <w:t>입력 정책과 프롬프트 비교는 반복 편집의 서로 다른 실패 지점을 보여 준다. 합성 인물 실험에서는 원본을 다시 입력하는 편집 정책이 얼굴 특징 보존에 유리했다. 실제 인물 실험에서는 동일한 원본을 사용해도 프롬프트 구성에 따라 최종 목표와 얼굴 특징이 서로 다른 방향으로 움직였다. 정확한 최종 상태의 높은 점수는 상태 추출과 취소 처리의 중요성을 드러내지만, 이를 실제 에이전트 성능으로 해석할 수 없다. H3의 과거 조건 잔존은 단순한 대화 요약이 최종 상태 관리와 다름을 보여 준다. H2의 핀 위치 실패는 상태 관리 이후에도 이미지 생성기의 속성·위치 제어 검사가 필요함을 보여 준다.</w:t>
       </w:r>
     </w:p>
     <w:p>
@@ -2085,7 +3752,7 @@
         <w:jc w:val="both"/>
       </w:pPr>
       <w:r>
-        <w:t>구현된 로컬 편집기는 최초 원본, 현재 요구 상태, 출력 버전을 분리해 저장하고 순차 생성과 원본 기반 재생성을 제공한다. 다음 개선은 취소·교체를 명시적으로 처리하는 상태 갱신, 최종 프롬프트의 요구별 검증, 생성 결과의 속성·얼굴 동시 평가다. 본 연구는 이 개선안의 효과까지 검증한 것은 아니다.</w:t>
+        <w:t>후속 비교에서는 새 요청에서 변경 항목을 추출하고 코드로 상태를 갱신하는 방법을 실제로 평가했다. 1차 AI 기준 목표 충족과 ArcFace 평균은 개선되었고 취소 항목의 실패가 줄었다. 반면 U4에서는 배경·소품 변경을 놓쳐 목표 점수가 낮아졌으며, 2차 AI는 큰 목표 점수 차이를 재현하지 못했다. 이 결과는 제한 어휘의 상태 갱신이 유용할 가능성과 함께, 상태 추출 오류 및 평가자 의존성을 보여 준다. 상태 관리의 도입만으로 모든 편집 실패를 해결했다고 주장하지 않는다.</w:t>
       </w:r>
     </w:p>
     <w:p>
@@ -2093,7 +3760,23 @@
         <w:jc w:val="both"/>
       </w:pPr>
       <w:r>
-        <w:t>두 실험의 인물 유형과 편집 과제가 달라 정책과 프롬프트의 상호작용을 추정할 수 없다. 합성 인물 실험의 두 방법은 생성 횟수도 다르다. 실제 인물 실험은 공개 사진 6명과 합성한 세 이력, 두 시드, 하나의 로컬 이미지 모델에 한정된다. 목표 점수는 단일 평가자의 판단이며 두 항목은 판정이 어려웠다. 한 세트의 가림 예외가 있고, ArcFace는 얼굴 정체성의 대리 지표로 자세·구도·조명 영향에서 완전히 자유롭지 않다. 108장을 독립 관측으로 취급한 유의성 검정이나 모집단 일반화는 하지 않았다.</w:t>
+        <w:t>구현된 로컬 편집기는 최초 원본, 현재 요구 상태, 출력 버전을 분리해 저장하고 순차 생성과 원본 기반 재생성을 제공한다. 연구용 여섯 항목 상태 갱신 CLI는 기존 웹 편집기와 별도이며, 연구 결과가 웹 UI 전체의 기능 검증을 뜻하지 않는다. 후속 개선 과제는 생성 전에 최종 상태의 근거 요청을 확인하고, 생성 후에는 속성 반영과 얼굴 유사도를 함께 검증하는 것이다. 특히 핀의 좌우·형태처럼 AI 평가자 간 차이가 큰 항목에는 독립 인간 판정이 필요하다.</w:t>
+      </w:r>
+    </w:p>
+    <w:p>
+      <w:pPr>
+        <w:jc w:val="both"/>
+      </w:pPr>
+      <w:r>
+        <w:t>정책 비교와 프롬프트 비교의 인물 유형·편집 과제가 달라 두 요소의 상호작용을 추정할 수 없다. 합성 인물 실험의 방법별 생성 횟수도 다르다. 실제 인물 실험은 공개 사진 6명, 개발자가 작성한 H1–H3 및 U1–U4, 두 시드, 하나의 로컬 이미지 모델에 한정된다. 초기 H1–H3 점수는 독립 인간 평가를 확인할 수 없는 단일 시각 판정 기록이고, 두 항목의 판단 어려움과 한 세트의 사전 노출 예외가 있다. U1–U4의 두 평가는 모두 AI이며 1차 모델 설정 변경과 채점 수정 이력, 2차 설명–점수 모순을 공개했다. 두 AI의 일치가 곧 정확성을 의미하지 않는다. ArcFace는 얼굴 정체성의 대리 지표로 자세·구도·조명 영향에서 완전히 자유롭지 않다. 108장 또는 96장을 각각 독립 표본으로 취급한 유의성 검정이나 모집단 일반화는 하지 않았다. 프롬프트 준비 시간은 중단된 작업을 제외한 기록값이며 다른 프로세스의 영향을 받을 수 있어 표준화된 속도 벤치마크로 해석하지 않는다.</w:t>
+      </w:r>
+    </w:p>
+    <w:p>
+      <w:pPr>
+        <w:jc w:val="both"/>
+      </w:pPr>
+      <w:r>
+        <w:t>전체 대화 상태 추출 대조에서는 형식 오류로 원본 유지 처리가 적용돼 목표 반영이 낮아졌다. 이때 얼굴 유사도가 높았다는 점은 얼굴 보존과 편집 수행을 함께 평가해야 한다는 해석을 뒷받침한다. 다만 대조는 같은 대화를 재사용한 후속 진단이고 추출 지시·예시·호출 수가 다르며 1차 채점 시점도 달라, 상태 관리만의 인과 효과를 분리한 비교는 아니다.</w:t>
       </w:r>
     </w:p>
     <w:p>
@@ -2109,7 +3792,7 @@
         <w:jc w:val="both"/>
       </w:pPr>
       <w:r>
-        <w:t>반복 인물 편집에서는 최초 원본을 보존하고 수정·취소를 반영한 최종 요구 상태를 별도로 관리해야 한다. 합성 인물의 대응 18쌍에서는 원본 기반 재생성이 순차 편집보다 얼굴 LPIPS와 ArcFace에서 모두 유리했다. 실제 인물의 36개 비교 세트에서는 에이전트 종합이 전체 대화 전달보다 최종 목표를 더 많이 충족했으나 얼굴 유사도는 낮았다. 정확한 상태 제공은 높은 목표 점수를 보였지만 핀 위치 오류는 남았다. 따라서 입력 이미지 정책, 상태 종합, 출력 검증을 별도 단계로 설계하고 함께 평가할 필요가 있다.</w:t>
+        <w:t>반복 인물 편집의 실패는 입력 이미지 정책, 최종 요구 상태 추출, 이미지 생성의 세부 제어로 나누어 평가할 필요가 있다. 합성 인물의 대응 18쌍에서는 원본 기반 재생성이 순차 편집보다 얼굴 LPIPS와 ArcFace에서 모두 유리했다. 실제 인물의 H1–H3 비교에서는 에이전트 종합이 전체 대화 전달보다 목표를 더 많이 충족했으나 얼굴 유사도는 낮았다. U1–U4 후속 비교에서 자동 상태 갱신은 1차 AI 목표 점수와 얼굴 유사도를 높였지만 특정 대화에서는 악화됐고, 2차 AI의 목표 점수 차이는 작았다. 추가 대조에서는 전체 대화 상태 추출의 형식 오류로 원본 유지 처리가 발생했고 목표 충족이 낮으면서 얼굴 유사도는 높았다. 정확한 상태 전달 이후에도 핀 위치·형태 오류는 남았다. 이 결과는 상태 관리와 얼굴·속성 평가를 함께 설계할 근거를 제공하지만, 소수 인물과 개발자 작성 대화, AI 평가에 한정된 탐색적 근거다.</w:t>
       </w:r>
     </w:p>
     <w:p>
@@ -2152,6 +3835,36 @@
     </w:p>
     <w:p>
       <w:pPr>
+        <w:keepLines/>
+        <w:ind w:firstLine="0"/>
+        <w:jc w:val="both"/>
+      </w:pPr>
+      <w:r>
+        <w:t>[4] J. Guo, K. Shuang, J. Li, and Z. Wang, “Dual Slot Selector via Local Reliability Verification for Dialogue State Tracking,” ACL-IJCNLP, pp. 139–151, 2021. https://aclanthology.org/2021.acl-long.12/</w:t>
+      </w:r>
+    </w:p>
+    <w:p>
+      <w:pPr>
+        <w:keepLines/>
+        <w:ind w:firstLine="0"/>
+        <w:jc w:val="both"/>
+      </w:pPr>
+      <w:r>
+        <w:t>[5] Y. Hao, Z. Chi, L. Dong, and F. Wei, “Optimizing Prompts for Text-to-Image Generation,” NeurIPS, 2023. https://arxiv.org/abs/2212.09611v2</w:t>
+      </w:r>
+    </w:p>
+    <w:p>
+      <w:pPr>
+        <w:keepLines/>
+        <w:ind w:firstLine="0"/>
+        <w:jc w:val="both"/>
+      </w:pPr>
+      <w:r>
+        <w:t>[6] K. Huang, K. Sun, E. Xie, Z. Li, and X. Liu, “T2I-CompBench: A Comprehensive Benchmark for Open-world Compositional Text-to-image Generation,” NeurIPS Datasets and Benchmarks, 2023. https://papers.nips.cc/paper/2023/file/f8ad010cdd9143dbb0e9308c093aff24-Paper-Datasets_and_Benchmarks.pdf</w:t>
+      </w:r>
+    </w:p>
+    <w:p>
+      <w:pPr>
         <w:pStyle w:val="Heading1"/>
       </w:pPr>
       <w:r>
@@ -2163,11 +3876,11 @@
         <w:jc w:val="both"/>
       </w:pPr>
       <w:r>
-        <w:t>합성 인물 정책 비교의 설정·출력·지표·검증은 experiments/studio-multiperson-v1/에 있다. 실제 인물의 편집 이력·프롬프트·출력·가림 평가·지표·검증은 experiments/prompt-synthesis-expanded-v1/에 있다. 실제 인물 2명의 정책 예비 비교는 experiments/real-people-v1/에 별도로 보존한다. 사진 출처는 assets/people/real/README.md에, 본문 수치의 원자료 대조는 paper/evidence.json에 기록한다. 모델 가중치와 실행 환경은 별도 준비가 필요하다.</w:t>
+        <w:t>합성 인물 정책 비교의 설정·출력·지표·검증은 experiments/studio-multiperson-v1/에 있다. 실제 인물 H1–H3의 자료는 experiments/prompt-synthesis-expanded-v1/, U1–U4의 자동 상태 갱신 자료는 experiments/state-tracking-v2/, 전체 대화 상태 추출의 추가 대조는 experiments/state-format-control-v1/에 있다. 프롬프트, 모델 원응답, 평가 원문과 수정 이력, 실패 처리, 출력 해시 및 집계 출처를 보존한다. 상태 추출의 초기 실패는 experiments/state-tracking-v1/에 남긴다. 실제 인물 2명의 정책 예비 비교는 experiments/real-people-v1/에 별도로 보존한다. 사진 출처는 assets/people/real/README.md에, 본문 수치의 원자료 대조는 paper/evidence.json에 기록한다. 모델 가중치와 실행 환경은 별도 준비가 필요하다.</w:t>
       </w:r>
     </w:p>
     <w:sectPr>
-      <w:footerReference w:type="default" r:id="rId9"/>
+      <w:footerReference w:type="default" r:id="rId10"/>
       <w:pgSz w:w="11906" w:h="16838"/>
       <w:pgMar w:top="1134" w:right="1134" w:bottom="1134" w:left="1134" w:header="720" w:footer="720" w:gutter="0"/>
       <w:cols w:space="720"/>

</xml_diff>

<commit_message>
Remove human evaluation requirements and unused rating form
</commit_message>
<xml_diff>
--- a/paper/manuscript.inha.docx
+++ b/paper/manuscript.inha.docx
@@ -65,7 +65,7 @@
         <w:t xml:space="preserve">요약: </w:t>
       </w:r>
       <w:r>
-        <w:t>반복 인물 이미지 편집에서는 생성물의 변형 누적과 대화의 최종 요구 추출 오류를 구분해야 한다. 합성 인물 6명의 최종 출력 18쌍에서 원본 기반 재생성의 평균 ArcFace는 0.922로 순차 편집의 0.714보다 높았다. 별도의 실제 인물 6명·8턴 대화 3종·두 시드 비교에서는 자연어 에이전트 종합이 전체 대화 전달보다 목표 충족을 높였지만(168/216 대 96/216) 얼굴 유사도는 낮았다(0.585 대 0.733). 취소 요청 처리의 후속 실험에서는 새 대화 4종으로 96장을 생성하고, 새 요청의 변경 항목을 추출해 코드로 갱신하는 방법을 평가했다. 1차 AI 목표 충족은 자연어 종합 194/288에서 상태 갱신 240/288로, 평균 ArcFace는 0.586에서 0.675로 높아졌다. 다만 한 대화에서는 배경·소품 교체를 놓쳐 상태 갱신의 목표 점수가 더 낮았다. 2차 AI는 257/288과 261/288로 작은 차이를 보였으며, 두 AI의 핀 항목 일치는 34/96에 그쳤다. 전체 대화 상태 추출의 추가 48개 조건에서는 1차·2차 목표 충족이 127/288·142/288로 낮았지만 ArcFace는 0.847로 높았다. 형식 오류로 편집을 수행하지 않은 출력도 포함되어 얼굴 유사도만으로 성공을 판단할 수 없었다. 결과는 최종 요구 관리와 이미지 생성 제어, 평가 신뢰도를 함께 검토할 필요성을 보여 준다. 단일 생성 모델과 소수 인물, 개발자 작성 대화에 한정된 탐색적 연구이며 독립 인간 평가는 확보하지 않았다.</w:t>
+        <w:t>반복 인물 이미지 편집에서는 생성물의 변형 누적과 대화의 최종 요구 추출 오류를 구분해야 한다. 합성 인물 6명의 최종 출력 18쌍에서 원본 기반 재생성의 평균 ArcFace는 0.922로 순차 편집의 0.714보다 높았다. 별도의 실제 인물 6명·8턴 대화 3종·두 시드 비교에서는 자연어 에이전트 종합이 전체 대화 전달보다 목표 충족을 높였지만(168/216 대 96/216) 얼굴 유사도는 낮았다(0.585 대 0.733). 취소 요청 처리의 후속 실험에서는 새 대화 4종으로 96장을 생성하고, 새 요청의 변경 항목을 추출해 코드로 갱신하는 방법을 평가했다. 1차 AI 목표 충족은 자연어 종합 194/288에서 상태 갱신 240/288로, 평균 ArcFace는 0.586에서 0.675로 높아졌다. 다만 한 대화에서는 배경·소품 교체를 놓쳐 상태 갱신의 목표 점수가 더 낮았다. 2차 AI는 257/288과 261/288로 작은 차이를 보였으며, 두 AI의 핀 항목 일치는 34/96에 그쳤다. 전체 대화 상태 추출의 추가 48개 조건에서는 1차·2차 목표 충족이 127/288·142/288로 낮았지만 ArcFace는 0.847로 높았다. 형식 오류로 편집을 수행하지 않은 출력도 포함되어 얼굴 유사도만으로 성공을 판단할 수 없었다. 결과는 최종 요구 관리와 이미지 생성 제어, 평가 신뢰도를 함께 검토할 필요성을 보여 준다. 단일 생성 모델과 소수 인물, 개발자 작성 대화에 한정된 탐색적 연구다.</w:t>
       </w:r>
     </w:p>
     <w:p>
@@ -79,7 +79,7 @@
         <w:t xml:space="preserve">Abstract: </w:t>
       </w:r>
       <w:r>
-        <w:t>Iterative portrait editing requires separating accumulated image changes from errors in extracting the final request. Across 18 final-output pairs from six synthetic identities, original-referenced regeneration achieved higher mean ArcFace similarity than sequential editing (0.922 versus 0.714). With six real-person photos, three eight-turn dialogues and two seeds, natural-language agent synthesis improved goal fulfillment over full-history prompting (168/216 versus 96/216), but reduced facial similarity (0.585 versus 0.733). A follow-up comparison generated 96 images using four new dialogues and the same photos. Extracting changes from each new request and applying them to a stored six-slot state increased primary AI goal ratings from 194/288 to 240/288 and mean ArcFace from 0.586 to 0.675. However, missed background and prop replacements worsened one dialogue. A second AI showed a smaller difference, 257/288 versus 261/288; agreement on pin judgments was only 34/96. A post-hoc whole-history structured extraction control suffered JSON format failures and achieved 127/288 and 142/288 goals under the two AI evaluators despite higher ArcFace (0.847). Its 48 conditions contained 36 distinct RGB images. These exploratory findings support joint assessment of request management, facial preservation and attribute fulfillment. Different instructions, call counts and evaluation phases prevent isolating a causal state-management effect. The study uses one image model, six real-person photos and developer-written dialogues, without independent human evaluation.</w:t>
+        <w:t>Iterative portrait editing requires separating accumulated image changes from errors in extracting the final request. Across 18 final-output pairs from six synthetic identities, original-referenced regeneration achieved higher mean ArcFace similarity than sequential editing (0.922 versus 0.714). With six real-person photos, three eight-turn dialogues and two seeds, natural-language agent synthesis improved goal fulfillment over full-history prompting (168/216 versus 96/216), but reduced facial similarity (0.585 versus 0.733). A follow-up comparison generated 96 images using four new dialogues and the same photos. Extracting changes from each new request and applying them to a stored six-slot state increased primary AI goal ratings from 194/288 to 240/288 and mean ArcFace from 0.586 to 0.675. However, missed background and prop replacements worsened one dialogue. A second AI showed a smaller difference, 257/288 versus 261/288; agreement on pin judgments was only 34/96. A post-hoc whole-history structured extraction control suffered JSON format failures and achieved 127/288 and 142/288 goals under the two AI evaluators despite higher ArcFace (0.847). Its 48 conditions contained 36 distinct RGB images. These exploratory findings support joint assessment of request management, facial preservation and attribute fulfillment. Different instructions, call counts and evaluation phases prevent isolating a causal state-management effect. The study uses one image model, six real-person photos and developer-written dialogues.</w:t>
       </w:r>
     </w:p>
     <w:p>
@@ -221,7 +221,7 @@
         <w:jc w:val="both"/>
       </w:pPr>
       <w:r>
-        <w:t>방법명을 가린 비교판에서 최종 목표 6항목을 각 이미지에 대해 충족(1), 미충족(0), 판단 어려움으로 채점했다. 판단 어려움은 성공으로 계산하지 않았다. 얼굴은 InsightFace buffalo_l로 검출·정렬한 뒤 원본–출력 ArcFace 코사인 유사도를 구했다. 108장 모두 한 얼굴이 검출되었다. 평가 원기록은 운영자의 단일 시각 판정으로 되어 있으며, 독립 인간 평가를 확인할 자료는 없다. R01–H2–시드42의 한 세트는 가림 전 이미지가 노출된 예외가 있다. 분석의 독립 단위는 6명이고 이력·시드는 인물 내 반복이다.</w:t>
+        <w:t>방법명을 가린 비교판에서 최종 목표 6항목을 각 이미지에 대해 충족(1), 미충족(0), 판단 어려움으로 채점했다. 판단 어려움은 성공으로 계산하지 않았다. 얼굴은 InsightFace buffalo_l로 검출·정렬한 뒤 원본–출력 ArcFace 코사인 유사도를 구했다. 108장 모두 한 얼굴이 검출되었다. 평가 원기록은 운영자의 단일 시각 판정으로 되어 있다. R01–H2–시드42의 한 세트는 가림 전 이미지가 노출된 예외가 있다. 분석의 독립 단위는 6명이고 이력·시드는 인물 내 반복이다.</w:t>
       </w:r>
     </w:p>
     <w:p>
@@ -309,7 +309,7 @@
         <w:jc w:val="both"/>
       </w:pPr>
       <w:r>
-        <w:t>최종 이미지의 여섯 목표는 방법명을 가린 Codex 시각 판정과 별도 로컬 Qwen2.5-VL 3B 판정으로 평가한다. 두 판정의 점수와 일치율을 각각 보고하고, 판단 불가 항목은 성공으로 계산하지 않는다. 두 평가 모두 AI 평가이며 독립 인간 평가는 확보하지 않았다. 얼굴 유사도는 모든 시각 점수를 기록한 뒤 결합한다. 반복 관측의 독립 단위는 인물 6명이며, 대화 수가 4종이라는 한계도 함께 고려한다.</w:t>
+        <w:t>최종 이미지의 여섯 목표는 방법명을 가린 Codex 시각 판정과 별도 로컬 Qwen2.5-VL 3B 판정으로 평가한다. 두 판정의 점수와 일치율을 각각 보고하고, 판단 불가 항목은 성공으로 계산하지 않는다. 두 평가 모두 AI 평가다. 얼굴 유사도는 모든 시각 점수를 기록한 뒤 결합한다. 반복 관측의 독립 단위는 인물 6명이며, 대화 수가 4종이라는 한계도 함께 고려한다.</w:t>
       </w:r>
     </w:p>
     <w:p>
@@ -2221,7 +2221,7 @@
         <w:jc w:val="both"/>
       </w:pPr>
       <w:r>
-        <w:t>U1–U4의 48쌍에서 1차 AI 평가의 목표 충족은 자연어 에이전트 종합 194/288(67.4%), 자동 상태 갱신 240/288(83.3%)이었다. 원본 대비 평균 ArcFace는 각각 0.585593과 0.675335였다. 취소된 항목만 보면 각각 26/72와 72/72였다. 취소 항목의 개선은 전체 목표의 완전한 달성과는 다르다. 이 점수는 방법명을 가린 AI 판정이며 인간 평가 결과가 아니다.</w:t>
+        <w:t>U1–U4의 48쌍에서 1차 AI 평가의 목표 충족은 자연어 에이전트 종합 194/288(67.4%), 자동 상태 갱신 240/288(83.3%)이었다. 원본 대비 평균 ArcFace는 각각 0.585593과 0.675335였다. 취소된 항목만 보면 각각 26/72와 72/72였다. 취소 항목의 개선은 전체 목표의 완전한 달성과는 다르다. 이 점수는 방법명을 가린 AI 판정이다.</w:t>
       </w:r>
     </w:p>
     <w:p>
@@ -3760,7 +3760,7 @@
         <w:jc w:val="both"/>
       </w:pPr>
       <w:r>
-        <w:t>구현된 로컬 편집기는 최초 원본, 현재 요구 상태, 출력 버전을 분리해 저장하고 순차 생성과 원본 기반 재생성을 제공한다. 연구용 여섯 항목 상태 갱신 CLI는 기존 웹 편집기와 별도이며, 연구 결과가 웹 UI 전체의 기능 검증을 뜻하지 않는다. 후속 개선 과제는 생성 전에 최종 상태의 근거 요청을 확인하고, 생성 후에는 속성 반영과 얼굴 유사도를 함께 검증하는 것이다. 특히 핀의 좌우·형태처럼 AI 평가자 간 차이가 큰 항목에는 독립 인간 판정이 필요하다.</w:t>
+        <w:t>구현된 로컬 편집기는 최초 원본, 현재 요구 상태, 출력 버전을 분리해 저장하고 순차 생성과 원본 기반 재생성을 제공한다. 연구용 여섯 항목 상태 갱신 CLI는 기존 웹 편집기와 별도이며, 연구 결과가 웹 UI 전체의 기능 검증을 뜻하지 않는다. 후속 개선 과제는 생성 전에 최종 상태의 근거 요청을 확인하고, 생성 후에는 속성 반영과 얼굴 유사도를 함께 검증하는 것이다. 핀의 좌우·형태처럼 AI 평가자 간 차이가 큰 항목은 평가 모델과 문항에 따른 변동을 함께 보고한다.</w:t>
       </w:r>
     </w:p>
     <w:p>
@@ -3768,7 +3768,7 @@
         <w:jc w:val="both"/>
       </w:pPr>
       <w:r>
-        <w:t>정책 비교와 프롬프트 비교의 인물 유형·편집 과제가 달라 두 요소의 상호작용을 추정할 수 없다. 합성 인물 실험의 방법별 생성 횟수도 다르다. 실제 인물 실험은 공개 사진 6명, 개발자가 작성한 H1–H3 및 U1–U4, 두 시드, 하나의 로컬 이미지 모델에 한정된다. 초기 H1–H3 점수는 독립 인간 평가를 확인할 수 없는 단일 시각 판정 기록이고, 두 항목의 판단 어려움과 한 세트의 사전 노출 예외가 있다. U1–U4의 두 평가는 모두 AI이며 1차 모델 설정 변경과 채점 수정 이력, 2차 설명–점수 모순을 공개했다. 두 AI의 일치가 곧 정확성을 의미하지 않는다. ArcFace는 얼굴 정체성의 대리 지표로 자세·구도·조명 영향에서 완전히 자유롭지 않다. 108장 또는 96장을 각각 독립 표본으로 취급한 유의성 검정이나 모집단 일반화는 하지 않았다. 프롬프트 준비 시간은 중단된 작업을 제외한 기록값이며 다른 프로세스의 영향을 받을 수 있어 표준화된 속도 벤치마크로 해석하지 않는다.</w:t>
+        <w:t>정책 비교와 프롬프트 비교의 인물 유형·편집 과제가 달라 두 요소의 상호작용을 추정할 수 없다. 합성 인물 실험의 방법별 생성 횟수도 다르다. 실제 인물 실험은 공개 사진 6명, 개발자가 작성한 H1–H3 및 U1–U4, 두 시드, 하나의 로컬 이미지 모델에 한정된다. 초기 H1–H3 점수는 단일 시각 판정 기록이고, 두 항목의 판단 어려움과 한 세트의 사전 노출 예외가 있다. U1–U4의 두 평가는 모두 AI이며 1차 모델 설정 변경과 채점 수정 이력, 2차 설명–점수 모순을 공개했다. 두 AI의 일치가 곧 정확성을 의미하지 않는다. ArcFace는 얼굴 정체성의 대리 지표로 자세·구도·조명 영향에서 완전히 자유롭지 않다. 108장 또는 96장을 각각 독립 표본으로 취급한 유의성 검정이나 모집단 일반화는 하지 않았다. 프롬프트 준비 시간은 중단된 작업을 제외한 기록값이며 다른 프로세스의 영향을 받을 수 있어 표준화된 속도 벤치마크로 해석하지 않는다.</w:t>
       </w:r>
     </w:p>
     <w:p>

</xml_diff>

<commit_message>
Refine paper and slide wording and apply Inha reference layout
</commit_message>
<xml_diff>
--- a/paper/manuscript.inha.docx
+++ b/paper/manuscript.inha.docx
@@ -65,7 +65,7 @@
         <w:t xml:space="preserve">요약: </w:t>
       </w:r>
       <w:r>
-        <w:t>반복 이미지 편집에서는 새로 바꿀 내용뿐 아니라 유지하거나 삭제할 내용도 다음 프롬프트에 정확히 반영해야 한다. 본 연구는 언어 모델의 변경 추출과 재검토 뒤에 명시적인 유지·삭제 지시를 검사하는 보조 방법을 제안한다. 유지 규칙은 지원하는 문형에서 이전 상태를 보존하고, 삭제 규칙은 지원하는 항목을 없음으로 설정한다. 두 규칙은 요청의 근거 구절을 기록하며 모호한 표현에서는 개입하지 않는다. 개발과 분리하여 고정한 8개 대화 32턴에서 동일한 모델 응답을 네 방법에 적용했다. 전체 상태가 정확한 턴은 공통 기준 27, 유지 보호만 27, 삭제 실행만 28, 결합 방식 29였다. 결합은 최종 상태가 정확한 대화를 6개에서 7개로 높였으며 새 미변경 항목 훼손을 1건에서 0건으로 줄였다. 개선은 한 대화의 두 턴에 집중됐다. 추가로 고정한 T 세트의 8개 대화 32턴에서도 기준 28/32에서 유지·삭제 29/32로 높아졌으나 항목별 오류 격리를 더한 이점은 없었다. 두 인물의 이미지 평가에서는 3B 목표 점수가 350/384에서 358/384로, 사후 7B 평가에서는 372/384에서 374/384로 높아졌다. 그러나 판단 불가 감소와 설명·점수 모순이 있어 이미지 개선의 정량 근거는 제한적이다. 결과는 제한된 영어 문형의 상태 오류 감소를 보여주며 일반 사용자 대화의 성능 추정은 아니다.</w:t>
+        <w:t>반복 이미지 편집에서는 변경할 내용과 유지하거나 삭제할 내용을 다음 프롬프트에 정확히 반영해야 한다. 본 연구는 언어 모델이 변경 사항을 추출하고 재검토한 뒤, 명시적인 유지·삭제 지시를 확인하는 후처리 규칙을 제안한다. 유지 규칙은 해당 항목의 이전 값을 보존하고 삭제 규칙은 값을 없음으로 설정한다. 적용 조건에 맞는 구절과 항목만 처리하고 근거 구절을 기록한다. 개발 후 별도로 구성하고 추론 전에 확정한 S 대화 8개 32턴에서 동일한 모델 응답에 네 방법을 적용했다. 여섯 항목이 모두 정확한 턴은 기준 방법 27, 유지 규칙만 27, 삭제 규칙만 28, 두 규칙 결합 29였다. 결합 시 마지막 상태가 정확한 대화는 6개에서 7개로 늘었고, 유지해야 할 항목을 잘못 변경한 횟수는 1건에서 0건으로 줄었다. 개선은 한 대화의 두 턴에서 나타났다. 추가 검증 T의 대화 8개 32턴에서도 정확한 턴이 28/32에서 29/32로 늘었으나, 변경을 항목별로 적용하는 처리를 더해도 결과는 같았다. 실제 인물 사진 2명의 이미지 평가에서 목표 충족 수는 3B 모델 기준 350/384에서 358/384로, 사후 7B 평가에서는 372/384에서 374/384로 늘었다. 다만 판단 불가 감소와 설명·점수 불일치가 포함되어 이미지 품질의 향상 여부는 판단하기 어렵다. 유지·삭제 규칙의 효과는 이번에 검사한 영어 문형과 합성 대화 범위에서 확인됐다.</w:t>
       </w:r>
     </w:p>
     <w:p>
@@ -79,7 +79,7 @@
         <w:t xml:space="preserve">Abstract: </w:t>
       </w:r>
       <w:r>
-        <w:t>Iterative portrait editing requires state updates that preserve or remove selected attributes without changing unrelated requirements. We implement bounded preservation and removal guards after a shared two-call extraction and review pipeline. The guards record evidence spans and abstain on unsupported expressions. On a frozen set S of eight synthetic dialogues comprising 32 turns, joint state accuracy was 27/32 for the common baseline, 27/32 for preservation alone, 28/32 for removal alone, and 29/32 for their combination. Correct final dialogue states increased from 6/8 to 7/8, with all gains occurring in two turns of one dialogue. On another frozen set T of eight dialogues, the combination improved joint accuracy from 28/32 to 29/32 and final dialogue accuracy from 7/8 to 8/8. Per-attribute error isolation added no further gain. An image study with two portrait references produced 66 unique outputs for 128 conditions. Primary 3B evaluation scores increased from 350/384 to 358/384, but six additional successes came from previously unknown judgments. A post-hoc 7B review scored 372/384 and 374/384 without unknown judgments, yet contradictory explanations remained. These results support complementary prevention of state-update errors within a restricted English grammar; they do not establish general conversational accuracy or overall image-quality improvement.</w:t>
+        <w:t>Iterative portrait editing requires prompts to reflect requested changes while preserving or removing specified attributes. We implement preservation and removal rules after a language model extracts and reviews the requested changes. The rules process supported expressions and record the text that triggered each rule. We compare four methods using the same model responses on set S, eight synthetic English dialogues comprising 32 turns, finalized before inference. All six attributes were correct in 27/32 turns for the baseline, 27/32 for preservation alone, 28/32 for removal alone, and 29/32 for their combination. Correct final dialogue states increased from 6/8 to 7/8. The combination also reduced erroneous changes to previously correct attributes that should remain unchanged from one to zero. All gains occurred in two turns of one dialogue. On a further set T of eight dialogues and 32 turns, correct turns increased from 28/32 to 29/32 and correct final states from 7/8 to 8/8. Applying changes separately by attribute added no further gain. An image study with two portrait references produced 66 unique outputs for 128 conditions. The 3B evaluator scored 350/384 for the baseline and 358/384 for the combination, with six of the eight additional successes coming from previously unknown judgments. A post-hoc 7B evaluation scored 372/384 and 374/384. Both evaluators produced inconsistencies between explanations and scores, which limit conclusions about image quality. The rules reduced state errors in the tested English expressions and synthetic dialogues without additional model calls.</w:t>
       </w:r>
     </w:p>
     <w:p>
@@ -95,6 +95,18 @@
       <w:r>
         <w:t>Iterative portrait editing, State tracking, Preservation constraints, Removal constraints</w:t>
       </w:r>
+    </w:p>
+    <w:p>
+      <w:pPr>
+        <w:spacing w:after="0" w:before="0" w:line="20" w:lineRule="exact"/>
+        <w:sectPr>
+          <w:footerReference w:type="default" r:id="rId11"/>
+          <w:pgSz w:w="11906" w:h="16838"/>
+          <w:pgMar w:top="1134" w:right="1134" w:bottom="1134" w:left="1134" w:header="720" w:footer="720" w:gutter="0"/>
+          <w:cols w:space="720"/>
+          <w:docGrid w:linePitch="360"/>
+        </w:sectPr>
+      </w:pPr>
     </w:p>
     <w:p>
       <w:pPr>
@@ -117,7 +129,7 @@
         <w:jc w:val="both"/>
       </w:pPr>
       <w:r>
-        <w:t>본 연구의 초점은 상태 추적 구조 자체보다 명시적인 지시를 검사하는 과정에 있다. 연구 질문은 같은 언어 모델 추출·재검토 결과를 사용할 때 명시적인 유지와 삭제 지시를 별도로 검사하는 것이 요청 상태의 오류를 줄이는가이다. 이를 위해 모델의 자유로운 재검토 결과를 그대로 신뢰하지 않고, 범위가 명확한 지시만 코드로 확인하는 보조 계층을 구현했다. 유지와 삭제를 각각 적용한 대조를 포함하여 두 기능을 결합해야 하는 경우를 분석한다.</w:t>
+        <w:t>본 연구는 같은 언어 모델의 추출·재검토 결과에 유지·삭제 규칙을 적용했을 때 편집 상태의 오류가 줄어드는지 확인한다. 이를 위해 요청에 명시된 유지·삭제 지시를 검사하는 후처리 규칙을 구현했다. 각 규칙을 단독으로 적용한 결과와 함께 비교해 두 규칙이 각각 어떤 오류를 줄이는지 분석한다.</w:t>
       </w:r>
     </w:p>
     <w:p>
@@ -141,7 +153,7 @@
         <w:jc w:val="both"/>
       </w:pPr>
       <w:r>
-        <w:t>Self-Refine은 모델의 피드백과 수정을 활용하는 방법이다[3]. 본 연구의 공통 기준은 요청에서 변경을 추출한 뒤 한 번 재검토하는 두 호출 구성이다. 이는 반복적인 Self-Refine 실험을 재현한 것이 아니라, 추가 모델 호출 수를 고정한 상태에서 후처리 규칙의 효과를 비교하기 위한 기준이다. 본 연구가 다루는 구체적인 문제는 재검토가 명시적 유지 지시를 어기거나, 삭제 누락으로 이전 물체를 남기는 경우이다.</w:t>
+        <w:t>Self-Refine은 모델의 피드백과 수정을 반복하는 방법이다[3]. 본 연구의 기준 방법은 변경 사항 추출과 한 차례 재검토에 모델을 총 두 번 호출한다. 모든 비교 방법에 같은 두 응답을 사용해 후처리 규칙의 효과를 비교한다. 특히 유지 지시를 어기고 값을 변경하거나 삭제할 물체를 남기는 오류를 다룬다.</w:t>
       </w:r>
     </w:p>
     <w:p>
@@ -157,7 +169,7 @@
         <w:pStyle w:val="Heading2"/>
       </w:pPr>
       <w:r>
-        <w:t>1. 상태와 공통 처리</w:t>
+        <w:t>1. 편집 상태와 기준 방법</w:t>
       </w:r>
     </w:p>
     <w:p>
@@ -197,7 +209,7 @@
         <w:jc w:val="both"/>
       </w:pPr>
       <w:r>
-        <w:t>유지 보호는 지원하는 항목 이름과 unchanged가 함께 있는 명시적 구절에 한해 해당 항목의 직전 값을 보존한다. 단순히 keep이라는 단어가 있다는 이유로 보존하지 않는다. 예를 들어 keep the necklace off는 목걸이를 유지하라는 뜻이 아니므로 넓은 키워드 규칙은 잘못 동작할 수 있다. 값 변경, 인용, 조건부 표현, 대명사, 뒤에서 다시 언급한 같은 항목, 지원 어휘 밖 표현에서는 개입을 유보한다. 유보는 요청이 성공적으로 해석됐다는 뜻이 아니라 일반 추출 결과에 맡긴다는 뜻이다.</w:t>
+        <w:t>유지 규칙은 지원하는 항목 이름과 unchanged가 함께 있는 구절에서 해당 항목의 직전 값을 보존한다. keep만으로 유지 여부를 판단하면 keep the necklace off처럼 목걸이가 없는 상태를 요구하는 문장을 잘못 처리할 수 있다. 값 변경, 인용, 조건부 표현, 대명사, 같은 항목의 후속 언급, 지원 어휘 밖 표현에는 규칙을 적용하지 않고 모델의 추출·재검토 결과를 사용한다.</w:t>
       </w:r>
     </w:p>
     <w:p>
@@ -205,7 +217,7 @@
         <w:jc w:val="both"/>
       </w:pPr>
       <w:r>
-        <w:t>삭제 실행은 명시적인 remove 구절에서 재킷, 핀, 목걸이, 소품을 없음으로 설정한다. 상의와 배경의 삭제는 이 규칙의 지원 범위가 아니다. 유지와 마찬가지로 안전 조건을 통과한 구절만 사용하며 항목, 적용 값, 근거 문자열을 기록한다. 유지 보호 후 삭제 실행을 적용하되 뒤의 동일 항목 언급을 발견하면 앞선 보호가 적용되지 않도록 한다.</w:t>
+        <w:t>삭제 규칙은 명시적인 remove 구절에서 재킷, 핀, 목걸이, 소품의 값을 없음으로 설정한다. 상의와 배경은 삭제 대상에서 제외한다. 유지 규칙과 같은 적용 조건을 확인하고 항목, 적용 값, 근거 구절을 기록한다. 유지 규칙 다음에 삭제 규칙을 적용하며, 같은 항목이 뒤에서 다시 언급되면 앞의 유지 지시를 적용하지 않는다.</w:t>
       </w:r>
     </w:p>
     <w:p>
@@ -229,7 +241,7 @@
         <w:pStyle w:val="Heading2"/>
       </w:pPr>
       <w:r>
-        <w:t>1. 개발 자료와 고정 검증</w:t>
+        <w:t>1. 개발 과정과 검증 대화</w:t>
       </w:r>
     </w:p>
     <w:p>
@@ -237,7 +249,7 @@
         <w:jc w:val="both"/>
       </w:pPr>
       <w:r>
-        <w:t>방법은 실패 후보를 분석하며 순차적으로 개발했다. P에서는 넓은 유지 보호가 기준 30/32를 32/32로 높였지만, 이후 경계 점검에서 off나 색 변경을 유지로 잘못 처리하는 결함을 확인했다. 새 Q 검증에서 넓은 규칙은 12/32로 낮아졌고, 문형을 좁힌 유지 규칙은 기준과 같은 27/32였다. 좁은 규칙도 최종 대화 정확 수가 6/8에서 5/8로 낮아 채택하지 않았다. 중간 턴의 잘못된 삭제를 막은 뒤, 다음 턴의 실제 삭제 요청을 모델이 놓친 사례가 원인이었다.</w:t>
+        <w:t>초기 개발 대화 P에서는 keep을 폭넓게 탐지하는 유지 규칙이 정확한 턴을 기준 30/32에서 32/32로 늘렸다. 그러나 후속 검사에서 off나 색 변경 요청을 유지 지시로 잘못 처리했다. 새 검증 대화 Q에서 이 규칙의 정확한 턴은 12/32였고, 적용 문형을 좁힌 유지 규칙은 기준과 같은 27/32였다. 문형을 좁혀도 마지막 상태가 정확한 대화는 6/8에서 5/8로 줄었다. 중간 턴의 잘못된 삭제는 막았지만 다음 턴의 실제 삭제 요청을 모델이 놓쳤기 때문이다.</w:t>
       </w:r>
     </w:p>
     <w:p>
@@ -245,15 +257,15 @@
         <w:jc w:val="both"/>
       </w:pPr>
       <w:r>
-        <w:t>Q 분석 후 유지와 삭제를 결합한 코드를 개발하고, 새 S 대화 8종 32턴을 코드·프롬프트·모델 리비전과 함께 추론 전에 고정했다. P·Q 재계산은 개발 진단으로만 사용하며 S와 합산하지 않는다. S는 연구 보조 에이전트로 구성한 합성 편집 대화의 제한 문형 검사이다. 대화별 정답은 작성 시 지정한 항목별 변경을 순서대로 적용해 만들고 추론 전에 고정했다. 외부 사용자가 작성하거나 무작위로 수집한 대화는 아니다. 사진은 실제 인물 자료이지만 대화는 연구용으로 구성했다.</w:t>
+        <w:t>Q 분석 후 유지·삭제 규칙을 결합하고 검증 대화 S를 새로 구성했다. S는 연구 보조 에이전트로 만든 영어 합성 대화 8개 32턴이다. 각 대화의 정답은 작성 시 지정한 항목별 변경을 순서대로 적용해 만들었다. 대화와 정답, 코드, 프롬프트, 모델 버전을 모두 추론 전에 확정했다. P·Q는 개발 자료이고 S는 후속 검증 자료이므로 결과를 따로 보고한다.</w:t>
       </w:r>
     </w:p>
     <w:p>
       <w:pPr>
-        <w:jc w:val="both"/>
+        <w:jc w:val="left"/>
       </w:pPr>
       <w:r>
-        <w:t>텍스트 모델 리비전은 4dcb3d101c2a062e5c1d4bb173588c54ea6c4d25이며 온도 0, 최대 260토큰, 공통 예시 7개를 사용했다. 32턴에 두 호출씩 실제 호출은 64회다. 공통 기준, 유지 보호만, 삭제 실행만, 두 기능 결합을 비교한다. 사전 채택 기준은 결합의 정확 턴 수 증가, 최종 대화 정확 수 비감소, 새 미변경 훼손 비증가이다. 두 단일 기능과 동률이면 결합의 추가 효과를 주장하지 않도록 정했다.</w:t>
+        <w:t>텍스트 모델 버전은 4dcb3d101c2a062e5c1d4bb173588c54ea6c4d25이며 온도 0, 최대 260토큰, 공통 예시 7개를 사용했다. 32턴에 두 번씩 총 64회 호출했다. 기준 방법, 유지 규칙만 적용, 삭제 규칙만 적용, 두 규칙 결합을 비교한다. 결합 방식의 채택 조건은 추론 전에 정했다. 기준보다 정확한 턴이 늘고, 마지막 상태가 정확한 대화가 줄지 않으며, 유지할 항목을 잘못 변경한 횟수가 늘지 않아야 한다. 두 단독 규칙보다 정확한 턴이 많을 때 결합의 추가 효과가 있는 것으로 판단한다.</w:t>
       </w:r>
     </w:p>
     <w:p>
@@ -269,15 +281,15 @@
         <w:jc w:val="both"/>
       </w:pPr>
       <w:r>
-        <w:t>전체 상태 정확도는 여섯 항목이 모두 정답과 같은 턴 수이고 항목 정확도는 총 192항목 중 정확한 수다. 최종 대화 정확도는 마지막 턴의 여섯 항목이 모두 맞는 대화 수다. 새 미변경 훼손은 직전까지 맞았고 현재 요청에서도 값이 같아야 하는 항목을 이번 갱신에서 틀리게 바꾼 경우를 센다. 같은 대화의 여러 턴을 독립 표본으로 간주한 유의성 검정은 하지 않는다.</w:t>
+        <w:t>각 요청에 따라 상태를 한 번 갱신하는 단위를 턴으로 부른다. ‘정확한 턴’은 여섯 항목이 모두 정답과 일치하는 턴 수, ‘정확한 항목’은 총 192항목 중 정답과 일치하는 수다. ‘최종 정답 대화’는 마지막 턴의 여섯 항목이 모두 맞는 대화 수다. ‘유지 오류’는 직전까지 정확했고 이번에도 유지해야 하는 항목을 잘못 변경한 횟수다. 같은 대화에 속한 턴들의 의존성을 고려해 유의성 검정 없이 건수와 비율을 비교한다.</w:t>
       </w:r>
     </w:p>
     <w:p>
       <w:pPr>
-        <w:jc w:val="both"/>
+        <w:jc w:val="left"/>
       </w:pPr>
       <w:r>
-        <w:t>이미지 단계는 S 전체 32턴과 실제 인물 원본 2명, 두 방법의 128조건으로 정했다. 동일한 원본 바이트와 프롬프트는 같은 출력을 공유하여 66개 고유 생성 작업이 됐다. 실제로 입력이 다른 비교는 두 턴과 두 인물의 네 쌍이고 나머지 60쌍은 공유 입력이다. 내장 이미지 생성 도구의 첫 성공 출력만 보존한다. 내부 모델 리비전과 시드는 노출되지 않아 동일 시드 통제 실험이라고 부르지 않는다. 목표 반영은 모델 리비전 46d4cf06a06ffc1a766c214174f9cbed2f45bcab으로 고정한 Qwen2.5-VL-3B-4bit[5]가 6항목을 성공·실패·판단 불가로 판정하며, 얼굴은 InsightFace buffalo_l[6]의 코사인 유사도로 따로 측정한다. 방법명과 생성 프롬프트는 평가 모델에 제공하지 않는다. 사람 평가 작업은 포함하지 않는다.</w:t>
+        <w:t>이미지 실험은 S의 32턴, 실제 인물 사진 2명, 두 방법을 조합한 128조건이다. 원본 파일과 프롬프트가 같으면 한 번 생성한 이미지를 함께 사용해 총 66개 이미지를 생성했다. 방법 간 비교 64쌍 중 입력이 다른 경우는 두 턴과 두 인물을 조합한 4쌍이며, 나머지 60쌍은 같은 이미지를 사용한다. 내장 이미지 생성 도구의 첫 성공 출력을 사용했다. 이 도구는 내부 모델 버전과 시드를 공개하지 않아 동일 시드로 통제할 수 없었다. Qwen2.5-VL-3B-4bit[5]가 이미지와 목표를 받아 여섯 항목을 성공·실패·판단 불가로 평가했다. 평가 모델 버전은 46d4cf06a06ffc1a766c214174f9cbed2f45bcab이다. 평가 시 방법명과 생성 프롬프트는 제공하지 않았다. 얼굴 유사도는 InsightFace buffalo_l[6]의 코사인 유사도로 측정했다.</w:t>
       </w:r>
     </w:p>
     <w:p>
@@ -301,7 +313,7 @@
         <w:jc w:val="both"/>
       </w:pPr>
       <w:r>
-        <w:t>S와 T 각각의 요청·정답·모델 원응답·코드 해시를 저장했으며 이미지 단계는 입력 사진, 프롬프트, 첫 성공 출력과 평가 원문을 연결했다. 코드와 원자료는 연구 저장소의 request-contract-v3, isolated-contract-v1, contract-image-v3 폴더에서 확인할 수 있다[9]. 고정 후 재계산한 개발 진단은 별도 파일에 기록했다. 수치 검산은 원자료 해시와 본문의 표를 대조하며 실험의 독립 검증을 대신하지 않는다.</w:t>
+        <w:t>S와 T의 요청, 정답, 모델 응답, 코드 해시를 저장했다. 이미지별로 입력 사진, 프롬프트, 첫 성공 출력, 평가 원문을 연결했다. 코드와 원자료는 연구 저장소의 request-contract-v3, isolated-contract-v1, contract-image-v3 폴더에 있다[9]. 개발 중 재계산한 결과는 별도 파일에 기록했다.</w:t>
       </w:r>
     </w:p>
     <w:p>
@@ -324,11 +336,12 @@
       <w:pPr>
         <w:pStyle w:val="Caption"/>
         <w:keepNext/>
+        <w:spacing w:before="100"/>
         <w:ind w:firstLine="0"/>
         <w:jc w:val="center"/>
       </w:pPr>
       <w:r>
-        <w:t>표 1. S 고정 검증의 구성요소별 결과</w:t>
+        <w:t>표 1. S에서 유지 규칙과 삭제 규칙의 효과</w:t>
       </w:r>
     </w:p>
     <w:tbl>
@@ -338,11 +351,11 @@
         <w:tblLook w:firstColumn="1" w:firstRow="1" w:lastColumn="0" w:lastRow="0" w:noHBand="0" w:noVBand="1" w:val="04A0"/>
       </w:tblPr>
       <w:tblGrid>
-        <w:gridCol w:w="2494"/>
-        <w:gridCol w:w="1786"/>
-        <w:gridCol w:w="1786"/>
-        <w:gridCol w:w="1786"/>
-        <w:gridCol w:w="1786"/>
+        <w:gridCol w:w="1417"/>
+        <w:gridCol w:w="801"/>
+        <w:gridCol w:w="801"/>
+        <w:gridCol w:w="801"/>
+        <w:gridCol w:w="801"/>
       </w:tblGrid>
       <w:tr>
         <w:trPr>
@@ -351,7 +364,11 @@
         </w:trPr>
         <w:tc>
           <w:tcPr>
-            <w:tcW w:type="dxa" w:w="2494"/>
+            <w:tcW w:type="dxa" w:w="1417"/>
+            <w:tcMar>
+              <w:left w:w="45" w:type="dxa"/>
+              <w:right w:w="45" w:type="dxa"/>
+            </w:tcMar>
             <w:tcBorders>
               <w:bottom w:val="single" w:sz="5"/>
             </w:tcBorders>
@@ -374,7 +391,11 @@
         </w:tc>
         <w:tc>
           <w:tcPr>
-            <w:tcW w:type="dxa" w:w="1786"/>
+            <w:tcW w:type="dxa" w:w="801"/>
+            <w:tcMar>
+              <w:left w:w="45" w:type="dxa"/>
+              <w:right w:w="45" w:type="dxa"/>
+            </w:tcMar>
             <w:tcBorders>
               <w:bottom w:val="single" w:sz="5"/>
             </w:tcBorders>
@@ -391,13 +412,19 @@
                 <w:b/>
                 <w:sz w:val="16"/>
               </w:rPr>
-              <w:t>전체 상태</w:t>
+              <w:t>정확한</w:t>
+              <w:br/>
+              <w:t>턴</w:t>
             </w:r>
           </w:p>
         </w:tc>
         <w:tc>
           <w:tcPr>
-            <w:tcW w:type="dxa" w:w="1786"/>
+            <w:tcW w:type="dxa" w:w="801"/>
+            <w:tcMar>
+              <w:left w:w="45" w:type="dxa"/>
+              <w:right w:w="45" w:type="dxa"/>
+            </w:tcMar>
             <w:tcBorders>
               <w:bottom w:val="single" w:sz="5"/>
             </w:tcBorders>
@@ -414,13 +441,19 @@
                 <w:b/>
                 <w:sz w:val="16"/>
               </w:rPr>
+              <w:t>정확한</w:t>
+              <w:br/>
               <w:t>항목</w:t>
             </w:r>
           </w:p>
         </w:tc>
         <w:tc>
           <w:tcPr>
-            <w:tcW w:type="dxa" w:w="1786"/>
+            <w:tcW w:type="dxa" w:w="801"/>
+            <w:tcMar>
+              <w:left w:w="45" w:type="dxa"/>
+              <w:right w:w="45" w:type="dxa"/>
+            </w:tcMar>
             <w:tcBorders>
               <w:bottom w:val="single" w:sz="5"/>
             </w:tcBorders>
@@ -437,13 +470,19 @@
                 <w:b/>
                 <w:sz w:val="16"/>
               </w:rPr>
-              <w:t>최종 대화</w:t>
+              <w:t>최종 정답</w:t>
+              <w:br/>
+              <w:t>대화</w:t>
             </w:r>
           </w:p>
         </w:tc>
         <w:tc>
           <w:tcPr>
-            <w:tcW w:type="dxa" w:w="1786"/>
+            <w:tcW w:type="dxa" w:w="801"/>
+            <w:tcMar>
+              <w:left w:w="45" w:type="dxa"/>
+              <w:right w:w="45" w:type="dxa"/>
+            </w:tcMar>
             <w:tcBorders>
               <w:bottom w:val="single" w:sz="5"/>
             </w:tcBorders>
@@ -460,7 +499,7 @@
                 <w:b/>
                 <w:sz w:val="16"/>
               </w:rPr>
-              <w:t>새 훼손</w:t>
+              <w:t>유지 오류</w:t>
             </w:r>
           </w:p>
         </w:tc>
@@ -471,7 +510,11 @@
         </w:trPr>
         <w:tc>
           <w:tcPr>
-            <w:tcW w:type="dxa" w:w="2494"/>
+            <w:tcW w:type="dxa" w:w="1417"/>
+            <w:tcMar>
+              <w:left w:w="45" w:type="dxa"/>
+              <w:right w:w="45" w:type="dxa"/>
+            </w:tcMar>
           </w:tcPr>
           <w:p>
             <w:pPr>
@@ -485,13 +528,17 @@
                 <w:b w:val="0"/>
                 <w:sz w:val="16"/>
               </w:rPr>
-              <w:t>공통 기준</w:t>
+              <w:t>기준 방법</w:t>
             </w:r>
           </w:p>
         </w:tc>
         <w:tc>
           <w:tcPr>
-            <w:tcW w:type="dxa" w:w="1786"/>
+            <w:tcW w:type="dxa" w:w="801"/>
+            <w:tcMar>
+              <w:left w:w="45" w:type="dxa"/>
+              <w:right w:w="45" w:type="dxa"/>
+            </w:tcMar>
           </w:tcPr>
           <w:p>
             <w:pPr>
@@ -511,7 +558,11 @@
         </w:tc>
         <w:tc>
           <w:tcPr>
-            <w:tcW w:type="dxa" w:w="1786"/>
+            <w:tcW w:type="dxa" w:w="801"/>
+            <w:tcMar>
+              <w:left w:w="45" w:type="dxa"/>
+              <w:right w:w="45" w:type="dxa"/>
+            </w:tcMar>
           </w:tcPr>
           <w:p>
             <w:pPr>
@@ -531,7 +582,11 @@
         </w:tc>
         <w:tc>
           <w:tcPr>
-            <w:tcW w:type="dxa" w:w="1786"/>
+            <w:tcW w:type="dxa" w:w="801"/>
+            <w:tcMar>
+              <w:left w:w="45" w:type="dxa"/>
+              <w:right w:w="45" w:type="dxa"/>
+            </w:tcMar>
           </w:tcPr>
           <w:p>
             <w:pPr>
@@ -551,7 +606,11 @@
         </w:tc>
         <w:tc>
           <w:tcPr>
-            <w:tcW w:type="dxa" w:w="1786"/>
+            <w:tcW w:type="dxa" w:w="801"/>
+            <w:tcMar>
+              <w:left w:w="45" w:type="dxa"/>
+              <w:right w:w="45" w:type="dxa"/>
+            </w:tcMar>
           </w:tcPr>
           <w:p>
             <w:pPr>
@@ -576,7 +635,11 @@
         </w:trPr>
         <w:tc>
           <w:tcPr>
-            <w:tcW w:type="dxa" w:w="2494"/>
+            <w:tcW w:type="dxa" w:w="1417"/>
+            <w:tcMar>
+              <w:left w:w="45" w:type="dxa"/>
+              <w:right w:w="45" w:type="dxa"/>
+            </w:tcMar>
           </w:tcPr>
           <w:p>
             <w:pPr>
@@ -590,13 +653,17 @@
                 <w:b w:val="0"/>
                 <w:sz w:val="16"/>
               </w:rPr>
-              <w:t>유지 보호만</w:t>
+              <w:t>유지 규칙만</w:t>
             </w:r>
           </w:p>
         </w:tc>
         <w:tc>
           <w:tcPr>
-            <w:tcW w:type="dxa" w:w="1786"/>
+            <w:tcW w:type="dxa" w:w="801"/>
+            <w:tcMar>
+              <w:left w:w="45" w:type="dxa"/>
+              <w:right w:w="45" w:type="dxa"/>
+            </w:tcMar>
           </w:tcPr>
           <w:p>
             <w:pPr>
@@ -616,7 +683,11 @@
         </w:tc>
         <w:tc>
           <w:tcPr>
-            <w:tcW w:type="dxa" w:w="1786"/>
+            <w:tcW w:type="dxa" w:w="801"/>
+            <w:tcMar>
+              <w:left w:w="45" w:type="dxa"/>
+              <w:right w:w="45" w:type="dxa"/>
+            </w:tcMar>
           </w:tcPr>
           <w:p>
             <w:pPr>
@@ -636,7 +707,11 @@
         </w:tc>
         <w:tc>
           <w:tcPr>
-            <w:tcW w:type="dxa" w:w="1786"/>
+            <w:tcW w:type="dxa" w:w="801"/>
+            <w:tcMar>
+              <w:left w:w="45" w:type="dxa"/>
+              <w:right w:w="45" w:type="dxa"/>
+            </w:tcMar>
           </w:tcPr>
           <w:p>
             <w:pPr>
@@ -656,7 +731,11 @@
         </w:tc>
         <w:tc>
           <w:tcPr>
-            <w:tcW w:type="dxa" w:w="1786"/>
+            <w:tcW w:type="dxa" w:w="801"/>
+            <w:tcMar>
+              <w:left w:w="45" w:type="dxa"/>
+              <w:right w:w="45" w:type="dxa"/>
+            </w:tcMar>
           </w:tcPr>
           <w:p>
             <w:pPr>
@@ -681,7 +760,11 @@
         </w:trPr>
         <w:tc>
           <w:tcPr>
-            <w:tcW w:type="dxa" w:w="2494"/>
+            <w:tcW w:type="dxa" w:w="1417"/>
+            <w:tcMar>
+              <w:left w:w="45" w:type="dxa"/>
+              <w:right w:w="45" w:type="dxa"/>
+            </w:tcMar>
           </w:tcPr>
           <w:p>
             <w:pPr>
@@ -695,13 +778,17 @@
                 <w:b w:val="0"/>
                 <w:sz w:val="16"/>
               </w:rPr>
-              <w:t>삭제 실행만</w:t>
+              <w:t>삭제 규칙만</w:t>
             </w:r>
           </w:p>
         </w:tc>
         <w:tc>
           <w:tcPr>
-            <w:tcW w:type="dxa" w:w="1786"/>
+            <w:tcW w:type="dxa" w:w="801"/>
+            <w:tcMar>
+              <w:left w:w="45" w:type="dxa"/>
+              <w:right w:w="45" w:type="dxa"/>
+            </w:tcMar>
           </w:tcPr>
           <w:p>
             <w:pPr>
@@ -721,7 +808,11 @@
         </w:tc>
         <w:tc>
           <w:tcPr>
-            <w:tcW w:type="dxa" w:w="1786"/>
+            <w:tcW w:type="dxa" w:w="801"/>
+            <w:tcMar>
+              <w:left w:w="45" w:type="dxa"/>
+              <w:right w:w="45" w:type="dxa"/>
+            </w:tcMar>
           </w:tcPr>
           <w:p>
             <w:pPr>
@@ -741,7 +832,11 @@
         </w:tc>
         <w:tc>
           <w:tcPr>
-            <w:tcW w:type="dxa" w:w="1786"/>
+            <w:tcW w:type="dxa" w:w="801"/>
+            <w:tcMar>
+              <w:left w:w="45" w:type="dxa"/>
+              <w:right w:w="45" w:type="dxa"/>
+            </w:tcMar>
           </w:tcPr>
           <w:p>
             <w:pPr>
@@ -761,7 +856,11 @@
         </w:tc>
         <w:tc>
           <w:tcPr>
-            <w:tcW w:type="dxa" w:w="1786"/>
+            <w:tcW w:type="dxa" w:w="801"/>
+            <w:tcMar>
+              <w:left w:w="45" w:type="dxa"/>
+              <w:right w:w="45" w:type="dxa"/>
+            </w:tcMar>
           </w:tcPr>
           <w:p>
             <w:pPr>
@@ -786,7 +885,11 @@
         </w:trPr>
         <w:tc>
           <w:tcPr>
-            <w:tcW w:type="dxa" w:w="2494"/>
+            <w:tcW w:type="dxa" w:w="1417"/>
+            <w:tcMar>
+              <w:left w:w="45" w:type="dxa"/>
+              <w:right w:w="45" w:type="dxa"/>
+            </w:tcMar>
             <w:tcBorders>
               <w:bottom w:val="single" w:sz="5"/>
             </w:tcBorders>
@@ -809,7 +912,11 @@
         </w:tc>
         <w:tc>
           <w:tcPr>
-            <w:tcW w:type="dxa" w:w="1786"/>
+            <w:tcW w:type="dxa" w:w="801"/>
+            <w:tcMar>
+              <w:left w:w="45" w:type="dxa"/>
+              <w:right w:w="45" w:type="dxa"/>
+            </w:tcMar>
             <w:tcBorders>
               <w:bottom w:val="single" w:sz="5"/>
             </w:tcBorders>
@@ -832,7 +939,11 @@
         </w:tc>
         <w:tc>
           <w:tcPr>
-            <w:tcW w:type="dxa" w:w="1786"/>
+            <w:tcW w:type="dxa" w:w="801"/>
+            <w:tcMar>
+              <w:left w:w="45" w:type="dxa"/>
+              <w:right w:w="45" w:type="dxa"/>
+            </w:tcMar>
             <w:tcBorders>
               <w:bottom w:val="single" w:sz="5"/>
             </w:tcBorders>
@@ -855,7 +966,11 @@
         </w:tc>
         <w:tc>
           <w:tcPr>
-            <w:tcW w:type="dxa" w:w="1786"/>
+            <w:tcW w:type="dxa" w:w="801"/>
+            <w:tcMar>
+              <w:left w:w="45" w:type="dxa"/>
+              <w:right w:w="45" w:type="dxa"/>
+            </w:tcMar>
             <w:tcBorders>
               <w:bottom w:val="single" w:sz="5"/>
             </w:tcBorders>
@@ -878,7 +993,11 @@
         </w:tc>
         <w:tc>
           <w:tcPr>
-            <w:tcW w:type="dxa" w:w="1786"/>
+            <w:tcW w:type="dxa" w:w="801"/>
+            <w:tcMar>
+              <w:left w:w="45" w:type="dxa"/>
+              <w:right w:w="45" w:type="dxa"/>
+            </w:tcMar>
             <w:tcBorders>
               <w:bottom w:val="single" w:sz="5"/>
             </w:tcBorders>
@@ -906,7 +1025,7 @@
         <w:jc w:val="both"/>
       </w:pPr>
       <w:r>
-        <w:t>결합은 공통 기준보다 정확한 턴이 2개 많았고 두 단일 구성요소도 각각 넘어 사전 채택 기준을 통과했다. 그러나 여덟 대화 전반에 개선이 퍼진 것은 아니다. S1, S2, S4, S5, S6, S8은 네 방법 모두 4턴이 정확했다. S7은 모두 1/4였으며 결합으로 해결되지 않았다. 방법 간 차이는 S3의 3턴과 4턴에서만 발생했다.</w:t>
+        <w:t>두 규칙을 결합했을 때 정확한 턴은 기준보다 2개 많아 사전 채택 조건을 충족했다. 유지 규칙만 적용한 경우보다 2개, 삭제 규칙만 적용한 경우보다 1개 많았다. 방법 간 차이는 S3의 3턴과 4턴에서 발생했다. S1, S2, S4, S5, S6, S8은 네 방법 모두 4턴이 정확했고, S7은 모든 방법에서 1/4였다.</w:t>
       </w:r>
     </w:p>
     <w:p>
@@ -922,7 +1041,7 @@
         <w:jc w:val="both"/>
       </w:pPr>
       <w:r>
-        <w:t>S3의 3턴은 식물을 삭제하고 재킷은 유지하도록 요청했다. 공통 기준과 유지 보호만 적용한 방법은 식물을 남겼다. 삭제 실행은 이를 없음으로 바꾸었다. 이어진 4턴은 상의와 목걸이를 원본으로 돌리되 재킷과 연한 파란색 배경은 그대로 두도록 요청했다. 공통 기준과 삭제 실행만 적용한 방법은 배경도 원본으로 바꾸었다. 유지 보호는 배경을 보존했지만, 단독으로는 이전 턴의 식물 삭제 누락이 남았다. 결합만 두 턴 모두 정확했다.</w:t>
+        <w:t>S3의 3턴에서는 식물을 삭제하고 재킷은 유지하도록 요청했다. 기준 방법과 유지 규칙만 적용한 방법은 식물을 남겼고, 삭제 규칙은 식물의 값을 없음으로 바꾸었다. 이어진 4턴에서는 상의와 목걸이를 원본으로 돌리되 재킷과 연한 파란색 배경은 그대로 두도록 요청했다. 기준 방법과 삭제 규칙만 적용한 방법은 배경도 원본으로 바꾸었다. 유지 규칙은 배경을 보존했지만 이전 턴에서 남긴 식물까지 삭제하지는 못했다. 두 규칙을 결합했을 때만 두 턴 모두 정확했다.</w:t>
       </w:r>
     </w:p>
     <w:p>
@@ -930,7 +1049,7 @@
         <w:jc w:val="both"/>
       </w:pPr>
       <w:r>
-        <w:t>이 사례에서 한 턴에서는 실제 변경의 누락을 막아야 하고 다음 턴에서는 불필요한 변경을 막아야 한다. 보존만 강화하면 과거 객체가 남을 수 있고 삭제만 실행하면 다른 항목의 훼손이 남을 수 있다. 같은 모델 응답에 대한 구성요소별 비교는 이 두 오류가 서로 다름을 보여준다.</w:t>
+        <w:t>삭제 규칙은 3턴의 식물 삭제 누락을, 유지 규칙은 4턴의 불필요한 배경 변경을 막았다. 두 규칙은 이 대화에서 서로 다른 오류를 처리했다.</w:t>
       </w:r>
     </w:p>
     <w:p>
@@ -946,18 +1065,19 @@
         <w:jc w:val="both"/>
       </w:pPr>
       <w:r>
-        <w:t>S에서 남은 오류는 항목별 적용과 결합한 사후 재계산에서 없어져 32/32가 됐다. 이 결과를 확인하기 위해 두 코드를 수정 없이 결합하고 새 T 대화 8종 32턴을 고정했다. 같은 추출·재검토 64호출을 공유한 T 결과는 표 2와 같다.</w:t>
+        <w:t>항목별 적용은 한 항목의 오류 때문에 다른 유효한 변경까지 취소되는 것을 막는 처리다. S 결과를 본 뒤 이 처리를 유지·삭제 규칙에 추가해 재계산하자 정확한 턴이 32/32가 됐다. 추가 효과를 확인하기 위해 코드를 수정하지 않고 새 검증 대화 T의 8개 대화 32턴에 적용했다. 대화와 정답은 추론 전에 확정했다. 모든 방법이 같은 추출·재검토 응답 64개를 사용한 결과는 표 2와 같다.</w:t>
       </w:r>
     </w:p>
     <w:p>
       <w:pPr>
         <w:pStyle w:val="Caption"/>
         <w:keepNext/>
+        <w:spacing w:before="100"/>
         <w:ind w:firstLine="0"/>
         <w:jc w:val="center"/>
       </w:pPr>
       <w:r>
-        <w:t>표 2. T 추가 검증의 항목별 적용 결합 비교</w:t>
+        <w:t>표 2. T에서 항목별 적용의 추가 효과</w:t>
       </w:r>
     </w:p>
     <w:tbl>
@@ -967,11 +1087,11 @@
         <w:tblLook w:firstColumn="1" w:firstRow="1" w:lastColumn="0" w:lastRow="0" w:noHBand="0" w:noVBand="1" w:val="04A0"/>
       </w:tblPr>
       <w:tblGrid>
-        <w:gridCol w:w="2494"/>
-        <w:gridCol w:w="1786"/>
-        <w:gridCol w:w="1786"/>
-        <w:gridCol w:w="1786"/>
-        <w:gridCol w:w="1786"/>
+        <w:gridCol w:w="1417"/>
+        <w:gridCol w:w="801"/>
+        <w:gridCol w:w="801"/>
+        <w:gridCol w:w="801"/>
+        <w:gridCol w:w="801"/>
       </w:tblGrid>
       <w:tr>
         <w:trPr>
@@ -980,7 +1100,11 @@
         </w:trPr>
         <w:tc>
           <w:tcPr>
-            <w:tcW w:type="dxa" w:w="2494"/>
+            <w:tcW w:type="dxa" w:w="1417"/>
+            <w:tcMar>
+              <w:left w:w="45" w:type="dxa"/>
+              <w:right w:w="45" w:type="dxa"/>
+            </w:tcMar>
             <w:tcBorders>
               <w:bottom w:val="single" w:sz="5"/>
             </w:tcBorders>
@@ -1003,7 +1127,11 @@
         </w:tc>
         <w:tc>
           <w:tcPr>
-            <w:tcW w:type="dxa" w:w="1786"/>
+            <w:tcW w:type="dxa" w:w="801"/>
+            <w:tcMar>
+              <w:left w:w="45" w:type="dxa"/>
+              <w:right w:w="45" w:type="dxa"/>
+            </w:tcMar>
             <w:tcBorders>
               <w:bottom w:val="single" w:sz="5"/>
             </w:tcBorders>
@@ -1020,13 +1148,19 @@
                 <w:b/>
                 <w:sz w:val="16"/>
               </w:rPr>
-              <w:t>전체 상태</w:t>
+              <w:t>정확한</w:t>
+              <w:br/>
+              <w:t>턴</w:t>
             </w:r>
           </w:p>
         </w:tc>
         <w:tc>
           <w:tcPr>
-            <w:tcW w:type="dxa" w:w="1786"/>
+            <w:tcW w:type="dxa" w:w="801"/>
+            <w:tcMar>
+              <w:left w:w="45" w:type="dxa"/>
+              <w:right w:w="45" w:type="dxa"/>
+            </w:tcMar>
             <w:tcBorders>
               <w:bottom w:val="single" w:sz="5"/>
             </w:tcBorders>
@@ -1043,13 +1177,19 @@
                 <w:b/>
                 <w:sz w:val="16"/>
               </w:rPr>
+              <w:t>정확한</w:t>
+              <w:br/>
               <w:t>항목</w:t>
             </w:r>
           </w:p>
         </w:tc>
         <w:tc>
           <w:tcPr>
-            <w:tcW w:type="dxa" w:w="1786"/>
+            <w:tcW w:type="dxa" w:w="801"/>
+            <w:tcMar>
+              <w:left w:w="45" w:type="dxa"/>
+              <w:right w:w="45" w:type="dxa"/>
+            </w:tcMar>
             <w:tcBorders>
               <w:bottom w:val="single" w:sz="5"/>
             </w:tcBorders>
@@ -1066,13 +1206,19 @@
                 <w:b/>
                 <w:sz w:val="16"/>
               </w:rPr>
-              <w:t>최종 대화</w:t>
+              <w:t>최종 정답</w:t>
+              <w:br/>
+              <w:t>대화</w:t>
             </w:r>
           </w:p>
         </w:tc>
         <w:tc>
           <w:tcPr>
-            <w:tcW w:type="dxa" w:w="1786"/>
+            <w:tcW w:type="dxa" w:w="801"/>
+            <w:tcMar>
+              <w:left w:w="45" w:type="dxa"/>
+              <w:right w:w="45" w:type="dxa"/>
+            </w:tcMar>
             <w:tcBorders>
               <w:bottom w:val="single" w:sz="5"/>
             </w:tcBorders>
@@ -1089,7 +1235,7 @@
                 <w:b/>
                 <w:sz w:val="16"/>
               </w:rPr>
-              <w:t>새 훼손</w:t>
+              <w:t>유지 오류</w:t>
             </w:r>
           </w:p>
         </w:tc>
@@ -1100,7 +1246,11 @@
         </w:trPr>
         <w:tc>
           <w:tcPr>
-            <w:tcW w:type="dxa" w:w="2494"/>
+            <w:tcW w:type="dxa" w:w="1417"/>
+            <w:tcMar>
+              <w:left w:w="45" w:type="dxa"/>
+              <w:right w:w="45" w:type="dxa"/>
+            </w:tcMar>
           </w:tcPr>
           <w:p>
             <w:pPr>
@@ -1114,13 +1264,17 @@
                 <w:b w:val="0"/>
                 <w:sz w:val="16"/>
               </w:rPr>
-              <w:t>공통 기준</w:t>
+              <w:t>기준 방법</w:t>
             </w:r>
           </w:p>
         </w:tc>
         <w:tc>
           <w:tcPr>
-            <w:tcW w:type="dxa" w:w="1786"/>
+            <w:tcW w:type="dxa" w:w="801"/>
+            <w:tcMar>
+              <w:left w:w="45" w:type="dxa"/>
+              <w:right w:w="45" w:type="dxa"/>
+            </w:tcMar>
           </w:tcPr>
           <w:p>
             <w:pPr>
@@ -1140,7 +1294,11 @@
         </w:tc>
         <w:tc>
           <w:tcPr>
-            <w:tcW w:type="dxa" w:w="1786"/>
+            <w:tcW w:type="dxa" w:w="801"/>
+            <w:tcMar>
+              <w:left w:w="45" w:type="dxa"/>
+              <w:right w:w="45" w:type="dxa"/>
+            </w:tcMar>
           </w:tcPr>
           <w:p>
             <w:pPr>
@@ -1160,7 +1318,11 @@
         </w:tc>
         <w:tc>
           <w:tcPr>
-            <w:tcW w:type="dxa" w:w="1786"/>
+            <w:tcW w:type="dxa" w:w="801"/>
+            <w:tcMar>
+              <w:left w:w="45" w:type="dxa"/>
+              <w:right w:w="45" w:type="dxa"/>
+            </w:tcMar>
           </w:tcPr>
           <w:p>
             <w:pPr>
@@ -1180,7 +1342,11 @@
         </w:tc>
         <w:tc>
           <w:tcPr>
-            <w:tcW w:type="dxa" w:w="1786"/>
+            <w:tcW w:type="dxa" w:w="801"/>
+            <w:tcMar>
+              <w:left w:w="45" w:type="dxa"/>
+              <w:right w:w="45" w:type="dxa"/>
+            </w:tcMar>
           </w:tcPr>
           <w:p>
             <w:pPr>
@@ -1205,7 +1371,11 @@
         </w:trPr>
         <w:tc>
           <w:tcPr>
-            <w:tcW w:type="dxa" w:w="2494"/>
+            <w:tcW w:type="dxa" w:w="1417"/>
+            <w:tcMar>
+              <w:left w:w="45" w:type="dxa"/>
+              <w:right w:w="45" w:type="dxa"/>
+            </w:tcMar>
           </w:tcPr>
           <w:p>
             <w:pPr>
@@ -1225,7 +1395,11 @@
         </w:tc>
         <w:tc>
           <w:tcPr>
-            <w:tcW w:type="dxa" w:w="1786"/>
+            <w:tcW w:type="dxa" w:w="801"/>
+            <w:tcMar>
+              <w:left w:w="45" w:type="dxa"/>
+              <w:right w:w="45" w:type="dxa"/>
+            </w:tcMar>
           </w:tcPr>
           <w:p>
             <w:pPr>
@@ -1245,7 +1419,11 @@
         </w:tc>
         <w:tc>
           <w:tcPr>
-            <w:tcW w:type="dxa" w:w="1786"/>
+            <w:tcW w:type="dxa" w:w="801"/>
+            <w:tcMar>
+              <w:left w:w="45" w:type="dxa"/>
+              <w:right w:w="45" w:type="dxa"/>
+            </w:tcMar>
           </w:tcPr>
           <w:p>
             <w:pPr>
@@ -1265,7 +1443,11 @@
         </w:tc>
         <w:tc>
           <w:tcPr>
-            <w:tcW w:type="dxa" w:w="1786"/>
+            <w:tcW w:type="dxa" w:w="801"/>
+            <w:tcMar>
+              <w:left w:w="45" w:type="dxa"/>
+              <w:right w:w="45" w:type="dxa"/>
+            </w:tcMar>
           </w:tcPr>
           <w:p>
             <w:pPr>
@@ -1285,7 +1467,11 @@
         </w:tc>
         <w:tc>
           <w:tcPr>
-            <w:tcW w:type="dxa" w:w="1786"/>
+            <w:tcW w:type="dxa" w:w="801"/>
+            <w:tcMar>
+              <w:left w:w="45" w:type="dxa"/>
+              <w:right w:w="45" w:type="dxa"/>
+            </w:tcMar>
           </w:tcPr>
           <w:p>
             <w:pPr>
@@ -1310,7 +1496,11 @@
         </w:trPr>
         <w:tc>
           <w:tcPr>
-            <w:tcW w:type="dxa" w:w="2494"/>
+            <w:tcW w:type="dxa" w:w="1417"/>
+            <w:tcMar>
+              <w:left w:w="45" w:type="dxa"/>
+              <w:right w:w="45" w:type="dxa"/>
+            </w:tcMar>
           </w:tcPr>
           <w:p>
             <w:pPr>
@@ -1330,7 +1520,11 @@
         </w:tc>
         <w:tc>
           <w:tcPr>
-            <w:tcW w:type="dxa" w:w="1786"/>
+            <w:tcW w:type="dxa" w:w="801"/>
+            <w:tcMar>
+              <w:left w:w="45" w:type="dxa"/>
+              <w:right w:w="45" w:type="dxa"/>
+            </w:tcMar>
           </w:tcPr>
           <w:p>
             <w:pPr>
@@ -1350,7 +1544,11 @@
         </w:tc>
         <w:tc>
           <w:tcPr>
-            <w:tcW w:type="dxa" w:w="1786"/>
+            <w:tcW w:type="dxa" w:w="801"/>
+            <w:tcMar>
+              <w:left w:w="45" w:type="dxa"/>
+              <w:right w:w="45" w:type="dxa"/>
+            </w:tcMar>
           </w:tcPr>
           <w:p>
             <w:pPr>
@@ -1370,7 +1568,11 @@
         </w:tc>
         <w:tc>
           <w:tcPr>
-            <w:tcW w:type="dxa" w:w="1786"/>
+            <w:tcW w:type="dxa" w:w="801"/>
+            <w:tcMar>
+              <w:left w:w="45" w:type="dxa"/>
+              <w:right w:w="45" w:type="dxa"/>
+            </w:tcMar>
           </w:tcPr>
           <w:p>
             <w:pPr>
@@ -1390,7 +1592,11 @@
         </w:tc>
         <w:tc>
           <w:tcPr>
-            <w:tcW w:type="dxa" w:w="1786"/>
+            <w:tcW w:type="dxa" w:w="801"/>
+            <w:tcMar>
+              <w:left w:w="45" w:type="dxa"/>
+              <w:right w:w="45" w:type="dxa"/>
+            </w:tcMar>
           </w:tcPr>
           <w:p>
             <w:pPr>
@@ -1415,7 +1621,11 @@
         </w:trPr>
         <w:tc>
           <w:tcPr>
-            <w:tcW w:type="dxa" w:w="2494"/>
+            <w:tcW w:type="dxa" w:w="1417"/>
+            <w:tcMar>
+              <w:left w:w="45" w:type="dxa"/>
+              <w:right w:w="45" w:type="dxa"/>
+            </w:tcMar>
             <w:tcBorders>
               <w:bottom w:val="single" w:sz="5"/>
             </w:tcBorders>
@@ -1438,7 +1648,11 @@
         </w:tc>
         <w:tc>
           <w:tcPr>
-            <w:tcW w:type="dxa" w:w="1786"/>
+            <w:tcW w:type="dxa" w:w="801"/>
+            <w:tcMar>
+              <w:left w:w="45" w:type="dxa"/>
+              <w:right w:w="45" w:type="dxa"/>
+            </w:tcMar>
             <w:tcBorders>
               <w:bottom w:val="single" w:sz="5"/>
             </w:tcBorders>
@@ -1461,7 +1675,11 @@
         </w:tc>
         <w:tc>
           <w:tcPr>
-            <w:tcW w:type="dxa" w:w="1786"/>
+            <w:tcW w:type="dxa" w:w="801"/>
+            <w:tcMar>
+              <w:left w:w="45" w:type="dxa"/>
+              <w:right w:w="45" w:type="dxa"/>
+            </w:tcMar>
             <w:tcBorders>
               <w:bottom w:val="single" w:sz="5"/>
             </w:tcBorders>
@@ -1484,7 +1702,11 @@
         </w:tc>
         <w:tc>
           <w:tcPr>
-            <w:tcW w:type="dxa" w:w="1786"/>
+            <w:tcW w:type="dxa" w:w="801"/>
+            <w:tcMar>
+              <w:left w:w="45" w:type="dxa"/>
+              <w:right w:w="45" w:type="dxa"/>
+            </w:tcMar>
             <w:tcBorders>
               <w:bottom w:val="single" w:sz="5"/>
             </w:tcBorders>
@@ -1507,7 +1729,11 @@
         </w:tc>
         <w:tc>
           <w:tcPr>
-            <w:tcW w:type="dxa" w:w="1786"/>
+            <w:tcW w:type="dxa" w:w="801"/>
+            <w:tcMar>
+              <w:left w:w="45" w:type="dxa"/>
+              <w:right w:w="45" w:type="dxa"/>
+            </w:tcMar>
             <w:tcBorders>
               <w:bottom w:val="single" w:sz="5"/>
             </w:tcBorders>
@@ -1535,15 +1761,27 @@
         <w:jc w:val="both"/>
       </w:pPr>
       <w:r>
-        <w:t>T에서도 유지·삭제 제약은 정확한 턴과 최종 대화를 각각 한 개 높였으며 차이는 T7의 마지막 턴에서 발생했다. 항목별 적용을 추가한 이점은 없었다. 따라서 사후 S의 32/32를 결합 방법의 일반적인 효과로 보고하지 않고 더 단순한 유지·삭제 제약을 중심 방법으로 유지한다. S와 T는 서로 다른 개발 단계의 제한 문형 검사이며 표본 수를 합산하지 않는다.</w:t>
+        <w:t>T에서도 유지·삭제 규칙은 정확한 턴과 최종 정답 대화를 각각 한 개 늘렸으며, 차이는 T7의 마지막 턴에서 발생했다. 항목별 적용을 추가한 결과는 유지·삭제 규칙만 사용한 결과와 같았다. 이에 따라 추가 처리 없이 유지·삭제 규칙을 사용하는 방법을 선택했다. S의 사후 재계산 결과와 새 대화 T의 검증 결과는 구분하며, 서로 다른 개발 단계에서 구성한 S와 T의 표본 수는 합산하지 않는다.</w:t>
       </w:r>
+    </w:p>
+    <w:p>
+      <w:pPr>
+        <w:spacing w:after="0" w:before="0" w:line="20" w:lineRule="exact"/>
+        <w:sectPr>
+          <w:type w:val="continuous"/>
+          <w:pgSz w:w="11906" w:h="16838"/>
+          <w:pgMar w:top="1134" w:right="1134" w:bottom="1134" w:left="1134" w:header="720" w:footer="720" w:gutter="0"/>
+          <w:cols w:space="397" w:num="2"/>
+          <w:docGrid w:linePitch="360"/>
+        </w:sectPr>
+      </w:pPr>
     </w:p>
     <w:p>
       <w:pPr>
         <w:pStyle w:val="Heading2"/>
       </w:pPr>
       <w:r>
-        <w:t>4. 이미지 단계</w:t>
+        <w:t>4. 이미지 편집 결과</w:t>
       </w:r>
     </w:p>
     <w:p>
@@ -1644,10 +1882,22 @@
     </w:p>
     <w:p>
       <w:pPr>
+        <w:spacing w:after="0" w:before="0" w:line="20" w:lineRule="exact"/>
+        <w:sectPr>
+          <w:type w:val="continuous"/>
+          <w:pgSz w:w="11906" w:h="16838"/>
+          <w:pgMar w:top="1134" w:right="1134" w:bottom="1134" w:left="1134" w:header="720" w:footer="720" w:gutter="0"/>
+          <w:cols w:space="397" w:num="1"/>
+          <w:docGrid w:linePitch="360"/>
+        </w:sectPr>
+      </w:pPr>
+    </w:p>
+    <w:p>
+      <w:pPr>
         <w:jc w:val="both"/>
       </w:pPr>
       <w:r>
-        <w:t>그림 1과 2는 입력이 달랐던 네 쌍 전체를 제시한다. 원본 출력의 영역을 자르거나 수정하지 않았다. 3턴에서 삭제 대상 식물이 기준 출력에는 남고 결합 출력에서는 사라진다. 4턴에서는 기준 출력이 식물과 원본 배경을 유지하는 반면 결합 출력은 식물을 제거하고 연한 파란 배경을 반영한다. 이 시각적 사례 설명은 별도 사람 평가 점수가 아니며 아래의 고정 AI 집계와 구분한다.</w:t>
+        <w:t>그림 1과 2는 두 방법의 입력이 달랐던 네 쌍의 생성 이미지를 전체 영역으로 보여준다. 3턴에서 삭제 대상 식물이 기준 출력에는 남고 결합 출력에서는 사라진다. 4턴에서는 기준 출력에 식물과 원본 배경이 남아 있는 반면, 결합 출력에서는 식물이 사라지고 연한 파란 배경이 나타난다.</w:t>
       </w:r>
     </w:p>
     <w:p>
@@ -1662,11 +1912,12 @@
       <w:pPr>
         <w:pStyle w:val="Caption"/>
         <w:keepNext/>
+        <w:spacing w:before="100"/>
         <w:ind w:firstLine="0"/>
         <w:jc w:val="center"/>
       </w:pPr>
       <w:r>
-        <w:t>표 3. 3B 평가 모델의 S 이미지 판정</w:t>
+        <w:t>표 3. 3B 모델의 이미지 평가</w:t>
       </w:r>
     </w:p>
     <w:tbl>
@@ -1676,11 +1927,11 @@
         <w:tblLook w:firstColumn="1" w:firstRow="1" w:lastColumn="0" w:lastRow="0" w:noHBand="0" w:noVBand="1" w:val="04A0"/>
       </w:tblPr>
       <w:tblGrid>
-        <w:gridCol w:w="2494"/>
-        <w:gridCol w:w="1786"/>
-        <w:gridCol w:w="1786"/>
-        <w:gridCol w:w="1786"/>
-        <w:gridCol w:w="1786"/>
+        <w:gridCol w:w="1106"/>
+        <w:gridCol w:w="822"/>
+        <w:gridCol w:w="680"/>
+        <w:gridCol w:w="935"/>
+        <w:gridCol w:w="1077"/>
       </w:tblGrid>
       <w:tr>
         <w:trPr>
@@ -1689,7 +1940,11 @@
         </w:trPr>
         <w:tc>
           <w:tcPr>
-            <w:tcW w:type="dxa" w:w="2494"/>
+            <w:tcW w:type="dxa" w:w="1106"/>
+            <w:tcMar>
+              <w:left w:w="45" w:type="dxa"/>
+              <w:right w:w="45" w:type="dxa"/>
+            </w:tcMar>
             <w:tcBorders>
               <w:bottom w:val="single" w:sz="5"/>
             </w:tcBorders>
@@ -1712,7 +1967,11 @@
         </w:tc>
         <w:tc>
           <w:tcPr>
-            <w:tcW w:type="dxa" w:w="1786"/>
+            <w:tcW w:type="dxa" w:w="822"/>
+            <w:tcMar>
+              <w:left w:w="45" w:type="dxa"/>
+              <w:right w:w="45" w:type="dxa"/>
+            </w:tcMar>
             <w:tcBorders>
               <w:bottom w:val="single" w:sz="5"/>
             </w:tcBorders>
@@ -1735,7 +1994,11 @@
         </w:tc>
         <w:tc>
           <w:tcPr>
-            <w:tcW w:type="dxa" w:w="1786"/>
+            <w:tcW w:type="dxa" w:w="680"/>
+            <w:tcMar>
+              <w:left w:w="45" w:type="dxa"/>
+              <w:right w:w="45" w:type="dxa"/>
+            </w:tcMar>
             <w:tcBorders>
               <w:bottom w:val="single" w:sz="5"/>
             </w:tcBorders>
@@ -1752,13 +2015,19 @@
                 <w:b/>
                 <w:sz w:val="16"/>
               </w:rPr>
-              <w:t>판단 불가</w:t>
+              <w:t>판단</w:t>
+              <w:br/>
+              <w:t>불가</w:t>
             </w:r>
           </w:p>
         </w:tc>
         <w:tc>
           <w:tcPr>
-            <w:tcW w:type="dxa" w:w="1786"/>
+            <w:tcW w:type="dxa" w:w="935"/>
+            <w:tcMar>
+              <w:left w:w="45" w:type="dxa"/>
+              <w:right w:w="45" w:type="dxa"/>
+            </w:tcMar>
             <w:tcBorders>
               <w:bottom w:val="single" w:sz="5"/>
             </w:tcBorders>
@@ -1781,7 +2050,11 @@
         </w:tc>
         <w:tc>
           <w:tcPr>
-            <w:tcW w:type="dxa" w:w="1786"/>
+            <w:tcW w:type="dxa" w:w="1077"/>
+            <w:tcMar>
+              <w:left w:w="45" w:type="dxa"/>
+              <w:right w:w="45" w:type="dxa"/>
+            </w:tcMar>
             <w:tcBorders>
               <w:bottom w:val="single" w:sz="5"/>
             </w:tcBorders>
@@ -1809,7 +2082,11 @@
         </w:trPr>
         <w:tc>
           <w:tcPr>
-            <w:tcW w:type="dxa" w:w="2494"/>
+            <w:tcW w:type="dxa" w:w="1106"/>
+            <w:tcMar>
+              <w:left w:w="45" w:type="dxa"/>
+              <w:right w:w="45" w:type="dxa"/>
+            </w:tcMar>
           </w:tcPr>
           <w:p>
             <w:pPr>
@@ -1823,13 +2100,17 @@
                 <w:b w:val="0"/>
                 <w:sz w:val="16"/>
               </w:rPr>
-              <w:t>공통 기준</w:t>
+              <w:t>기준 방법</w:t>
             </w:r>
           </w:p>
         </w:tc>
         <w:tc>
           <w:tcPr>
-            <w:tcW w:type="dxa" w:w="1786"/>
+            <w:tcW w:type="dxa" w:w="822"/>
+            <w:tcMar>
+              <w:left w:w="45" w:type="dxa"/>
+              <w:right w:w="45" w:type="dxa"/>
+            </w:tcMar>
           </w:tcPr>
           <w:p>
             <w:pPr>
@@ -1849,7 +2130,11 @@
         </w:tc>
         <w:tc>
           <w:tcPr>
-            <w:tcW w:type="dxa" w:w="1786"/>
+            <w:tcW w:type="dxa" w:w="680"/>
+            <w:tcMar>
+              <w:left w:w="45" w:type="dxa"/>
+              <w:right w:w="45" w:type="dxa"/>
+            </w:tcMar>
           </w:tcPr>
           <w:p>
             <w:pPr>
@@ -1869,7 +2154,11 @@
         </w:tc>
         <w:tc>
           <w:tcPr>
-            <w:tcW w:type="dxa" w:w="1786"/>
+            <w:tcW w:type="dxa" w:w="935"/>
+            <w:tcMar>
+              <w:left w:w="45" w:type="dxa"/>
+              <w:right w:w="45" w:type="dxa"/>
+            </w:tcMar>
           </w:tcPr>
           <w:p>
             <w:pPr>
@@ -1889,7 +2178,11 @@
         </w:tc>
         <w:tc>
           <w:tcPr>
-            <w:tcW w:type="dxa" w:w="1786"/>
+            <w:tcW w:type="dxa" w:w="1077"/>
+            <w:tcMar>
+              <w:left w:w="45" w:type="dxa"/>
+              <w:right w:w="45" w:type="dxa"/>
+            </w:tcMar>
           </w:tcPr>
           <w:p>
             <w:pPr>
@@ -1914,7 +2207,11 @@
         </w:trPr>
         <w:tc>
           <w:tcPr>
-            <w:tcW w:type="dxa" w:w="2494"/>
+            <w:tcW w:type="dxa" w:w="1106"/>
+            <w:tcMar>
+              <w:left w:w="45" w:type="dxa"/>
+              <w:right w:w="45" w:type="dxa"/>
+            </w:tcMar>
             <w:tcBorders>
               <w:bottom w:val="single" w:sz="5"/>
             </w:tcBorders>
@@ -1937,7 +2234,11 @@
         </w:tc>
         <w:tc>
           <w:tcPr>
-            <w:tcW w:type="dxa" w:w="1786"/>
+            <w:tcW w:type="dxa" w:w="822"/>
+            <w:tcMar>
+              <w:left w:w="45" w:type="dxa"/>
+              <w:right w:w="45" w:type="dxa"/>
+            </w:tcMar>
             <w:tcBorders>
               <w:bottom w:val="single" w:sz="5"/>
             </w:tcBorders>
@@ -1960,7 +2261,11 @@
         </w:tc>
         <w:tc>
           <w:tcPr>
-            <w:tcW w:type="dxa" w:w="1786"/>
+            <w:tcW w:type="dxa" w:w="680"/>
+            <w:tcMar>
+              <w:left w:w="45" w:type="dxa"/>
+              <w:right w:w="45" w:type="dxa"/>
+            </w:tcMar>
             <w:tcBorders>
               <w:bottom w:val="single" w:sz="5"/>
             </w:tcBorders>
@@ -1983,7 +2288,11 @@
         </w:tc>
         <w:tc>
           <w:tcPr>
-            <w:tcW w:type="dxa" w:w="1786"/>
+            <w:tcW w:type="dxa" w:w="935"/>
+            <w:tcMar>
+              <w:left w:w="45" w:type="dxa"/>
+              <w:right w:w="45" w:type="dxa"/>
+            </w:tcMar>
             <w:tcBorders>
               <w:bottom w:val="single" w:sz="5"/>
             </w:tcBorders>
@@ -2006,7 +2315,11 @@
         </w:tc>
         <w:tc>
           <w:tcPr>
-            <w:tcW w:type="dxa" w:w="1786"/>
+            <w:tcW w:type="dxa" w:w="1077"/>
+            <w:tcMar>
+              <w:left w:w="45" w:type="dxa"/>
+              <w:right w:w="45" w:type="dxa"/>
+            </w:tcMar>
             <w:tcBorders>
               <w:bottom w:val="single" w:sz="5"/>
             </w:tcBorders>
@@ -2042,21 +2355,22 @@
         <w:jc w:val="both"/>
       </w:pPr>
       <w:r>
-        <w:t>얼굴 코사인은 전체 평균 0.910458과 0.910535로 가까웠다. 입력이 다른 네 쌍의 평균 차이는 +0.001237이지만 두 쌍은 증가하고 두 쌍은 감소했다. 공유 출력 60쌍을 포함한 전체 평균의 작은 차이를 얼굴 보존 개선이나 비열등성의 증거로 삼지 않는다.</w:t>
+        <w:t>얼굴 코사인 유사도는 기준 평균 0.910458, 결합 평균 0.910535였다. 입력이 다른 네 쌍의 평균 차이는 +0.001237이지만 두 쌍은 증가하고 두 쌍은 감소했다. 나머지 60쌍은 같은 출력이므로 전체 평균 차이만으로 얼굴 보존의 개선 여부를 판단하기 어렵다.</w:t>
       </w:r>
     </w:p>
     <w:p>
       <w:pPr>
-        <w:jc w:val="both"/>
+        <w:jc w:val="left"/>
       </w:pPr>
       <w:r>
-        <w:t>이러한 1차 평가의 한계를 확인한 뒤 같은 계열의 Qwen2.5-VL-7B-4bit로 전체 68개 출력·목표 쌍을 한 번 더 평가하는 민감도 분석을 고정했다. 목표 문구·파서·온도·최대 토큰은 같고 모델 리비전은 fdcc572e8b05ba9daeaf71be8c9e4267c826ff9b이다. 1차 점수는 보존하며 유리한 결과만 선택하지 않는다. 이 후속 평가는 사후 분석이고 독립 정답 검증이 아니다. 7B 평가에서는 목표 충족이 372/384에서 374/384로 높아졌고 JSON 파싱 실패와 판단 불가는 없었다.</w:t>
+        <w:t>1차 평가의 오류를 확인한 뒤, 평가 모델을 바꿔도 결과가 같은지 알아보기 위해 Qwen2.5-VL-7B-4bit로 전체 68개 이미지·목표 쌍을 다시 평가했다. 재평가 전에 대상과 설정을 확정했으며 목표 문구, 파서, 온도, 최대 토큰은 1차 평가와 같았다. 모델 버전은 fdcc572e8b05ba9daeaf71be8c9e4267c826ff9b이다. 3B와 7B 결과를 함께 보고한다. 같은 계열 모델을 사용한 사후 분석이므로 두 모델의 일치만으로 판정의 정확성을 확인할 수는 없다. 7B 평가에서 목표 충족 수는 기준 372/384, 결합 374/384였고 JSON 파싱 실패와 판단 불가는 없었다.</w:t>
       </w:r>
     </w:p>
     <w:p>
       <w:pPr>
         <w:pStyle w:val="Caption"/>
         <w:keepNext/>
+        <w:spacing w:before="100"/>
         <w:ind w:firstLine="0"/>
         <w:jc w:val="center"/>
       </w:pPr>
@@ -2071,10 +2385,10 @@
         <w:tblLook w:firstColumn="1" w:firstRow="1" w:lastColumn="0" w:lastRow="0" w:noHBand="0" w:noVBand="1" w:val="04A0"/>
       </w:tblPr>
       <w:tblGrid>
-        <w:gridCol w:w="2494"/>
-        <w:gridCol w:w="2381"/>
-        <w:gridCol w:w="2381"/>
-        <w:gridCol w:w="2381"/>
+        <w:gridCol w:w="1417"/>
+        <w:gridCol w:w="1068"/>
+        <w:gridCol w:w="1068"/>
+        <w:gridCol w:w="1068"/>
       </w:tblGrid>
       <w:tr>
         <w:trPr>
@@ -2083,7 +2397,11 @@
         </w:trPr>
         <w:tc>
           <w:tcPr>
-            <w:tcW w:type="dxa" w:w="2494"/>
+            <w:tcW w:type="dxa" w:w="1417"/>
+            <w:tcMar>
+              <w:left w:w="45" w:type="dxa"/>
+              <w:right w:w="45" w:type="dxa"/>
+            </w:tcMar>
             <w:tcBorders>
               <w:bottom w:val="single" w:sz="5"/>
             </w:tcBorders>
@@ -2106,7 +2424,11 @@
         </w:tc>
         <w:tc>
           <w:tcPr>
-            <w:tcW w:type="dxa" w:w="2381"/>
+            <w:tcW w:type="dxa" w:w="1068"/>
+            <w:tcMar>
+              <w:left w:w="45" w:type="dxa"/>
+              <w:right w:w="45" w:type="dxa"/>
+            </w:tcMar>
             <w:tcBorders>
               <w:bottom w:val="single" w:sz="5"/>
             </w:tcBorders>
@@ -2129,7 +2451,11 @@
         </w:tc>
         <w:tc>
           <w:tcPr>
-            <w:tcW w:type="dxa" w:w="2381"/>
+            <w:tcW w:type="dxa" w:w="1068"/>
+            <w:tcMar>
+              <w:left w:w="45" w:type="dxa"/>
+              <w:right w:w="45" w:type="dxa"/>
+            </w:tcMar>
             <w:tcBorders>
               <w:bottom w:val="single" w:sz="5"/>
             </w:tcBorders>
@@ -2146,13 +2472,19 @@
                 <w:b/>
                 <w:sz w:val="16"/>
               </w:rPr>
-              <w:t>판단 불가</w:t>
+              <w:t>판단</w:t>
+              <w:br/>
+              <w:t>불가</w:t>
             </w:r>
           </w:p>
         </w:tc>
         <w:tc>
           <w:tcPr>
-            <w:tcW w:type="dxa" w:w="2381"/>
+            <w:tcW w:type="dxa" w:w="1068"/>
+            <w:tcMar>
+              <w:left w:w="45" w:type="dxa"/>
+              <w:right w:w="45" w:type="dxa"/>
+            </w:tcMar>
             <w:tcBorders>
               <w:bottom w:val="single" w:sz="5"/>
             </w:tcBorders>
@@ -2180,7 +2512,11 @@
         </w:trPr>
         <w:tc>
           <w:tcPr>
-            <w:tcW w:type="dxa" w:w="2494"/>
+            <w:tcW w:type="dxa" w:w="1417"/>
+            <w:tcMar>
+              <w:left w:w="45" w:type="dxa"/>
+              <w:right w:w="45" w:type="dxa"/>
+            </w:tcMar>
           </w:tcPr>
           <w:p>
             <w:pPr>
@@ -2194,13 +2530,17 @@
                 <w:b w:val="0"/>
                 <w:sz w:val="16"/>
               </w:rPr>
-              <w:t>공통 기준</w:t>
+              <w:t>기준 방법</w:t>
             </w:r>
           </w:p>
         </w:tc>
         <w:tc>
           <w:tcPr>
-            <w:tcW w:type="dxa" w:w="2381"/>
+            <w:tcW w:type="dxa" w:w="1068"/>
+            <w:tcMar>
+              <w:left w:w="45" w:type="dxa"/>
+              <w:right w:w="45" w:type="dxa"/>
+            </w:tcMar>
           </w:tcPr>
           <w:p>
             <w:pPr>
@@ -2220,7 +2560,11 @@
         </w:tc>
         <w:tc>
           <w:tcPr>
-            <w:tcW w:type="dxa" w:w="2381"/>
+            <w:tcW w:type="dxa" w:w="1068"/>
+            <w:tcMar>
+              <w:left w:w="45" w:type="dxa"/>
+              <w:right w:w="45" w:type="dxa"/>
+            </w:tcMar>
           </w:tcPr>
           <w:p>
             <w:pPr>
@@ -2240,7 +2584,11 @@
         </w:tc>
         <w:tc>
           <w:tcPr>
-            <w:tcW w:type="dxa" w:w="2381"/>
+            <w:tcW w:type="dxa" w:w="1068"/>
+            <w:tcMar>
+              <w:left w:w="45" w:type="dxa"/>
+              <w:right w:w="45" w:type="dxa"/>
+            </w:tcMar>
           </w:tcPr>
           <w:p>
             <w:pPr>
@@ -2265,7 +2613,11 @@
         </w:trPr>
         <w:tc>
           <w:tcPr>
-            <w:tcW w:type="dxa" w:w="2494"/>
+            <w:tcW w:type="dxa" w:w="1417"/>
+            <w:tcMar>
+              <w:left w:w="45" w:type="dxa"/>
+              <w:right w:w="45" w:type="dxa"/>
+            </w:tcMar>
             <w:tcBorders>
               <w:bottom w:val="single" w:sz="5"/>
             </w:tcBorders>
@@ -2288,7 +2640,11 @@
         </w:tc>
         <w:tc>
           <w:tcPr>
-            <w:tcW w:type="dxa" w:w="2381"/>
+            <w:tcW w:type="dxa" w:w="1068"/>
+            <w:tcMar>
+              <w:left w:w="45" w:type="dxa"/>
+              <w:right w:w="45" w:type="dxa"/>
+            </w:tcMar>
             <w:tcBorders>
               <w:bottom w:val="single" w:sz="5"/>
             </w:tcBorders>
@@ -2311,7 +2667,11 @@
         </w:tc>
         <w:tc>
           <w:tcPr>
-            <w:tcW w:type="dxa" w:w="2381"/>
+            <w:tcW w:type="dxa" w:w="1068"/>
+            <w:tcMar>
+              <w:left w:w="45" w:type="dxa"/>
+              <w:right w:w="45" w:type="dxa"/>
+            </w:tcMar>
             <w:tcBorders>
               <w:bottom w:val="single" w:sz="5"/>
             </w:tcBorders>
@@ -2334,7 +2694,11 @@
         </w:tc>
         <w:tc>
           <w:tcPr>
-            <w:tcW w:type="dxa" w:w="2381"/>
+            <w:tcW w:type="dxa" w:w="1068"/>
+            <w:tcMar>
+              <w:left w:w="45" w:type="dxa"/>
+              <w:right w:w="45" w:type="dxa"/>
+            </w:tcMar>
             <w:tcBorders>
               <w:bottom w:val="single" w:sz="5"/>
             </w:tcBorders>
@@ -2361,11 +2725,12 @@
       <w:pPr>
         <w:pStyle w:val="Caption"/>
         <w:keepNext/>
+        <w:spacing w:before="100"/>
         <w:ind w:firstLine="0"/>
         <w:jc w:val="center"/>
       </w:pPr>
       <w:r>
-        <w:t>표 5. 입력이 달랐던 네 쌍의 목표 충족 수</w:t>
+        <w:t>표 5. 입력이 다른 네 쌍의 목표 충족 수</w:t>
       </w:r>
     </w:p>
     <w:tbl>
@@ -2375,11 +2740,11 @@
         <w:tblLook w:firstColumn="1" w:firstRow="1" w:lastColumn="0" w:lastRow="0" w:noHBand="0" w:noVBand="1" w:val="04A0"/>
       </w:tblPr>
       <w:tblGrid>
-        <w:gridCol w:w="2494"/>
-        <w:gridCol w:w="1786"/>
-        <w:gridCol w:w="1786"/>
-        <w:gridCol w:w="1786"/>
-        <w:gridCol w:w="1786"/>
+        <w:gridCol w:w="1417"/>
+        <w:gridCol w:w="801"/>
+        <w:gridCol w:w="801"/>
+        <w:gridCol w:w="801"/>
+        <w:gridCol w:w="801"/>
       </w:tblGrid>
       <w:tr>
         <w:trPr>
@@ -2388,7 +2753,11 @@
         </w:trPr>
         <w:tc>
           <w:tcPr>
-            <w:tcW w:type="dxa" w:w="2494"/>
+            <w:tcW w:type="dxa" w:w="1417"/>
+            <w:tcMar>
+              <w:left w:w="45" w:type="dxa"/>
+              <w:right w:w="45" w:type="dxa"/>
+            </w:tcMar>
             <w:tcBorders>
               <w:bottom w:val="single" w:sz="5"/>
             </w:tcBorders>
@@ -2411,7 +2780,11 @@
         </w:tc>
         <w:tc>
           <w:tcPr>
-            <w:tcW w:type="dxa" w:w="1786"/>
+            <w:tcW w:type="dxa" w:w="801"/>
+            <w:tcMar>
+              <w:left w:w="45" w:type="dxa"/>
+              <w:right w:w="45" w:type="dxa"/>
+            </w:tcMar>
             <w:tcBorders>
               <w:bottom w:val="single" w:sz="5"/>
             </w:tcBorders>
@@ -2434,7 +2807,11 @@
         </w:tc>
         <w:tc>
           <w:tcPr>
-            <w:tcW w:type="dxa" w:w="1786"/>
+            <w:tcW w:type="dxa" w:w="801"/>
+            <w:tcMar>
+              <w:left w:w="45" w:type="dxa"/>
+              <w:right w:w="45" w:type="dxa"/>
+            </w:tcMar>
             <w:tcBorders>
               <w:bottom w:val="single" w:sz="5"/>
             </w:tcBorders>
@@ -2457,7 +2834,11 @@
         </w:tc>
         <w:tc>
           <w:tcPr>
-            <w:tcW w:type="dxa" w:w="1786"/>
+            <w:tcW w:type="dxa" w:w="801"/>
+            <w:tcMar>
+              <w:left w:w="45" w:type="dxa"/>
+              <w:right w:w="45" w:type="dxa"/>
+            </w:tcMar>
             <w:tcBorders>
               <w:bottom w:val="single" w:sz="5"/>
             </w:tcBorders>
@@ -2480,7 +2861,11 @@
         </w:tc>
         <w:tc>
           <w:tcPr>
-            <w:tcW w:type="dxa" w:w="1786"/>
+            <w:tcW w:type="dxa" w:w="801"/>
+            <w:tcMar>
+              <w:left w:w="45" w:type="dxa"/>
+              <w:right w:w="45" w:type="dxa"/>
+            </w:tcMar>
             <w:tcBorders>
               <w:bottom w:val="single" w:sz="5"/>
             </w:tcBorders>
@@ -2508,7 +2893,11 @@
         </w:trPr>
         <w:tc>
           <w:tcPr>
-            <w:tcW w:type="dxa" w:w="2494"/>
+            <w:tcW w:type="dxa" w:w="1417"/>
+            <w:tcMar>
+              <w:left w:w="45" w:type="dxa"/>
+              <w:right w:w="45" w:type="dxa"/>
+            </w:tcMar>
           </w:tcPr>
           <w:p>
             <w:pPr>
@@ -2528,7 +2917,11 @@
         </w:tc>
         <w:tc>
           <w:tcPr>
-            <w:tcW w:type="dxa" w:w="1786"/>
+            <w:tcW w:type="dxa" w:w="801"/>
+            <w:tcMar>
+              <w:left w:w="45" w:type="dxa"/>
+              <w:right w:w="45" w:type="dxa"/>
+            </w:tcMar>
           </w:tcPr>
           <w:p>
             <w:pPr>
@@ -2548,7 +2941,11 @@
         </w:tc>
         <w:tc>
           <w:tcPr>
-            <w:tcW w:type="dxa" w:w="1786"/>
+            <w:tcW w:type="dxa" w:w="801"/>
+            <w:tcMar>
+              <w:left w:w="45" w:type="dxa"/>
+              <w:right w:w="45" w:type="dxa"/>
+            </w:tcMar>
           </w:tcPr>
           <w:p>
             <w:pPr>
@@ -2568,7 +2965,11 @@
         </w:tc>
         <w:tc>
           <w:tcPr>
-            <w:tcW w:type="dxa" w:w="1786"/>
+            <w:tcW w:type="dxa" w:w="801"/>
+            <w:tcMar>
+              <w:left w:w="45" w:type="dxa"/>
+              <w:right w:w="45" w:type="dxa"/>
+            </w:tcMar>
           </w:tcPr>
           <w:p>
             <w:pPr>
@@ -2588,7 +2989,11 @@
         </w:tc>
         <w:tc>
           <w:tcPr>
-            <w:tcW w:type="dxa" w:w="1786"/>
+            <w:tcW w:type="dxa" w:w="801"/>
+            <w:tcMar>
+              <w:left w:w="45" w:type="dxa"/>
+              <w:right w:w="45" w:type="dxa"/>
+            </w:tcMar>
           </w:tcPr>
           <w:p>
             <w:pPr>
@@ -2613,7 +3018,11 @@
         </w:trPr>
         <w:tc>
           <w:tcPr>
-            <w:tcW w:type="dxa" w:w="2494"/>
+            <w:tcW w:type="dxa" w:w="1417"/>
+            <w:tcMar>
+              <w:left w:w="45" w:type="dxa"/>
+              <w:right w:w="45" w:type="dxa"/>
+            </w:tcMar>
           </w:tcPr>
           <w:p>
             <w:pPr>
@@ -2633,7 +3042,11 @@
         </w:tc>
         <w:tc>
           <w:tcPr>
-            <w:tcW w:type="dxa" w:w="1786"/>
+            <w:tcW w:type="dxa" w:w="801"/>
+            <w:tcMar>
+              <w:left w:w="45" w:type="dxa"/>
+              <w:right w:w="45" w:type="dxa"/>
+            </w:tcMar>
           </w:tcPr>
           <w:p>
             <w:pPr>
@@ -2653,7 +3066,11 @@
         </w:tc>
         <w:tc>
           <w:tcPr>
-            <w:tcW w:type="dxa" w:w="1786"/>
+            <w:tcW w:type="dxa" w:w="801"/>
+            <w:tcMar>
+              <w:left w:w="45" w:type="dxa"/>
+              <w:right w:w="45" w:type="dxa"/>
+            </w:tcMar>
           </w:tcPr>
           <w:p>
             <w:pPr>
@@ -2673,7 +3090,11 @@
         </w:tc>
         <w:tc>
           <w:tcPr>
-            <w:tcW w:type="dxa" w:w="1786"/>
+            <w:tcW w:type="dxa" w:w="801"/>
+            <w:tcMar>
+              <w:left w:w="45" w:type="dxa"/>
+              <w:right w:w="45" w:type="dxa"/>
+            </w:tcMar>
           </w:tcPr>
           <w:p>
             <w:pPr>
@@ -2693,7 +3114,11 @@
         </w:tc>
         <w:tc>
           <w:tcPr>
-            <w:tcW w:type="dxa" w:w="1786"/>
+            <w:tcW w:type="dxa" w:w="801"/>
+            <w:tcMar>
+              <w:left w:w="45" w:type="dxa"/>
+              <w:right w:w="45" w:type="dxa"/>
+            </w:tcMar>
           </w:tcPr>
           <w:p>
             <w:pPr>
@@ -2718,7 +3143,11 @@
         </w:trPr>
         <w:tc>
           <w:tcPr>
-            <w:tcW w:type="dxa" w:w="2494"/>
+            <w:tcW w:type="dxa" w:w="1417"/>
+            <w:tcMar>
+              <w:left w:w="45" w:type="dxa"/>
+              <w:right w:w="45" w:type="dxa"/>
+            </w:tcMar>
           </w:tcPr>
           <w:p>
             <w:pPr>
@@ -2738,7 +3167,11 @@
         </w:tc>
         <w:tc>
           <w:tcPr>
-            <w:tcW w:type="dxa" w:w="1786"/>
+            <w:tcW w:type="dxa" w:w="801"/>
+            <w:tcMar>
+              <w:left w:w="45" w:type="dxa"/>
+              <w:right w:w="45" w:type="dxa"/>
+            </w:tcMar>
           </w:tcPr>
           <w:p>
             <w:pPr>
@@ -2758,7 +3191,11 @@
         </w:tc>
         <w:tc>
           <w:tcPr>
-            <w:tcW w:type="dxa" w:w="1786"/>
+            <w:tcW w:type="dxa" w:w="801"/>
+            <w:tcMar>
+              <w:left w:w="45" w:type="dxa"/>
+              <w:right w:w="45" w:type="dxa"/>
+            </w:tcMar>
           </w:tcPr>
           <w:p>
             <w:pPr>
@@ -2778,7 +3215,11 @@
         </w:tc>
         <w:tc>
           <w:tcPr>
-            <w:tcW w:type="dxa" w:w="1786"/>
+            <w:tcW w:type="dxa" w:w="801"/>
+            <w:tcMar>
+              <w:left w:w="45" w:type="dxa"/>
+              <w:right w:w="45" w:type="dxa"/>
+            </w:tcMar>
           </w:tcPr>
           <w:p>
             <w:pPr>
@@ -2798,7 +3239,11 @@
         </w:tc>
         <w:tc>
           <w:tcPr>
-            <w:tcW w:type="dxa" w:w="1786"/>
+            <w:tcW w:type="dxa" w:w="801"/>
+            <w:tcMar>
+              <w:left w:w="45" w:type="dxa"/>
+              <w:right w:w="45" w:type="dxa"/>
+            </w:tcMar>
           </w:tcPr>
           <w:p>
             <w:pPr>
@@ -2823,7 +3268,11 @@
         </w:trPr>
         <w:tc>
           <w:tcPr>
-            <w:tcW w:type="dxa" w:w="2494"/>
+            <w:tcW w:type="dxa" w:w="1417"/>
+            <w:tcMar>
+              <w:left w:w="45" w:type="dxa"/>
+              <w:right w:w="45" w:type="dxa"/>
+            </w:tcMar>
             <w:tcBorders>
               <w:bottom w:val="single" w:sz="5"/>
             </w:tcBorders>
@@ -2846,7 +3295,11 @@
         </w:tc>
         <w:tc>
           <w:tcPr>
-            <w:tcW w:type="dxa" w:w="1786"/>
+            <w:tcW w:type="dxa" w:w="801"/>
+            <w:tcMar>
+              <w:left w:w="45" w:type="dxa"/>
+              <w:right w:w="45" w:type="dxa"/>
+            </w:tcMar>
             <w:tcBorders>
               <w:bottom w:val="single" w:sz="5"/>
             </w:tcBorders>
@@ -2869,7 +3322,11 @@
         </w:tc>
         <w:tc>
           <w:tcPr>
-            <w:tcW w:type="dxa" w:w="1786"/>
+            <w:tcW w:type="dxa" w:w="801"/>
+            <w:tcMar>
+              <w:left w:w="45" w:type="dxa"/>
+              <w:right w:w="45" w:type="dxa"/>
+            </w:tcMar>
             <w:tcBorders>
               <w:bottom w:val="single" w:sz="5"/>
             </w:tcBorders>
@@ -2892,7 +3349,11 @@
         </w:tc>
         <w:tc>
           <w:tcPr>
-            <w:tcW w:type="dxa" w:w="1786"/>
+            <w:tcW w:type="dxa" w:w="801"/>
+            <w:tcMar>
+              <w:left w:w="45" w:type="dxa"/>
+              <w:right w:w="45" w:type="dxa"/>
+            </w:tcMar>
             <w:tcBorders>
               <w:bottom w:val="single" w:sz="5"/>
             </w:tcBorders>
@@ -2915,7 +3376,11 @@
         </w:tc>
         <w:tc>
           <w:tcPr>
-            <w:tcW w:type="dxa" w:w="1786"/>
+            <w:tcW w:type="dxa" w:w="801"/>
+            <w:tcMar>
+              <w:left w:w="45" w:type="dxa"/>
+              <w:right w:w="45" w:type="dxa"/>
+            </w:tcMar>
             <w:tcBorders>
               <w:bottom w:val="single" w:sz="5"/>
             </w:tcBorders>
@@ -2951,7 +3416,7 @@
         <w:jc w:val="both"/>
       </w:pPr>
       <w:r>
-        <w:t>큰 모델에서도 의미 판정의 모순은 남았다. 두 인물의 3턴 기준 출력에 식물이 보인다고 설명한 뒤 식물이 없다고도 설명하면서 모두 성공으로 채점했다. R02 4턴에서도 같은 소품 설명 모순이 나타났다. 원점수는 수정하지 않았다. 따라서 7B에서 형식 오류가 사라졌다는 사실이나 두 평가의 증가 방향만으로 전반적인 이미지 품질 개선을 확정할 수 없다.</w:t>
+        <w:t>7B 모델에서도 설명과 점수가 일치하지 않는 경우가 있었다. 두 인물의 3턴 기준 출력에 식물이 보인다고 설명한 뒤 식물이 없다고도 설명하면서 모두 성공으로 채점했다. R02 4턴에서도 같은 소품 설명 모순이 나타났다. 표에는 평가 모델이 반환한 점수를 그대로 집계했다. 따라서 JSON 형식 오류의 감소와 실제 편집 정확도의 향상을 구분해야 한다.</w:t>
       </w:r>
     </w:p>
     <w:p>
@@ -2959,7 +3424,7 @@
         <w:jc w:val="both"/>
       </w:pPr>
       <w:r>
-        <w:t>앞서 P에서 유지 보호를 선택한 탐색적 이미지 실험은 128조건·68개 고유 출력으로 완료했다. 목표 충족은 기준 354/384와 보호 355/384, 얼굴 코사인 평균은 0.914851과 0.914108이었다. 실제 입력이 다른 네 쌍 중 R01-P2-2의 소품 판정 하나만 판단 불가에서 성공으로 바뀌었으며 확정 실패에서 성공으로 바뀐 항목은 없었다. JSON 파싱 실패 4개와 설명·점수 모순도 있었다. 따라서 P에서 뚜렷한 이미지 개선을 확인했다고 해석하지 않는다.</w:t>
+        <w:t>앞선 개발 대화 P의 이미지 실험에서는 128조건에 대해 68개 이미지를 생성했다. 목표 충족 수는 기준 354/384, 유지 규칙 355/384였고 얼굴 코사인 평균은 각각 0.914851과 0.914108이었다. 입력이 다른 네 쌍 중 R01-P2-2의 소품 판정 하나만 판단 불가에서 성공으로 바뀌었다. 실패에서 성공으로 바뀐 항목은 없었으며 JSON 파싱 실패 4개와 설명·점수 불일치가 있었다.</w:t>
       </w:r>
     </w:p>
     <w:p>
@@ -2975,7 +3440,7 @@
         <w:jc w:val="both"/>
       </w:pPr>
       <w:r>
-        <w:t>실무적으로 얻은 설계 원칙은 유지와 삭제를 독립적으로 점검하고 적용 근거를 남기는 것이다. 좁은 규칙은 모델이 이해할 수 있는 모든 문장을 대신하지 않으며, 지원 범위가 명확할 때만 개입한다. 유지 단어를 넓게 탐지하는 규칙의 Q 실패는 적용 범위를 제한해야 하는 근거이고, Q의 최종 상태 실패와 S3의 구성요소별 차이는 유지 보호만으로 충분하지 않은 근거이다.</w:t>
+        <w:t>Q에서는 keep을 폭넓게 탐지하는 규칙이 삭제나 값 변경 요청을 유지로 잘못 처리했다. 적용 문형을 좁히자 이 오류는 줄었지만 삭제 누락은 남았다. S3에서는 유지와 삭제를 각각 검사했을 때 배경의 불필요한 변경과 식물 삭제 누락을 함께 막았다. 이 결과는 유지 규칙의 적용 범위를 명확히 하고 삭제 지시를 별도로 확인할 필요성을 보여준다.</w:t>
       </w:r>
     </w:p>
     <w:p>
@@ -2983,7 +3448,15 @@
         <w:jc w:val="both"/>
       </w:pPr>
       <w:r>
-        <w:t>결과의 적용 범위에는 세 가지 제한이 있다. 첫째, 두 검증은 각각 8개의 개발자 작성 대화이며 S의 개선은 한 대화에 집중됐다. 어휘와 문형도 제한되어 일반 사용자 대화의 평균 효과를 추정할 수 없다. 둘째, 텍스트 추출은 한 종류의 4B 모델에 한정되며, 추출기가 현재 요청만 읽으므로 대명사나 긴 문맥 해석을 포함하는 상태 추적 시스템과 직접 성능을 비교할 수 없다. 셋째, 이미지 비교는 두 인물과 한 도구를 사용하고 공유 출력이 많다. AI 평가의 판단 불가와 설명·점수 불일치는 원문에 보존하며 사람이 확정한 정답 평가로 취급하지 않는다. 얼굴 코사인도 사람이 느끼는 동일성 자체를 증명하는 지표는 아니다.</w:t>
+        <w:t>S와 T는 각각 8개의 연구용 합성 대화이며 개선은 S3와 T7에 집중됐다. 어휘와 문형이 제한되어 일반 사용자 대화에서의 평균 효과는 알 수 없다. 변경 사항 추출에 사용한 모델도 한 종류의 4B 모델이다. 추출기는 현재 요청만 읽으므로 대명사나 긴 대화의 맥락을 해석하는 성능은 이번 실험 범위에 포함되지 않는다.</w:t>
+      </w:r>
+    </w:p>
+    <w:p>
+      <w:pPr>
+        <w:jc w:val="both"/>
+      </w:pPr>
+      <w:r>
+        <w:t>이미지 실험은 인물 2명과 생성 도구 하나를 사용했고, 비교 64쌍 중 60쌍이 같은 출력을 공유했다. 두 AI 평가 모두 설명과 점수의 불일치가 있어 점수 증가를 전반적인 이미지 품질 향상으로 해석하기 어렵다. 얼굴 코사인 유사도는 특징 벡터의 유사성을 측정하므로 사람이 느끼는 인물의 동일성과 차이가 있을 수 있다.</w:t>
       </w:r>
     </w:p>
     <w:p>
@@ -2999,7 +3472,7 @@
         <w:jc w:val="both"/>
       </w:pPr>
       <w:r>
-        <w:t>명시적인 유지와 삭제 지시를 모델 응답 뒤에서 검사하면 추가 모델 호출 없이 서로 다른 상태 오류를 줄일 수 있었다. S에서는 유지 보호만으로 남는 삭제 누락과 삭제 실행만으로 남는 배경 훼손을 함께 막았고, T에서도 정확한 턴과 최종 대화가 각각 한 개 증가했다. 항목별 오류 격리를 더한 이점은 없어 단순한 유지·삭제 방식을 선택했다. 이미지 단계에서는 입력이 달랐던 네 쌍의 차이를 확인했지만 두 AI 평가의 모순 때문에 전반적인 이미지 품질 개선까지 주장하지 않는다. 본 연구의 기여는 제한 문형에서 작동하는 요청 검사 방법과 두 구성요소가 필요한 오류 사례의 검증이다.</w:t>
+        <w:t>언어 모델의 추출·재검토 뒤에 유지·삭제 규칙을 적용해 추가 모델 호출 없이 편집 상태의 오류를 줄였다. S에서는 삭제 누락과 불필요한 배경 변경을 함께 막았고, T에서는 정확한 턴과 최종 정답 대화가 각각 한 개 늘었다. 항목별 적용을 더해도 결과가 같아 유지·삭제 규칙만 사용하는 방법을 선택했다. 이 결과는 명시적인 영어 지시를 검사하는 후처리 규칙과 두 규칙이 각각 처리하는 오류를 보여준다. 일반 대화에서의 효과와 전반적인 이미지 품질 향상은 이번 실험으로 확인하지 못했다.</w:t>
       </w:r>
     </w:p>
     <w:p>
@@ -3101,10 +3574,10 @@
       </w:r>
     </w:p>
     <w:sectPr>
-      <w:footerReference w:type="default" r:id="rId11"/>
+      <w:type w:val="continuous"/>
       <w:pgSz w:w="11906" w:h="16838"/>
       <w:pgMar w:top="1134" w:right="1134" w:bottom="1134" w:left="1134" w:header="720" w:footer="720" w:gutter="0"/>
-      <w:cols w:space="720"/>
+      <w:cols w:space="397" w:num="2"/>
       <w:docGrid w:linePitch="360"/>
     </w:sectPr>
   </w:body>

</xml_diff>

<commit_message>
Tighten paper discussion and remove generic future-work wording
</commit_message>
<xml_diff>
--- a/paper/manuscript.inha.docx
+++ b/paper/manuscript.inha.docx
@@ -3440,7 +3440,7 @@
         <w:jc w:val="both"/>
       </w:pPr>
       <w:r>
-        <w:t>Q에서는 keep을 폭넓게 탐지하는 규칙이 삭제나 값 변경 요청을 유지로 잘못 처리했다. 적용 문형을 좁히자 이 오류는 줄었지만 삭제 누락은 남았다. S3에서는 유지와 삭제를 각각 검사했을 때 배경의 불필요한 변경과 식물 삭제 누락을 함께 막았다. 이 결과는 유지 규칙의 적용 범위를 명확히 하고 삭제 지시를 별도로 확인할 필요성을 보여준다.</w:t>
+        <w:t>Q에서는 keep을 폭넓게 탐지하는 규칙이 삭제나 값 변경 요청을 유지로 잘못 처리했다. 적용 문형을 좁히자 이 오류는 줄었지만 삭제 누락은 남았다. S3에서는 유지 규칙이 불필요한 배경 변경을, 삭제 규칙이 식물 삭제 누락을 막았다. 두 규칙은 서로 다른 오류를 처리했다.</w:t>
       </w:r>
     </w:p>
     <w:p>
@@ -3448,7 +3448,7 @@
         <w:jc w:val="both"/>
       </w:pPr>
       <w:r>
-        <w:t>S와 T는 각각 8개의 연구용 합성 대화이며 개선은 S3와 T7에 집중됐다. 어휘와 문형이 제한되어 일반 사용자 대화에서의 평균 효과는 알 수 없다. 변경 사항 추출에 사용한 모델도 한 종류의 4B 모델이다. 추출기는 현재 요청만 읽으므로 대명사나 긴 대화의 맥락을 해석하는 성능은 이번 실험 범위에 포함되지 않는다.</w:t>
+        <w:t>S와 T는 각각 정해진 영어 문형으로 구성한 합성 대화 8개이며 개선은 S3와 T7에 집중됐다. 변경 사항 추출에는 한 종류의 4B 모델을 사용했고, 매 턴 현재 요청만 입력했다.</w:t>
       </w:r>
     </w:p>
     <w:p>
@@ -3456,7 +3456,7 @@
         <w:jc w:val="both"/>
       </w:pPr>
       <w:r>
-        <w:t>이미지 실험은 인물 2명과 생성 도구 하나를 사용했고, 비교 64쌍 중 60쌍이 같은 출력을 공유했다. 두 AI 평가 모두 설명과 점수의 불일치가 있어 점수 증가를 전반적인 이미지 품질 향상으로 해석하기 어렵다. 얼굴 코사인 유사도는 특징 벡터의 유사성을 측정하므로 사람이 느끼는 인물의 동일성과 차이가 있을 수 있다.</w:t>
+        <w:t>이미지 실험은 인물 2명과 생성 도구 하나를 사용했고, 비교 64쌍 중 60쌍이 같은 출력을 공유했다. 두 AI 평가 모두 설명과 점수의 불일치가 있어 점수 증가를 전반적인 이미지 품질 향상으로 해석하기 어렵다. 얼굴 특징 벡터의 코사인 유사도는 입력이 다른 네 쌍 중 두 쌍에서 상승하고 두 쌍에서 하락했다.</w:t>
       </w:r>
     </w:p>
     <w:p>
@@ -3472,7 +3472,7 @@
         <w:jc w:val="both"/>
       </w:pPr>
       <w:r>
-        <w:t>언어 모델의 추출·재검토 뒤에 유지·삭제 규칙을 적용해 추가 모델 호출 없이 편집 상태의 오류를 줄였다. S에서는 삭제 누락과 불필요한 배경 변경을 함께 막았고, T에서는 정확한 턴과 최종 정답 대화가 각각 한 개 늘었다. 항목별 적용을 더해도 결과가 같아 유지·삭제 규칙만 사용하는 방법을 선택했다. 이 결과는 명시적인 영어 지시를 검사하는 후처리 규칙과 두 규칙이 각각 처리하는 오류를 보여준다. 일반 대화에서의 효과와 전반적인 이미지 품질 향상은 이번 실험으로 확인하지 못했다.</w:t>
+        <w:t>정해진 영어 문형의 합성 대화에서 언어 모델의 추출·재검토 뒤에 유지·삭제 규칙을 적용해 추가 모델 호출 없이 편집 상태의 오류를 줄였다. S에서는 삭제 누락과 불필요한 배경 변경을 함께 막았고, T에서는 정확한 턴과 최종 정답 대화가 각각 한 개 늘었다. 항목별 적용을 더해도 결과가 같아 유지·삭제 규칙만 사용하는 방법을 선택했다.</w:t>
       </w:r>
     </w:p>
     <w:p>

</xml_diff>

<commit_message>
Polish academic prose and regenerate verified paper artifacts
</commit_message>
<xml_diff>
--- a/paper/manuscript.inha.docx
+++ b/paper/manuscript.inha.docx
@@ -65,7 +65,7 @@
         <w:t xml:space="preserve">요약: </w:t>
       </w:r>
       <w:r>
-        <w:t>반복 이미지 편집에서는 변경할 내용과 유지하거나 삭제할 내용을 다음 프롬프트에 정확히 반영해야 한다. 본 연구는 언어 모델이 변경 사항을 추출하고 재검토한 뒤, 명시적인 유지·삭제 지시를 확인하는 후처리 규칙을 제안한다. 유지 규칙은 해당 항목의 이전 값을 보존하고 삭제 규칙은 값을 없음으로 설정한다. 적용 조건에 맞는 구절과 항목만 처리하고 근거 구절을 기록한다. 개발 후 별도로 구성하고 추론 전에 확정한 S 대화 8개 32턴에서 동일한 모델 응답에 네 방법을 적용했다. 여섯 항목이 모두 정확한 턴은 기준 방법 27, 유지 규칙만 27, 삭제 규칙만 28, 두 규칙 결합 29였다. 결합 시 마지막 상태가 정확한 대화는 6개에서 7개로 늘었고, 유지해야 할 항목을 잘못 변경한 횟수는 1건에서 0건으로 줄었다. 개선은 한 대화의 두 턴에서 나타났다. 추가 검증 T의 대화 8개 32턴에서도 정확한 턴이 28/32에서 29/32로 늘었으나, 변경을 항목별로 적용하는 처리를 더해도 결과는 같았다. 실제 인물 사진 2명의 이미지 평가에서 목표 충족 수는 3B 모델 기준 350/384에서 358/384로, 사후 7B 평가에서는 372/384에서 374/384로 늘었다. 다만 판단 불가 감소와 설명·점수 불일치가 포함되어 이미지 품질의 향상 여부는 판단하기 어렵다. 유지·삭제 규칙의 효과는 이번에 검사한 영어 문형과 합성 대화 범위에서 확인됐다.</w:t>
+        <w:t>반복 이미지 편집에서는 변경할 내용과 유지하거나 삭제할 내용을 다음 프롬프트에 정확히 반영해야 한다. 본 연구는 언어 모델이 변경 사항을 추출하고 재검토한 뒤, 명시적인 유지·삭제 지시를 확인하는 후처리 규칙을 제안한다. 유지 규칙은 해당 항목의 이전 값을 보존하고 삭제 규칙은 값을 없음으로 설정한다. 적용 조건에 맞는 구절과 항목만 처리하고 근거 구절을 기록한다. 개발 후 별도로 구성하고 추론 전에 확정한 S 대화 8개 32턴에서 동일한 모델 응답에 네 방법을 적용하였다. 여섯 항목이 모두 정확한 턴은 기준 방법 27, 유지 규칙만 27, 삭제 규칙만 28, 두 규칙 결합 29였다. 결합 시 마지막 상태가 정확한 대화는 6개에서 7개로 증가하였고, 유지해야 할 항목을 잘못 변경한 횟수는 1건에서 0건으로 감소하였다. 개선은 한 대화의 두 턴에서 나타났다. 추가 검증 T의 대화 8개 32턴에서도 정확한 턴이 28/32에서 29/32로 증가하였으나, 변경을 항목별로 적용하는 처리를 더해도 결과는 같았다. 실제 인물 사진 2명의 이미지 평가에서 목표 충족 수는 3B 모델 기준 350/384에서 358/384로, 사후 7B 평가에서는 372/384에서 374/384로 증가하였다. 다만 판단 불가 감소와 설명·점수 불일치가 포함되어 이미지 품질의 향상 여부는 판단하기 어렵다. 유지·삭제 규칙의 효과를 해당 영어 문형과 합성 대화 범위에서 확인하였다.</w:t>
       </w:r>
     </w:p>
     <w:p>
@@ -121,7 +121,7 @@
         <w:jc w:val="both"/>
       </w:pPr>
       <w:r>
-        <w:t>사용자가 인물 사진을 여러 번 편집하면 요청에는 추가, 변경, 유지, 삭제, 원본 복원이 섞인다. 예를 들어 배경은 그대로 두고 목걸이를 지우라는 요청을 전체 장면의 새 설명으로 바꾸면, 목걸이 삭제를 놓치거나 변경 대상이 아닌 배경까지 원본으로 되돌릴 수 있다. 원본 사진을 다시 참조하는 정책은 누적된 얼굴 변화를 줄이는 데 도움이 될 수 있지만, 잘못 정리한 목표까지 바로잡지는 않는다. 따라서 이미지 생성에 앞서 현재 요구 상태가 올바르게 갱신됐는지 확인해야 한다.</w:t>
+        <w:t>반복 인물 이미지 편집에서는 속성의 추가·변경·유지·삭제와 원본 복원 요청을 편집 상태에 반영해야 한다. 예를 들어 배경은 그대로 두고 목걸이를 지우라는 요청을 전체 장면의 새 설명으로 바꾸면, 목걸이 삭제를 놓치거나 변경 대상이 아닌 배경까지 원본으로 되돌릴 수 있다. 원본 사진을 다시 참조하는 정책은 누적된 얼굴 변화를 줄이는 데 도움이 될 수 있지만, 잘못 정리한 목표까지 바로잡지는 않는다. 따라서 이미지 생성에 앞서 현재 요구 상태가 올바르게 갱신됐는지 확인해야 한다.</w:t>
       </w:r>
     </w:p>
     <w:p>
@@ -129,7 +129,7 @@
         <w:jc w:val="both"/>
       </w:pPr>
       <w:r>
-        <w:t>본 연구는 같은 언어 모델의 추출·재검토 결과에 유지·삭제 규칙을 적용했을 때 편집 상태의 오류가 줄어드는지 확인한다. 이를 위해 요청에 명시된 유지·삭제 지시를 검사하는 후처리 규칙을 구현했다. 각 규칙을 단독으로 적용한 결과와 함께 비교해 두 규칙이 각각 어떤 오류를 줄이는지 분석한다.</w:t>
+        <w:t>본 연구에서는 언어 모델이 추출하고 재검토한 변경 사항에 명시적 유지·삭제 제약을 적용하는 상태 갱신 방법을 제안한다. 유지 지시가 있는 항목은 직전 값을 보존하고, 삭제 지시가 있는 항목은 없음으로 설정한다. 동일한 모델 응답에 각 규칙을 단독 또는 결합하여 적용함으로써 유지 오류와 삭제 누락에 대한 각 규칙의 효과를 분석한다.</w:t>
       </w:r>
     </w:p>
     <w:p>
@@ -145,7 +145,7 @@
         <w:jc w:val="both"/>
       </w:pPr>
       <w:r>
-        <w:t>ChatEdit는 대화에서 편집 상태를 추적하고 이를 이미지 편집에 사용하는 구조를 제시했다[1]. 본 연구도 이 구성을 따르며, 상태 갱신 뒤의 유지·삭제 검사에 초점을 맞춘다. SOM-DST는 상태 갱신 동작을 예측하고 필요한 값만 생성하는 접근을 제안했다[2]. 이러한 동작 기반 상태 갱신과 달리 본 연구는 동일한 모델 응답에 적용하는 제한 문형의 후처리 효과를 비교한다.</w:t>
+        <w:t>ChatEdit는 대화에서 편집 상태를 추적하고 이를 이미지 편집에 사용하는 구조를 제시하였다[1]. 본 연구도 이 구성을 따르며, 상태 갱신 뒤의 유지·삭제 검사에 초점을 맞춘다. SOM-DST는 상태 갱신 동작을 예측하고 필요한 값만 생성하는 접근을 제안하였다[2]. 이러한 동작 기반 상태 갱신과 달리 본 연구는 동일한 모델 응답에 적용하는 제한 문형의 후처리 효과를 비교한다.</w:t>
       </w:r>
     </w:p>
     <w:p>
@@ -185,7 +185,7 @@
         <w:jc w:val="both"/>
       </w:pPr>
       <w:r>
-        <w:t>각 턴에서 Qwen3-4B-4bit[4]가 현재 요청의 변경을 JSON으로 추출하고, 같은 모델이 요청과 첫 응답을 받아 이를 재검토한다. 모델에는 정답 상태나 이전 정답을 제공하지 않는다. 이 실험의 추출기는 현재 요청만 읽으며 전체 대화나 방법별 이전 상태를 읽지 않는다. 따라서 두 호출의 원응답을 모든 방법에서 공유할 수 있다. 이전 상태의 적용과 검증은 이후 코드 단계에서 각 방법이 자기 상태를 대상으로 수행한다.</w:t>
+        <w:t>각 턴에서 Qwen3-4B-4bit[4]가 현재 요청의 변경 사항을 JSON으로 추출한 뒤, 요청과 첫 응답을 입력받아 재검토한다. 추출기에는 현재 요청만 제공하며, 전체 대화와 방법별 이전 상태, 정답 상태는 입력하지 않는다. 이에 따라 모든 비교 방법에 동일한 두 모델 응답을 사용할 수 있다. 각 방법은 이후 코드 단계에서 자신의 이전 상태에 변경 사항을 적용하고 검증한다.</w:t>
       </w:r>
     </w:p>
     <w:p>
@@ -241,7 +241,7 @@
         <w:pStyle w:val="Heading2"/>
       </w:pPr>
       <w:r>
-        <w:t>1. 개발 과정과 검증 대화</w:t>
+        <w:t>1. 비교 방법과 검증 대화</w:t>
       </w:r>
     </w:p>
     <w:p>
@@ -249,7 +249,7 @@
         <w:jc w:val="both"/>
       </w:pPr>
       <w:r>
-        <w:t>초기 개발 대화 P에서는 keep을 폭넓게 탐지하는 유지 규칙이 정확한 턴을 기준 30/32에서 32/32로 늘렸다. 그러나 후속 검사에서 off나 색 변경 요청을 유지 지시로 잘못 처리했다. 새 검증 대화 Q에서 이 규칙의 정확한 턴은 12/32였고, 적용 문형을 좁힌 유지 규칙은 기준과 같은 27/32였다. 문형을 좁혀도 마지막 상태가 정확한 대화는 6/8에서 5/8로 줄었다. 중간 턴의 잘못된 삭제는 막았지만 다음 턴의 실제 삭제 요청을 모델이 놓쳤기 때문이다.</w:t>
+        <w:t>초기 개발 대화 P에서는 keep을 폭넓게 탐지하는 유지 규칙이 정확한 턴 수를 기준 30/32에서 32/32로 증가시켰다. 그러나 후속 검사에서 off나 색 변경 요청을 유지 지시로 잘못 처리하였다. 새 검증 대화 Q에서 이 규칙의 정확한 턴은 12/32였고, 적용 문형을 좁힌 유지 규칙은 기준과 같은 27/32였다. 문형을 좁혀도 마지막 상태가 정확한 대화는 6/8에서 5/8로 감소하였다. 중간 턴의 잘못된 삭제는 막았지만 다음 턴의 실제 삭제 요청을 모델이 놓쳤기 때문이다.</w:t>
       </w:r>
     </w:p>
     <w:p>
@@ -257,7 +257,7 @@
         <w:jc w:val="both"/>
       </w:pPr>
       <w:r>
-        <w:t>Q 분석 후 유지·삭제 규칙을 결합하고 검증 대화 S를 새로 구성했다. S는 연구 보조 에이전트로 만든 영어 합성 대화 8개 32턴이다. 각 대화의 정답은 작성 시 지정한 항목별 변경을 순서대로 적용해 만들었다. 대화와 정답, 코드, 프롬프트, 모델 버전을 모두 추론 전에 확정했다. P·Q는 개발 자료이고 S는 후속 검증 자료이므로 결과를 따로 보고한다.</w:t>
+        <w:t>Q 분석 후 유지·삭제 규칙을 결합하고 검증 대화 S를 새로 구성하였다. S는 연구 보조 에이전트로 만든 영어 합성 대화 8개 32턴이다. 각 대화의 정답은 작성 시 지정한 항목별 변경을 순서대로 적용해 만들었다. 대화와 정답, 코드, 프롬프트, 모델 버전을 모두 추론 전에 확정하였다. P·Q는 개발 자료이고 S는 후속 검증 자료이므로 결과를 따로 보고한다.</w:t>
       </w:r>
     </w:p>
     <w:p>
@@ -265,7 +265,7 @@
         <w:jc w:val="left"/>
       </w:pPr>
       <w:r>
-        <w:t>텍스트 모델 버전은 4dcb3d101c2a062e5c1d4bb173588c54ea6c4d25이며 온도 0, 최대 260토큰, 공통 예시 7개를 사용했다. 32턴에 두 번씩 총 64회 호출했다. 기준 방법, 유지 규칙만 적용, 삭제 규칙만 적용, 두 규칙 결합을 비교한다. 결합 방식의 채택 조건은 추론 전에 정했다. 기준보다 정확한 턴이 늘고, 마지막 상태가 정확한 대화가 줄지 않으며, 유지할 항목을 잘못 변경한 횟수가 늘지 않아야 한다. 두 단독 규칙보다 정확한 턴이 많을 때 결합의 추가 효과가 있는 것으로 판단한다.</w:t>
+        <w:t>텍스트 모델 버전은 4dcb3d101c2a062e5c1d4bb173588c54ea6c4d25이며 온도 0, 최대 260토큰, 공통 예시 7개를 사용하였다. 32턴에 두 번씩 총 64회 호출하였다. 기준 방법, 유지 규칙만 적용, 삭제 규칙만 적용, 두 규칙 결합을 비교한다. 결합 방식의 채택 조건은 추론 전에 설정하였다. 기준보다 정확한 턴이 늘고, 마지막 상태가 정확한 대화가 줄지 않으며, 유지할 항목을 잘못 변경한 횟수가 늘지 않아야 한다. 두 단독 규칙보다 정확한 턴이 많을 때 결합의 추가 효과가 있는 것으로 판단한다.</w:t>
       </w:r>
     </w:p>
     <w:p>
@@ -281,7 +281,7 @@
         <w:jc w:val="both"/>
       </w:pPr>
       <w:r>
-        <w:t>각 요청에 따라 상태를 한 번 갱신하는 단위를 턴으로 부른다. ‘정확한 턴’은 여섯 항목이 모두 정답과 일치하는 턴 수, ‘정확한 항목’은 총 192항목 중 정답과 일치하는 수다. ‘최종 정답 대화’는 마지막 턴의 여섯 항목이 모두 맞는 대화 수다. ‘유지 오류’는 직전까지 정확했고 이번에도 유지해야 하는 항목을 잘못 변경한 횟수다. 같은 대화에 속한 턴들의 의존성을 고려해 유의성 검정 없이 건수와 비율을 비교한다.</w:t>
+        <w:t>각 요청에 따라 상태를 한 번 갱신하는 단위를 턴으로 부른다. ‘정확한 턴’은 여섯 항목이 모두 정답과 일치하는 턴 수, ‘정확한 항목’은 총 192항목 중 정답과 일치하는 수이다. ‘최종 정답 대화’는 마지막 턴의 여섯 항목이 모두 맞는 대화 수이다. ‘유지 오류’는 직전까지 정확했고 이번에도 유지해야 하는 항목을 잘못 변경한 횟수이다. 같은 대화에 속한 턴들의 의존성을 고려해 유의성 검정 없이 건수와 비율을 비교한다.</w:t>
       </w:r>
     </w:p>
     <w:p>
@@ -289,7 +289,7 @@
         <w:jc w:val="left"/>
       </w:pPr>
       <w:r>
-        <w:t>이미지 실험은 S의 32턴, 실제 인물 사진 2명, 두 방법을 조합한 128조건이다. 원본 파일과 프롬프트가 같으면 한 번 생성한 이미지를 함께 사용해 총 66개 이미지를 생성했다. 방법 간 비교 64쌍 중 입력이 다른 경우는 두 턴과 두 인물을 조합한 4쌍이며, 나머지 60쌍은 같은 이미지를 사용한다. 내장 이미지 생성 도구의 첫 성공 출력을 사용했다. 이 도구는 내부 모델 버전과 시드를 공개하지 않아 동일 시드로 통제할 수 없었다. Qwen2.5-VL-3B-4bit[5]가 이미지와 목표를 받아 여섯 항목을 성공·실패·판단 불가로 평가했다. 평가 모델 버전은 46d4cf06a06ffc1a766c214174f9cbed2f45bcab이다. 평가 시 방법명과 생성 프롬프트는 제공하지 않았다. 얼굴 유사도는 InsightFace buffalo_l[6]의 코사인 유사도로 측정했다.</w:t>
+        <w:t>이미지 실험은 S의 32턴, 실제 인물 사진 2명, 두 방법을 조합한 128조건이다. 원본 파일과 프롬프트가 같으면 한 번 생성한 이미지를 함께 사용해 총 66개 이미지를 생성하였다. 방법 간 비교 64쌍 중 입력이 다른 경우는 두 턴과 두 인물을 조합한 4쌍이며, 나머지 60쌍은 같은 이미지를 사용한다. 내장 이미지 생성 도구의 첫 성공 출력을 사용하였다. 이 도구는 내부 모델 버전과 시드를 공개하지 않아 동일 시드로 통제할 수 없었다. Qwen2.5-VL-3B-4bit[5]가 이미지와 목표를 받아 여섯 항목을 성공·실패·판단 불가로 평가하였다. 평가 모델 버전은 46d4cf06a06ffc1a766c214174f9cbed2f45bcab이다. 평가 시 방법명과 생성 프롬프트는 제공하지 않았다. 얼굴 유사도는 InsightFace buffalo_l[6]의 코사인 유사도로 측정하였다.</w:t>
       </w:r>
     </w:p>
     <w:p>
@@ -297,7 +297,7 @@
         <w:jc w:val="both"/>
       </w:pPr>
       <w:r>
-        <w:t>원본 사진은 Monstera Production의 Pexels 사진 6311573과 6311581이다[7,8]. 각각 512×336, 512×768 크기의 기존 실험 입력을 재사용했다. 그림의 의상·장신구·배경은 AI 편집 결과이며 사진 속 인물의 실제 행동이나 연구 참여를 나타내지 않는다.</w:t>
+        <w:t>원본 사진은 Monstera Production의 Pexels 사진 6311573과 6311581이다[7,8]. 각각 512×336, 512×768 크기의 기존 실험 입력을 재사용하였다. 그림의 의상·장신구·배경은 AI 편집 결과이며 사진 속 인물의 실제 행동이나 연구 참여를 나타내지 않는다.</w:t>
       </w:r>
     </w:p>
     <w:p>
@@ -313,7 +313,7 @@
         <w:jc w:val="both"/>
       </w:pPr>
       <w:r>
-        <w:t>S와 T의 요청, 정답, 모델 응답, 코드 해시를 저장했다. 이미지별로 입력 사진, 프롬프트, 첫 성공 출력, 평가 원문을 연결했다. 코드와 원자료는 연구 저장소의 request-contract-v3, isolated-contract-v1, contract-image-v3 폴더에 있다[9]. 개발 중 재계산한 결과는 별도 파일에 기록했다.</w:t>
+        <w:t>S와 T의 요청, 정답, 모델 응답, 코드 해시를 저장하였다. 이미지별로 입력 사진, 프롬프트, 첫 성공 출력, 평가 원문을 연결하였다. 코드와 원자료는 연구 저장소의 request-contract-v3, isolated-contract-v1, contract-image-v3 폴더에 있다[9]. 개발 중 재계산한 결과는 별도 파일에 기록하였다.</w:t>
       </w:r>
     </w:p>
     <w:p>
@@ -1025,7 +1025,7 @@
         <w:jc w:val="both"/>
       </w:pPr>
       <w:r>
-        <w:t>두 규칙을 결합했을 때 정확한 턴은 기준보다 2개 많아 사전 채택 조건을 충족했다. 유지 규칙만 적용한 경우보다 2개, 삭제 규칙만 적용한 경우보다 1개 많았다. 방법 간 차이는 S3의 3턴과 4턴에서 발생했다. S1, S2, S4, S5, S6, S8은 네 방법 모두 4턴이 정확했고, S7은 모든 방법에서 1/4였다.</w:t>
+        <w:t>두 규칙을 결합했을 때 정확한 턴은 기준보다 2개 많아 사전 채택 조건을 충족하였다. 유지 규칙만 적용한 경우보다 2개, 삭제 규칙만 적용한 경우보다 1개 많았다. 방법 간 차이는 S3의 3턴과 4턴에서 발생하였다. S1, S2, S4, S5, S6, S8은 네 방법 모두 4턴이 정확했고, S7은 모든 방법에서 1/4였다.</w:t>
       </w:r>
     </w:p>
     <w:p>
@@ -1041,7 +1041,7 @@
         <w:jc w:val="both"/>
       </w:pPr>
       <w:r>
-        <w:t>S3의 3턴에서는 식물을 삭제하고 재킷은 유지하도록 요청했다. 기준 방법과 유지 규칙만 적용한 방법은 식물을 남겼고, 삭제 규칙은 식물의 값을 없음으로 바꾸었다. 이어진 4턴에서는 상의와 목걸이를 원본으로 돌리되 재킷과 연한 파란색 배경은 그대로 두도록 요청했다. 기준 방법과 삭제 규칙만 적용한 방법은 배경도 원본으로 바꾸었다. 유지 규칙은 배경을 보존했지만 이전 턴에서 남긴 식물까지 삭제하지는 못했다. 두 규칙을 결합했을 때만 두 턴 모두 정확했다.</w:t>
+        <w:t>S3의 3턴에서는 식물을 삭제하고 재킷은 유지하도록 요청하였다. 기준 방법과 유지 규칙만 적용한 방법은 식물을 남겼고, 삭제 규칙은 식물의 값을 없음으로 바꾸었다. 이어진 4턴에서는 상의와 목걸이를 원본으로 돌리되 재킷과 연한 파란색 배경은 그대로 두도록 요청하였다. 기준 방법과 삭제 규칙만 적용한 방법은 배경도 원본으로 바꾸었다. 유지 규칙은 배경을 보존하였지만 이전 턴에서 남긴 식물까지 삭제하지는 못했다. 두 규칙을 결합했을 때만 두 턴 모두 정확했다.</w:t>
       </w:r>
     </w:p>
     <w:p>
@@ -1049,7 +1049,7 @@
         <w:jc w:val="both"/>
       </w:pPr>
       <w:r>
-        <w:t>삭제 규칙은 3턴의 식물 삭제 누락을, 유지 규칙은 4턴의 불필요한 배경 변경을 막았다. 두 규칙은 이 대화에서 서로 다른 오류를 처리했다.</w:t>
+        <w:t>이 사례에서 삭제 규칙은 3턴의 식물 삭제 누락을 방지하고, 유지 규칙은 4턴의 배경 상태를 보존하였다. 두 오류가 서로 다른 항목과 턴에서 발생하므로, 두 규칙을 결합한 경우에만 두 턴의 여섯 항목이 모두 정답과 일치하였다.</w:t>
       </w:r>
     </w:p>
     <w:p>
@@ -1065,7 +1065,7 @@
         <w:jc w:val="both"/>
       </w:pPr>
       <w:r>
-        <w:t>항목별 적용은 한 항목의 오류 때문에 다른 유효한 변경까지 취소되는 것을 막는 처리다. S 결과를 본 뒤 이 처리를 유지·삭제 규칙에 추가해 재계산하자 정확한 턴이 32/32가 됐다. 추가 효과를 확인하기 위해 코드를 수정하지 않고 새 검증 대화 T의 8개 대화 32턴에 적용했다. 대화와 정답은 추론 전에 확정했다. 모든 방법이 같은 추출·재검토 응답 64개를 사용한 결과는 표 2와 같다.</w:t>
+        <w:t>항목별 적용은 각 항목의 변경을 개별적으로 검증하여 한 항목의 오류가 다른 유효한 변경까지 취소하는 것을 방지한다. S에 대한 사후 분석에서 이를 유지·삭제 규칙과 결합한 결과, 정확한 턴 수는 32/32였다. 추가 효과의 검증에는 새로 구성한 T의 8개 대화 32턴을 사용하였다. T의 대화와 정답은 추론 전에 확정하였으며, S의 사후 분석에 사용한 코드를 수정 없이 적용하였다. 모든 비교 방법에 동일한 추출·재검토 응답 64개를 사용한 결과를 표 2에 제시하였다.</w:t>
       </w:r>
     </w:p>
     <w:p>
@@ -1761,7 +1761,7 @@
         <w:jc w:val="both"/>
       </w:pPr>
       <w:r>
-        <w:t>T에서도 유지·삭제 규칙은 정확한 턴과 최종 정답 대화를 각각 한 개 늘렸으며, 차이는 T7의 마지막 턴에서 발생했다. 항목별 적용을 추가한 결과는 유지·삭제 규칙만 사용한 결과와 같았다. 이에 따라 추가 처리 없이 유지·삭제 규칙을 사용하는 방법을 선택했다. S의 사후 재계산 결과와 새 대화 T의 검증 결과는 구분하며, 서로 다른 개발 단계에서 구성한 S와 T의 표본 수는 합산하지 않는다.</w:t>
+        <w:t>T에서도 유지·삭제 규칙은 정확한 턴 수와 최종 정답 대화 수를 각각 한 개 증가시켰으며, 차이는 T7의 마지막 턴에서 발생하였다. 항목별 적용을 추가한 결과는 유지·삭제 규칙만 사용한 결과와 같았다. 이에 따라 추가 처리 없이 유지·삭제 규칙을 사용하는 방법을 선택하였다. S의 사후 재계산 결과와 새 대화 T의 검증 결과는 구분하며, 서로 다른 개발 단계에서 구성한 S와 T의 표본 수는 합산하지 않는다.</w:t>
       </w:r>
     </w:p>
     <w:p>
@@ -1905,7 +1905,7 @@
         <w:jc w:val="both"/>
       </w:pPr>
       <w:r>
-        <w:t>1차 AI 목표 충족은 기준 350/384와 결합 358/384였다. JSON 파싱 실패는 고유 평가 입력 68개 중 3개였다. 판독하지 못한 응답을 다시 채점하지 않고 판단 불가로 집계했다.</w:t>
+        <w:t>1차 AI 목표 충족은 기준 350/384와 결합 358/384였다. JSON 파싱 실패는 고유 평가 입력 68개 중 3개였다. 판독하지 못한 응답을 다시 채점하지 않고 판단 불가로 집계하였다.</w:t>
       </w:r>
     </w:p>
     <w:p>
@@ -2347,7 +2347,7 @@
         <w:jc w:val="both"/>
       </w:pPr>
       <w:r>
-        <w:t>증가한 8개 성공 항목 중 6개는 판단 불가에서 성공으로 바뀌었고 실패에서 성공으로 바뀐 항목은 2개였다. R02 S3 3턴의 기준 평가가 JSON 대신 느낌표를 출력하여 6항목 모두 판단 불가가 된 영향이 크다. 또 같은 턴의 결합 출력에서는 소품이 없다는 설명과 ‘소품 없음’에 대한 실패 점수가 모순됐다. 따라서 증가분 전체를 실제 편집 오류의 해소로 해석하기 어렵다.</w:t>
+        <w:t>증가한 8개 성공 항목 중 6개는 판단 불가에서 성공으로 바뀌었고 실패에서 성공으로 바뀐 항목은 2개였다. R02 S3 3턴의 기준 평가가 JSON 대신 느낌표를 출력하여 6항목 모두 판단 불가가 된 영향이 크다. 또 같은 턴의 결합 출력에서는 소품이 없다는 설명과 ‘소품 없음’에 대한 실패 점수가 모순되었다. 따라서 증가분 전체를 실제 편집 오류의 해소로 해석하기 어렵다.</w:t>
       </w:r>
     </w:p>
     <w:p>
@@ -2355,7 +2355,7 @@
         <w:jc w:val="both"/>
       </w:pPr>
       <w:r>
-        <w:t>얼굴 코사인 유사도는 기준 평균 0.910458, 결합 평균 0.910535였다. 입력이 다른 네 쌍의 평균 차이는 +0.001237이지만 두 쌍은 증가하고 두 쌍은 감소했다. 나머지 60쌍은 같은 출력이므로 전체 평균 차이만으로 얼굴 보존의 개선 여부를 판단하기 어렵다.</w:t>
+        <w:t>얼굴 코사인 유사도는 기준 평균 0.910458, 결합 평균 0.910535였다. 입력이 다른 네 쌍의 평균 차이는 +0.001237이지만 두 쌍은 증가하고 두 쌍은 감소하였다. 나머지 60쌍은 같은 출력이므로 전체 평균 차이만으로 얼굴 보존의 개선 여부를 판단하기 어렵다.</w:t>
       </w:r>
     </w:p>
     <w:p>
@@ -2363,7 +2363,7 @@
         <w:jc w:val="left"/>
       </w:pPr>
       <w:r>
-        <w:t>1차 평가의 오류를 확인한 뒤, 평가 모델을 바꿔도 결과가 같은지 알아보기 위해 Qwen2.5-VL-7B-4bit로 전체 68개 이미지·목표 쌍을 다시 평가했다. 재평가 전에 대상과 설정을 확정했으며 목표 문구, 파서, 온도, 최대 토큰은 1차 평가와 같았다. 모델 버전은 fdcc572e8b05ba9daeaf71be8c9e4267c826ff9b이다. 3B와 7B 결과를 함께 보고한다. 같은 계열 모델을 사용한 사후 분석이므로 두 모델의 일치만으로 판정의 정확성을 확인할 수는 없다. 7B 평가에서 목표 충족 수는 기준 372/384, 결합 374/384였고 JSON 파싱 실패와 판단 불가는 없었다.</w:t>
+        <w:t>평가 모델에 따른 판정 차이를 분석하기 위해 Qwen2.5-VL-7B-4bit로 전체 68개 이미지·목표 쌍을 다시 평가하였다. 재평가 전에 대상과 설정을 확정하였으며 목표 문구, 파서, 온도, 최대 토큰은 1차 평가와 같았다. 모델 버전은 fdcc572e8b05ba9daeaf71be8c9e4267c826ff9b이다. 3B와 7B 결과를 함께 보고한다. 같은 계열 모델을 사용한 사후 분석이므로 두 모델의 일치만으로 판정의 정확성을 확인할 수는 없다. 7B 평가에서 목표 충족 수는 기준 372/384, 결합 374/384였고 JSON 파싱 실패와 판단 불가는 없었다.</w:t>
       </w:r>
     </w:p>
     <w:p>
@@ -3416,7 +3416,7 @@
         <w:jc w:val="both"/>
       </w:pPr>
       <w:r>
-        <w:t>7B 모델에서도 설명과 점수가 일치하지 않는 경우가 있었다. 두 인물의 3턴 기준 출력에 식물이 보인다고 설명한 뒤 식물이 없다고도 설명하면서 모두 성공으로 채점했다. R02 4턴에서도 같은 소품 설명 모순이 나타났다. 표에는 평가 모델이 반환한 점수를 그대로 집계했다. 따라서 JSON 형식 오류의 감소와 실제 편집 정확도의 향상을 구분해야 한다.</w:t>
+        <w:t>7B 모델에서도 설명과 점수가 일치하지 않는 경우가 있었다. 두 인물의 3턴 기준 출력에 식물이 보인다고 설명한 뒤 식물이 없다고도 설명하면서 모두 성공으로 채점하였다. R02 4턴에서도 같은 소품 설명 모순이 나타났다. 표에는 평가 모델이 반환한 점수를 그대로 집계하였다. 따라서 JSON 형식 오류의 감소와 실제 편집 정확도의 향상을 구분해야 한다.</w:t>
       </w:r>
     </w:p>
     <w:p>
@@ -3424,7 +3424,7 @@
         <w:jc w:val="both"/>
       </w:pPr>
       <w:r>
-        <w:t>앞선 개발 대화 P의 이미지 실험에서는 128조건에 대해 68개 이미지를 생성했다. 목표 충족 수는 기준 354/384, 유지 규칙 355/384였고 얼굴 코사인 평균은 각각 0.914851과 0.914108이었다. 입력이 다른 네 쌍 중 R01-P2-2의 소품 판정 하나만 판단 불가에서 성공으로 바뀌었다. 실패에서 성공으로 바뀐 항목은 없었으며 JSON 파싱 실패 4개와 설명·점수 불일치가 있었다.</w:t>
+        <w:t>앞선 개발 대화 P의 이미지 실험에서는 128조건에 대해 68개 이미지를 생성하였다. 목표 충족 수는 기준 354/384, 유지 규칙 355/384였고 얼굴 코사인 평균은 각각 0.914851과 0.914108이었다. 입력이 다른 네 쌍 중 R01-P2-2의 소품 판정 하나만 판단 불가에서 성공으로 바뀌었다. 실패에서 성공으로 바뀐 항목은 없었으며 JSON 파싱 실패 4개와 설명·점수 불일치가 있었다.</w:t>
       </w:r>
     </w:p>
     <w:p>
@@ -3440,7 +3440,7 @@
         <w:jc w:val="both"/>
       </w:pPr>
       <w:r>
-        <w:t>Q에서는 keep을 폭넓게 탐지하는 규칙이 삭제나 값 변경 요청을 유지로 잘못 처리했다. 적용 문형을 좁히자 이 오류는 줄었지만 삭제 누락은 남았다. S3에서는 유지 규칙이 불필요한 배경 변경을, 삭제 규칙이 식물 삭제 누락을 막았다. 두 규칙은 서로 다른 오류를 처리했다.</w:t>
+        <w:t>유지와 삭제는 서로 다른 상태 갱신 동작을 요구한다. 유지 규칙은 직전 값을 보존하므로, 이전 턴에 남은 삭제 대상까지 제거하지는 않는다. 반대로 삭제 규칙은 명시된 대상을 제거하지만 다른 항목의 불필요한 변경을 방지하지는 않는다. S3에서 두 규칙을 결합한 경우에만 식물 삭제와 배경 유지가 모두 정확했던 결과는 이러한 차이에 따른 것이다. Q에서 keep을 폭넓게 탐지한 규칙이 삭제·변경 요청을 유지로 오인한 결과 역시 동작을 구분하는 적용 조건의 중요성을 보여준다.</w:t>
       </w:r>
     </w:p>
     <w:p>
@@ -3448,7 +3448,7 @@
         <w:jc w:val="both"/>
       </w:pPr>
       <w:r>
-        <w:t>S와 T는 각각 정해진 영어 문형으로 구성한 합성 대화 8개이며 개선은 S3와 T7에 집중됐다. 변경 사항 추출에는 한 종류의 4B 모델을 사용했고, 매 턴 현재 요청만 입력했다.</w:t>
+        <w:t>S와 T는 각각 정해진 영어 문형으로 구성한 합성 대화 8개이며 개선은 S3와 T7에 집중되었다. 변경 사항 추출에는 한 종류의 4B 모델을 사용하였고, 매 턴 현재 요청만 입력하였다.</w:t>
       </w:r>
     </w:p>
     <w:p>
@@ -3456,7 +3456,7 @@
         <w:jc w:val="both"/>
       </w:pPr>
       <w:r>
-        <w:t>이미지 실험은 인물 2명과 생성 도구 하나를 사용했고, 비교 64쌍 중 60쌍이 같은 출력을 공유했다. 두 AI 평가 모두 설명과 점수의 불일치가 있어 점수 증가를 전반적인 이미지 품질 향상으로 해석하기 어렵다. 얼굴 특징 벡터의 코사인 유사도는 입력이 다른 네 쌍 중 두 쌍에서 상승하고 두 쌍에서 하락했다.</w:t>
+        <w:t>이미지 실험은 인물 2명과 생성 도구 하나를 사용하였고, 비교 64쌍 중 60쌍이 같은 출력을 공유하였다. 두 AI 평가 모두 설명과 점수의 불일치가 있어 점수 증가를 전반적인 이미지 품질 향상으로 해석하기 어렵다. 얼굴 특징 벡터의 코사인 유사도는 입력이 다른 네 쌍 중 두 쌍에서 상승하고 두 쌍에서 하락하였다.</w:t>
       </w:r>
     </w:p>
     <w:p>
@@ -3472,7 +3472,7 @@
         <w:jc w:val="both"/>
       </w:pPr>
       <w:r>
-        <w:t>정해진 영어 문형의 합성 대화에서 언어 모델의 추출·재검토 뒤에 유지·삭제 규칙을 적용해 추가 모델 호출 없이 편집 상태의 오류를 줄였다. S에서는 삭제 누락과 불필요한 배경 변경을 함께 막았고, T에서는 정확한 턴과 최종 정답 대화가 각각 한 개 늘었다. 항목별 적용을 더해도 결과가 같아 유지·삭제 규칙만 사용하는 방법을 선택했다.</w:t>
+        <w:t>본 연구에서는 언어 모델의 추출·재검토 결과에 명시적 유지·삭제 제약을 적용하는 상태 갱신 방법을 제안하였다. 정해진 영어 문형의 합성 대화 S에서 유지 규칙은 불필요한 배경 변경을, 삭제 규칙은 식물 삭제 누락을 방지하였다. 두 규칙의 결합으로 정확한 턴 수는 27/32에서 29/32로 증가하였다. 추가 검증 대화 T에서도 정확한 턴 수는 28/32에서 29/32로 증가하였으며, 항목별 적용을 결합한 경우와 동일한 결과를 보였다. 제안 방법은 추가 모델 호출 없이 유지 오류와 삭제 누락을 감소시켰다.</w:t>
       </w:r>
     </w:p>
     <w:p>

</xml_diff>

<commit_message>
Clarify model names and remove implementation clutter from paper
</commit_message>
<xml_diff>
--- a/paper/manuscript.inha.docx
+++ b/paper/manuscript.inha.docx
@@ -65,7 +65,7 @@
         <w:t xml:space="preserve">요약: </w:t>
       </w:r>
       <w:r>
-        <w:t>반복 이미지 편집에서는 변경할 내용과 유지하거나 삭제할 내용을 다음 프롬프트에 정확히 반영해야 한다. 본 연구는 언어 모델이 변경 사항을 추출하고 재검토한 뒤, 명시적인 유지·삭제 지시를 확인하는 후처리 규칙을 제안한다. 유지 규칙은 해당 항목의 이전 값을 보존하고 삭제 규칙은 값을 없음으로 설정한다. 적용 조건에 맞는 구절과 항목만 처리하고 근거 구절을 기록한다. 개발 후 별도로 구성하고 추론 전에 확정한 S 대화 8개 32턴에서 동일한 모델 응답에 네 방법을 적용하였다. 여섯 항목이 모두 정확한 턴은 기준 방법 27, 유지 규칙만 27, 삭제 규칙만 28, 두 규칙 결합 29였다. 결합 시 마지막 상태가 정확한 대화는 6개에서 7개로 증가하였고, 유지해야 할 항목을 잘못 변경한 횟수는 1건에서 0건으로 감소하였다. 개선은 한 대화의 두 턴에서 나타났다. 추가 검증 T의 대화 8개 32턴에서도 정확한 턴이 28/32에서 29/32로 증가하였으나, 변경을 항목별로 적용하는 처리를 더해도 결과는 같았다. 실제 인물 사진 2명의 이미지 평가에서 목표 충족 수는 3B 모델 기준 350/384에서 358/384로, 사후 7B 평가에서는 372/384에서 374/384로 증가하였다. 다만 판단 불가 감소와 설명·점수 불일치가 포함되어 이미지 품질의 향상 여부는 판단하기 어렵다. 유지·삭제 규칙의 효과를 해당 영어 문형과 합성 대화 범위에서 확인하였다.</w:t>
+        <w:t>반복 이미지 편집에서는 변경할 내용과 유지하거나 삭제할 내용을 다음 프롬프트에 정확히 반영해야 한다. 본 연구는 언어 모델이 변경 사항을 추출하고 재검토한 뒤, 명시적인 유지·삭제 지시를 확인하는 후처리 규칙을 제안한다. 유지 규칙은 해당 항목의 이전 값을 보존하고 삭제 규칙은 값을 없음으로 설정한다. 개발 자료와 별도로 구성한 검증 대화 S의 8개 대화 32턴에서 동일한 모델 응답에 네 방법을 적용하였다. 여섯 항목이 모두 정확한 턴은 기준 방법 27, 유지 규칙만 27, 삭제 규칙만 28, 두 규칙 결합 29였다. 결합 시 마지막 상태가 정확한 대화는 6개에서 7개로 증가하였고, 유지해야 할 항목을 잘못 변경한 횟수는 1건에서 0건으로 감소하였다. 개선은 한 대화의 두 턴에서 나타났다. 추가 검증 T의 대화 8개 32턴에서도 정확한 턴이 28/32에서 29/32로 증가하였으나, 변경을 항목별로 적용하는 처리를 더해도 결과는 같았다. 실제 인물 사진 2명의 이미지 평가에서 목표 충족 수는 Qwen2.5-VL-3B 기준 350/384에서 358/384로, 사후 Qwen2.5-VL-7B 평가에서는 372/384에서 374/384로 증가하였다. 다만 판단 불가 감소와 설명·점수 불일치가 포함되어 이미지 품질의 향상 여부는 판단하기 어렵다. 유지·삭제 규칙의 효과를 해당 영어 문형과 합성 대화 범위에서 확인하였다.</w:t>
       </w:r>
     </w:p>
     <w:p>
@@ -121,7 +121,7 @@
         <w:jc w:val="both"/>
       </w:pPr>
       <w:r>
-        <w:t>반복 인물 이미지 편집에서는 속성의 추가·변경·유지·삭제와 원본 복원 요청을 편집 상태에 반영해야 한다. 예를 들어 배경은 그대로 두고 목걸이를 지우라는 요청을 전체 장면의 새 설명으로 바꾸면, 목걸이 삭제를 놓치거나 변경 대상이 아닌 배경까지 원본으로 되돌릴 수 있다. 원본 사진을 다시 참조하는 정책은 누적된 얼굴 변화를 줄이는 데 도움이 될 수 있지만, 잘못 정리한 목표까지 바로잡지는 않는다. 따라서 이미지 생성에 앞서 현재 요구 상태가 올바르게 갱신됐는지 확인해야 한다.</w:t>
+        <w:t>반복 인물 이미지 편집에서는 속성의 추가·변경·유지·삭제와 원본 복원 요청을 편집 상태에 반영해야 한다. 예를 들어 배경은 그대로 두고 목걸이를 지우라는 요청을 전체 장면의 새 설명으로 바꾸면, 목걸이 삭제를 놓치거나 변경 대상이 아닌 배경까지 원본으로 되돌릴 수 있다. 원본 사진을 매번 편집 입력으로 사용하는 방식은 누적된 얼굴 변화를 줄이는 데 도움이 될 수 있지만, 편집 요청을 잘못 해석한 오류까지 바로잡지는 않는다. 따라서 이미지 생성에 앞서 편집 상태가 현재 요청을 정확히 반영하는지 확인해야 한다.</w:t>
       </w:r>
     </w:p>
     <w:p>
@@ -177,7 +177,7 @@
         <w:jc w:val="both"/>
       </w:pPr>
       <w:r>
-        <w:t>현재 요구를 재킷, 상의, 핀, 목걸이, 배경, 소품의 여섯 항목으로 저장한다. 항목별로 허용된 속성 값과 원본을 사용하며 제거 가능한 재킷·핀·목걸이·소품에는 없음도 허용한다. 없음은 해당 대상을 제거하라는 요구이고 원본은 최초 사진의 상태를 복원하라는 요구이므로 서로 구별한다. 최초 상태는 모든 항목이 원본이다.</w:t>
+        <w:t>편집 상태는 재킷, 상의, 핀, 목걸이, 배경, 소품의 여섯 항목으로 구성한다. 각 항목에는 지정된 속성 값 또는 ‘원본’을 저장한다. 제거 가능한 재킷·핀·목걸이·소품에는 ‘없음’도 사용할 수 있다. ‘원본’은 최초 사진의 상태로 복원하는 동작이며, ‘없음’은 대상을 제거하는 동작이다. 초기에는 모든 항목을 ‘원본’으로 설정한다.</w:t>
       </w:r>
     </w:p>
     <w:p>
@@ -185,7 +185,7 @@
         <w:jc w:val="both"/>
       </w:pPr>
       <w:r>
-        <w:t>각 턴에서 Qwen3-4B-4bit[4]가 현재 요청의 변경 사항을 JSON으로 추출한 뒤, 요청과 첫 응답을 입력받아 재검토한다. 추출기에는 현재 요청만 제공하며, 전체 대화와 방법별 이전 상태, 정답 상태는 입력하지 않는다. 이에 따라 모든 비교 방법에 동일한 두 모델 응답을 사용할 수 있다. 각 방법은 이후 코드 단계에서 자신의 이전 상태에 변경 사항을 적용하고 검증한다.</w:t>
+        <w:t>각 턴에서 Qwen3-4B-4bit[4]가 현재 요청의 변경 사항을 JSON으로 추출한 뒤, 요청과 첫 응답을 입력받아 재검토한다. 추출기에는 현재 요청만 제공하며, 전체 대화와 방법별 이전 상태, 정답 상태는 입력하지 않는다. 이에 따라 모든 비교 방법에 동일한 두 모델 응답을 사용할 수 있다. 각 방법은 이 응답을 자신의 이전 편집 상태에 적용하고 검증한다.</w:t>
       </w:r>
     </w:p>
     <w:p>
@@ -193,7 +193,7 @@
         <w:jc w:val="both"/>
       </w:pPr>
       <w:r>
-        <w:t>공통 코드는 허용 값 검사, 현재 값과 같은 변경의 생략, 명시적인 원본 복원을 처리한다. 그 다음 제안한 유지·삭제 제약을 적용한다. 정답은 모든 응답 저장 후 별도 채점에서만 사용한다. 완성된 상태는 동일한 문장 변환 함수를 거쳐 원본 사진에 대한 편집 프롬프트가 된다.</w:t>
+        <w:t>모든 방법은 허용된 값인지 검사하고, 현재 상태와 같은 변경을 생략하며, 명시적인 원본 복원 요청을 처리한다. 제안 방법은 여기에 유지·삭제 제약을 적용한다. 정답은 평가에만 사용한다. 갱신한 상태는 공통 변환 함수로 편집 프롬프트를 작성하여 원본 사진과 함께 입력한다.</w:t>
       </w:r>
     </w:p>
     <w:p>
@@ -262,10 +262,10 @@
     </w:p>
     <w:p>
       <w:pPr>
-        <w:jc w:val="left"/>
+        <w:jc w:val="both"/>
       </w:pPr>
       <w:r>
-        <w:t>텍스트 모델 버전은 4dcb3d101c2a062e5c1d4bb173588c54ea6c4d25이며 온도 0, 최대 260토큰, 공통 예시 7개를 사용하였다. 32턴에 두 번씩 총 64회 호출하였다. 기준 방법, 유지 규칙만 적용, 삭제 규칙만 적용, 두 규칙 결합을 비교한다. 결합 방식의 채택 조건은 추론 전에 설정하였다. 기준보다 정확한 턴이 늘고, 마지막 상태가 정확한 대화가 줄지 않으며, 유지할 항목을 잘못 변경한 횟수가 늘지 않아야 한다. 두 단독 규칙보다 정확한 턴이 많을 때 결합의 추가 효과가 있는 것으로 판단한다.</w:t>
+        <w:t>변경 사항 추출에는 Qwen3-4B의 4비트 양자화 모델을 사용하였다. 생성 온도는 0, 최대 출력 길이는 260토큰으로 설정하고 공통 예시 7개를 제공하였다. 32턴에 두 번씩 총 64회 호출하였다. 기준 방법, 유지 규칙만 적용, 삭제 규칙만 적용, 두 규칙 결합을 비교한다. 결합 방식의 채택 조건은 추론 전에 설정하였다. 기준보다 정확한 턴이 늘고, 마지막 상태가 정확한 대화가 줄지 않으며, 유지할 항목을 잘못 변경한 횟수가 늘지 않아야 한다. 두 단독 규칙보다 정확한 턴이 많을 때 결합의 추가 효과가 있는 것으로 판단한다.</w:t>
       </w:r>
     </w:p>
     <w:p>
@@ -286,10 +286,10 @@
     </w:p>
     <w:p>
       <w:pPr>
-        <w:jc w:val="left"/>
+        <w:jc w:val="both"/>
       </w:pPr>
       <w:r>
-        <w:t>이미지 실험은 S의 32턴, 실제 인물 사진 2명, 두 방법을 조합한 128조건이다. 원본 파일과 프롬프트가 같으면 한 번 생성한 이미지를 함께 사용해 총 66개 이미지를 생성하였다. 방법 간 비교 64쌍 중 입력이 다른 경우는 두 턴과 두 인물을 조합한 4쌍이며, 나머지 60쌍은 같은 이미지를 사용한다. 내장 이미지 생성 도구의 첫 성공 출력을 사용하였다. 이 도구는 내부 모델 버전과 시드를 공개하지 않아 동일 시드로 통제할 수 없었다. Qwen2.5-VL-3B-4bit[5]가 이미지와 목표를 받아 여섯 항목을 성공·실패·판단 불가로 평가하였다. 평가 모델 버전은 46d4cf06a06ffc1a766c214174f9cbed2f45bcab이다. 평가 시 방법명과 생성 프롬프트는 제공하지 않았다. 얼굴 유사도는 InsightFace buffalo_l[6]의 코사인 유사도로 측정하였다.</w:t>
+        <w:t>이미지 실험은 S의 32턴, 실제 인물 사진 2명, 두 방법을 조합한 128조건이다. 원본 파일과 프롬프트가 같으면 한 번 생성한 이미지를 함께 사용해 총 66개 이미지를 생성하였다. 방법 간 비교 64쌍 중 입력이 다른 경우는 두 턴과 두 인물을 조합한 4쌍이며, 나머지 60쌍은 같은 이미지를 사용한다. 내장 이미지 생성 도구의 첫 성공 출력을 사용하였다. 이 도구는 내부 모델 버전과 시드를 공개하지 않아 동일 시드로 통제할 수 없었다. 이미지 평가는 Qwen2.5-VL-3B의 4비트 양자화 모델[5]을 사용하였다. 이미지와 목표 상태를 입력하여 여섯 항목을 성공·실패·판단 불가로 판정하였다. 평가 시 방법명과 생성 프롬프트는 제공하지 않았다. 얼굴 유사도는 InsightFace buffalo_l[6]의 코사인 유사도로 측정하였다.</w:t>
       </w:r>
     </w:p>
     <w:p>
@@ -297,7 +297,7 @@
         <w:jc w:val="both"/>
       </w:pPr>
       <w:r>
-        <w:t>원본 사진은 Monstera Production의 Pexels 사진 6311573과 6311581이다[7,8]. 각각 512×336, 512×768 크기의 기존 실험 입력을 재사용하였다. 그림의 의상·장신구·배경은 AI 편집 결과이며 사진 속 인물의 실제 행동이나 연구 참여를 나타내지 않는다.</w:t>
+        <w:t>원본 사진은 Pexels에 공개된 Monstera Production의 인물 사진 2장이다[7,8]. 두 인물을 각각 R01, R02로 구분하고, 512×336, 512×768 크기로 입력하였다. 그림의 의상·장신구·배경은 AI 편집 결과이며 사진 속 인물의 실제 행동이나 연구 참여를 나타내지 않는다.</w:t>
       </w:r>
     </w:p>
     <w:p>
@@ -313,7 +313,7 @@
         <w:jc w:val="both"/>
       </w:pPr>
       <w:r>
-        <w:t>S와 T의 요청, 정답, 모델 응답, 코드 해시를 저장하였다. 이미지별로 입력 사진, 프롬프트, 첫 성공 출력, 평가 원문을 연결하였다. 코드와 원자료는 연구 저장소의 request-contract-v3, isolated-contract-v1, contract-image-v3 폴더에 있다[9]. 개발 중 재계산한 결과는 별도 파일에 기록하였다.</w:t>
+        <w:t>실험 코드와 대화, 정답, 모델 응답, 생성 이미지 및 평가 원문은 연구 저장소에 공개하였다[9]. 정확한 모델 버전과 실행 설정은 실험별 기록에 포함하였으며, 개발 중 재계산한 결과와 검증 결과를 구분하였다.</w:t>
       </w:r>
     </w:p>
     <w:p>
@@ -1041,7 +1041,7 @@
         <w:jc w:val="both"/>
       </w:pPr>
       <w:r>
-        <w:t>S3의 3턴에서는 식물을 삭제하고 재킷은 유지하도록 요청하였다. 기준 방법과 유지 규칙만 적용한 방법은 식물을 남겼고, 삭제 규칙은 식물의 값을 없음으로 바꾸었다. 이어진 4턴에서는 상의와 목걸이를 원본으로 돌리되 재킷과 연한 파란색 배경은 그대로 두도록 요청하였다. 기준 방법과 삭제 규칙만 적용한 방법은 배경도 원본으로 바꾸었다. 유지 규칙은 배경을 보존하였지만 이전 턴에서 남긴 식물까지 삭제하지는 못했다. 두 규칙을 결합했을 때만 두 턴 모두 정확했다.</w:t>
+        <w:t>S3의 3턴에서는 식물을 삭제하고 재킷은 유지하도록 요청하였다. 기준 방법과 유지 규칙만 적용한 방법은 식물을 남겼고, 삭제 규칙은 식물의 값을 없음으로 바꾸었다. 이어진 4턴에서는 상의와 목걸이를 원본으로 돌리되 재킷과 연한 파란색 배경은 그대로 두도록 요청하였다. 기준 방법과 삭제 규칙만 적용한 방법은 배경도 원본으로 바꾸었다. 유지 규칙은 배경을 보존하였지만 이전 턴에서 남긴 식물까지 삭제하지는 못했다.</w:t>
       </w:r>
     </w:p>
     <w:p>
@@ -1049,7 +1049,7 @@
         <w:jc w:val="both"/>
       </w:pPr>
       <w:r>
-        <w:t>이 사례에서 삭제 규칙은 3턴의 식물 삭제 누락을 방지하고, 유지 규칙은 4턴의 배경 상태를 보존하였다. 두 오류가 서로 다른 항목과 턴에서 발생하므로, 두 규칙을 결합한 경우에만 두 턴의 여섯 항목이 모두 정답과 일치하였다.</w:t>
+        <w:t>삭제 규칙은 식물 삭제 누락을, 유지 규칙은 배경 변경 오류를 각각 방지하였다. 두 규칙을 결합한 경우에만 두 턴의 여섯 항목이 모두 정답과 일치하였다.</w:t>
       </w:r>
     </w:p>
     <w:p>
@@ -1905,7 +1905,7 @@
         <w:jc w:val="both"/>
       </w:pPr>
       <w:r>
-        <w:t>1차 AI 목표 충족은 기준 350/384와 결합 358/384였다. JSON 파싱 실패는 고유 평가 입력 68개 중 3개였다. 판독하지 못한 응답을 다시 채점하지 않고 판단 불가로 집계하였다.</w:t>
+        <w:t>3B 평가 모델이 목표를 충족한 것으로 판정한 항목 수는 기준 방법 350/384, 결합 방법 358/384였다. 서로 다른 이미지·목표 조합 68개 중 3개에서는 응답 형식 오류로 평가 결과를 읽을 수 없었다. 판독하지 못한 응답을 다시 채점하지 않고 판단 불가로 집계하였다.</w:t>
       </w:r>
     </w:p>
     <w:p>
@@ -2360,10 +2360,10 @@
     </w:p>
     <w:p>
       <w:pPr>
-        <w:jc w:val="left"/>
+        <w:jc w:val="both"/>
       </w:pPr>
       <w:r>
-        <w:t>평가 모델에 따른 판정 차이를 분석하기 위해 Qwen2.5-VL-7B-4bit로 전체 68개 이미지·목표 쌍을 다시 평가하였다. 재평가 전에 대상과 설정을 확정하였으며 목표 문구, 파서, 온도, 최대 토큰은 1차 평가와 같았다. 모델 버전은 fdcc572e8b05ba9daeaf71be8c9e4267c826ff9b이다. 3B와 7B 결과를 함께 보고한다. 같은 계열 모델을 사용한 사후 분석이므로 두 모델의 일치만으로 판정의 정확성을 확인할 수는 없다. 7B 평가에서 목표 충족 수는 기준 372/384, 결합 374/384였고 JSON 파싱 실패와 판단 불가는 없었다.</w:t>
+        <w:t>평가 모델에 따른 판정 차이를 분석하기 위해 Qwen2.5-VL-7B의 4비트 양자화 모델로 전체 68개 이미지·목표 쌍을 다시 평가하였다. 재평가 전에 대상과 설정을 확정하였으며 목표 문구, 파서, 온도, 최대 토큰은 1차 평가와 같았다. 같은 계열 모델을 사용한 사후 분석이므로 두 모델의 일치만으로 판정의 정확성을 확인할 수는 없다. 7B 평가에서 목표 충족 수는 기준 372/384, 결합 374/384였고 JSON 파싱 실패와 판단 불가는 없었다.</w:t>
       </w:r>
     </w:p>
     <w:p>
@@ -3408,7 +3408,7 @@
         <w:jc w:val="both"/>
       </w:pPr>
       <w:r>
-        <w:t>7B에서 실패에서 성공으로 바뀐 두 항목은 R01 4턴의 소품과 R02 4턴의 배경이다. 3B의 두 항목은 R02 4턴의 소품과 배경으로, 두 평가가 공통으로 실패→성공으로 판정한 것은 R02의 배경 한 항목이다. 고유 평가 입력의 점수 일치는 판단 불가 포함 367/408, 두 모델 모두 판정 가능한 항목에서는 367/387이었다.</w:t>
+        <w:t>7B에서 실패에서 성공으로 바뀐 두 항목은 R01 4턴의 소품과 R02 4턴의 배경이다. 3B의 두 항목은 R02 4턴의 소품과 배경으로, 두 평가에서 모두 실패에서 성공으로 바뀐 항목은 R02의 배경 한 항목이다. 두 평가 모델의 판정이 일치한 항목 수는 판단 불가를 포함하면 367/408, 두 모델 모두 판정한 항목만 비교하면 367/387이었다.</w:t>
       </w:r>
     </w:p>
     <w:p>
@@ -3424,7 +3424,7 @@
         <w:jc w:val="both"/>
       </w:pPr>
       <w:r>
-        <w:t>앞선 개발 대화 P의 이미지 실험에서는 128조건에 대해 68개 이미지를 생성하였다. 목표 충족 수는 기준 354/384, 유지 규칙 355/384였고 얼굴 코사인 평균은 각각 0.914851과 0.914108이었다. 입력이 다른 네 쌍 중 R01-P2-2의 소품 판정 하나만 판단 불가에서 성공으로 바뀌었다. 실패에서 성공으로 바뀐 항목은 없었으며 JSON 파싱 실패 4개와 설명·점수 불일치가 있었다.</w:t>
+        <w:t>앞선 개발 대화 P의 이미지 실험에서는 128조건에 대해 68개 이미지를 생성하였다. 목표 충족 수는 기준 354/384, 유지 규칙 355/384였고 얼굴 코사인 평균은 각각 0.914851과 0.914108이었다. 입력이 다른 네 쌍 중 인물 R01의 개발 대화 P2 두 번째 턴에서 소품 판정 하나만 판단 불가에서 성공으로 바뀌었다. 실패에서 성공으로 바뀐 항목은 없었으며 JSON 파싱 실패 4개와 설명·점수 불일치가 있었다.</w:t>
       </w:r>
     </w:p>
     <w:p>
@@ -3440,7 +3440,7 @@
         <w:jc w:val="both"/>
       </w:pPr>
       <w:r>
-        <w:t>유지와 삭제는 서로 다른 상태 갱신 동작을 요구한다. 유지 규칙은 직전 값을 보존하므로, 이전 턴에 남은 삭제 대상까지 제거하지는 않는다. 반대로 삭제 규칙은 명시된 대상을 제거하지만 다른 항목의 불필요한 변경을 방지하지는 않는다. S3에서 두 규칙을 결합한 경우에만 식물 삭제와 배경 유지가 모두 정확했던 결과는 이러한 차이에 따른 것이다. Q에서 keep을 폭넓게 탐지한 규칙이 삭제·변경 요청을 유지로 오인한 결과 역시 동작을 구분하는 적용 조건의 중요성을 보여준다.</w:t>
+        <w:t>유지와 삭제는 서로 다른 상태 갱신 동작을 요구한다. 유지 규칙은 직전 값을 보존하므로, 이전 턴에 남은 삭제 대상까지 제거하지는 않는다. 반대로 삭제 규칙은 명시된 대상을 제거하지만 다른 항목의 불필요한 변경을 방지하지는 않는다. S3에서 두 규칙을 결합한 경우에만 식물 삭제와 배경 유지가 모두 정확했던 결과는 이러한 차이에 따른 것이다. Q에서는 keep만으로 유지 여부를 판단하여 삭제·변경 요청을 오인하였다. 이에 따라 제안 규칙은 항목 이름과 명시적 유지·삭제 표현이 함께 있는 구절에 적용한다.</w:t>
       </w:r>
     </w:p>
     <w:p>

</xml_diff>

<commit_message>
Add compound portrait request experiments and align thesis and slides
</commit_message>
<xml_diff>
--- a/paper/manuscript.inha.docx
+++ b/paper/manuscript.inha.docx
@@ -65,7 +65,7 @@
         <w:t xml:space="preserve">요약: </w:t>
       </w:r>
       <w:r>
-        <w:t>반복 이미지 편집에서는 변경할 내용과 유지하거나 삭제할 내용을 다음 프롬프트에 정확히 반영해야 한다. 본 연구는 언어 모델이 변경 사항을 추출하고 재검토한 뒤, 명시적인 유지·삭제 지시를 확인하는 후처리 규칙을 제안한다. 유지 규칙은 해당 항목의 이전 값을 보존하고 삭제 규칙은 값을 없음으로 설정한다. 개발 자료와 별도로 구성한 검증 대화 S의 8개 대화 32턴에서 동일한 모델 응답에 네 방법을 적용하였다. 여섯 항목이 모두 정확한 턴은 기준 방법 27, 유지 규칙만 27, 삭제 규칙만 28, 두 규칙 결합 29였다. 결합 시 마지막 상태가 정확한 대화는 6개에서 7개로 증가하였고, 유지해야 할 항목을 잘못 변경한 횟수는 1건에서 0건으로 감소하였다. 개선은 한 대화의 두 턴에서 나타났다. 추가 검증 T의 대화 8개 32턴에서도 정확한 턴이 28/32에서 29/32로 증가하였으나, 변경을 항목별로 적용하는 처리를 더해도 결과는 같았다. 실제 인물 사진 2명의 이미지 평가에서 목표 충족 수는 Qwen2.5-VL-3B 기준 350/384에서 358/384로, 사후 Qwen2.5-VL-7B 평가에서는 372/384에서 374/384로 증가하였다. 다만 판단 불가 감소와 설명·점수 불일치가 포함되어 이미지 품질의 향상 여부는 판단하기 어렵다. 유지·삭제 규칙의 효과를 해당 영어 문형과 합성 대화 범위에서 확인하였다.</w:t>
+        <w:t>반복 이미지 편집에서는 변경할 내용과 유지하거나 삭제할 내용을 다음 프롬프트에 정확히 반영해야 한다. 본 연구는 언어 모델이 변경 사항을 추출하고 재검토한 뒤 명시적인 유지·삭제 지시를 확인하는 후처리 규칙을 제안한다. 유지 규칙은 이전 값을 보존하고 삭제 규칙은 값을 없음으로 설정한다. 검증 대화 S의 8개 대화 32턴에서 동일한 모델 응답에 네 방법을 적용하였다. 여섯 항목이 모두 정확한 턴은 기준 방법 27, 유지 규칙만 27, 삭제 규칙만 28, 두 규칙 결합 29였다. 추가 검증 T의 8개 대화 32턴에서도 정확한 턴이 28/32에서 29/32로 증가하였다. 포즈·표정을 포함한 별도 확장 실험 C의 12개 대화 48턴에서는 속성 지시를 혼합한 조건의 정확한 턴이 재검토 4/16에서 규칙 보정 16/16으로 증가하였다. C의 개선은 삭제를 원본 복원으로 잘못 해석한 오류를 삭제 규칙이 바로잡은 결과였다. 실제 인물 사진 2명의 이미지 평가는 모델의 설명·점수 불일치가 있어 이미지 품질 향상의 근거로 삼지 않았다. 정해진 영어 문형의 합성 대화에서 추가 모델 호출 없이 상태 갱신 오류를 감소시켰다.</w:t>
       </w:r>
     </w:p>
     <w:p>
@@ -79,7 +79,7 @@
         <w:t xml:space="preserve">Abstract: </w:t>
       </w:r>
       <w:r>
-        <w:t>Iterative portrait editing requires prompts to reflect requested changes while preserving or removing specified attributes. We implement preservation and removal rules after a language model extracts and reviews the requested changes. The rules process supported expressions and record the text that triggered each rule. We compare four methods using the same model responses on set S, eight synthetic English dialogues comprising 32 turns, finalized before inference. All six attributes were correct in 27/32 turns for the baseline, 27/32 for preservation alone, 28/32 for removal alone, and 29/32 for their combination. Correct final dialogue states increased from 6/8 to 7/8. The combination also reduced erroneous changes to previously correct attributes that should remain unchanged from one to zero. All gains occurred in two turns of one dialogue. On a further set T of eight dialogues and 32 turns, correct turns increased from 28/32 to 29/32 and correct final states from 7/8 to 8/8. Applying changes separately by attribute added no further gain. An image study with two portrait references produced 66 unique outputs for 128 conditions. The 3B evaluator scored 350/384 for the baseline and 358/384 for the combination, with six of the eight additional successes coming from previously unknown judgments. A post-hoc 7B evaluation scored 372/384 and 374/384. Both evaluators produced inconsistencies between explanations and scores, which limit conclusions about image quality. The rules reduced state errors in the tested English expressions and synthetic dialogues without additional model calls.</w:t>
+        <w:t>Iterative portrait editing requires prompts to reflect requested changes while preserving or removing specified attributes. We apply explicit preservation and removal rules after a language model extracts and reviews the requested changes. Preservation retains the previous value, whereas removal sets an attribute to absent. On set S, eight synthetic English dialogues with 32 turns, all six attributes were correct in 27/32 turns for the baseline, 27/32 for preservation alone, 28/32 for removal alone, and 29/32 for their combination. On a further set T of eight dialogues and 32 turns, correct turns increased from 28/32 to 29/32. A separate extension C comprised 12 dialogues and 48 turns involving expressions and poses. For the condition combining these requests with attribute changes, preservation, removal, and restoration, correct turns increased from 4/16 after model review to 16/16 after rule correction. In C, removal rules corrected confusion between removing an object and restoring its original state. An image study using two portrait references revealed inconsistencies between evaluator explanations and scores; these scores were not treated as evidence of improved image quality. The rules reduced state-update errors without additional model calls within the tested English patterns and synthetic dialogues.</w:t>
       </w:r>
     </w:p>
     <w:p>
@@ -130,6 +130,14 @@
       </w:pPr>
       <w:r>
         <w:t>본 연구에서는 언어 모델이 추출하고 재검토한 변경 사항에 명시적 유지·삭제 제약을 적용하는 상태 갱신 방법을 제안한다. 유지 지시가 있는 항목은 직전 값을 보존하고, 삭제 지시가 있는 항목은 없음으로 설정한다. 동일한 모델 응답에 각 규칙을 단독 또는 결합하여 적용함으로써 유지 오류와 삭제 누락에 대한 각 규칙의 효과를 분석한다.</w:t>
+      </w:r>
+    </w:p>
+    <w:p>
+      <w:pPr>
+        <w:jc w:val="both"/>
+      </w:pPr>
+      <w:r>
+        <w:t>분석 대상은 이미지의 화질보다 생성 전에 작성되는 편집 상태이다. 상태의 정답은 요청에 명시한 변경을 누적하여 계산할 수 있으므로 이미지 평가 모델의 판단과 분리하여 검사한다. 본 연구의 기여는 유지와 삭제를 구분한 후처리의 구현, 동일 응답을 이용한 구성요소 비교, 포즈·표정을 포함하는 복합 요청에서의 오류 분석이다.</w:t>
       </w:r>
     </w:p>
     <w:p>
@@ -230,6 +238,30 @@
     </w:p>
     <w:p>
       <w:pPr>
+        <w:pStyle w:val="Heading2"/>
+      </w:pPr>
+      <w:r>
+        <w:t>3. 상태 갱신 절차</w:t>
+      </w:r>
+    </w:p>
+    <w:p>
+      <w:pPr>
+        <w:jc w:val="both"/>
+      </w:pPr>
+      <w:r>
+        <w:t>각 턴에서는 먼저 직전 상태를 복사하고 추출·재검토 응답에서 유효한 변경 사항을 선택한다. 이를 복사한 상태에 적용한 다음, 현재 요청에서 지원 문형에 해당하는 구절을 찾는다. 명시적인 유지 구절의 항목은 직전 값으로 되돌리고, 삭제 구절의 항목은 ‘없음’으로 설정한다. 따라서 유지 규칙이 참조하는 값은 모델 응답을 적용하기 전의 상태이다. 이 순서를 지키지 않으면 잘못 변경된 값을 다시 보존하게 된다. 최종 상태와 함께 적용 항목, 동작 및 근거 구절을 저장한다.</w:t>
+      </w:r>
+    </w:p>
+    <w:p>
+      <w:pPr>
+        <w:jc w:val="both"/>
+      </w:pPr>
+      <w:r>
+        <w:t>예를 들어 직전 배경이 파란색인 상태에서 배경 유지와 목걸이 삭제를 요청했다고 하자. 모델이 두 항목 모두 ‘원본’으로 추출하더라도 유지 규칙은 배경을 파란색으로, 삭제 규칙은 목걸이를 ‘없음’으로 보정한다. 구절의 의미를 확정할 수 없는 경우에는 규칙으로 값을 덮어쓰지 않는다. 이 처리는 정답 상태를 입력받지 않으며 현재 요청과 직전 상태만 사용한다.</w:t>
+      </w:r>
+    </w:p>
+    <w:p>
+      <w:pPr>
         <w:pStyle w:val="Heading1"/>
       </w:pPr>
       <w:r>
@@ -314,6 +346,46 @@
       </w:pPr>
       <w:r>
         <w:t>실험 코드와 대화, 정답, 모델 응답, 생성 이미지 및 평가 원문은 연구 저장소에 공개하였다[9]. 정확한 모델 버전과 실행 설정은 실험별 기록에 포함하였으며, 개발 중 재계산한 결과와 검증 결과를 구분하였다.</w:t>
+      </w:r>
+    </w:p>
+    <w:p>
+      <w:pPr>
+        <w:pStyle w:val="Heading2"/>
+      </w:pPr>
+      <w:r>
+        <w:t>4. 포즈와 표정을 포함한 확장 실험</w:t>
+      </w:r>
+    </w:p>
+    <w:p>
+      <w:pPr>
+        <w:jc w:val="both"/>
+      </w:pPr>
+      <w:r>
+        <w:t>포즈·표정 요청과 속성 변경을 함께 처리하는 경우를 검사하기 위해 별도 합성 대화 C를 구성하였다. 네 시나리오마다 단일·복합·혼합 조건의 4턴 대화를 작성하여 총 12개 대화 48턴을 사용하였다. 단일 조건은 표정만 변경하고, 복합 조건은 몸 방향과 손동작을 추가한다. 혼합 조건은 재킷·배경·식물·목걸이의 변경·유지·삭제·복원도 포함한다. 같은 시나리오의 표정 목표는 세 조건에서 같게 하였다.</w:t>
+      </w:r>
+    </w:p>
+    <w:p>
+      <w:pPr>
+        <w:jc w:val="both"/>
+      </w:pPr>
+      <w:r>
+        <w:t>C는 기존 여섯 항목에 몸 방향·손동작·표정을 더한 아홉 항목을 사용한다. 어휘와 허용 값을 다시 정하고, 마침표로 구분한 유지·삭제·복원 구절을 검사하는 별도 구현을 사용하였다. 따라서 S·T의 동일 코드 재검증이 아닌 상태 표현의 확장 검사이다. 최초 추출만 사용하는 방법, 한 차례 재검토한 방법, 재검토 뒤 구절 규칙으로 보정한 방법을 비교하였다. 최초 추출은 턴당 한 번, 나머지 두 방법은 두 번 호출하며 규칙 보정에는 추가 호출이 없다.</w:t>
+      </w:r>
+    </w:p>
+    <w:p>
+      <w:pPr>
+        <w:jc w:val="both"/>
+      </w:pPr>
+      <w:r>
+        <w:t>Qwen3-4B-4bit의 온도를 0, 최대 출력을 320토큰으로 설정하고 공통 예시 두 개를 제공하였다. 전체 추론은 96회이며 방법 간 응답을 공유하였다. 코드·대화·정답·설정을 추론 전에 고정하였다. 모든 항목이 맞는 턴 수와 표정·몸 방향·손동작의 정확도를 따로 집계하였다. 조건 간에는 문장 길이와 지시 종류도 함께 달라지므로 결과 차이를 포즈 추가의 인과 효과로 해석하지 않는다.</w:t>
+      </w:r>
+    </w:p>
+    <w:p>
+      <w:pPr>
+        <w:jc w:val="both"/>
+      </w:pPr>
+      <w:r>
+        <w:t>생성 단계는 첫 번째 시나리오의 첫 턴을 세 조건에서 골라 두 원본 사진에 적용한 6장으로 따로 검사하였다. 선택 기준은 텍스트 결과 집계 전에 정하였다. 추출 모델의 출력 대신 정확한 요청을 직접 전달하고 첫 성공 이미지만 사용하였다. 단일·복합·혼합 조건의 시각적 목표는 각각 1·3·6개이며, Qwen2.5-VL-7B-4bit로 목표별 성공·실패·판단 불가와 설명을 받았다. 이는 방법 간 비교가 아닌 생성 단계의 예비 진단이다.</w:t>
       </w:r>
     </w:p>
     <w:p>
@@ -3429,6 +3501,524 @@
     </w:p>
     <w:p>
       <w:pPr>
+        <w:pStyle w:val="Heading2"/>
+      </w:pPr>
+      <w:r>
+        <w:t>5. 복합 요청에서의 삭제와 복원 혼동</w:t>
+      </w:r>
+    </w:p>
+    <w:p>
+      <w:pPr>
+        <w:pStyle w:val="Caption"/>
+        <w:keepNext/>
+        <w:spacing w:before="100"/>
+        <w:ind w:firstLine="0"/>
+        <w:jc w:val="center"/>
+      </w:pPr>
+      <w:r>
+        <w:t>표 6. C의 요청 조건별 정확한 턴 수</w:t>
+      </w:r>
+    </w:p>
+    <w:tbl>
+      <w:tblPr>
+        <w:tblW w:type="auto" w:w="0"/>
+        <w:tblLayout w:type="fixed"/>
+        <w:tblLook w:firstColumn="1" w:firstRow="1" w:lastColumn="0" w:lastRow="0" w:noHBand="0" w:noVBand="1" w:val="04A0"/>
+      </w:tblPr>
+      <w:tblGrid>
+        <w:gridCol w:w="1417"/>
+        <w:gridCol w:w="1068"/>
+        <w:gridCol w:w="1068"/>
+        <w:gridCol w:w="1068"/>
+      </w:tblGrid>
+      <w:tr>
+        <w:trPr>
+          <w:cantSplit/>
+          <w:tblHeader/>
+        </w:trPr>
+        <w:tc>
+          <w:tcPr>
+            <w:tcW w:type="dxa" w:w="1417"/>
+            <w:tcMar>
+              <w:left w:w="45" w:type="dxa"/>
+              <w:right w:w="45" w:type="dxa"/>
+            </w:tcMar>
+            <w:tcBorders>
+              <w:bottom w:val="single" w:sz="5"/>
+            </w:tcBorders>
+          </w:tcPr>
+          <w:p>
+            <w:pPr>
+              <w:keepNext/>
+              <w:spacing w:after="60" w:before="60" w:line="240" w:lineRule="auto"/>
+              <w:ind w:firstLine="0"/>
+              <w:jc w:val="left"/>
+            </w:pPr>
+            <w:r>
+              <w:rPr>
+                <w:b/>
+                <w:sz w:val="16"/>
+              </w:rPr>
+              <w:t>요청 조건</w:t>
+            </w:r>
+          </w:p>
+        </w:tc>
+        <w:tc>
+          <w:tcPr>
+            <w:tcW w:type="dxa" w:w="1068"/>
+            <w:tcMar>
+              <w:left w:w="45" w:type="dxa"/>
+              <w:right w:w="45" w:type="dxa"/>
+            </w:tcMar>
+            <w:tcBorders>
+              <w:bottom w:val="single" w:sz="5"/>
+            </w:tcBorders>
+          </w:tcPr>
+          <w:p>
+            <w:pPr>
+              <w:keepNext/>
+              <w:spacing w:after="60" w:before="60" w:line="240" w:lineRule="auto"/>
+              <w:ind w:firstLine="0"/>
+              <w:jc w:val="center"/>
+            </w:pPr>
+            <w:r>
+              <w:rPr>
+                <w:b/>
+                <w:sz w:val="16"/>
+              </w:rPr>
+              <w:t>최초 추출</w:t>
+            </w:r>
+          </w:p>
+        </w:tc>
+        <w:tc>
+          <w:tcPr>
+            <w:tcW w:type="dxa" w:w="1068"/>
+            <w:tcMar>
+              <w:left w:w="45" w:type="dxa"/>
+              <w:right w:w="45" w:type="dxa"/>
+            </w:tcMar>
+            <w:tcBorders>
+              <w:bottom w:val="single" w:sz="5"/>
+            </w:tcBorders>
+          </w:tcPr>
+          <w:p>
+            <w:pPr>
+              <w:keepNext/>
+              <w:spacing w:after="60" w:before="60" w:line="240" w:lineRule="auto"/>
+              <w:ind w:firstLine="0"/>
+              <w:jc w:val="center"/>
+            </w:pPr>
+            <w:r>
+              <w:rPr>
+                <w:b/>
+                <w:sz w:val="16"/>
+              </w:rPr>
+              <w:t>재검토</w:t>
+            </w:r>
+          </w:p>
+        </w:tc>
+        <w:tc>
+          <w:tcPr>
+            <w:tcW w:type="dxa" w:w="1068"/>
+            <w:tcMar>
+              <w:left w:w="45" w:type="dxa"/>
+              <w:right w:w="45" w:type="dxa"/>
+            </w:tcMar>
+            <w:tcBorders>
+              <w:bottom w:val="single" w:sz="5"/>
+            </w:tcBorders>
+          </w:tcPr>
+          <w:p>
+            <w:pPr>
+              <w:keepNext/>
+              <w:spacing w:after="60" w:before="60" w:line="240" w:lineRule="auto"/>
+              <w:ind w:firstLine="0"/>
+              <w:jc w:val="center"/>
+            </w:pPr>
+            <w:r>
+              <w:rPr>
+                <w:b/>
+                <w:sz w:val="16"/>
+              </w:rPr>
+              <w:t>규칙 보정</w:t>
+            </w:r>
+          </w:p>
+        </w:tc>
+      </w:tr>
+      <w:tr>
+        <w:trPr>
+          <w:cantSplit/>
+        </w:trPr>
+        <w:tc>
+          <w:tcPr>
+            <w:tcW w:type="dxa" w:w="1417"/>
+            <w:tcMar>
+              <w:left w:w="45" w:type="dxa"/>
+              <w:right w:w="45" w:type="dxa"/>
+            </w:tcMar>
+          </w:tcPr>
+          <w:p>
+            <w:pPr>
+              <w:keepNext/>
+              <w:spacing w:after="60" w:before="60" w:line="240" w:lineRule="auto"/>
+              <w:ind w:firstLine="0"/>
+              <w:jc w:val="left"/>
+            </w:pPr>
+            <w:r>
+              <w:rPr>
+                <w:b w:val="0"/>
+                <w:sz w:val="16"/>
+              </w:rPr>
+              <w:t>표정</w:t>
+            </w:r>
+          </w:p>
+        </w:tc>
+        <w:tc>
+          <w:tcPr>
+            <w:tcW w:type="dxa" w:w="1068"/>
+            <w:tcMar>
+              <w:left w:w="45" w:type="dxa"/>
+              <w:right w:w="45" w:type="dxa"/>
+            </w:tcMar>
+          </w:tcPr>
+          <w:p>
+            <w:pPr>
+              <w:keepNext/>
+              <w:spacing w:after="60" w:before="60" w:line="240" w:lineRule="auto"/>
+              <w:ind w:firstLine="0"/>
+              <w:jc w:val="center"/>
+            </w:pPr>
+            <w:r>
+              <w:rPr>
+                <w:b w:val="0"/>
+                <w:sz w:val="16"/>
+              </w:rPr>
+              <w:t>16/16</w:t>
+            </w:r>
+          </w:p>
+        </w:tc>
+        <w:tc>
+          <w:tcPr>
+            <w:tcW w:type="dxa" w:w="1068"/>
+            <w:tcMar>
+              <w:left w:w="45" w:type="dxa"/>
+              <w:right w:w="45" w:type="dxa"/>
+            </w:tcMar>
+          </w:tcPr>
+          <w:p>
+            <w:pPr>
+              <w:keepNext/>
+              <w:spacing w:after="60" w:before="60" w:line="240" w:lineRule="auto"/>
+              <w:ind w:firstLine="0"/>
+              <w:jc w:val="center"/>
+            </w:pPr>
+            <w:r>
+              <w:rPr>
+                <w:b w:val="0"/>
+                <w:sz w:val="16"/>
+              </w:rPr>
+              <w:t>16/16</w:t>
+            </w:r>
+          </w:p>
+        </w:tc>
+        <w:tc>
+          <w:tcPr>
+            <w:tcW w:type="dxa" w:w="1068"/>
+            <w:tcMar>
+              <w:left w:w="45" w:type="dxa"/>
+              <w:right w:w="45" w:type="dxa"/>
+            </w:tcMar>
+          </w:tcPr>
+          <w:p>
+            <w:pPr>
+              <w:keepNext/>
+              <w:spacing w:after="60" w:before="60" w:line="240" w:lineRule="auto"/>
+              <w:ind w:firstLine="0"/>
+              <w:jc w:val="center"/>
+            </w:pPr>
+            <w:r>
+              <w:rPr>
+                <w:b w:val="0"/>
+                <w:sz w:val="16"/>
+              </w:rPr>
+              <w:t>16/16</w:t>
+            </w:r>
+          </w:p>
+        </w:tc>
+      </w:tr>
+      <w:tr>
+        <w:trPr>
+          <w:cantSplit/>
+        </w:trPr>
+        <w:tc>
+          <w:tcPr>
+            <w:tcW w:type="dxa" w:w="1417"/>
+            <w:tcMar>
+              <w:left w:w="45" w:type="dxa"/>
+              <w:right w:w="45" w:type="dxa"/>
+            </w:tcMar>
+          </w:tcPr>
+          <w:p>
+            <w:pPr>
+              <w:keepNext/>
+              <w:spacing w:after="60" w:before="60" w:line="240" w:lineRule="auto"/>
+              <w:ind w:firstLine="0"/>
+              <w:jc w:val="left"/>
+            </w:pPr>
+            <w:r>
+              <w:rPr>
+                <w:b w:val="0"/>
+                <w:sz w:val="16"/>
+              </w:rPr>
+              <w:t>표정·포즈</w:t>
+            </w:r>
+          </w:p>
+        </w:tc>
+        <w:tc>
+          <w:tcPr>
+            <w:tcW w:type="dxa" w:w="1068"/>
+            <w:tcMar>
+              <w:left w:w="45" w:type="dxa"/>
+              <w:right w:w="45" w:type="dxa"/>
+            </w:tcMar>
+          </w:tcPr>
+          <w:p>
+            <w:pPr>
+              <w:keepNext/>
+              <w:spacing w:after="60" w:before="60" w:line="240" w:lineRule="auto"/>
+              <w:ind w:firstLine="0"/>
+              <w:jc w:val="center"/>
+            </w:pPr>
+            <w:r>
+              <w:rPr>
+                <w:b w:val="0"/>
+                <w:sz w:val="16"/>
+              </w:rPr>
+              <w:t>16/16</w:t>
+            </w:r>
+          </w:p>
+        </w:tc>
+        <w:tc>
+          <w:tcPr>
+            <w:tcW w:type="dxa" w:w="1068"/>
+            <w:tcMar>
+              <w:left w:w="45" w:type="dxa"/>
+              <w:right w:w="45" w:type="dxa"/>
+            </w:tcMar>
+          </w:tcPr>
+          <w:p>
+            <w:pPr>
+              <w:keepNext/>
+              <w:spacing w:after="60" w:before="60" w:line="240" w:lineRule="auto"/>
+              <w:ind w:firstLine="0"/>
+              <w:jc w:val="center"/>
+            </w:pPr>
+            <w:r>
+              <w:rPr>
+                <w:b w:val="0"/>
+                <w:sz w:val="16"/>
+              </w:rPr>
+              <w:t>16/16</w:t>
+            </w:r>
+          </w:p>
+        </w:tc>
+        <w:tc>
+          <w:tcPr>
+            <w:tcW w:type="dxa" w:w="1068"/>
+            <w:tcMar>
+              <w:left w:w="45" w:type="dxa"/>
+              <w:right w:w="45" w:type="dxa"/>
+            </w:tcMar>
+          </w:tcPr>
+          <w:p>
+            <w:pPr>
+              <w:keepNext/>
+              <w:spacing w:after="60" w:before="60" w:line="240" w:lineRule="auto"/>
+              <w:ind w:firstLine="0"/>
+              <w:jc w:val="center"/>
+            </w:pPr>
+            <w:r>
+              <w:rPr>
+                <w:b w:val="0"/>
+                <w:sz w:val="16"/>
+              </w:rPr>
+              <w:t>16/16</w:t>
+            </w:r>
+          </w:p>
+        </w:tc>
+      </w:tr>
+      <w:tr>
+        <w:trPr>
+          <w:cantSplit/>
+        </w:trPr>
+        <w:tc>
+          <w:tcPr>
+            <w:tcW w:type="dxa" w:w="1417"/>
+            <w:tcMar>
+              <w:left w:w="45" w:type="dxa"/>
+              <w:right w:w="45" w:type="dxa"/>
+            </w:tcMar>
+            <w:tcBorders>
+              <w:bottom w:val="single" w:sz="5"/>
+            </w:tcBorders>
+          </w:tcPr>
+          <w:p>
+            <w:pPr>
+              <w:keepNext w:val="0"/>
+              <w:spacing w:after="60" w:before="60" w:line="240" w:lineRule="auto"/>
+              <w:ind w:firstLine="0"/>
+              <w:jc w:val="left"/>
+            </w:pPr>
+            <w:r>
+              <w:rPr>
+                <w:b w:val="0"/>
+                <w:sz w:val="16"/>
+              </w:rPr>
+              <w:t>속성 지시 혼합</w:t>
+            </w:r>
+          </w:p>
+        </w:tc>
+        <w:tc>
+          <w:tcPr>
+            <w:tcW w:type="dxa" w:w="1068"/>
+            <w:tcMar>
+              <w:left w:w="45" w:type="dxa"/>
+              <w:right w:w="45" w:type="dxa"/>
+            </w:tcMar>
+            <w:tcBorders>
+              <w:bottom w:val="single" w:sz="5"/>
+            </w:tcBorders>
+          </w:tcPr>
+          <w:p>
+            <w:pPr>
+              <w:keepNext w:val="0"/>
+              <w:spacing w:after="60" w:before="60" w:line="240" w:lineRule="auto"/>
+              <w:ind w:firstLine="0"/>
+              <w:jc w:val="center"/>
+            </w:pPr>
+            <w:r>
+              <w:rPr>
+                <w:b w:val="0"/>
+                <w:sz w:val="16"/>
+              </w:rPr>
+              <w:t>4/16</w:t>
+            </w:r>
+          </w:p>
+        </w:tc>
+        <w:tc>
+          <w:tcPr>
+            <w:tcW w:type="dxa" w:w="1068"/>
+            <w:tcMar>
+              <w:left w:w="45" w:type="dxa"/>
+              <w:right w:w="45" w:type="dxa"/>
+            </w:tcMar>
+            <w:tcBorders>
+              <w:bottom w:val="single" w:sz="5"/>
+            </w:tcBorders>
+          </w:tcPr>
+          <w:p>
+            <w:pPr>
+              <w:keepNext w:val="0"/>
+              <w:spacing w:after="60" w:before="60" w:line="240" w:lineRule="auto"/>
+              <w:ind w:firstLine="0"/>
+              <w:jc w:val="center"/>
+            </w:pPr>
+            <w:r>
+              <w:rPr>
+                <w:b w:val="0"/>
+                <w:sz w:val="16"/>
+              </w:rPr>
+              <w:t>4/16</w:t>
+            </w:r>
+          </w:p>
+        </w:tc>
+        <w:tc>
+          <w:tcPr>
+            <w:tcW w:type="dxa" w:w="1068"/>
+            <w:tcMar>
+              <w:left w:w="45" w:type="dxa"/>
+              <w:right w:w="45" w:type="dxa"/>
+            </w:tcMar>
+            <w:tcBorders>
+              <w:bottom w:val="single" w:sz="5"/>
+            </w:tcBorders>
+          </w:tcPr>
+          <w:p>
+            <w:pPr>
+              <w:keepNext w:val="0"/>
+              <w:spacing w:after="60" w:before="60" w:line="240" w:lineRule="auto"/>
+              <w:ind w:firstLine="0"/>
+              <w:jc w:val="center"/>
+            </w:pPr>
+            <w:r>
+              <w:rPr>
+                <w:b w:val="0"/>
+                <w:sz w:val="16"/>
+              </w:rPr>
+              <w:t>16/16</w:t>
+            </w:r>
+          </w:p>
+        </w:tc>
+      </w:tr>
+    </w:tbl>
+    <w:p>
+      <w:pPr>
+        <w:jc w:val="both"/>
+      </w:pPr>
+      <w:r>
+        <w:t>표 6은 아홉 항목이 모두 정확한 턴 수이다. 세 방법 모두 표정·몸 방향·손동작은 조건별 48항목을 정확히 처리하였다. 혼합 조건의 정확한 전체 항목 수는 최초 추출과 재검토가 각각 124/144, 규칙 보정이 144/144였다. 마지막 상태가 정확한 대화 수는 각각 0/4, 0/4, 4/4였다.</w:t>
+      </w:r>
+    </w:p>
+    <w:p>
+      <w:pPr>
+        <w:jc w:val="both"/>
+      </w:pPr>
+      <w:r>
+        <w:t>혼합 조건의 오류는 네 시나리오에서 같은 형태로 나타났다. 2턴의 식물 삭제와 3턴의 목걸이 삭제를 모델이 ‘원본’으로 추출하였고 재검토에서도 같은 값을 반환하였다. 식물 오류는 2~4턴, 목걸이 오류는 3~4턴에 남아 총 20개의 항목 오류로 집계되었다. 서로 다른 20종의 오류가 아니라 두 삭제 지시의 오류가 후속 상태에 누적된 결과이다. 사후에 삭제 규칙만 적용하여 재계산해도 48턴 모두 정확하였다. 이 확장 실험에서는 유지·복원 규칙을 함께 적용한 추가 이점은 나타나지 않았다.</w:t>
+      </w:r>
+    </w:p>
+    <w:p>
+      <w:pPr>
+        <w:jc w:val="both"/>
+      </w:pPr>
+      <w:r>
+        <w:t>네 시나리오는 표정과 몸 방향이 다르지만 삭제·복원 문형은 공유한다. 따라서 16/16은 정해진 혼합 문형에 대한 결과이다. 이번 검사에서 포즈 자체의 추출 오류는 없었으며, 확인된 문제는 대상을 없애는 동작과 최초 사진으로 복원하는 동작의 혼동이었다.</w:t>
+      </w:r>
+    </w:p>
+    <w:p>
+      <w:pPr>
+        <w:jc w:val="both"/>
+      </w:pPr>
+      <w:r>
+        <w:t>이 오류를 분석한 뒤 포즈를 제외한 짧은 대조 요청 8개를 고정하고 같은 설정으로 16회 추가 추론하였다. 최초 추출과 재검토는 각각 7/8이 정확하였다. 식물·목걸이의 삭제·복원을 단독으로 요청한 네 경우는 모두 맞았다. 그러나 “Remove the plant. Restore the necklace to the original.”에서는 식물도 ‘원본’으로 추출하였다. 두 문장의 순서만 바꾼 경우는 정확하였다. 이는 사후 진단이며 C의 48턴에 합산하지 않는다. 이 사례에서는 포즈가 없어도 삭제와 복원을 함께 요청하면 오류가 발생하였다.</w:t>
+      </w:r>
+    </w:p>
+    <w:p>
+      <w:pPr>
+        <w:pStyle w:val="Heading2"/>
+      </w:pPr>
+      <w:r>
+        <w:t>6. 복합 요청 이미지의 평가 오류</w:t>
+      </w:r>
+    </w:p>
+    <w:p>
+      <w:pPr>
+        <w:jc w:val="both"/>
+      </w:pPr>
+      <w:r>
+        <w:t>정확한 요청을 직접 입력한 이미지 6장의 AI 평가에서 두 인물 모두 복합 조건은 2/3, 혼합 조건은 5/6의 목표를 충족한 것으로 집계되었다. 실패 점수는 몸 방향에 부여되었으나 설명에서는 요청한 방향으로 회전했다고 서술하였다. 또한 설명이 각 목표 문장을 그대로 반복하였다. 단일 조건의 두 응답은 목표 하나에 점수 세 개를 반환하고 예시 설명을 복사하여 판독할 수 없었다. 두 응답은 모두 판단 불가로 처리하였다.</w:t>
+      </w:r>
+    </w:p>
+    <w:p>
+      <w:pPr>
+        <w:jc w:val="both"/>
+      </w:pPr>
+      <w:r>
+        <w:t>이 결과는 점수만으로 몸 방향의 성공 여부를 확정할 수 없음을 보여준다. 모든 첫 출력과 평가 원문을 보존하였으며, 이미지 재생성이나 유리한 응답의 선택 없이 보고하였다. 조건마다 목표 수가 다르고 각 인물·조건에서 한 장만 생성했으므로 2/3과 5/6을 생성 성공률이나 복잡도별 성능 차이로 해석하지 않는다.</w:t>
+      </w:r>
+    </w:p>
+    <w:p>
+      <w:pPr>
         <w:pStyle w:val="Heading1"/>
       </w:pPr>
       <w:r>
@@ -3456,6 +4046,14 @@
         <w:jc w:val="both"/>
       </w:pPr>
       <w:r>
+        <w:t>C에서는 삭제를 원본 복원으로 해석한 오류가 재검토 뒤에도 남았다. 명시적인 동작에 값을 직접 대응시키는 규칙은 이 오류를 제거하였다. S에서 나타난 유지·삭제의 상호 보완과 달리 C의 개선은 삭제 규칙만으로 설명된다. 두 결과를 구분하면 어떤 규칙이 어떤 오류를 줄였는지 확인할 수 있다. C는 어휘·예시·구현이 달라 S·T와 정확도나 표본 수를 합산하지 않는다.</w:t>
+      </w:r>
+    </w:p>
+    <w:p>
+      <w:pPr>
+        <w:jc w:val="both"/>
+      </w:pPr>
+      <w:r>
         <w:t>이미지 실험은 인물 2명과 생성 도구 하나를 사용하였고, 비교 64쌍 중 60쌍이 같은 출력을 공유하였다. 두 AI 평가 모두 설명과 점수의 불일치가 있어 점수 증가를 전반적인 이미지 품질 향상으로 해석하기 어렵다. 얼굴 특징 벡터의 코사인 유사도는 입력이 다른 네 쌍 중 두 쌍에서 상승하고 두 쌍에서 하락하였다.</w:t>
       </w:r>
     </w:p>
@@ -3473,6 +4071,14 @@
       </w:pPr>
       <w:r>
         <w:t>본 연구에서는 언어 모델의 추출·재검토 결과에 명시적 유지·삭제 제약을 적용하는 상태 갱신 방법을 제안하였다. 정해진 영어 문형의 합성 대화 S에서 유지 규칙은 불필요한 배경 변경을, 삭제 규칙은 식물 삭제 누락을 방지하였다. 두 규칙의 결합으로 정확한 턴 수는 27/32에서 29/32로 증가하였다. 추가 검증 대화 T에서도 정확한 턴 수는 28/32에서 29/32로 증가하였으며, 항목별 적용을 결합한 경우와 동일한 결과를 보였다. 제안 방법은 추가 모델 호출 없이 유지 오류와 삭제 누락을 감소시켰다.</w:t>
+      </w:r>
+    </w:p>
+    <w:p>
+      <w:pPr>
+        <w:jc w:val="both"/>
+      </w:pPr>
+      <w:r>
+        <w:t>포즈·표정을 추가한 C의 혼합 조건에서는 정확한 턴이 재검토 4/16에서 규칙 보정 16/16으로 증가하였다. 모델은 포즈와 표정을 정확히 추출했으나 삭제를 원본 복원으로 해석하였고, 삭제 규칙이 이를 바로잡았다. 정해진 동작의 상태 갱신을 명시적으로 검사하는 것이 동일 모델의 재검토 뒤에도 남은 오류를 줄였다.</w:t>
       </w:r>
     </w:p>
     <w:p>

</xml_diff>

<commit_message>
Clarify experiment names and describe evaluation observations directly
</commit_message>
<xml_diff>
--- a/paper/manuscript.inha.docx
+++ b/paper/manuscript.inha.docx
@@ -65,7 +65,7 @@
         <w:t xml:space="preserve">요약: </w:t>
       </w:r>
       <w:r>
-        <w:t>반복 이미지 편집에서는 변경할 내용과 유지하거나 삭제할 내용을 다음 프롬프트에 정확히 반영해야 한다. 본 연구는 언어 모델이 변경 사항을 추출하고 재검토한 뒤 명시적인 유지·삭제 지시를 확인하는 후처리 규칙을 제안한다. 유지 규칙은 이전 값을 보존하고 삭제 규칙은 값을 없음으로 설정한다. 검증 대화 S의 8개 대화 32턴에서 동일한 모델 응답에 네 방법을 적용하였다. 여섯 항목이 모두 정확한 턴은 기준 방법 27, 유지 규칙만 27, 삭제 규칙만 28, 두 규칙 결합 29였다. 추가 검증 T의 8개 대화 32턴에서도 정확한 턴이 28/32에서 29/32로 증가하였다. 포즈·표정을 포함한 별도 확장 실험 C의 12개 대화 48턴에서는 속성 지시를 혼합한 조건의 정확한 턴이 재검토 4/16에서 규칙 보정 16/16으로 증가하였다. C의 개선은 삭제를 원본 복원으로 잘못 해석한 오류를 삭제 규칙이 바로잡은 결과였다. 실제 인물 사진 2명의 이미지 평가는 모델의 설명·점수 불일치가 있어 이미지 품질 향상의 근거로 삼지 않았다. 정해진 영어 문형의 합성 대화에서 추가 모델 호출 없이 상태 갱신 오류를 감소시켰다.</w:t>
+        <w:t>반복 이미지 편집에서는 변경할 내용과 유지하거나 삭제할 내용을 다음 프롬프트에 정확히 반영해야 한다. 본 연구는 언어 모델이 변경 사항을 추출하고 재검토한 뒤 명시적인 유지·삭제 지시를 확인하는 후처리 규칙을 제안한다. 유지 규칙은 이전 값을 보존하고 삭제 규칙은 값을 없음으로 설정한다. 유지·삭제 규칙 비교 실험의 대화 8개 32턴에서 동일한 모델 응답에 네 방법을 적용하였다. 여섯 항목이 모두 정확한 턴은 기준 방법 27, 유지 규칙만 27, 삭제 규칙만 28, 두 규칙 결합 29였다. 새로운 대화 8개 32턴을 이용한 재검증에서도 정확한 턴이 28/32에서 29/32로 증가하였다. 포즈·표정을 포함한 복합 요청 실험의 12개 대화 48턴에서는 속성 지시를 혼합한 조건의 정확한 턴이 재검토 4/16에서 규칙 보정 16/16으로 증가하였다. 복합 요청 실험의 개선은 삭제를 원본 복원으로 잘못 해석한 오류를 삭제 규칙이 바로잡은 결과였다. 실제 인물 2명의 사진을 이용한 이미지 평가에서는 평가 모델의 설명과 점수가 일치하지 않는 사례가 나타났다. 정해진 영어 문형의 합성 대화에서 추가 모델 호출 없이 상태 갱신 오류를 감소시켰다.</w:t>
       </w:r>
     </w:p>
     <w:p>
@@ -79,7 +79,7 @@
         <w:t xml:space="preserve">Abstract: </w:t>
       </w:r>
       <w:r>
-        <w:t>Iterative portrait editing requires prompts to reflect requested changes while preserving or removing specified attributes. We apply explicit preservation and removal rules after a language model extracts and reviews the requested changes. Preservation retains the previous value, whereas removal sets an attribute to absent. On set S, eight synthetic English dialogues with 32 turns, all six attributes were correct in 27/32 turns for the baseline, 27/32 for preservation alone, 28/32 for removal alone, and 29/32 for their combination. On a further set T of eight dialogues and 32 turns, correct turns increased from 28/32 to 29/32. A separate extension C comprised 12 dialogues and 48 turns involving expressions and poses. For the condition combining these requests with attribute changes, preservation, removal, and restoration, correct turns increased from 4/16 after model review to 16/16 after rule correction. In C, removal rules corrected confusion between removing an object and restoring its original state. An image study using two portrait references revealed inconsistencies between evaluator explanations and scores; these scores were not treated as evidence of improved image quality. The rules reduced state-update errors without additional model calls within the tested English patterns and synthetic dialogues.</w:t>
+        <w:t>Iterative portrait editing requires prompts to reflect requested changes while preserving or removing specified attributes. We apply explicit preservation and removal rules after a language model extracts and reviews the requested changes. Preservation retains the previous value, whereas removal sets an attribute to absent. In the preservation and removal rule comparison using eight synthetic English dialogues with 32 turns, all six attributes were correct in 27/32 turns for the baseline, 27/32 for preservation alone, 28/32 for removal alone, and 29/32 for their combination. In a replication using eight new dialogues and 32 turns, correct turns increased from 28/32 to 29/32. A separate complex-request experiment comprised 12 dialogues and 48 turns involving expressions and poses. For the condition combining these requests with attribute changes, preservation, removal, and restoration, correct turns increased from 4/16 after model review to 16/16 after rule correction. In this experiment, removal rules corrected confusion between removing an object and restoring its original state. An image study using two portrait references revealed inconsistencies between evaluator explanations and scores. The rules reduced state-update errors without additional model calls within the tested English patterns and synthetic dialogues.</w:t>
       </w:r>
     </w:p>
     <w:p>
@@ -281,7 +281,7 @@
         <w:jc w:val="both"/>
       </w:pPr>
       <w:r>
-        <w:t>초기 개발 대화 P에서는 keep을 폭넓게 탐지하는 유지 규칙이 정확한 턴 수를 기준 30/32에서 32/32로 증가시켰다. 그러나 후속 검사에서 off나 색 변경 요청을 유지 지시로 잘못 처리하였다. 새 검증 대화 Q에서 이 규칙의 정확한 턴은 12/32였고, 적용 문형을 좁힌 유지 규칙은 기준과 같은 27/32였다. 문형을 좁혀도 마지막 상태가 정확한 대화는 6/8에서 5/8로 감소하였다. 중간 턴의 잘못된 삭제는 막았지만 다음 턴의 실제 삭제 요청을 모델이 놓쳤기 때문이다.</w:t>
+        <w:t>초기 개발 대화에서는 keep을 폭넓게 탐지하는 유지 규칙이 정확한 턴 수를 기준 30/32에서 32/32로 증가시켰다. 그러나 후속 검사에서 off나 색 변경 요청을 유지 지시로 잘못 처리하였다. 후속 개발 대화에서 이 규칙의 정확한 턴은 12/32였고, 적용 문형을 좁힌 유지 규칙은 기준과 같은 27/32였다. 문형을 좁혀도 마지막 상태가 정확한 대화는 6/8에서 5/8로 감소하였다. 중간 턴의 잘못된 삭제는 막았지만 다음 턴의 실제 삭제 요청을 모델이 놓쳤기 때문이다.</w:t>
       </w:r>
     </w:p>
     <w:p>
@@ -289,7 +289,7 @@
         <w:jc w:val="both"/>
       </w:pPr>
       <w:r>
-        <w:t>Q 분석 후 유지·삭제 규칙을 결합하고 검증 대화 S를 새로 구성하였다. S는 연구 보조 에이전트로 만든 영어 합성 대화 8개 32턴이다. 각 대화의 정답은 작성 시 지정한 항목별 변경을 순서대로 적용해 만들었다. 대화와 정답, 코드, 프롬프트, 모델 버전을 모두 추론 전에 확정하였다. P·Q는 개발 자료이고 S는 후속 검증 자료이므로 결과를 따로 보고한다.</w:t>
+        <w:t>후속 개발 결과를 분석한 뒤 유지·삭제 규칙 비교 실험을 설계하였다. 이 실험에는 연구 보조 에이전트로 만든 영어 합성 대화 8개 32턴을 사용하였다. 각 대화의 정답은 작성 시 지정한 항목별 변경을 순서대로 적용해 만들었다. 대화와 정답, 코드, 프롬프트, 모델 버전을 모두 추론 전에 확정하였다. 규칙 개발에 사용한 대화와 비교 실험에 사용한 대화의 결과는 따로 보고한다.</w:t>
       </w:r>
     </w:p>
     <w:p>
@@ -321,7 +321,7 @@
         <w:jc w:val="both"/>
       </w:pPr>
       <w:r>
-        <w:t>이미지 실험은 S의 32턴, 실제 인물 사진 2명, 두 방법을 조합한 128조건이다. 원본 파일과 프롬프트가 같으면 한 번 생성한 이미지를 함께 사용해 총 66개 이미지를 생성하였다. 방법 간 비교 64쌍 중 입력이 다른 경우는 두 턴과 두 인물을 조합한 4쌍이며, 나머지 60쌍은 같은 이미지를 사용한다. 내장 이미지 생성 도구의 첫 성공 출력을 사용하였다. 이 도구는 내부 모델 버전과 시드를 공개하지 않아 동일 시드로 통제할 수 없었다. 이미지 평가는 Qwen2.5-VL-3B의 4비트 양자화 모델[5]을 사용하였다. 이미지와 목표 상태를 입력하여 여섯 항목을 성공·실패·판단 불가로 판정하였다. 평가 시 방법명과 생성 프롬프트는 제공하지 않았다. 얼굴 유사도는 InsightFace buffalo_l[6]의 코사인 유사도로 측정하였다.</w:t>
+        <w:t>이미지 실험은 규칙 비교 실험의 32턴, 실제 인물 사진 2명, 두 방법을 조합한 128조건이다. 원본 파일과 프롬프트가 같으면 한 번 생성한 이미지를 함께 사용해 총 66개 이미지를 생성하였다. 방법 간 비교 64쌍 중 입력이 다른 경우는 두 턴과 두 인물을 조합한 4쌍이며, 나머지 60쌍은 같은 이미지를 사용한다. 내장 이미지 생성 도구의 첫 성공 출력을 사용하였다. 이 도구는 내부 모델 버전과 시드를 공개하지 않아 동일 시드로 통제할 수 없었다. 이미지 평가는 Qwen2.5-VL-3B의 4비트 양자화 모델[5]을 사용하였다. 이미지와 목표 상태를 입력하여 여섯 항목을 성공·실패·판단 불가로 판정하였다. 평가 시 방법명과 생성 프롬프트는 제공하지 않았다. 얼굴 유사도는 InsightFace buffalo_l[6]의 코사인 유사도로 측정하였다.</w:t>
       </w:r>
     </w:p>
     <w:p>
@@ -353,7 +353,7 @@
         <w:pStyle w:val="Heading2"/>
       </w:pPr>
       <w:r>
-        <w:t>4. 포즈와 표정을 포함한 확장 실험</w:t>
+        <w:t>4. 포즈와 표정을 포함한 복합 요청 실험</w:t>
       </w:r>
     </w:p>
     <w:p>
@@ -361,7 +361,7 @@
         <w:jc w:val="both"/>
       </w:pPr>
       <w:r>
-        <w:t>포즈·표정 요청과 속성 변경을 함께 처리하는 경우를 검사하기 위해 별도 합성 대화 C를 구성하였다. 네 시나리오마다 단일·복합·혼합 조건의 4턴 대화를 작성하여 총 12개 대화 48턴을 사용하였다. 단일 조건은 표정만 변경하고, 복합 조건은 몸 방향과 손동작을 추가한다. 혼합 조건은 재킷·배경·식물·목걸이의 변경·유지·삭제·복원도 포함한다. 같은 시나리오의 표정 목표는 세 조건에서 같게 하였다.</w:t>
+        <w:t>포즈·표정 요청과 속성 변경을 함께 처리하는 경우를 검사하기 위해 별도의 합성 대화를 구성하였다. 네 시나리오마다 단일·복합·혼합 조건의 4턴 대화를 작성하여 총 12개 대화 48턴을 사용하였다. 단일 조건은 표정만 변경하고, 복합 조건은 몸 방향과 손동작을 추가한다. 혼합 조건은 재킷·배경·식물·목걸이의 변경·유지·삭제·복원도 포함한다. 같은 시나리오의 표정 목표는 세 조건에서 같게 하였다.</w:t>
       </w:r>
     </w:p>
     <w:p>
@@ -369,7 +369,7 @@
         <w:jc w:val="both"/>
       </w:pPr>
       <w:r>
-        <w:t>C는 기존 여섯 항목에 몸 방향·손동작·표정을 더한 아홉 항목을 사용한다. 어휘와 허용 값을 다시 정하고, 마침표로 구분한 유지·삭제·복원 구절을 검사하는 별도 구현을 사용하였다. 따라서 S·T의 동일 코드 재검증이 아닌 상태 표현의 확장 검사이다. 최초 추출만 사용하는 방법, 한 차례 재검토한 방법, 재검토 뒤 구절 규칙으로 보정한 방법을 비교하였다. 최초 추출은 턴당 한 번, 나머지 두 방법은 두 번 호출하며 규칙 보정에는 추가 호출이 없다.</w:t>
+        <w:t>복합 요청 실험은 기존 여섯 항목에 몸 방향·손동작·표정을 더한 아홉 항목을 사용한다. 어휘와 허용 값을 다시 정하고, 마침표로 구분한 유지·삭제·복원 구절을 검사하는 별도 구현을 사용하였다. 앞선 규칙 비교 및 재검증 실험과 달리 상태 항목과 규칙 구현을 확장하였다. 최초 추출만 사용하는 방법, 한 차례 재검토한 방법, 재검토 뒤 구절 규칙으로 보정한 방법을 비교하였다. 최초 추출은 턴당 한 번, 나머지 두 방법은 두 번 호출하며 규칙 보정에는 추가 호출이 없다.</w:t>
       </w:r>
     </w:p>
     <w:p>
@@ -413,7 +413,7 @@
         <w:jc w:val="center"/>
       </w:pPr>
       <w:r>
-        <w:t>표 1. S에서 유지 규칙과 삭제 규칙의 효과</w:t>
+        <w:t>표 1. 유지 규칙과 삭제 규칙의 비교</w:t>
       </w:r>
     </w:p>
     <w:tbl>
@@ -1097,7 +1097,7 @@
         <w:jc w:val="both"/>
       </w:pPr>
       <w:r>
-        <w:t>두 규칙을 결합했을 때 정확한 턴은 기준보다 2개 많아 사전 채택 조건을 충족하였다. 유지 규칙만 적용한 경우보다 2개, 삭제 규칙만 적용한 경우보다 1개 많았다. 방법 간 차이는 S3의 3턴과 4턴에서 발생하였다. S1, S2, S4, S5, S6, S8은 네 방법 모두 4턴이 정확했고, S7은 모든 방법에서 1/4였다.</w:t>
+        <w:t>두 규칙을 결합했을 때 정확한 턴은 기준보다 2개 많아 사전 채택 조건을 충족하였다. 유지 규칙만 적용한 경우보다 2개, 삭제 규칙만 적용한 경우보다 1개 많았다. 방법 간 차이는 세 번째 대화의 3턴과 4턴에서 발생하였다. 일곱 번째 대화는 모든 방법에서 4턴 중 1턴이 정확했고, 나머지 여섯 대화는 네 방법 모두 4턴이 정확하였다.</w:t>
       </w:r>
     </w:p>
     <w:p>
@@ -1113,7 +1113,7 @@
         <w:jc w:val="both"/>
       </w:pPr>
       <w:r>
-        <w:t>S3의 3턴에서는 식물을 삭제하고 재킷은 유지하도록 요청하였다. 기준 방법과 유지 규칙만 적용한 방법은 식물을 남겼고, 삭제 규칙은 식물의 값을 없음으로 바꾸었다. 이어진 4턴에서는 상의와 목걸이를 원본으로 돌리되 재킷과 연한 파란색 배경은 그대로 두도록 요청하였다. 기준 방법과 삭제 규칙만 적용한 방법은 배경도 원본으로 바꾸었다. 유지 규칙은 배경을 보존하였지만 이전 턴에서 남긴 식물까지 삭제하지는 못했다.</w:t>
+        <w:t>규칙 비교 실험의 세 번째 대화에서는 3턴에 식물을 삭제하고 재킷은 유지하도록 요청하였다. 기준 방법과 유지 규칙만 적용한 방법은 식물을 남겼고, 삭제 규칙은 식물의 값을 없음으로 바꾸었다. 이어진 4턴에서는 상의와 목걸이를 원본으로 돌리되 재킷과 연한 파란색 배경은 그대로 두도록 요청하였다. 기준 방법과 삭제 규칙만 적용한 방법은 배경도 원본으로 바꾸었다. 유지 규칙은 배경을 보존하였지만 이전 턴에서 남긴 식물까지 삭제하지는 못했다.</w:t>
       </w:r>
     </w:p>
     <w:p>
@@ -1129,7 +1129,7 @@
         <w:pStyle w:val="Heading2"/>
       </w:pPr>
       <w:r>
-        <w:t>3. 항목별 적용을 결합한 추가 검증</w:t>
+        <w:t>3. 새 대화에서의 재검증</w:t>
       </w:r>
     </w:p>
     <w:p>
@@ -1137,7 +1137,7 @@
         <w:jc w:val="both"/>
       </w:pPr>
       <w:r>
-        <w:t>항목별 적용은 각 항목의 변경을 개별적으로 검증하여 한 항목의 오류가 다른 유효한 변경까지 취소하는 것을 방지한다. S에 대한 사후 분석에서 이를 유지·삭제 규칙과 결합한 결과, 정확한 턴 수는 32/32였다. 추가 효과의 검증에는 새로 구성한 T의 8개 대화 32턴을 사용하였다. T의 대화와 정답은 추론 전에 확정하였으며, S의 사후 분석에 사용한 코드를 수정 없이 적용하였다. 모든 비교 방법에 동일한 추출·재검토 응답 64개를 사용한 결과를 표 2에 제시하였다.</w:t>
+        <w:t>항목별 적용은 각 항목의 변경을 개별적으로 검증하여 한 항목의 오류가 다른 유효한 변경까지 취소하는 것을 방지한다. 규칙 비교 실험의 사후 분석에서 이를 유지·삭제 규칙과 결합한 결과, 정확한 턴 수는 32/32였다. 추가 효과를 재검증하기 위해 새로운 대화 8개 32턴을 구성하였다. 대화와 정답은 추론 전에 확정하였으며, 앞선 사후 분석에 사용한 코드를 수정 없이 적용하였다. 모든 비교 방법에 동일한 추출·재검토 응답 64개를 사용한 결과를 표 2에 제시하였다.</w:t>
       </w:r>
     </w:p>
     <w:p>
@@ -1149,7 +1149,7 @@
         <w:jc w:val="center"/>
       </w:pPr>
       <w:r>
-        <w:t>표 2. T에서 항목별 적용의 추가 효과</w:t>
+        <w:t>표 2. 새 대화에서 항목별 적용의 효과</w:t>
       </w:r>
     </w:p>
     <w:tbl>
@@ -1833,7 +1833,7 @@
         <w:jc w:val="both"/>
       </w:pPr>
       <w:r>
-        <w:t>T에서도 유지·삭제 규칙은 정확한 턴 수와 최종 정답 대화 수를 각각 한 개 증가시켰으며, 차이는 T7의 마지막 턴에서 발생하였다. 항목별 적용을 추가한 결과는 유지·삭제 규칙만 사용한 결과와 같았다. 이에 따라 추가 처리 없이 유지·삭제 규칙을 사용하는 방법을 선택하였다. S의 사후 재계산 결과와 새 대화 T의 검증 결과는 구분하며, 서로 다른 개발 단계에서 구성한 S와 T의 표본 수는 합산하지 않는다.</w:t>
+        <w:t>새 대화에서도 유지·삭제 규칙은 정확한 턴 수와 최종 정답 대화 수를 각각 한 개 증가시켰으며, 차이는 일곱 번째 대화의 마지막 턴에서 발생하였다. 항목별 적용을 추가한 결과는 유지·삭제 규칙만 사용한 결과와 같았다. 이에 따라 추가 처리 없이 유지·삭제 규칙을 사용하는 방법을 선택하였다. 규칙 비교 실험의 사후 분석과 새 대화에서의 재검증은 서로 다른 개발 단계에서 수행하였으므로 결과와 표본 수를 따로 집계하였다.</w:t>
       </w:r>
     </w:p>
     <w:p>
@@ -1865,7 +1865,7 @@
         <w:drawing>
           <wp:inline xmlns:a="http://schemas.openxmlformats.org/drawingml/2006/main" xmlns:pic="http://schemas.openxmlformats.org/drawingml/2006/picture">
             <wp:extent cx="6048000" cy="1223879"/>
-            <wp:docPr id="1" name="Picture 1" descr="그림 1 R01의 S3 비교에서 식물 삭제와 배경 유지에 따른 차이"/>
+            <wp:docPr id="1" name="Picture 1" descr="그림 1 규칙 비교 실험의 세 번째 대화에서 R01의 식물 삭제와 배경 유지"/>
             <wp:cNvGraphicFramePr>
               <a:graphicFrameLocks noChangeAspect="1"/>
             </wp:cNvGraphicFramePr>
@@ -1901,7 +1901,7 @@
         <w:pStyle w:val="Caption"/>
       </w:pPr>
       <w:r>
-        <w:t>그림 1 R01의 S3 비교에서 식물 삭제와 배경 유지에 따른 차이</w:t>
+        <w:t>그림 1 규칙 비교 실험의 세 번째 대화에서 R01의 식물 삭제와 배경 유지</w:t>
       </w:r>
     </w:p>
     <w:p>
@@ -2419,7 +2419,7 @@
         <w:jc w:val="both"/>
       </w:pPr>
       <w:r>
-        <w:t>증가한 8개 성공 항목 중 6개는 판단 불가에서 성공으로 바뀌었고 실패에서 성공으로 바뀐 항목은 2개였다. R02 S3 3턴의 기준 평가가 JSON 대신 느낌표를 출력하여 6항목 모두 판단 불가가 된 영향이 크다. 또 같은 턴의 결합 출력에서는 소품이 없다는 설명과 ‘소품 없음’에 대한 실패 점수가 모순되었다. 따라서 증가분 전체를 실제 편집 오류의 해소로 해석하기 어렵다.</w:t>
+        <w:t>증가한 8개 성공 항목 중 6개는 판단 불가에서 성공으로 바뀌었고 실패에서 성공으로 바뀐 항목은 2개였다. 세 번째 대화의 R02 3턴 기준 평가가 JSON 대신 느낌표를 출력하여 6항목 모두 판단 불가가 된 영향이 크다. 또 같은 턴의 결합 출력에서는 소품이 없다는 설명과 ‘소품 없음’에 대한 실패 점수가 모순되었다. 따라서 증가분 전체를 실제 편집 오류의 해소로 해석하기 어렵다.</w:t>
       </w:r>
     </w:p>
     <w:p>
@@ -2846,7 +2846,7 @@
                 <w:b/>
                 <w:sz w:val="16"/>
               </w:rPr>
-              <w:t>인물·대화·턴</w:t>
+              <w:t>인물·턴</w:t>
             </w:r>
           </w:p>
         </w:tc>
@@ -2983,7 +2983,7 @@
                 <w:b w:val="0"/>
                 <w:sz w:val="16"/>
               </w:rPr>
-              <w:t>R01 S3 3턴</w:t>
+              <w:t>R01 3턴</w:t>
             </w:r>
           </w:p>
         </w:tc>
@@ -3108,7 +3108,7 @@
                 <w:b w:val="0"/>
                 <w:sz w:val="16"/>
               </w:rPr>
-              <w:t>R01 S3 4턴</w:t>
+              <w:t>R01 4턴</w:t>
             </w:r>
           </w:p>
         </w:tc>
@@ -3233,7 +3233,7 @@
                 <w:b w:val="0"/>
                 <w:sz w:val="16"/>
               </w:rPr>
-              <w:t>R02 S3 3턴</w:t>
+              <w:t>R02 3턴</w:t>
             </w:r>
           </w:p>
         </w:tc>
@@ -3361,7 +3361,7 @@
                 <w:b w:val="0"/>
                 <w:sz w:val="16"/>
               </w:rPr>
-              <w:t>R02 S3 4턴</w:t>
+              <w:t>R02 4턴</w:t>
             </w:r>
           </w:p>
         </w:tc>
@@ -3496,7 +3496,7 @@
         <w:jc w:val="both"/>
       </w:pPr>
       <w:r>
-        <w:t>앞선 개발 대화 P의 이미지 실험에서는 128조건에 대해 68개 이미지를 생성하였다. 목표 충족 수는 기준 354/384, 유지 규칙 355/384였고 얼굴 코사인 평균은 각각 0.914851과 0.914108이었다. 입력이 다른 네 쌍 중 인물 R01의 개발 대화 P2 두 번째 턴에서 소품 판정 하나만 판단 불가에서 성공으로 바뀌었다. 실패에서 성공으로 바뀐 항목은 없었으며 JSON 파싱 실패 4개와 설명·점수 불일치가 있었다.</w:t>
+        <w:t>초기 개발 대화의 이미지 실험에서는 128조건에 대해 68개 이미지를 생성하였다. 목표 충족 수는 기준 354/384, 유지 규칙 355/384였고 얼굴 코사인 평균은 각각 0.914851과 0.914108이었다. 입력이 다른 네 쌍 중 인물 R01의 두 번째 개발 대화 2턴에서 소품 판정 하나만 판단 불가에서 성공으로 바뀌었다. 실패에서 성공으로 바뀐 항목은 없었으며 JSON 파싱 실패 4개와 설명·점수 불일치가 있었다.</w:t>
       </w:r>
     </w:p>
     <w:p>
@@ -3516,7 +3516,7 @@
         <w:jc w:val="center"/>
       </w:pPr>
       <w:r>
-        <w:t>표 6. C의 요청 조건별 정확한 턴 수</w:t>
+        <w:t>표 6. 복합 요청 실험의 조건별 정확한 턴 수</w:t>
       </w:r>
     </w:p>
     <w:tbl>
@@ -3974,7 +3974,7 @@
         <w:jc w:val="both"/>
       </w:pPr>
       <w:r>
-        <w:t>혼합 조건의 오류는 네 시나리오에서 같은 형태로 나타났다. 2턴의 식물 삭제와 3턴의 목걸이 삭제를 모델이 ‘원본’으로 추출하였고 재검토에서도 같은 값을 반환하였다. 식물 오류는 2~4턴, 목걸이 오류는 3~4턴에 남아 총 20개의 항목 오류로 집계되었다. 서로 다른 20종의 오류가 아니라 두 삭제 지시의 오류가 후속 상태에 누적된 결과이다. 사후에 삭제 규칙만 적용하여 재계산해도 48턴 모두 정확하였다. 이 확장 실험에서는 유지·복원 규칙을 함께 적용한 추가 이점은 나타나지 않았다.</w:t>
+        <w:t>혼합 조건의 오류는 네 시나리오에서 같은 형태로 나타났다. 2턴의 식물 삭제와 3턴의 목걸이 삭제를 모델이 ‘원본’으로 추출하였고 재검토에서도 같은 값을 반환하였다. 식물 오류는 2~4턴, 목걸이 오류는 3~4턴에 남아 총 20개의 항목 오류로 집계되었다. 서로 다른 20종의 오류가 아니라 두 삭제 지시의 오류가 후속 상태에 누적된 결과이다. 사후에 삭제 규칙만 적용하여 재계산해도 48턴 모두 정확하였다. 복합 요청 실험에서는 유지·복원 규칙을 함께 적용한 추가 이점은 나타나지 않았다.</w:t>
       </w:r>
     </w:p>
     <w:p>
@@ -3990,7 +3990,7 @@
         <w:jc w:val="both"/>
       </w:pPr>
       <w:r>
-        <w:t>이 오류를 분석한 뒤 포즈를 제외한 짧은 대조 요청 8개를 고정하고 같은 설정으로 16회 추가 추론하였다. 최초 추출과 재검토는 각각 7/8이 정확하였다. 식물·목걸이의 삭제·복원을 단독으로 요청한 네 경우는 모두 맞았다. 그러나 “Remove the plant. Restore the necklace to the original.”에서는 식물도 ‘원본’으로 추출하였다. 두 문장의 순서만 바꾼 경우는 정확하였다. 이는 사후 진단이며 C의 48턴에 합산하지 않는다. 이 사례에서는 포즈가 없어도 삭제와 복원을 함께 요청하면 오류가 발생하였다.</w:t>
+        <w:t>이 오류를 분석한 뒤 포즈를 제외한 짧은 대조 요청 8개를 고정하고 같은 설정으로 16회 추가 추론하였다. 최초 추출과 재검토는 각각 7/8이 정확하였다. 식물·목걸이의 삭제·복원을 단독으로 요청한 네 경우는 모두 맞았다. 그러나 “Remove the plant. Restore the necklace to the original.”에서는 식물도 ‘원본’으로 추출하였다. 두 문장의 순서만 바꾼 경우는 정확하였다. 이는 사후 진단이며 복합 요청 실험의 48턴에 합산하지 않는다. 이 사례에서는 포즈가 없어도 삭제와 복원을 함께 요청하면 오류가 발생하였다.</w:t>
       </w:r>
     </w:p>
     <w:p>
@@ -4014,7 +4014,7 @@
         <w:jc w:val="both"/>
       </w:pPr>
       <w:r>
-        <w:t>이 결과는 점수만으로 몸 방향의 성공 여부를 확정할 수 없음을 보여준다. 모든 첫 출력과 평가 원문을 보존하였으며, 이미지 재생성이나 유리한 응답의 선택 없이 보고하였다. 조건마다 목표 수가 다르고 각 인물·조건에서 한 장만 생성했으므로 2/3과 5/6을 생성 성공률이나 복잡도별 성능 차이로 해석하지 않는다.</w:t>
+        <w:t>이 결과는 점수만으로 몸 방향의 성공 여부를 확정할 수 없음을 보여준다. 이미지와 평가에는 각각 첫 성공 출력과 최초 평가 응답을 사용하였다. 조건마다 목표 수가 다르고 각 인물·조건에서 한 장만 생성했으므로 2/3과 5/6을 생성 성공률이나 복잡도별 성능 차이로 해석하지 않는다.</w:t>
       </w:r>
     </w:p>
     <w:p>
@@ -4030,7 +4030,7 @@
         <w:jc w:val="both"/>
       </w:pPr>
       <w:r>
-        <w:t>유지와 삭제는 서로 다른 상태 갱신 동작을 요구한다. 유지 규칙은 직전 값을 보존하므로, 이전 턴에 남은 삭제 대상까지 제거하지는 않는다. 반대로 삭제 규칙은 명시된 대상을 제거하지만 다른 항목의 불필요한 변경을 방지하지는 않는다. S3에서 두 규칙을 결합한 경우에만 식물 삭제와 배경 유지가 모두 정확했던 결과는 이러한 차이에 따른 것이다. Q에서는 keep만으로 유지 여부를 판단하여 삭제·변경 요청을 오인하였다. 이에 따라 제안 규칙은 항목 이름과 명시적 유지·삭제 표현이 함께 있는 구절에 적용한다.</w:t>
+        <w:t>유지와 삭제는 서로 다른 상태 갱신 동작을 요구한다. 유지 규칙은 직전 값을 보존하므로, 이전 턴에 남은 삭제 대상까지 제거하지는 않는다. 반대로 삭제 규칙은 명시된 대상을 제거하지만 다른 항목의 불필요한 변경을 방지하지는 않는다. 규칙 비교 실험의 세 번째 대화에서 두 규칙을 결합한 경우에만 식물 삭제와 배경 유지가 모두 정확했던 결과는 이러한 차이에 따른 것이다. 후속 개발 대화에서는 keep만으로 유지 여부를 판단하여 삭제·변경 요청을 오인하였다. 이에 따라 제안 규칙은 항목 이름과 명시적 유지·삭제 표현이 함께 있는 구절에 적용한다.</w:t>
       </w:r>
     </w:p>
     <w:p>
@@ -4038,7 +4038,7 @@
         <w:jc w:val="both"/>
       </w:pPr>
       <w:r>
-        <w:t>S와 T는 각각 정해진 영어 문형으로 구성한 합성 대화 8개이며 개선은 S3와 T7에 집중되었다. 변경 사항 추출에는 한 종류의 4B 모델을 사용하였고, 매 턴 현재 요청만 입력하였다.</w:t>
+        <w:t>규칙 비교와 재검증에는 각각 정해진 영어 문형의 합성 대화 8개를 사용하였으며, 개선은 각 실험의 세 번째와 일곱 번째 대화에 집중되었다. 변경 사항 추출에는 한 종류의 4B 모델을 사용하였고, 매 턴 현재 요청만 입력하였다.</w:t>
       </w:r>
     </w:p>
     <w:p>
@@ -4046,7 +4046,7 @@
         <w:jc w:val="both"/>
       </w:pPr>
       <w:r>
-        <w:t>C에서는 삭제를 원본 복원으로 해석한 오류가 재검토 뒤에도 남았다. 명시적인 동작에 값을 직접 대응시키는 규칙은 이 오류를 제거하였다. S에서 나타난 유지·삭제의 상호 보완과 달리 C의 개선은 삭제 규칙만으로 설명된다. 두 결과를 구분하면 어떤 규칙이 어떤 오류를 줄였는지 확인할 수 있다. C는 어휘·예시·구현이 달라 S·T와 정확도나 표본 수를 합산하지 않는다.</w:t>
+        <w:t>복합 요청 실험에서는 삭제를 원본 복원으로 해석한 오류가 재검토 뒤에도 남았다. 명시적인 동작에 값을 직접 대응시키는 규칙은 이 오류를 제거하였다. 규칙 비교 실험에서 나타난 유지·삭제의 상호 보완과 달리 복합 요청 실험의 개선은 삭제 규칙만으로 설명된다. 두 결과를 구분하면 어떤 규칙이 어떤 오류를 줄였는지 확인할 수 있다. 복합 요청 실험은 앞선 두 실험과 어휘·예시·구현이 달라 정확도와 표본 수를 별도로 집계하였다.</w:t>
       </w:r>
     </w:p>
     <w:p>
@@ -4070,7 +4070,7 @@
         <w:jc w:val="both"/>
       </w:pPr>
       <w:r>
-        <w:t>본 연구에서는 언어 모델의 추출·재검토 결과에 명시적 유지·삭제 제약을 적용하는 상태 갱신 방법을 제안하였다. 정해진 영어 문형의 합성 대화 S에서 유지 규칙은 불필요한 배경 변경을, 삭제 규칙은 식물 삭제 누락을 방지하였다. 두 규칙의 결합으로 정확한 턴 수는 27/32에서 29/32로 증가하였다. 추가 검증 대화 T에서도 정확한 턴 수는 28/32에서 29/32로 증가하였으며, 항목별 적용을 결합한 경우와 동일한 결과를 보였다. 제안 방법은 추가 모델 호출 없이 유지 오류와 삭제 누락을 감소시켰다.</w:t>
+        <w:t>본 연구에서는 언어 모델의 추출·재검토 결과에 명시적 유지·삭제 제약을 적용하는 상태 갱신 방법을 제안하였다. 정해진 영어 문형의 합성 대화를 이용한 규칙 비교 실험에서 유지 규칙은 불필요한 배경 변경을, 삭제 규칙은 식물 삭제 누락을 방지하였다. 두 규칙의 결합으로 정확한 턴 수는 27/32에서 29/32로 증가하였다. 새 대화에서의 재검증에서도 정확한 턴 수는 28/32에서 29/32로 증가하였으며, 항목별 적용을 결합한 경우와 동일한 결과를 보였다. 제안 방법은 추가 모델 호출 없이 유지 오류와 삭제 누락을 감소시켰다.</w:t>
       </w:r>
     </w:p>
     <w:p>
@@ -4078,7 +4078,7 @@
         <w:jc w:val="both"/>
       </w:pPr>
       <w:r>
-        <w:t>포즈·표정을 추가한 C의 혼합 조건에서는 정확한 턴이 재검토 4/16에서 규칙 보정 16/16으로 증가하였다. 모델은 포즈와 표정을 정확히 추출했으나 삭제를 원본 복원으로 해석하였고, 삭제 규칙이 이를 바로잡았다. 정해진 동작의 상태 갱신을 명시적으로 검사하는 것이 동일 모델의 재검토 뒤에도 남은 오류를 줄였다.</w:t>
+        <w:t>포즈·표정을 포함한 복합 요청 실험의 혼합 조건에서는 정확한 턴이 재검토 4/16에서 규칙 보정 16/16으로 증가하였다. 모델은 포즈와 표정을 정확히 추출했으나 삭제를 원본 복원으로 해석하였고, 삭제 규칙이 이를 바로잡았다. 정해진 동작의 상태 갱신을 명시적으로 검사하는 것이 동일 모델의 재검토 뒤에도 남은 오류를 줄였다.</w:t>
       </w:r>
     </w:p>
     <w:p>

</xml_diff>

<commit_message>
Rewrite indirect negative prose throughout paper and slides
</commit_message>
<xml_diff>
--- a/paper/manuscript.inha.docx
+++ b/paper/manuscript.inha.docx
@@ -121,7 +121,7 @@
         <w:jc w:val="both"/>
       </w:pPr>
       <w:r>
-        <w:t>반복 인물 이미지 편집에서는 속성의 추가·변경·유지·삭제와 원본 복원 요청을 편집 상태에 반영해야 한다. 예를 들어 배경은 그대로 두고 목걸이를 지우라는 요청을 전체 장면의 새 설명으로 바꾸면, 목걸이 삭제를 놓치거나 변경 대상이 아닌 배경까지 원본으로 되돌릴 수 있다. 원본 사진을 매번 편집 입력으로 사용하는 방식은 누적된 얼굴 변화를 줄이는 데 도움이 될 수 있지만, 편집 요청을 잘못 해석한 오류까지 바로잡지는 않는다. 따라서 이미지 생성에 앞서 편집 상태가 현재 요청을 정확히 반영하는지 확인해야 한다.</w:t>
+        <w:t>반복 인물 이미지 편집에서는 속성의 추가·변경·유지·삭제와 원본 복원 요청을 편집 상태에 반영해야 한다. 예를 들어 배경은 그대로 두고 목걸이를 지우라는 요청을 전체 장면의 새 설명으로 바꾸면, 목걸이 삭제를 놓치거나 변경 대상이 아닌 배경까지 원본으로 되돌릴 수 있다. 원본 사진을 매번 편집 입력으로 사용하는 방식은 누적된 얼굴 변화를 줄이는 데 도움이 될 수 있다. 이때 편집 요청을 잘못 해석하면 원본 사진을 사용하더라도 잘못된 상태가 생성 단계로 전달된다. 따라서 이미지 생성에 앞서 편집 상태가 현재 요청을 정확히 반영하는지 확인해야 한다.</w:t>
       </w:r>
     </w:p>
     <w:p>
@@ -137,7 +137,7 @@
         <w:jc w:val="both"/>
       </w:pPr>
       <w:r>
-        <w:t>분석 대상은 이미지의 화질보다 생성 전에 작성되는 편집 상태이다. 상태의 정답은 요청에 명시한 변경을 누적하여 계산할 수 있으므로 이미지 평가 모델의 판단과 분리하여 검사한다. 본 연구의 기여는 유지와 삭제를 구분한 후처리의 구현, 동일 응답을 이용한 구성요소 비교, 포즈·표정을 포함하는 복합 요청에서의 오류 분석이다.</w:t>
+        <w:t>분석 대상은 이미지 생성 전에 작성되는 편집 상태이다. 상태의 정답은 요청에 명시한 변경을 누적하여 계산할 수 있으므로 이미지 평가 모델의 판단과 분리하여 검사한다. 본 연구의 기여는 유지와 삭제를 구분한 후처리의 구현, 동일 응답을 이용한 구성요소 비교, 포즈·표정을 포함하는 복합 요청에서의 오류 분석이다.</w:t>
       </w:r>
     </w:p>
     <w:p>
@@ -193,7 +193,7 @@
         <w:jc w:val="both"/>
       </w:pPr>
       <w:r>
-        <w:t>각 턴에서 Qwen3-4B-4bit[4]가 현재 요청의 변경 사항을 JSON으로 추출한 뒤, 요청과 첫 응답을 입력받아 재검토한다. 추출기에는 현재 요청만 제공하며, 전체 대화와 방법별 이전 상태, 정답 상태는 입력하지 않는다. 이에 따라 모든 비교 방법에 동일한 두 모델 응답을 사용할 수 있다. 각 방법은 이 응답을 자신의 이전 편집 상태에 적용하고 검증한다.</w:t>
+        <w:t>각 턴에서 Qwen3-4B-4bit[4]가 현재 요청의 변경 사항을 JSON으로 추출한 뒤, 요청과 첫 응답을 입력받아 재검토한다. 추출기의 입력은 현재 요청으로 한정한다. 이에 따라 모든 비교 방법에 동일한 두 모델 응답을 사용할 수 있다. 각 방법은 이 응답을 자신의 이전 편집 상태에 적용하고 검증한다.</w:t>
       </w:r>
     </w:p>
     <w:p>
@@ -217,7 +217,7 @@
         <w:jc w:val="both"/>
       </w:pPr>
       <w:r>
-        <w:t>유지 규칙은 지원하는 항목 이름과 unchanged가 함께 있는 구절에서 해당 항목의 직전 값을 보존한다. keep만으로 유지 여부를 판단하면 keep the necklace off처럼 목걸이가 없는 상태를 요구하는 문장을 잘못 처리할 수 있다. 값 변경, 인용, 조건부 표현, 대명사, 같은 항목의 후속 언급, 지원 어휘 밖 표현에는 규칙을 적용하지 않고 모델의 추출·재검토 결과를 사용한다.</w:t>
+        <w:t>유지 규칙은 지원하는 항목 이름과 unchanged가 함께 있는 구절에서 해당 항목의 직전 값을 보존한다. keep만으로 유지 여부를 판단하면 keep the necklace off처럼 목걸이가 없는 상태를 요구하는 문장을 잘못 처리할 수 있다. 값 변경, 인용, 조건부 표현, 대명사, 같은 항목의 후속 언급, 지원 어휘 밖 표현은 모델의 추출·재검토 결과로 처리한다.</w:t>
       </w:r>
     </w:p>
     <w:p>
@@ -225,7 +225,7 @@
         <w:jc w:val="both"/>
       </w:pPr>
       <w:r>
-        <w:t>삭제 규칙은 명시적인 remove 구절에서 재킷, 핀, 목걸이, 소품의 값을 없음으로 설정한다. 상의와 배경은 삭제 대상에서 제외한다. 유지 규칙과 같은 적용 조건을 확인하고 항목, 적용 값, 근거 구절을 기록한다. 유지 규칙 다음에 삭제 규칙을 적용하며, 같은 항목이 뒤에서 다시 언급되면 앞의 유지 지시를 적용하지 않는다.</w:t>
+        <w:t>삭제 규칙은 명시적인 remove 구절에서 재킷, 핀, 목걸이, 소품의 값을 없음으로 설정한다. 상의와 배경은 삭제 대상에서 제외한다. 유지 규칙과 같은 적용 조건을 확인하고 항목, 적용 값, 근거 구절을 기록한다. 유지 규칙 다음에 삭제 규칙을 적용한다. 같은 항목이 뒤에서 다시 언급되면 앞의 유지 지시는 규칙 적용 대상에서 제외한다.</w:t>
       </w:r>
     </w:p>
     <w:p>
@@ -233,7 +233,7 @@
         <w:jc w:val="both"/>
       </w:pPr>
       <w:r>
-        <w:t>이 방법은 새 모델 학습이나 추가 추론 호출을 요구하지 않는다. 다만 제한 어휘와 문형에 의존한다. 과거 상태가 이미 틀렸다면 유지 규칙은 잘못된 값도 보존할 수 있으며, 지원하지 않는 표현의 의미 해석을 개선하지 못한다.</w:t>
+        <w:t>이 방법은 사전 학습된 모델의 추출·재검토 응답을 그대로 사용한다. 규칙의 적용 범위는 지정된 어휘와 문형으로 한정하며, 그 밖의 표현은 모델이 해석한다. 유지 규칙은 직전 값을 보존하므로 과거 상태의 오류도 다음 턴으로 이어질 수 있다.</w:t>
       </w:r>
     </w:p>
     <w:p>
@@ -249,7 +249,7 @@
         <w:jc w:val="both"/>
       </w:pPr>
       <w:r>
-        <w:t>각 턴에서는 먼저 직전 상태를 복사하고 추출·재검토 응답에서 유효한 변경 사항을 선택한다. 이를 복사한 상태에 적용한 다음, 현재 요청에서 지원 문형에 해당하는 구절을 찾는다. 명시적인 유지 구절의 항목은 직전 값으로 되돌리고, 삭제 구절의 항목은 ‘없음’으로 설정한다. 따라서 유지 규칙이 참조하는 값은 모델 응답을 적용하기 전의 상태이다. 이 순서를 지키지 않으면 잘못 변경된 값을 다시 보존하게 된다. 최종 상태와 함께 적용 항목, 동작 및 근거 구절을 저장한다.</w:t>
+        <w:t>각 턴에서는 먼저 직전 상태를 복사하고 추출·재검토 응답에서 유효한 변경 사항을 선택한다. 이를 복사한 상태에 적용한 다음, 현재 요청에서 지원 문형에 해당하는 구절을 찾는다. 명시적인 유지 구절의 항목은 직전 값으로 되돌리고, 삭제 구절의 항목은 ‘없음’으로 설정한다. 따라서 유지 규칙이 참조하는 값은 모델 응답을 적용하기 전의 상태이다. 모델 응답을 적용한 뒤의 값을 참조하면 잘못 변경된 값도 보존할 수 있다. 최종 상태와 함께 적용 항목, 동작 및 근거 구절을 저장한다.</w:t>
       </w:r>
     </w:p>
     <w:p>
@@ -257,7 +257,7 @@
         <w:jc w:val="both"/>
       </w:pPr>
       <w:r>
-        <w:t>예를 들어 직전 배경이 파란색인 상태에서 배경 유지와 목걸이 삭제를 요청했다고 하자. 모델이 두 항목 모두 ‘원본’으로 추출하더라도 유지 규칙은 배경을 파란색으로, 삭제 규칙은 목걸이를 ‘없음’으로 보정한다. 구절의 의미를 확정할 수 없는 경우에는 규칙으로 값을 덮어쓰지 않는다. 이 처리는 정답 상태를 입력받지 않으며 현재 요청과 직전 상태만 사용한다.</w:t>
+        <w:t>예를 들어 직전 배경이 파란색인 상태에서 배경 유지와 목걸이 삭제를 요청했다고 하자. 모델이 두 항목 모두 ‘원본’으로 추출하더라도 유지 규칙은 배경을 파란색으로, 삭제 규칙은 목걸이를 ‘없음’으로 보정한다. 규칙의 적용 조건을 충족한 구절만 보정하고 나머지는 모델이 갱신한 값을 유지한다. 이 처리에는 현재 요청과 직전 상태만 사용한다.</w:t>
       </w:r>
     </w:p>
     <w:p>
@@ -297,7 +297,7 @@
         <w:jc w:val="both"/>
       </w:pPr>
       <w:r>
-        <w:t>변경 사항 추출에는 Qwen3-4B의 4비트 양자화 모델을 사용하였다. 생성 온도는 0, 최대 출력 길이는 260토큰으로 설정하고 공통 예시 7개를 제공하였다. 32턴에 두 번씩 총 64회 호출하였다. 기준 방법, 유지 규칙만 적용, 삭제 규칙만 적용, 두 규칙 결합을 비교한다. 결합 방식의 채택 조건은 추론 전에 설정하였다. 기준보다 정확한 턴이 늘고, 마지막 상태가 정확한 대화가 줄지 않으며, 유지할 항목을 잘못 변경한 횟수가 늘지 않아야 한다. 두 단독 규칙보다 정확한 턴이 많을 때 결합의 추가 효과가 있는 것으로 판단한다.</w:t>
+        <w:t>변경 사항 추출에는 Qwen3-4B의 4비트 양자화 모델을 사용하였다. 생성 온도는 0, 최대 출력 길이는 260토큰으로 설정하고 공통 예시 7개를 제공하였다. 32턴에 두 번씩 총 64회 호출하였다. 기준 방법, 유지 규칙만 적용, 삭제 규칙만 적용, 두 규칙 결합을 비교한다. 결합 방식의 채택 조건은 추론 전에 설정하였다. 정확한 턴 수는 기준보다 많고, 최종 정답 대화 수는 기준 이상이며, 유지 오류 수는 기준 이하여야 한다. 두 단독 규칙보다 정확한 턴이 많을 때 결합의 추가 효과가 있는 것으로 판단한다.</w:t>
       </w:r>
     </w:p>
     <w:p>
@@ -313,7 +313,7 @@
         <w:jc w:val="both"/>
       </w:pPr>
       <w:r>
-        <w:t>각 요청에 따라 상태를 한 번 갱신하는 단위를 턴으로 부른다. ‘정확한 턴’은 여섯 항목이 모두 정답과 일치하는 턴 수, ‘정확한 항목’은 총 192항목 중 정답과 일치하는 수이다. ‘최종 정답 대화’는 마지막 턴의 여섯 항목이 모두 맞는 대화 수이다. ‘유지 오류’는 직전까지 정확했고 이번에도 유지해야 하는 항목을 잘못 변경한 횟수이다. 같은 대화에 속한 턴들의 의존성을 고려해 유의성 검정 없이 건수와 비율을 비교한다.</w:t>
+        <w:t>각 요청에 따라 상태를 한 번 갱신하는 단위를 턴으로 부른다. ‘정확한 턴’은 여섯 항목이 모두 정답과 일치하는 턴 수, ‘정확한 항목’은 총 192항목 중 정답과 일치하는 수이다. ‘최종 정답 대화’는 마지막 턴의 여섯 항목이 모두 맞는 대화 수이다. ‘유지 오류’는 직전까지 정확했고 이번에도 유지해야 하는 항목을 잘못 변경한 횟수이다. 같은 대화에 속한 턴들의 의존성을 고려하여 기술통계인 건수와 비율로 결과를 비교한다.</w:t>
       </w:r>
     </w:p>
     <w:p>
@@ -321,7 +321,7 @@
         <w:jc w:val="both"/>
       </w:pPr>
       <w:r>
-        <w:t>이미지 실험은 규칙 비교 실험의 32턴, 실제 인물 사진 2명, 두 방법을 조합한 128조건이다. 원본 파일과 프롬프트가 같으면 한 번 생성한 이미지를 함께 사용해 총 66개 이미지를 생성하였다. 방법 간 비교 64쌍 중 입력이 다른 경우는 두 턴과 두 인물을 조합한 4쌍이며, 나머지 60쌍은 같은 이미지를 사용한다. 내장 이미지 생성 도구의 첫 성공 출력을 사용하였다. 이 도구는 내부 모델 버전과 시드를 공개하지 않아 동일 시드로 통제할 수 없었다. 이미지 평가는 Qwen2.5-VL-3B의 4비트 양자화 모델[5]을 사용하였다. 이미지와 목표 상태를 입력하여 여섯 항목을 성공·실패·판단 불가로 판정하였다. 평가 시 방법명과 생성 프롬프트는 제공하지 않았다. 얼굴 유사도는 InsightFace buffalo_l[6]의 코사인 유사도로 측정하였다.</w:t>
+        <w:t>이미지 실험은 규칙 비교 실험의 32턴, 실제 인물 사진 2명, 두 방법을 조합한 128조건이다. 원본 파일과 프롬프트가 같으면 한 번 생성한 이미지를 함께 사용해 총 66개 이미지를 생성하였다. 방법 간 비교 64쌍 중 입력이 다른 경우는 두 턴과 두 인물을 조합한 4쌍이며, 나머지 60쌍은 같은 이미지를 사용한다. 내장 이미지 생성 도구의 첫 성공 출력을 사용하였다. 이 도구의 내부 모델 버전과 시드는 비공개이며, 시드 설정은 도구의 기본 동작을 따랐다. 이미지 평가는 Qwen2.5-VL-3B의 4비트 양자화 모델[5]을 사용하였다. 이미지와 목표 상태를 입력하여 여섯 항목을 성공·실패·판단 불가로 판정하였다. 평가 입력은 이미지와 목표 상태로 한정하였다. 얼굴 유사도는 InsightFace buffalo_l[6]의 코사인 유사도로 측정하였다.</w:t>
       </w:r>
     </w:p>
     <w:p>
@@ -329,7 +329,7 @@
         <w:jc w:val="both"/>
       </w:pPr>
       <w:r>
-        <w:t>원본 사진은 Pexels에 공개된 Monstera Production의 인물 사진 2장이다[7,8]. 두 인물을 각각 R01, R02로 구분하고, 512×336, 512×768 크기로 입력하였다. 그림의 의상·장신구·배경은 AI 편집 결과이며 사진 속 인물의 실제 행동이나 연구 참여를 나타내지 않는다.</w:t>
+        <w:t>원본 사진은 Pexels에 공개된 Monstera Production의 인물 사진 2장이다[7,8]. 두 인물을 각각 R01, R02로 구분하고, 512×336, 512×768 크기로 입력하였다. 사진은 공개 이미지 자료로 사용하였으며, 그림의 의상·장신구·배경은 AI로 편집하였다.</w:t>
       </w:r>
     </w:p>
     <w:p>
@@ -369,7 +369,7 @@
         <w:jc w:val="both"/>
       </w:pPr>
       <w:r>
-        <w:t>복합 요청 실험은 기존 여섯 항목에 몸 방향·손동작·표정을 더한 아홉 항목을 사용한다. 어휘와 허용 값을 다시 정하고, 마침표로 구분한 유지·삭제·복원 구절을 검사하는 별도 구현을 사용하였다. 앞선 규칙 비교 및 재검증 실험과 달리 상태 항목과 규칙 구현을 확장하였다. 최초 추출만 사용하는 방법, 한 차례 재검토한 방법, 재검토 뒤 구절 규칙으로 보정한 방법을 비교하였다. 최초 추출은 턴당 한 번, 나머지 두 방법은 두 번 호출하며 규칙 보정에는 추가 호출이 없다.</w:t>
+        <w:t>복합 요청 실험은 기존 여섯 항목에 몸 방향·손동작·표정을 더한 아홉 항목을 사용한다. 어휘와 허용 값을 다시 정하고, 마침표로 구분한 유지·삭제·복원 구절을 검사하는 별도 구현을 사용하였다. 앞선 규칙 비교 및 재검증 실험과 달리 상태 항목과 규칙 구현을 확장하였다. 최초 추출만 사용하는 방법, 한 차례 재검토한 방법, 재검토 뒤 구절 규칙으로 보정한 방법을 비교하였다. 최초 추출은 턴당 한 번, 나머지 두 방법은 두 번 호출한다. 규칙 보정은 재검토 응답에 적용한다.</w:t>
       </w:r>
     </w:p>
     <w:p>
@@ -377,7 +377,7 @@
         <w:jc w:val="both"/>
       </w:pPr>
       <w:r>
-        <w:t>Qwen3-4B-4bit의 온도를 0, 최대 출력을 320토큰으로 설정하고 공통 예시 두 개를 제공하였다. 전체 추론은 96회이며 방법 간 응답을 공유하였다. 코드·대화·정답·설정을 추론 전에 고정하였다. 모든 항목이 맞는 턴 수와 표정·몸 방향·손동작의 정확도를 따로 집계하였다. 조건 간에는 문장 길이와 지시 종류도 함께 달라지므로 결과 차이를 포즈 추가의 인과 효과로 해석하지 않는다.</w:t>
+        <w:t>Qwen3-4B-4bit의 온도를 0, 최대 출력을 320토큰으로 설정하고 공통 예시 두 개를 제공하였다. 전체 추론은 96회이며 방법 간 응답을 공유하였다. 코드·대화·정답·설정을 추론 전에 고정하였다. 모든 항목이 맞는 턴 수와 표정·몸 방향·손동작의 정확도를 따로 집계하였다. 조건 간에는 문장 길이와 지시 종류가 함께 달라진다. 따라서 조건별 결과는 포즈와 속성 지시를 조합한 요청에 대한 처리 정확도를 나타낸다.</w:t>
       </w:r>
     </w:p>
     <w:p>
@@ -385,7 +385,7 @@
         <w:jc w:val="both"/>
       </w:pPr>
       <w:r>
-        <w:t>생성 단계는 첫 번째 시나리오의 첫 턴을 세 조건에서 골라 두 원본 사진에 적용한 6장으로 따로 검사하였다. 선택 기준은 텍스트 결과 집계 전에 정하였다. 추출 모델의 출력 대신 정확한 요청을 직접 전달하고 첫 성공 이미지만 사용하였다. 단일·복합·혼합 조건의 시각적 목표는 각각 1·3·6개이며, Qwen2.5-VL-7B-4bit로 목표별 성공·실패·판단 불가와 설명을 받았다. 이는 방법 간 비교가 아닌 생성 단계의 예비 진단이다.</w:t>
+        <w:t>생성 단계는 첫 번째 시나리오의 첫 턴을 세 조건에서 골라 두 원본 사진에 적용한 6장으로 따로 검사하였다. 선택 기준은 텍스트 결과 집계 전에 정하였다. 추출 모델의 출력 대신 정확한 요청을 직접 전달하고 첫 성공 이미지만 사용하였다. 단일·복합·혼합 조건의 시각적 목표는 각각 1·3·6개이며, Qwen2.5-VL-7B-4bit로 목표별 성공·실패·판단 불가와 설명을 받았다. 이 검사는 정확한 요청을 입력했을 때의 이미지 생성 결과를 살펴보기 위한 것이다.</w:t>
       </w:r>
     </w:p>
     <w:p>
@@ -1113,7 +1113,7 @@
         <w:jc w:val="both"/>
       </w:pPr>
       <w:r>
-        <w:t>규칙 비교 실험의 세 번째 대화에서는 3턴에 식물을 삭제하고 재킷은 유지하도록 요청하였다. 기준 방법과 유지 규칙만 적용한 방법은 식물을 남겼고, 삭제 규칙은 식물의 값을 없음으로 바꾸었다. 이어진 4턴에서는 상의와 목걸이를 원본으로 돌리되 재킷과 연한 파란색 배경은 그대로 두도록 요청하였다. 기준 방법과 삭제 규칙만 적용한 방법은 배경도 원본으로 바꾸었다. 유지 규칙은 배경을 보존하였지만 이전 턴에서 남긴 식물까지 삭제하지는 못했다.</w:t>
+        <w:t>규칙 비교 실험의 세 번째 대화에서는 3턴에 식물을 삭제하고 재킷은 유지하도록 요청하였다. 기준 방법과 유지 규칙만 적용한 방법은 식물을 남겼고, 삭제 규칙은 식물의 값을 없음으로 바꾸었다. 이어진 4턴에서는 상의와 목걸이를 원본으로 돌리되 재킷과 연한 파란색 배경은 그대로 두도록 요청하였다. 기준 방법과 삭제 규칙만 적용한 방법은 배경도 원본으로 바꾸었다. 유지 규칙을 적용한 출력에서는 배경과 함께 이전 턴의 식물도 남았다.</w:t>
       </w:r>
     </w:p>
     <w:p>
@@ -1977,7 +1977,7 @@
         <w:jc w:val="both"/>
       </w:pPr>
       <w:r>
-        <w:t>3B 평가 모델이 목표를 충족한 것으로 판정한 항목 수는 기준 방법 350/384, 결합 방법 358/384였다. 서로 다른 이미지·목표 조합 68개 중 3개에서는 응답 형식 오류로 평가 결과를 읽을 수 없었다. 판독하지 못한 응답을 다시 채점하지 않고 판단 불가로 집계하였다.</w:t>
+        <w:t>3B 평가 모델이 목표를 충족한 것으로 판정한 항목 수는 기준 방법 350/384, 결합 방법 358/384였다. 서로 다른 이미지·목표 조합 68개 중 3개에서 응답 형식 오류가 발생하였다. 최초 평가 응답을 기준으로 집계하고 형식 오류가 있는 응답은 판단 불가로 처리하였다.</w:t>
       </w:r>
     </w:p>
     <w:p>
@@ -2419,7 +2419,7 @@
         <w:jc w:val="both"/>
       </w:pPr>
       <w:r>
-        <w:t>증가한 8개 성공 항목 중 6개는 판단 불가에서 성공으로 바뀌었고 실패에서 성공으로 바뀐 항목은 2개였다. 세 번째 대화의 R02 3턴 기준 평가가 JSON 대신 느낌표를 출력하여 6항목 모두 판단 불가가 된 영향이 크다. 또 같은 턴의 결합 출력에서는 소품이 없다는 설명과 ‘소품 없음’에 대한 실패 점수가 모순되었다. 따라서 증가분 전체를 실제 편집 오류의 해소로 해석하기 어렵다.</w:t>
+        <w:t>증가한 8개 성공 항목 중 6개는 판단 불가에서 성공으로 바뀌었고 실패에서 성공으로 바뀐 항목은 2개였다. 세 번째 대화의 R02 3턴 기준 평가가 JSON 대신 느낌표를 출력하여 6항목 모두 판단 불가가 된 영향이 크다. 또 같은 턴의 결합 출력에서는 소품이 없다는 설명과 ‘소품 없음’에 대한 실패 점수가 모순되었다. 즉, 성공 항목 수의 증가에는 평가 응답의 형식과 판정 오류도 영향을 주었다.</w:t>
       </w:r>
     </w:p>
     <w:p>
@@ -2427,7 +2427,7 @@
         <w:jc w:val="both"/>
       </w:pPr>
       <w:r>
-        <w:t>얼굴 코사인 유사도는 기준 평균 0.910458, 결합 평균 0.910535였다. 입력이 다른 네 쌍의 평균 차이는 +0.001237이지만 두 쌍은 증가하고 두 쌍은 감소하였다. 나머지 60쌍은 같은 출력이므로 전체 평균 차이만으로 얼굴 보존의 개선 여부를 판단하기 어렵다.</w:t>
+        <w:t>얼굴 코사인 유사도는 기준 평균 0.910458, 결합 평균 0.910535였다. 입력이 다른 네 쌍의 평균 차이는 +0.001237이지만 두 쌍은 증가하고 두 쌍은 감소하였다. 나머지 60쌍은 같은 출력을 공유하므로 전체 평균 차이는 입력이 다른 네 쌍에서 발생하였다.</w:t>
       </w:r>
     </w:p>
     <w:p>
@@ -2435,7 +2435,7 @@
         <w:jc w:val="both"/>
       </w:pPr>
       <w:r>
-        <w:t>평가 모델에 따른 판정 차이를 분석하기 위해 Qwen2.5-VL-7B의 4비트 양자화 모델로 전체 68개 이미지·목표 쌍을 다시 평가하였다. 재평가 전에 대상과 설정을 확정하였으며 목표 문구, 파서, 온도, 최대 토큰은 1차 평가와 같았다. 같은 계열 모델을 사용한 사후 분석이므로 두 모델의 일치만으로 판정의 정확성을 확인할 수는 없다. 7B 평가에서 목표 충족 수는 기준 372/384, 결합 374/384였고 JSON 파싱 실패와 판단 불가는 없었다.</w:t>
+        <w:t>평가 모델에 따른 판정 차이를 분석하기 위해 Qwen2.5-VL-7B의 4비트 양자화 모델로 전체 68개 이미지·목표 쌍을 다시 평가하였다. 재평가 전에 대상과 설정을 확정하였으며 목표 문구, 파서, 온도, 최대 토큰은 1차 평가와 같았다. 이는 같은 계열의 두 평가 모델 사이에서 판정이 얼마나 일치하는지 살펴본 사후 분석이다. 7B 평가에서 목표 충족 수는 기준 372/384, 결합 374/384였고 JSON 파싱 실패와 판단 불가는 각각 0개였다.</w:t>
       </w:r>
     </w:p>
     <w:p>
@@ -3488,7 +3488,7 @@
         <w:jc w:val="both"/>
       </w:pPr>
       <w:r>
-        <w:t>7B 모델에서도 설명과 점수가 일치하지 않는 경우가 있었다. 두 인물의 3턴 기준 출력에 식물이 보인다고 설명한 뒤 식물이 없다고도 설명하면서 모두 성공으로 채점하였다. R02 4턴에서도 같은 소품 설명 모순이 나타났다. 표에는 평가 모델이 반환한 점수를 그대로 집계하였다. 따라서 JSON 형식 오류의 감소와 실제 편집 정확도의 향상을 구분해야 한다.</w:t>
+        <w:t>7B 모델에서도 설명과 점수가 일치하지 않는 경우가 있었다. 두 인물의 3턴 기준 출력에 식물이 보인다고 설명한 뒤 식물이 없다고도 설명하면서 모두 성공으로 채점하였다. R02 4턴에서도 같은 소품 설명 모순이 나타났다. 표에는 평가 모델이 반환한 점수를 그대로 집계하였다. 응답 형식 오류가 해소된 뒤에도 내용상의 모순은 남았다.</w:t>
       </w:r>
     </w:p>
     <w:p>
@@ -3496,7 +3496,7 @@
         <w:jc w:val="both"/>
       </w:pPr>
       <w:r>
-        <w:t>초기 개발 대화의 이미지 실험에서는 128조건에 대해 68개 이미지를 생성하였다. 목표 충족 수는 기준 354/384, 유지 규칙 355/384였고 얼굴 코사인 평균은 각각 0.914851과 0.914108이었다. 입력이 다른 네 쌍 중 인물 R01의 두 번째 개발 대화 2턴에서 소품 판정 하나만 판단 불가에서 성공으로 바뀌었다. 실패에서 성공으로 바뀐 항목은 없었으며 JSON 파싱 실패 4개와 설명·점수 불일치가 있었다.</w:t>
+        <w:t>초기 개발 대화의 이미지 실험에서는 128조건에 대해 68개 이미지를 생성하였다. 목표 충족 수는 기준 354/384, 유지 규칙 355/384였고 얼굴 코사인 평균은 각각 0.914851과 0.914108이었다. 입력이 다른 네 쌍 중 인물 R01의 두 번째 개발 대화 2턴에서 소품 판정 하나만 판단 불가에서 성공으로 바뀌었다. 실패에서 성공으로 바뀐 항목은 0개였으며 JSON 파싱 실패 4개와 설명·점수 불일치가 있었다.</w:t>
       </w:r>
     </w:p>
     <w:p>
@@ -3974,7 +3974,7 @@
         <w:jc w:val="both"/>
       </w:pPr>
       <w:r>
-        <w:t>혼합 조건의 오류는 네 시나리오에서 같은 형태로 나타났다. 2턴의 식물 삭제와 3턴의 목걸이 삭제를 모델이 ‘원본’으로 추출하였고 재검토에서도 같은 값을 반환하였다. 식물 오류는 2~4턴, 목걸이 오류는 3~4턴에 남아 총 20개의 항목 오류로 집계되었다. 서로 다른 20종의 오류가 아니라 두 삭제 지시의 오류가 후속 상태에 누적된 결과이다. 사후에 삭제 규칙만 적용하여 재계산해도 48턴 모두 정확하였다. 복합 요청 실험에서는 유지·복원 규칙을 함께 적용한 추가 이점은 나타나지 않았다.</w:t>
+        <w:t>혼합 조건의 오류는 네 시나리오에서 같은 형태로 나타났다. 2턴의 식물 삭제와 3턴의 목걸이 삭제를 모델이 ‘원본’으로 추출하였고 재검토에서도 같은 값을 반환하였다. 식물 오류는 2~4턴, 목걸이 오류는 3~4턴에 남아 총 20개의 항목 오류로 집계되었다. 이 20개는 두 삭제 지시의 오류가 각 시나리오의 후속 상태에 누적된 건수이다. 사후에 삭제 규칙만 적용하여 재계산한 결과도 48턴 모두 정확하여, 유지·복원 규칙을 함께 적용한 결과와 같았다.</w:t>
       </w:r>
     </w:p>
     <w:p>
@@ -3982,7 +3982,7 @@
         <w:jc w:val="both"/>
       </w:pPr>
       <w:r>
-        <w:t>네 시나리오는 표정과 몸 방향이 다르지만 삭제·복원 문형은 공유한다. 따라서 16/16은 정해진 혼합 문형에 대한 결과이다. 이번 검사에서 포즈 자체의 추출 오류는 없었으며, 확인된 문제는 대상을 없애는 동작과 최초 사진으로 복원하는 동작의 혼동이었다.</w:t>
+        <w:t>네 시나리오는 표정과 몸 방향이 다르지만 삭제·복원 문형은 공유한다. 따라서 16/16은 정해진 혼합 문형에 대한 결과이다. 포즈는 정확히 추출되었으며, 오류는 대상 삭제와 원본 복원의 혼동에서 발생하였다.</w:t>
       </w:r>
     </w:p>
     <w:p>
@@ -3990,7 +3990,7 @@
         <w:jc w:val="both"/>
       </w:pPr>
       <w:r>
-        <w:t>이 오류를 분석한 뒤 포즈를 제외한 짧은 대조 요청 8개를 고정하고 같은 설정으로 16회 추가 추론하였다. 최초 추출과 재검토는 각각 7/8이 정확하였다. 식물·목걸이의 삭제·복원을 단독으로 요청한 네 경우는 모두 맞았다. 그러나 “Remove the plant. Restore the necklace to the original.”에서는 식물도 ‘원본’으로 추출하였다. 두 문장의 순서만 바꾼 경우는 정확하였다. 이는 사후 진단이며 복합 요청 실험의 48턴에 합산하지 않는다. 이 사례에서는 포즈가 없어도 삭제와 복원을 함께 요청하면 오류가 발생하였다.</w:t>
+        <w:t>복합 요청 실험의 오류를 분석한 뒤, 포즈를 제외한 짧은 대조 요청 8개를 구성하였다. 요청을 확정하고 같은 설정으로 16회 추가 추론하여 결과를 별도로 집계하였다. 최초 추출과 재검토는 각각 7/8이 정확하였다. 식물·목걸이의 삭제·복원을 단독으로 요청한 네 경우는 모두 맞았다. 그러나 “Remove the plant. Restore the necklace to the original.”에서는 식물도 ‘원본’으로 추출하였다. 두 문장의 순서만 바꾼 경우는 정확하였다. 삭제와 복원만으로 구성한 짧은 요청에서도 같은 오류가 발생하였다.</w:t>
       </w:r>
     </w:p>
     <w:p>
@@ -4006,7 +4006,7 @@
         <w:jc w:val="both"/>
       </w:pPr>
       <w:r>
-        <w:t>정확한 요청을 직접 입력한 이미지 6장의 AI 평가에서 두 인물 모두 복합 조건은 2/3, 혼합 조건은 5/6의 목표를 충족한 것으로 집계되었다. 실패 점수는 몸 방향에 부여되었으나 설명에서는 요청한 방향으로 회전했다고 서술하였다. 또한 설명이 각 목표 문장을 그대로 반복하였다. 단일 조건의 두 응답은 목표 하나에 점수 세 개를 반환하고 예시 설명을 복사하여 판독할 수 없었다. 두 응답은 모두 판단 불가로 처리하였다.</w:t>
+        <w:t>정확한 요청을 직접 입력한 이미지 6장의 AI 평가에서 두 인물 모두 복합 조건은 2/3, 혼합 조건은 5/6의 목표를 충족한 것으로 집계되었다. 실패 점수는 몸 방향에 부여되었으나 설명에서는 요청한 방향으로 회전했다고 서술하였다. 또한 설명이 각 목표 문장을 그대로 반복하였다. 단일 조건의 두 응답은 목표 하나에 점수 세 개를 반환하고 예시 설명을 복사하였다. 평가 형식에 맞지 않는 두 응답은 모두 판단 불가로 처리하였다.</w:t>
       </w:r>
     </w:p>
     <w:p>
@@ -4014,7 +4014,7 @@
         <w:jc w:val="both"/>
       </w:pPr>
       <w:r>
-        <w:t>이 결과는 점수만으로 몸 방향의 성공 여부를 확정할 수 없음을 보여준다. 이미지와 평가에는 각각 첫 성공 출력과 최초 평가 응답을 사용하였다. 조건마다 목표 수가 다르고 각 인물·조건에서 한 장만 생성했으므로 2/3과 5/6을 생성 성공률이나 복잡도별 성능 차이로 해석하지 않는다.</w:t>
+        <w:t>이미지와 평가에는 각각 첫 성공 출력과 최초 평가 응답을 사용하였다. 2/3과 5/6은 각 인물·조건에서 생성한 이미지 한 장의 목표 충족 수이다. 조건별 목표 수가 다르므로 각 점수는 해당 이미지의 개별 평가 결과로 제시하였다.</w:t>
       </w:r>
     </w:p>
     <w:p>
@@ -4030,7 +4030,7 @@
         <w:jc w:val="both"/>
       </w:pPr>
       <w:r>
-        <w:t>유지와 삭제는 서로 다른 상태 갱신 동작을 요구한다. 유지 규칙은 직전 값을 보존하므로, 이전 턴에 남은 삭제 대상까지 제거하지는 않는다. 반대로 삭제 규칙은 명시된 대상을 제거하지만 다른 항목의 불필요한 변경을 방지하지는 않는다. 규칙 비교 실험의 세 번째 대화에서 두 규칙을 결합한 경우에만 식물 삭제와 배경 유지가 모두 정확했던 결과는 이러한 차이에 따른 것이다. 후속 개발 대화에서는 keep만으로 유지 여부를 판단하여 삭제·변경 요청을 오인하였다. 이에 따라 제안 규칙은 항목 이름과 명시적 유지·삭제 표현이 함께 있는 구절에 적용한다.</w:t>
+        <w:t>유지와 삭제는 서로 다른 상태 갱신 동작을 요구한다. 유지 규칙은 직전 값을 보존하므로 이전 턴의 삭제 누락도 다음 상태로 이어질 수 있다. 삭제 규칙의 보정 대상은 현재 요청에서 삭제가 명시된 항목이며, 나머지 항목은 모델의 갱신 결과를 따른다. 규칙 비교 실험의 세 번째 대화에서 두 규칙을 결합한 경우에만 식물 삭제와 배경 유지가 모두 정확했던 결과는 이러한 차이에 따른 것이다. 후속 개발 대화에서는 keep만으로 유지 여부를 판단하여 삭제·변경 요청을 오인하였다. 이에 따라 제안 규칙은 항목 이름과 명시적 유지·삭제 표현이 함께 있는 구절에 적용한다.</w:t>
       </w:r>
     </w:p>
     <w:p>
@@ -4054,7 +4054,7 @@
         <w:jc w:val="both"/>
       </w:pPr>
       <w:r>
-        <w:t>이미지 실험은 인물 2명과 생성 도구 하나를 사용하였고, 비교 64쌍 중 60쌍이 같은 출력을 공유하였다. 두 AI 평가 모두 설명과 점수의 불일치가 있어 점수 증가를 전반적인 이미지 품질 향상으로 해석하기 어렵다. 얼굴 특징 벡터의 코사인 유사도는 입력이 다른 네 쌍 중 두 쌍에서 상승하고 두 쌍에서 하락하였다.</w:t>
+        <w:t>이미지 실험은 인물 2명과 생성 도구 하나를 사용하였고, 비교 64쌍 중 60쌍이 같은 출력을 공유하였다. 두 AI 평가 모두 설명과 점수의 불일치가 나타났다. 따라서 이미지 결과의 분석 범위는 개별 편집 사례와 평가 모델의 판정 차이로 한정하였다. 얼굴 특징 벡터의 코사인 유사도는 입력이 다른 네 쌍 중 두 쌍에서 상승하고 두 쌍에서 하락하였다.</w:t>
       </w:r>
     </w:p>
     <w:p>

</xml_diff>

<commit_message>
Define evaluation measures and clarify terminology throughout thesis
</commit_message>
<xml_diff>
--- a/paper/manuscript.inha.docx
+++ b/paper/manuscript.inha.docx
@@ -65,7 +65,7 @@
         <w:t xml:space="preserve">요약: </w:t>
       </w:r>
       <w:r>
-        <w:t>반복 이미지 편집에서는 변경할 내용과 유지하거나 삭제할 내용을 다음 프롬프트에 정확히 반영해야 한다. 본 연구는 언어 모델이 변경 사항을 추출하고 재검토한 뒤 명시적인 유지·삭제 지시를 확인하는 후처리 규칙을 제안한다. 유지 규칙은 이전 값을 보존하고 삭제 규칙은 값을 없음으로 설정한다. 유지·삭제 규칙 비교 실험의 대화 8개 32턴에서 동일한 모델 응답에 네 방법을 적용하였다. 여섯 항목이 모두 정확한 턴은 기준 방법 27, 유지 규칙만 27, 삭제 규칙만 28, 두 규칙 결합 29였다. 새로운 대화 8개 32턴을 이용한 재검증에서도 정확한 턴이 28/32에서 29/32로 증가하였다. 포즈·표정을 포함한 복합 요청 실험의 12개 대화 48턴에서는 속성 지시를 혼합한 조건의 정확한 턴이 재검토 4/16에서 규칙 보정 16/16으로 증가하였다. 복합 요청 실험의 개선은 삭제를 원본 복원으로 잘못 해석한 오류를 삭제 규칙이 바로잡은 결과였다. 실제 인물 2명의 사진을 이용한 이미지 평가에서는 평가 모델의 설명과 점수가 일치하지 않는 사례가 나타났다. 정해진 영어 문형의 합성 대화에서 추가 모델 호출 없이 상태 갱신 오류를 감소시켰다.</w:t>
+        <w:t>반복 이미지 편집에서는 변경할 내용과 유지하거나 삭제할 내용을 다음 프롬프트에 정확히 반영해야 한다. 본 연구는 언어 모델이 변경 사항을 추출하고 재검토한 뒤 명시적인 유지·삭제 지시를 확인하는 후처리 규칙을 제안한다. 유지 규칙은 이전 값을 보존하고 삭제 규칙은 값을 없음으로 설정한다. 유지·삭제 규칙 비교 실험의 대화 8개 32턴에서 동일한 모델 응답에 네 방법을 적용하였다. 요청 처리 후 여섯 항목이 모두 정답과 일치한 비율은 기준 방법 27/32, 유지 규칙만 27/32, 삭제 규칙만 28/32, 두 규칙 결합 29/32였다. 새로운 대화 8개 32턴을 이용한 재검증에서도 전체 상태 일치율이 28/32에서 29/32로 증가하였다. 포즈·표정을 포함한 복합 요청 실험의 12개 대화 48턴에서는 속성 지시를 혼합한 조건의 전체 상태 일치율이 재검토 4/16에서 규칙 보정 16/16으로 증가하였다. 실제 인물 2명의 사진을 이용한 이미지 평가에서는 평가 모델의 설명과 점수가 일치하지 않는 사례가 나타났다. 제안 규칙은 추가 모델 호출 없이 상태 갱신 오류를 줄였다.</w:t>
       </w:r>
     </w:p>
     <w:p>
@@ -79,7 +79,7 @@
         <w:t xml:space="preserve">Abstract: </w:t>
       </w:r>
       <w:r>
-        <w:t>Iterative portrait editing requires prompts to reflect requested changes while preserving or removing specified attributes. We apply explicit preservation and removal rules after a language model extracts and reviews the requested changes. Preservation retains the previous value, whereas removal sets an attribute to absent. In the preservation and removal rule comparison using eight synthetic English dialogues with 32 turns, all six attributes were correct in 27/32 turns for the baseline, 27/32 for preservation alone, 28/32 for removal alone, and 29/32 for their combination. In a replication using eight new dialogues and 32 turns, correct turns increased from 28/32 to 29/32. A separate complex-request experiment comprised 12 dialogues and 48 turns involving expressions and poses. For the condition combining these requests with attribute changes, preservation, removal, and restoration, correct turns increased from 4/16 after model review to 16/16 after rule correction. In this experiment, removal rules corrected confusion between removing an object and restoring its original state. An image study using two portrait references revealed inconsistencies between evaluator explanations and scores. The rules reduced state-update errors without additional model calls within the tested English patterns and synthetic dialogues.</w:t>
+        <w:t>Iterative portrait editing requires accurate updates to requested attribute values. We apply explicit preservation and removal rules after a language model extracts and reviews the requested changes. Preservation retains the previous value, whereas removal sets an attribute to absent. Across eight synthetic English dialogues with 32 turns, all six attribute values matched the reference state in 27/32 turns for the baseline, 27/32 for preservation alone, 28/32 for removal alone, and 29/32 for their combination. In eight new dialogues with 32 turns, the full-state match rate increased from 28/32 to 29/32. A separate complex-request experiment comprised 12 dialogues and 48 turns involving expressions and poses. When combined with attribute changes, preservation, removal, and restoration, the full-state match rate increased from 4/16 after model review to 16/16 after rule correction. In this experiment, removal rules corrected confusion between removing an object and restoring its original state. An image study using two portrait references revealed inconsistencies between evaluator explanations and scores. The rules reduced state-update errors without additional model calls within the tested English patterns and synthetic dialogues.</w:t>
       </w:r>
     </w:p>
     <w:p>
@@ -129,7 +129,7 @@
         <w:jc w:val="both"/>
       </w:pPr>
       <w:r>
-        <w:t>본 연구에서는 언어 모델이 추출하고 재검토한 변경 사항에 명시적 유지·삭제 제약을 적용하는 상태 갱신 방법을 제안한다. 유지 지시가 있는 항목은 직전 값을 보존하고, 삭제 지시가 있는 항목은 없음으로 설정한다. 동일한 모델 응답에 각 규칙을 단독 또는 결합하여 적용함으로써 유지 오류와 삭제 누락에 대한 각 규칙의 효과를 분석한다.</w:t>
+        <w:t>본 연구에서는 언어 모델이 추출하고 재검토한 변경 사항에 명시적 유지·삭제 제약을 적용하는 상태 갱신 방법을 제안한다. 유지 지시가 있는 항목은 직전 값을 보존하고, 삭제 지시가 있는 항목은 없음으로 설정한다. 동일한 모델 응답에 각 규칙을 단독 또는 결합하여 적용함으로써 유지 지시 위반과 삭제 누락에 대한 각 규칙의 효과를 분석한다.</w:t>
       </w:r>
     </w:p>
     <w:p>
@@ -185,7 +185,7 @@
         <w:jc w:val="both"/>
       </w:pPr>
       <w:r>
-        <w:t>편집 상태는 재킷, 상의, 핀, 목걸이, 배경, 소품의 여섯 항목으로 구성한다. 각 항목에는 지정된 속성 값 또는 ‘원본’을 저장한다. 제거 가능한 재킷·핀·목걸이·소품에는 ‘없음’도 사용할 수 있다. ‘원본’은 최초 사진의 상태로 복원하는 동작이며, ‘없음’은 대상을 제거하는 동작이다. 초기에는 모든 항목을 ‘원본’으로 설정한다.</w:t>
+        <w:t>편집 상태는 현재까지의 요청을 반영한 항목별 요구 값이다. 재킷·상의·핀·목걸이·배경·소품의 여섯 항목을 저장한다. 각 항목에는 지정된 속성 값 또는 ‘원본’을 저장한다. 제거 가능한 재킷·핀·목걸이·소품에는 ‘없음’도 사용할 수 있다. ‘원본’은 최초 사진의 상태로 복원하는 동작이며, ‘없음’은 대상을 제거하는 동작이다. 초기에는 모든 항목을 ‘원본’으로 설정한다.</w:t>
       </w:r>
     </w:p>
     <w:p>
@@ -193,7 +193,7 @@
         <w:jc w:val="both"/>
       </w:pPr>
       <w:r>
-        <w:t>각 턴에서 Qwen3-4B-4bit[4]가 현재 요청의 변경 사항을 JSON으로 추출한 뒤, 요청과 첫 응답을 입력받아 재검토한다. 추출기의 입력은 현재 요청으로 한정한다. 이에 따라 모든 비교 방법에 동일한 두 모델 응답을 사용할 수 있다. 각 방법은 이 응답을 자신의 이전 편집 상태에 적용하고 검증한다.</w:t>
+        <w:t>각 턴에서 Qwen3-4B-4bit[4]가 현재 요청의 변경 사항을 JSON 형식의 항목·값 목록으로 추출한 뒤, 요청과 첫 응답을 입력받아 재검토한다. 추출기의 입력은 현재 요청으로 한정한다. 이에 따라 모든 비교 방법에 동일한 두 모델 응답을 사용할 수 있다. 각 방법은 이 응답을 자신의 이전 편집 상태에 적용하고 검증한다.</w:t>
       </w:r>
     </w:p>
     <w:p>
@@ -249,7 +249,7 @@
         <w:jc w:val="both"/>
       </w:pPr>
       <w:r>
-        <w:t>각 턴에서는 먼저 직전 상태를 복사하고 추출·재검토 응답에서 유효한 변경 사항을 선택한다. 이를 복사한 상태에 적용한 다음, 현재 요청에서 지원 문형에 해당하는 구절을 찾는다. 명시적인 유지 구절의 항목은 직전 값으로 되돌리고, 삭제 구절의 항목은 ‘없음’으로 설정한다. 따라서 유지 규칙이 참조하는 값은 모델 응답을 적용하기 전의 상태이다. 모델 응답을 적용한 뒤의 값을 참조하면 잘못 변경된 값도 보존할 수 있다. 최종 상태와 함께 적용 항목, 동작 및 근거 구절을 저장한다.</w:t>
+        <w:t>각 턴에서는 먼저 직전 상태를 복사하고 추출·재검토 응답에서 허용된 항목과 값에 맞는 변경 사항을 선택한다. 이를 복사한 상태에 적용한 다음, 현재 요청에서 지원 문형에 해당하는 구절을 찾는다. 명시적인 유지 구절의 항목은 직전 값으로 되돌리고, 삭제 구절의 항목은 ‘없음’으로 설정한다. 따라서 유지 규칙이 참조하는 값은 모델 응답을 적용하기 전의 상태이다. 모델 응답을 적용한 뒤의 값을 참조하면 잘못 변경된 값도 보존할 수 있다. 최종 상태와 함께 적용 항목, 동작 및 근거 구절을 저장한다.</w:t>
       </w:r>
     </w:p>
     <w:p>
@@ -281,7 +281,7 @@
         <w:jc w:val="both"/>
       </w:pPr>
       <w:r>
-        <w:t>초기 개발 대화에서는 keep을 폭넓게 탐지하는 유지 규칙이 정확한 턴 수를 기준 30/32에서 32/32로 증가시켰다. 그러나 후속 검사에서 off나 색 변경 요청을 유지 지시로 잘못 처리하였다. 후속 개발 대화에서 이 규칙의 정확한 턴은 12/32였고, 적용 문형을 좁힌 유지 규칙은 기준과 같은 27/32였다. 문형을 좁혀도 마지막 상태가 정확한 대화는 6/8에서 5/8로 감소하였다. 중간 턴의 잘못된 삭제는 막았지만 다음 턴의 실제 삭제 요청을 모델이 놓쳤기 때문이다.</w:t>
+        <w:t>초기 개발 대화에서는 keep을 폭넓게 탐지하는 유지 규칙이 전체 상태 일치율을 기준 30/32에서 32/32로 증가시켰다. 그러나 후속 검사에서 off나 색 변경 요청을 유지 지시로 잘못 처리하였다. 후속 개발 대화에서 이 규칙의 전체 상태 일치율은 12/32였고, 적용 문형을 좁힌 유지 규칙은 기준과 같은 27/32였다. 문형을 좁혀도 최종 상태 일치율은 6/8에서 5/8로 감소하였다. 중간 턴의 잘못된 삭제는 막았지만 다음 턴의 실제 삭제 요청을 모델이 놓쳤기 때문이다.</w:t>
       </w:r>
     </w:p>
     <w:p>
@@ -297,7 +297,7 @@
         <w:jc w:val="both"/>
       </w:pPr>
       <w:r>
-        <w:t>변경 사항 추출에는 Qwen3-4B의 4비트 양자화 모델을 사용하였다. 생성 온도는 0, 최대 출력 길이는 260토큰으로 설정하고 공통 예시 7개를 제공하였다. 32턴에 두 번씩 총 64회 호출하였다. 기준 방법, 유지 규칙만 적용, 삭제 규칙만 적용, 두 규칙 결합을 비교한다. 결합 방식의 채택 조건은 추론 전에 설정하였다. 정확한 턴 수는 기준보다 많고, 최종 정답 대화 수는 기준 이상이며, 유지 오류 수는 기준 이하여야 한다. 두 단독 규칙보다 정확한 턴이 많을 때 결합의 추가 효과가 있는 것으로 판단한다.</w:t>
+        <w:t>변경 사항 추출에는 Qwen3-4B의 4비트 양자화 모델을 사용하였다. 생성 온도는 0, 최대 출력 길이는 260토큰으로 설정하고 공통 예시 7개를 제공하였다. 32턴에 두 번씩 총 64회 호출하였다. 기준 방법, 유지 규칙만 적용, 삭제 규칙만 적용, 두 규칙 결합을 비교한다. 결합 방식의 채택 조건은 추론 전에 설정하였다. 전체 상태 일치율은 기준보다 높고, 최종 상태 일치율은 기준 이상이며, 유지 지시 위반 수는 기준 이하여야 한다. 두 단독 규칙보다 전체 상태 일치율이 높을 때 결합의 추가 효과가 있는 것으로 판단한다.</w:t>
       </w:r>
     </w:p>
     <w:p>
@@ -313,7 +313,7 @@
         <w:jc w:val="both"/>
       </w:pPr>
       <w:r>
-        <w:t>각 요청에 따라 상태를 한 번 갱신하는 단위를 턴으로 부른다. ‘정확한 턴’은 여섯 항목이 모두 정답과 일치하는 턴 수, ‘정확한 항목’은 총 192항목 중 정답과 일치하는 수이다. ‘최종 정답 대화’는 마지막 턴의 여섯 항목이 모두 맞는 대화 수이다. ‘유지 오류’는 직전까지 정확했고 이번에도 유지해야 하는 항목을 잘못 변경한 횟수이다. 같은 대화에 속한 턴들의 의존성을 고려하여 기술통계인 건수와 비율로 결과를 비교한다.</w:t>
+        <w:t>사용자의 수정 요청 한 번과 그에 따른 상태 갱신을 한 턴으로 정의한다. 전체 상태 일치율은 처리한 요청 중 모든 항목의 값이 정답과 일치한 요청의 비율이다. 기본 실험은 여섯 항목, 복합 요청 실험은 아홉 항목을 비교한다. 항목별 일치율은 평가한 전체 항목 중 값이 정답과 일치한 비율이며, 기본 실험의 분모는 32회 요청×6항목인 192개이다. 최종 상태 일치율은 각 대화의 마지막 요청 처리 후 모든 항목이 정답과 일치한 대화의 비율이다. 유지 지시 위반 수는 직전까지 정답과 일치했고 현재 요청에서도 보존해야 하는 항목을 잘못 변경한 횟수이다. 일치율은 일치 건수/전체 평가 건수로 표기한다. 예를 들어 27/32는 요청 32회 중 27회에서 모든 항목이 일치했음을 뜻한다. 같은 대화에 속한 요청들의 의존성을 고려하여 기술통계인 건수와 비율로 결과를 비교한다.</w:t>
       </w:r>
     </w:p>
     <w:p>
@@ -321,7 +321,15 @@
         <w:jc w:val="both"/>
       </w:pPr>
       <w:r>
-        <w:t>이미지 실험은 규칙 비교 실험의 32턴, 실제 인물 사진 2명, 두 방법을 조합한 128조건이다. 원본 파일과 프롬프트가 같으면 한 번 생성한 이미지를 함께 사용해 총 66개 이미지를 생성하였다. 방법 간 비교 64쌍 중 입력이 다른 경우는 두 턴과 두 인물을 조합한 4쌍이며, 나머지 60쌍은 같은 이미지를 사용한다. 내장 이미지 생성 도구의 첫 성공 출력을 사용하였다. 이 도구의 내부 모델 버전과 시드는 비공개이며, 시드 설정은 도구의 기본 동작을 따랐다. 이미지 평가는 Qwen2.5-VL-3B의 4비트 양자화 모델[5]을 사용하였다. 이미지와 목표 상태를 입력하여 여섯 항목을 성공·실패·판단 불가로 판정하였다. 평가 입력은 이미지와 목표 상태로 한정하였다. 얼굴 유사도는 InsightFace buffalo_l[6]의 코사인 유사도로 측정하였다.</w:t>
+        <w:t>이미지 실험은 규칙 비교 실험의 32턴, 실제 인물 사진 2명, 두 방법을 조합한 128개 생성 조건이다. 생성 조건은 요청 처리 단계·인물 사진·비교 방법의 조합이다. 원본 파일과 프롬프트가 같으면 한 번 생성한 이미지를 함께 사용해 총 66개 이미지를 생성하였다. 방법 간 비교 64쌍 중 입력이 다른 경우는 두 턴과 두 인물을 조합한 4쌍이며, 나머지 60쌍은 같은 이미지를 사용한다. 내장 이미지 생성 도구의 첫 성공 출력을 사용하였다. 이 도구의 내부 모델 버전과 시드는 비공개이며, 시드 설정은 도구의 기본 동작을 따랐다. 이미지 평가는 Qwen2.5-VL-3B의 4비트 양자화 모델[5]을 사용하였다. 이미지와 목표 상태를 입력하여 여섯 항목을 성공·실패·판단 불가로 판정하였다. 평가 입력은 이미지와 목표 상태로 한정하였다. 얼굴 유사도는 InsightFace buffalo_l[6]의 코사인 유사도로 측정하였다.</w:t>
+      </w:r>
+    </w:p>
+    <w:p>
+      <w:pPr>
+        <w:jc w:val="both"/>
+      </w:pPr>
+      <w:r>
+        <w:t>이미지 평가의 항목별 충족률은 성공으로 판정한 항목 수를 전체 평가 항목 수로 나눈 값이며, 전체 항목 충족률은 여섯 항목 모두 성공으로 판정한 생성 조건의 비율이다. 판단 불가는 형식 오류나 판독 문제로 성공·실패를 결정할 수 없는 항목이다. 코사인 유사도는 두 얼굴 특징 벡터의 방향이 유사한 정도이며, 표에는 생성 조건별 평균을 제시한다.</w:t>
       </w:r>
     </w:p>
     <w:p>
@@ -361,7 +369,7 @@
         <w:jc w:val="both"/>
       </w:pPr>
       <w:r>
-        <w:t>포즈·표정 요청과 속성 변경을 함께 처리하는 경우를 검사하기 위해 별도의 합성 대화를 구성하였다. 네 시나리오마다 단일·복합·혼합 조건의 4턴 대화를 작성하여 총 12개 대화 48턴을 사용하였다. 단일 조건은 표정만 변경하고, 복합 조건은 몸 방향과 손동작을 추가한다. 혼합 조건은 재킷·배경·식물·목걸이의 변경·유지·삭제·복원도 포함한다. 같은 시나리오의 표정 목표는 세 조건에서 같게 하였다.</w:t>
+        <w:t>포즈·표정 요청과 속성 변경을 함께 처리하는 경우를 검사하기 위해 별도의 합성 대화를 구성하였다. 네 가지 요청 구성마다 표정 단독·표정과 포즈·속성 지시 혼합 조건의 4턴 대화를 작성하여 총 12개 대화 48턴을 사용하였다. 표정 단독 조건은 표정만 변경하고, 표정과 포즈 조건은 몸 방향과 손동작을 추가한다. 속성 지시 혼합 조건은 재킷·배경·식물·목걸이의 변경·유지·삭제·복원도 포함한다. 같은 요청 구성의 표정 목표는 세 조건에서 같게 하였다.</w:t>
       </w:r>
     </w:p>
     <w:p>
@@ -377,7 +385,7 @@
         <w:jc w:val="both"/>
       </w:pPr>
       <w:r>
-        <w:t>Qwen3-4B-4bit의 온도를 0, 최대 출력을 320토큰으로 설정하고 공통 예시 두 개를 제공하였다. 전체 추론은 96회이며 방법 간 응답을 공유하였다. 코드·대화·정답·설정을 추론 전에 고정하였다. 모든 항목이 맞는 턴 수와 표정·몸 방향·손동작의 정확도를 따로 집계하였다. 조건 간에는 문장 길이와 지시 종류가 함께 달라진다. 따라서 조건별 결과는 포즈와 속성 지시를 조합한 요청에 대한 처리 정확도를 나타낸다.</w:t>
+        <w:t>Qwen3-4B-4bit의 온도를 0, 최대 출력을 320토큰으로 설정하고 공통 예시 두 개를 제공하였다. 전체 추론은 96회이며 방법 간 응답을 공유하였다. 코드·대화·정답·설정을 추론 전에 고정하였다. 모든 항목이 정답과 일치한 요청 수와 표정·몸 방향·손동작의 정확도를 따로 집계하였다. 조건 간에는 문장 길이와 지시 종류가 함께 달라진다. 따라서 조건별 결과는 포즈와 속성 지시를 조합한 요청에 대한 처리 정확도를 나타낸다.</w:t>
       </w:r>
     </w:p>
     <w:p>
@@ -385,7 +393,7 @@
         <w:jc w:val="both"/>
       </w:pPr>
       <w:r>
-        <w:t>생성 단계는 첫 번째 시나리오의 첫 턴을 세 조건에서 골라 두 원본 사진에 적용한 6장으로 따로 검사하였다. 선택 기준은 텍스트 결과 집계 전에 정하였다. 추출 모델의 출력 대신 정확한 요청을 직접 전달하고 첫 성공 이미지만 사용하였다. 단일·복합·혼합 조건의 시각적 목표는 각각 1·3·6개이며, Qwen2.5-VL-7B-4bit로 목표별 성공·실패·판단 불가와 설명을 받았다. 이 검사는 정확한 요청을 입력했을 때의 이미지 생성 결과를 살펴보기 위한 것이다.</w:t>
+        <w:t>생성 단계는 첫 번째 요청 구성의 첫 턴을 세 조건에서 골라 두 원본 사진에 적용한 6장으로 따로 검사하였다. 선택 기준은 텍스트 결과 집계 전에 정하였다. 추출 모델의 출력 대신 정확한 요청을 직접 전달하고 첫 성공 이미지만 사용하였다. 표정 단독·표정과 포즈·속성 지시 혼합 조건의 시각적 목표는 각각 1·3·6개이며, Qwen2.5-VL-7B-4bit로 목표별 성공·실패·판단 불가와 설명을 받았다. 이 검사는 정확한 요청을 입력했을 때의 이미지 생성 결과를 살펴보기 위한 것이다.</w:t>
       </w:r>
     </w:p>
     <w:p>
@@ -401,7 +409,7 @@
         <w:pStyle w:val="Heading2"/>
       </w:pPr>
       <w:r>
-        <w:t>1. 구성요소별 상태 정확도</w:t>
+        <w:t>1. 유지 규칙과 삭제 규칙의 효과</w:t>
       </w:r>
     </w:p>
     <w:p>
@@ -484,9 +492,9 @@
                 <w:b/>
                 <w:sz w:val="16"/>
               </w:rPr>
-              <w:t>정확한</w:t>
+              <w:t>전체 상태</w:t>
               <w:br/>
-              <w:t>턴</w:t>
+              <w:t>일치율</w:t>
             </w:r>
           </w:p>
         </w:tc>
@@ -513,9 +521,9 @@
                 <w:b/>
                 <w:sz w:val="16"/>
               </w:rPr>
-              <w:t>정확한</w:t>
+              <w:t>항목별</w:t>
               <w:br/>
-              <w:t>항목</w:t>
+              <w:t>일치율</w:t>
             </w:r>
           </w:p>
         </w:tc>
@@ -542,9 +550,9 @@
                 <w:b/>
                 <w:sz w:val="16"/>
               </w:rPr>
-              <w:t>최종 정답</w:t>
+              <w:t>최종 상태</w:t>
               <w:br/>
-              <w:t>대화</w:t>
+              <w:t>일치율</w:t>
             </w:r>
           </w:p>
         </w:tc>
@@ -571,7 +579,9 @@
                 <w:b/>
                 <w:sz w:val="16"/>
               </w:rPr>
-              <w:t>유지 오류</w:t>
+              <w:t>유지 지시</w:t>
+              <w:br/>
+              <w:t>위반 수</w:t>
             </w:r>
           </w:p>
         </w:tc>
@@ -1097,7 +1107,7 @@
         <w:jc w:val="both"/>
       </w:pPr>
       <w:r>
-        <w:t>두 규칙을 결합했을 때 정확한 턴은 기준보다 2개 많아 사전 채택 조건을 충족하였다. 유지 규칙만 적용한 경우보다 2개, 삭제 규칙만 적용한 경우보다 1개 많았다. 방법 간 차이는 세 번째 대화의 3턴과 4턴에서 발생하였다. 일곱 번째 대화는 모든 방법에서 4턴 중 1턴이 정확했고, 나머지 여섯 대화는 네 방법 모두 4턴이 정확하였다.</w:t>
+        <w:t>두 규칙을 결합했을 때 모든 항목이 정답과 일치한 요청은 기준보다 2회 많아 사전 채택 조건을 충족하였다. 일치한 요청 수는 유지 규칙만 적용한 경우보다 2회, 삭제 규칙만 적용한 경우보다 1회 많았다. 방법 간 차이는 세 번째 대화의 3턴과 4턴에서 발생하였다. 일곱 번째 대화에서는 모든 방법이 4회 요청 중 1회에서 전체 항목을 맞혔으며, 나머지 여섯 대화에서는 네 방법 모두 4회 요청 전체에서 모든 항목을 맞혔다.</w:t>
       </w:r>
     </w:p>
     <w:p>
@@ -1137,7 +1147,7 @@
         <w:jc w:val="both"/>
       </w:pPr>
       <w:r>
-        <w:t>항목별 적용은 각 항목의 변경을 개별적으로 검증하여 한 항목의 오류가 다른 유효한 변경까지 취소하는 것을 방지한다. 규칙 비교 실험의 사후 분석에서 이를 유지·삭제 규칙과 결합한 결과, 정확한 턴 수는 32/32였다. 추가 효과를 재검증하기 위해 새로운 대화 8개 32턴을 구성하였다. 대화와 정답은 추론 전에 확정하였으며, 앞선 사후 분석에 사용한 코드를 수정 없이 적용하였다. 모든 비교 방법에 동일한 추출·재검토 응답 64개를 사용한 결과를 표 2에 제시하였다.</w:t>
+        <w:t>항목별 적용은 각 항목의 변경을 개별적으로 검증하여 한 항목의 오류가 다른 유효한 변경까지 취소하는 것을 방지한다. 규칙 비교 실험의 사후 분석에서 이를 유지·삭제 규칙과 결합한 결과, 전체 상태 일치율은 32/32였다. 추가 효과를 재검증하기 위해 새로운 대화 8개 32턴을 구성하였다. 대화와 정답은 추론 전에 확정하였으며, 앞선 사후 분석에 사용한 코드를 수정 없이 적용하였다. 모든 비교 방법에 동일한 추출·재검토 응답 64개를 사용한 결과를 표 2에 제시하였다.</w:t>
       </w:r>
     </w:p>
     <w:p>
@@ -1220,9 +1230,9 @@
                 <w:b/>
                 <w:sz w:val="16"/>
               </w:rPr>
-              <w:t>정확한</w:t>
+              <w:t>전체 상태</w:t>
               <w:br/>
-              <w:t>턴</w:t>
+              <w:t>일치율</w:t>
             </w:r>
           </w:p>
         </w:tc>
@@ -1249,9 +1259,9 @@
                 <w:b/>
                 <w:sz w:val="16"/>
               </w:rPr>
-              <w:t>정확한</w:t>
+              <w:t>항목별</w:t>
               <w:br/>
-              <w:t>항목</w:t>
+              <w:t>일치율</w:t>
             </w:r>
           </w:p>
         </w:tc>
@@ -1278,9 +1288,9 @@
                 <w:b/>
                 <w:sz w:val="16"/>
               </w:rPr>
-              <w:t>최종 정답</w:t>
+              <w:t>최종 상태</w:t>
               <w:br/>
-              <w:t>대화</w:t>
+              <w:t>일치율</w:t>
             </w:r>
           </w:p>
         </w:tc>
@@ -1307,7 +1317,9 @@
                 <w:b/>
                 <w:sz w:val="16"/>
               </w:rPr>
-              <w:t>유지 오류</w:t>
+              <w:t>유지 지시</w:t>
+              <w:br/>
+              <w:t>위반 수</w:t>
             </w:r>
           </w:p>
         </w:tc>
@@ -1833,7 +1845,7 @@
         <w:jc w:val="both"/>
       </w:pPr>
       <w:r>
-        <w:t>새 대화에서도 유지·삭제 규칙은 정확한 턴 수와 최종 정답 대화 수를 각각 한 개 증가시켰으며, 차이는 일곱 번째 대화의 마지막 턴에서 발생하였다. 항목별 적용을 추가한 결과는 유지·삭제 규칙만 사용한 결과와 같았다. 이에 따라 추가 처리 없이 유지·삭제 규칙을 사용하는 방법을 선택하였다. 규칙 비교 실험의 사후 분석과 새 대화에서의 재검증은 서로 다른 개발 단계에서 수행하였으므로 결과와 표본 수를 따로 집계하였다.</w:t>
+        <w:t>새 대화에서도 유지·삭제 규칙은 모든 항목이 정답과 일치한 요청 수와 최종 상태가 일치한 대화 수를 각각 한 건 늘렸으며, 차이는 일곱 번째 대화의 마지막 턴에서 발생하였다. 항목별 적용을 추가한 결과는 유지·삭제 규칙만 사용한 결과와 같았다. 이에 따라 추가 처리 없이 유지·삭제 규칙을 사용하는 방법을 선택하였다. 규칙 비교 실험의 사후 분석과 새 대화에서의 재검증은 서로 다른 개발 단계에서 수행하였으므로 결과와 표본 수를 따로 집계하였다.</w:t>
       </w:r>
     </w:p>
     <w:p>
@@ -2060,7 +2072,9 @@
                 <w:b/>
                 <w:sz w:val="16"/>
               </w:rPr>
-              <w:t>목표 충족</w:t>
+              <w:t>항목별</w:t>
+              <w:br/>
+              <w:t>충족률</w:t>
             </w:r>
           </w:p>
         </w:tc>
@@ -2087,9 +2101,9 @@
                 <w:b/>
                 <w:sz w:val="16"/>
               </w:rPr>
-              <w:t>판단</w:t>
+              <w:t>판단 불가</w:t>
               <w:br/>
-              <w:t>불가</w:t>
+              <w:t>항목 수</w:t>
             </w:r>
           </w:p>
         </w:tc>
@@ -2116,7 +2130,9 @@
                 <w:b/>
                 <w:sz w:val="16"/>
               </w:rPr>
-              <w:t>6항목 모두 충족</w:t>
+              <w:t>전체 항목</w:t>
+              <w:br/>
+              <w:t>충족률</w:t>
             </w:r>
           </w:p>
         </w:tc>
@@ -2143,7 +2159,9 @@
                 <w:b/>
                 <w:sz w:val="16"/>
               </w:rPr>
-              <w:t>얼굴 코사인 평균</w:t>
+              <w:t>얼굴 유사도</w:t>
+              <w:br/>
+              <w:t>평균</w:t>
             </w:r>
           </w:p>
         </w:tc>
@@ -2435,7 +2453,7 @@
         <w:jc w:val="both"/>
       </w:pPr>
       <w:r>
-        <w:t>평가 모델에 따른 판정 차이를 분석하기 위해 Qwen2.5-VL-7B의 4비트 양자화 모델로 전체 68개 이미지·목표 쌍을 다시 평가하였다. 재평가 전에 대상과 설정을 확정하였으며 목표 문구, 파서, 온도, 최대 토큰은 1차 평가와 같았다. 이는 같은 계열의 두 평가 모델 사이에서 판정이 얼마나 일치하는지 살펴본 사후 분석이다. 7B 평가에서 목표 충족 수는 기준 372/384, 결합 374/384였고 JSON 파싱 실패와 판단 불가는 각각 0개였다.</w:t>
+        <w:t>평가 모델에 따른 판정 차이를 분석하기 위해 Qwen2.5-VL-7B의 4비트 양자화 모델로 전체 68개 이미지·목표 쌍을 다시 평가하였다. 재평가 전에 대상과 설정을 확정하였으며 목표 문구, 파서, 온도, 최대 토큰은 1차 평가와 같았다. 이는 같은 계열의 두 평가 모델 사이에서 판정이 얼마나 일치하는지 살펴본 사후 분석이다. 7B 평가에서 항목별 충족률은 기준 372/384, 결합 374/384였고 JSON 파싱 실패와 판단 불가는 각각 0개였다.</w:t>
       </w:r>
     </w:p>
     <w:p>
@@ -2517,7 +2535,9 @@
                 <w:b/>
                 <w:sz w:val="16"/>
               </w:rPr>
-              <w:t>목표 충족</w:t>
+              <w:t>항목별</w:t>
+              <w:br/>
+              <w:t>충족률</w:t>
             </w:r>
           </w:p>
         </w:tc>
@@ -2544,9 +2564,9 @@
                 <w:b/>
                 <w:sz w:val="16"/>
               </w:rPr>
-              <w:t>판단</w:t>
+              <w:t>판단 불가</w:t>
               <w:br/>
-              <w:t>불가</w:t>
+              <w:t>항목 수</w:t>
             </w:r>
           </w:p>
         </w:tc>
@@ -2573,7 +2593,9 @@
                 <w:b/>
                 <w:sz w:val="16"/>
               </w:rPr>
-              <w:t>6항목 모두 충족</w:t>
+              <w:t>전체 항목</w:t>
+              <w:br/>
+              <w:t>충족률</w:t>
             </w:r>
           </w:p>
         </w:tc>
@@ -3496,7 +3518,7 @@
         <w:jc w:val="both"/>
       </w:pPr>
       <w:r>
-        <w:t>초기 개발 대화의 이미지 실험에서는 128조건에 대해 68개 이미지를 생성하였다. 목표 충족 수는 기준 354/384, 유지 규칙 355/384였고 얼굴 코사인 평균은 각각 0.914851과 0.914108이었다. 입력이 다른 네 쌍 중 인물 R01의 두 번째 개발 대화 2턴에서 소품 판정 하나만 판단 불가에서 성공으로 바뀌었다. 실패에서 성공으로 바뀐 항목은 0개였으며 JSON 파싱 실패 4개와 설명·점수 불일치가 있었다.</w:t>
+        <w:t>초기 개발 대화의 이미지 실험에서는 128개 생성 조건에 대해 68개 이미지를 생성하였다. 항목별 충족률은 기준 354/384, 유지 규칙 355/384였고 얼굴 유사도 평균은 각각 0.914851과 0.914108이었다. 입력이 다른 네 쌍 중 인물 R01의 두 번째 개발 대화 2턴에서 소품 판정 하나만 판단 불가에서 성공으로 바뀌었다. 실패에서 성공으로 바뀐 항목은 0개였으며 JSON 파싱 실패 4개와 설명·점수 불일치가 있었다.</w:t>
       </w:r>
     </w:p>
     <w:p>
@@ -3516,7 +3538,7 @@
         <w:jc w:val="center"/>
       </w:pPr>
       <w:r>
-        <w:t>표 6. 복합 요청 실험의 조건별 정확한 턴 수</w:t>
+        <w:t>표 6. 복합 요청 실험의 조건별 전체 상태 일치율</w:t>
       </w:r>
     </w:p>
     <w:tbl>
@@ -3966,7 +3988,7 @@
         <w:jc w:val="both"/>
       </w:pPr>
       <w:r>
-        <w:t>표 6은 아홉 항목이 모두 정확한 턴 수이다. 세 방법 모두 표정·몸 방향·손동작은 조건별 48항목을 정확히 처리하였다. 혼합 조건의 정확한 전체 항목 수는 최초 추출과 재검토가 각각 124/144, 규칙 보정이 144/144였다. 마지막 상태가 정확한 대화 수는 각각 0/4, 0/4, 4/4였다.</w:t>
+        <w:t>표 6은 요청 처리 후 아홉 항목이 모두 정답과 일치한 비율이다. 세 방법 모두 표정·몸 방향·손동작은 조건별 48항목을 정확히 처리하였다. 혼합 조건의 항목별 일치율은 최초 추출과 재검토가 각각 124/144, 규칙 보정이 144/144였다. 최종 상태 일치율은 각각 0/4, 0/4, 4/4였다.</w:t>
       </w:r>
     </w:p>
     <w:p>
@@ -3974,7 +3996,7 @@
         <w:jc w:val="both"/>
       </w:pPr>
       <w:r>
-        <w:t>혼합 조건의 오류는 네 시나리오에서 같은 형태로 나타났다. 2턴의 식물 삭제와 3턴의 목걸이 삭제를 모델이 ‘원본’으로 추출하였고 재검토에서도 같은 값을 반환하였다. 식물 오류는 2~4턴, 목걸이 오류는 3~4턴에 남아 총 20개의 항목 오류로 집계되었다. 이 20개는 두 삭제 지시의 오류가 각 시나리오의 후속 상태에 누적된 건수이다. 사후에 삭제 규칙만 적용하여 재계산한 결과도 48턴 모두 정확하여, 유지·복원 규칙을 함께 적용한 결과와 같았다.</w:t>
+        <w:t>혼합 조건의 오류는 네 가지 요청 구성에서 같은 형태로 나타났다. 2턴의 식물 삭제와 3턴의 목걸이 삭제를 모델이 ‘원본’으로 추출하였고 재검토에서도 같은 값을 반환하였다. 식물 오류는 2~4턴, 목걸이 오류는 3~4턴에 남아 총 20개의 항목 오류로 집계되었다. 이 20개는 두 삭제 지시의 오류가 각 요청 구성의 후속 상태에 누적된 건수이다. 사후에 삭제 규칙만 적용하여 재계산한 결과도 48턴 모두 정확하여, 유지·복원 규칙을 함께 적용한 결과와 같았다.</w:t>
       </w:r>
     </w:p>
     <w:p>
@@ -3982,7 +4004,7 @@
         <w:jc w:val="both"/>
       </w:pPr>
       <w:r>
-        <w:t>네 시나리오는 표정과 몸 방향이 다르지만 삭제·복원 문형은 공유한다. 따라서 16/16은 정해진 혼합 문형에 대한 결과이다. 포즈는 정확히 추출되었으며, 오류는 대상 삭제와 원본 복원의 혼동에서 발생하였다.</w:t>
+        <w:t>네 가지 요청 구성은 표정과 몸 방향이 다르지만 삭제·복원 문형은 공유한다. 따라서 16/16은 정해진 혼합 문형에 대한 결과이다. 포즈는 정확히 추출되었으며, 오류는 대상 삭제와 원본 복원의 혼동에서 발생하였다.</w:t>
       </w:r>
     </w:p>
     <w:p>
@@ -3990,7 +4012,7 @@
         <w:jc w:val="both"/>
       </w:pPr>
       <w:r>
-        <w:t>복합 요청 실험의 오류를 분석한 뒤, 포즈를 제외한 짧은 대조 요청 8개를 구성하였다. 요청을 확정하고 같은 설정으로 16회 추가 추론하여 결과를 별도로 집계하였다. 최초 추출과 재검토는 각각 7/8이 정확하였다. 식물·목걸이의 삭제·복원을 단독으로 요청한 네 경우는 모두 맞았다. 그러나 “Remove the plant. Restore the necklace to the original.”에서는 식물도 ‘원본’으로 추출하였다. 두 문장의 순서만 바꾼 경우는 정확하였다. 삭제와 복원만으로 구성한 짧은 요청에서도 같은 오류가 발생하였다.</w:t>
+        <w:t>복합 요청 실험의 오류를 분석한 뒤, 포즈를 제외한 짧은 대조 요청 8개를 구성하였다. 요청을 확정하고 같은 설정으로 16회 추가 추론하여 결과를 별도로 집계하였다. 최초 추출과 재검토는 각각 7/8의 전체 상태 일치율을 보였다. 식물·목걸이의 삭제·복원을 단독으로 요청한 네 경우는 모두 맞았다. 그러나 “Remove the plant. Restore the necklace to the original.”에서는 식물도 ‘원본’으로 추출하였다. 두 문장의 순서만 바꾼 경우는 정확하였다. 삭제와 복원만으로 구성한 짧은 요청에서도 같은 오류가 발생하였다.</w:t>
       </w:r>
     </w:p>
     <w:p>
@@ -4006,7 +4028,7 @@
         <w:jc w:val="both"/>
       </w:pPr>
       <w:r>
-        <w:t>정확한 요청을 직접 입력한 이미지 6장의 AI 평가에서 두 인물 모두 복합 조건은 2/3, 혼합 조건은 5/6의 목표를 충족한 것으로 집계되었다. 실패 점수는 몸 방향에 부여되었으나 설명에서는 요청한 방향으로 회전했다고 서술하였다. 또한 설명이 각 목표 문장을 그대로 반복하였다. 단일 조건의 두 응답은 목표 하나에 점수 세 개를 반환하고 예시 설명을 복사하였다. 평가 형식에 맞지 않는 두 응답은 모두 판단 불가로 처리하였다.</w:t>
+        <w:t>정확한 요청을 직접 입력한 이미지 6장의 AI 평가에서 두 인물 모두 표정과 포즈 조건은 2/3, 속성 지시 혼합 조건은 5/6의 목표를 충족한 것으로 집계되었다. 실패 점수는 몸 방향에 부여되었으나 설명에서는 요청한 방향으로 회전했다고 서술하였다. 또한 설명이 각 목표 문장을 그대로 반복하였다. 표정 단독 조건의 두 응답은 목표 하나에 점수 세 개를 반환하고 예시 설명을 복사하였다. 평가 형식에 맞지 않는 두 응답은 모두 판단 불가로 처리하였다.</w:t>
       </w:r>
     </w:p>
     <w:p>
@@ -4070,7 +4092,7 @@
         <w:jc w:val="both"/>
       </w:pPr>
       <w:r>
-        <w:t>본 연구에서는 언어 모델의 추출·재검토 결과에 명시적 유지·삭제 제약을 적용하는 상태 갱신 방법을 제안하였다. 정해진 영어 문형의 합성 대화를 이용한 규칙 비교 실험에서 유지 규칙은 불필요한 배경 변경을, 삭제 규칙은 식물 삭제 누락을 방지하였다. 두 규칙의 결합으로 정확한 턴 수는 27/32에서 29/32로 증가하였다. 새 대화에서의 재검증에서도 정확한 턴 수는 28/32에서 29/32로 증가하였으며, 항목별 적용을 결합한 경우와 동일한 결과를 보였다. 제안 방법은 추가 모델 호출 없이 유지 오류와 삭제 누락을 감소시켰다.</w:t>
+        <w:t>본 연구에서는 언어 모델의 추출·재검토 결과에 명시적 유지·삭제 제약을 적용하는 상태 갱신 방법을 제안하였다. 정해진 영어 문형의 합성 대화를 이용한 규칙 비교 실험에서 유지 규칙은 불필요한 배경 변경을, 삭제 규칙은 식물 삭제 누락을 방지하였다. 두 규칙의 결합으로 전체 상태 일치율은 27/32에서 29/32로 증가하였다. 새 대화에서의 재검증에서도 전체 상태 일치율은 28/32에서 29/32로 증가하였으며, 항목별 적용을 결합한 경우와 동일한 결과를 보였다. 제안 방법은 추가 모델 호출 없이 유지 지시 위반과 삭제 누락을 감소시켰다.</w:t>
       </w:r>
     </w:p>
     <w:p>
@@ -4078,7 +4100,7 @@
         <w:jc w:val="both"/>
       </w:pPr>
       <w:r>
-        <w:t>포즈·표정을 포함한 복합 요청 실험의 혼합 조건에서는 정확한 턴이 재검토 4/16에서 규칙 보정 16/16으로 증가하였다. 모델은 포즈와 표정을 정확히 추출했으나 삭제를 원본 복원으로 해석하였고, 삭제 규칙이 이를 바로잡았다. 정해진 동작의 상태 갱신을 명시적으로 검사하는 것이 동일 모델의 재검토 뒤에도 남은 오류를 줄였다.</w:t>
+        <w:t>포즈·표정을 포함한 복합 요청 실험의 혼합 조건에서는 전체 상태 일치율이 재검토 4/16에서 규칙 보정 16/16으로 증가하였다. 모델은 포즈와 표정을 정확히 추출했으나 삭제를 원본 복원으로 해석하였고, 삭제 규칙이 이를 바로잡았다. 정해진 동작의 상태 갱신을 명시적으로 검사하는 것이 동일 모델의 재검토 뒤에도 남은 오류를 줄였다.</w:t>
       </w:r>
     </w:p>
     <w:p>

</xml_diff>

<commit_message>
Clarify state-record findings and evaluation wording in thesis
</commit_message>
<xml_diff>
--- a/paper/manuscript.inha.docx
+++ b/paper/manuscript.inha.docx
@@ -121,7 +121,7 @@
         <w:jc w:val="both"/>
       </w:pPr>
       <w:r>
-        <w:t>반복 인물 이미지 편집에서는 속성의 추가·변경·유지·삭제와 원본 복원 요청을 편집 상태에 반영해야 한다. 예를 들어 배경은 그대로 두고 목걸이를 지우라는 요청을 전체 장면의 새 설명으로 바꾸면, 목걸이 삭제를 놓치거나 변경 대상이 아닌 배경까지 원본으로 되돌릴 수 있다. 원본 사진을 매번 편집 입력으로 사용하는 방식은 누적된 얼굴 변화를 줄이는 데 도움이 될 수 있다. 이때 편집 요청을 잘못 해석하면 원본 사진을 사용하더라도 잘못된 상태가 생성 단계로 전달된다. 따라서 이미지 생성에 앞서 편집 상태가 현재 요청을 정확히 반영하는지 확인해야 한다.</w:t>
+        <w:t>반복 인물 이미지 편집에서는 속성의 추가·변경·유지·삭제와 원본 복원 요청을 편집 상태에 반영해야 한다. 예를 들어 배경을 유지하고 목걸이를 지우라는 요청을 처리할 때, 목걸이 삭제를 누락하거나 배경까지 원본으로 되돌리는 오류가 발생할 수 있다. 원본 사진을 매번 편집 입력으로 사용하는 방식은 누적된 얼굴 변화를 줄이는 데 도움이 될 수 있다. 이때 편집 요청을 잘못 해석하면 원본 사진을 사용하더라도 잘못된 상태가 생성 단계로 전달된다. 따라서 이미지 생성에 앞서 편집 상태가 현재 요청을 정확히 반영하는지 확인해야 한다.</w:t>
       </w:r>
     </w:p>
     <w:p>
@@ -137,7 +137,7 @@
         <w:jc w:val="both"/>
       </w:pPr>
       <w:r>
-        <w:t>분석 대상은 이미지 생성 전에 작성되는 편집 상태이다. 상태의 정답은 요청에 명시한 변경을 누적하여 계산할 수 있으므로 이미지 평가 모델의 판단과 분리하여 검사한다. 본 연구의 기여는 유지와 삭제를 구분한 후처리의 구현, 동일 응답을 이용한 구성요소 비교, 포즈·표정을 포함하는 복합 요청에서의 오류 분석이다.</w:t>
+        <w:t>분석 대상은 이미지 생성 전에 작성되는 편집 상태이다. 상태의 정답은 요청에 명시한 변경을 누적하여 계산할 수 있으므로 이미지 평가 모델의 판단과 분리하여 검사한다. 본 연구의 기여는 유지와 삭제를 구분한 후처리의 구현, 동일한 모델 응답을 이용한 유지·삭제 규칙의 효과 비교, 포즈·표정을 포함하는 복합 요청에서의 오류 분석이다.</w:t>
       </w:r>
     </w:p>
     <w:p>
@@ -193,7 +193,7 @@
         <w:jc w:val="both"/>
       </w:pPr>
       <w:r>
-        <w:t>각 턴에서 Qwen3-4B-4bit[4]가 현재 요청의 변경 사항을 JSON 형식의 항목·값 목록으로 추출한 뒤, 요청과 첫 응답을 입력받아 재검토한다. 추출기의 입력은 현재 요청으로 한정한다. 이에 따라 모든 비교 방법에 동일한 두 모델 응답을 사용할 수 있다. 각 방법은 이 응답을 자신의 이전 편집 상태에 적용하고 검증한다.</w:t>
+        <w:t>각 턴에서 Qwen3-4B-4bit[4]가 현재 요청에서 변경할 항목과 값을 JSON 형식으로 추출한다. 같은 모델이 요청과 첫 응답을 입력받아 한 차례 재검토한다. 모든 비교 방법은 이 두 응답을 공유하며 각자의 이전 편집 상태에 적용한다.</w:t>
       </w:r>
     </w:p>
     <w:p>
@@ -201,7 +201,7 @@
         <w:jc w:val="both"/>
       </w:pPr>
       <w:r>
-        <w:t>모든 방법은 허용된 값인지 검사하고, 현재 상태와 같은 변경을 생략하며, 명시적인 원본 복원 요청을 처리한다. 제안 방법은 여기에 유지·삭제 제약을 적용한다. 정답은 평가에만 사용한다. 갱신한 상태는 공통 변환 함수로 편집 프롬프트를 작성하여 원본 사진과 함께 입력한다.</w:t>
+        <w:t>모든 방법은 허용된 값인지 검사하고, 현재 상태와 같은 변경을 생략하며, 명시적인 원본 복원 요청을 처리한다. 제안 방법은 여기에 유지·삭제 제약을 적용한다. 정답은 평가에만 사용한다. 갱신한 상태를 공통 변환 함수로 편집 프롬프트로 바꾸고, 원본 사진과 함께 이미지 생성 도구에 입력한다.</w:t>
       </w:r>
     </w:p>
     <w:p>
@@ -289,7 +289,7 @@
         <w:jc w:val="both"/>
       </w:pPr>
       <w:r>
-        <w:t>후속 개발 결과를 분석한 뒤 유지·삭제 규칙 비교 실험을 설계하였다. 이 실험에는 연구 보조 에이전트로 만든 영어 합성 대화 8개 32턴을 사용하였다. 각 대화의 정답은 작성 시 지정한 항목별 변경을 순서대로 적용해 만들었다. 대화와 정답, 코드, 프롬프트, 모델 버전을 모두 추론 전에 확정하였다. 규칙 개발에 사용한 대화와 비교 실험에 사용한 대화의 결과는 따로 보고한다.</w:t>
+        <w:t>후속 개발 결과를 분석한 뒤 유지·삭제 규칙 비교 실험을 설계하였다. 이 실험에는 AI를 이용해 작성한 영어 합성 대화 8개 32턴을 사용하였다. 각 요청의 정답 상태는 대화 작성 시 지정한 항목별 변경을 초기 상태에 순서대로 적용하여 계산하였다. 대화와 정답, 코드, 프롬프트, 모델 버전을 모두 추론 전에 확정하였다. 규칙 개발에 사용한 대화와 비교 실험에 사용한 대화의 결과는 따로 보고한다.</w:t>
       </w:r>
     </w:p>
     <w:p>
@@ -1123,7 +1123,7 @@
         <w:jc w:val="both"/>
       </w:pPr>
       <w:r>
-        <w:t>규칙 비교 실험의 세 번째 대화에서는 3턴에 식물을 삭제하고 재킷은 유지하도록 요청하였다. 기준 방법과 유지 규칙만 적용한 방법은 식물을 남겼고, 삭제 규칙은 식물의 값을 없음으로 바꾸었다. 이어진 4턴에서는 상의와 목걸이를 원본으로 돌리되 재킷과 연한 파란색 배경은 그대로 두도록 요청하였다. 기준 방법과 삭제 규칙만 적용한 방법은 배경도 원본으로 바꾸었다. 유지 규칙을 적용한 출력에서는 배경과 함께 이전 턴의 식물도 남았다.</w:t>
+        <w:t>규칙 비교 실험의 세 번째 대화에서는 3턴에 식물을 삭제하고 재킷은 유지하도록 요청하였다. 기준 방법과 유지 규칙만 적용한 방법의 상태 기록에는 식물이 남았고, 삭제 규칙은 소품 값을 ‘없음’으로 바꾸었다. 이어진 4턴에서는 상의와 목걸이를 원본으로 돌리되 재킷과 연한 파란색 배경은 그대로 두도록 요청하였다. 기준 방법과 삭제 규칙만 적용한 방법은 배경도 원본으로 바꾸었다. 유지 규칙만 적용한 상태 기록에는 연한 파란색 배경과 이전 턴의 식물이 함께 남았다.</w:t>
       </w:r>
     </w:p>
     <w:p>
@@ -1989,7 +1989,7 @@
         <w:jc w:val="both"/>
       </w:pPr>
       <w:r>
-        <w:t>3B 평가 모델이 목표를 충족한 것으로 판정한 항목 수는 기준 방법 350/384, 결합 방법 358/384였다. 서로 다른 이미지·목표 조합 68개 중 3개에서 응답 형식 오류가 발생하였다. 최초 평가 응답을 기준으로 집계하고 형식 오류가 있는 응답은 판단 불가로 처리하였다.</w:t>
+        <w:t>3B 평가 모델의 항목별 충족률은 기준 방법 350/384, 결합 방법 358/384였다. 서로 다른 이미지·목표 조합 68개 중 3개에서 응답 형식 오류가 발생하였다. 최초 평가 응답을 기준으로 집계하고 형식 오류가 있는 응답은 판단 불가로 처리하였다.</w:t>
       </w:r>
     </w:p>
     <w:p>
@@ -3502,7 +3502,7 @@
         <w:jc w:val="both"/>
       </w:pPr>
       <w:r>
-        <w:t>7B에서 실패에서 성공으로 바뀐 두 항목은 R01 4턴의 소품과 R02 4턴의 배경이다. 3B의 두 항목은 R02 4턴의 소품과 배경으로, 두 평가에서 모두 실패에서 성공으로 바뀐 항목은 R02의 배경 한 항목이다. 두 평가 모델의 판정이 일치한 항목 수는 판단 불가를 포함하면 367/408, 두 모델 모두 판정한 항목만 비교하면 367/387이었다.</w:t>
+        <w:t>7B에서 실패에서 성공으로 바뀐 두 항목은 R01 4턴의 소품과 R02 4턴의 배경이다. 3B의 두 항목은 R02 4턴의 소품과 배경으로, 두 평가에서 모두 실패에서 성공으로 바뀐 항목은 R02의 배경 한 항목이다. 두 평가 모델의 판정 일치율은 판단 불가를 포함한 전체 408개 항목에서 367/408, 두 모델 모두 성공·실패를 판정한 387개 항목에서 367/387이었다.</w:t>
       </w:r>
     </w:p>
     <w:p>
@@ -4036,7 +4036,7 @@
         <w:jc w:val="both"/>
       </w:pPr>
       <w:r>
-        <w:t>이미지와 평가에는 각각 첫 성공 출력과 최초 평가 응답을 사용하였다. 2/3과 5/6은 각 인물·조건에서 생성한 이미지 한 장의 목표 충족 수이다. 조건별 목표 수가 다르므로 각 점수는 해당 이미지의 개별 평가 결과로 제시하였다.</w:t>
+        <w:t>2/3과 5/6은 각 인물·조건에서 생성한 이미지 한 장에 대한 성공 판정 항목 수/전체 목표 항목 수이다. 조건별 목표 수가 다르므로 각 점수는 해당 이미지의 개별 평가 결과로 제시하였다.</w:t>
       </w:r>
     </w:p>
     <w:p>
@@ -4052,7 +4052,7 @@
         <w:jc w:val="both"/>
       </w:pPr>
       <w:r>
-        <w:t>유지와 삭제는 서로 다른 상태 갱신 동작을 요구한다. 유지 규칙은 직전 값을 보존하므로 이전 턴의 삭제 누락도 다음 상태로 이어질 수 있다. 삭제 규칙의 보정 대상은 현재 요청에서 삭제가 명시된 항목이며, 나머지 항목은 모델의 갱신 결과를 따른다. 규칙 비교 실험의 세 번째 대화에서 두 규칙을 결합한 경우에만 식물 삭제와 배경 유지가 모두 정확했던 결과는 이러한 차이에 따른 것이다. 후속 개발 대화에서는 keep만으로 유지 여부를 판단하여 삭제·변경 요청을 오인하였다. 이에 따라 제안 규칙은 항목 이름과 명시적 유지·삭제 표현이 함께 있는 구절에 적용한다.</w:t>
+        <w:t>유지와 삭제는 서로 다른 상태 갱신 동작을 요구한다. 유지 규칙은 직전 값을 보존하므로 이전 턴의 삭제 누락도 다음 상태로 이어질 수 있다. 삭제 규칙의 보정 대상은 현재 요청에서 삭제가 명시된 항목이며, 나머지 항목은 모델의 갱신 결과를 따른다. 세 번째 대화에서는 두 규칙의 결합으로 식물 삭제와 배경 유지가 모두 정답과 일치하였다. 후속 개발 대화에서는 keep만으로 유지 여부를 판단하여 삭제·변경 요청을 오인하였다. 이에 따라 제안 규칙은 항목 이름과 명시적 유지·삭제 표현이 함께 있는 구절에 적용한다.</w:t>
       </w:r>
     </w:p>
     <w:p>
@@ -4068,7 +4068,7 @@
         <w:jc w:val="both"/>
       </w:pPr>
       <w:r>
-        <w:t>복합 요청 실험에서는 삭제를 원본 복원으로 해석한 오류가 재검토 뒤에도 남았다. 명시적인 동작에 값을 직접 대응시키는 규칙은 이 오류를 제거하였다. 규칙 비교 실험에서 나타난 유지·삭제의 상호 보완과 달리 복합 요청 실험의 개선은 삭제 규칙만으로 설명된다. 두 결과를 구분하면 어떤 규칙이 어떤 오류를 줄였는지 확인할 수 있다. 복합 요청 실험은 앞선 두 실험과 어휘·예시·구현이 달라 정확도와 표본 수를 별도로 집계하였다.</w:t>
+        <w:t>복합 요청 실험에서는 삭제를 원본 복원으로 해석한 오류가 재검토 뒤에도 남았다. 삭제 지시가 있는 항목을 ‘없음’으로 설정하는 규칙이 이 오류를 바로잡았다. 규칙 비교 실험에서 나타난 유지·삭제의 상호 보완과 달리 복합 요청 실험의 개선은 삭제 규칙만으로 설명된다. 복합 요청 실험은 앞선 두 실험과 어휘·예시·구현이 달라 정확도와 표본 수를 별도로 집계하였다.</w:t>
       </w:r>
     </w:p>
     <w:p>
@@ -4092,7 +4092,7 @@
         <w:jc w:val="both"/>
       </w:pPr>
       <w:r>
-        <w:t>본 연구에서는 언어 모델의 추출·재검토 결과에 명시적 유지·삭제 제약을 적용하는 상태 갱신 방법을 제안하였다. 정해진 영어 문형의 합성 대화를 이용한 규칙 비교 실험에서 유지 규칙은 불필요한 배경 변경을, 삭제 규칙은 식물 삭제 누락을 방지하였다. 두 규칙의 결합으로 전체 상태 일치율은 27/32에서 29/32로 증가하였다. 새 대화에서의 재검증에서도 전체 상태 일치율은 28/32에서 29/32로 증가하였으며, 항목별 적용을 결합한 경우와 동일한 결과를 보였다. 제안 방법은 추가 모델 호출 없이 유지 지시 위반과 삭제 누락을 감소시켰다.</w:t>
+        <w:t>본 연구에서는 언어 모델의 추출·재검토 결과에 명시적 유지·삭제 제약을 적용하는 상태 갱신 방법을 제안하였다. 정해진 영어 문형의 합성 대화를 이용한 규칙 비교 실험에서 유지 규칙은 배경 값의 변경을, 삭제 규칙은 소품 값의 삭제 누락을 각각 바로잡았다. 두 규칙의 결합으로 전체 상태 일치율은 27/32에서 29/32로 증가하였다. 새 대화에서의 재검증에서도 전체 상태 일치율은 28/32에서 29/32로 증가하였으며, 항목별 적용을 결합한 경우와 동일한 결과를 보였다. 제안 방법은 추가 모델 호출 없이 유지 지시 위반과 삭제 누락을 감소시켰다.</w:t>
       </w:r>
     </w:p>
     <w:p>
@@ -4100,7 +4100,7 @@
         <w:jc w:val="both"/>
       </w:pPr>
       <w:r>
-        <w:t>포즈·표정을 포함한 복합 요청 실험의 혼합 조건에서는 전체 상태 일치율이 재검토 4/16에서 규칙 보정 16/16으로 증가하였다. 모델은 포즈와 표정을 정확히 추출했으나 삭제를 원본 복원으로 해석하였고, 삭제 규칙이 이를 바로잡았다. 정해진 동작의 상태 갱신을 명시적으로 검사하는 것이 동일 모델의 재검토 뒤에도 남은 오류를 줄였다.</w:t>
+        <w:t>포즈·표정을 포함한 복합 요청 실험의 혼합 조건에서는 전체 상태 일치율이 재검토 4/16에서 규칙 보정 16/16으로 증가하였다. 모델은 포즈와 표정을 정확히 추출했으나 삭제를 원본 복원으로 해석하였고, 삭제 규칙이 이를 바로잡았다. 유지·삭제 지시를 확인하는 후처리 규칙은 동일 모델의 재검토 뒤에도 남은 상태 갱신 오류를 줄였다.</w:t>
       </w:r>
     </w:p>
     <w:p>

</xml_diff>

<commit_message>
Validate clause normalization on new dialogues and strengthen thesis
</commit_message>
<xml_diff>
--- a/paper/manuscript.inha.docx
+++ b/paper/manuscript.inha.docx
@@ -65,7 +65,7 @@
         <w:t xml:space="preserve">요약: </w:t>
       </w:r>
       <w:r>
-        <w:t>반복 이미지 편집에서는 변경할 내용과 유지하거나 삭제할 내용을 다음 프롬프트에 정확히 반영해야 한다. 본 연구는 언어 모델이 변경 사항을 추출하고 재검토한 뒤 명시적인 유지·삭제 지시를 확인하는 후처리 규칙을 제안한다. 유지 규칙은 이전 값을 보존하고 삭제 규칙은 값을 없음으로 설정한다. 유지·삭제 규칙 비교 실험의 대화 8개 32턴에서 동일한 모델 응답에 네 방법을 적용하였다. 요청 처리 후 여섯 항목이 모두 정답과 일치한 비율은 기준 방법 27/32, 유지 규칙만 27/32, 삭제 규칙만 28/32, 두 규칙 결합 29/32였다. 새로운 대화 8개 32턴을 이용한 재검증에서도 전체 상태 일치율이 28/32에서 29/32로 증가하였다. 포즈·표정을 포함한 복합 요청 실험의 12개 대화 48턴에서는 속성 지시를 혼합한 조건의 전체 상태 일치율이 재검토 4/16에서 규칙 보정 16/16으로 증가하였다. 실제 인물 2명의 사진을 이용한 이미지 평가에서는 평가 모델의 설명과 점수가 일치하지 않는 사례가 나타났다. 제안 규칙은 추가 모델 호출 없이 상태 갱신 오류를 줄였다.</w:t>
+        <w:t>반복 이미지 편집에서는 변경할 내용과 유지하거나 삭제할 내용을 다음 프롬프트에 정확히 반영해야 한다. 본 연구는 언어 모델이 변경 사항을 추출하고 재검토한 뒤 명시적인 유지·삭제 지시를 확인하는 후처리 규칙을 제안한다. 유지 규칙은 이전 값을 보존하고 삭제 규칙은 값을 없음으로 설정한다. 유지·삭제 규칙 비교 실험의 대화 8개 32턴에서 전체 상태 일치율은 기준 27/32, 유지 규칙만 27/32, 삭제 규칙만 28/32, 두 규칙 결합 29/32였다. 새로운 대화 8개 32턴의 재검증에서도 28/32에서 29/32로 증가하였다. 포즈·표정을 포함한 복합 요청 실험에서는 속성 지시 혼합 조건의 전체 상태 일치율이 재검토 4/16에서 규칙 보정 16/16으로 증가하였다. 표현 변화 검사에서 원본 복원과 유지 구절의 경계 오류를 확인하여 지시 정규화를 추가하였다. 코드를 고정한 뒤 새 대화 4개 16턴을 검사한 결과, 기준은 9/16, 기존 유지·삭제는 10/16, 정규화는 16/16이었다. 실제 인물 사진의 AI 평가에서는 설명과 점수의 불일치가 나타났다. 제안 방법은 지정된 영어 구절의 합성 대화에서 추가 모델 호출 없이 상태 갱신 오류를 줄였다.</w:t>
       </w:r>
     </w:p>
     <w:p>
@@ -79,7 +79,7 @@
         <w:t xml:space="preserve">Abstract: </w:t>
       </w:r>
       <w:r>
-        <w:t>Iterative portrait editing requires accurate updates to requested attribute values. We apply explicit preservation and removal rules after a language model extracts and reviews the requested changes. Preservation retains the previous value, whereas removal sets an attribute to absent. Across eight synthetic English dialogues with 32 turns, all six attribute values matched the reference state in 27/32 turns for the baseline, 27/32 for preservation alone, 28/32 for removal alone, and 29/32 for their combination. In eight new dialogues with 32 turns, the full-state match rate increased from 28/32 to 29/32. A separate complex-request experiment comprised 12 dialogues and 48 turns involving expressions and poses. When combined with attribute changes, preservation, removal, and restoration, the full-state match rate increased from 4/16 after model review to 16/16 after rule correction. In this experiment, removal rules corrected confusion between removing an object and restoring its original state. An image study using two portrait references revealed inconsistencies between evaluator explanations and scores. The rules reduced state-update errors without additional model calls within the tested English patterns and synthetic dialogues.</w:t>
+        <w:t>Iterative portrait editing requires accurate updates to requested attribute values. We apply explicit preservation and removal rules after a language model extracts and reviews the requested changes. Preservation retains the previous value, whereas removal sets an attribute to absent. Across eight synthetic English dialogues with 32 turns, all six attribute values matched the reference state in 27/32 turns for the baseline, 27/32 for preservation alone, 28/32 for removal alone, and 29/32 for their combination. In eight new dialogues with 32 turns, the full-state match rate increased from 28/32 to 29/32. In a separate experiment involving expressions and poses, the full-state match rate for mixed attribute requests increased from 4/16 after model review to 16/16 after rule correction. A paired paraphrase test exposed errors in separating restoration from preservation clauses. We added bounded instruction normalization and froze the implementation before testing four new dialogues with 16 turns. The baseline matched 9/16 reference states, the existing preservation and removal rules matched 10/16, and normalization matched 16/16. An image study revealed inconsistencies between evaluator explanations and scores. The method reduced state-update errors without additional model calls within the tested English patterns and synthetic dialogues.</w:t>
       </w:r>
     </w:p>
     <w:p>
@@ -93,7 +93,7 @@
         <w:t xml:space="preserve">Keywords: </w:t>
       </w:r>
       <w:r>
-        <w:t>Iterative portrait editing, State tracking, Preservation constraints, Removal constraints</w:t>
+        <w:t>Iterative portrait editing, State tracking, Preservation constraints, Instruction normalization</w:t>
       </w:r>
     </w:p>
     <w:p>
@@ -137,7 +137,15 @@
         <w:jc w:val="both"/>
       </w:pPr>
       <w:r>
-        <w:t>분석 대상은 이미지 생성 전에 작성되는 편집 상태이다. 상태의 정답은 요청에 명시한 변경을 누적하여 계산할 수 있으므로 이미지 평가 모델의 판단과 분리하여 검사한다. 본 연구의 기여는 유지와 삭제를 구분한 후처리의 구현, 동일한 모델 응답을 이용한 유지·삭제 규칙의 효과 비교, 포즈·표정을 포함하는 복합 요청에서의 오류 분석이다.</w:t>
+        <w:t>초기 구현은 편집 대화 전체를 언어 모델에 전달하여 최종 프롬프트를 한 번에 작성하였다. 이 과정에서 이미 취소된 재킷과 장신구 조건이 최종 프롬프트에 남는 사례가 관찰되었다[9]. 이에 따라 프롬프트 종합을 항목별 상태 갱신과 최종 문장 작성으로 나누었다. 본 연구의 유지·삭제 검사는 상태 갱신 단계에 적용하며, 검사한 상태를 이미지 생성 프롬프트로 변환한다. 따라서 제안 방법은 프롬프트 종합 과정에서 취소된 조건과 유지할 조건을 구별하는 처리이다.</w:t>
+      </w:r>
+    </w:p>
+    <w:p>
+      <w:pPr>
+        <w:jc w:val="both"/>
+      </w:pPr>
+      <w:r>
+        <w:t>분석 대상은 이미지 생성 전에 작성되는 편집 상태이다. 상태의 정답은 요청에 명시한 변경을 누적하여 계산할 수 있으므로 이미지 평가 모델의 판단과 분리하여 검사한다. 본 연구는 유지·삭제를 구분한 후처리를 구현하고 동일한 모델 응답으로 구성요소별 효과를 비교한다. 또한 복합 요청과 표현 변화에서 발생한 오류를 분석하여, 원본 복원과 유지 지시의 적용 대상을 구분하는 구절 정규화 방법을 제안한다.</w:t>
       </w:r>
     </w:p>
     <w:p>
@@ -258,6 +266,38 @@
       </w:pPr>
       <w:r>
         <w:t>예를 들어 직전 배경이 파란색인 상태에서 배경 유지와 목걸이 삭제를 요청했다고 하자. 모델이 두 항목 모두 ‘원본’으로 추출하더라도 유지 규칙은 배경을 파란색으로, 삭제 규칙은 목걸이를 ‘없음’으로 보정한다. 규칙의 적용 조건을 충족한 구절만 보정하고 나머지는 모델이 갱신한 값을 유지한다. 이 처리에는 현재 요청과 직전 상태만 사용한다.</w:t>
+      </w:r>
+    </w:p>
+    <w:p>
+      <w:pPr>
+        <w:pStyle w:val="Heading2"/>
+      </w:pPr>
+      <w:r>
+        <w:t>4. 지시 구절의 정규화와 항목별 적용</w:t>
+      </w:r>
+    </w:p>
+    <w:p>
+      <w:pPr>
+        <w:jc w:val="both"/>
+      </w:pPr>
+      <w:r>
+        <w:t>표현 변화 검사에서 기존 후처리의 구절 경계 오류를 확인하여 정규화 단계를 추가하였다. 원본 복원 구절 뒤의 leaving이나 preserving을 다음 지시로 구분하고, bring back을 restore로 바꾼다. do not change와 do not alter는 해당 대상을 그대로 두는 지시로 변환한다. 예를 들어 셔츠를 원본으로 돌리면서 재킷은 유지하라는 문장을 복원 구절과 유지 구절로 나눈다. 이로써 원본 복원 검사에 재킷까지 포함되는 오류를 막는다.</w:t>
+      </w:r>
+    </w:p>
+    <w:p>
+      <w:pPr>
+        <w:jc w:val="both"/>
+      </w:pPr>
+      <w:r>
+        <w:t>정규화는 명시한 항목과 지원 어휘를 포함하는 구절에 적용한다. 인용문과 조건문은 변환 대상에서 제외하며, 같은 항목이 뒤에서 다시 언급되면 앞선 구절로 덮어쓰지 않는다. 정규화한 구절을 검증에 사용하고 변환 전후의 문장을 함께 저장한다. 언어 모델에는 원래 요청을 입력하므로 정규화가 모델 응답에 영향을 주지 않는다.</w:t>
+      </w:r>
+    </w:p>
+    <w:p>
+      <w:pPr>
+        <w:jc w:val="both"/>
+      </w:pPr>
+      <w:r>
+        <w:t>정규화와 함께 항목별 적용을 사용하여 한 항목의 형식 오류가 다른 변경까지 취소하는 일을 방지한다. 정규화는 지시의 적용 대상을 구분하고, 항목별 적용은 추출 결과를 검증하는 단위를 구분한다. 두 처리의 효과는 별도 조건으로 비교한다.</w:t>
       </w:r>
     </w:p>
     <w:p>
@@ -394,6 +434,30 @@
       </w:pPr>
       <w:r>
         <w:t>생성 단계는 첫 번째 요청 구성의 첫 턴을 세 조건에서 골라 두 원본 사진에 적용한 6장으로 따로 검사하였다. 선택 기준은 텍스트 결과 집계 전에 정하였다. 추출 모델의 출력 대신 정확한 요청을 직접 전달하고 첫 성공 이미지만 사용하였다. 표정 단독·표정과 포즈·속성 지시 혼합 조건의 시각적 목표는 각각 1·3·6개이며, Qwen2.5-VL-7B-4bit로 목표별 성공·실패·판단 불가와 설명을 받았다. 이 검사는 정확한 요청을 입력했을 때의 이미지 생성 결과를 살펴보기 위한 것이다.</w:t>
+      </w:r>
+    </w:p>
+    <w:p>
+      <w:pPr>
+        <w:pStyle w:val="Heading2"/>
+      </w:pPr>
+      <w:r>
+        <w:t>5. 표현 변화와 개선 방법의 검증</w:t>
+      </w:r>
+    </w:p>
+    <w:p>
+      <w:pPr>
+        <w:jc w:val="both"/>
+      </w:pPr>
+      <w:r>
+        <w:t>새 대화 재검증에 사용한 여덟 대화의 목표를 그대로 두고 요청 32개의 표현을 바꾸었다. 기존 규칙을 수정 없이 적용하여 표현 변화에 따른 오류를 확인하였다. 이 자료를 개발에 사용한 뒤 구절 정규화 코드를 고정하고 새로운 대화 네 개, 요청 16개로 검증하였다. 앞선 실험과 같은 추출 모델·예시·온도·최대 출력 길이를 사용하고, 각각 추출·재검토 응답 64개와 32개를 저장하였다. 모든 방법은 같은 원응답을 공유하며 자기 이전 상태를 누적한다.</w:t>
+      </w:r>
+    </w:p>
+    <w:p>
+      <w:pPr>
+        <w:jc w:val="both"/>
+      </w:pPr>
+      <w:r>
+        <w:t>새 대화에서는 기준 방법, 기존 유지·삭제, 구절 정규화, 항목별 적용, 정규화와 항목별 적용의 결합을 비교한다. 구절 정규화 조건은 일괄 적용을 유지하고, 항목별 적용 조건은 기존 유지·삭제 규칙을 사용한다. 결합 조건은 두 처리를 모두 사용한다. 전체 상태·항목별·최종 상태 일치율과 기준은 맞았지만 각 방법에서 새로 틀린 요청 수를 집계한다. 개발 자료 재계산과 새 대화 검증은 따로 보고한다.</w:t>
       </w:r>
     </w:p>
     <w:p>
@@ -4041,6 +4105,859 @@
     </w:p>
     <w:p>
       <w:pPr>
+        <w:pStyle w:val="Heading2"/>
+      </w:pPr>
+      <w:r>
+        <w:t>7. 표현 변화와 구절 정규화의 효과</w:t>
+      </w:r>
+    </w:p>
+    <w:p>
+      <w:pPr>
+        <w:jc w:val="both"/>
+      </w:pPr>
+      <w:r>
+        <w:t>같은 편집 목표를 다른 표현으로 요청한 32개 검사에서 기준과 기존 유지·삭제 방법은 모두 25/32의 전체 상태 일치율과 5/8의 최종 상태 일치율을 보였다. 유지 지시의 동의 표현을 인식하지 못한 사례와, 원본 복원 뒤의 leaving 구절까지 복원 대상으로 포함한 사례가 나타났다. bring back 구절에서는 모델이 원본 값을 반환해도 검증 과정에서 복원 요청으로 인정하지 못하였다. 오류는 모델의 추출뿐 아니라 후처리의 지시 범위 판정에서도 발생하였다.</w:t>
+      </w:r>
+    </w:p>
+    <w:p>
+      <w:pPr>
+        <w:jc w:val="both"/>
+      </w:pPr>
+      <w:r>
+        <w:t>이 자료에 구절 정규화를 적용한 개발 결과는 29/32, 항목별 적용은 27/32, 두 처리의 결합은 32/32였다. 정규화만 사용한 경우에는 이전 상태의 오류를 유지하여 기준이 맞았던 요청 하나를 틀렸다. 항목별 적용을 결합한 경우에는 해당 오류가 발생하지 않았다. 이 재계산 결과를 바탕으로 코드를 고정한 뒤 새 대화 네 개를 검사하였다.</w:t>
+      </w:r>
+    </w:p>
+    <w:p>
+      <w:pPr>
+        <w:pStyle w:val="Caption"/>
+        <w:keepNext/>
+        <w:spacing w:before="100"/>
+        <w:ind w:firstLine="0"/>
+        <w:jc w:val="center"/>
+      </w:pPr>
+      <w:r>
+        <w:t>표 7. 구절 정규화와 항목별 적용의 새 대화 검증</w:t>
+      </w:r>
+    </w:p>
+    <w:tbl>
+      <w:tblPr>
+        <w:tblW w:type="auto" w:w="0"/>
+        <w:tblLayout w:type="fixed"/>
+        <w:tblLook w:firstColumn="1" w:firstRow="1" w:lastColumn="0" w:lastRow="0" w:noHBand="0" w:noVBand="1" w:val="04A0"/>
+      </w:tblPr>
+      <w:tblGrid>
+        <w:gridCol w:w="1417"/>
+        <w:gridCol w:w="801"/>
+        <w:gridCol w:w="801"/>
+        <w:gridCol w:w="801"/>
+        <w:gridCol w:w="801"/>
+      </w:tblGrid>
+      <w:tr>
+        <w:trPr>
+          <w:cantSplit/>
+          <w:tblHeader/>
+        </w:trPr>
+        <w:tc>
+          <w:tcPr>
+            <w:tcW w:type="dxa" w:w="1417"/>
+            <w:tcMar>
+              <w:left w:w="45" w:type="dxa"/>
+              <w:right w:w="45" w:type="dxa"/>
+            </w:tcMar>
+            <w:tcBorders>
+              <w:bottom w:val="single" w:sz="5"/>
+            </w:tcBorders>
+          </w:tcPr>
+          <w:p>
+            <w:pPr>
+              <w:keepNext/>
+              <w:spacing w:after="60" w:before="60" w:line="240" w:lineRule="auto"/>
+              <w:ind w:firstLine="0"/>
+              <w:jc w:val="left"/>
+            </w:pPr>
+            <w:r>
+              <w:rPr>
+                <w:b/>
+                <w:sz w:val="16"/>
+              </w:rPr>
+              <w:t>방법</w:t>
+            </w:r>
+          </w:p>
+        </w:tc>
+        <w:tc>
+          <w:tcPr>
+            <w:tcW w:type="dxa" w:w="801"/>
+            <w:tcMar>
+              <w:left w:w="45" w:type="dxa"/>
+              <w:right w:w="45" w:type="dxa"/>
+            </w:tcMar>
+            <w:tcBorders>
+              <w:bottom w:val="single" w:sz="5"/>
+            </w:tcBorders>
+          </w:tcPr>
+          <w:p>
+            <w:pPr>
+              <w:keepNext/>
+              <w:spacing w:after="60" w:before="60" w:line="240" w:lineRule="auto"/>
+              <w:ind w:firstLine="0"/>
+              <w:jc w:val="center"/>
+            </w:pPr>
+            <w:r>
+              <w:rPr>
+                <w:b/>
+                <w:sz w:val="16"/>
+              </w:rPr>
+              <w:t>전체 상태</w:t>
+              <w:br/>
+              <w:t>일치율</w:t>
+            </w:r>
+          </w:p>
+        </w:tc>
+        <w:tc>
+          <w:tcPr>
+            <w:tcW w:type="dxa" w:w="801"/>
+            <w:tcMar>
+              <w:left w:w="45" w:type="dxa"/>
+              <w:right w:w="45" w:type="dxa"/>
+            </w:tcMar>
+            <w:tcBorders>
+              <w:bottom w:val="single" w:sz="5"/>
+            </w:tcBorders>
+          </w:tcPr>
+          <w:p>
+            <w:pPr>
+              <w:keepNext/>
+              <w:spacing w:after="60" w:before="60" w:line="240" w:lineRule="auto"/>
+              <w:ind w:firstLine="0"/>
+              <w:jc w:val="center"/>
+            </w:pPr>
+            <w:r>
+              <w:rPr>
+                <w:b/>
+                <w:sz w:val="16"/>
+              </w:rPr>
+              <w:t>항목별</w:t>
+              <w:br/>
+              <w:t>일치율</w:t>
+            </w:r>
+          </w:p>
+        </w:tc>
+        <w:tc>
+          <w:tcPr>
+            <w:tcW w:type="dxa" w:w="801"/>
+            <w:tcMar>
+              <w:left w:w="45" w:type="dxa"/>
+              <w:right w:w="45" w:type="dxa"/>
+            </w:tcMar>
+            <w:tcBorders>
+              <w:bottom w:val="single" w:sz="5"/>
+            </w:tcBorders>
+          </w:tcPr>
+          <w:p>
+            <w:pPr>
+              <w:keepNext/>
+              <w:spacing w:after="60" w:before="60" w:line="240" w:lineRule="auto"/>
+              <w:ind w:firstLine="0"/>
+              <w:jc w:val="center"/>
+            </w:pPr>
+            <w:r>
+              <w:rPr>
+                <w:b/>
+                <w:sz w:val="16"/>
+              </w:rPr>
+              <w:t>최종 상태</w:t>
+              <w:br/>
+              <w:t>일치율</w:t>
+            </w:r>
+          </w:p>
+        </w:tc>
+        <w:tc>
+          <w:tcPr>
+            <w:tcW w:type="dxa" w:w="801"/>
+            <w:tcMar>
+              <w:left w:w="45" w:type="dxa"/>
+              <w:right w:w="45" w:type="dxa"/>
+            </w:tcMar>
+            <w:tcBorders>
+              <w:bottom w:val="single" w:sz="5"/>
+            </w:tcBorders>
+          </w:tcPr>
+          <w:p>
+            <w:pPr>
+              <w:keepNext/>
+              <w:spacing w:after="60" w:before="60" w:line="240" w:lineRule="auto"/>
+              <w:ind w:firstLine="0"/>
+              <w:jc w:val="center"/>
+            </w:pPr>
+            <w:r>
+              <w:rPr>
+                <w:b/>
+                <w:sz w:val="16"/>
+              </w:rPr>
+              <w:t>새 오류 수</w:t>
+            </w:r>
+          </w:p>
+        </w:tc>
+      </w:tr>
+      <w:tr>
+        <w:trPr>
+          <w:cantSplit/>
+        </w:trPr>
+        <w:tc>
+          <w:tcPr>
+            <w:tcW w:type="dxa" w:w="1417"/>
+            <w:tcMar>
+              <w:left w:w="45" w:type="dxa"/>
+              <w:right w:w="45" w:type="dxa"/>
+            </w:tcMar>
+          </w:tcPr>
+          <w:p>
+            <w:pPr>
+              <w:keepNext/>
+              <w:spacing w:after="60" w:before="60" w:line="240" w:lineRule="auto"/>
+              <w:ind w:firstLine="0"/>
+              <w:jc w:val="left"/>
+            </w:pPr>
+            <w:r>
+              <w:rPr>
+                <w:b w:val="0"/>
+                <w:sz w:val="16"/>
+              </w:rPr>
+              <w:t>기준 방법</w:t>
+            </w:r>
+          </w:p>
+        </w:tc>
+        <w:tc>
+          <w:tcPr>
+            <w:tcW w:type="dxa" w:w="801"/>
+            <w:tcMar>
+              <w:left w:w="45" w:type="dxa"/>
+              <w:right w:w="45" w:type="dxa"/>
+            </w:tcMar>
+          </w:tcPr>
+          <w:p>
+            <w:pPr>
+              <w:keepNext/>
+              <w:spacing w:after="60" w:before="60" w:line="240" w:lineRule="auto"/>
+              <w:ind w:firstLine="0"/>
+              <w:jc w:val="center"/>
+            </w:pPr>
+            <w:r>
+              <w:rPr>
+                <w:b w:val="0"/>
+                <w:sz w:val="16"/>
+              </w:rPr>
+              <w:t>9/16</w:t>
+            </w:r>
+          </w:p>
+        </w:tc>
+        <w:tc>
+          <w:tcPr>
+            <w:tcW w:type="dxa" w:w="801"/>
+            <w:tcMar>
+              <w:left w:w="45" w:type="dxa"/>
+              <w:right w:w="45" w:type="dxa"/>
+            </w:tcMar>
+          </w:tcPr>
+          <w:p>
+            <w:pPr>
+              <w:keepNext/>
+              <w:spacing w:after="60" w:before="60" w:line="240" w:lineRule="auto"/>
+              <w:ind w:firstLine="0"/>
+              <w:jc w:val="center"/>
+            </w:pPr>
+            <w:r>
+              <w:rPr>
+                <w:b w:val="0"/>
+                <w:sz w:val="16"/>
+              </w:rPr>
+              <w:t>86/96</w:t>
+            </w:r>
+          </w:p>
+        </w:tc>
+        <w:tc>
+          <w:tcPr>
+            <w:tcW w:type="dxa" w:w="801"/>
+            <w:tcMar>
+              <w:left w:w="45" w:type="dxa"/>
+              <w:right w:w="45" w:type="dxa"/>
+            </w:tcMar>
+          </w:tcPr>
+          <w:p>
+            <w:pPr>
+              <w:keepNext/>
+              <w:spacing w:after="60" w:before="60" w:line="240" w:lineRule="auto"/>
+              <w:ind w:firstLine="0"/>
+              <w:jc w:val="center"/>
+            </w:pPr>
+            <w:r>
+              <w:rPr>
+                <w:b w:val="0"/>
+                <w:sz w:val="16"/>
+              </w:rPr>
+              <w:t>2/4</w:t>
+            </w:r>
+          </w:p>
+        </w:tc>
+        <w:tc>
+          <w:tcPr>
+            <w:tcW w:type="dxa" w:w="801"/>
+            <w:tcMar>
+              <w:left w:w="45" w:type="dxa"/>
+              <w:right w:w="45" w:type="dxa"/>
+            </w:tcMar>
+          </w:tcPr>
+          <w:p>
+            <w:pPr>
+              <w:keepNext/>
+              <w:spacing w:after="60" w:before="60" w:line="240" w:lineRule="auto"/>
+              <w:ind w:firstLine="0"/>
+              <w:jc w:val="center"/>
+            </w:pPr>
+            <w:r>
+              <w:rPr>
+                <w:b w:val="0"/>
+                <w:sz w:val="16"/>
+              </w:rPr>
+              <w:t>0</w:t>
+            </w:r>
+          </w:p>
+        </w:tc>
+      </w:tr>
+      <w:tr>
+        <w:trPr>
+          <w:cantSplit/>
+        </w:trPr>
+        <w:tc>
+          <w:tcPr>
+            <w:tcW w:type="dxa" w:w="1417"/>
+            <w:tcMar>
+              <w:left w:w="45" w:type="dxa"/>
+              <w:right w:w="45" w:type="dxa"/>
+            </w:tcMar>
+          </w:tcPr>
+          <w:p>
+            <w:pPr>
+              <w:keepNext/>
+              <w:spacing w:after="60" w:before="60" w:line="240" w:lineRule="auto"/>
+              <w:ind w:firstLine="0"/>
+              <w:jc w:val="left"/>
+            </w:pPr>
+            <w:r>
+              <w:rPr>
+                <w:b w:val="0"/>
+                <w:sz w:val="16"/>
+              </w:rPr>
+              <w:t>기존 유지·삭제</w:t>
+            </w:r>
+          </w:p>
+        </w:tc>
+        <w:tc>
+          <w:tcPr>
+            <w:tcW w:type="dxa" w:w="801"/>
+            <w:tcMar>
+              <w:left w:w="45" w:type="dxa"/>
+              <w:right w:w="45" w:type="dxa"/>
+            </w:tcMar>
+          </w:tcPr>
+          <w:p>
+            <w:pPr>
+              <w:keepNext/>
+              <w:spacing w:after="60" w:before="60" w:line="240" w:lineRule="auto"/>
+              <w:ind w:firstLine="0"/>
+              <w:jc w:val="center"/>
+            </w:pPr>
+            <w:r>
+              <w:rPr>
+                <w:b w:val="0"/>
+                <w:sz w:val="16"/>
+              </w:rPr>
+              <w:t>10/16</w:t>
+            </w:r>
+          </w:p>
+        </w:tc>
+        <w:tc>
+          <w:tcPr>
+            <w:tcW w:type="dxa" w:w="801"/>
+            <w:tcMar>
+              <w:left w:w="45" w:type="dxa"/>
+              <w:right w:w="45" w:type="dxa"/>
+            </w:tcMar>
+          </w:tcPr>
+          <w:p>
+            <w:pPr>
+              <w:keepNext/>
+              <w:spacing w:after="60" w:before="60" w:line="240" w:lineRule="auto"/>
+              <w:ind w:firstLine="0"/>
+              <w:jc w:val="center"/>
+            </w:pPr>
+            <w:r>
+              <w:rPr>
+                <w:b w:val="0"/>
+                <w:sz w:val="16"/>
+              </w:rPr>
+              <w:t>87/96</w:t>
+            </w:r>
+          </w:p>
+        </w:tc>
+        <w:tc>
+          <w:tcPr>
+            <w:tcW w:type="dxa" w:w="801"/>
+            <w:tcMar>
+              <w:left w:w="45" w:type="dxa"/>
+              <w:right w:w="45" w:type="dxa"/>
+            </w:tcMar>
+          </w:tcPr>
+          <w:p>
+            <w:pPr>
+              <w:keepNext/>
+              <w:spacing w:after="60" w:before="60" w:line="240" w:lineRule="auto"/>
+              <w:ind w:firstLine="0"/>
+              <w:jc w:val="center"/>
+            </w:pPr>
+            <w:r>
+              <w:rPr>
+                <w:b w:val="0"/>
+                <w:sz w:val="16"/>
+              </w:rPr>
+              <w:t>3/4</w:t>
+            </w:r>
+          </w:p>
+        </w:tc>
+        <w:tc>
+          <w:tcPr>
+            <w:tcW w:type="dxa" w:w="801"/>
+            <w:tcMar>
+              <w:left w:w="45" w:type="dxa"/>
+              <w:right w:w="45" w:type="dxa"/>
+            </w:tcMar>
+          </w:tcPr>
+          <w:p>
+            <w:pPr>
+              <w:keepNext/>
+              <w:spacing w:after="60" w:before="60" w:line="240" w:lineRule="auto"/>
+              <w:ind w:firstLine="0"/>
+              <w:jc w:val="center"/>
+            </w:pPr>
+            <w:r>
+              <w:rPr>
+                <w:b w:val="0"/>
+                <w:sz w:val="16"/>
+              </w:rPr>
+              <w:t>0</w:t>
+            </w:r>
+          </w:p>
+        </w:tc>
+      </w:tr>
+      <w:tr>
+        <w:trPr>
+          <w:cantSplit/>
+        </w:trPr>
+        <w:tc>
+          <w:tcPr>
+            <w:tcW w:type="dxa" w:w="1417"/>
+            <w:tcMar>
+              <w:left w:w="45" w:type="dxa"/>
+              <w:right w:w="45" w:type="dxa"/>
+            </w:tcMar>
+          </w:tcPr>
+          <w:p>
+            <w:pPr>
+              <w:keepNext/>
+              <w:spacing w:after="60" w:before="60" w:line="240" w:lineRule="auto"/>
+              <w:ind w:firstLine="0"/>
+              <w:jc w:val="left"/>
+            </w:pPr>
+            <w:r>
+              <w:rPr>
+                <w:b w:val="0"/>
+                <w:sz w:val="16"/>
+              </w:rPr>
+              <w:t>구절 정규화</w:t>
+            </w:r>
+          </w:p>
+        </w:tc>
+        <w:tc>
+          <w:tcPr>
+            <w:tcW w:type="dxa" w:w="801"/>
+            <w:tcMar>
+              <w:left w:w="45" w:type="dxa"/>
+              <w:right w:w="45" w:type="dxa"/>
+            </w:tcMar>
+          </w:tcPr>
+          <w:p>
+            <w:pPr>
+              <w:keepNext/>
+              <w:spacing w:after="60" w:before="60" w:line="240" w:lineRule="auto"/>
+              <w:ind w:firstLine="0"/>
+              <w:jc w:val="center"/>
+            </w:pPr>
+            <w:r>
+              <w:rPr>
+                <w:b w:val="0"/>
+                <w:sz w:val="16"/>
+              </w:rPr>
+              <w:t>16/16</w:t>
+            </w:r>
+          </w:p>
+        </w:tc>
+        <w:tc>
+          <w:tcPr>
+            <w:tcW w:type="dxa" w:w="801"/>
+            <w:tcMar>
+              <w:left w:w="45" w:type="dxa"/>
+              <w:right w:w="45" w:type="dxa"/>
+            </w:tcMar>
+          </w:tcPr>
+          <w:p>
+            <w:pPr>
+              <w:keepNext/>
+              <w:spacing w:after="60" w:before="60" w:line="240" w:lineRule="auto"/>
+              <w:ind w:firstLine="0"/>
+              <w:jc w:val="center"/>
+            </w:pPr>
+            <w:r>
+              <w:rPr>
+                <w:b w:val="0"/>
+                <w:sz w:val="16"/>
+              </w:rPr>
+              <w:t>96/96</w:t>
+            </w:r>
+          </w:p>
+        </w:tc>
+        <w:tc>
+          <w:tcPr>
+            <w:tcW w:type="dxa" w:w="801"/>
+            <w:tcMar>
+              <w:left w:w="45" w:type="dxa"/>
+              <w:right w:w="45" w:type="dxa"/>
+            </w:tcMar>
+          </w:tcPr>
+          <w:p>
+            <w:pPr>
+              <w:keepNext/>
+              <w:spacing w:after="60" w:before="60" w:line="240" w:lineRule="auto"/>
+              <w:ind w:firstLine="0"/>
+              <w:jc w:val="center"/>
+            </w:pPr>
+            <w:r>
+              <w:rPr>
+                <w:b w:val="0"/>
+                <w:sz w:val="16"/>
+              </w:rPr>
+              <w:t>4/4</w:t>
+            </w:r>
+          </w:p>
+        </w:tc>
+        <w:tc>
+          <w:tcPr>
+            <w:tcW w:type="dxa" w:w="801"/>
+            <w:tcMar>
+              <w:left w:w="45" w:type="dxa"/>
+              <w:right w:w="45" w:type="dxa"/>
+            </w:tcMar>
+          </w:tcPr>
+          <w:p>
+            <w:pPr>
+              <w:keepNext/>
+              <w:spacing w:after="60" w:before="60" w:line="240" w:lineRule="auto"/>
+              <w:ind w:firstLine="0"/>
+              <w:jc w:val="center"/>
+            </w:pPr>
+            <w:r>
+              <w:rPr>
+                <w:b w:val="0"/>
+                <w:sz w:val="16"/>
+              </w:rPr>
+              <w:t>0</w:t>
+            </w:r>
+          </w:p>
+        </w:tc>
+      </w:tr>
+      <w:tr>
+        <w:trPr>
+          <w:cantSplit/>
+        </w:trPr>
+        <w:tc>
+          <w:tcPr>
+            <w:tcW w:type="dxa" w:w="1417"/>
+            <w:tcMar>
+              <w:left w:w="45" w:type="dxa"/>
+              <w:right w:w="45" w:type="dxa"/>
+            </w:tcMar>
+          </w:tcPr>
+          <w:p>
+            <w:pPr>
+              <w:keepNext/>
+              <w:spacing w:after="60" w:before="60" w:line="240" w:lineRule="auto"/>
+              <w:ind w:firstLine="0"/>
+              <w:jc w:val="left"/>
+            </w:pPr>
+            <w:r>
+              <w:rPr>
+                <w:b w:val="0"/>
+                <w:sz w:val="16"/>
+              </w:rPr>
+              <w:t>항목별 적용</w:t>
+            </w:r>
+          </w:p>
+        </w:tc>
+        <w:tc>
+          <w:tcPr>
+            <w:tcW w:type="dxa" w:w="801"/>
+            <w:tcMar>
+              <w:left w:w="45" w:type="dxa"/>
+              <w:right w:w="45" w:type="dxa"/>
+            </w:tcMar>
+          </w:tcPr>
+          <w:p>
+            <w:pPr>
+              <w:keepNext/>
+              <w:spacing w:after="60" w:before="60" w:line="240" w:lineRule="auto"/>
+              <w:ind w:firstLine="0"/>
+              <w:jc w:val="center"/>
+            </w:pPr>
+            <w:r>
+              <w:rPr>
+                <w:b w:val="0"/>
+                <w:sz w:val="16"/>
+              </w:rPr>
+              <w:t>10/16</w:t>
+            </w:r>
+          </w:p>
+        </w:tc>
+        <w:tc>
+          <w:tcPr>
+            <w:tcW w:type="dxa" w:w="801"/>
+            <w:tcMar>
+              <w:left w:w="45" w:type="dxa"/>
+              <w:right w:w="45" w:type="dxa"/>
+            </w:tcMar>
+          </w:tcPr>
+          <w:p>
+            <w:pPr>
+              <w:keepNext/>
+              <w:spacing w:after="60" w:before="60" w:line="240" w:lineRule="auto"/>
+              <w:ind w:firstLine="0"/>
+              <w:jc w:val="center"/>
+            </w:pPr>
+            <w:r>
+              <w:rPr>
+                <w:b w:val="0"/>
+                <w:sz w:val="16"/>
+              </w:rPr>
+              <w:t>87/96</w:t>
+            </w:r>
+          </w:p>
+        </w:tc>
+        <w:tc>
+          <w:tcPr>
+            <w:tcW w:type="dxa" w:w="801"/>
+            <w:tcMar>
+              <w:left w:w="45" w:type="dxa"/>
+              <w:right w:w="45" w:type="dxa"/>
+            </w:tcMar>
+          </w:tcPr>
+          <w:p>
+            <w:pPr>
+              <w:keepNext/>
+              <w:spacing w:after="60" w:before="60" w:line="240" w:lineRule="auto"/>
+              <w:ind w:firstLine="0"/>
+              <w:jc w:val="center"/>
+            </w:pPr>
+            <w:r>
+              <w:rPr>
+                <w:b w:val="0"/>
+                <w:sz w:val="16"/>
+              </w:rPr>
+              <w:t>3/4</w:t>
+            </w:r>
+          </w:p>
+        </w:tc>
+        <w:tc>
+          <w:tcPr>
+            <w:tcW w:type="dxa" w:w="801"/>
+            <w:tcMar>
+              <w:left w:w="45" w:type="dxa"/>
+              <w:right w:w="45" w:type="dxa"/>
+            </w:tcMar>
+          </w:tcPr>
+          <w:p>
+            <w:pPr>
+              <w:keepNext/>
+              <w:spacing w:after="60" w:before="60" w:line="240" w:lineRule="auto"/>
+              <w:ind w:firstLine="0"/>
+              <w:jc w:val="center"/>
+            </w:pPr>
+            <w:r>
+              <w:rPr>
+                <w:b w:val="0"/>
+                <w:sz w:val="16"/>
+              </w:rPr>
+              <w:t>0</w:t>
+            </w:r>
+          </w:p>
+        </w:tc>
+      </w:tr>
+      <w:tr>
+        <w:trPr>
+          <w:cantSplit/>
+        </w:trPr>
+        <w:tc>
+          <w:tcPr>
+            <w:tcW w:type="dxa" w:w="1417"/>
+            <w:tcMar>
+              <w:left w:w="45" w:type="dxa"/>
+              <w:right w:w="45" w:type="dxa"/>
+            </w:tcMar>
+            <w:tcBorders>
+              <w:bottom w:val="single" w:sz="5"/>
+            </w:tcBorders>
+          </w:tcPr>
+          <w:p>
+            <w:pPr>
+              <w:keepNext w:val="0"/>
+              <w:spacing w:after="60" w:before="60" w:line="240" w:lineRule="auto"/>
+              <w:ind w:firstLine="0"/>
+              <w:jc w:val="left"/>
+            </w:pPr>
+            <w:r>
+              <w:rPr>
+                <w:b w:val="0"/>
+                <w:sz w:val="16"/>
+              </w:rPr>
+              <w:t>정규화+항목별 적용</w:t>
+            </w:r>
+          </w:p>
+        </w:tc>
+        <w:tc>
+          <w:tcPr>
+            <w:tcW w:type="dxa" w:w="801"/>
+            <w:tcMar>
+              <w:left w:w="45" w:type="dxa"/>
+              <w:right w:w="45" w:type="dxa"/>
+            </w:tcMar>
+            <w:tcBorders>
+              <w:bottom w:val="single" w:sz="5"/>
+            </w:tcBorders>
+          </w:tcPr>
+          <w:p>
+            <w:pPr>
+              <w:keepNext w:val="0"/>
+              <w:spacing w:after="60" w:before="60" w:line="240" w:lineRule="auto"/>
+              <w:ind w:firstLine="0"/>
+              <w:jc w:val="center"/>
+            </w:pPr>
+            <w:r>
+              <w:rPr>
+                <w:b w:val="0"/>
+                <w:sz w:val="16"/>
+              </w:rPr>
+              <w:t>16/16</w:t>
+            </w:r>
+          </w:p>
+        </w:tc>
+        <w:tc>
+          <w:tcPr>
+            <w:tcW w:type="dxa" w:w="801"/>
+            <w:tcMar>
+              <w:left w:w="45" w:type="dxa"/>
+              <w:right w:w="45" w:type="dxa"/>
+            </w:tcMar>
+            <w:tcBorders>
+              <w:bottom w:val="single" w:sz="5"/>
+            </w:tcBorders>
+          </w:tcPr>
+          <w:p>
+            <w:pPr>
+              <w:keepNext w:val="0"/>
+              <w:spacing w:after="60" w:before="60" w:line="240" w:lineRule="auto"/>
+              <w:ind w:firstLine="0"/>
+              <w:jc w:val="center"/>
+            </w:pPr>
+            <w:r>
+              <w:rPr>
+                <w:b w:val="0"/>
+                <w:sz w:val="16"/>
+              </w:rPr>
+              <w:t>96/96</w:t>
+            </w:r>
+          </w:p>
+        </w:tc>
+        <w:tc>
+          <w:tcPr>
+            <w:tcW w:type="dxa" w:w="801"/>
+            <w:tcMar>
+              <w:left w:w="45" w:type="dxa"/>
+              <w:right w:w="45" w:type="dxa"/>
+            </w:tcMar>
+            <w:tcBorders>
+              <w:bottom w:val="single" w:sz="5"/>
+            </w:tcBorders>
+          </w:tcPr>
+          <w:p>
+            <w:pPr>
+              <w:keepNext w:val="0"/>
+              <w:spacing w:after="60" w:before="60" w:line="240" w:lineRule="auto"/>
+              <w:ind w:firstLine="0"/>
+              <w:jc w:val="center"/>
+            </w:pPr>
+            <w:r>
+              <w:rPr>
+                <w:b w:val="0"/>
+                <w:sz w:val="16"/>
+              </w:rPr>
+              <w:t>4/4</w:t>
+            </w:r>
+          </w:p>
+        </w:tc>
+        <w:tc>
+          <w:tcPr>
+            <w:tcW w:type="dxa" w:w="801"/>
+            <w:tcMar>
+              <w:left w:w="45" w:type="dxa"/>
+              <w:right w:w="45" w:type="dxa"/>
+            </w:tcMar>
+            <w:tcBorders>
+              <w:bottom w:val="single" w:sz="5"/>
+            </w:tcBorders>
+          </w:tcPr>
+          <w:p>
+            <w:pPr>
+              <w:keepNext w:val="0"/>
+              <w:spacing w:after="60" w:before="60" w:line="240" w:lineRule="auto"/>
+              <w:ind w:firstLine="0"/>
+              <w:jc w:val="center"/>
+            </w:pPr>
+            <w:r>
+              <w:rPr>
+                <w:b w:val="0"/>
+                <w:sz w:val="16"/>
+              </w:rPr>
+              <w:t>0</w:t>
+            </w:r>
+          </w:p>
+        </w:tc>
+      </w:tr>
+    </w:tbl>
+    <w:p>
+      <w:pPr>
+        <w:jc w:val="both"/>
+      </w:pPr>
+      <w:r>
+        <w:t>표 7의 새 오류 수는 기준 방법이 맞았으나 해당 방법 적용 후 틀린 요청 수다. 구절 정규화는 기준보다 요청 일곱 개, 기존 유지·삭제보다 여섯 개를 더 맞혔다. 차이는 첫째·둘째·넷째 대화에서 나타났고 셋째 대화는 모든 방법이 네 요청을 모두 맞혔다. 정규화만 사용한 결과와 항목별 적용을 결합한 결과는 같았다. 따라서 이 새 대화에서의 추가 개선은 구절 정규화로 설명된다.</w:t>
+      </w:r>
+    </w:p>
+    <w:p>
+      <w:pPr>
+        <w:jc w:val="both"/>
+      </w:pPr>
+      <w:r>
+        <w:t>예를 들어 둘째 대화의 두 번째 요청은 셔츠와 목걸이를 원본으로 돌리되 초록 재킷과 사무실 배경은 유지하도록 지시하였다. 모델의 응답은 셔츠와 목걸이만 원본으로 지정하였다. 기존 복원 검사는 뒤의 leaving 구절까지 포함해 재킷과 배경도 원본으로 바꾸었으나, 정규화한 방법은 복원과 유지 대상을 구분하였다. 일부 후속 요청의 차이는 앞선 오류가 다음 상태에 남은 결과이다. 따라서 요청 일곱 개의 개선과 별도로, 개선이 나타난 대화 수를 함께 제시하였다.</w:t>
+      </w:r>
+    </w:p>
+    <w:p>
+      <w:pPr>
         <w:pStyle w:val="Heading1"/>
       </w:pPr>
       <w:r>
@@ -4081,6 +4998,14 @@
     </w:p>
     <w:p>
       <w:pPr>
+        <w:jc w:val="both"/>
+      </w:pPr>
+      <w:r>
+        <w:t>표현 변화 검사에서는 기존 후처리 자체가 정답인 모델 응답을 훼손하는 문제가 드러났다. 지시 구절 정규화는 이 오류를 줄였으며 새 대화 네 개에서 세 대화의 결과를 개선하였다. 개발 자료에서는 항목별 적용도 결합 효과에 기여했으나 새 대화에서는 정규화만으로 같은 결과를 얻었다. 검증 자료는 지정된 영어 어휘와 구절로 작성하였으며 정규화 규칙의 적용 범위도 이 문법에 해당한다. 새 대화 검증은 상태 기록의 정확도를 측정하였다.</w:t>
+      </w:r>
+    </w:p>
+    <w:p>
+      <w:pPr>
         <w:pStyle w:val="Heading1"/>
       </w:pPr>
       <w:r>
@@ -4101,6 +5026,14 @@
       </w:pPr>
       <w:r>
         <w:t>포즈·표정을 포함한 복합 요청 실험의 혼합 조건에서는 전체 상태 일치율이 재검토 4/16에서 규칙 보정 16/16으로 증가하였다. 모델은 포즈와 표정을 정확히 추출했으나 삭제를 원본 복원으로 해석하였고, 삭제 규칙이 이를 바로잡았다. 유지·삭제 지시를 확인하는 후처리 규칙은 동일 모델의 재검토 뒤에도 남은 상태 갱신 오류를 줄였다.</w:t>
+      </w:r>
+    </w:p>
+    <w:p>
+      <w:pPr>
+        <w:jc w:val="both"/>
+      </w:pPr>
+      <w:r>
+        <w:t>표현을 바꾼 요청에서 발견한 구절 경계 오류를 분석하여 지시 정규화를 추가하였다. 코드를 고정한 뒤 수행한 새 대화 검증에서 전체 상태 일치율은 기준 9/16, 기존 유지·삭제 10/16, 정규화 16/16이었다. 원본 복원과 유지 지시를 각각의 구절에 적용하는 처리가 잘못된 상태 갱신을 줄였다. 제안 방법은 편집 요구를 프롬프트로 종합하는 과정에서 지시별 적용 대상을 구분하며 추가 모델 호출 없이 동작한다.</w:t>
       </w:r>
     </w:p>
     <w:p>

</xml_diff>

<commit_message>
Validate sentence-structure effects and strengthen thesis controls
</commit_message>
<xml_diff>
--- a/paper/manuscript.inha.docx
+++ b/paper/manuscript.inha.docx
@@ -65,7 +65,7 @@
         <w:t xml:space="preserve">요약: </w:t>
       </w:r>
       <w:r>
-        <w:t>반복 이미지 편집에서는 변경할 내용과 유지하거나 삭제할 내용을 다음 프롬프트에 정확히 반영해야 한다. 본 연구는 언어 모델이 변경 사항을 추출하고 재검토한 뒤 명시적인 유지·삭제 지시를 확인하는 후처리 규칙을 제안한다. 유지 규칙은 이전 값을 보존하고 삭제 규칙은 값을 없음으로 설정한다. 유지·삭제 규칙 비교 실험의 대화 8개 32턴에서 전체 상태 일치율은 기준 27/32, 유지 규칙만 27/32, 삭제 규칙만 28/32, 두 규칙 결합 29/32였다. 새로운 대화 8개 32턴의 재검증에서도 28/32에서 29/32로 증가하였다. 포즈·표정을 포함한 복합 요청 실험에서는 속성 지시 혼합 조건의 전체 상태 일치율이 재검토 4/16에서 규칙 보정 16/16으로 증가하였다. 표현 변화 검사에서 원본 복원과 유지 구절의 경계 오류를 확인하여 지시 정규화를 추가하였다. 코드를 고정한 뒤 새 대화 4개 16턴을 검사한 결과, 기준은 9/16, 기존 유지·삭제는 10/16, 정규화는 16/16이었다. 실제 인물 사진의 AI 평가에서는 설명과 점수의 불일치가 나타났다. 제안 방법은 지정된 영어 구절의 합성 대화에서 추가 모델 호출 없이 상태 갱신 오류를 줄였다.</w:t>
+        <w:t>반복 이미지 편집에서는 변경할 내용과 유지하거나 삭제할 내용을 다음 프롬프트에 정확히 반영해야 한다. 본 연구는 언어 모델이 변경 사항을 추출하고 재검토한 뒤 명시적인 유지·삭제 지시를 확인하는 후처리 규칙을 제안한다. 유지 규칙은 이전 값을 보존하고 삭제 규칙은 값을 없음으로 설정한다. 유지·삭제 규칙 비교 실험의 대화 8개 32턴에서 전체 상태 일치율은 기준 27/32, 유지 규칙만 27/32, 삭제 규칙만 28/32, 두 규칙 결합 29/32였다. 새로운 대화 8개 32턴의 재검증에서도 28/32에서 29/32로 증가하였다. 포즈·표정을 포함한 복합 요청 실험에서는 속성 지시 혼합 조건의 전체 상태 일치율이 재검토 4/16에서 규칙 보정 16/16으로 증가하였다. 표현 변화 검사에서 원본 복원과 유지 구절의 경계 오류를 확인하여 지시 정규화를 추가하였다. 코드를 고정한 뒤 새 대화 4개 16턴을 검사한 결과, 기준은 9/16, 기존 유지·삭제는 10/16, 정규화는 16/16이었다. 같은 목표의 문장 구조 대조에서도 기존 유지·삭제 26/36, 단순 JSON 적용 28/36, 정규화 36/36이었다. 실제 인물 사진의 AI 평가에서는 설명과 점수의 불일치가 나타났다. 제안 방법은 지정된 영어 구절의 합성 대화에서 추가 모델 호출 없이 상태 갱신 오류를 줄였다.</w:t>
       </w:r>
     </w:p>
     <w:p>
@@ -79,7 +79,7 @@
         <w:t xml:space="preserve">Abstract: </w:t>
       </w:r>
       <w:r>
-        <w:t>Iterative portrait editing requires accurate updates to requested attribute values. We apply explicit preservation and removal rules after a language model extracts and reviews the requested changes. Preservation retains the previous value, whereas removal sets an attribute to absent. Across eight synthetic English dialogues with 32 turns, all six attribute values matched the reference state in 27/32 turns for the baseline, 27/32 for preservation alone, 28/32 for removal alone, and 29/32 for their combination. In eight new dialogues with 32 turns, the full-state match rate increased from 28/32 to 29/32. In a separate experiment involving expressions and poses, the full-state match rate for mixed attribute requests increased from 4/16 after model review to 16/16 after rule correction. A paired paraphrase test exposed errors in separating restoration from preservation clauses. We added bounded instruction normalization and froze the implementation before testing four new dialogues with 16 turns. The baseline matched 9/16 reference states, the existing preservation and removal rules matched 10/16, and normalization matched 16/16. An image study revealed inconsistencies between evaluator explanations and scores. The method reduced state-update errors without additional model calls within the tested English patterns and synthetic dialogues.</w:t>
+        <w:t>Iterative portrait editing requires accurate updates to requested attribute values. We apply explicit preservation and removal rules after a language model extracts and reviews the requested changes. Preservation retains the previous value, whereas removal sets an attribute to absent. Across eight synthetic English dialogues with 32 turns, all six attribute values matched the reference state in 27/32 turns for the baseline, 27/32 for preservation alone, 28/32 for removal alone, and 29/32 for their combination. In eight new dialogues with 32 turns, the full-state match rate increased from 28/32 to 29/32. In a separate experiment involving expressions and poses, the full-state match rate for mixed attribute requests increased from 4/16 after model review to 16/16 after rule correction. A paired paraphrase test exposed errors in separating restoration from preservation clauses. We added bounded instruction normalization and froze the implementation before testing four new dialogues with 16 turns. The baseline matched 9/16 reference states, the existing preservation and removal rules matched 10/16, and normalization matched 16/16. A paired comparison across three target configurations and four sentence structures yielded 26/36 for the existing rules, 28/36 for schema-only patch application, and 36/36 for normalization. An image study revealed inconsistencies between evaluator explanations and scores. The method reduced state-update errors without additional model calls within the tested English patterns and synthetic dialogues.</w:t>
       </w:r>
     </w:p>
     <w:p>
@@ -93,7 +93,7 @@
         <w:t xml:space="preserve">Keywords: </w:t>
       </w:r>
       <w:r>
-        <w:t>Iterative portrait editing, State tracking, Preservation constraints, Instruction normalization</w:t>
+        <w:t>Iterative portrait editing, State tracking, Preservation and removal rules, Instruction clause normalization</w:t>
       </w:r>
     </w:p>
     <w:p>
@@ -398,6 +398,14 @@
     </w:p>
     <w:p>
       <w:pPr>
+        <w:jc w:val="both"/>
+      </w:pPr>
+      <w:r>
+        <w:t>후처리 코드에는 별도의 자동 검사를 적용하였다. 세 가지 이전 상태에서 복원·유지 대상의 조합, 두 대상의 복원, 뒤 지시의 우선 적용, 부정·조건·인용 표현을 구성하고 기준 갱신값과 비교하였다. 구성한 963개 경우에서 정답인 변경 사항을 적용한 결과가 기준 상태와 일치하였고 입력 상태도 보존되었다. 이는 정답 응답을 구성한 코드 검사이며, 실제 모델을 호출한 대화 실험과 구분한다.</w:t>
+      </w:r>
+    </w:p>
+    <w:p>
+      <w:pPr>
         <w:pStyle w:val="Heading2"/>
       </w:pPr>
       <w:r>
@@ -458,6 +466,22 @@
       </w:pPr>
       <w:r>
         <w:t>새 대화에서는 기준 방법, 기존 유지·삭제, 구절 정규화, 항목별 적용, 정규화와 항목별 적용의 결합을 비교한다. 구절 정규화 조건은 일괄 적용을 유지하고, 항목별 적용 조건은 기존 유지·삭제 규칙을 사용한다. 결합 조건은 두 처리를 모두 사용한다. 전체 상태·항목별·최종 상태 일치율과 기준은 맞았지만 각 방법에서 새로 틀린 요청 수를 집계한다. 개발 자료 재계산과 새 대화 검증은 따로 보고한다.</w:t>
+      </w:r>
+    </w:p>
+    <w:p>
+      <w:pPr>
+        <w:pStyle w:val="Heading2"/>
+      </w:pPr>
+      <w:r>
+        <w:t>6. 같은 목표의 문장 구조 대조</w:t>
+      </w:r>
+    </w:p>
+    <w:p>
+      <w:pPr>
+        <w:jc w:val="both"/>
+      </w:pPr>
+      <w:r>
+        <w:t>세 가지 항목 구성에서 복원·유지 목표를 고정하고 네 문장 구조를 비교하였다. 표준 분리 구절, leaving 연결, preserving 연결, bring back과 부정형 유지 표현을 사용하였다. 각 대화는 초기 설정, 복원과 유지, 별도 변경 요청의 세 단계로 구성하였다. 총 대화 12개·요청 36개에 대해 기존 코드를 수정 없이 적용하고 추출·재검토 응답 72개를 새로 저장하였다. 목표 구성은 세 가지이며 문장 구조 사이의 목표는 같다. 같은 초기 설정과 후속 요청의 반복 호출은 새 목표 구성과 구분하였다.</w:t>
       </w:r>
     </w:p>
     <w:p>
@@ -4129,6 +4153,14 @@
     </w:p>
     <w:p>
       <w:pPr>
+        <w:jc w:val="both"/>
+      </w:pPr>
+      <w:r>
+        <w:t>기존 후처리의 복잡성이 비교 결과에 미친 영향을 살펴보기 위해, 같은 응답에 단순 JSON 적용 방법을 추가로 비교하였다. 항목과 값의 형식만 검사하고 요청의 어휘를 확인하는 규칙이나 유지·복원 규칙을 사용하지 않았다. 최초 응답만 적용하면 10/16, 유효한 재검토 응답을 우선 적용하면 9/16이었다. 이 비교는 저장된 전체 응답을 이용한 사후 분석이며, 최초 응답 방식은 요청당 한 번, 재검토 방식과 제안 방법은 두 번 호출한다.</w:t>
+      </w:r>
+    </w:p>
+    <w:p>
+      <w:pPr>
         <w:pStyle w:val="Caption"/>
         <w:keepNext/>
         <w:spacing w:before="100"/>
@@ -4826,7 +4858,9 @@
                 <w:b w:val="0"/>
                 <w:sz w:val="16"/>
               </w:rPr>
-              <w:t>정규화+항목별 적용</w:t>
+              <w:t>정규화+</w:t>
+              <w:br/>
+              <w:t>항목별 적용</w:t>
             </w:r>
           </w:p>
         </w:tc>
@@ -4958,6 +4992,593 @@
     </w:p>
     <w:p>
       <w:pPr>
+        <w:pStyle w:val="Heading2"/>
+      </w:pPr>
+      <w:r>
+        <w:t>8. 문장 구조에 따른 처리 차이</w:t>
+      </w:r>
+    </w:p>
+    <w:p>
+      <w:pPr>
+        <w:jc w:val="both"/>
+      </w:pPr>
+      <w:r>
+        <w:t>같은 목표를 네 구조로 요청한 대조에서 전체 상태 일치율은 기준 18/36, 기존 유지·삭제 26/36, 구절 정규화 36/36이었다. 항목별 적용만 사용하면 26/36, 정규화와 결합하면 36/36으로 앞선 새 대화 검증과 같은 구성요소별 차이가 나타났다. 초기 설정은 모든 방법이 12회 모두 맞혔다. 표 8은 복원과 유지를 함께 요청한 두 번째 단계에서 세 목표 구성의 상태가 모두 맞았는지 비교한 결과다.</w:t>
+      </w:r>
+    </w:p>
+    <w:p>
+      <w:pPr>
+        <w:pStyle w:val="Caption"/>
+        <w:keepNext/>
+        <w:spacing w:before="100"/>
+        <w:ind w:firstLine="0"/>
+        <w:jc w:val="center"/>
+      </w:pPr>
+      <w:r>
+        <w:t>표 8. 같은 복원·유지 목표의 문장 구조별 전체 상태 일치율</w:t>
+      </w:r>
+    </w:p>
+    <w:tbl>
+      <w:tblPr>
+        <w:tblW w:type="auto" w:w="0"/>
+        <w:tblLayout w:type="fixed"/>
+        <w:tblLook w:firstColumn="1" w:firstRow="1" w:lastColumn="0" w:lastRow="0" w:noHBand="0" w:noVBand="1" w:val="04A0"/>
+      </w:tblPr>
+      <w:tblGrid>
+        <w:gridCol w:w="1417"/>
+        <w:gridCol w:w="1068"/>
+        <w:gridCol w:w="1068"/>
+        <w:gridCol w:w="1068"/>
+      </w:tblGrid>
+      <w:tr>
+        <w:trPr>
+          <w:cantSplit/>
+          <w:tblHeader/>
+        </w:trPr>
+        <w:tc>
+          <w:tcPr>
+            <w:tcW w:type="dxa" w:w="1417"/>
+            <w:tcMar>
+              <w:left w:w="45" w:type="dxa"/>
+              <w:right w:w="45" w:type="dxa"/>
+            </w:tcMar>
+            <w:tcBorders>
+              <w:bottom w:val="single" w:sz="5"/>
+            </w:tcBorders>
+          </w:tcPr>
+          <w:p>
+            <w:pPr>
+              <w:keepNext/>
+              <w:spacing w:after="60" w:before="60" w:line="240" w:lineRule="auto"/>
+              <w:ind w:firstLine="0"/>
+              <w:jc w:val="left"/>
+            </w:pPr>
+            <w:r>
+              <w:rPr>
+                <w:b/>
+                <w:sz w:val="16"/>
+              </w:rPr>
+              <w:t>문장 구조</w:t>
+            </w:r>
+          </w:p>
+        </w:tc>
+        <w:tc>
+          <w:tcPr>
+            <w:tcW w:type="dxa" w:w="1068"/>
+            <w:tcMar>
+              <w:left w:w="45" w:type="dxa"/>
+              <w:right w:w="45" w:type="dxa"/>
+            </w:tcMar>
+            <w:tcBorders>
+              <w:bottom w:val="single" w:sz="5"/>
+            </w:tcBorders>
+          </w:tcPr>
+          <w:p>
+            <w:pPr>
+              <w:keepNext/>
+              <w:spacing w:after="60" w:before="60" w:line="240" w:lineRule="auto"/>
+              <w:ind w:firstLine="0"/>
+              <w:jc w:val="center"/>
+            </w:pPr>
+            <w:r>
+              <w:rPr>
+                <w:b/>
+                <w:sz w:val="16"/>
+              </w:rPr>
+              <w:t>기준 방법</w:t>
+            </w:r>
+          </w:p>
+        </w:tc>
+        <w:tc>
+          <w:tcPr>
+            <w:tcW w:type="dxa" w:w="1068"/>
+            <w:tcMar>
+              <w:left w:w="45" w:type="dxa"/>
+              <w:right w:w="45" w:type="dxa"/>
+            </w:tcMar>
+            <w:tcBorders>
+              <w:bottom w:val="single" w:sz="5"/>
+            </w:tcBorders>
+          </w:tcPr>
+          <w:p>
+            <w:pPr>
+              <w:keepNext/>
+              <w:spacing w:after="60" w:before="60" w:line="240" w:lineRule="auto"/>
+              <w:ind w:firstLine="0"/>
+              <w:jc w:val="center"/>
+            </w:pPr>
+            <w:r>
+              <w:rPr>
+                <w:b/>
+                <w:sz w:val="16"/>
+              </w:rPr>
+              <w:t>기존 유지·삭제</w:t>
+            </w:r>
+          </w:p>
+        </w:tc>
+        <w:tc>
+          <w:tcPr>
+            <w:tcW w:type="dxa" w:w="1068"/>
+            <w:tcMar>
+              <w:left w:w="45" w:type="dxa"/>
+              <w:right w:w="45" w:type="dxa"/>
+            </w:tcMar>
+            <w:tcBorders>
+              <w:bottom w:val="single" w:sz="5"/>
+            </w:tcBorders>
+          </w:tcPr>
+          <w:p>
+            <w:pPr>
+              <w:keepNext/>
+              <w:spacing w:after="60" w:before="60" w:line="240" w:lineRule="auto"/>
+              <w:ind w:firstLine="0"/>
+              <w:jc w:val="center"/>
+            </w:pPr>
+            <w:r>
+              <w:rPr>
+                <w:b/>
+                <w:sz w:val="16"/>
+              </w:rPr>
+              <w:t>구절 정규화</w:t>
+            </w:r>
+          </w:p>
+        </w:tc>
+      </w:tr>
+      <w:tr>
+        <w:trPr>
+          <w:cantSplit/>
+        </w:trPr>
+        <w:tc>
+          <w:tcPr>
+            <w:tcW w:type="dxa" w:w="1417"/>
+            <w:tcMar>
+              <w:left w:w="45" w:type="dxa"/>
+              <w:right w:w="45" w:type="dxa"/>
+            </w:tcMar>
+          </w:tcPr>
+          <w:p>
+            <w:pPr>
+              <w:keepNext/>
+              <w:spacing w:after="60" w:before="60" w:line="240" w:lineRule="auto"/>
+              <w:ind w:firstLine="0"/>
+              <w:jc w:val="left"/>
+            </w:pPr>
+            <w:r>
+              <w:rPr>
+                <w:b w:val="0"/>
+                <w:sz w:val="16"/>
+              </w:rPr>
+              <w:t>표준 분리 구절</w:t>
+            </w:r>
+          </w:p>
+        </w:tc>
+        <w:tc>
+          <w:tcPr>
+            <w:tcW w:type="dxa" w:w="1068"/>
+            <w:tcMar>
+              <w:left w:w="45" w:type="dxa"/>
+              <w:right w:w="45" w:type="dxa"/>
+            </w:tcMar>
+          </w:tcPr>
+          <w:p>
+            <w:pPr>
+              <w:keepNext/>
+              <w:spacing w:after="60" w:before="60" w:line="240" w:lineRule="auto"/>
+              <w:ind w:firstLine="0"/>
+              <w:jc w:val="center"/>
+            </w:pPr>
+            <w:r>
+              <w:rPr>
+                <w:b w:val="0"/>
+                <w:sz w:val="16"/>
+              </w:rPr>
+              <w:t>2/3</w:t>
+            </w:r>
+          </w:p>
+        </w:tc>
+        <w:tc>
+          <w:tcPr>
+            <w:tcW w:type="dxa" w:w="1068"/>
+            <w:tcMar>
+              <w:left w:w="45" w:type="dxa"/>
+              <w:right w:w="45" w:type="dxa"/>
+            </w:tcMar>
+          </w:tcPr>
+          <w:p>
+            <w:pPr>
+              <w:keepNext/>
+              <w:spacing w:after="60" w:before="60" w:line="240" w:lineRule="auto"/>
+              <w:ind w:firstLine="0"/>
+              <w:jc w:val="center"/>
+            </w:pPr>
+            <w:r>
+              <w:rPr>
+                <w:b w:val="0"/>
+                <w:sz w:val="16"/>
+              </w:rPr>
+              <w:t>3/3</w:t>
+            </w:r>
+          </w:p>
+        </w:tc>
+        <w:tc>
+          <w:tcPr>
+            <w:tcW w:type="dxa" w:w="1068"/>
+            <w:tcMar>
+              <w:left w:w="45" w:type="dxa"/>
+              <w:right w:w="45" w:type="dxa"/>
+            </w:tcMar>
+          </w:tcPr>
+          <w:p>
+            <w:pPr>
+              <w:keepNext/>
+              <w:spacing w:after="60" w:before="60" w:line="240" w:lineRule="auto"/>
+              <w:ind w:firstLine="0"/>
+              <w:jc w:val="center"/>
+            </w:pPr>
+            <w:r>
+              <w:rPr>
+                <w:b w:val="0"/>
+                <w:sz w:val="16"/>
+              </w:rPr>
+              <w:t>3/3</w:t>
+            </w:r>
+          </w:p>
+        </w:tc>
+      </w:tr>
+      <w:tr>
+        <w:trPr>
+          <w:cantSplit/>
+        </w:trPr>
+        <w:tc>
+          <w:tcPr>
+            <w:tcW w:type="dxa" w:w="1417"/>
+            <w:tcMar>
+              <w:left w:w="45" w:type="dxa"/>
+              <w:right w:w="45" w:type="dxa"/>
+            </w:tcMar>
+          </w:tcPr>
+          <w:p>
+            <w:pPr>
+              <w:keepNext/>
+              <w:spacing w:after="60" w:before="60" w:line="240" w:lineRule="auto"/>
+              <w:ind w:firstLine="0"/>
+              <w:jc w:val="left"/>
+            </w:pPr>
+            <w:r>
+              <w:rPr>
+                <w:b w:val="0"/>
+                <w:sz w:val="16"/>
+              </w:rPr>
+              <w:t>leaving 연결</w:t>
+            </w:r>
+          </w:p>
+        </w:tc>
+        <w:tc>
+          <w:tcPr>
+            <w:tcW w:type="dxa" w:w="1068"/>
+            <w:tcMar>
+              <w:left w:w="45" w:type="dxa"/>
+              <w:right w:w="45" w:type="dxa"/>
+            </w:tcMar>
+          </w:tcPr>
+          <w:p>
+            <w:pPr>
+              <w:keepNext/>
+              <w:spacing w:after="60" w:before="60" w:line="240" w:lineRule="auto"/>
+              <w:ind w:firstLine="0"/>
+              <w:jc w:val="center"/>
+            </w:pPr>
+            <w:r>
+              <w:rPr>
+                <w:b w:val="0"/>
+                <w:sz w:val="16"/>
+              </w:rPr>
+              <w:t>0/3</w:t>
+            </w:r>
+          </w:p>
+        </w:tc>
+        <w:tc>
+          <w:tcPr>
+            <w:tcW w:type="dxa" w:w="1068"/>
+            <w:tcMar>
+              <w:left w:w="45" w:type="dxa"/>
+              <w:right w:w="45" w:type="dxa"/>
+            </w:tcMar>
+          </w:tcPr>
+          <w:p>
+            <w:pPr>
+              <w:keepNext/>
+              <w:spacing w:after="60" w:before="60" w:line="240" w:lineRule="auto"/>
+              <w:ind w:firstLine="0"/>
+              <w:jc w:val="center"/>
+            </w:pPr>
+            <w:r>
+              <w:rPr>
+                <w:b w:val="0"/>
+                <w:sz w:val="16"/>
+              </w:rPr>
+              <w:t>3/3</w:t>
+            </w:r>
+          </w:p>
+        </w:tc>
+        <w:tc>
+          <w:tcPr>
+            <w:tcW w:type="dxa" w:w="1068"/>
+            <w:tcMar>
+              <w:left w:w="45" w:type="dxa"/>
+              <w:right w:w="45" w:type="dxa"/>
+            </w:tcMar>
+          </w:tcPr>
+          <w:p>
+            <w:pPr>
+              <w:keepNext/>
+              <w:spacing w:after="60" w:before="60" w:line="240" w:lineRule="auto"/>
+              <w:ind w:firstLine="0"/>
+              <w:jc w:val="center"/>
+            </w:pPr>
+            <w:r>
+              <w:rPr>
+                <w:b w:val="0"/>
+                <w:sz w:val="16"/>
+              </w:rPr>
+              <w:t>3/3</w:t>
+            </w:r>
+          </w:p>
+        </w:tc>
+      </w:tr>
+      <w:tr>
+        <w:trPr>
+          <w:cantSplit/>
+        </w:trPr>
+        <w:tc>
+          <w:tcPr>
+            <w:tcW w:type="dxa" w:w="1417"/>
+            <w:tcMar>
+              <w:left w:w="45" w:type="dxa"/>
+              <w:right w:w="45" w:type="dxa"/>
+            </w:tcMar>
+          </w:tcPr>
+          <w:p>
+            <w:pPr>
+              <w:keepNext/>
+              <w:spacing w:after="60" w:before="60" w:line="240" w:lineRule="auto"/>
+              <w:ind w:firstLine="0"/>
+              <w:jc w:val="left"/>
+            </w:pPr>
+            <w:r>
+              <w:rPr>
+                <w:b w:val="0"/>
+                <w:sz w:val="16"/>
+              </w:rPr>
+              <w:t>preserving 연결</w:t>
+            </w:r>
+          </w:p>
+        </w:tc>
+        <w:tc>
+          <w:tcPr>
+            <w:tcW w:type="dxa" w:w="1068"/>
+            <w:tcMar>
+              <w:left w:w="45" w:type="dxa"/>
+              <w:right w:w="45" w:type="dxa"/>
+            </w:tcMar>
+          </w:tcPr>
+          <w:p>
+            <w:pPr>
+              <w:keepNext/>
+              <w:spacing w:after="60" w:before="60" w:line="240" w:lineRule="auto"/>
+              <w:ind w:firstLine="0"/>
+              <w:jc w:val="center"/>
+            </w:pPr>
+            <w:r>
+              <w:rPr>
+                <w:b w:val="0"/>
+                <w:sz w:val="16"/>
+              </w:rPr>
+              <w:t>0/3</w:t>
+            </w:r>
+          </w:p>
+        </w:tc>
+        <w:tc>
+          <w:tcPr>
+            <w:tcW w:type="dxa" w:w="1068"/>
+            <w:tcMar>
+              <w:left w:w="45" w:type="dxa"/>
+              <w:right w:w="45" w:type="dxa"/>
+            </w:tcMar>
+          </w:tcPr>
+          <w:p>
+            <w:pPr>
+              <w:keepNext/>
+              <w:spacing w:after="60" w:before="60" w:line="240" w:lineRule="auto"/>
+              <w:ind w:firstLine="0"/>
+              <w:jc w:val="center"/>
+            </w:pPr>
+            <w:r>
+              <w:rPr>
+                <w:b w:val="0"/>
+                <w:sz w:val="16"/>
+              </w:rPr>
+              <w:t>0/3</w:t>
+            </w:r>
+          </w:p>
+        </w:tc>
+        <w:tc>
+          <w:tcPr>
+            <w:tcW w:type="dxa" w:w="1068"/>
+            <w:tcMar>
+              <w:left w:w="45" w:type="dxa"/>
+              <w:right w:w="45" w:type="dxa"/>
+            </w:tcMar>
+          </w:tcPr>
+          <w:p>
+            <w:pPr>
+              <w:keepNext/>
+              <w:spacing w:after="60" w:before="60" w:line="240" w:lineRule="auto"/>
+              <w:ind w:firstLine="0"/>
+              <w:jc w:val="center"/>
+            </w:pPr>
+            <w:r>
+              <w:rPr>
+                <w:b w:val="0"/>
+                <w:sz w:val="16"/>
+              </w:rPr>
+              <w:t>3/3</w:t>
+            </w:r>
+          </w:p>
+        </w:tc>
+      </w:tr>
+      <w:tr>
+        <w:trPr>
+          <w:cantSplit/>
+        </w:trPr>
+        <w:tc>
+          <w:tcPr>
+            <w:tcW w:type="dxa" w:w="1417"/>
+            <w:tcMar>
+              <w:left w:w="45" w:type="dxa"/>
+              <w:right w:w="45" w:type="dxa"/>
+            </w:tcMar>
+            <w:tcBorders>
+              <w:bottom w:val="single" w:sz="5"/>
+            </w:tcBorders>
+          </w:tcPr>
+          <w:p>
+            <w:pPr>
+              <w:keepNext w:val="0"/>
+              <w:spacing w:after="60" w:before="60" w:line="240" w:lineRule="auto"/>
+              <w:ind w:firstLine="0"/>
+              <w:jc w:val="left"/>
+            </w:pPr>
+            <w:r>
+              <w:rPr>
+                <w:b w:val="0"/>
+                <w:sz w:val="16"/>
+              </w:rPr>
+              <w:t>bring back과 부정형 유지</w:t>
+            </w:r>
+          </w:p>
+        </w:tc>
+        <w:tc>
+          <w:tcPr>
+            <w:tcW w:type="dxa" w:w="1068"/>
+            <w:tcMar>
+              <w:left w:w="45" w:type="dxa"/>
+              <w:right w:w="45" w:type="dxa"/>
+            </w:tcMar>
+            <w:tcBorders>
+              <w:bottom w:val="single" w:sz="5"/>
+            </w:tcBorders>
+          </w:tcPr>
+          <w:p>
+            <w:pPr>
+              <w:keepNext w:val="0"/>
+              <w:spacing w:after="60" w:before="60" w:line="240" w:lineRule="auto"/>
+              <w:ind w:firstLine="0"/>
+              <w:jc w:val="center"/>
+            </w:pPr>
+            <w:r>
+              <w:rPr>
+                <w:b w:val="0"/>
+                <w:sz w:val="16"/>
+              </w:rPr>
+              <w:t>1/3</w:t>
+            </w:r>
+          </w:p>
+        </w:tc>
+        <w:tc>
+          <w:tcPr>
+            <w:tcW w:type="dxa" w:w="1068"/>
+            <w:tcMar>
+              <w:left w:w="45" w:type="dxa"/>
+              <w:right w:w="45" w:type="dxa"/>
+            </w:tcMar>
+            <w:tcBorders>
+              <w:bottom w:val="single" w:sz="5"/>
+            </w:tcBorders>
+          </w:tcPr>
+          <w:p>
+            <w:pPr>
+              <w:keepNext w:val="0"/>
+              <w:spacing w:after="60" w:before="60" w:line="240" w:lineRule="auto"/>
+              <w:ind w:firstLine="0"/>
+              <w:jc w:val="center"/>
+            </w:pPr>
+            <w:r>
+              <w:rPr>
+                <w:b w:val="0"/>
+                <w:sz w:val="16"/>
+              </w:rPr>
+              <w:t>1/3</w:t>
+            </w:r>
+          </w:p>
+        </w:tc>
+        <w:tc>
+          <w:tcPr>
+            <w:tcW w:type="dxa" w:w="1068"/>
+            <w:tcMar>
+              <w:left w:w="45" w:type="dxa"/>
+              <w:right w:w="45" w:type="dxa"/>
+            </w:tcMar>
+            <w:tcBorders>
+              <w:bottom w:val="single" w:sz="5"/>
+            </w:tcBorders>
+          </w:tcPr>
+          <w:p>
+            <w:pPr>
+              <w:keepNext w:val="0"/>
+              <w:spacing w:after="60" w:before="60" w:line="240" w:lineRule="auto"/>
+              <w:ind w:firstLine="0"/>
+              <w:jc w:val="center"/>
+            </w:pPr>
+            <w:r>
+              <w:rPr>
+                <w:b w:val="0"/>
+                <w:sz w:val="16"/>
+              </w:rPr>
+              <w:t>3/3</w:t>
+            </w:r>
+          </w:p>
+        </w:tc>
+      </w:tr>
+    </w:tbl>
+    <w:p>
+      <w:pPr>
+        <w:jc w:val="both"/>
+      </w:pPr>
+      <w:r>
+        <w:t>기존 유지·삭제 규칙은 unchanged를 포함한 leaving 구절을 처리하였으나 preserving 연결에서는 세 구성 모두 틀렸다. bring back 구조에서도 세 구성 중 한 구성만 맞혔다. 정규화는 네 구조 모두에서 세 구성을 맞혔다. 세 번째 단계의 결과는 표 8과 같아, 앞서 생긴 상태 오류가 별도 변경 후에도 남는 양상을 보였다.</w:t>
+      </w:r>
+    </w:p>
+    <w:p>
+      <w:pPr>
+        <w:jc w:val="both"/>
+      </w:pPr>
+      <w:r>
+        <w:t>단순 JSON 적용을 추가로 재계산하면 최초 응답과 재검토 우선 방식이 모두 28/36이었다. 정규화는 두 단순 방식보다 여덟 요청을 더 맞혔다. 요청 문장은 서로 다른 18개이며, 같은 초기 설정과 후속 요청을 반복 호출한 응답 쌍은 모두 같았다. 따라서 이 대조는 서로 다른 요청 36개의 관측이 아니라, 세 목표 구성에서 문장 구조를 바꾼 대응 결과이다.</w:t>
+      </w:r>
+    </w:p>
+    <w:p>
+      <w:pPr>
         <w:pStyle w:val="Heading1"/>
       </w:pPr>
       <w:r>
@@ -5006,6 +5627,14 @@
     </w:p>
     <w:p>
       <w:pPr>
+        <w:jc w:val="both"/>
+      </w:pPr>
+      <w:r>
+        <w:t>문장 구조 대조에서는 목표를 같게 두고 표현만 바꾸어 차이를 확인하였다. 기존 유지·삭제 규칙의 실패는 preserving과 bring back 구조에 집중되었으며, 단순 JSON 적용도 정규화와 차이를 보였다. 동일한 추출·재검토 응답에서도 지시별 적용 대상을 구분한 후처리가 상태 오류를 줄였다. 효과를 확인한 대상은 고정한 세 가지 항목 구성과 네 문장 구조이다.</w:t>
+      </w:r>
+    </w:p>
+    <w:p>
+      <w:pPr>
         <w:pStyle w:val="Heading1"/>
       </w:pPr>
       <w:r>
@@ -5034,6 +5663,14 @@
       </w:pPr>
       <w:r>
         <w:t>표현을 바꾼 요청에서 발견한 구절 경계 오류를 분석하여 지시 정규화를 추가하였다. 코드를 고정한 뒤 수행한 새 대화 검증에서 전체 상태 일치율은 기준 9/16, 기존 유지·삭제 10/16, 정규화 16/16이었다. 원본 복원과 유지 지시를 각각의 구절에 적용하는 처리가 잘못된 상태 갱신을 줄였다. 제안 방법은 편집 요구를 프롬프트로 종합하는 과정에서 지시별 적용 대상을 구분하며 추가 모델 호출 없이 동작한다.</w:t>
+      </w:r>
+    </w:p>
+    <w:p>
+      <w:pPr>
+        <w:jc w:val="both"/>
+      </w:pPr>
+      <w:r>
+        <w:t>같은 목표를 네 문장 구조로 요청한 대조에서도 기존 유지·삭제 26/36, 단순 JSON 적용 28/36, 정규화 36/36이었다. 지정된 편집 어휘 안에서 복원과 유지 구절을 분리하는 처리가 상태 갱신의 정확도를 높였다.</w:t>
       </w:r>
     </w:p>
     <w:p>

</xml_diff>

<commit_message>
Remove repository self-citation from thesis references
</commit_message>
<xml_diff>
--- a/paper/manuscript.inha.docx
+++ b/paper/manuscript.inha.docx
@@ -137,7 +137,7 @@
         <w:jc w:val="both"/>
       </w:pPr>
       <w:r>
-        <w:t>초기 구현은 편집 대화 전체를 언어 모델에 전달하여 최종 프롬프트를 한 번에 작성하였다. 이 과정에서 이미 취소된 재킷과 장신구 조건이 최종 프롬프트에 남는 사례가 관찰되었다[9]. 이에 따라 프롬프트 종합을 항목별 상태 갱신과 최종 문장 작성으로 나누었다. 본 연구의 유지·삭제 검사는 상태 갱신 단계에 적용하며, 검사한 상태를 이미지 생성 프롬프트로 변환한다. 따라서 제안 방법은 프롬프트 종합 과정에서 취소된 조건과 유지할 조건을 구별하는 처리이다.</w:t>
+        <w:t>초기 구현은 편집 대화 전체를 언어 모델에 전달하여 최종 프롬프트를 한 번에 작성하였다. 이 과정에서 이미 취소된 재킷과 장신구 조건이 최종 프롬프트에 남는 사례가 관찰되었다. 이에 따라 프롬프트 종합을 항목별 상태 갱신과 최종 문장 작성으로 나누었다. 본 연구의 유지·삭제 검사는 상태 갱신 단계에 적용하며, 검사한 상태를 이미지 생성 프롬프트로 변환한다. 따라서 제안 방법은 프롬프트 종합 과정에서 취소된 조건과 유지할 조건을 구별하는 처리이다.</w:t>
       </w:r>
     </w:p>
     <w:p>
@@ -393,7 +393,17 @@
         <w:jc w:val="both"/>
       </w:pPr>
       <w:r>
-        <w:t>실험 코드와 대화, 정답, 모델 응답, 생성 이미지 및 평가 원문은 연구 저장소에 공개하였다[9]. 정확한 모델 버전과 실행 설정은 실험별 기록에 포함하였으며, 개발 중 재계산한 결과와 검증 결과를 구분하였다.</w:t>
+        <w:t>실험 코드와 대화, 정답, 모델 응답, 생성 이미지 및 평가 원문은 연구 저장소에 공개하였다. 정확한 모델 버전과 실행 설정은 실험별 기록에 포함하였으며, 개발 중 재계산한 결과와 검증 결과를 구분하였다.</w:t>
+      </w:r>
+    </w:p>
+    <w:p>
+      <w:pPr>
+        <w:keepLines/>
+        <w:ind w:firstLine="0"/>
+        <w:jc w:val="left"/>
+      </w:pPr>
+      <w:r>
+        <w:t>https://github.com/kimmireu0220/inha-capstone</w:t>
       </w:r>
     </w:p>
     <w:p>
@@ -5761,16 +5771,6 @@
         <w:t>[8] Monstera Production, “Cheerful black woman in studio,” Pexels, photo 6311581. https://www.pexels.com/photo/cheerful-black-woman-in-studio-6311581/</w:t>
       </w:r>
     </w:p>
-    <w:p>
-      <w:pPr>
-        <w:keepLines/>
-        <w:ind w:firstLine="0"/>
-        <w:jc w:val="left"/>
-      </w:pPr>
-      <w:r>
-        <w:t>[9] 김미르·장윤석, 반복 인물 이미지 편집 실험 코드 및 자료, inha-capstone repository, 2026. https://github.com/kimmireu0220/inha-capstone</w:t>
-      </w:r>
-    </w:p>
     <w:sectPr>
       <w:type w:val="continuous"/>
       <w:pgSz w:w="11906" w:h="16838"/>

</xml_diff>

<commit_message>
Revise paper and slides with clear request-based wording
</commit_message>
<xml_diff>
--- a/paper/manuscript.inha.docx
+++ b/paper/manuscript.inha.docx
@@ -10,7 +10,7 @@
         <w:jc w:val="center"/>
       </w:pPr>
       <w:r>
-        <w:t>반복 인물 이미지 편집을 위한 유지 및 삭제 지시의 상태 갱신 제약</w:t>
+        <w:t>반복 인물 이미지 편집을 위한 유지 및 삭제 지시 처리 방법</w:t>
       </w:r>
     </w:p>
     <w:p>
@@ -21,7 +21,7 @@
         <w:jc w:val="center"/>
       </w:pPr>
       <w:r>
-        <w:t>Explicit Preservation and Removal Constraints for State Updates in Iterative Portrait Editing</w:t>
+        <w:t>Handling Preservation and Removal Instructions in Iterative Portrait Editing</w:t>
       </w:r>
     </w:p>
     <w:p>
@@ -65,7 +65,7 @@
         <w:t xml:space="preserve">요약: </w:t>
       </w:r>
       <w:r>
-        <w:t>반복 이미지 편집에서는 변경할 내용과 유지하거나 삭제할 내용을 다음 프롬프트에 정확히 반영해야 한다. 본 연구는 언어 모델이 변경 사항을 추출하고 재검토한 뒤 명시적인 유지·삭제 지시를 확인하는 후처리 규칙을 제안한다. 유지 규칙은 이전 값을 보존하고 삭제 규칙은 값을 없음으로 설정한다. 유지·삭제 규칙 비교 실험의 대화 8개 32턴에서 전체 상태 일치율은 기준 27/32, 유지 규칙만 27/32, 삭제 규칙만 28/32, 두 규칙 결합 29/32였다. 새로운 대화 8개 32턴의 재검증에서도 28/32에서 29/32로 증가하였다. 포즈·표정을 포함한 복합 요청 실험에서는 속성 지시 혼합 조건의 전체 상태 일치율이 재검토 4/16에서 규칙 보정 16/16으로 증가하였다. 표현 변화 검사에서 원본 복원과 유지 구절의 경계 오류를 확인하여 지시 정규화를 추가하였다. 코드를 고정한 뒤 새 대화 4개 16턴을 검사한 결과, 기준은 9/16, 기존 유지·삭제는 10/16, 정규화는 16/16이었다. 같은 목표의 문장 구조 대조에서도 기존 유지·삭제 26/36, 단순 JSON 적용 28/36, 정규화 36/36이었다. 실제 인물 사진의 AI 평가에서는 설명과 점수의 불일치가 나타났다. 제안 방법은 지정된 영어 구절의 합성 대화에서 추가 모델 호출 없이 상태 갱신 오류를 줄였다.</w:t>
+        <w:t>반복 이미지 편집에서는 변경할 내용과 유지하거나 삭제할 내용을 다음 프롬프트에 정확히 반영해야 한다. 본 연구는 언어 모델이 변경 사항을 추출하고 재검토한 뒤 명시적인 유지·삭제 지시를 확인하는 후처리 규칙을 제안한다. 유지 규칙은 이전 값을 보존하고 삭제 규칙은 값을 없음으로 설정한다. 유지·삭제 규칙 비교 실험의 대화 8개, 요청 32회에서 전체 상태 일치율은 기준 27/32, 유지 규칙만 27/32, 삭제 규칙만 28/32, 두 규칙 결합 29/32였다. 새로운 대화 8개, 요청 32회의 재검증에서도 28/32에서 29/32로 증가하였다. 포즈·표정을 포함한 복합 요청 실험에서는 속성 지시 혼합 조건의 전체 상태 일치율이 재검토 4/16에서 규칙 보정 16/16으로 증가하였다. 표현 변화 검사에서 원본 복원과 유지 구절의 경계 오류를 확인하여 지시 정규화를 추가하였다. 코드를 고정한 뒤 새 대화 4개, 요청 16회를 검사한 결과, 기준은 9/16, 기존 유지·삭제는 10/16, 정규화는 16/16이었다. 같은 목표의 문장 구조 대조에서도 기존 유지·삭제 26/36, 단순 JSON 적용 28/36, 정규화 36/36이었다. 실제 인물 사진의 AI 평가에서는 설명과 점수의 불일치가 나타났다. 제안 방법은 지정된 영어 구절의 합성 대화에서 추가 모델 호출 없이 상태 갱신 오류를 줄였다.</w:t>
       </w:r>
     </w:p>
     <w:p>
@@ -79,7 +79,7 @@
         <w:t xml:space="preserve">Abstract: </w:t>
       </w:r>
       <w:r>
-        <w:t>Iterative portrait editing requires accurate updates to requested attribute values. We apply explicit preservation and removal rules after a language model extracts and reviews the requested changes. Preservation retains the previous value, whereas removal sets an attribute to absent. Across eight synthetic English dialogues with 32 turns, all six attribute values matched the reference state in 27/32 turns for the baseline, 27/32 for preservation alone, 28/32 for removal alone, and 29/32 for their combination. In eight new dialogues with 32 turns, the full-state match rate increased from 28/32 to 29/32. In a separate experiment involving expressions and poses, the full-state match rate for mixed attribute requests increased from 4/16 after model review to 16/16 after rule correction. A paired paraphrase test exposed errors in separating restoration from preservation clauses. We added bounded instruction normalization and froze the implementation before testing four new dialogues with 16 turns. The baseline matched 9/16 reference states, the existing preservation and removal rules matched 10/16, and normalization matched 16/16. A paired comparison across three target configurations and four sentence structures yielded 26/36 for the existing rules, 28/36 for schema-only patch application, and 36/36 for normalization. An image study revealed inconsistencies between evaluator explanations and scores. The method reduced state-update errors without additional model calls within the tested English patterns and synthetic dialogues.</w:t>
+        <w:t>Iterative portrait editing requires accurate updates to requested attribute values. We apply explicit preservation and removal rules after a language model extracts and reviews the requested changes. Preservation retains the previous value, whereas removal sets an attribute to absent. Across eight synthetic English dialogues with 32 requests, all six attribute values matched the reference state in 27/32 requests for the baseline, 27/32 for preservation alone, 28/32 for removal alone, and 29/32 for their combination. In eight new dialogues with 32 requests, the full-state match rate increased from 28/32 to 29/32. In a separate experiment involving expressions and poses, the full-state match rate for mixed attribute requests increased from 4/16 after model review to 16/16 after rule correction. A paired paraphrase test exposed errors in separating restoration from preservation clauses. We added normalization of explicitly supported instruction clauses and froze the implementation before testing four new dialogues with 16 requests. The baseline matched 9/16 reference states, the existing preservation and removal rules matched 10/16, and normalization matched 16/16. A paired comparison across three sets of editing goals and four sentence structures yielded 26/36 for the existing rules, 28/36 for schema-only patch application, and 36/36 for normalization. An image study revealed inconsistencies between evaluator explanations and scores. The method reduced state-update errors without additional model calls within the tested English patterns and synthetic dialogues.</w:t>
       </w:r>
     </w:p>
     <w:p>
@@ -137,7 +137,7 @@
         <w:jc w:val="both"/>
       </w:pPr>
       <w:r>
-        <w:t>초기 구현은 편집 대화 전체를 언어 모델에 전달하여 최종 프롬프트를 한 번에 작성하였다. 이 과정에서 이미 취소된 재킷과 장신구 조건이 최종 프롬프트에 남는 사례가 관찰되었다. 이에 따라 프롬프트 종합을 항목별 상태 갱신과 최종 문장 작성으로 나누었다. 본 연구의 유지·삭제 검사는 상태 갱신 단계에 적용하며, 검사한 상태를 이미지 생성 프롬프트로 변환한다. 따라서 제안 방법은 프롬프트 종합 과정에서 취소된 조건과 유지할 조건을 구별하는 처리이다.</w:t>
+        <w:t>초기 구현은 편집 대화 전체를 언어 모델에 전달하여 최종 프롬프트를 한 번에 작성하였다. 이 과정에서 이미 취소된 재킷과 장신구 조건이 최종 프롬프트에 남는 사례가 관찰되었다. 이에 따라 프롬프트 종합을 항목별 상태 갱신과 최종 문장 작성으로 나누었다. 유지·삭제 규칙으로 저장된 조건을 확인한 뒤 이미지 생성 프롬프트를 작성한다. 이 과정에서 취소한 조건을 지우고 유지할 조건을 남긴다.</w:t>
       </w:r>
     </w:p>
     <w:p>
@@ -193,7 +193,7 @@
         <w:jc w:val="both"/>
       </w:pPr>
       <w:r>
-        <w:t>편집 상태는 현재까지의 요청을 반영한 항목별 요구 값이다. 재킷·상의·핀·목걸이·배경·소품의 여섯 항목을 저장한다. 각 항목에는 지정된 속성 값 또는 ‘원본’을 저장한다. 제거 가능한 재킷·핀·목걸이·소품에는 ‘없음’도 사용할 수 있다. ‘원본’은 최초 사진의 상태로 복원하는 동작이며, ‘없음’은 대상을 제거하는 동작이다. 초기에는 모든 항목을 ‘원본’으로 설정한다.</w:t>
+        <w:t>편집 상태는 현재까지의 요청을 반영하여 항목마다 저장한 편집 조건이다. 재킷·상의·핀·목걸이·배경·소품의 여섯 항목을 저장한다. 각 항목에는 지정된 속성 값 또는 ‘원본’을 저장한다. 제거 가능한 재킷·핀·목걸이·소품에는 ‘없음’도 사용할 수 있다. ‘원본’은 최초 사진의 상태로 복원하는 동작이며, ‘없음’은 대상을 제거하는 동작이다. 초기에는 모든 항목을 ‘원본’으로 설정한다.</w:t>
       </w:r>
     </w:p>
     <w:p>
@@ -201,7 +201,7 @@
         <w:jc w:val="both"/>
       </w:pPr>
       <w:r>
-        <w:t>각 턴에서 Qwen3-4B-4bit[4]가 현재 요청에서 변경할 항목과 값을 JSON 형식으로 추출한다. 같은 모델이 요청과 첫 응답을 입력받아 한 차례 재검토한다. 모든 비교 방법은 이 두 응답을 공유하며 각자의 이전 편집 상태에 적용한다.</w:t>
+        <w:t>요청을 받을 때마다 Qwen3-4B-4bit[4]가 현재 요청에서 변경할 항목과 값을 JSON 형식으로 추출한다. 같은 모델이 요청과 첫 응답을 입력받아 한 차례 재검토한다. 모든 비교 방법은 이 두 응답을 공유하며 각자의 이전 편집 상태에 적용한다.</w:t>
       </w:r>
     </w:p>
     <w:p>
@@ -217,7 +217,7 @@
         <w:pStyle w:val="Heading2"/>
       </w:pPr>
       <w:r>
-        <w:t>2. 명시적 유지와 삭제</w:t>
+        <w:t>2. 유지·삭제 지시 검사</w:t>
       </w:r>
     </w:p>
     <w:p>
@@ -241,7 +241,7 @@
         <w:jc w:val="both"/>
       </w:pPr>
       <w:r>
-        <w:t>이 방법은 사전 학습된 모델의 추출·재검토 응답을 그대로 사용한다. 규칙의 적용 범위는 지정된 어휘와 문형으로 한정하며, 그 밖의 표현은 모델이 해석한다. 유지 규칙은 직전 값을 보존하므로 과거 상태의 오류도 다음 턴으로 이어질 수 있다.</w:t>
+        <w:t>이 방법은 사전 학습된 모델의 추출·재검토 응답을 그대로 사용한다. 규칙의 적용 범위는 지정된 어휘와 문형으로 한정하며, 그 밖의 표현은 모델이 해석한다. 유지 규칙은 직전 값을 보존하므로 과거 상태의 오류도 다음 요청으로 이어질 수 있다.</w:t>
       </w:r>
     </w:p>
     <w:p>
@@ -257,7 +257,7 @@
         <w:jc w:val="both"/>
       </w:pPr>
       <w:r>
-        <w:t>각 턴에서는 먼저 직전 상태를 복사하고 추출·재검토 응답에서 허용된 항목과 값에 맞는 변경 사항을 선택한다. 이를 복사한 상태에 적용한 다음, 현재 요청에서 지원 문형에 해당하는 구절을 찾는다. 명시적인 유지 구절의 항목은 직전 값으로 되돌리고, 삭제 구절의 항목은 ‘없음’으로 설정한다. 따라서 유지 규칙이 참조하는 값은 모델 응답을 적용하기 전의 상태이다. 모델 응답을 적용한 뒤의 값을 참조하면 잘못 변경된 값도 보존할 수 있다. 최종 상태와 함께 적용 항목, 동작 및 근거 구절을 저장한다.</w:t>
+        <w:t>요청을 처리할 때는 먼저 직전 상태를 복사하고 추출·재검토 응답에서 허용된 항목과 값에 맞는 변경 사항을 선택한다. 이를 복사한 상태에 적용한 다음, 현재 요청에서 지원 문형에 해당하는 구절을 찾는다. 명시적인 유지 구절의 항목은 직전 값으로 되돌리고, 삭제 구절의 항목은 ‘없음’으로 설정한다. 따라서 유지 규칙이 참조하는 값은 모델 응답을 적용하기 전의 상태이다. 모델 응답을 적용한 뒤의 값을 참조하면 잘못 변경된 값도 보존할 수 있다. 최종 상태와 함께 적용 항목, 동작 및 근거 구절을 저장한다.</w:t>
       </w:r>
     </w:p>
     <w:p>
@@ -281,7 +281,7 @@
         <w:jc w:val="both"/>
       </w:pPr>
       <w:r>
-        <w:t>표현 변화 검사에서 기존 후처리의 구절 경계 오류를 확인하여 정규화 단계를 추가하였다. 원본 복원 구절 뒤의 leaving이나 preserving을 다음 지시로 구분하고, bring back을 restore로 바꾼다. do not change와 do not alter는 해당 대상을 그대로 두는 지시로 변환한다. 예를 들어 셔츠를 원본으로 돌리면서 재킷은 유지하라는 문장을 복원 구절과 유지 구절로 나눈다. 이로써 원본 복원 검사에 재킷까지 포함되는 오류를 막는다.</w:t>
+        <w:t>표현을 바꾼 요청을 검사하자, 복원 지시가 뒤의 유지 대상에까지 적용되는 오류가 나타났다. 이를 고치기 위해 뜻이 같은 지시를 정해진 문장 형태로 바꾸는 정규화 단계를 추가하였다. 원본 복원 구절 뒤의 leaving이나 preserving을 다음 지시로 구분하고, bring back을 restore로 바꾼다. do not change와 do not alter는 해당 대상을 그대로 두는 지시로 변환한다. 예를 들어 셔츠를 원본으로 돌리면서 재킷은 유지하라는 문장을 복원 구절과 유지 구절로 나눈다. 이로써 원본 복원 검사에 재킷까지 포함되는 오류를 막는다.</w:t>
       </w:r>
     </w:p>
     <w:p>
@@ -297,7 +297,7 @@
         <w:jc w:val="both"/>
       </w:pPr>
       <w:r>
-        <w:t>정규화와 함께 항목별 적용을 사용하여 한 항목의 형식 오류가 다른 변경까지 취소하는 일을 방지한다. 정규화는 지시의 적용 대상을 구분하고, 항목별 적용은 추출 결과를 검증하는 단위를 구분한다. 두 처리의 효과는 별도 조건으로 비교한다.</w:t>
+        <w:t>정규화와 함께 항목별 적용을 사용하여 한 항목의 형식 오류가 다른 변경까지 취소하는 일을 방지한다. 정규화는 각 지시가 어느 항목에 적용되는지 구분한다. 항목별 적용은 추출한 값을 하나씩 검사하여 유효한 변경을 반영한다. 두 처리의 효과는 별도 조건으로 비교한다.</w:t>
       </w:r>
     </w:p>
     <w:p>
@@ -321,7 +321,7 @@
         <w:jc w:val="both"/>
       </w:pPr>
       <w:r>
-        <w:t>초기 개발 대화에서는 keep을 폭넓게 탐지하는 유지 규칙이 전체 상태 일치율을 기준 30/32에서 32/32로 증가시켰다. 그러나 후속 검사에서 off나 색 변경 요청을 유지 지시로 잘못 처리하였다. 후속 개발 대화에서 이 규칙의 전체 상태 일치율은 12/32였고, 적용 문형을 좁힌 유지 규칙은 기준과 같은 27/32였다. 문형을 좁혀도 최종 상태 일치율은 6/8에서 5/8로 감소하였다. 중간 턴의 잘못된 삭제는 막았지만 다음 턴의 실제 삭제 요청을 모델이 놓쳤기 때문이다.</w:t>
+        <w:t>초기 개발 대화에서는 keep을 폭넓게 탐지하는 유지 규칙이 전체 상태 일치율을 기준 30/32에서 32/32로 증가시켰다. 그러나 후속 검사에서 off나 색 변경 요청을 유지 지시로 잘못 처리하였다. 후속 개발 대화에서 이 규칙의 전체 상태 일치율은 12/32였고, 적용 문형을 좁힌 유지 규칙은 기준과 같은 27/32였다. 문형을 좁혀도 최종 상태 일치율은 6/8에서 5/8로 감소하였다. 대화 중간에 잘못 삭제되는 것은 막았지만 다음 요청에서 명시한 삭제 지시를 모델이 놓쳤기 때문이다.</w:t>
       </w:r>
     </w:p>
     <w:p>
@@ -329,7 +329,7 @@
         <w:jc w:val="both"/>
       </w:pPr>
       <w:r>
-        <w:t>후속 개발 결과를 분석한 뒤 유지·삭제 규칙 비교 실험을 설계하였다. 이 실험에는 AI를 이용해 작성한 영어 합성 대화 8개 32턴을 사용하였다. 각 요청의 정답 상태는 대화 작성 시 지정한 항목별 변경을 초기 상태에 순서대로 적용하여 계산하였다. 대화와 정답, 코드, 프롬프트, 모델 버전을 모두 추론 전에 확정하였다. 규칙 개발에 사용한 대화와 비교 실험에 사용한 대화의 결과는 따로 보고한다.</w:t>
+        <w:t>후속 개발 결과를 분석한 뒤 유지·삭제 규칙 비교 실험을 설계하였다. 이 실험에는 AI를 이용해 작성한 영어 합성 대화 8개, 요청 32회를 사용하였다. 각 요청의 정답 상태는 대화 작성 시 지정한 항목별 변경을 초기 상태에 순서대로 적용하여 계산하였다. 대화와 정답, 코드, 프롬프트, 모델 버전을 모두 추론 전에 확정하였다. 규칙 개발에 사용한 대화와 비교 실험에 사용한 대화의 결과는 따로 보고한다.</w:t>
       </w:r>
     </w:p>
     <w:p>
@@ -337,7 +337,7 @@
         <w:jc w:val="both"/>
       </w:pPr>
       <w:r>
-        <w:t>변경 사항 추출에는 Qwen3-4B의 4비트 양자화 모델을 사용하였다. 생성 온도는 0, 최대 출력 길이는 260토큰으로 설정하고 공통 예시 7개를 제공하였다. 32턴에 두 번씩 총 64회 호출하였다. 기준 방법, 유지 규칙만 적용, 삭제 규칙만 적용, 두 규칙 결합을 비교한다. 결합 방식의 채택 조건은 추론 전에 설정하였다. 전체 상태 일치율은 기준보다 높고, 최종 상태 일치율은 기준 이상이며, 유지 지시 위반 수는 기준 이하여야 한다. 두 단독 규칙보다 전체 상태 일치율이 높을 때 결합의 추가 효과가 있는 것으로 판단한다.</w:t>
+        <w:t>변경 사항 추출에는 Qwen3-4B의 4비트 양자화 모델을 사용하였다. 생성 온도는 0, 최대 출력 길이는 260토큰으로 설정하고 공통 예시 7개를 제공하였다. 요청 32개를 처리하며 각각 두 번씩, 총 64회 호출하였다. 기준 방법, 유지 규칙만 적용, 삭제 규칙만 적용, 두 규칙 결합을 비교한다. 결합 방식의 채택 조건은 추론 전에 설정하였다. 전체 상태 일치율은 기준보다 높고, 최종 상태 일치율은 기준 이상이며, 유지 지시 위반 수는 기준 이하여야 한다. 두 단독 규칙보다 전체 상태 일치율이 높을 때 결합의 추가 효과가 있는 것으로 판단한다.</w:t>
       </w:r>
     </w:p>
     <w:p>
@@ -353,7 +353,7 @@
         <w:jc w:val="both"/>
       </w:pPr>
       <w:r>
-        <w:t>사용자의 수정 요청 한 번과 그에 따른 상태 갱신을 한 턴으로 정의한다. 전체 상태 일치율은 처리한 요청 중 모든 항목의 값이 정답과 일치한 요청의 비율이다. 기본 실험은 여섯 항목, 복합 요청 실험은 아홉 항목을 비교한다. 항목별 일치율은 평가한 전체 항목 중 값이 정답과 일치한 비율이며, 기본 실험의 분모는 32회 요청×6항목인 192개이다. 최종 상태 일치율은 각 대화의 마지막 요청 처리 후 모든 항목이 정답과 일치한 대화의 비율이다. 유지 지시 위반 수는 직전까지 정답과 일치했고 현재 요청에서도 보존해야 하는 항목을 잘못 변경한 횟수이다. 일치율은 일치 건수/전체 평가 건수로 표기한다. 예를 들어 27/32는 요청 32회 중 27회에서 모든 항목이 일치했음을 뜻한다. 같은 대화에 속한 요청들의 의존성을 고려하여 기술통계인 건수와 비율로 결과를 비교한다.</w:t>
+        <w:t>평가 단위는 사용자의 수정 요청 한 번과 그에 따른 상태 갱신이다. 전체 상태 일치율은 처리한 요청 중 모든 항목의 값이 정답과 일치한 요청의 비율이다. 기본 실험은 여섯 항목, 복합 요청 실험은 아홉 항목을 비교한다. 항목별 일치율은 평가한 전체 항목 중 값이 정답과 일치한 비율이며, 기본 실험의 분모는 32회 요청×6항목인 192개이다. 최종 상태 일치율은 각 대화의 마지막 요청 처리 후 모든 항목이 정답과 일치한 대화의 비율이다. 유지 지시 위반 수는 직전까지 정답과 일치했고 현재 요청에서도 보존해야 하는 항목을 잘못 변경한 횟수이다. 일치율은 일치 건수/전체 평가 건수로 표기한다. 예를 들어 27/32는 요청 32회 중 27회에서 모든 항목이 일치했음을 뜻한다. 같은 대화에 속한 요청들의 의존성을 고려하여 기술통계인 건수와 비율로 결과를 비교한다.</w:t>
       </w:r>
     </w:p>
     <w:p>
@@ -361,7 +361,7 @@
         <w:jc w:val="both"/>
       </w:pPr>
       <w:r>
-        <w:t>이미지 실험은 규칙 비교 실험의 32턴, 실제 인물 사진 2명, 두 방법을 조합한 128개 생성 조건이다. 생성 조건은 요청 처리 단계·인물 사진·비교 방법의 조합이다. 원본 파일과 프롬프트가 같으면 한 번 생성한 이미지를 함께 사용해 총 66개 이미지를 생성하였다. 방법 간 비교 64쌍 중 입력이 다른 경우는 두 턴과 두 인물을 조합한 4쌍이며, 나머지 60쌍은 같은 이미지를 사용한다. 내장 이미지 생성 도구의 첫 성공 출력을 사용하였다. 이 도구의 내부 모델 버전과 시드는 비공개이며, 시드 설정은 도구의 기본 동작을 따랐다. 이미지 평가는 Qwen2.5-VL-3B의 4비트 양자화 모델[5]을 사용하였다. 이미지와 목표 상태를 입력하여 여섯 항목을 성공·실패·판단 불가로 판정하였다. 평가 입력은 이미지와 목표 상태로 한정하였다. 얼굴 유사도는 InsightFace buffalo_l[6]의 코사인 유사도로 측정하였다.</w:t>
+        <w:t>이미지 실험은 규칙 비교 실험의 요청 32회, 실제 인물 사진 2명, 두 방법을 조합한 128개 생성 조건이다. 생성 조건은 요청 처리 단계·인물 사진·비교 방법의 조합이다. 원본 파일과 프롬프트가 같으면 한 번 생성한 이미지를 함께 사용해 총 66개 이미지를 생성하였다. 방법 간 비교 64쌍 중 입력이 다른 경우는 요청 두 개와 인물 두 명을 조합한 4쌍이며, 나머지 60쌍은 같은 이미지를 사용한다. 내장 이미지 생성 도구의 첫 성공 출력을 사용하였다. 이 도구의 내부 모델 버전과 시드는 비공개이며, 시드 설정은 도구의 기본 동작을 따랐다. 이미지 평가는 Qwen2.5-VL-3B의 4비트 양자화 모델[5]을 사용하였다. 이미지와 목표 상태를 입력하여 여섯 항목을 성공·실패·판단 불가로 판정하였다. 평가 입력은 이미지와 목표 상태로 한정하였다. 얼굴 유사도는 InsightFace buffalo_l[6]의 코사인 유사도로 측정하였다.</w:t>
       </w:r>
     </w:p>
     <w:p>
@@ -411,7 +411,7 @@
         <w:jc w:val="both"/>
       </w:pPr>
       <w:r>
-        <w:t>후처리 코드에는 별도의 자동 검사를 적용하였다. 세 가지 이전 상태에서 복원·유지 대상의 조합, 두 대상의 복원, 뒤 지시의 우선 적용, 부정·조건·인용 표현을 구성하고 기준 갱신값과 비교하였다. 구성한 963개 경우에서 정답인 변경 사항을 적용한 결과가 기준 상태와 일치하였고 입력 상태도 보존되었다. 이는 정답 응답을 구성한 코드 검사이며, 실제 모델을 호출한 대화 실험과 구분한다.</w:t>
+        <w:t>후처리 코드에는 별도의 자동 검사를 적용하였다. 세 가지 이전 상태에서 복원·유지 대상의 조합, 두 대상의 복원, 뒤 지시의 우선 적용, 부정·조건·인용 표현을 구성하고 기준 갱신값과 비교하였다. 구성한 963개 경우에서 정답인 변경 사항을 적용한 결과가 기준 상태와 일치하였고 입력 상태도 보존되었다. 이 코드 검사에는 직접 구성한 정답 응답을 사용했다. 대화 실험에서는 모델을 실제로 호출하여 받은 응답을 사용했다.</w:t>
       </w:r>
     </w:p>
     <w:p>
@@ -427,7 +427,7 @@
         <w:jc w:val="both"/>
       </w:pPr>
       <w:r>
-        <w:t>포즈·표정 요청과 속성 변경을 함께 처리하는 경우를 검사하기 위해 별도의 합성 대화를 구성하였다. 네 가지 요청 구성마다 표정 단독·표정과 포즈·속성 지시 혼합 조건의 4턴 대화를 작성하여 총 12개 대화 48턴을 사용하였다. 표정 단독 조건은 표정만 변경하고, 표정과 포즈 조건은 몸 방향과 손동작을 추가한다. 속성 지시 혼합 조건은 재킷·배경·식물·목걸이의 변경·유지·삭제·복원도 포함한다. 같은 요청 구성의 표정 목표는 세 조건에서 같게 하였다.</w:t>
+        <w:t>포즈·표정 요청과 속성 변경을 함께 처리하는 경우를 검사하기 위해 별도의 합성 대화를 구성하였다. 네 가지 요청 구성마다 표정 단독·표정과 포즈·속성 지시 혼합 조건의 요청 네 개로 이루어진 대화를 작성하였다. 대화는 총 12개이며 요청은 48개이다. 표정 단독 조건은 표정만 변경하고, 표정과 포즈 조건은 몸 방향과 손동작을 추가한다. 속성 지시 혼합 조건은 재킷·배경·식물·목걸이의 변경·유지·삭제·복원도 포함한다. 같은 요청 구성의 표정 목표는 세 조건에서 같게 하였다.</w:t>
       </w:r>
     </w:p>
     <w:p>
@@ -435,7 +435,7 @@
         <w:jc w:val="both"/>
       </w:pPr>
       <w:r>
-        <w:t>복합 요청 실험은 기존 여섯 항목에 몸 방향·손동작·표정을 더한 아홉 항목을 사용한다. 어휘와 허용 값을 다시 정하고, 마침표로 구분한 유지·삭제·복원 구절을 검사하는 별도 구현을 사용하였다. 앞선 규칙 비교 및 재검증 실험과 달리 상태 항목과 규칙 구현을 확장하였다. 최초 추출만 사용하는 방법, 한 차례 재검토한 방법, 재검토 뒤 구절 규칙으로 보정한 방법을 비교하였다. 최초 추출은 턴당 한 번, 나머지 두 방법은 두 번 호출한다. 규칙 보정은 재검토 응답에 적용한다.</w:t>
+        <w:t>복합 요청 실험은 기존 여섯 항목에 몸 방향·손동작·표정을 더한 아홉 항목을 사용한다. 어휘와 허용 값을 다시 정하고, 마침표로 구분한 유지·삭제·복원 구절을 검사하는 별도 구현을 사용하였다. 앞선 규칙 비교 및 재검증 실험과 달리 상태 항목과 규칙 구현을 확장하였다. 최초 추출만 사용하는 방법, 한 차례 재검토한 방법, 재검토 뒤 구절 규칙으로 보정한 방법을 비교하였다. 최초 추출은 요청당 한 번, 나머지 두 방법은 두 번 호출한다. 규칙 보정은 재검토 응답에 적용한다.</w:t>
       </w:r>
     </w:p>
     <w:p>
@@ -451,7 +451,7 @@
         <w:jc w:val="both"/>
       </w:pPr>
       <w:r>
-        <w:t>생성 단계는 첫 번째 요청 구성의 첫 턴을 세 조건에서 골라 두 원본 사진에 적용한 6장으로 따로 검사하였다. 선택 기준은 텍스트 결과 집계 전에 정하였다. 추출 모델의 출력 대신 정확한 요청을 직접 전달하고 첫 성공 이미지만 사용하였다. 표정 단독·표정과 포즈·속성 지시 혼합 조건의 시각적 목표는 각각 1·3·6개이며, Qwen2.5-VL-7B-4bit로 목표별 성공·실패·판단 불가와 설명을 받았다. 이 검사는 정확한 요청을 입력했을 때의 이미지 생성 결과를 살펴보기 위한 것이다.</w:t>
+        <w:t>생성 단계는 첫 번째 요청 구성의 첫 요청을 세 조건에서 골라 두 원본 사진에 적용한 6장으로 따로 검사하였다. 선택 기준은 텍스트 결과 집계 전에 정하였다. 추출 모델의 출력 대신 정확한 요청을 직접 전달하고 첫 성공 이미지만 사용하였다. 표정 단독·표정과 포즈·속성 지시 혼합 조건의 시각적 목표는 각각 1개, 3개, 6개이며, Qwen2.5-VL-7B-4bit로 목표별 성공·실패·판단 불가와 설명을 받았다. 이 검사는 정확한 요청을 입력했을 때의 이미지 생성 결과를 살펴보기 위한 것이다.</w:t>
       </w:r>
     </w:p>
     <w:p>
@@ -467,7 +467,7 @@
         <w:jc w:val="both"/>
       </w:pPr>
       <w:r>
-        <w:t>새 대화 재검증에 사용한 여덟 대화의 목표를 그대로 두고 요청 32개의 표현을 바꾸었다. 기존 규칙을 수정 없이 적용하여 표현 변화에 따른 오류를 확인하였다. 이 자료를 개발에 사용한 뒤 구절 정규화 코드를 고정하고 새로운 대화 네 개, 요청 16개로 검증하였다. 앞선 실험과 같은 추출 모델·예시·온도·최대 출력 길이를 사용하고, 각각 추출·재검토 응답 64개와 32개를 저장하였다. 모든 방법은 같은 원응답을 공유하며 자기 이전 상태를 누적한다.</w:t>
+        <w:t>새 대화 재검증에 사용한 여덟 대화의 목표를 그대로 두고 요청 32개의 표현을 바꾸었다. 기존 규칙을 수정 없이 적용하여 표현 변화에 따른 오류를 확인하였다. 이 자료를 개발에 사용한 뒤 구절 정규화 코드를 고정하고 새로운 대화 네 개, 요청 16개로 검증하였다. 앞선 실험과 같은 추출 모델·예시·온도·최대 출력 길이를 사용하고, 각각 추출·재검토 응답 64개와 32개를 저장하였다. 모든 방법에 같은 모델 응답 원문을 사용하고, 각 방법이 직전까지 저장한 상태를 이어서 갱신한다.</w:t>
       </w:r>
     </w:p>
     <w:p>
@@ -1205,7 +1205,7 @@
         <w:jc w:val="both"/>
       </w:pPr>
       <w:r>
-        <w:t>두 규칙을 결합했을 때 모든 항목이 정답과 일치한 요청은 기준보다 2회 많아 사전 채택 조건을 충족하였다. 일치한 요청 수는 유지 규칙만 적용한 경우보다 2회, 삭제 규칙만 적용한 경우보다 1회 많았다. 방법 간 차이는 세 번째 대화의 3턴과 4턴에서 발생하였다. 일곱 번째 대화에서는 모든 방법이 4회 요청 중 1회에서 전체 항목을 맞혔으며, 나머지 여섯 대화에서는 네 방법 모두 4회 요청 전체에서 모든 항목을 맞혔다.</w:t>
+        <w:t>두 규칙을 결합했을 때 모든 항목이 정답과 일치한 요청은 기준보다 2회 많아 사전 채택 조건을 충족하였다. 일치한 요청 수는 유지 규칙만 적용한 경우보다 2회, 삭제 규칙만 적용한 경우보다 1회 많았다. 방법 간 차이는 세 번째 대화의 세 번째 요청과 네 번째 요청에서 발생하였다. 일곱 번째 대화에서는 모든 방법이 4회 요청 중 1회에서 전체 항목을 맞혔으며, 나머지 여섯 대화에서는 네 방법 모두 4회 요청 전체에서 모든 항목을 맞혔다.</w:t>
       </w:r>
     </w:p>
     <w:p>
@@ -1221,7 +1221,7 @@
         <w:jc w:val="both"/>
       </w:pPr>
       <w:r>
-        <w:t>규칙 비교 실험의 세 번째 대화에서는 3턴에 식물을 삭제하고 재킷은 유지하도록 요청하였다. 기준 방법과 유지 규칙만 적용한 방법의 상태 기록에는 식물이 남았고, 삭제 규칙은 소품 값을 ‘없음’으로 바꾸었다. 이어진 4턴에서는 상의와 목걸이를 원본으로 돌리되 재킷과 연한 파란색 배경은 그대로 두도록 요청하였다. 기준 방법과 삭제 규칙만 적용한 방법은 배경도 원본으로 바꾸었다. 유지 규칙만 적용한 상태 기록에는 연한 파란색 배경과 이전 턴의 식물이 함께 남았다.</w:t>
+        <w:t>규칙 비교 실험의 세 번째 대화에서는 세 번째 요청에 식물을 삭제하고 재킷은 유지하도록 요청하였다. 기준 방법과 유지 규칙만 적용한 방법의 상태 기록에는 식물이 남았고, 삭제 규칙은 소품 값을 ‘없음’으로 바꾸었다. 이어진 네 번째 요청에서는 상의와 목걸이를 원본으로 돌리되 재킷과 연한 파란색 배경은 그대로 두도록 요청하였다. 기준 방법과 삭제 규칙만 적용한 방법은 배경도 원본으로 바꾸었다. 유지 규칙만 적용한 상태 기록에는 연한 파란색 배경과 앞선 요청의 식물이 함께 남았다.</w:t>
       </w:r>
     </w:p>
     <w:p>
@@ -1229,7 +1229,7 @@
         <w:jc w:val="both"/>
       </w:pPr>
       <w:r>
-        <w:t>삭제 규칙은 식물 삭제 누락을, 유지 규칙은 배경 변경 오류를 각각 방지하였다. 두 규칙을 결합한 경우에만 두 턴의 여섯 항목이 모두 정답과 일치하였다.</w:t>
+        <w:t>삭제 규칙은 식물 삭제 누락을, 유지 규칙은 배경 변경 오류를 각각 방지하였다. 두 규칙을 결합한 경우에만 두 요청의 여섯 항목이 모두 정답과 일치하였다.</w:t>
       </w:r>
     </w:p>
     <w:p>
@@ -1245,7 +1245,7 @@
         <w:jc w:val="both"/>
       </w:pPr>
       <w:r>
-        <w:t>항목별 적용은 각 항목의 변경을 개별적으로 검증하여 한 항목의 오류가 다른 유효한 변경까지 취소하는 것을 방지한다. 규칙 비교 실험의 사후 분석에서 이를 유지·삭제 규칙과 결합한 결과, 전체 상태 일치율은 32/32였다. 추가 효과를 재검증하기 위해 새로운 대화 8개 32턴을 구성하였다. 대화와 정답은 추론 전에 확정하였으며, 앞선 사후 분석에 사용한 코드를 수정 없이 적용하였다. 모든 비교 방법에 동일한 추출·재검토 응답 64개를 사용한 결과를 표 2에 제시하였다.</w:t>
+        <w:t>항목별 적용은 각 항목의 변경을 개별적으로 검증하여 한 항목의 오류가 다른 유효한 변경까지 취소하는 것을 방지한다. 규칙 비교 실험의 사후 분석에서 이를 유지·삭제 규칙과 결합한 결과, 전체 상태 일치율은 32/32였다. 추가 효과를 재검증하기 위해 새로운 대화 8개, 요청 32회를 구성하였다. 대화와 정답은 추론 전에 확정하였으며, 앞선 사후 분석에 사용한 코드를 수정 없이 적용하였다. 모든 비교 방법에 동일한 추출·재검토 응답 64개를 사용한 결과를 표 2에 제시하였다.</w:t>
       </w:r>
     </w:p>
     <w:p>
@@ -1943,7 +1943,7 @@
         <w:jc w:val="both"/>
       </w:pPr>
       <w:r>
-        <w:t>새 대화에서도 유지·삭제 규칙은 모든 항목이 정답과 일치한 요청 수와 최종 상태가 일치한 대화 수를 각각 한 건 늘렸으며, 차이는 일곱 번째 대화의 마지막 턴에서 발생하였다. 항목별 적용을 추가한 결과는 유지·삭제 규칙만 사용한 결과와 같았다. 이에 따라 추가 처리 없이 유지·삭제 규칙을 사용하는 방법을 선택하였다. 규칙 비교 실험의 사후 분석과 새 대화에서의 재검증은 서로 다른 개발 단계에서 수행하였으므로 결과와 표본 수를 따로 집계하였다.</w:t>
+        <w:t>새 대화에서도 유지·삭제 규칙은 모든 항목이 정답과 일치한 요청 수와 최종 상태가 일치한 대화 수를 각각 한 건 늘렸으며, 차이는 일곱 번째 대화의 마지막 요청에서 발생하였다. 항목별 적용을 추가한 결과는 유지·삭제 규칙만 사용한 결과와 같았다. 이에 따라 추가 처리 없이 유지·삭제 규칙을 사용하는 방법을 선택하였다. 규칙 비교 실험의 사후 분석과 새 대화에서의 재검증은 서로 다른 개발 단계에서 수행하였으므로 결과와 표본 수를 따로 집계하였다.</w:t>
       </w:r>
     </w:p>
     <w:p>
@@ -2079,7 +2079,7 @@
         <w:jc w:val="both"/>
       </w:pPr>
       <w:r>
-        <w:t>그림 1과 2는 두 방법의 입력이 달랐던 네 쌍의 생성 이미지를 전체 영역으로 보여준다. 3턴에서 삭제 대상 식물이 기준 출력에는 남고 결합 출력에서는 사라진다. 4턴에서는 기준 출력에 식물과 원본 배경이 남아 있는 반면, 결합 출력에서는 식물이 사라지고 연한 파란 배경이 나타난다.</w:t>
+        <w:t>그림 1과 2는 두 방법의 입력이 달랐던 네 쌍의 생성 이미지를 전체 영역으로 보여준다. 세 번째 요청에서 삭제 대상 식물이 기준 출력에는 남고 결합 출력에서는 사라진다. 네 번째 요청에서는 기준 출력에 식물과 원본 배경이 남아 있는 반면, 결합 출력에서는 식물이 사라지고 연한 파란 배경이 나타난다.</w:t>
       </w:r>
     </w:p>
     <w:p>
@@ -2535,7 +2535,7 @@
         <w:jc w:val="both"/>
       </w:pPr>
       <w:r>
-        <w:t>증가한 8개 성공 항목 중 6개는 판단 불가에서 성공으로 바뀌었고 실패에서 성공으로 바뀐 항목은 2개였다. 세 번째 대화의 R02 3턴 기준 평가가 JSON 대신 느낌표를 출력하여 6항목 모두 판단 불가가 된 영향이 크다. 또 같은 턴의 결합 출력에서는 소품이 없다는 설명과 ‘소품 없음’에 대한 실패 점수가 모순되었다. 즉, 성공 항목 수의 증가에는 평가 응답의 형식과 판정 오류도 영향을 주었다.</w:t>
+        <w:t>증가한 8개 성공 항목 중 6개는 판단 불가에서 성공으로 바뀌었고 실패에서 성공으로 바뀐 항목은 2개였다. 세 번째 대화의 R02 요청 3 기준 평가가 JSON 대신 느낌표를 출력하여 6항목 모두 판단 불가가 된 영향이 크다. 또 같은 요청의 결합 출력에서는 소품이 없다는 설명과 ‘소품 없음’에 대한 실패 점수가 모순되었다. 즉, 성공 항목 수의 증가에는 평가 응답의 형식과 판정 오류도 영향을 주었다.</w:t>
       </w:r>
     </w:p>
     <w:p>
@@ -2551,7 +2551,7 @@
         <w:jc w:val="both"/>
       </w:pPr>
       <w:r>
-        <w:t>평가 모델에 따른 판정 차이를 분석하기 위해 Qwen2.5-VL-7B의 4비트 양자화 모델로 전체 68개 이미지·목표 쌍을 다시 평가하였다. 재평가 전에 대상과 설정을 확정하였으며 목표 문구, 파서, 온도, 최대 토큰은 1차 평가와 같았다. 이는 같은 계열의 두 평가 모델 사이에서 판정이 얼마나 일치하는지 살펴본 사후 분석이다. 7B 평가에서 항목별 충족률은 기준 372/384, 결합 374/384였고 JSON 파싱 실패와 판단 불가는 각각 0개였다.</w:t>
+        <w:t>평가 모델에 따른 판정 차이를 분석하기 위해 Qwen2.5-VL-7B의 4비트 양자화 모델로 전체 68개 이미지·목표 쌍을 다시 평가하였다. 재평가 전에 대상과 설정을 확정하였으며 목표 문구, 파서, 온도, 최대 토큰은 1차 평가와 같았다. 첫 평가의 오류를 확인한 뒤 같은 계열의 두 모델이 내린 판정을 비교하였다. 7B 평가에서 항목별 충족률은 기준 372/384, 결합 374/384였고 JSON 파싱 실패와 판단 불가는 각각 0개였다.</w:t>
       </w:r>
     </w:p>
     <w:p>
@@ -2966,7 +2966,7 @@
                 <w:b/>
                 <w:sz w:val="16"/>
               </w:rPr>
-              <w:t>인물·턴</w:t>
+              <w:t>인물·요청</w:t>
             </w:r>
           </w:p>
         </w:tc>
@@ -3103,7 +3103,7 @@
                 <w:b w:val="0"/>
                 <w:sz w:val="16"/>
               </w:rPr>
-              <w:t>R01 3턴</w:t>
+              <w:t>R01 요청 3</w:t>
             </w:r>
           </w:p>
         </w:tc>
@@ -3228,7 +3228,7 @@
                 <w:b w:val="0"/>
                 <w:sz w:val="16"/>
               </w:rPr>
-              <w:t>R01 4턴</w:t>
+              <w:t>R01 요청 4</w:t>
             </w:r>
           </w:p>
         </w:tc>
@@ -3353,7 +3353,7 @@
                 <w:b w:val="0"/>
                 <w:sz w:val="16"/>
               </w:rPr>
-              <w:t>R02 3턴</w:t>
+              <w:t>R02 요청 3</w:t>
             </w:r>
           </w:p>
         </w:tc>
@@ -3481,7 +3481,7 @@
                 <w:b w:val="0"/>
                 <w:sz w:val="16"/>
               </w:rPr>
-              <w:t>R02 4턴</w:t>
+              <w:t>R02 요청 4</w:t>
             </w:r>
           </w:p>
         </w:tc>
@@ -3600,7 +3600,7 @@
         <w:jc w:val="both"/>
       </w:pPr>
       <w:r>
-        <w:t>7B에서 실패에서 성공으로 바뀐 두 항목은 R01 4턴의 소품과 R02 4턴의 배경이다. 3B의 두 항목은 R02 4턴의 소품과 배경으로, 두 평가에서 모두 실패에서 성공으로 바뀐 항목은 R02의 배경 한 항목이다. 두 평가 모델의 판정 일치율은 판단 불가를 포함한 전체 408개 항목에서 367/408, 두 모델 모두 성공·실패를 판정한 387개 항목에서 367/387이었다.</w:t>
+        <w:t>7B에서 실패에서 성공으로 바뀐 두 항목은 R01 요청 4의 소품과 R02 요청 4의 배경이다. 3B의 두 항목은 R02 요청 4의 소품과 배경으로, 두 평가에서 모두 실패에서 성공으로 바뀐 항목은 R02의 배경 한 항목이다. 두 평가 모델의 판정 일치율은 판단 불가를 포함한 전체 408개 항목에서 367/408, 두 모델 모두 성공·실패를 판정한 387개 항목에서 367/387이었다.</w:t>
       </w:r>
     </w:p>
     <w:p>
@@ -3608,7 +3608,7 @@
         <w:jc w:val="both"/>
       </w:pPr>
       <w:r>
-        <w:t>7B 모델에서도 설명과 점수가 일치하지 않는 경우가 있었다. 두 인물의 3턴 기준 출력에 식물이 보인다고 설명한 뒤 식물이 없다고도 설명하면서 모두 성공으로 채점하였다. R02 4턴에서도 같은 소품 설명 모순이 나타났다. 표에는 평가 모델이 반환한 점수를 그대로 집계하였다. 응답 형식 오류가 해소된 뒤에도 내용상의 모순은 남았다.</w:t>
+        <w:t>7B 모델에서도 설명과 점수가 일치하지 않는 경우가 있었다. 두 인물의 세 번째 요청 기준 출력에 식물이 보인다고 설명한 뒤 식물이 없다고도 설명하면서 모두 성공으로 채점하였다. R02 요청 4에서도 같은 소품 설명 모순이 나타났다. 표에는 평가 모델이 반환한 점수를 그대로 집계하였다. 응답 형식 오류가 해소된 뒤에도 내용상의 모순은 남았다.</w:t>
       </w:r>
     </w:p>
     <w:p>
@@ -3616,7 +3616,7 @@
         <w:jc w:val="both"/>
       </w:pPr>
       <w:r>
-        <w:t>초기 개발 대화의 이미지 실험에서는 128개 생성 조건에 대해 68개 이미지를 생성하였다. 항목별 충족률은 기준 354/384, 유지 규칙 355/384였고 얼굴 유사도 평균은 각각 0.914851과 0.914108이었다. 입력이 다른 네 쌍 중 인물 R01의 두 번째 개발 대화 2턴에서 소품 판정 하나만 판단 불가에서 성공으로 바뀌었다. 실패에서 성공으로 바뀐 항목은 0개였으며 JSON 파싱 실패 4개와 설명·점수 불일치가 있었다.</w:t>
+        <w:t>초기 개발 대화의 이미지 실험에서는 128개 생성 조건에 대해 68개 이미지를 생성하였다. 항목별 충족률은 기준 354/384, 유지 규칙 355/384였고 얼굴 유사도 평균은 각각 0.914851과 0.914108이었다. 입력이 다른 네 쌍 중 인물 R01의 두 번째 개발 대화 두 번째 요청에서 소품 판정 하나만 판단 불가에서 성공으로 바뀌었다. 실패에서 성공으로 바뀐 항목은 0개였으며 JSON 파싱 실패 4개와 설명·점수 불일치가 있었다.</w:t>
       </w:r>
     </w:p>
     <w:p>
@@ -4094,7 +4094,7 @@
         <w:jc w:val="both"/>
       </w:pPr>
       <w:r>
-        <w:t>혼합 조건의 오류는 네 가지 요청 구성에서 같은 형태로 나타났다. 2턴의 식물 삭제와 3턴의 목걸이 삭제를 모델이 ‘원본’으로 추출하였고 재검토에서도 같은 값을 반환하였다. 식물 오류는 2~4턴, 목걸이 오류는 3~4턴에 남아 총 20개의 항목 오류로 집계되었다. 이 20개는 두 삭제 지시의 오류가 각 요청 구성의 후속 상태에 누적된 건수이다. 사후에 삭제 규칙만 적용하여 재계산한 결과도 48턴 모두 정확하여, 유지·복원 규칙을 함께 적용한 결과와 같았다.</w:t>
+        <w:t>혼합 조건의 오류는 네 가지 요청 구성에서 같은 형태로 나타났다. 두 번째 요청의 식물 삭제와 세 번째 요청의 목걸이 삭제를 모델이 ‘원본’으로 추출하였고 재검토에서도 같은 값을 반환하였다. 식물 오류는 두 번째부터 네 번째 요청까지, 목걸이 오류는 세 번째와 네 번째 요청에 남아 총 20개의 항목 오류로 집계되었다. 이 20개는 두 삭제 지시의 오류가 각 요청 구성의 후속 상태에 누적된 건수이다. 사후에 삭제 규칙만 적용하여 재계산한 결과도 요청 48회 모두 정확하여, 유지·복원 규칙을 함께 적용한 결과와 같았다.</w:t>
       </w:r>
     </w:p>
     <w:p>
@@ -4150,7 +4150,7 @@
         <w:jc w:val="both"/>
       </w:pPr>
       <w:r>
-        <w:t>같은 편집 목표를 다른 표현으로 요청한 32개 검사에서 기준과 기존 유지·삭제 방법은 모두 25/32의 전체 상태 일치율과 5/8의 최종 상태 일치율을 보였다. 유지 지시의 동의 표현을 인식하지 못한 사례와, 원본 복원 뒤의 leaving 구절까지 복원 대상으로 포함한 사례가 나타났다. bring back 구절에서는 모델이 원본 값을 반환해도 검증 과정에서 복원 요청으로 인정하지 못하였다. 오류는 모델의 추출뿐 아니라 후처리의 지시 범위 판정에서도 발생하였다.</w:t>
+        <w:t>같은 편집 목표를 다른 표현으로 요청한 32개 사례에서 기준과 기존 유지·삭제 방법은 모두 25/32의 전체 상태 일치율과 5/8의 최종 상태 일치율을 보였다. 유지 지시의 동의 표현을 인식하지 못한 사례와, 원본 복원 뒤의 leaving 구절까지 복원 대상으로 포함한 사례가 나타났다. bring back 구절에서는 모델이 원본 값을 반환해도 검증 과정에서 복원 요청으로 인정하지 못하였다. 오류는 모델의 추출뿐 아니라 후처리의 지시 범위 판정에서도 발생하였다.</w:t>
       </w:r>
     </w:p>
     <w:p>
@@ -4166,7 +4166,7 @@
         <w:jc w:val="both"/>
       </w:pPr>
       <w:r>
-        <w:t>기존 후처리의 복잡성이 비교 결과에 미친 영향을 살펴보기 위해, 같은 응답에 단순 JSON 적용 방법을 추가로 비교하였다. 항목과 값의 형식만 검사하고 요청의 어휘를 확인하는 규칙이나 유지·복원 규칙을 사용하지 않았다. 최초 응답만 적용하면 10/16, 유효한 재검토 응답을 우선 적용하면 9/16이었다. 이 비교는 저장된 전체 응답을 이용한 사후 분석이며, 최초 응답 방식은 요청당 한 번, 재검토 방식과 제안 방법은 두 번 호출한다.</w:t>
+        <w:t>복잡한 후처리를 생략해도 같은 결과를 얻을 수 있는지 확인하기 위해 단순 JSON 적용 방법과 비교하였다. 항목과 값의 형식만 검사하고 요청의 어휘를 확인하는 규칙이나 유지·복원 규칙을 사용하지 않았다. 최초 응답만 적용하면 10/16, 유효한 재검토 응답을 우선 적용하면 9/16이었다. 이 비교에는 기존 실험에서 저장한 전체 응답을 사용하였다. 최초 응답 방식은 첫 응답만 사용하고, 재검토 방식과 제안 방법은 추출·재검토 응답을 모두 사용한다.</w:t>
       </w:r>
     </w:p>
     <w:p>
@@ -4336,7 +4336,7 @@
                 <w:b/>
                 <w:sz w:val="16"/>
               </w:rPr>
-              <w:t>새 오류 수</w:t>
+              <w:t>추가 오류 수</w:t>
             </w:r>
           </w:p>
         </w:tc>
@@ -4989,7 +4989,7 @@
         <w:jc w:val="both"/>
       </w:pPr>
       <w:r>
-        <w:t>표 7의 새 오류 수는 기준 방법이 맞았으나 해당 방법 적용 후 틀린 요청 수다. 구절 정규화는 기준보다 요청 일곱 개, 기존 유지·삭제보다 여섯 개를 더 맞혔다. 차이는 첫째·둘째·넷째 대화에서 나타났고 셋째 대화는 모든 방법이 네 요청을 모두 맞혔다. 정규화만 사용한 결과와 항목별 적용을 결합한 결과는 같았다. 따라서 이 새 대화에서의 추가 개선은 구절 정규화로 설명된다.</w:t>
+        <w:t>표 7의 추가 오류 수는 기준 방법이 맞았으나 해당 방법 적용 후 틀린 요청 수다. 구절 정규화는 기준보다 요청 일곱 개, 기존 유지·삭제보다 여섯 개를 더 맞혔다. 차이는 첫째·둘째·넷째 대화에서 나타났고 셋째 대화는 모든 방법이 네 요청을 모두 맞혔다. 정규화만 사용한 결과와 항목별 적용을 결합한 결과는 같았다. 이 새 대화에서는 구절 정규화만으로 결합 방법과 같은 결과를 얻었다.</w:t>
       </w:r>
     </w:p>
     <w:p>
@@ -4997,7 +4997,7 @@
         <w:jc w:val="both"/>
       </w:pPr>
       <w:r>
-        <w:t>예를 들어 둘째 대화의 두 번째 요청은 셔츠와 목걸이를 원본으로 돌리되 초록 재킷과 사무실 배경은 유지하도록 지시하였다. 모델의 응답은 셔츠와 목걸이만 원본으로 지정하였다. 기존 복원 검사는 뒤의 leaving 구절까지 포함해 재킷과 배경도 원본으로 바꾸었으나, 정규화한 방법은 복원과 유지 대상을 구분하였다. 일부 후속 요청의 차이는 앞선 오류가 다음 상태에 남은 결과이다. 따라서 요청 일곱 개의 개선과 별도로, 개선이 나타난 대화 수를 함께 제시하였다.</w:t>
+        <w:t>예를 들어 둘째 대화의 두 번째 요청은 셔츠와 목걸이를 원본으로 돌리되 초록 재킷과 사무실 배경은 유지하도록 지시하였다. 모델의 응답은 셔츠와 목걸이만 원본으로 지정하였다. 기존 복원 검사는 뒤의 leaving 구절까지 포함해 재킷과 배경도 원본으로 바꾸었으나, 정규화한 방법은 복원과 유지 대상을 구분하였다. 일부 후속 요청의 차이는 앞선 오류가 다음 상태에 남은 결과이다. 이 때문에 개선된 요청 수와 개선이 나타난 대화 수를 함께 집계하였다.</w:t>
       </w:r>
     </w:p>
     <w:p>
@@ -5576,7 +5576,7 @@
         <w:jc w:val="both"/>
       </w:pPr>
       <w:r>
-        <w:t>기존 유지·삭제 규칙은 unchanged를 포함한 leaving 구절을 처리하였으나 preserving 연결에서는 세 구성 모두 틀렸다. bring back 구조에서도 세 구성 중 한 구성만 맞혔다. 정규화는 네 구조 모두에서 세 구성을 맞혔다. 세 번째 단계의 결과는 표 8과 같아, 앞서 생긴 상태 오류가 별도 변경 후에도 남는 양상을 보였다.</w:t>
+        <w:t>기존 유지·삭제 규칙은 unchanged를 포함한 leaving 구절을 처리하였으나 preserving 연결에서는 세 구성 모두 틀렸다. bring back 구조에서도 세 구성 중 한 구성만 맞혔다. 정규화는 네 구조 모두에서 세 구성을 맞혔다. 다음 변경 요청을 처리한 뒤에도 결과는 표 8과 같았다. 앞서 생긴 상태 오류가 다음 요청까지 남았기 때문이다.</w:t>
       </w:r>
     </w:p>
     <w:p>
@@ -5584,7 +5584,7 @@
         <w:jc w:val="both"/>
       </w:pPr>
       <w:r>
-        <w:t>단순 JSON 적용을 추가로 재계산하면 최초 응답과 재검토 우선 방식이 모두 28/36이었다. 정규화는 두 단순 방식보다 여덟 요청을 더 맞혔다. 요청 문장은 서로 다른 18개이며, 같은 초기 설정과 후속 요청을 반복 호출한 응답 쌍은 모두 같았다. 따라서 이 대조는 서로 다른 요청 36개의 관측이 아니라, 세 목표 구성에서 문장 구조를 바꾼 대응 결과이다.</w:t>
+        <w:t>단순 JSON 적용을 추가로 재계산하면 최초 응답과 재검토 우선 방식이 모두 28/36이었다. 정규화는 두 단순 방식보다 여덟 요청을 더 맞혔다. 요청 문장은 서로 다른 18개이며, 같은 초기 설정과 후속 요청을 반복 호출한 응답 쌍은 모두 같았다. 이 실험은 세 가지 편집 목표를 네 가지 문장 구조로 요청한 비교이며, 같은 설정 요청과 후속 요청이 반복된다.</w:t>
       </w:r>
     </w:p>
     <w:p>
@@ -5600,7 +5600,7 @@
         <w:jc w:val="both"/>
       </w:pPr>
       <w:r>
-        <w:t>유지와 삭제는 서로 다른 상태 갱신 동작을 요구한다. 유지 규칙은 직전 값을 보존하므로 이전 턴의 삭제 누락도 다음 상태로 이어질 수 있다. 삭제 규칙의 보정 대상은 현재 요청에서 삭제가 명시된 항목이며, 나머지 항목은 모델의 갱신 결과를 따른다. 세 번째 대화에서는 두 규칙의 결합으로 식물 삭제와 배경 유지가 모두 정답과 일치하였다. 후속 개발 대화에서는 keep만으로 유지 여부를 판단하여 삭제·변경 요청을 오인하였다. 이에 따라 제안 규칙은 항목 이름과 명시적 유지·삭제 표현이 함께 있는 구절에 적용한다.</w:t>
+        <w:t>유지와 삭제는 서로 다른 상태 갱신 동작을 요구한다. 유지 규칙은 직전 값을 보존하므로 앞선 요청의 삭제 누락도 다음 상태로 이어질 수 있다. 삭제 규칙의 보정 대상은 현재 요청에서 삭제가 명시된 항목이며, 나머지 항목은 모델의 갱신 결과를 따른다. 세 번째 대화에서는 두 규칙의 결합으로 식물 삭제와 배경 유지가 모두 정답과 일치하였다. 후속 개발 대화에서는 keep만으로 유지 여부를 판단하여 삭제·변경 요청을 오인하였다. 이에 따라 제안 규칙은 항목 이름과 명시적 유지·삭제 표현이 함께 있는 구절에 적용한다.</w:t>
       </w:r>
     </w:p>
     <w:p>
@@ -5608,7 +5608,7 @@
         <w:jc w:val="both"/>
       </w:pPr>
       <w:r>
-        <w:t>규칙 비교와 재검증에는 각각 정해진 영어 문형의 합성 대화 8개를 사용하였으며, 개선은 각 실험의 세 번째와 일곱 번째 대화에 집중되었다. 변경 사항 추출에는 한 종류의 4B 모델을 사용하였고, 매 턴 현재 요청만 입력하였다.</w:t>
+        <w:t>규칙 비교와 재검증에는 각각 정해진 영어 문형의 합성 대화 8개를 사용하였으며, 개선은 각 실험의 세 번째와 일곱 번째 대화에 집중되었다. 변경 사항 추출에는 한 종류의 4B 모델을 사용하였고, 요청마다 현재 문장만 입력하였다.</w:t>
       </w:r>
     </w:p>
     <w:p>
@@ -5624,7 +5624,7 @@
         <w:jc w:val="both"/>
       </w:pPr>
       <w:r>
-        <w:t>이미지 실험은 인물 2명과 생성 도구 하나를 사용하였고, 비교 64쌍 중 60쌍이 같은 출력을 공유하였다. 두 AI 평가 모두 설명과 점수의 불일치가 나타났다. 따라서 이미지 결과의 분석 범위는 개별 편집 사례와 평가 모델의 판정 차이로 한정하였다. 얼굴 특징 벡터의 코사인 유사도는 입력이 다른 네 쌍 중 두 쌍에서 상승하고 두 쌍에서 하락하였다.</w:t>
+        <w:t>이미지 실험은 인물 2명과 생성 도구 하나를 사용하였고, 비교 64쌍 중 60쌍이 같은 출력을 공유하였다. 두 AI 평가 모두 설명과 점수의 불일치가 나타났다. 이미지 분석에서는 개별 편집 결과와 두 평가 모델의 판정 차이를 비교하였다. 얼굴 특징 벡터의 코사인 유사도는 입력이 다른 네 쌍 중 두 쌍에서 상승하고 두 쌍에서 하락하였다.</w:t>
       </w:r>
     </w:p>
     <w:p>
@@ -5632,7 +5632,7 @@
         <w:jc w:val="both"/>
       </w:pPr>
       <w:r>
-        <w:t>표현 변화 검사에서는 기존 후처리 자체가 정답인 모델 응답을 훼손하는 문제가 드러났다. 지시 구절 정규화는 이 오류를 줄였으며 새 대화 네 개에서 세 대화의 결과를 개선하였다. 개발 자료에서는 항목별 적용도 결합 효과에 기여했으나 새 대화에서는 정규화만으로 같은 결과를 얻었다. 검증 자료는 지정된 영어 어휘와 구절로 작성하였으며 정규화 규칙의 적용 범위도 이 문법에 해당한다. 새 대화 검증은 상태 기록의 정확도를 측정하였다.</w:t>
+        <w:t>표현 변화 검사에서는 기존 후처리 자체가 정답인 모델 응답을 훼손하는 문제가 드러났다. 지시 구절 정규화는 이 오류를 줄였으며 새 대화 네 개에서 세 대화의 결과를 개선하였다. 개발 자료에서는 항목별 적용도 결합 효과에 기여했으나 새 대화에서는 정규화만으로 같은 결과를 얻었다. 검증에는 규칙이 처리하도록 정한 영어 어휘와 구절을 사용하였다. 새 대화 검증은 상태 기록의 정확도를 측정하였다.</w:t>
       </w:r>
     </w:p>
     <w:p>
@@ -5656,7 +5656,7 @@
         <w:jc w:val="both"/>
       </w:pPr>
       <w:r>
-        <w:t>본 연구에서는 언어 모델의 추출·재검토 결과에 명시적 유지·삭제 제약을 적용하는 상태 갱신 방법을 제안하였다. 정해진 영어 문형의 합성 대화를 이용한 규칙 비교 실험에서 유지 규칙은 배경 값의 변경을, 삭제 규칙은 소품 값의 삭제 누락을 각각 바로잡았다. 두 규칙의 결합으로 전체 상태 일치율은 27/32에서 29/32로 증가하였다. 새 대화에서의 재검증에서도 전체 상태 일치율은 28/32에서 29/32로 증가하였으며, 항목별 적용을 결합한 경우와 동일한 결과를 보였다. 제안 방법은 추가 모델 호출 없이 유지 지시 위반과 삭제 누락을 감소시켰다.</w:t>
+        <w:t>반복 인물 이미지 편집에서 사용자의 유지·삭제 지시를 확인하고, 복원 지시와 유지 지시를 구분하는 방법을 구현하였다. 언어 모델이 추출한 변경 사항을 재검토한 뒤 규칙을 적용한다. 요청이 가리키는 항목을 구분하여 삭제 누락과 불필요한 변경을 바로잡고, 저장한 조건으로 다음 이미지 생성 프롬프트를 작성한다.</w:t>
       </w:r>
     </w:p>
     <w:p>
@@ -5664,23 +5664,7 @@
         <w:jc w:val="both"/>
       </w:pPr>
       <w:r>
-        <w:t>포즈·표정을 포함한 복합 요청 실험의 혼합 조건에서는 전체 상태 일치율이 재검토 4/16에서 규칙 보정 16/16으로 증가하였다. 모델은 포즈와 표정을 정확히 추출했으나 삭제를 원본 복원으로 해석하였고, 삭제 규칙이 이를 바로잡았다. 유지·삭제 지시를 확인하는 후처리 규칙은 동일 모델의 재검토 뒤에도 남은 상태 갱신 오류를 줄였다.</w:t>
-      </w:r>
-    </w:p>
-    <w:p>
-      <w:pPr>
-        <w:jc w:val="both"/>
-      </w:pPr>
-      <w:r>
-        <w:t>표현을 바꾼 요청에서 발견한 구절 경계 오류를 분석하여 지시 정규화를 추가하였다. 코드를 고정한 뒤 수행한 새 대화 검증에서 전체 상태 일치율은 기준 9/16, 기존 유지·삭제 10/16, 정규화 16/16이었다. 원본 복원과 유지 지시를 각각의 구절에 적용하는 처리가 잘못된 상태 갱신을 줄였다. 제안 방법은 편집 요구를 프롬프트로 종합하는 과정에서 지시별 적용 대상을 구분하며 추가 모델 호출 없이 동작한다.</w:t>
-      </w:r>
-    </w:p>
-    <w:p>
-      <w:pPr>
-        <w:jc w:val="both"/>
-      </w:pPr>
-      <w:r>
-        <w:t>같은 목표를 네 문장 구조로 요청한 대조에서도 기존 유지·삭제 26/36, 단순 JSON 적용 28/36, 정규화 36/36이었다. 지정된 편집 어휘 안에서 복원과 유지 구절을 분리하는 처리가 상태 갱신의 정확도를 높였다.</w:t>
+        <w:t>코드를 고정한 뒤 수행한 새 대화 검증에서 전체 상태 일치율은 기준 9/16, 기존 유지·삭제 10/16, 구절 정규화 16/16이었다. 같은 목표를 네 문장 구조로 요청한 비교에서도 기존 유지·삭제 26/36, 단순 JSON 적용 28/36, 정규화 36/36이었다. 지정된 영어 어휘와 문장 구조에서 지시별 적용 대상을 구분하는 처리가 상태 기록의 정확도를 높였으며, 추가 모델 호출은 사용하지 않았다.</w:t>
       </w:r>
     </w:p>
     <w:p>

</xml_diff>

<commit_message>
Validate instruction transfer with 48 frozen requests and update thesis
</commit_message>
<xml_diff>
--- a/paper/manuscript.inha.docx
+++ b/paper/manuscript.inha.docx
@@ -65,7 +65,7 @@
         <w:t xml:space="preserve">요약: </w:t>
       </w:r>
       <w:r>
-        <w:t>반복 이미지 편집에서는 변경할 내용과 유지하거나 삭제할 내용을 다음 프롬프트에 정확히 반영해야 한다. 본 연구는 언어 모델이 변경 사항을 추출하고 재검토한 뒤 명시적인 유지·삭제 지시를 확인하는 후처리 규칙을 제안한다. 유지 규칙은 이전 값을 보존하고 삭제 규칙은 값을 없음으로 설정한다. 유지·삭제 규칙 비교 실험의 대화 8개, 요청 32회에서 전체 상태 일치율은 기준 27/32, 유지 규칙만 27/32, 삭제 규칙만 28/32, 두 규칙 결합 29/32였다. 새로운 대화 8개, 요청 32회의 재검증에서도 28/32에서 29/32로 증가하였다. 포즈·표정을 포함한 복합 요청 실험에서는 속성 지시 혼합 조건의 전체 상태 일치율이 재검토 4/16에서 규칙 보정 16/16으로 증가하였다. 표현 변화 검사에서 원본 복원과 유지 구절의 경계 오류를 확인하여 지시 정규화를 추가하였다. 코드를 고정한 뒤 새 대화 4개, 요청 16회를 검사한 결과, 기준은 9/16, 기존 유지·삭제는 10/16, 정규화는 16/16이었다. 같은 목표의 문장 구조 대조에서도 기존 유지·삭제 26/36, 단순 JSON 적용 28/36, 정규화 36/36이었다. 실제 인물 사진의 AI 평가에서는 설명과 점수의 불일치가 나타났다. 제안 방법은 지정된 영어 구절의 합성 대화에서 추가 모델 호출 없이 상태 갱신 오류를 줄였다.</w:t>
+        <w:t>반복 이미지 편집에서는 변경할 내용과 유지하거나 삭제할 내용을 다음 프롬프트에 정확히 반영해야 한다. 본 연구는 언어 모델이 변경 사항을 추출하고 재검토한 뒤 명시적인 유지·삭제 지시를 확인하는 후처리 규칙을 제안한다. 유지 규칙은 이전 값을 보존하고 삭제 규칙은 값을 없음으로 설정한다. 유지·삭제 규칙 비교 실험의 대화 8개, 요청 32회에서 전체 상태 일치율은 기준 27/32, 유지 규칙만 27/32, 삭제 규칙만 28/32, 두 규칙 결합 29/32였다. 새로운 대화 8개, 요청 32회의 재검증에서도 28/32에서 29/32로 증가하였다. 포즈·표정을 포함한 복합 요청 실험에서는 속성 지시 혼합 조건의 전체 상태 일치율이 재검토 4/16에서 규칙 보정 16/16으로 증가하였다. 표현 변화 검사에서 원본 복원과 유지 구절의 경계 오류를 확인하여 지시 정규화를 추가하였다. 코드를 고정한 뒤 새 대화 4개, 요청 16회를 검사한 결과, 기준은 9/16, 기존 유지·삭제는 10/16, 정규화는 16/16이었다. 같은 목표의 문장 구조 대조에서도 기존 유지·삭제 26/36, 단순 JSON 적용 28/36, 정규화 36/36이었다. 표현과 지시 순서를 바꾼 추가 검증에서는 기준 24/48, 정규화 36/48이었다. 규칙에 없는 복원 표현의 오류는 후속 요청에도 남았다. 실제 인물 사진의 AI 평가에서는 설명과 점수의 불일치가 나타났다. 제안 방법은 지정된 영어 구절의 합성 대화에서 추가 모델 호출 없이 상태 갱신 오류를 줄였다.</w:t>
       </w:r>
     </w:p>
     <w:p>
@@ -79,7 +79,7 @@
         <w:t xml:space="preserve">Abstract: </w:t>
       </w:r>
       <w:r>
-        <w:t>Iterative portrait editing requires accurate updates to requested attribute values. We apply explicit preservation and removal rules after a language model extracts and reviews the requested changes. Preservation retains the previous value, whereas removal sets an attribute to absent. Across eight synthetic English dialogues with 32 requests, all six attribute values matched the reference state in 27/32 requests for the baseline, 27/32 for preservation alone, 28/32 for removal alone, and 29/32 for their combination. In eight new dialogues with 32 requests, the full-state match rate increased from 28/32 to 29/32. In a separate experiment involving expressions and poses, the full-state match rate for mixed attribute requests increased from 4/16 after model review to 16/16 after rule correction. A paired paraphrase test exposed errors in separating restoration from preservation clauses. We added normalization of explicitly supported instruction clauses and froze the implementation before testing four new dialogues with 16 requests. The baseline matched 9/16 reference states, the existing preservation and removal rules matched 10/16, and normalization matched 16/16. A paired comparison across three sets of editing goals and four sentence structures yielded 26/36 for the existing rules, 28/36 for schema-only patch application, and 36/36 for normalization. An image study revealed inconsistencies between evaluator explanations and scores. The method reduced state-update errors without additional model calls within the tested English patterns and synthetic dialogues.</w:t>
+        <w:t>Iterative portrait editing requires accurate updates to requested attribute values. We apply explicit preservation and removal rules after a language model extracts and reviews the requested changes. Preservation retains the previous value, whereas removal sets an attribute to absent. Across eight synthetic English dialogues with 32 requests, all six attribute values matched the reference state in 27/32 requests for the baseline, 27/32 for preservation alone, 28/32 for removal alone, and 29/32 for their combination. In eight new dialogues with 32 requests, the full-state match rate increased from 28/32 to 29/32. In a separate experiment involving expressions and poses, the full-state match rate for mixed attribute requests increased from 4/16 after model review to 16/16 after rule correction. A paired paraphrase test exposed errors in separating restoration from preservation clauses. We added normalization of explicitly supported instruction clauses and froze the implementation before testing four new dialogues with 16 requests. The baseline matched 9/16 reference states, the existing preservation and removal rules matched 10/16, and normalization matched 16/16. A paired comparison across three sets of editing goals and four sentence structures yielded 26/36 for the existing rules, 28/36 for schema-only patch application, and 36/36 for normalization. In an additional evaluation of recombined, unfamiliar, and revised instructions, the baseline matched 24/48 states and normalization matched 36/48. Restoration errors with an unfamiliar expression persisted in subsequent requests. An image study revealed inconsistencies between evaluator explanations and scores. The method reduced state-update errors without additional model calls within the tested English patterns and synthetic dialogues.</w:t>
       </w:r>
     </w:p>
     <w:p>
@@ -492,6 +492,30 @@
       </w:pPr>
       <w:r>
         <w:t>세 가지 항목 구성에서 복원·유지 목표를 고정하고 네 문장 구조를 비교하였다. 표준 분리 구절, leaving 연결, preserving 연결, bring back과 부정형 유지 표현을 사용하였다. 각 대화는 초기 설정, 복원과 유지, 별도 변경 요청의 세 단계로 구성하였다. 총 대화 12개·요청 36개에 대해 기존 코드를 수정 없이 적용하고 추출·재검토 응답 72개를 새로 저장하였다. 목표 구성은 세 가지이며 문장 구조 사이의 목표는 같다. 같은 초기 설정과 후속 요청의 반복 호출은 새 목표 구성과 구분하였다.</w:t>
+      </w:r>
+    </w:p>
+    <w:p>
+      <w:pPr>
+        <w:pStyle w:val="Heading2"/>
+      </w:pPr>
+      <w:r>
+        <w:t>7. 표현과 지시 순서를 바꾼 추가 검증</w:t>
+      </w:r>
+    </w:p>
+    <w:p>
+      <w:pPr>
+        <w:jc w:val="both"/>
+      </w:pPr>
+      <w:r>
+        <w:t>정규화 구현을 고정한 뒤, 기존 어휘를 새롭게 조합한 요청과 규칙이 직접 다루지 않은 표현, 앞 지시를 뒤에서 수정하는 요청을 비교하였다. 네 가지 편집 조건마다 세 표현 유형의 대화를 구성하였다. 각 대화는 초기 설정, 복원과 유지, 삭제와 유지, 별도 변경의 요청 네 개로 이루어진다. 대화 12개, 요청 48개이며 추출·재검토에 모델을 총 96회 호출하였다. 모든 방법은 같은 응답을 사용한다. 기존 다섯 방법과 함께 최초 응답만 적용하는 JSON 방식, 유효한 재검토 응답을 우선 적용하는 JSON 방식을 비교하였다.</w:t>
+      </w:r>
+    </w:p>
+    <w:p>
+      <w:pPr>
+        <w:jc w:val="both"/>
+      </w:pPr>
+      <w:r>
+        <w:t>요청과 정답은 추론 전에 확정하고 모든 결과를 집계하였다. 네 가지 편집 목표를 표현 유형별로 반복하므로 같은 초기 설정과 후속 요청이 포함된다. 서로 다른 요청 문장은 32개다. 표현을 달리한 두 번째와 세 번째 요청의 정확도를 따로 제시한다. 정답은 명시한 항목별 변경을 누적하여 계산하였다. 이 자료도 연구자가 구성한 합성 영어 대화다.</w:t>
       </w:r>
     </w:p>
     <w:p>
@@ -1943,7 +1967,7 @@
         <w:jc w:val="both"/>
       </w:pPr>
       <w:r>
-        <w:t>새 대화에서도 유지·삭제 규칙은 모든 항목이 정답과 일치한 요청 수와 최종 상태가 일치한 대화 수를 각각 한 건 늘렸으며, 차이는 일곱 번째 대화의 마지막 요청에서 발생하였다. 항목별 적용을 추가한 결과는 유지·삭제 규칙만 사용한 결과와 같았다. 이에 따라 추가 처리 없이 유지·삭제 규칙을 사용하는 방법을 선택하였다. 규칙 비교 실험의 사후 분석과 새 대화에서의 재검증은 서로 다른 개발 단계에서 수행하였으므로 결과와 표본 수를 따로 집계하였다.</w:t>
+        <w:t>새 대화에서도 유지·삭제 규칙은 모든 항목이 정답과 일치한 요청 수와 최종 상태가 일치한 대화 수를 각각 한 건 늘렸으며, 차이는 일곱 번째 대화의 마지막 요청에서 발생하였다. 항목별 적용을 추가한 결과는 유지·삭제 규칙만 사용한 결과와 같았다.</w:t>
       </w:r>
     </w:p>
     <w:p>
@@ -5589,6 +5613,603 @@
     </w:p>
     <w:p>
       <w:pPr>
+        <w:pStyle w:val="Heading2"/>
+      </w:pPr>
+      <w:r>
+        <w:t>9. 표현과 지시 순서에 따른 처리 결과</w:t>
+      </w:r>
+    </w:p>
+    <w:p>
+      <w:pPr>
+        <w:jc w:val="both"/>
+      </w:pPr>
+      <w:r>
+        <w:t>추가 요청 48개에서 전체 상태 일치율은 기준 24/48, 기존 유지·삭제 27/48, 구절 정규화 36/48이었다. 항목별 적용은 27/48, 정규화와 결합하면 36/48였으며, JSON 최초 응답과 재검토 우선 방식은 모두 15/48이었다. 정규화의 항목별 일치율은 264/288, 최종 상태 일치율은 8/12였고 기준이 맞았던 요청을 새로 틀린 경우는 0개였다.</w:t>
+      </w:r>
+    </w:p>
+    <w:p>
+      <w:pPr>
+        <w:jc w:val="both"/>
+      </w:pPr>
+      <w:r>
+        <w:t>표 9는 표현을 바꾼 두 번째와 세 번째 요청만 비교한 결과다. 각 유형에는 네 편집 조건의 요청 두 개씩, 총 여덟 개가 포함된다.</w:t>
+      </w:r>
+    </w:p>
+    <w:p>
+      <w:pPr>
+        <w:pStyle w:val="Caption"/>
+        <w:keepNext/>
+        <w:spacing w:before="100"/>
+        <w:ind w:firstLine="0"/>
+        <w:jc w:val="center"/>
+      </w:pPr>
+      <w:r>
+        <w:t>표 9. 표현 유형별 복원과 삭제 요청의 전체 상태 일치율</w:t>
+      </w:r>
+    </w:p>
+    <w:tbl>
+      <w:tblPr>
+        <w:tblW w:type="auto" w:w="0"/>
+        <w:tblLayout w:type="fixed"/>
+        <w:tblLook w:firstColumn="1" w:firstRow="1" w:lastColumn="0" w:lastRow="0" w:noHBand="0" w:noVBand="1" w:val="04A0"/>
+      </w:tblPr>
+      <w:tblGrid>
+        <w:gridCol w:w="1417"/>
+        <w:gridCol w:w="801"/>
+        <w:gridCol w:w="801"/>
+        <w:gridCol w:w="801"/>
+        <w:gridCol w:w="801"/>
+      </w:tblGrid>
+      <w:tr>
+        <w:trPr>
+          <w:cantSplit/>
+          <w:tblHeader/>
+        </w:trPr>
+        <w:tc>
+          <w:tcPr>
+            <w:tcW w:type="dxa" w:w="1417"/>
+            <w:tcMar>
+              <w:left w:w="45" w:type="dxa"/>
+              <w:right w:w="45" w:type="dxa"/>
+            </w:tcMar>
+            <w:tcBorders>
+              <w:bottom w:val="single" w:sz="5"/>
+            </w:tcBorders>
+          </w:tcPr>
+          <w:p>
+            <w:pPr>
+              <w:keepNext/>
+              <w:spacing w:after="60" w:before="60" w:line="240" w:lineRule="auto"/>
+              <w:ind w:firstLine="0"/>
+              <w:jc w:val="left"/>
+            </w:pPr>
+            <w:r>
+              <w:rPr>
+                <w:b/>
+                <w:sz w:val="16"/>
+              </w:rPr>
+              <w:t>표현 유형</w:t>
+            </w:r>
+          </w:p>
+        </w:tc>
+        <w:tc>
+          <w:tcPr>
+            <w:tcW w:type="dxa" w:w="801"/>
+            <w:tcMar>
+              <w:left w:w="45" w:type="dxa"/>
+              <w:right w:w="45" w:type="dxa"/>
+            </w:tcMar>
+            <w:tcBorders>
+              <w:bottom w:val="single" w:sz="5"/>
+            </w:tcBorders>
+          </w:tcPr>
+          <w:p>
+            <w:pPr>
+              <w:keepNext/>
+              <w:spacing w:after="60" w:before="60" w:line="240" w:lineRule="auto"/>
+              <w:ind w:firstLine="0"/>
+              <w:jc w:val="center"/>
+            </w:pPr>
+            <w:r>
+              <w:rPr>
+                <w:b/>
+                <w:sz w:val="16"/>
+              </w:rPr>
+              <w:t>기준 방법</w:t>
+            </w:r>
+          </w:p>
+        </w:tc>
+        <w:tc>
+          <w:tcPr>
+            <w:tcW w:type="dxa" w:w="801"/>
+            <w:tcMar>
+              <w:left w:w="45" w:type="dxa"/>
+              <w:right w:w="45" w:type="dxa"/>
+            </w:tcMar>
+            <w:tcBorders>
+              <w:bottom w:val="single" w:sz="5"/>
+            </w:tcBorders>
+          </w:tcPr>
+          <w:p>
+            <w:pPr>
+              <w:keepNext/>
+              <w:spacing w:after="60" w:before="60" w:line="240" w:lineRule="auto"/>
+              <w:ind w:firstLine="0"/>
+              <w:jc w:val="center"/>
+            </w:pPr>
+            <w:r>
+              <w:rPr>
+                <w:b/>
+                <w:sz w:val="16"/>
+              </w:rPr>
+              <w:t>기존 유지·삭제</w:t>
+            </w:r>
+          </w:p>
+        </w:tc>
+        <w:tc>
+          <w:tcPr>
+            <w:tcW w:type="dxa" w:w="801"/>
+            <w:tcMar>
+              <w:left w:w="45" w:type="dxa"/>
+              <w:right w:w="45" w:type="dxa"/>
+            </w:tcMar>
+            <w:tcBorders>
+              <w:bottom w:val="single" w:sz="5"/>
+            </w:tcBorders>
+          </w:tcPr>
+          <w:p>
+            <w:pPr>
+              <w:keepNext/>
+              <w:spacing w:after="60" w:before="60" w:line="240" w:lineRule="auto"/>
+              <w:ind w:firstLine="0"/>
+              <w:jc w:val="center"/>
+            </w:pPr>
+            <w:r>
+              <w:rPr>
+                <w:b/>
+                <w:sz w:val="16"/>
+              </w:rPr>
+              <w:t>구절 정규화</w:t>
+            </w:r>
+          </w:p>
+        </w:tc>
+        <w:tc>
+          <w:tcPr>
+            <w:tcW w:type="dxa" w:w="801"/>
+            <w:tcMar>
+              <w:left w:w="45" w:type="dxa"/>
+              <w:right w:w="45" w:type="dxa"/>
+            </w:tcMar>
+            <w:tcBorders>
+              <w:bottom w:val="single" w:sz="5"/>
+            </w:tcBorders>
+          </w:tcPr>
+          <w:p>
+            <w:pPr>
+              <w:keepNext/>
+              <w:spacing w:after="60" w:before="60" w:line="240" w:lineRule="auto"/>
+              <w:ind w:firstLine="0"/>
+              <w:jc w:val="center"/>
+            </w:pPr>
+            <w:r>
+              <w:rPr>
+                <w:b/>
+                <w:sz w:val="16"/>
+              </w:rPr>
+              <w:t>JSON 재검토 우선</w:t>
+            </w:r>
+          </w:p>
+        </w:tc>
+      </w:tr>
+      <w:tr>
+        <w:trPr>
+          <w:cantSplit/>
+        </w:trPr>
+        <w:tc>
+          <w:tcPr>
+            <w:tcW w:type="dxa" w:w="1417"/>
+            <w:tcMar>
+              <w:left w:w="45" w:type="dxa"/>
+              <w:right w:w="45" w:type="dxa"/>
+            </w:tcMar>
+          </w:tcPr>
+          <w:p>
+            <w:pPr>
+              <w:keepNext/>
+              <w:spacing w:after="60" w:before="60" w:line="240" w:lineRule="auto"/>
+              <w:ind w:firstLine="0"/>
+              <w:jc w:val="left"/>
+            </w:pPr>
+            <w:r>
+              <w:rPr>
+                <w:b w:val="0"/>
+                <w:sz w:val="16"/>
+              </w:rPr>
+              <w:t>기존 어휘의 새 조합</w:t>
+            </w:r>
+          </w:p>
+        </w:tc>
+        <w:tc>
+          <w:tcPr>
+            <w:tcW w:type="dxa" w:w="801"/>
+            <w:tcMar>
+              <w:left w:w="45" w:type="dxa"/>
+              <w:right w:w="45" w:type="dxa"/>
+            </w:tcMar>
+          </w:tcPr>
+          <w:p>
+            <w:pPr>
+              <w:keepNext/>
+              <w:spacing w:after="60" w:before="60" w:line="240" w:lineRule="auto"/>
+              <w:ind w:firstLine="0"/>
+              <w:jc w:val="center"/>
+            </w:pPr>
+            <w:r>
+              <w:rPr>
+                <w:b w:val="0"/>
+                <w:sz w:val="16"/>
+              </w:rPr>
+              <w:t>2/8</w:t>
+            </w:r>
+          </w:p>
+        </w:tc>
+        <w:tc>
+          <w:tcPr>
+            <w:tcW w:type="dxa" w:w="801"/>
+            <w:tcMar>
+              <w:left w:w="45" w:type="dxa"/>
+              <w:right w:w="45" w:type="dxa"/>
+            </w:tcMar>
+          </w:tcPr>
+          <w:p>
+            <w:pPr>
+              <w:keepNext/>
+              <w:spacing w:after="60" w:before="60" w:line="240" w:lineRule="auto"/>
+              <w:ind w:firstLine="0"/>
+              <w:jc w:val="center"/>
+            </w:pPr>
+            <w:r>
+              <w:rPr>
+                <w:b w:val="0"/>
+                <w:sz w:val="16"/>
+              </w:rPr>
+              <w:t>2/8</w:t>
+            </w:r>
+          </w:p>
+        </w:tc>
+        <w:tc>
+          <w:tcPr>
+            <w:tcW w:type="dxa" w:w="801"/>
+            <w:tcMar>
+              <w:left w:w="45" w:type="dxa"/>
+              <w:right w:w="45" w:type="dxa"/>
+            </w:tcMar>
+          </w:tcPr>
+          <w:p>
+            <w:pPr>
+              <w:keepNext/>
+              <w:spacing w:after="60" w:before="60" w:line="240" w:lineRule="auto"/>
+              <w:ind w:firstLine="0"/>
+              <w:jc w:val="center"/>
+            </w:pPr>
+            <w:r>
+              <w:rPr>
+                <w:b w:val="0"/>
+                <w:sz w:val="16"/>
+              </w:rPr>
+              <w:t>8/8</w:t>
+            </w:r>
+          </w:p>
+        </w:tc>
+        <w:tc>
+          <w:tcPr>
+            <w:tcW w:type="dxa" w:w="801"/>
+            <w:tcMar>
+              <w:left w:w="45" w:type="dxa"/>
+              <w:right w:w="45" w:type="dxa"/>
+            </w:tcMar>
+          </w:tcPr>
+          <w:p>
+            <w:pPr>
+              <w:keepNext/>
+              <w:spacing w:after="60" w:before="60" w:line="240" w:lineRule="auto"/>
+              <w:ind w:firstLine="0"/>
+              <w:jc w:val="center"/>
+            </w:pPr>
+            <w:r>
+              <w:rPr>
+                <w:b w:val="0"/>
+                <w:sz w:val="16"/>
+              </w:rPr>
+              <w:t>2/8</w:t>
+            </w:r>
+          </w:p>
+        </w:tc>
+      </w:tr>
+      <w:tr>
+        <w:trPr>
+          <w:cantSplit/>
+        </w:trPr>
+        <w:tc>
+          <w:tcPr>
+            <w:tcW w:type="dxa" w:w="1417"/>
+            <w:tcMar>
+              <w:left w:w="45" w:type="dxa"/>
+              <w:right w:w="45" w:type="dxa"/>
+            </w:tcMar>
+          </w:tcPr>
+          <w:p>
+            <w:pPr>
+              <w:keepNext/>
+              <w:spacing w:after="60" w:before="60" w:line="240" w:lineRule="auto"/>
+              <w:ind w:firstLine="0"/>
+              <w:jc w:val="left"/>
+            </w:pPr>
+            <w:r>
+              <w:rPr>
+                <w:b w:val="0"/>
+                <w:sz w:val="16"/>
+              </w:rPr>
+              <w:t>규칙에 없는 표현</w:t>
+            </w:r>
+          </w:p>
+        </w:tc>
+        <w:tc>
+          <w:tcPr>
+            <w:tcW w:type="dxa" w:w="801"/>
+            <w:tcMar>
+              <w:left w:w="45" w:type="dxa"/>
+              <w:right w:w="45" w:type="dxa"/>
+            </w:tcMar>
+          </w:tcPr>
+          <w:p>
+            <w:pPr>
+              <w:keepNext/>
+              <w:spacing w:after="60" w:before="60" w:line="240" w:lineRule="auto"/>
+              <w:ind w:firstLine="0"/>
+              <w:jc w:val="center"/>
+            </w:pPr>
+            <w:r>
+              <w:rPr>
+                <w:b w:val="0"/>
+                <w:sz w:val="16"/>
+              </w:rPr>
+              <w:t>0/8</w:t>
+            </w:r>
+          </w:p>
+        </w:tc>
+        <w:tc>
+          <w:tcPr>
+            <w:tcW w:type="dxa" w:w="801"/>
+            <w:tcMar>
+              <w:left w:w="45" w:type="dxa"/>
+              <w:right w:w="45" w:type="dxa"/>
+            </w:tcMar>
+          </w:tcPr>
+          <w:p>
+            <w:pPr>
+              <w:keepNext/>
+              <w:spacing w:after="60" w:before="60" w:line="240" w:lineRule="auto"/>
+              <w:ind w:firstLine="0"/>
+              <w:jc w:val="center"/>
+            </w:pPr>
+            <w:r>
+              <w:rPr>
+                <w:b w:val="0"/>
+                <w:sz w:val="16"/>
+              </w:rPr>
+              <w:t>0/8</w:t>
+            </w:r>
+          </w:p>
+        </w:tc>
+        <w:tc>
+          <w:tcPr>
+            <w:tcW w:type="dxa" w:w="801"/>
+            <w:tcMar>
+              <w:left w:w="45" w:type="dxa"/>
+              <w:right w:w="45" w:type="dxa"/>
+            </w:tcMar>
+          </w:tcPr>
+          <w:p>
+            <w:pPr>
+              <w:keepNext/>
+              <w:spacing w:after="60" w:before="60" w:line="240" w:lineRule="auto"/>
+              <w:ind w:firstLine="0"/>
+              <w:jc w:val="center"/>
+            </w:pPr>
+            <w:r>
+              <w:rPr>
+                <w:b w:val="0"/>
+                <w:sz w:val="16"/>
+              </w:rPr>
+              <w:t>0/8</w:t>
+            </w:r>
+          </w:p>
+        </w:tc>
+        <w:tc>
+          <w:tcPr>
+            <w:tcW w:type="dxa" w:w="801"/>
+            <w:tcMar>
+              <w:left w:w="45" w:type="dxa"/>
+              <w:right w:w="45" w:type="dxa"/>
+            </w:tcMar>
+          </w:tcPr>
+          <w:p>
+            <w:pPr>
+              <w:keepNext/>
+              <w:spacing w:after="60" w:before="60" w:line="240" w:lineRule="auto"/>
+              <w:ind w:firstLine="0"/>
+              <w:jc w:val="center"/>
+            </w:pPr>
+            <w:r>
+              <w:rPr>
+                <w:b w:val="0"/>
+                <w:sz w:val="16"/>
+              </w:rPr>
+              <w:t>0/8</w:t>
+            </w:r>
+          </w:p>
+        </w:tc>
+      </w:tr>
+      <w:tr>
+        <w:trPr>
+          <w:cantSplit/>
+        </w:trPr>
+        <w:tc>
+          <w:tcPr>
+            <w:tcW w:type="dxa" w:w="1417"/>
+            <w:tcMar>
+              <w:left w:w="45" w:type="dxa"/>
+              <w:right w:w="45" w:type="dxa"/>
+            </w:tcMar>
+            <w:tcBorders>
+              <w:bottom w:val="single" w:sz="5"/>
+            </w:tcBorders>
+          </w:tcPr>
+          <w:p>
+            <w:pPr>
+              <w:keepNext w:val="0"/>
+              <w:spacing w:after="60" w:before="60" w:line="240" w:lineRule="auto"/>
+              <w:ind w:firstLine="0"/>
+              <w:jc w:val="left"/>
+            </w:pPr>
+            <w:r>
+              <w:rPr>
+                <w:b w:val="0"/>
+                <w:sz w:val="16"/>
+              </w:rPr>
+              <w:t>앞 지시의 수정</w:t>
+            </w:r>
+          </w:p>
+        </w:tc>
+        <w:tc>
+          <w:tcPr>
+            <w:tcW w:type="dxa" w:w="801"/>
+            <w:tcMar>
+              <w:left w:w="45" w:type="dxa"/>
+              <w:right w:w="45" w:type="dxa"/>
+            </w:tcMar>
+            <w:tcBorders>
+              <w:bottom w:val="single" w:sz="5"/>
+            </w:tcBorders>
+          </w:tcPr>
+          <w:p>
+            <w:pPr>
+              <w:keepNext w:val="0"/>
+              <w:spacing w:after="60" w:before="60" w:line="240" w:lineRule="auto"/>
+              <w:ind w:firstLine="0"/>
+              <w:jc w:val="center"/>
+            </w:pPr>
+            <w:r>
+              <w:rPr>
+                <w:b w:val="0"/>
+                <w:sz w:val="16"/>
+              </w:rPr>
+              <w:t>6/8</w:t>
+            </w:r>
+          </w:p>
+        </w:tc>
+        <w:tc>
+          <w:tcPr>
+            <w:tcW w:type="dxa" w:w="801"/>
+            <w:tcMar>
+              <w:left w:w="45" w:type="dxa"/>
+              <w:right w:w="45" w:type="dxa"/>
+            </w:tcMar>
+            <w:tcBorders>
+              <w:bottom w:val="single" w:sz="5"/>
+            </w:tcBorders>
+          </w:tcPr>
+          <w:p>
+            <w:pPr>
+              <w:keepNext w:val="0"/>
+              <w:spacing w:after="60" w:before="60" w:line="240" w:lineRule="auto"/>
+              <w:ind w:firstLine="0"/>
+              <w:jc w:val="center"/>
+            </w:pPr>
+            <w:r>
+              <w:rPr>
+                <w:b w:val="0"/>
+                <w:sz w:val="16"/>
+              </w:rPr>
+              <w:t>8/8</w:t>
+            </w:r>
+          </w:p>
+        </w:tc>
+        <w:tc>
+          <w:tcPr>
+            <w:tcW w:type="dxa" w:w="801"/>
+            <w:tcMar>
+              <w:left w:w="45" w:type="dxa"/>
+              <w:right w:w="45" w:type="dxa"/>
+            </w:tcMar>
+            <w:tcBorders>
+              <w:bottom w:val="single" w:sz="5"/>
+            </w:tcBorders>
+          </w:tcPr>
+          <w:p>
+            <w:pPr>
+              <w:keepNext w:val="0"/>
+              <w:spacing w:after="60" w:before="60" w:line="240" w:lineRule="auto"/>
+              <w:ind w:firstLine="0"/>
+              <w:jc w:val="center"/>
+            </w:pPr>
+            <w:r>
+              <w:rPr>
+                <w:b w:val="0"/>
+                <w:sz w:val="16"/>
+              </w:rPr>
+              <w:t>8/8</w:t>
+            </w:r>
+          </w:p>
+        </w:tc>
+        <w:tc>
+          <w:tcPr>
+            <w:tcW w:type="dxa" w:w="801"/>
+            <w:tcMar>
+              <w:left w:w="45" w:type="dxa"/>
+              <w:right w:w="45" w:type="dxa"/>
+            </w:tcMar>
+            <w:tcBorders>
+              <w:bottom w:val="single" w:sz="5"/>
+            </w:tcBorders>
+          </w:tcPr>
+          <w:p>
+            <w:pPr>
+              <w:keepNext w:val="0"/>
+              <w:spacing w:after="60" w:before="60" w:line="240" w:lineRule="auto"/>
+              <w:ind w:firstLine="0"/>
+              <w:jc w:val="center"/>
+            </w:pPr>
+            <w:r>
+              <w:rPr>
+                <w:b w:val="0"/>
+                <w:sz w:val="16"/>
+              </w:rPr>
+              <w:t>0/8</w:t>
+            </w:r>
+          </w:p>
+        </w:tc>
+      </w:tr>
+    </w:tbl>
+    <w:p>
+      <w:pPr>
+        <w:jc w:val="both"/>
+      </w:pPr>
+      <w:r>
+        <w:t>기존 어휘를 새 순서로 조합한 요청에서는 정규화가 복원과 유지 대상을 구분하였다. 앞 지시를 뒤에서 수정한 요청에서는 기존 유지·삭제와 정규화가 같은 결과를 보였다. 예를 들어 배경을 원본으로 돌리라고 한 뒤 실제로는 그대로 두라고 수정하면, 마지막 유지 지시가 지정한 직전 배경을 보존하였다.</w:t>
+      </w:r>
+    </w:p>
+    <w:p>
+      <w:pPr>
+        <w:jc w:val="both"/>
+      </w:pPr>
+      <w:r>
+        <w:t>규칙에 없는 표현에서는 네 대화 모두 두 번째 요청에서 오류가 발생하였다. “Revert … to how they looked in the source photo”라는 복원 지시를 모델이 ‘유지’로 추출하였고 재검토에서도 같은 값을 반환하였다. 정규화도 이 표현을 변환하지 않아 복원할 두 항목이 이전 값으로 남았다. 뒤의 삭제와 별도 변경을 처리한 뒤에도 두 항목의 오류가 이어졌다. 이 때문에 해당 유형의 0/8에는 최초 복원 오류 네 건과 그 오류가 남은 후속 요청 네 건이 포함된다.</w:t>
+      </w:r>
+    </w:p>
+    <w:p>
+      <w:pPr>
         <w:pStyle w:val="Heading1"/>
       </w:pPr>
       <w:r>
@@ -5645,6 +6266,14 @@
     </w:p>
     <w:p>
       <w:pPr>
+        <w:jc w:val="both"/>
+      </w:pPr>
+      <w:r>
+        <w:t>추가 검증에서는 기존 어휘를 새롭게 조합하거나 앞 지시를 수정한 문장을 처리하였지만, 새로운 복원 표현에서 발생한 추출 오류는 그대로 남았다. 따라서 지시 구절 정규화의 효과는 구현이 구분하는 동작과 표현에 달려 있다. 같은 목표의 표현 유형을 나누어 비교하면, 전체 점수만으로는 드러나지 않는 적용 범위와 후속 상태의 오류를 확인할 수 있다.</w:t>
+      </w:r>
+    </w:p>
+    <w:p>
+      <w:pPr>
         <w:pStyle w:val="Heading1"/>
       </w:pPr>
       <w:r>
@@ -5664,7 +6293,7 @@
         <w:jc w:val="both"/>
       </w:pPr>
       <w:r>
-        <w:t>코드를 고정한 뒤 수행한 새 대화 검증에서 전체 상태 일치율은 기준 9/16, 기존 유지·삭제 10/16, 구절 정규화 16/16이었다. 같은 목표를 네 문장 구조로 요청한 비교에서도 기존 유지·삭제 26/36, 단순 JSON 적용 28/36, 정규화 36/36이었다. 지정된 영어 어휘와 문장 구조에서 지시별 적용 대상을 구분하는 처리가 상태 기록의 정확도를 높였으며, 추가 모델 호출은 사용하지 않았다.</w:t>
+        <w:t>코드를 고정한 뒤 수행한 새 대화 검증에서 전체 상태 일치율은 기준 9/16, 기존 유지·삭제 10/16, 구절 정규화 16/16이었다. 같은 목표를 네 문장 구조로 요청한 비교에서도 기존 유지·삭제 26/36, 단순 JSON 적용 28/36, 정규화 36/36이었다. 표현과 지시 순서를 바꾼 추가 검증에서는 기준 24/48, 기존 유지·삭제 27/48, 정규화 36/48이었다. 지시별 적용 대상을 구분하는 처리는 지원하는 표현에서 상태 기록의 정확도를 높였으며, 추가 모델 호출은 사용하지 않았다. 규칙에 없는 복원 표현에서는 모델의 추출 오류가 다음 요청까지 이어졌다.</w:t>
       </w:r>
     </w:p>
     <w:p>

</xml_diff>

<commit_message>
Validate single-extraction instruction checks across two models and align thesis
</commit_message>
<xml_diff>
--- a/paper/manuscript.inha.docx
+++ b/paper/manuscript.inha.docx
@@ -10,7 +10,7 @@
         <w:jc w:val="center"/>
       </w:pPr>
       <w:r>
-        <w:t>반복 인물 이미지 편집을 위한 유지 및 삭제 지시 처리 방법</w:t>
+        <w:t>반복 인물 이미지 편집에서 지시 검사를 이용한 상태 갱신</w:t>
       </w:r>
     </w:p>
     <w:p>
@@ -21,7 +21,7 @@
         <w:jc w:val="center"/>
       </w:pPr>
       <w:r>
-        <w:t>Handling Preservation and Removal Instructions in Iterative Portrait Editing</w:t>
+        <w:t>State Updates Using Instruction Validation in Iterative Portrait Editing</w:t>
       </w:r>
     </w:p>
     <w:p>
@@ -65,7 +65,7 @@
         <w:t xml:space="preserve">요약: </w:t>
       </w:r>
       <w:r>
-        <w:t>반복 이미지 편집에서는 변경할 내용과 유지하거나 삭제할 내용을 다음 프롬프트에 정확히 반영해야 한다. 본 연구는 언어 모델이 변경 사항을 추출하고 재검토한 뒤 명시적인 유지·삭제 지시를 확인하는 후처리 규칙을 제안한다. 유지 규칙은 이전 값을 보존하고 삭제 규칙은 값을 없음으로 설정한다. 유지·삭제 규칙 비교 실험의 대화 8개, 요청 32회에서 전체 상태 일치율은 기준 27/32, 유지 규칙만 27/32, 삭제 규칙만 28/32, 두 규칙 결합 29/32였다. 새로운 대화 8개, 요청 32회의 재검증에서도 28/32에서 29/32로 증가하였다. 포즈·표정을 포함한 복합 요청 실험에서는 속성 지시 혼합 조건의 전체 상태 일치율이 재검토 4/16에서 규칙 보정 16/16으로 증가하였다. 표현 변화 검사에서 원본 복원과 유지 구절의 경계 오류를 확인하여 지시 정규화를 추가하였다. 코드를 고정한 뒤 새 대화 4개, 요청 16회를 검사한 결과, 기준은 9/16, 기존 유지·삭제는 10/16, 정규화는 16/16이었다. 같은 목표의 문장 구조 대조에서도 기존 유지·삭제 26/36, 단순 JSON 적용 28/36, 정규화 36/36이었다. 표현과 지시 순서를 바꾼 추가 검증에서는 기준 24/48, 정규화 36/48이었다. 규칙에 없는 복원 표현의 오류는 후속 요청에도 남았다. 실제 인물 사진의 AI 평가에서는 설명과 점수의 불일치가 나타났다. 제안 방법은 지정된 영어 구절의 합성 대화에서 추가 모델 호출 없이 상태 갱신 오류를 줄였다.</w:t>
+        <w:t>반복 인물 이미지 편집에서는 현재 요청의 변경 사항과 유지·삭제·복원 지시를 저장된 편집 조건에 반영해야 한다. 본 연구는 한 번의 변경 사항 추출에 지시 구절 정규화와 실행 대상 검사를 결합한 상태 갱신 방법을 제안한다. 복원과 유지 대상을 구분하고, 부정·조건·인용 표현의 적용 범위와 같은 항목에 대한 뒤 지시를 검사한다. Qwen3-4B와 Llama-3.2-3B-Instruct의 4비트 양자화 모델에 같은 합성 영어 요청을 입력하여 비교하였다. 새 요청 12개에서 동일한 최초 응답을 단순 JSON으로 적용한 전체 상태 일치율은 두 모델 모두 3/12였으며, 제안 방법은 모두 12/12였다. 추출·재검토와 지시 검사를 함께 사용하면 각각 12/12와 4/12였다. 제안 방법은 요청당 모델 호출 한 번으로, 두 번 호출하는 방법과 같은 정확도 또는 더 높은 정확도를 보였다. 별도의 구성요소 검증에서는 복원 표현 처리의 효과와 재검토가 정답을 훼손하는 사례를 확인하였다. 실험은 명시한 영어 어휘와 문형의 합성 대화를 대상으로 수행하였으며, 실제 인물 이미지 분석에서는 AI 평가 설명과 점수의 불일치를 기록하였다.</w:t>
       </w:r>
     </w:p>
     <w:p>
@@ -79,7 +79,7 @@
         <w:t xml:space="preserve">Abstract: </w:t>
       </w:r>
       <w:r>
-        <w:t>Iterative portrait editing requires accurate updates to requested attribute values. We apply explicit preservation and removal rules after a language model extracts and reviews the requested changes. Preservation retains the previous value, whereas removal sets an attribute to absent. Across eight synthetic English dialogues with 32 requests, all six attribute values matched the reference state in 27/32 requests for the baseline, 27/32 for preservation alone, 28/32 for removal alone, and 29/32 for their combination. In eight new dialogues with 32 requests, the full-state match rate increased from 28/32 to 29/32. In a separate experiment involving expressions and poses, the full-state match rate for mixed attribute requests increased from 4/16 after model review to 16/16 after rule correction. A paired paraphrase test exposed errors in separating restoration from preservation clauses. We added normalization of explicitly supported instruction clauses and froze the implementation before testing four new dialogues with 16 requests. The baseline matched 9/16 reference states, the existing preservation and removal rules matched 10/16, and normalization matched 16/16. A paired comparison across three sets of editing goals and four sentence structures yielded 26/36 for the existing rules, 28/36 for schema-only patch application, and 36/36 for normalization. In an additional evaluation of recombined, unfamiliar, and revised instructions, the baseline matched 24/48 states and normalization matched 36/48. Restoration errors with an unfamiliar expression persisted in subsequent requests. An image study revealed inconsistencies between evaluator explanations and scores. The method reduced state-update errors without additional model calls within the tested English patterns and synthetic dialogues.</w:t>
+        <w:t>Iterative portrait editing requires updating stored editing conditions while respecting preservation, removal, and restoration instructions. We propose a state update method that combines a single extraction by a language model with instruction normalization and checks on which instructions should execute. The method separates restoration from preservation targets, handles explicitly supported negative, conditional, and quoted instructions, and respects later direct instructions about the same attribute. We compared 4-bit versions of Qwen3-4B and Llama-3.2-3B-Instruct on the same synthetic English requests. On twelve new requests, applying the initial response as a schema-only JSON patch matched 3/12 full reference states for each model; the proposed method matched 12/12 for both. Combining extraction, model review, and the instruction checks matched 12/12 and 4/12, respectively. The proposed method required one model call per request and achieved equal or higher accuracy than the method requiring two calls in this comparison. Separate component studies identified restoration errors and cases in which review corrupted a correct initial response. Evaluation used AI-generated synthetic dialogues within the specified English vocabulary and instruction forms. An accompanying image analysis recorded inconsistencies between AI evaluator explanations and scores.</w:t>
       </w:r>
     </w:p>
     <w:p>
@@ -93,7 +93,7 @@
         <w:t xml:space="preserve">Keywords: </w:t>
       </w:r>
       <w:r>
-        <w:t>Iterative portrait editing, State tracking, Preservation and removal rules, Instruction clause normalization</w:t>
+        <w:t>Iterative portrait editing, State updates, Instruction normalization, Instruction validation</w:t>
       </w:r>
     </w:p>
     <w:p>
@@ -129,7 +129,7 @@
         <w:jc w:val="both"/>
       </w:pPr>
       <w:r>
-        <w:t>본 연구에서는 언어 모델이 추출하고 재검토한 변경 사항에 명시적 유지·삭제 제약을 적용하는 상태 갱신 방법을 제안한다. 유지 지시가 있는 항목은 직전 값을 보존하고, 삭제 지시가 있는 항목은 없음으로 설정한다. 동일한 모델 응답에 각 규칙을 단독 또는 결합하여 적용함으로써 유지 지시 위반과 삭제 누락에 대한 각 규칙의 효과를 분석한다.</w:t>
+        <w:t>본 연구에서는 언어 모델이 추출한 변경 사항에 지시 검사를 적용하는 상태 갱신 방법을 제안한다. 유지할 항목의 직전 값을 보존하고 삭제와 원본 복원을 구분하며, 현재 실행할 지시와 조건부·인용 표현을 구분한다. 최초 추출만 사용하는 방법과 재검토를 추가한 방법을 같은 응답으로 비교하여 정확도와 필요한 모델 호출 횟수를 분석한다.</w:t>
       </w:r>
     </w:p>
     <w:p>
@@ -145,7 +145,7 @@
         <w:jc w:val="both"/>
       </w:pPr>
       <w:r>
-        <w:t>분석 대상은 이미지 생성 전에 작성되는 편집 상태이다. 상태의 정답은 요청에 명시한 변경을 누적하여 계산할 수 있으므로 이미지 평가 모델의 판단과 분리하여 검사한다. 본 연구는 유지·삭제를 구분한 후처리를 구현하고 동일한 모델 응답으로 구성요소별 효과를 비교한다. 또한 복합 요청과 표현 변화에서 발생한 오류를 분석하여, 원본 복원과 유지 지시의 적용 대상을 구분하는 구절 정규화 방법을 제안한다.</w:t>
+        <w:t>분석 대상은 이미지 생성 전에 작성되는 편집 상태이다. 상태의 정답은 요청에 명시한 변경을 누적하여 계산할 수 있으므로 이미지 평가 모델의 판단과 분리하여 검사한다. 본 연구는 유지·삭제를 구분한 후처리를 구현하고 동일한 모델 응답으로 구성요소별 효과를 비교한다. 또한 복합 요청과 표현 변화에서 발생한 오류를 분석하여 원본 복원과 유지 지시의 적용 대상을 구분한다. 실행 대상 검사와 최초 응답 선택의 효과를 별도의 새 요청으로 검증한다.</w:t>
       </w:r>
     </w:p>
     <w:p>
@@ -169,7 +169,7 @@
         <w:jc w:val="both"/>
       </w:pPr>
       <w:r>
-        <w:t>Self-Refine은 모델의 피드백과 수정을 반복하는 방법이다[3]. 본 연구의 기준 방법은 변경 사항 추출과 한 차례 재검토에 모델을 총 두 번 호출한다. 모든 비교 방법에 같은 두 응답을 사용해 후처리 규칙의 효과를 비교한다. 특히 유지 지시를 어기고 값을 변경하거나 삭제할 물체를 남기는 오류를 다룬다.</w:t>
+        <w:t>Self-Refine은 모델의 피드백과 수정을 반복하는 방법이다[3]. 본 연구의 기준 방법은 변경 사항 추출과 한 차례 재검토에 모델을 총 두 번 호출한다. 재검토를 사용하는 구성요소 비교에서는 같은 두 응답으로 후처리 규칙의 효과를 비교한다. 특히 유지 지시를 어기고 값을 변경하거나 삭제할 물체를 남기는 오류를 다룬다.</w:t>
       </w:r>
     </w:p>
     <w:p>
@@ -201,7 +201,7 @@
         <w:jc w:val="both"/>
       </w:pPr>
       <w:r>
-        <w:t>요청을 받을 때마다 Qwen3-4B-4bit[4]가 현재 요청에서 변경할 항목과 값을 JSON 형식으로 추출한다. 같은 모델이 요청과 첫 응답을 입력받아 한 차례 재검토한다. 모든 비교 방법은 이 두 응답을 공유하며 각자의 이전 편집 상태에 적용한다.</w:t>
+        <w:t>요청을 받을 때마다 Qwen3-4B-4bit[4]가 현재 요청에서 변경할 항목과 값을 JSON 형식으로 추출한다. 같은 모델이 요청과 첫 응답을 입력받아 한 차례 재검토한다. 초기 구성요소 비교에서는 이 두 응답을 공유하며 각 방법의 이전 편집 상태에 적용한다.</w:t>
       </w:r>
     </w:p>
     <w:p>
@@ -209,7 +209,7 @@
         <w:jc w:val="both"/>
       </w:pPr>
       <w:r>
-        <w:t>모든 방법은 허용된 값인지 검사하고, 현재 상태와 같은 변경을 생략하며, 명시적인 원본 복원 요청을 처리한다. 제안 방법은 여기에 유지·삭제 제약을 적용한다. 정답은 평가에만 사용한다. 갱신한 상태를 공통 변환 함수로 편집 프롬프트로 바꾸고, 원본 사진과 함께 이미지 생성 도구에 입력한다.</w:t>
+        <w:t>모든 방법은 허용된 값인지 검사하고, 현재 상태와 같은 변경을 생략하며, 명시적인 원본 복원 요청을 처리한다. 초기 구성요소 비교에서는 여기에 유지·삭제 제약을 적용한다. 정답은 평가에만 사용한다. 갱신한 상태를 공통 변환 함수로 편집 프롬프트로 바꾸고, 원본 사진과 함께 이미지 생성 도구에 입력한다.</w:t>
       </w:r>
     </w:p>
     <w:p>
@@ -241,7 +241,7 @@
         <w:jc w:val="both"/>
       </w:pPr>
       <w:r>
-        <w:t>이 방법은 사전 학습된 모델의 추출·재검토 응답을 그대로 사용한다. 규칙의 적용 범위는 지정된 어휘와 문형으로 한정하며, 그 밖의 표현은 모델이 해석한다. 유지 규칙은 직전 값을 보존하므로 과거 상태의 오류도 다음 요청으로 이어질 수 있다.</w:t>
+        <w:t>이 방법은 사전 학습된 모델의 응답 원문을 그대로 사용한다. 규칙의 적용 범위는 지정된 어휘와 문형으로 한정하며, 그 밖의 표현은 모델이 해석한다. 유지 규칙은 직전 값을 보존하므로 과거 상태의 오류도 다음 요청으로 이어질 수 있다.</w:t>
       </w:r>
     </w:p>
     <w:p>
@@ -257,7 +257,7 @@
         <w:jc w:val="both"/>
       </w:pPr>
       <w:r>
-        <w:t>요청을 처리할 때는 먼저 직전 상태를 복사하고 추출·재검토 응답에서 허용된 항목과 값에 맞는 변경 사항을 선택한다. 이를 복사한 상태에 적용한 다음, 현재 요청에서 지원 문형에 해당하는 구절을 찾는다. 명시적인 유지 구절의 항목은 직전 값으로 되돌리고, 삭제 구절의 항목은 ‘없음’으로 설정한다. 따라서 유지 규칙이 참조하는 값은 모델 응답을 적용하기 전의 상태이다. 모델 응답을 적용한 뒤의 값을 참조하면 잘못 변경된 값도 보존할 수 있다. 최종 상태와 함께 적용 항목, 동작 및 근거 구절을 저장한다.</w:t>
+        <w:t>요청을 처리할 때는 먼저 직전 상태를 복사하고 모델 응답에서 허용된 항목과 값에 맞는 변경 사항을 선택한다. 이를 복사한 상태에 적용한 다음, 현재 요청에서 지원 문형에 해당하는 구절을 찾는다. 명시적인 유지 구절의 항목은 직전 값으로 되돌리고, 삭제 구절의 항목은 ‘없음’으로 설정한다. 따라서 유지 규칙이 참조하는 값은 모델 응답을 적용하기 전의 상태이다. 모델 응답을 적용한 뒤의 값을 참조하면 잘못 변경된 값도 보존할 수 있다. 최종 상태와 함께 적용 항목, 동작 및 근거 구절을 저장한다.</w:t>
       </w:r>
     </w:p>
     <w:p>
@@ -298,6 +298,86 @@
       </w:pPr>
       <w:r>
         <w:t>정규화와 함께 항목별 적용을 사용하여 한 항목의 형식 오류가 다른 변경까지 취소하는 일을 방지한다. 정규화는 각 지시가 어느 항목에 적용되는지 구분한다. 항목별 적용은 추출한 값을 하나씩 검사하여 유효한 변경을 반영한다. 두 처리의 효과는 별도 조건으로 비교한다.</w:t>
+      </w:r>
+    </w:p>
+    <w:p>
+      <w:pPr>
+        <w:pStyle w:val="Heading2"/>
+      </w:pPr>
+      <w:r>
+        <w:t>5. 원본 사진을 가리키는 표현의 처리</w:t>
+      </w:r>
+    </w:p>
+    <w:p>
+      <w:pPr>
+        <w:jc w:val="both"/>
+      </w:pPr>
+      <w:r>
+        <w:t>기존 정규화에 대한 추가 검증에서 “source photo”를 포함한 복원 지시를 모델이 유지로 해석한 오류가 나타났다. 이 자료를 개발에 사용하여 원본 사진을 가리키는 복원 표현과 현재 상태를 유지하는 표현을 표준 지시로 변환하도록 확장하였다. 이후 이 확장을 개선 정규화, 앞선 구현을 기존 정규화로 구분한다.</w:t>
+      </w:r>
+    </w:p>
+    <w:p>
+      <w:pPr>
+        <w:jc w:val="both"/>
+      </w:pPr>
+      <w:r>
+        <w:t>개선 정규화는 지시 동사를 기준으로 구절을 나눈 뒤 항목 목록과 문장 전체의 형태를 확인한다. 예를 들어 “Reset the shirt to the source image appearance”를 셔츠의 원본 복원으로, “Leave the background alone”을 배경의 유지로 변환한다. “Get rid of the plant completely”는 식물 삭제로 변환한다. 변환한 구절에는 기존 정규화와 같은 상태 갱신 절차를 적용한다. 모델에는 변환 전 요청을 입력한다. 정규화 구성요소 비교의 모델 호출 수와 응답은 같다.</w:t>
+      </w:r>
+    </w:p>
+    <w:p>
+      <w:pPr>
+        <w:jc w:val="both"/>
+      </w:pPr>
+      <w:r>
+        <w:t>인식하는 항목과 문형이 모두 일치할 때 변환한다. 부정·조건·인용 표현과 지원하지 않는 대상은 변환 대상에서 제외한다. 같은 항목의 뒤 지시가 앞 지시보다 우선하며, 유지 지시는 모델 응답을 적용하기 전의 값을 참조한다. 변환 전후 문장과 적용 항목을 함께 기록한다.</w:t>
+      </w:r>
+    </w:p>
+    <w:p>
+      <w:pPr>
+        <w:pStyle w:val="Heading2"/>
+      </w:pPr>
+      <w:r>
+        <w:t>6. 현재 실행할 지시의 구분</w:t>
+      </w:r>
+    </w:p>
+    <w:p>
+      <w:pPr>
+        <w:jc w:val="both"/>
+      </w:pPr>
+      <w:r>
+        <w:t>복원 표현 검증에서는 조건부 지시와 인용문을 모델이 실제 변경으로 추출하는 오류도 나타났다. 이를 처리하기 위해 현재 실행할 지시에서 제외할 범위를 기록한다. if가 포함된 조건문, do not·don't·never가 앞선 동작 구절, 캡션이나 인용문이라고 명시한 경우의 인용 범위를 검사한다. 부정 구절의 범위는 다음 동작 지시가 시작되는 곳에서 끝난다.</w:t>
+      </w:r>
+    </w:p>
+    <w:p>
+      <w:pPr>
+        <w:jc w:val="both"/>
+      </w:pPr>
+      <w:r>
+        <w:t>항목의 마지막 언급이 제외 범위 안에 있으면 모델 응답을 적용하기 전의 값을 보존한다. 같은 항목이 뒤의 직접 지시에 다시 나타나면 그 지시를 적용한다. 예를 들어 캡션 속 “Remove the pin”은 핀을 삭제하는 지시로 처리하지 않지만, 뒤에서 실제로 핀을 삭제하라고 요청하면 삭제를 적용한다. 다른 항목의 직접 변경 지시는 함께 처리한다. 보존한 항목과 제외 이유, 근거 문장을 기록한다.</w:t>
+      </w:r>
+    </w:p>
+    <w:p>
+      <w:pPr>
+        <w:pStyle w:val="Heading2"/>
+      </w:pPr>
+      <w:r>
+        <w:t>7. 한 번 추출한 응답의 사용</w:t>
+      </w:r>
+    </w:p>
+    <w:p>
+      <w:pPr>
+        <w:jc w:val="both"/>
+      </w:pPr>
+      <w:r>
+        <w:t>추출·재검토 응답을 분석하자 처음에 맞게 추출한 내용을 재검토가 잘못 바꾸거나 일부 항목만 반환하는 사례가 나타났다. 이에 따라 최초 추출 응답에만 지시 검사를 적용하는 방법을 비교한다. 현재 요청을 모델에 한 번 입력하여 변경 사항을 추출하고, 지시 구절 정규화와 실행 대상 검사를 적용한 뒤 상태를 저장한다. 저장한 여섯 항목으로 이미지 편집 프롬프트를 작성한다.</w:t>
+      </w:r>
+    </w:p>
+    <w:p>
+      <w:pPr>
+        <w:jc w:val="both"/>
+      </w:pPr>
+      <w:r>
+        <w:t>이 방법은 재검토 응답을 사용하지 않으며 요청당 모델을 한 번 호출한다. 추출·재검토 방식에는 두 번이 필요하다. 지시 검사에는 모델 호출과 정답을 사용하지 않는다. 실제 실행 코드에서는 입력 상태 검사, 한 번의 추출, 상태 갱신, 편집 프롬프트 작성을 하나의 절차로 연결하였다.</w:t>
       </w:r>
     </w:p>
     <w:p>
@@ -416,6 +496,14 @@
     </w:p>
     <w:p>
       <w:pPr>
+        <w:jc w:val="both"/>
+      </w:pPr>
+      <w:r>
+        <w:t>개선 후에는 기존 사례 963개와 새 복원·유지 조합 360개, 총 1323개를 최종 지시 검사에 적용하여 예상 상태와 입력 상태 보존을 확인하였다. 실제 실행 절차도 저장한 최초 응답으로 다시 검사하여, 한 번의 추출과 상태 갱신 및 프롬프트 작성이 실험 구현과 같은 결과를 내는지 확인하였다.</w:t>
+      </w:r>
+    </w:p>
+    <w:p>
+      <w:pPr>
         <w:pStyle w:val="Heading2"/>
       </w:pPr>
       <w:r>
@@ -516,6 +604,86 @@
       </w:pPr>
       <w:r>
         <w:t>요청과 정답은 추론 전에 확정하고 모든 결과를 집계하였다. 네 가지 편집 목표를 표현 유형별로 반복하므로 같은 초기 설정과 후속 요청이 포함된다. 서로 다른 요청 문장은 32개다. 표현을 달리한 두 번째와 세 번째 요청의 정확도를 따로 제시한다. 정답은 명시한 항목별 변경을 누적하여 계산하였다. 이 자료도 연구자가 구성한 합성 영어 대화다.</w:t>
+      </w:r>
+    </w:p>
+    <w:p>
+      <w:pPr>
+        <w:pStyle w:val="Heading2"/>
+      </w:pPr>
+      <w:r>
+        <w:t>8. 두 모델에서의 새 요청 검증</w:t>
+      </w:r>
+    </w:p>
+    <w:p>
+      <w:pPr>
+        <w:jc w:val="both"/>
+      </w:pPr>
+      <w:r>
+        <w:t>개선 정규화의 구현을 고정한 뒤 새로운 대화 8개, 요청 32개로 검증하였다. 복원 표현, 변경과 복원의 혼합, 앞 지시의 수정, 부정·조건·인용의 네 유형마다 대화 두 개를 작성하였다. 문장 32개는 모두 서로 다르며 앞선 개발 자료의 문장과 겹치지 않는다. 각 대화에는 요청 네 개가 포함된다. 조건부로 나중에 수행하라고 한 지시와 인용문은 현재 상태의 변경으로 계산하지 않는다. 정답은 요청에 명시한 변경을 누적하여 계산하고 채점에만 사용하였다.</w:t>
+      </w:r>
+    </w:p>
+    <w:p>
+      <w:pPr>
+        <w:jc w:val="both"/>
+      </w:pPr>
+      <w:r>
+        <w:t>같은 요청을 Qwen3-4B와 Llama-3.2-3B-Instruct[9]의 4비트 양자화 모델에 각각 입력하였다. 두 모델은 온도 0, 최대 출력 260토큰, 같은 지시문과 예시 일곱 개를 사용하였다. 모델마다 요청 32개에 추출·재검토를 각각 한 번 수행하여 실제 호출 64회와 원문 응답을 저장하였다. 총 호출은 128회이며 모델별 결과를 따로 집계한다. 모델별로 같은 응답 기록을 사용하되 최초 응답 조건은 첫 응답만 적용한다.</w:t>
+      </w:r>
+    </w:p>
+    <w:p>
+      <w:pPr>
+        <w:jc w:val="both"/>
+      </w:pPr>
+      <w:r>
+        <w:t>기존 다섯 방법에 개선 정규화와 JSON 최초 응답·재검토 우선 방식을 더한 여덟 방법을 비교하였다. 코드·요청·정답·모델 배포 버전은 추론 전에 확정하였다. 전체 상태·항목별·최종 상태 일치율, 기준이 맞았으나 새로 틀린 요청 수, 유형별 결과를 집계하였다. 이 자료는 AI를 이용해 작성한 합성 영어 대화다.</w:t>
+      </w:r>
+    </w:p>
+    <w:p>
+      <w:pPr>
+        <w:pStyle w:val="Heading2"/>
+      </w:pPr>
+      <w:r>
+        <w:t>9. 실행 대상 검사의 새 요청 검증</w:t>
+      </w:r>
+    </w:p>
+    <w:p>
+      <w:pPr>
+        <w:jc w:val="both"/>
+      </w:pPr>
+      <w:r>
+        <w:t>앞선 32개 요청을 실행 대상 검사 개발에 사용한 뒤, 겹치지 않는 새 대화 네 개, 요청 16개를 확정하였다. 첫 두 대화는 실행하지 않을 지시와 다른 항목의 직접 변경을 함께 요청한다. 나머지 두 대화는 앞선 부정·조건·인용 표현 뒤에서 같은 항목의 직접 변경을 요청한다. 이를 통해 잘못된 변경을 막으면서 뒤의 실제 변경도 적용하는지 확인한다.</w:t>
+      </w:r>
+    </w:p>
+    <w:p>
+      <w:pPr>
+        <w:jc w:val="both"/>
+      </w:pPr>
+      <w:r>
+        <w:t>두 모델과 추출·재검토 설정은 앞선 검증과 같다. 모델별 실제 호출은 32회, 전체 64회다. 기존 여덟 방법에 실행 대상 검사 결합을 추가하여 비교한다. 코드·요청·정답을 추론 전에 고정하고 결과를 모델별로 집계하였다.</w:t>
+      </w:r>
+    </w:p>
+    <w:p>
+      <w:pPr>
+        <w:pStyle w:val="Heading2"/>
+      </w:pPr>
+      <w:r>
+        <w:t>10. 한 번 추출하는 방법의 새 요청 검증</w:t>
+      </w:r>
+    </w:p>
+    <w:p>
+      <w:pPr>
+        <w:jc w:val="both"/>
+      </w:pPr>
+      <w:r>
+        <w:t>32개 개발 자료에서 첫 응답만 사용한 결과와 추출·재검토 응답을 사용한 결과를 비교한 뒤, 새 대화 세 개, 요청 12개를 작성하였다. 이 문장들은 모두 서로 다르며 앞선 개발·검증 요청과 겹치지 않는다. 복원과 유지, 삭제와 부정, 조건문과 인용문, 뒤의 직접 지시를 함께 포함한다. 후처리 구현과 어휘는 수정하지 않는다.</w:t>
+      </w:r>
+    </w:p>
+    <w:p>
+      <w:pPr>
+        <w:jc w:val="both"/>
+      </w:pPr>
+      <w:r>
+        <w:t>자료와 방법을 추론 전에 고정하고 두 모델에 같은 요청을 입력하였다. 전체 비교를 위해 추출·재검토를 기록하여 모델별 24회, 전체 48회 호출하였다. 한 번 추출하는 조건의 점수는 첫 응답만으로 계산한다. 최초 응답을 단순 JSON으로 적용하는 조건과는 같은 호출 수에서 비교하고, 재검토를 사용하는 조건과는 정확도와 요청당 호출 횟수를 함께 비교한다. 호출 횟수는 알고리즘 실행에 필요한 횟수이며 처리 시간이나 금액을 측정한 값과 구분한다.</w:t>
       </w:r>
     </w:p>
     <w:p>
@@ -1229,7 +1397,7 @@
         <w:jc w:val="both"/>
       </w:pPr>
       <w:r>
-        <w:t>두 규칙을 결합했을 때 모든 항목이 정답과 일치한 요청은 기준보다 2회 많아 사전 채택 조건을 충족하였다. 일치한 요청 수는 유지 규칙만 적용한 경우보다 2회, 삭제 규칙만 적용한 경우보다 1회 많았다. 방법 간 차이는 세 번째 대화의 세 번째 요청과 네 번째 요청에서 발생하였다. 일곱 번째 대화에서는 모든 방법이 4회 요청 중 1회에서 전체 항목을 맞혔으며, 나머지 여섯 대화에서는 네 방법 모두 4회 요청 전체에서 모든 항목을 맞혔다.</w:t>
+        <w:t>결합 방법은 기준보다 요청 두 개, 유지 규칙만 적용한 방법보다 두 개, 삭제 규칙만 적용한 방법보다 한 개를 더 맞혀 사전 채택 조건을 충족하였다. 차이는 세 번째 대화의 세 번째와 네 번째 요청에서 발생하였다. 일곱 번째 대화에서는 모든 방법이 요청 네 개 중 한 개를 맞혔고, 나머지 여섯 대화는 모든 요청을 맞혔다.</w:t>
       </w:r>
     </w:p>
     <w:p>
@@ -1245,15 +1413,7 @@
         <w:jc w:val="both"/>
       </w:pPr>
       <w:r>
-        <w:t>규칙 비교 실험의 세 번째 대화에서는 세 번째 요청에 식물을 삭제하고 재킷은 유지하도록 요청하였다. 기준 방법과 유지 규칙만 적용한 방법의 상태 기록에는 식물이 남았고, 삭제 규칙은 소품 값을 ‘없음’으로 바꾸었다. 이어진 네 번째 요청에서는 상의와 목걸이를 원본으로 돌리되 재킷과 연한 파란색 배경은 그대로 두도록 요청하였다. 기준 방법과 삭제 규칙만 적용한 방법은 배경도 원본으로 바꾸었다. 유지 규칙만 적용한 상태 기록에는 연한 파란색 배경과 앞선 요청의 식물이 함께 남았다.</w:t>
-      </w:r>
-    </w:p>
-    <w:p>
-      <w:pPr>
-        <w:jc w:val="both"/>
-      </w:pPr>
-      <w:r>
-        <w:t>삭제 규칙은 식물 삭제 누락을, 유지 규칙은 배경 변경 오류를 각각 방지하였다. 두 규칙을 결합한 경우에만 두 요청의 여섯 항목이 모두 정답과 일치하였다.</w:t>
+        <w:t>세 번째 대화의 세 번째 요청은 식물을 삭제하고 재킷을 유지하는 것이었다. 기준과 유지 규칙만 적용한 방법은 식물을 남겼으며, 삭제 규칙은 소품 값을 ‘없음’으로 바꾸었다. 네 번째 요청은 상의·목걸이를 원본으로 돌리고 재킷·연한 파란색 배경을 유지하는 것이었다. 기준과 삭제 규칙만 적용한 방법은 배경까지 원본으로 바꾸었고, 유지 규칙만 적용한 방법은 앞서 남은 식물을 보존하였다. 두 규칙을 결합한 경우에만 두 요청의 여섯 항목이 모두 정답과 일치하였다.</w:t>
       </w:r>
     </w:p>
     <w:p>
@@ -1269,7 +1429,7 @@
         <w:jc w:val="both"/>
       </w:pPr>
       <w:r>
-        <w:t>항목별 적용은 각 항목의 변경을 개별적으로 검증하여 한 항목의 오류가 다른 유효한 변경까지 취소하는 것을 방지한다. 규칙 비교 실험의 사후 분석에서 이를 유지·삭제 규칙과 결합한 결과, 전체 상태 일치율은 32/32였다. 추가 효과를 재검증하기 위해 새로운 대화 8개, 요청 32회를 구성하였다. 대화와 정답은 추론 전에 확정하였으며, 앞선 사후 분석에 사용한 코드를 수정 없이 적용하였다. 모든 비교 방법에 동일한 추출·재검토 응답 64개를 사용한 결과를 표 2에 제시하였다.</w:t>
+        <w:t>규칙 비교 자료에 항목별 적용과 유지·삭제를 결합한 사후 재계산은 32/32였다. 추론 전에 확정한 새 대화 8개, 요청 32개에 같은 코드를 적용하여 재검증하였다. 모든 방법은 추출·재검토 응답 64개를 공유하였다(표 2).</w:t>
       </w:r>
     </w:p>
     <w:p>
@@ -1994,11 +2154,13 @@
       <w:pPr>
         <w:keepNext/>
         <w:spacing w:line="240" w:lineRule="auto"/>
+        <w:ind w:firstLine="0"/>
+        <w:jc w:val="center"/>
       </w:pPr>
       <w:r>
         <w:drawing>
           <wp:inline xmlns:a="http://schemas.openxmlformats.org/drawingml/2006/main" xmlns:pic="http://schemas.openxmlformats.org/drawingml/2006/picture">
-            <wp:extent cx="6048000" cy="1223879"/>
+            <wp:extent cx="5760000" cy="1165599"/>
             <wp:docPr id="1" name="Picture 1" descr="그림 1 규칙 비교 실험의 세 번째 대화에서 R01의 식물 삭제와 배경 유지"/>
             <wp:cNvGraphicFramePr>
               <a:graphicFrameLocks noChangeAspect="1"/>
@@ -2019,7 +2181,7 @@
                   <pic:spPr>
                     <a:xfrm>
                       <a:off x="0" y="0"/>
-                      <a:ext cx="6048000" cy="1223879"/>
+                      <a:ext cx="5760000" cy="1165599"/>
                     </a:xfrm>
                     <a:prstGeom prst="rect"/>
                   </pic:spPr>
@@ -2033,6 +2195,7 @@
     <w:p>
       <w:pPr>
         <w:pStyle w:val="Caption"/>
+        <w:ind w:firstLine="0"/>
       </w:pPr>
       <w:r>
         <w:t>그림 1 규칙 비교 실험의 세 번째 대화에서 R01의 식물 삭제와 배경 유지</w:t>
@@ -2042,11 +2205,13 @@
       <w:pPr>
         <w:keepNext/>
         <w:spacing w:line="240" w:lineRule="auto"/>
+        <w:ind w:firstLine="0"/>
+        <w:jc w:val="center"/>
       </w:pPr>
       <w:r>
         <w:drawing>
           <wp:inline xmlns:a="http://schemas.openxmlformats.org/drawingml/2006/main" xmlns:pic="http://schemas.openxmlformats.org/drawingml/2006/picture">
-            <wp:extent cx="6048000" cy="2439164"/>
+            <wp:extent cx="5760000" cy="2323013"/>
             <wp:docPr id="2" name="Picture 2" descr="그림 2 R02의 동일한 네 조건 비교"/>
             <wp:cNvGraphicFramePr>
               <a:graphicFrameLocks noChangeAspect="1"/>
@@ -2067,7 +2232,7 @@
                   <pic:spPr>
                     <a:xfrm>
                       <a:off x="0" y="0"/>
-                      <a:ext cx="6048000" cy="2439164"/>
+                      <a:ext cx="5760000" cy="2323013"/>
                     </a:xfrm>
                     <a:prstGeom prst="rect"/>
                   </pic:spPr>
@@ -2081,6 +2246,7 @@
     <w:p>
       <w:pPr>
         <w:pStyle w:val="Caption"/>
+        <w:ind w:firstLine="0"/>
       </w:pPr>
       <w:r>
         <w:t>그림 2 R02의 동일한 네 조건 비교</w:t>
@@ -4190,7 +4356,7 @@
         <w:jc w:val="both"/>
       </w:pPr>
       <w:r>
-        <w:t>복잡한 후처리를 생략해도 같은 결과를 얻을 수 있는지 확인하기 위해 단순 JSON 적용 방법과 비교하였다. 항목과 값의 형식만 검사하고 요청의 어휘를 확인하는 규칙이나 유지·복원 규칙을 사용하지 않았다. 최초 응답만 적용하면 10/16, 유효한 재검토 응답을 우선 적용하면 9/16이었다. 이 비교에는 기존 실험에서 저장한 전체 응답을 사용하였다. 최초 응답 방식은 첫 응답만 사용하고, 재검토 방식과 제안 방법은 추출·재검토 응답을 모두 사용한다.</w:t>
+        <w:t>복잡한 후처리를 생략해도 같은 결과를 얻을 수 있는지 확인하기 위해 단순 JSON 적용 방법과 비교하였다. 항목과 값의 형식만 검사하고 요청의 어휘를 확인하는 규칙이나 유지·복원 규칙을 사용하지 않았다. 최초 응답만 적용하면 10/16, 유효한 재검토 응답을 우선 적용하면 9/16이었다. 이 비교에는 기존 실험에서 저장한 전체 응답을 사용하였다. 최초 응답 방식은 첫 응답만 사용하고, 재검토 방식과 당시 정규화 방법은 추출·재검토 응답을 모두 사용한다.</w:t>
       </w:r>
     </w:p>
     <w:p>
@@ -5608,7 +5774,7 @@
         <w:jc w:val="both"/>
       </w:pPr>
       <w:r>
-        <w:t>단순 JSON 적용을 추가로 재계산하면 최초 응답과 재검토 우선 방식이 모두 28/36이었다. 정규화는 두 단순 방식보다 여덟 요청을 더 맞혔다. 요청 문장은 서로 다른 18개이며, 같은 초기 설정과 후속 요청을 반복 호출한 응답 쌍은 모두 같았다. 이 실험은 세 가지 편집 목표를 네 가지 문장 구조로 요청한 비교이며, 같은 설정 요청과 후속 요청이 반복된다.</w:t>
+        <w:t>단순 JSON 적용을 추가로 재계산하면 최초 응답과 재검토 우선 방식이 모두 28/36이었다. 정규화는 두 단순 방식보다 여덟 요청을 더 맞혔다. 요청 문장은 서로 다른 18개이며, 같은 초기 설정과 후속 요청을 반복 호출한 응답 쌍은 모두 같았다.</w:t>
       </w:r>
     </w:p>
     <w:p>
@@ -5624,7 +5790,7 @@
         <w:jc w:val="both"/>
       </w:pPr>
       <w:r>
-        <w:t>추가 요청 48개에서 전체 상태 일치율은 기준 24/48, 기존 유지·삭제 27/48, 구절 정규화 36/48이었다. 항목별 적용은 27/48, 정규화와 결합하면 36/48였으며, JSON 최초 응답과 재검토 우선 방식은 모두 15/48이었다. 정규화의 항목별 일치율은 264/288, 최종 상태 일치율은 8/12였고 기준이 맞았던 요청을 새로 틀린 경우는 0개였다.</w:t>
+        <w:t>추가 요청 48개에서 전체 상태 일치율은 기준 24/48, 기존 유지·삭제 27/48, 구절 정규화 36/48이었다. 항목별 적용은 27/48, 정규화와 결합하면 36/48이었으며, JSON 최초 응답과 재검토 우선 방식은 모두 15/48이었다. 정규화의 항목별 일치율은 264/288, 최종 상태 일치율은 8/12였고 기준이 맞았던 요청을 새로 틀린 경우는 0개였다.</w:t>
       </w:r>
     </w:p>
     <w:p>
@@ -6210,6 +6376,1837 @@
     </w:p>
     <w:p>
       <w:pPr>
+        <w:pStyle w:val="Heading2"/>
+      </w:pPr>
+      <w:r>
+        <w:t>10. 복원 표현 개선의 두 모델 검증</w:t>
+      </w:r>
+    </w:p>
+    <w:p>
+      <w:pPr>
+        <w:jc w:val="both"/>
+      </w:pPr>
+      <w:r>
+        <w:t>앞선 48개 요청을 개발 자료로 사용하여 재계산한 결과, 기존 정규화 36/48에서 복원 표현 개선 48/48로 증가하였다. 구현을 고정한 뒤 새로운 요청 32개를 두 모델에 각각 적용한 결과를 표 10에 제시하였다.</w:t>
+      </w:r>
+    </w:p>
+    <w:p>
+      <w:pPr>
+        <w:pStyle w:val="Caption"/>
+        <w:keepNext/>
+        <w:spacing w:before="100"/>
+        <w:ind w:firstLine="0"/>
+        <w:jc w:val="center"/>
+      </w:pPr>
+      <w:r>
+        <w:t>표 10. 복원 표현 개선의 모델별 전체 상태 일치율</w:t>
+      </w:r>
+    </w:p>
+    <w:tbl>
+      <w:tblPr>
+        <w:tblW w:type="auto" w:w="0"/>
+        <w:tblLayout w:type="fixed"/>
+        <w:tblLook w:firstColumn="1" w:firstRow="1" w:lastColumn="0" w:lastRow="0" w:noHBand="0" w:noVBand="1" w:val="04A0"/>
+      </w:tblPr>
+      <w:tblGrid>
+        <w:gridCol w:w="1417"/>
+        <w:gridCol w:w="1602"/>
+        <w:gridCol w:w="1602"/>
+      </w:tblGrid>
+      <w:tr>
+        <w:trPr>
+          <w:cantSplit/>
+          <w:tblHeader/>
+        </w:trPr>
+        <w:tc>
+          <w:tcPr>
+            <w:tcW w:type="dxa" w:w="1417"/>
+            <w:tcMar>
+              <w:left w:w="45" w:type="dxa"/>
+              <w:right w:w="45" w:type="dxa"/>
+            </w:tcMar>
+            <w:tcBorders>
+              <w:bottom w:val="single" w:sz="5"/>
+            </w:tcBorders>
+          </w:tcPr>
+          <w:p>
+            <w:pPr>
+              <w:keepNext/>
+              <w:spacing w:after="60" w:before="60" w:line="240" w:lineRule="auto"/>
+              <w:ind w:firstLine="0"/>
+              <w:jc w:val="left"/>
+            </w:pPr>
+            <w:r>
+              <w:rPr>
+                <w:b/>
+                <w:sz w:val="16"/>
+              </w:rPr>
+              <w:t>방법</w:t>
+            </w:r>
+          </w:p>
+        </w:tc>
+        <w:tc>
+          <w:tcPr>
+            <w:tcW w:type="dxa" w:w="1602"/>
+            <w:tcMar>
+              <w:left w:w="45" w:type="dxa"/>
+              <w:right w:w="45" w:type="dxa"/>
+            </w:tcMar>
+            <w:tcBorders>
+              <w:bottom w:val="single" w:sz="5"/>
+            </w:tcBorders>
+          </w:tcPr>
+          <w:p>
+            <w:pPr>
+              <w:keepNext/>
+              <w:spacing w:after="60" w:before="60" w:line="240" w:lineRule="auto"/>
+              <w:ind w:firstLine="0"/>
+              <w:jc w:val="center"/>
+            </w:pPr>
+            <w:r>
+              <w:rPr>
+                <w:b/>
+                <w:sz w:val="16"/>
+              </w:rPr>
+              <w:t>Qwen3-4B</w:t>
+            </w:r>
+          </w:p>
+        </w:tc>
+        <w:tc>
+          <w:tcPr>
+            <w:tcW w:type="dxa" w:w="1602"/>
+            <w:tcMar>
+              <w:left w:w="45" w:type="dxa"/>
+              <w:right w:w="45" w:type="dxa"/>
+            </w:tcMar>
+            <w:tcBorders>
+              <w:bottom w:val="single" w:sz="5"/>
+            </w:tcBorders>
+          </w:tcPr>
+          <w:p>
+            <w:pPr>
+              <w:keepNext/>
+              <w:spacing w:after="60" w:before="60" w:line="240" w:lineRule="auto"/>
+              <w:ind w:firstLine="0"/>
+              <w:jc w:val="center"/>
+            </w:pPr>
+            <w:r>
+              <w:rPr>
+                <w:b/>
+                <w:sz w:val="16"/>
+              </w:rPr>
+              <w:t>Llama-3.2-3B</w:t>
+            </w:r>
+          </w:p>
+        </w:tc>
+      </w:tr>
+      <w:tr>
+        <w:trPr>
+          <w:cantSplit/>
+        </w:trPr>
+        <w:tc>
+          <w:tcPr>
+            <w:tcW w:type="dxa" w:w="1417"/>
+            <w:tcMar>
+              <w:left w:w="45" w:type="dxa"/>
+              <w:right w:w="45" w:type="dxa"/>
+            </w:tcMar>
+          </w:tcPr>
+          <w:p>
+            <w:pPr>
+              <w:keepNext/>
+              <w:spacing w:after="60" w:before="60" w:line="240" w:lineRule="auto"/>
+              <w:ind w:firstLine="0"/>
+              <w:jc w:val="left"/>
+            </w:pPr>
+            <w:r>
+              <w:rPr>
+                <w:b w:val="0"/>
+                <w:sz w:val="16"/>
+              </w:rPr>
+              <w:t>기준 방법</w:t>
+            </w:r>
+          </w:p>
+        </w:tc>
+        <w:tc>
+          <w:tcPr>
+            <w:tcW w:type="dxa" w:w="1602"/>
+            <w:tcMar>
+              <w:left w:w="45" w:type="dxa"/>
+              <w:right w:w="45" w:type="dxa"/>
+            </w:tcMar>
+          </w:tcPr>
+          <w:p>
+            <w:pPr>
+              <w:keepNext/>
+              <w:spacing w:after="60" w:before="60" w:line="240" w:lineRule="auto"/>
+              <w:ind w:firstLine="0"/>
+              <w:jc w:val="center"/>
+            </w:pPr>
+            <w:r>
+              <w:rPr>
+                <w:b w:val="0"/>
+                <w:sz w:val="16"/>
+              </w:rPr>
+              <w:t>14/32</w:t>
+            </w:r>
+          </w:p>
+        </w:tc>
+        <w:tc>
+          <w:tcPr>
+            <w:tcW w:type="dxa" w:w="1602"/>
+            <w:tcMar>
+              <w:left w:w="45" w:type="dxa"/>
+              <w:right w:w="45" w:type="dxa"/>
+            </w:tcMar>
+          </w:tcPr>
+          <w:p>
+            <w:pPr>
+              <w:keepNext/>
+              <w:spacing w:after="60" w:before="60" w:line="240" w:lineRule="auto"/>
+              <w:ind w:firstLine="0"/>
+              <w:jc w:val="center"/>
+            </w:pPr>
+            <w:r>
+              <w:rPr>
+                <w:b w:val="0"/>
+                <w:sz w:val="16"/>
+              </w:rPr>
+              <w:t>7/32</w:t>
+            </w:r>
+          </w:p>
+        </w:tc>
+      </w:tr>
+      <w:tr>
+        <w:trPr>
+          <w:cantSplit/>
+        </w:trPr>
+        <w:tc>
+          <w:tcPr>
+            <w:tcW w:type="dxa" w:w="1417"/>
+            <w:tcMar>
+              <w:left w:w="45" w:type="dxa"/>
+              <w:right w:w="45" w:type="dxa"/>
+            </w:tcMar>
+          </w:tcPr>
+          <w:p>
+            <w:pPr>
+              <w:keepNext/>
+              <w:spacing w:after="60" w:before="60" w:line="240" w:lineRule="auto"/>
+              <w:ind w:firstLine="0"/>
+              <w:jc w:val="left"/>
+            </w:pPr>
+            <w:r>
+              <w:rPr>
+                <w:b w:val="0"/>
+                <w:sz w:val="16"/>
+              </w:rPr>
+              <w:t>기존 유지·삭제</w:t>
+            </w:r>
+          </w:p>
+        </w:tc>
+        <w:tc>
+          <w:tcPr>
+            <w:tcW w:type="dxa" w:w="1602"/>
+            <w:tcMar>
+              <w:left w:w="45" w:type="dxa"/>
+              <w:right w:w="45" w:type="dxa"/>
+            </w:tcMar>
+          </w:tcPr>
+          <w:p>
+            <w:pPr>
+              <w:keepNext/>
+              <w:spacing w:after="60" w:before="60" w:line="240" w:lineRule="auto"/>
+              <w:ind w:firstLine="0"/>
+              <w:jc w:val="center"/>
+            </w:pPr>
+            <w:r>
+              <w:rPr>
+                <w:b w:val="0"/>
+                <w:sz w:val="16"/>
+              </w:rPr>
+              <w:t>14/32</w:t>
+            </w:r>
+          </w:p>
+        </w:tc>
+        <w:tc>
+          <w:tcPr>
+            <w:tcW w:type="dxa" w:w="1602"/>
+            <w:tcMar>
+              <w:left w:w="45" w:type="dxa"/>
+              <w:right w:w="45" w:type="dxa"/>
+            </w:tcMar>
+          </w:tcPr>
+          <w:p>
+            <w:pPr>
+              <w:keepNext/>
+              <w:spacing w:after="60" w:before="60" w:line="240" w:lineRule="auto"/>
+              <w:ind w:firstLine="0"/>
+              <w:jc w:val="center"/>
+            </w:pPr>
+            <w:r>
+              <w:rPr>
+                <w:b w:val="0"/>
+                <w:sz w:val="16"/>
+              </w:rPr>
+              <w:t>7/32</w:t>
+            </w:r>
+          </w:p>
+        </w:tc>
+      </w:tr>
+      <w:tr>
+        <w:trPr>
+          <w:cantSplit/>
+        </w:trPr>
+        <w:tc>
+          <w:tcPr>
+            <w:tcW w:type="dxa" w:w="1417"/>
+            <w:tcMar>
+              <w:left w:w="45" w:type="dxa"/>
+              <w:right w:w="45" w:type="dxa"/>
+            </w:tcMar>
+          </w:tcPr>
+          <w:p>
+            <w:pPr>
+              <w:keepNext/>
+              <w:spacing w:after="60" w:before="60" w:line="240" w:lineRule="auto"/>
+              <w:ind w:firstLine="0"/>
+              <w:jc w:val="left"/>
+            </w:pPr>
+            <w:r>
+              <w:rPr>
+                <w:b w:val="0"/>
+                <w:sz w:val="16"/>
+              </w:rPr>
+              <w:t>기존 정규화</w:t>
+            </w:r>
+          </w:p>
+        </w:tc>
+        <w:tc>
+          <w:tcPr>
+            <w:tcW w:type="dxa" w:w="1602"/>
+            <w:tcMar>
+              <w:left w:w="45" w:type="dxa"/>
+              <w:right w:w="45" w:type="dxa"/>
+            </w:tcMar>
+          </w:tcPr>
+          <w:p>
+            <w:pPr>
+              <w:keepNext/>
+              <w:spacing w:after="60" w:before="60" w:line="240" w:lineRule="auto"/>
+              <w:ind w:firstLine="0"/>
+              <w:jc w:val="center"/>
+            </w:pPr>
+            <w:r>
+              <w:rPr>
+                <w:b w:val="0"/>
+                <w:sz w:val="16"/>
+              </w:rPr>
+              <w:t>17/32</w:t>
+            </w:r>
+          </w:p>
+        </w:tc>
+        <w:tc>
+          <w:tcPr>
+            <w:tcW w:type="dxa" w:w="1602"/>
+            <w:tcMar>
+              <w:left w:w="45" w:type="dxa"/>
+              <w:right w:w="45" w:type="dxa"/>
+            </w:tcMar>
+          </w:tcPr>
+          <w:p>
+            <w:pPr>
+              <w:keepNext/>
+              <w:spacing w:after="60" w:before="60" w:line="240" w:lineRule="auto"/>
+              <w:ind w:firstLine="0"/>
+              <w:jc w:val="center"/>
+            </w:pPr>
+            <w:r>
+              <w:rPr>
+                <w:b w:val="0"/>
+                <w:sz w:val="16"/>
+              </w:rPr>
+              <w:t>9/32</w:t>
+            </w:r>
+          </w:p>
+        </w:tc>
+      </w:tr>
+      <w:tr>
+        <w:trPr>
+          <w:cantSplit/>
+        </w:trPr>
+        <w:tc>
+          <w:tcPr>
+            <w:tcW w:type="dxa" w:w="1417"/>
+            <w:tcMar>
+              <w:left w:w="45" w:type="dxa"/>
+              <w:right w:w="45" w:type="dxa"/>
+            </w:tcMar>
+          </w:tcPr>
+          <w:p>
+            <w:pPr>
+              <w:keepNext/>
+              <w:spacing w:after="60" w:before="60" w:line="240" w:lineRule="auto"/>
+              <w:ind w:firstLine="0"/>
+              <w:jc w:val="left"/>
+            </w:pPr>
+            <w:r>
+              <w:rPr>
+                <w:b w:val="0"/>
+                <w:sz w:val="16"/>
+              </w:rPr>
+              <w:t>항목별 적용</w:t>
+            </w:r>
+          </w:p>
+        </w:tc>
+        <w:tc>
+          <w:tcPr>
+            <w:tcW w:type="dxa" w:w="1602"/>
+            <w:tcMar>
+              <w:left w:w="45" w:type="dxa"/>
+              <w:right w:w="45" w:type="dxa"/>
+            </w:tcMar>
+          </w:tcPr>
+          <w:p>
+            <w:pPr>
+              <w:keepNext/>
+              <w:spacing w:after="60" w:before="60" w:line="240" w:lineRule="auto"/>
+              <w:ind w:firstLine="0"/>
+              <w:jc w:val="center"/>
+            </w:pPr>
+            <w:r>
+              <w:rPr>
+                <w:b w:val="0"/>
+                <w:sz w:val="16"/>
+              </w:rPr>
+              <w:t>14/32</w:t>
+            </w:r>
+          </w:p>
+        </w:tc>
+        <w:tc>
+          <w:tcPr>
+            <w:tcW w:type="dxa" w:w="1602"/>
+            <w:tcMar>
+              <w:left w:w="45" w:type="dxa"/>
+              <w:right w:w="45" w:type="dxa"/>
+            </w:tcMar>
+          </w:tcPr>
+          <w:p>
+            <w:pPr>
+              <w:keepNext/>
+              <w:spacing w:after="60" w:before="60" w:line="240" w:lineRule="auto"/>
+              <w:ind w:firstLine="0"/>
+              <w:jc w:val="center"/>
+            </w:pPr>
+            <w:r>
+              <w:rPr>
+                <w:b w:val="0"/>
+                <w:sz w:val="16"/>
+              </w:rPr>
+              <w:t>6/32</w:t>
+            </w:r>
+          </w:p>
+        </w:tc>
+      </w:tr>
+      <w:tr>
+        <w:trPr>
+          <w:cantSplit/>
+        </w:trPr>
+        <w:tc>
+          <w:tcPr>
+            <w:tcW w:type="dxa" w:w="1417"/>
+            <w:tcMar>
+              <w:left w:w="45" w:type="dxa"/>
+              <w:right w:w="45" w:type="dxa"/>
+            </w:tcMar>
+          </w:tcPr>
+          <w:p>
+            <w:pPr>
+              <w:keepNext/>
+              <w:spacing w:after="60" w:before="60" w:line="240" w:lineRule="auto"/>
+              <w:ind w:firstLine="0"/>
+              <w:jc w:val="left"/>
+            </w:pPr>
+            <w:r>
+              <w:rPr>
+                <w:b w:val="0"/>
+                <w:sz w:val="16"/>
+              </w:rPr>
+              <w:t>기존 정규화+항목별 적용</w:t>
+            </w:r>
+          </w:p>
+        </w:tc>
+        <w:tc>
+          <w:tcPr>
+            <w:tcW w:type="dxa" w:w="1602"/>
+            <w:tcMar>
+              <w:left w:w="45" w:type="dxa"/>
+              <w:right w:w="45" w:type="dxa"/>
+            </w:tcMar>
+          </w:tcPr>
+          <w:p>
+            <w:pPr>
+              <w:keepNext/>
+              <w:spacing w:after="60" w:before="60" w:line="240" w:lineRule="auto"/>
+              <w:ind w:firstLine="0"/>
+              <w:jc w:val="center"/>
+            </w:pPr>
+            <w:r>
+              <w:rPr>
+                <w:b w:val="0"/>
+                <w:sz w:val="16"/>
+              </w:rPr>
+              <w:t>17/32</w:t>
+            </w:r>
+          </w:p>
+        </w:tc>
+        <w:tc>
+          <w:tcPr>
+            <w:tcW w:type="dxa" w:w="1602"/>
+            <w:tcMar>
+              <w:left w:w="45" w:type="dxa"/>
+              <w:right w:w="45" w:type="dxa"/>
+            </w:tcMar>
+          </w:tcPr>
+          <w:p>
+            <w:pPr>
+              <w:keepNext/>
+              <w:spacing w:after="60" w:before="60" w:line="240" w:lineRule="auto"/>
+              <w:ind w:firstLine="0"/>
+              <w:jc w:val="center"/>
+            </w:pPr>
+            <w:r>
+              <w:rPr>
+                <w:b w:val="0"/>
+                <w:sz w:val="16"/>
+              </w:rPr>
+              <w:t>8/32</w:t>
+            </w:r>
+          </w:p>
+        </w:tc>
+      </w:tr>
+      <w:tr>
+        <w:trPr>
+          <w:cantSplit/>
+        </w:trPr>
+        <w:tc>
+          <w:tcPr>
+            <w:tcW w:type="dxa" w:w="1417"/>
+            <w:tcMar>
+              <w:left w:w="45" w:type="dxa"/>
+              <w:right w:w="45" w:type="dxa"/>
+            </w:tcMar>
+          </w:tcPr>
+          <w:p>
+            <w:pPr>
+              <w:keepNext/>
+              <w:spacing w:after="60" w:before="60" w:line="240" w:lineRule="auto"/>
+              <w:ind w:firstLine="0"/>
+              <w:jc w:val="left"/>
+            </w:pPr>
+            <w:r>
+              <w:rPr>
+                <w:b w:val="0"/>
+                <w:sz w:val="16"/>
+              </w:rPr>
+              <w:t>개선 정규화</w:t>
+            </w:r>
+          </w:p>
+        </w:tc>
+        <w:tc>
+          <w:tcPr>
+            <w:tcW w:type="dxa" w:w="1602"/>
+            <w:tcMar>
+              <w:left w:w="45" w:type="dxa"/>
+              <w:right w:w="45" w:type="dxa"/>
+            </w:tcMar>
+          </w:tcPr>
+          <w:p>
+            <w:pPr>
+              <w:keepNext/>
+              <w:spacing w:after="60" w:before="60" w:line="240" w:lineRule="auto"/>
+              <w:ind w:firstLine="0"/>
+              <w:jc w:val="center"/>
+            </w:pPr>
+            <w:r>
+              <w:rPr>
+                <w:b w:val="0"/>
+                <w:sz w:val="16"/>
+              </w:rPr>
+              <w:t>28/32</w:t>
+            </w:r>
+          </w:p>
+        </w:tc>
+        <w:tc>
+          <w:tcPr>
+            <w:tcW w:type="dxa" w:w="1602"/>
+            <w:tcMar>
+              <w:left w:w="45" w:type="dxa"/>
+              <w:right w:w="45" w:type="dxa"/>
+            </w:tcMar>
+          </w:tcPr>
+          <w:p>
+            <w:pPr>
+              <w:keepNext/>
+              <w:spacing w:after="60" w:before="60" w:line="240" w:lineRule="auto"/>
+              <w:ind w:firstLine="0"/>
+              <w:jc w:val="center"/>
+            </w:pPr>
+            <w:r>
+              <w:rPr>
+                <w:b w:val="0"/>
+                <w:sz w:val="16"/>
+              </w:rPr>
+              <w:t>17/32</w:t>
+            </w:r>
+          </w:p>
+        </w:tc>
+      </w:tr>
+      <w:tr>
+        <w:trPr>
+          <w:cantSplit/>
+        </w:trPr>
+        <w:tc>
+          <w:tcPr>
+            <w:tcW w:type="dxa" w:w="1417"/>
+            <w:tcMar>
+              <w:left w:w="45" w:type="dxa"/>
+              <w:right w:w="45" w:type="dxa"/>
+            </w:tcMar>
+          </w:tcPr>
+          <w:p>
+            <w:pPr>
+              <w:keepNext/>
+              <w:spacing w:after="60" w:before="60" w:line="240" w:lineRule="auto"/>
+              <w:ind w:firstLine="0"/>
+              <w:jc w:val="left"/>
+            </w:pPr>
+            <w:r>
+              <w:rPr>
+                <w:b w:val="0"/>
+                <w:sz w:val="16"/>
+              </w:rPr>
+              <w:t>JSON 최초 응답</w:t>
+            </w:r>
+          </w:p>
+        </w:tc>
+        <w:tc>
+          <w:tcPr>
+            <w:tcW w:type="dxa" w:w="1602"/>
+            <w:tcMar>
+              <w:left w:w="45" w:type="dxa"/>
+              <w:right w:w="45" w:type="dxa"/>
+            </w:tcMar>
+          </w:tcPr>
+          <w:p>
+            <w:pPr>
+              <w:keepNext/>
+              <w:spacing w:after="60" w:before="60" w:line="240" w:lineRule="auto"/>
+              <w:ind w:firstLine="0"/>
+              <w:jc w:val="center"/>
+            </w:pPr>
+            <w:r>
+              <w:rPr>
+                <w:b w:val="0"/>
+                <w:sz w:val="16"/>
+              </w:rPr>
+              <w:t>16/32</w:t>
+            </w:r>
+          </w:p>
+        </w:tc>
+        <w:tc>
+          <w:tcPr>
+            <w:tcW w:type="dxa" w:w="1602"/>
+            <w:tcMar>
+              <w:left w:w="45" w:type="dxa"/>
+              <w:right w:w="45" w:type="dxa"/>
+            </w:tcMar>
+          </w:tcPr>
+          <w:p>
+            <w:pPr>
+              <w:keepNext/>
+              <w:spacing w:after="60" w:before="60" w:line="240" w:lineRule="auto"/>
+              <w:ind w:firstLine="0"/>
+              <w:jc w:val="center"/>
+            </w:pPr>
+            <w:r>
+              <w:rPr>
+                <w:b w:val="0"/>
+                <w:sz w:val="16"/>
+              </w:rPr>
+              <w:t>7/32</w:t>
+            </w:r>
+          </w:p>
+        </w:tc>
+      </w:tr>
+      <w:tr>
+        <w:trPr>
+          <w:cantSplit/>
+        </w:trPr>
+        <w:tc>
+          <w:tcPr>
+            <w:tcW w:type="dxa" w:w="1417"/>
+            <w:tcMar>
+              <w:left w:w="45" w:type="dxa"/>
+              <w:right w:w="45" w:type="dxa"/>
+            </w:tcMar>
+            <w:tcBorders>
+              <w:bottom w:val="single" w:sz="5"/>
+            </w:tcBorders>
+          </w:tcPr>
+          <w:p>
+            <w:pPr>
+              <w:keepNext w:val="0"/>
+              <w:spacing w:after="60" w:before="60" w:line="240" w:lineRule="auto"/>
+              <w:ind w:firstLine="0"/>
+              <w:jc w:val="left"/>
+            </w:pPr>
+            <w:r>
+              <w:rPr>
+                <w:b w:val="0"/>
+                <w:sz w:val="16"/>
+              </w:rPr>
+              <w:t>JSON 재검토 우선</w:t>
+            </w:r>
+          </w:p>
+        </w:tc>
+        <w:tc>
+          <w:tcPr>
+            <w:tcW w:type="dxa" w:w="1602"/>
+            <w:tcMar>
+              <w:left w:w="45" w:type="dxa"/>
+              <w:right w:w="45" w:type="dxa"/>
+            </w:tcMar>
+            <w:tcBorders>
+              <w:bottom w:val="single" w:sz="5"/>
+            </w:tcBorders>
+          </w:tcPr>
+          <w:p>
+            <w:pPr>
+              <w:keepNext w:val="0"/>
+              <w:spacing w:after="60" w:before="60" w:line="240" w:lineRule="auto"/>
+              <w:ind w:firstLine="0"/>
+              <w:jc w:val="center"/>
+            </w:pPr>
+            <w:r>
+              <w:rPr>
+                <w:b w:val="0"/>
+                <w:sz w:val="16"/>
+              </w:rPr>
+              <w:t>17/32</w:t>
+            </w:r>
+          </w:p>
+        </w:tc>
+        <w:tc>
+          <w:tcPr>
+            <w:tcW w:type="dxa" w:w="1602"/>
+            <w:tcMar>
+              <w:left w:w="45" w:type="dxa"/>
+              <w:right w:w="45" w:type="dxa"/>
+            </w:tcMar>
+            <w:tcBorders>
+              <w:bottom w:val="single" w:sz="5"/>
+            </w:tcBorders>
+          </w:tcPr>
+          <w:p>
+            <w:pPr>
+              <w:keepNext w:val="0"/>
+              <w:spacing w:after="60" w:before="60" w:line="240" w:lineRule="auto"/>
+              <w:ind w:firstLine="0"/>
+              <w:jc w:val="center"/>
+            </w:pPr>
+            <w:r>
+              <w:rPr>
+                <w:b w:val="0"/>
+                <w:sz w:val="16"/>
+              </w:rPr>
+              <w:t>4/32</w:t>
+            </w:r>
+          </w:p>
+        </w:tc>
+      </w:tr>
+    </w:tbl>
+    <w:p>
+      <w:pPr>
+        <w:jc w:val="both"/>
+      </w:pPr>
+      <w:r>
+        <w:t>복원 표현을 추가한 정규화는 두 모델 모두 기준보다 정확한 요청 수를 늘렸다. Qwen3의 항목별 일치율은 187/192, 최종 상태 일치율은 6/8이었고 Llama는 각각 140/192, 3/8이었다. Qwen3에 남은 오류는 조건부 복원 지시와 캡션 속 삭제 문장을 실제 변경으로 처리한 사례였다. Llama에서는 초기 설정의 재검토 응답이 일부 항목만 반환하여 다른 조건이 누락되는 오류도 나타났다.</w:t>
+      </w:r>
+    </w:p>
+    <w:p>
+      <w:pPr>
+        <w:pStyle w:val="Heading2"/>
+      </w:pPr>
+      <w:r>
+        <w:t>11. 실행 대상 검사의 효과와 재검토 오류</w:t>
+      </w:r>
+    </w:p>
+    <w:p>
+      <w:pPr>
+        <w:jc w:val="both"/>
+      </w:pPr>
+      <w:r>
+        <w:t>위 32개를 개발 자료로 사용하여 실행 대상 검사를 추가한 재계산 결과는 Qwen3 32/32, Llama 19/32였다. 새 요청 16개로 수행한 검증 결과는 표 11과 같다.</w:t>
+      </w:r>
+    </w:p>
+    <w:p>
+      <w:pPr>
+        <w:pStyle w:val="Caption"/>
+        <w:keepNext/>
+        <w:spacing w:before="100"/>
+        <w:ind w:firstLine="0"/>
+        <w:jc w:val="center"/>
+      </w:pPr>
+      <w:r>
+        <w:t>표 11. 실행 대상 검사의 새 요청 검증</w:t>
+      </w:r>
+    </w:p>
+    <w:tbl>
+      <w:tblPr>
+        <w:tblW w:type="auto" w:w="0"/>
+        <w:tblLayout w:type="fixed"/>
+        <w:tblLook w:firstColumn="1" w:firstRow="1" w:lastColumn="0" w:lastRow="0" w:noHBand="0" w:noVBand="1" w:val="04A0"/>
+      </w:tblPr>
+      <w:tblGrid>
+        <w:gridCol w:w="1417"/>
+        <w:gridCol w:w="1602"/>
+        <w:gridCol w:w="1602"/>
+      </w:tblGrid>
+      <w:tr>
+        <w:trPr>
+          <w:cantSplit/>
+          <w:tblHeader/>
+        </w:trPr>
+        <w:tc>
+          <w:tcPr>
+            <w:tcW w:type="dxa" w:w="1417"/>
+            <w:tcMar>
+              <w:left w:w="45" w:type="dxa"/>
+              <w:right w:w="45" w:type="dxa"/>
+            </w:tcMar>
+            <w:tcBorders>
+              <w:bottom w:val="single" w:sz="5"/>
+            </w:tcBorders>
+          </w:tcPr>
+          <w:p>
+            <w:pPr>
+              <w:keepNext/>
+              <w:spacing w:after="60" w:before="60" w:line="240" w:lineRule="auto"/>
+              <w:ind w:firstLine="0"/>
+              <w:jc w:val="left"/>
+            </w:pPr>
+            <w:r>
+              <w:rPr>
+                <w:b/>
+                <w:sz w:val="16"/>
+              </w:rPr>
+              <w:t>방법</w:t>
+            </w:r>
+          </w:p>
+        </w:tc>
+        <w:tc>
+          <w:tcPr>
+            <w:tcW w:type="dxa" w:w="1602"/>
+            <w:tcMar>
+              <w:left w:w="45" w:type="dxa"/>
+              <w:right w:w="45" w:type="dxa"/>
+            </w:tcMar>
+            <w:tcBorders>
+              <w:bottom w:val="single" w:sz="5"/>
+            </w:tcBorders>
+          </w:tcPr>
+          <w:p>
+            <w:pPr>
+              <w:keepNext/>
+              <w:spacing w:after="60" w:before="60" w:line="240" w:lineRule="auto"/>
+              <w:ind w:firstLine="0"/>
+              <w:jc w:val="center"/>
+            </w:pPr>
+            <w:r>
+              <w:rPr>
+                <w:b/>
+                <w:sz w:val="16"/>
+              </w:rPr>
+              <w:t>Qwen3-4B</w:t>
+            </w:r>
+          </w:p>
+        </w:tc>
+        <w:tc>
+          <w:tcPr>
+            <w:tcW w:type="dxa" w:w="1602"/>
+            <w:tcMar>
+              <w:left w:w="45" w:type="dxa"/>
+              <w:right w:w="45" w:type="dxa"/>
+            </w:tcMar>
+            <w:tcBorders>
+              <w:bottom w:val="single" w:sz="5"/>
+            </w:tcBorders>
+          </w:tcPr>
+          <w:p>
+            <w:pPr>
+              <w:keepNext/>
+              <w:spacing w:after="60" w:before="60" w:line="240" w:lineRule="auto"/>
+              <w:ind w:firstLine="0"/>
+              <w:jc w:val="center"/>
+            </w:pPr>
+            <w:r>
+              <w:rPr>
+                <w:b/>
+                <w:sz w:val="16"/>
+              </w:rPr>
+              <w:t>Llama-3.2-3B</w:t>
+            </w:r>
+          </w:p>
+        </w:tc>
+      </w:tr>
+      <w:tr>
+        <w:trPr>
+          <w:cantSplit/>
+        </w:trPr>
+        <w:tc>
+          <w:tcPr>
+            <w:tcW w:type="dxa" w:w="1417"/>
+            <w:tcMar>
+              <w:left w:w="45" w:type="dxa"/>
+              <w:right w:w="45" w:type="dxa"/>
+            </w:tcMar>
+          </w:tcPr>
+          <w:p>
+            <w:pPr>
+              <w:keepNext/>
+              <w:spacing w:after="60" w:before="60" w:line="240" w:lineRule="auto"/>
+              <w:ind w:firstLine="0"/>
+              <w:jc w:val="left"/>
+            </w:pPr>
+            <w:r>
+              <w:rPr>
+                <w:b w:val="0"/>
+                <w:sz w:val="16"/>
+              </w:rPr>
+              <w:t>기준 방법</w:t>
+            </w:r>
+          </w:p>
+        </w:tc>
+        <w:tc>
+          <w:tcPr>
+            <w:tcW w:type="dxa" w:w="1602"/>
+            <w:tcMar>
+              <w:left w:w="45" w:type="dxa"/>
+              <w:right w:w="45" w:type="dxa"/>
+            </w:tcMar>
+          </w:tcPr>
+          <w:p>
+            <w:pPr>
+              <w:keepNext/>
+              <w:spacing w:after="60" w:before="60" w:line="240" w:lineRule="auto"/>
+              <w:ind w:firstLine="0"/>
+              <w:jc w:val="center"/>
+            </w:pPr>
+            <w:r>
+              <w:rPr>
+                <w:b w:val="0"/>
+                <w:sz w:val="16"/>
+              </w:rPr>
+              <w:t>9/16</w:t>
+            </w:r>
+          </w:p>
+        </w:tc>
+        <w:tc>
+          <w:tcPr>
+            <w:tcW w:type="dxa" w:w="1602"/>
+            <w:tcMar>
+              <w:left w:w="45" w:type="dxa"/>
+              <w:right w:w="45" w:type="dxa"/>
+            </w:tcMar>
+          </w:tcPr>
+          <w:p>
+            <w:pPr>
+              <w:keepNext/>
+              <w:spacing w:after="60" w:before="60" w:line="240" w:lineRule="auto"/>
+              <w:ind w:firstLine="0"/>
+              <w:jc w:val="center"/>
+            </w:pPr>
+            <w:r>
+              <w:rPr>
+                <w:b w:val="0"/>
+                <w:sz w:val="16"/>
+              </w:rPr>
+              <w:t>0/16</w:t>
+            </w:r>
+          </w:p>
+        </w:tc>
+      </w:tr>
+      <w:tr>
+        <w:trPr>
+          <w:cantSplit/>
+        </w:trPr>
+        <w:tc>
+          <w:tcPr>
+            <w:tcW w:type="dxa" w:w="1417"/>
+            <w:tcMar>
+              <w:left w:w="45" w:type="dxa"/>
+              <w:right w:w="45" w:type="dxa"/>
+            </w:tcMar>
+          </w:tcPr>
+          <w:p>
+            <w:pPr>
+              <w:keepNext/>
+              <w:spacing w:after="60" w:before="60" w:line="240" w:lineRule="auto"/>
+              <w:ind w:firstLine="0"/>
+              <w:jc w:val="left"/>
+            </w:pPr>
+            <w:r>
+              <w:rPr>
+                <w:b w:val="0"/>
+                <w:sz w:val="16"/>
+              </w:rPr>
+              <w:t>복원 표현 개선</w:t>
+            </w:r>
+          </w:p>
+        </w:tc>
+        <w:tc>
+          <w:tcPr>
+            <w:tcW w:type="dxa" w:w="1602"/>
+            <w:tcMar>
+              <w:left w:w="45" w:type="dxa"/>
+              <w:right w:w="45" w:type="dxa"/>
+            </w:tcMar>
+          </w:tcPr>
+          <w:p>
+            <w:pPr>
+              <w:keepNext/>
+              <w:spacing w:after="60" w:before="60" w:line="240" w:lineRule="auto"/>
+              <w:ind w:firstLine="0"/>
+              <w:jc w:val="center"/>
+            </w:pPr>
+            <w:r>
+              <w:rPr>
+                <w:b w:val="0"/>
+                <w:sz w:val="16"/>
+              </w:rPr>
+              <w:t>11/16</w:t>
+            </w:r>
+          </w:p>
+        </w:tc>
+        <w:tc>
+          <w:tcPr>
+            <w:tcW w:type="dxa" w:w="1602"/>
+            <w:tcMar>
+              <w:left w:w="45" w:type="dxa"/>
+              <w:right w:w="45" w:type="dxa"/>
+            </w:tcMar>
+          </w:tcPr>
+          <w:p>
+            <w:pPr>
+              <w:keepNext/>
+              <w:spacing w:after="60" w:before="60" w:line="240" w:lineRule="auto"/>
+              <w:ind w:firstLine="0"/>
+              <w:jc w:val="center"/>
+            </w:pPr>
+            <w:r>
+              <w:rPr>
+                <w:b w:val="0"/>
+                <w:sz w:val="16"/>
+              </w:rPr>
+              <w:t>0/16</w:t>
+            </w:r>
+          </w:p>
+        </w:tc>
+      </w:tr>
+      <w:tr>
+        <w:trPr>
+          <w:cantSplit/>
+        </w:trPr>
+        <w:tc>
+          <w:tcPr>
+            <w:tcW w:type="dxa" w:w="1417"/>
+            <w:tcMar>
+              <w:left w:w="45" w:type="dxa"/>
+              <w:right w:w="45" w:type="dxa"/>
+            </w:tcMar>
+            <w:tcBorders>
+              <w:bottom w:val="single" w:sz="5"/>
+            </w:tcBorders>
+          </w:tcPr>
+          <w:p>
+            <w:pPr>
+              <w:keepNext w:val="0"/>
+              <w:spacing w:after="60" w:before="60" w:line="240" w:lineRule="auto"/>
+              <w:ind w:firstLine="0"/>
+              <w:jc w:val="left"/>
+            </w:pPr>
+            <w:r>
+              <w:rPr>
+                <w:b w:val="0"/>
+                <w:sz w:val="16"/>
+              </w:rPr>
+              <w:t>실행 대상 검사 결합</w:t>
+            </w:r>
+          </w:p>
+        </w:tc>
+        <w:tc>
+          <w:tcPr>
+            <w:tcW w:type="dxa" w:w="1602"/>
+            <w:tcMar>
+              <w:left w:w="45" w:type="dxa"/>
+              <w:right w:w="45" w:type="dxa"/>
+            </w:tcMar>
+            <w:tcBorders>
+              <w:bottom w:val="single" w:sz="5"/>
+            </w:tcBorders>
+          </w:tcPr>
+          <w:p>
+            <w:pPr>
+              <w:keepNext w:val="0"/>
+              <w:spacing w:after="60" w:before="60" w:line="240" w:lineRule="auto"/>
+              <w:ind w:firstLine="0"/>
+              <w:jc w:val="center"/>
+            </w:pPr>
+            <w:r>
+              <w:rPr>
+                <w:b w:val="0"/>
+                <w:sz w:val="16"/>
+              </w:rPr>
+              <w:t>16/16</w:t>
+            </w:r>
+          </w:p>
+        </w:tc>
+        <w:tc>
+          <w:tcPr>
+            <w:tcW w:type="dxa" w:w="1602"/>
+            <w:tcMar>
+              <w:left w:w="45" w:type="dxa"/>
+              <w:right w:w="45" w:type="dxa"/>
+            </w:tcMar>
+            <w:tcBorders>
+              <w:bottom w:val="single" w:sz="5"/>
+            </w:tcBorders>
+          </w:tcPr>
+          <w:p>
+            <w:pPr>
+              <w:keepNext w:val="0"/>
+              <w:spacing w:after="60" w:before="60" w:line="240" w:lineRule="auto"/>
+              <w:ind w:firstLine="0"/>
+              <w:jc w:val="center"/>
+            </w:pPr>
+            <w:r>
+              <w:rPr>
+                <w:b w:val="0"/>
+                <w:sz w:val="16"/>
+              </w:rPr>
+              <w:t>0/16</w:t>
+            </w:r>
+          </w:p>
+        </w:tc>
+      </w:tr>
+    </w:tbl>
+    <w:p>
+      <w:pPr>
+        <w:jc w:val="both"/>
+      </w:pPr>
+      <w:r>
+        <w:t>Qwen3에서는 실행하지 않을 지시에 따른 변경을 막고 다른 항목의 직접 변경을 반영하였다. 부정·조건·인용 표현 뒤에 같은 항목의 직접 변경이 나타난 경우에도 뒤 지시를 적용하였다.</w:t>
+      </w:r>
+    </w:p>
+    <w:p>
+      <w:pPr>
+        <w:jc w:val="both"/>
+      </w:pPr>
+      <w:r>
+        <w:t>Llama는 네 대화의 초기 설정 요청에서 최초 응답의 여섯 항목을 모두 정확하게 추출하였다. 그러나 재검토에서는 목걸이 삭제 등 한두 항목만 반환하였다. 예를 들어 의상·장신구·배경·소품을 설정한 요청의 재검토 응답은 {"necklace": "none"}이었다. 이 응답을 우선 적용하면서 첫 상태부터 오류가 발생하였고 이후 요청에도 남았다. 실행 대상 검사도 누락된 초기 설정을 복원하지 못하여 전체 상태 일치율은 0/16이었다. 같은 첫 응답을 단순 JSON으로 적용한 결과는 8/16이었다.</w:t>
+      </w:r>
+    </w:p>
+    <w:p>
+      <w:pPr>
+        <w:pStyle w:val="Heading2"/>
+      </w:pPr>
+      <w:r>
+        <w:t>12. 한 번 추출하는 방법의 정확도와 호출 횟수</w:t>
+      </w:r>
+    </w:p>
+    <w:p>
+      <w:pPr>
+        <w:jc w:val="both"/>
+      </w:pPr>
+      <w:r>
+        <w:t>32개 개발 자료에서 최초 응답에만 최종 지시 검사를 적용하면 Qwen3 32/32, Llama 27/32였다. 추출·재검토 응답을 함께 사용하면 각각 32/32와 19/32였다. 이를 바탕으로 코드를 고정하고 새 요청 12개에서 비교한 결과를 표 12에 제시하였다.</w:t>
+      </w:r>
+    </w:p>
+    <w:p>
+      <w:pPr>
+        <w:pStyle w:val="Caption"/>
+        <w:keepNext/>
+        <w:spacing w:before="100"/>
+        <w:ind w:firstLine="0"/>
+        <w:jc w:val="center"/>
+      </w:pPr>
+      <w:r>
+        <w:t>표 12. 새 요청에서의 전체 상태 일치율과 필요한 모델 호출 수</w:t>
+      </w:r>
+    </w:p>
+    <w:tbl>
+      <w:tblPr>
+        <w:tblW w:type="auto" w:w="0"/>
+        <w:tblLayout w:type="fixed"/>
+        <w:tblLook w:firstColumn="1" w:firstRow="1" w:lastColumn="0" w:lastRow="0" w:noHBand="0" w:noVBand="1" w:val="04A0"/>
+      </w:tblPr>
+      <w:tblGrid>
+        <w:gridCol w:w="1417"/>
+        <w:gridCol w:w="1068"/>
+        <w:gridCol w:w="1068"/>
+        <w:gridCol w:w="1068"/>
+      </w:tblGrid>
+      <w:tr>
+        <w:trPr>
+          <w:cantSplit/>
+          <w:tblHeader/>
+        </w:trPr>
+        <w:tc>
+          <w:tcPr>
+            <w:tcW w:type="dxa" w:w="1417"/>
+            <w:tcMar>
+              <w:left w:w="45" w:type="dxa"/>
+              <w:right w:w="45" w:type="dxa"/>
+            </w:tcMar>
+            <w:tcBorders>
+              <w:bottom w:val="single" w:sz="5"/>
+            </w:tcBorders>
+          </w:tcPr>
+          <w:p>
+            <w:pPr>
+              <w:keepNext/>
+              <w:spacing w:after="60" w:before="60" w:line="240" w:lineRule="auto"/>
+              <w:ind w:firstLine="0"/>
+              <w:jc w:val="left"/>
+            </w:pPr>
+            <w:r>
+              <w:rPr>
+                <w:b/>
+                <w:sz w:val="16"/>
+              </w:rPr>
+              <w:t>방법</w:t>
+            </w:r>
+          </w:p>
+        </w:tc>
+        <w:tc>
+          <w:tcPr>
+            <w:tcW w:type="dxa" w:w="1068"/>
+            <w:tcMar>
+              <w:left w:w="45" w:type="dxa"/>
+              <w:right w:w="45" w:type="dxa"/>
+            </w:tcMar>
+            <w:tcBorders>
+              <w:bottom w:val="single" w:sz="5"/>
+            </w:tcBorders>
+          </w:tcPr>
+          <w:p>
+            <w:pPr>
+              <w:keepNext/>
+              <w:spacing w:after="60" w:before="60" w:line="240" w:lineRule="auto"/>
+              <w:ind w:firstLine="0"/>
+              <w:jc w:val="center"/>
+            </w:pPr>
+            <w:r>
+              <w:rPr>
+                <w:b/>
+                <w:sz w:val="16"/>
+              </w:rPr>
+              <w:t>요청당 호출 수</w:t>
+            </w:r>
+          </w:p>
+        </w:tc>
+        <w:tc>
+          <w:tcPr>
+            <w:tcW w:type="dxa" w:w="1068"/>
+            <w:tcMar>
+              <w:left w:w="45" w:type="dxa"/>
+              <w:right w:w="45" w:type="dxa"/>
+            </w:tcMar>
+            <w:tcBorders>
+              <w:bottom w:val="single" w:sz="5"/>
+            </w:tcBorders>
+          </w:tcPr>
+          <w:p>
+            <w:pPr>
+              <w:keepNext/>
+              <w:spacing w:after="60" w:before="60" w:line="240" w:lineRule="auto"/>
+              <w:ind w:firstLine="0"/>
+              <w:jc w:val="center"/>
+            </w:pPr>
+            <w:r>
+              <w:rPr>
+                <w:b/>
+                <w:sz w:val="16"/>
+              </w:rPr>
+              <w:t>Qwen3-4B</w:t>
+            </w:r>
+          </w:p>
+        </w:tc>
+        <w:tc>
+          <w:tcPr>
+            <w:tcW w:type="dxa" w:w="1068"/>
+            <w:tcMar>
+              <w:left w:w="45" w:type="dxa"/>
+              <w:right w:w="45" w:type="dxa"/>
+            </w:tcMar>
+            <w:tcBorders>
+              <w:bottom w:val="single" w:sz="5"/>
+            </w:tcBorders>
+          </w:tcPr>
+          <w:p>
+            <w:pPr>
+              <w:keepNext/>
+              <w:spacing w:after="60" w:before="60" w:line="240" w:lineRule="auto"/>
+              <w:ind w:firstLine="0"/>
+              <w:jc w:val="center"/>
+            </w:pPr>
+            <w:r>
+              <w:rPr>
+                <w:b/>
+                <w:sz w:val="16"/>
+              </w:rPr>
+              <w:t>Llama-3.2-3B</w:t>
+            </w:r>
+          </w:p>
+        </w:tc>
+      </w:tr>
+      <w:tr>
+        <w:trPr>
+          <w:cantSplit/>
+        </w:trPr>
+        <w:tc>
+          <w:tcPr>
+            <w:tcW w:type="dxa" w:w="1417"/>
+            <w:tcMar>
+              <w:left w:w="45" w:type="dxa"/>
+              <w:right w:w="45" w:type="dxa"/>
+            </w:tcMar>
+          </w:tcPr>
+          <w:p>
+            <w:pPr>
+              <w:keepNext/>
+              <w:spacing w:after="60" w:before="60" w:line="240" w:lineRule="auto"/>
+              <w:ind w:firstLine="0"/>
+              <w:jc w:val="left"/>
+            </w:pPr>
+            <w:r>
+              <w:rPr>
+                <w:b w:val="0"/>
+                <w:sz w:val="16"/>
+              </w:rPr>
+              <w:t>기준 방법</w:t>
+            </w:r>
+          </w:p>
+        </w:tc>
+        <w:tc>
+          <w:tcPr>
+            <w:tcW w:type="dxa" w:w="1068"/>
+            <w:tcMar>
+              <w:left w:w="45" w:type="dxa"/>
+              <w:right w:w="45" w:type="dxa"/>
+            </w:tcMar>
+          </w:tcPr>
+          <w:p>
+            <w:pPr>
+              <w:keepNext/>
+              <w:spacing w:after="60" w:before="60" w:line="240" w:lineRule="auto"/>
+              <w:ind w:firstLine="0"/>
+              <w:jc w:val="center"/>
+            </w:pPr>
+            <w:r>
+              <w:rPr>
+                <w:b w:val="0"/>
+                <w:sz w:val="16"/>
+              </w:rPr>
+              <w:t>2</w:t>
+            </w:r>
+          </w:p>
+        </w:tc>
+        <w:tc>
+          <w:tcPr>
+            <w:tcW w:type="dxa" w:w="1068"/>
+            <w:tcMar>
+              <w:left w:w="45" w:type="dxa"/>
+              <w:right w:w="45" w:type="dxa"/>
+            </w:tcMar>
+          </w:tcPr>
+          <w:p>
+            <w:pPr>
+              <w:keepNext/>
+              <w:spacing w:after="60" w:before="60" w:line="240" w:lineRule="auto"/>
+              <w:ind w:firstLine="0"/>
+              <w:jc w:val="center"/>
+            </w:pPr>
+            <w:r>
+              <w:rPr>
+                <w:b w:val="0"/>
+                <w:sz w:val="16"/>
+              </w:rPr>
+              <w:t>3/12</w:t>
+            </w:r>
+          </w:p>
+        </w:tc>
+        <w:tc>
+          <w:tcPr>
+            <w:tcW w:type="dxa" w:w="1068"/>
+            <w:tcMar>
+              <w:left w:w="45" w:type="dxa"/>
+              <w:right w:w="45" w:type="dxa"/>
+            </w:tcMar>
+          </w:tcPr>
+          <w:p>
+            <w:pPr>
+              <w:keepNext/>
+              <w:spacing w:after="60" w:before="60" w:line="240" w:lineRule="auto"/>
+              <w:ind w:firstLine="0"/>
+              <w:jc w:val="center"/>
+            </w:pPr>
+            <w:r>
+              <w:rPr>
+                <w:b w:val="0"/>
+                <w:sz w:val="16"/>
+              </w:rPr>
+              <w:t>1/12</w:t>
+            </w:r>
+          </w:p>
+        </w:tc>
+      </w:tr>
+      <w:tr>
+        <w:trPr>
+          <w:cantSplit/>
+        </w:trPr>
+        <w:tc>
+          <w:tcPr>
+            <w:tcW w:type="dxa" w:w="1417"/>
+            <w:tcMar>
+              <w:left w:w="45" w:type="dxa"/>
+              <w:right w:w="45" w:type="dxa"/>
+            </w:tcMar>
+          </w:tcPr>
+          <w:p>
+            <w:pPr>
+              <w:keepNext/>
+              <w:spacing w:after="60" w:before="60" w:line="240" w:lineRule="auto"/>
+              <w:ind w:firstLine="0"/>
+              <w:jc w:val="left"/>
+            </w:pPr>
+            <w:r>
+              <w:rPr>
+                <w:b w:val="0"/>
+                <w:sz w:val="16"/>
+              </w:rPr>
+              <w:t>JSON 최초 응답</w:t>
+            </w:r>
+          </w:p>
+        </w:tc>
+        <w:tc>
+          <w:tcPr>
+            <w:tcW w:type="dxa" w:w="1068"/>
+            <w:tcMar>
+              <w:left w:w="45" w:type="dxa"/>
+              <w:right w:w="45" w:type="dxa"/>
+            </w:tcMar>
+          </w:tcPr>
+          <w:p>
+            <w:pPr>
+              <w:keepNext/>
+              <w:spacing w:after="60" w:before="60" w:line="240" w:lineRule="auto"/>
+              <w:ind w:firstLine="0"/>
+              <w:jc w:val="center"/>
+            </w:pPr>
+            <w:r>
+              <w:rPr>
+                <w:b w:val="0"/>
+                <w:sz w:val="16"/>
+              </w:rPr>
+              <w:t>1</w:t>
+            </w:r>
+          </w:p>
+        </w:tc>
+        <w:tc>
+          <w:tcPr>
+            <w:tcW w:type="dxa" w:w="1068"/>
+            <w:tcMar>
+              <w:left w:w="45" w:type="dxa"/>
+              <w:right w:w="45" w:type="dxa"/>
+            </w:tcMar>
+          </w:tcPr>
+          <w:p>
+            <w:pPr>
+              <w:keepNext/>
+              <w:spacing w:after="60" w:before="60" w:line="240" w:lineRule="auto"/>
+              <w:ind w:firstLine="0"/>
+              <w:jc w:val="center"/>
+            </w:pPr>
+            <w:r>
+              <w:rPr>
+                <w:b w:val="0"/>
+                <w:sz w:val="16"/>
+              </w:rPr>
+              <w:t>3/12</w:t>
+            </w:r>
+          </w:p>
+        </w:tc>
+        <w:tc>
+          <w:tcPr>
+            <w:tcW w:type="dxa" w:w="1068"/>
+            <w:tcMar>
+              <w:left w:w="45" w:type="dxa"/>
+              <w:right w:w="45" w:type="dxa"/>
+            </w:tcMar>
+          </w:tcPr>
+          <w:p>
+            <w:pPr>
+              <w:keepNext/>
+              <w:spacing w:after="60" w:before="60" w:line="240" w:lineRule="auto"/>
+              <w:ind w:firstLine="0"/>
+              <w:jc w:val="center"/>
+            </w:pPr>
+            <w:r>
+              <w:rPr>
+                <w:b w:val="0"/>
+                <w:sz w:val="16"/>
+              </w:rPr>
+              <w:t>3/12</w:t>
+            </w:r>
+          </w:p>
+        </w:tc>
+      </w:tr>
+      <w:tr>
+        <w:trPr>
+          <w:cantSplit/>
+        </w:trPr>
+        <w:tc>
+          <w:tcPr>
+            <w:tcW w:type="dxa" w:w="1417"/>
+            <w:tcMar>
+              <w:left w:w="45" w:type="dxa"/>
+              <w:right w:w="45" w:type="dxa"/>
+            </w:tcMar>
+          </w:tcPr>
+          <w:p>
+            <w:pPr>
+              <w:keepNext/>
+              <w:spacing w:after="60" w:before="60" w:line="240" w:lineRule="auto"/>
+              <w:ind w:firstLine="0"/>
+              <w:jc w:val="left"/>
+            </w:pPr>
+            <w:r>
+              <w:rPr>
+                <w:b w:val="0"/>
+                <w:sz w:val="16"/>
+              </w:rPr>
+              <w:t>JSON 재검토 우선</w:t>
+            </w:r>
+          </w:p>
+        </w:tc>
+        <w:tc>
+          <w:tcPr>
+            <w:tcW w:type="dxa" w:w="1068"/>
+            <w:tcMar>
+              <w:left w:w="45" w:type="dxa"/>
+              <w:right w:w="45" w:type="dxa"/>
+            </w:tcMar>
+          </w:tcPr>
+          <w:p>
+            <w:pPr>
+              <w:keepNext/>
+              <w:spacing w:after="60" w:before="60" w:line="240" w:lineRule="auto"/>
+              <w:ind w:firstLine="0"/>
+              <w:jc w:val="center"/>
+            </w:pPr>
+            <w:r>
+              <w:rPr>
+                <w:b w:val="0"/>
+                <w:sz w:val="16"/>
+              </w:rPr>
+              <w:t>2</w:t>
+            </w:r>
+          </w:p>
+        </w:tc>
+        <w:tc>
+          <w:tcPr>
+            <w:tcW w:type="dxa" w:w="1068"/>
+            <w:tcMar>
+              <w:left w:w="45" w:type="dxa"/>
+              <w:right w:w="45" w:type="dxa"/>
+            </w:tcMar>
+          </w:tcPr>
+          <w:p>
+            <w:pPr>
+              <w:keepNext/>
+              <w:spacing w:after="60" w:before="60" w:line="240" w:lineRule="auto"/>
+              <w:ind w:firstLine="0"/>
+              <w:jc w:val="center"/>
+            </w:pPr>
+            <w:r>
+              <w:rPr>
+                <w:b w:val="0"/>
+                <w:sz w:val="16"/>
+              </w:rPr>
+              <w:t>3/12</w:t>
+            </w:r>
+          </w:p>
+        </w:tc>
+        <w:tc>
+          <w:tcPr>
+            <w:tcW w:type="dxa" w:w="1068"/>
+            <w:tcMar>
+              <w:left w:w="45" w:type="dxa"/>
+              <w:right w:w="45" w:type="dxa"/>
+            </w:tcMar>
+          </w:tcPr>
+          <w:p>
+            <w:pPr>
+              <w:keepNext/>
+              <w:spacing w:after="60" w:before="60" w:line="240" w:lineRule="auto"/>
+              <w:ind w:firstLine="0"/>
+              <w:jc w:val="center"/>
+            </w:pPr>
+            <w:r>
+              <w:rPr>
+                <w:b w:val="0"/>
+                <w:sz w:val="16"/>
+              </w:rPr>
+              <w:t>1/12</w:t>
+            </w:r>
+          </w:p>
+        </w:tc>
+      </w:tr>
+      <w:tr>
+        <w:trPr>
+          <w:cantSplit/>
+        </w:trPr>
+        <w:tc>
+          <w:tcPr>
+            <w:tcW w:type="dxa" w:w="1417"/>
+            <w:tcMar>
+              <w:left w:w="45" w:type="dxa"/>
+              <w:right w:w="45" w:type="dxa"/>
+            </w:tcMar>
+          </w:tcPr>
+          <w:p>
+            <w:pPr>
+              <w:keepNext/>
+              <w:spacing w:after="60" w:before="60" w:line="240" w:lineRule="auto"/>
+              <w:ind w:firstLine="0"/>
+              <w:jc w:val="left"/>
+            </w:pPr>
+            <w:r>
+              <w:rPr>
+                <w:b w:val="0"/>
+                <w:sz w:val="16"/>
+              </w:rPr>
+              <w:t>추출·재검토+지시 검사</w:t>
+            </w:r>
+          </w:p>
+        </w:tc>
+        <w:tc>
+          <w:tcPr>
+            <w:tcW w:type="dxa" w:w="1068"/>
+            <w:tcMar>
+              <w:left w:w="45" w:type="dxa"/>
+              <w:right w:w="45" w:type="dxa"/>
+            </w:tcMar>
+          </w:tcPr>
+          <w:p>
+            <w:pPr>
+              <w:keepNext/>
+              <w:spacing w:after="60" w:before="60" w:line="240" w:lineRule="auto"/>
+              <w:ind w:firstLine="0"/>
+              <w:jc w:val="center"/>
+            </w:pPr>
+            <w:r>
+              <w:rPr>
+                <w:b w:val="0"/>
+                <w:sz w:val="16"/>
+              </w:rPr>
+              <w:t>2</w:t>
+            </w:r>
+          </w:p>
+        </w:tc>
+        <w:tc>
+          <w:tcPr>
+            <w:tcW w:type="dxa" w:w="1068"/>
+            <w:tcMar>
+              <w:left w:w="45" w:type="dxa"/>
+              <w:right w:w="45" w:type="dxa"/>
+            </w:tcMar>
+          </w:tcPr>
+          <w:p>
+            <w:pPr>
+              <w:keepNext/>
+              <w:spacing w:after="60" w:before="60" w:line="240" w:lineRule="auto"/>
+              <w:ind w:firstLine="0"/>
+              <w:jc w:val="center"/>
+            </w:pPr>
+            <w:r>
+              <w:rPr>
+                <w:b w:val="0"/>
+                <w:sz w:val="16"/>
+              </w:rPr>
+              <w:t>12/12</w:t>
+            </w:r>
+          </w:p>
+        </w:tc>
+        <w:tc>
+          <w:tcPr>
+            <w:tcW w:type="dxa" w:w="1068"/>
+            <w:tcMar>
+              <w:left w:w="45" w:type="dxa"/>
+              <w:right w:w="45" w:type="dxa"/>
+            </w:tcMar>
+          </w:tcPr>
+          <w:p>
+            <w:pPr>
+              <w:keepNext/>
+              <w:spacing w:after="60" w:before="60" w:line="240" w:lineRule="auto"/>
+              <w:ind w:firstLine="0"/>
+              <w:jc w:val="center"/>
+            </w:pPr>
+            <w:r>
+              <w:rPr>
+                <w:b w:val="0"/>
+                <w:sz w:val="16"/>
+              </w:rPr>
+              <w:t>4/12</w:t>
+            </w:r>
+          </w:p>
+        </w:tc>
+      </w:tr>
+      <w:tr>
+        <w:trPr>
+          <w:cantSplit/>
+        </w:trPr>
+        <w:tc>
+          <w:tcPr>
+            <w:tcW w:type="dxa" w:w="1417"/>
+            <w:tcMar>
+              <w:left w:w="45" w:type="dxa"/>
+              <w:right w:w="45" w:type="dxa"/>
+            </w:tcMar>
+            <w:tcBorders>
+              <w:bottom w:val="single" w:sz="5"/>
+            </w:tcBorders>
+          </w:tcPr>
+          <w:p>
+            <w:pPr>
+              <w:keepNext w:val="0"/>
+              <w:spacing w:after="60" w:before="60" w:line="240" w:lineRule="auto"/>
+              <w:ind w:firstLine="0"/>
+              <w:jc w:val="left"/>
+            </w:pPr>
+            <w:r>
+              <w:rPr>
+                <w:b w:val="0"/>
+                <w:sz w:val="16"/>
+              </w:rPr>
+              <w:t>한 번 추출+지시 검사</w:t>
+            </w:r>
+          </w:p>
+        </w:tc>
+        <w:tc>
+          <w:tcPr>
+            <w:tcW w:type="dxa" w:w="1068"/>
+            <w:tcMar>
+              <w:left w:w="45" w:type="dxa"/>
+              <w:right w:w="45" w:type="dxa"/>
+            </w:tcMar>
+            <w:tcBorders>
+              <w:bottom w:val="single" w:sz="5"/>
+            </w:tcBorders>
+          </w:tcPr>
+          <w:p>
+            <w:pPr>
+              <w:keepNext w:val="0"/>
+              <w:spacing w:after="60" w:before="60" w:line="240" w:lineRule="auto"/>
+              <w:ind w:firstLine="0"/>
+              <w:jc w:val="center"/>
+            </w:pPr>
+            <w:r>
+              <w:rPr>
+                <w:b w:val="0"/>
+                <w:sz w:val="16"/>
+              </w:rPr>
+              <w:t>1</w:t>
+            </w:r>
+          </w:p>
+        </w:tc>
+        <w:tc>
+          <w:tcPr>
+            <w:tcW w:type="dxa" w:w="1068"/>
+            <w:tcMar>
+              <w:left w:w="45" w:type="dxa"/>
+              <w:right w:w="45" w:type="dxa"/>
+            </w:tcMar>
+            <w:tcBorders>
+              <w:bottom w:val="single" w:sz="5"/>
+            </w:tcBorders>
+          </w:tcPr>
+          <w:p>
+            <w:pPr>
+              <w:keepNext w:val="0"/>
+              <w:spacing w:after="60" w:before="60" w:line="240" w:lineRule="auto"/>
+              <w:ind w:firstLine="0"/>
+              <w:jc w:val="center"/>
+            </w:pPr>
+            <w:r>
+              <w:rPr>
+                <w:b w:val="0"/>
+                <w:sz w:val="16"/>
+              </w:rPr>
+              <w:t>12/12</w:t>
+            </w:r>
+          </w:p>
+        </w:tc>
+        <w:tc>
+          <w:tcPr>
+            <w:tcW w:type="dxa" w:w="1068"/>
+            <w:tcMar>
+              <w:left w:w="45" w:type="dxa"/>
+              <w:right w:w="45" w:type="dxa"/>
+            </w:tcMar>
+            <w:tcBorders>
+              <w:bottom w:val="single" w:sz="5"/>
+            </w:tcBorders>
+          </w:tcPr>
+          <w:p>
+            <w:pPr>
+              <w:keepNext w:val="0"/>
+              <w:spacing w:after="60" w:before="60" w:line="240" w:lineRule="auto"/>
+              <w:ind w:firstLine="0"/>
+              <w:jc w:val="center"/>
+            </w:pPr>
+            <w:r>
+              <w:rPr>
+                <w:b w:val="0"/>
+                <w:sz w:val="16"/>
+              </w:rPr>
+              <w:t>12/12</w:t>
+            </w:r>
+          </w:p>
+        </w:tc>
+      </w:tr>
+    </w:tbl>
+    <w:p>
+      <w:pPr>
+        <w:jc w:val="both"/>
+      </w:pPr>
+      <w:r>
+        <w:t>한 번 추출한 응답에 지시 검사를 적용한 방법은 두 모델 모두 항목별 72/72, 최종 상태 3/3이었고 기준이 맞았던 요청을 새로 틀린 경우는 0개였다. 같은 첫 응답을 단순 적용한 결과가 두 모델 모두 3/12였으므로 최초 응답 선택과 함께 지시 검사의 효과도 나타났다. Qwen3에서는 재검토를 사용하는 검사 방법과 같은 결과를 보였고, Llama에서는 한 번 추출이 맞았으나 재검토 결합이 틀린 요청이 여덟 개였다. 반대 경우는 두 모델 모두 0개였다.</w:t>
+      </w:r>
+    </w:p>
+    <w:p>
+      <w:pPr>
+        <w:jc w:val="both"/>
+      </w:pPr>
+      <w:r>
+        <w:t>이 비교에서 한 번 추출하는 방법은 요청당 모델 호출 한 번으로 같은 정확도 또는 더 높은 정확도를 보였다. 재검토 응답을 사용하지 않아 정답인 최초 응답이 잘못 바뀌는 사례를 피하면서, 명시한 복원·유지·삭제 지시는 후처리로 확인하였다.</w:t>
+      </w:r>
+    </w:p>
+    <w:p>
+      <w:pPr>
         <w:pStyle w:val="Heading1"/>
       </w:pPr>
       <w:r>
@@ -6274,6 +8271,14 @@
     </w:p>
     <w:p>
       <w:pPr>
+        <w:jc w:val="both"/>
+      </w:pPr>
+      <w:r>
+        <w:t>두 모델 비교에서 재검토의 결과는 사용한 모델과 고정 프롬프트에 따라 달랐다. 따라서 같은 최초 응답에 대한 단순 적용, 지시 검사, 재검토 결합을 나누어 비교하였다. 한 번 추출하는 방법의 효과는 명시한 문형의 새 요청 12개에서 확인한 결과다. 실험별 대화와 모델 응답을 보존하여 각 처리 단계가 상태에 미친 영향을 확인할 수 있도록 하였다.</w:t>
+      </w:r>
+    </w:p>
+    <w:p>
+      <w:pPr>
         <w:pStyle w:val="Heading1"/>
       </w:pPr>
       <w:r>
@@ -6285,7 +8290,7 @@
         <w:jc w:val="both"/>
       </w:pPr>
       <w:r>
-        <w:t>반복 인물 이미지 편집에서 사용자의 유지·삭제 지시를 확인하고, 복원 지시와 유지 지시를 구분하는 방법을 구현하였다. 언어 모델이 추출한 변경 사항을 재검토한 뒤 규칙을 적용한다. 요청이 가리키는 항목을 구분하여 삭제 누락과 불필요한 변경을 바로잡고, 저장한 조건으로 다음 이미지 생성 프롬프트를 작성한다.</w:t>
+        <w:t>반복 인물 이미지 편집에서 변경 사항을 한 번 추출한 뒤 지시 구절을 확인하여 상태를 갱신하는 방법을 구현하였다. 원본 복원과 유지 대상을 구분하고, 현재 실행할 지시와 부정·조건·인용 표현을 구분한다. 같은 항목의 뒤 직접 지시를 적용한 후 저장한 조건으로 이미지 편집 프롬프트를 작성한다.</w:t>
       </w:r>
     </w:p>
     <w:p>
@@ -6293,7 +8298,7 @@
         <w:jc w:val="both"/>
       </w:pPr>
       <w:r>
-        <w:t>코드를 고정한 뒤 수행한 새 대화 검증에서 전체 상태 일치율은 기준 9/16, 기존 유지·삭제 10/16, 구절 정규화 16/16이었다. 같은 목표를 네 문장 구조로 요청한 비교에서도 기존 유지·삭제 26/36, 단순 JSON 적용 28/36, 정규화 36/36이었다. 표현과 지시 순서를 바꾼 추가 검증에서는 기준 24/48, 기존 유지·삭제 27/48, 정규화 36/48이었다. 지시별 적용 대상을 구분하는 처리는 지원하는 표현에서 상태 기록의 정확도를 높였으며, 추가 모델 호출은 사용하지 않았다. 규칙에 없는 복원 표현에서는 모델의 추출 오류가 다음 요청까지 이어졌다.</w:t>
+        <w:t>새 요청 12개에서 동일한 최초 응답을 단순 JSON으로 적용하면 Qwen3와 Llama 모두 3/12였고, 제안 방법은 모두 12/12였다. 재검토와 지시 검사를 함께 사용하면 각각 12/12와 4/12였다. 이 검증에서 요청당 모델 호출을 두 번에서 한 번으로 줄이면서 같은 정확도 또는 더 높은 정확도를 얻었다. 지시 검사는 지원하는 표현의 적용 오류를 바로잡았고, 최초 응답만 사용하여 재검토가 정답을 잘못 바꾸는 사례를 피하였다. 검증 범위는 AI를 이용해 구성한 영어 대화와 명시한 여섯 상태 항목 및 문형이다.</w:t>
       </w:r>
     </w:p>
     <w:p>
@@ -6382,6 +8387,16 @@
       </w:pPr>
       <w:r>
         <w:t>[8] Monstera Production, “Cheerful black woman in studio,” Pexels, photo 6311581. https://www.pexels.com/photo/cheerful-black-woman-in-studio-6311581/</w:t>
+      </w:r>
+    </w:p>
+    <w:p>
+      <w:pPr>
+        <w:keepLines/>
+        <w:ind w:firstLine="0"/>
+        <w:jc w:val="left"/>
+      </w:pPr>
+      <w:r>
+        <w:t>[9] Meta, “Llama 3.2 Model Card,” 2024. https://huggingface.co/meta-llama/Llama-3.2-3B-Instruct</w:t>
       </w:r>
     </w:p>
     <w:sectPr>

</xml_diff>

<commit_message>
Connect portrait drift and prompt-state results in thesis and slides
</commit_message>
<xml_diff>
--- a/paper/manuscript.inha.docx
+++ b/paper/manuscript.inha.docx
@@ -65,7 +65,7 @@
         <w:t xml:space="preserve">요약: </w:t>
       </w:r>
       <w:r>
-        <w:t>반복 인물 이미지 편집에서는 현재 요청의 변경 사항과 유지·삭제·복원 지시를 저장된 편집 조건에 반영해야 한다. 본 연구는 한 번의 변경 사항 추출에 지시 구절 정규화와 실행 대상 검사를 결합한 상태 갱신 방법을 제안한다. 복원과 유지 대상을 구분하고, 부정·조건·인용 표현의 적용 범위와 같은 항목에 대한 뒤 지시를 검사한다. Qwen3-4B와 Llama-3.2-3B-Instruct의 4비트 양자화 모델에 같은 합성 영어 요청을 입력하여 비교하였다. 새 요청 12개에서 동일한 최초 응답을 단순 JSON으로 적용한 전체 상태 일치율은 두 모델 모두 3/12였으며, 제안 방법은 모두 12/12였다. 추출·재검토와 지시 검사를 함께 사용하면 각각 12/12와 4/12였다. 제안 방법은 요청당 모델 호출 한 번으로, 두 번 호출하는 방법과 같은 정확도 또는 더 높은 정확도를 보였다. 별도의 구성요소 검증에서는 복원 표현 처리의 효과와 재검토가 정답을 훼손하는 사례를 확인하였다. 실험은 명시한 영어 어휘와 문형의 합성 대화를 대상으로 수행하였으며, 실제 인물 이미지 분석에서는 AI 평가 설명과 점수의 불일치를 기록하였다.</w:t>
+        <w:t>초기 합성 인물 6명의 10단계 편집에서 얼굴 위치를 보정한 MAE·SSIM·LPIPS는 최종 6쌍 모두 원본 기반 재생성에 유리하였다. 원본에 적용할 현재 조건을 정리하기 위해, 변경 사항을 한 번 추출한 뒤 삭제·복원·유지 대상과 현재 실행할 지시를 검사하는 방법을 제안한다. 새 합성 영어 요청 12개에서 Qwen3-4B와 Llama-3.2-3B-Instruct의 최초 응답을 단순 적용한 전체 상태 일치율은 모두 3/12였고, 제안 방법은 모두 12/12였다. 추출·재검토와 같은 검사를 결합하면 각각 12/12와 4/12였다. 세 대화의 마지막 요청을 실제 인물 두 명에게 적용한 이미지 18장을 추가 생성하였다. 전체 요청 이력을 현재 조건으로 바꾸면 평균 프롬프트 길이는 204.00토큰에서 122.67토큰으로 39.87% 줄었다. 7B AI 평가의 목표 충족 수는 전체 이력 34/36, 검사 전 조건 24/36, 검사 후 조건 36/36이었다. 얼굴 보존 지표의 변화 방향은 측정 항목에 따라 달랐다. 상태 갱신 평가는 명시한 여섯 편집 항목과 영어 문형의 합성 대화를 대상으로 한다.</w:t>
       </w:r>
     </w:p>
     <w:p>
@@ -79,7 +79,7 @@
         <w:t xml:space="preserve">Abstract: </w:t>
       </w:r>
       <w:r>
-        <w:t>Iterative portrait editing requires updating stored editing conditions while respecting preservation, removal, and restoration instructions. We propose a state update method that combines a single extraction by a language model with instruction normalization and checks on which instructions should execute. The method separates restoration from preservation targets, handles explicitly supported negative, conditional, and quoted instructions, and respects later direct instructions about the same attribute. We compared 4-bit versions of Qwen3-4B and Llama-3.2-3B-Instruct on the same synthetic English requests. On twelve new requests, applying the initial response as a schema-only JSON patch matched 3/12 full reference states for each model; the proposed method matched 12/12 for both. Combining extraction, model review, and the instruction checks matched 12/12 and 4/12, respectively. The proposed method required one model call per request and achieved equal or higher accuracy than the method requiring two calls in this comparison. Separate component studies identified restoration errors and cases in which review corrupted a correct initial response. Evaluation used AI-generated synthetic dialogues within the specified English vocabulary and instruction forms. An accompanying image analysis recorded inconsistencies between AI evaluator explanations and scores.</w:t>
+        <w:t>An initial comparison on six synthetic people found that original-referenced regeneration was closer to the source than ten-step sequential editing on all six final pairs using registered MAE, SSIM, and LPIPS. To compile current editing conditions for regeneration, we propose extracting changes once and checking restoration, preservation, removal, and instruction eligibility. On twelve new synthetic English requests, applying the initial response as a schema-only JSON patch matched 3/12 full reference states for both Qwen3-4B and Llama-3.2-3B-Instruct; the proposed method matched 12/12 for both. Combining extraction, model review, and the same checks matched 12/12 and 4/12, respectively. A follow-up experiment generated eighteen images from two real-person photographs using the final requests of three dialogues. Compiling checked current conditions reduced the mean prompt length from 204.00 to 122.67 tokens, a 39.87% reduction. A post-hoc 7B AI evaluator scored 34/36 target attributes for full request histories, 24/36 for unchecked states, and 36/36 for checked states. Facial preservation metrics showed mixed directions across input forms. Primary and secondary AI evaluation errors were retained. State-update evaluation covers six specified editing attributes and supported instruction forms in AI-generated synthetic English dialogues.</w:t>
       </w:r>
     </w:p>
     <w:p>
@@ -100,7 +100,7 @@
       <w:pPr>
         <w:spacing w:after="0" w:before="0" w:line="20" w:lineRule="exact"/>
         <w:sectPr>
-          <w:footerReference w:type="default" r:id="rId11"/>
+          <w:footerReference w:type="default" r:id="rId12"/>
           <w:pgSz w:w="11906" w:h="16838"/>
           <w:pgMar w:top="1134" w:right="1134" w:bottom="1134" w:left="1134" w:header="720" w:footer="720" w:gutter="0"/>
           <w:cols w:space="720"/>
@@ -121,7 +121,7 @@
         <w:jc w:val="both"/>
       </w:pPr>
       <w:r>
-        <w:t>반복 인물 이미지 편집에서는 속성의 추가·변경·유지·삭제와 원본 복원 요청을 편집 상태에 반영해야 한다. 예를 들어 배경을 유지하고 목걸이를 지우라는 요청을 처리할 때, 목걸이 삭제를 누락하거나 배경까지 원본으로 되돌리는 오류가 발생할 수 있다. 원본 사진을 매번 편집 입력으로 사용하는 방식은 누적된 얼굴 변화를 줄이는 데 도움이 될 수 있다. 이때 편집 요청을 잘못 해석하면 원본 사진을 사용하더라도 잘못된 상태가 생성 단계로 전달된다. 따라서 이미지 생성에 앞서 편집 상태가 현재 요청을 정확히 반영하는지 확인해야 한다.</w:t>
+        <w:t>반복 인물 이미지 편집에서는 속성의 추가·변경·유지·삭제와 원본 복원 요청을 편집 상태에 반영해야 한다. 예를 들어 배경을 유지하고 목걸이를 지우라는 요청을 처리할 때, 목걸이 삭제를 누락하거나 배경까지 원본으로 되돌리는 오류가 발생할 수 있다. 초기 실험에서 합성 인물 6명에게 각각 10단계 편집을 적용한 결과, 얼굴 위치를 보정한 최종 MAE·SSIM·LPIPS는 6쌍 모두 원본 기반 재생성에 유리하였다. 이 결과에 따라 원본 사진에 현재까지의 편집 조건을 적용하는 구성을 사용한다. 이때 편집 요청을 잘못 해석하면 원본 사진을 사용하더라도 잘못된 상태가 생성 단계로 전달된다. 따라서 이미지 생성에 앞서 편집 상태가 현재 요청을 정확히 반영하는지 확인해야 한다.</w:t>
       </w:r>
     </w:p>
     <w:p>
@@ -137,7 +137,7 @@
         <w:jc w:val="both"/>
       </w:pPr>
       <w:r>
-        <w:t>초기 구현은 편집 대화 전체를 언어 모델에 전달하여 최종 프롬프트를 한 번에 작성하였다. 이 과정에서 이미 취소된 재킷과 장신구 조건이 최종 프롬프트에 남는 사례가 관찰되었다. 이에 따라 프롬프트 종합을 항목별 상태 갱신과 최종 문장 작성으로 나누었다. 유지·삭제 규칙으로 저장된 조건을 확인한 뒤 이미지 생성 프롬프트를 작성한다. 이 과정에서 취소한 조건을 지우고 유지할 조건을 남긴다.</w:t>
+        <w:t>초기 구현은 편집 대화 전체를 언어 모델에 전달하여 최종 프롬프트를 한 번에 작성하였다. 이 과정에서 이미 취소된 재킷과 장신구 조건이 최종 프롬프트에 남는 사례가 관찰되었다. 이에 따라 프롬프트 종합을 항목별 상태 갱신과 최종 문장 작성으로 나누었다. 유지·삭제 규칙으로 저장된 조건을 확인한 뒤 이미지 생성 프롬프트를 작성한다. 이 과정에서 취소한 조건과 이전 값을 지우고 유지할 조건을 남긴다. 예를 들어 은색 목걸이 추가, 금색으로 변경, 목걸이 삭제를 차례로 요청하면 최종 조건에는 목걸이 없음만 남는다. 과거 요청 전체를 전달하는 대신 현재 상태로 정리하되, 정리 과정의 정확도와 프롬프트 길이를 함께 확인해야 한다.</w:t>
       </w:r>
     </w:p>
     <w:p>
@@ -145,7 +145,7 @@
         <w:jc w:val="both"/>
       </w:pPr>
       <w:r>
-        <w:t>분석 대상은 이미지 생성 전에 작성되는 편집 상태이다. 상태의 정답은 요청에 명시한 변경을 누적하여 계산할 수 있으므로 이미지 평가 모델의 판단과 분리하여 검사한다. 본 연구는 유지·삭제를 구분한 후처리를 구현하고 동일한 모델 응답으로 구성요소별 효과를 비교한다. 또한 복합 요청과 표현 변화에서 발생한 오류를 분석하여 원본 복원과 유지 지시의 적용 대상을 구분한다. 실행 대상 검사와 최초 응답 선택의 효과를 별도의 새 요청으로 검증한다.</w:t>
+        <w:t>상태 갱신의 정확도는 이미지 생성 전에 작성되는 편집 상태로 평가한다. 상태의 정답은 요청에 명시한 변경을 누적하여 계산할 수 있으므로 이미지 평가 모델의 판단과 분리하여 검사한다. 본 연구는 유지·삭제를 구분한 후처리를 구현하고 동일한 모델 응답으로 구성요소별 효과를 비교한다. 또한 복합 요청과 표현 변화에서 발생한 오류를 분석하여 원본 복원과 유지 지시의 적용 대상을 구분한다. 실행 대상 검사와 최초 응답 선택의 효과를 별도의 새 요청으로 검증한다.</w:t>
       </w:r>
     </w:p>
     <w:p>
@@ -390,6 +390,14 @@
     </w:p>
     <w:p>
       <w:pPr>
+        <w:jc w:val="both"/>
+      </w:pPr>
+      <w:r>
+        <w:t>초기 이미지 실험은 합성 인물 6명의 장신구·의상·배경을 같은 순서로 10단계 편집한 자료이다. 순차 방식은 직전 출력에 현재 요구를 적용하며, 원본 기반 방식은 최초 사진에 같은 최종 요구를 적용한다. 얼굴·표정·자세와 인물 조명은 유지하도록 요청하였다. 인물마다 원본에서 정한 320×360 얼굴 영역에서 MAE·SSIM·LPIPS[10]를 측정하였다. MAE와 LPIPS는 작을수록, SSIM은 클수록 원본에 가깝다. 위치 보정은 원본과 출력의 얼굴 영역을 NCC로 비교하여 ±64픽셀 안에서 이동을 찾고, 평활화 sigma 3 설정을 주 분석으로 사용하였다. 기존 순차 출력 60장과 원본 기반 최종 출력 6장 및 원본 6장의 해시를 대조하고 저장된 수치를 재계산하였다. 초기 비교의 대상은 입력 이미지 선택이며, 프롬프트 길이는 후속 실험에서 따로 측정하였다.</w:t>
+      </w:r>
+    </w:p>
+    <w:p>
+      <w:pPr>
         <w:pStyle w:val="Heading2"/>
       </w:pPr>
       <w:r>
@@ -401,7 +409,7 @@
         <w:jc w:val="both"/>
       </w:pPr>
       <w:r>
-        <w:t>초기 개발 대화에서는 keep을 폭넓게 탐지하는 유지 규칙이 전체 상태 일치율을 기준 30/32에서 32/32로 증가시켰다. 그러나 후속 검사에서 off나 색 변경 요청을 유지 지시로 잘못 처리하였다. 후속 개발 대화에서 이 규칙의 전체 상태 일치율은 12/32였고, 적용 문형을 좁힌 유지 규칙은 기준과 같은 27/32였다. 문형을 좁혀도 최종 상태 일치율은 6/8에서 5/8로 감소하였다. 대화 중간에 잘못 삭제되는 것은 막았지만 다음 요청에서 명시한 삭제 지시를 모델이 놓쳤기 때문이다.</w:t>
+        <w:t>상태 갱신 개발 대화에서는 keep을 폭넓게 탐지하는 유지 규칙이 전체 상태 일치율을 기준 30/32에서 32/32로 증가시켰다. 그러나 후속 검사에서 off나 색 변경 요청을 유지 지시로 잘못 처리하였다. 후속 개발 대화에서 이 규칙의 전체 상태 일치율은 12/32였고, 적용 문형을 좁힌 유지 규칙은 기준과 같은 27/32였다. 문형을 좁혀도 최종 상태 일치율은 6/8에서 5/8로 감소하였다. 대화 중간에 잘못 삭제되는 것은 막았지만 다음 요청에서 명시한 삭제 지시를 모델이 놓쳤기 때문이다.</w:t>
       </w:r>
     </w:p>
     <w:p>
@@ -441,7 +449,7 @@
         <w:jc w:val="both"/>
       </w:pPr>
       <w:r>
-        <w:t>이미지 실험은 규칙 비교 실험의 요청 32회, 실제 인물 사진 2명, 두 방법을 조합한 128개 생성 조건이다. 생성 조건은 요청 처리 단계·인물 사진·비교 방법의 조합이다. 원본 파일과 프롬프트가 같으면 한 번 생성한 이미지를 함께 사용해 총 66개 이미지를 생성하였다. 방법 간 비교 64쌍 중 입력이 다른 경우는 요청 두 개와 인물 두 명을 조합한 4쌍이며, 나머지 60쌍은 같은 이미지를 사용한다. 내장 이미지 생성 도구의 첫 성공 출력을 사용하였다. 이 도구의 내부 모델 버전과 시드는 비공개이며, 시드 설정은 도구의 기본 동작을 따랐다. 이미지 평가는 Qwen2.5-VL-3B의 4비트 양자화 모델[5]을 사용하였다. 이미지와 목표 상태를 입력하여 여섯 항목을 성공·실패·판단 불가로 판정하였다. 평가 입력은 이미지와 목표 상태로 한정하였다. 얼굴 유사도는 InsightFace buffalo_l[6]의 코사인 유사도로 측정하였다.</w:t>
+        <w:t>유지·삭제 규칙의 이미지 실험은 규칙 비교 실험의 요청 32회, 실제 인물 사진 2명, 두 방법을 조합한 128개 생성 조건이다. 생성 조건은 요청 처리 단계·인물 사진·비교 방법의 조합이다. 원본 파일과 프롬프트가 같으면 한 번 생성한 이미지를 함께 사용해 총 66개 이미지를 생성하였다. 방법 간 비교 64쌍 중 입력이 다른 경우는 요청 두 개와 인물 두 명을 조합한 4쌍이며, 나머지 60쌍은 같은 이미지를 사용한다. 내장 이미지 생성 도구의 첫 성공 출력을 사용하였다. 이 도구의 내부 모델 버전과 시드는 비공개이며, 시드 설정은 도구의 기본 동작을 따랐다. 이미지 평가는 Qwen2.5-VL-3B의 4비트 양자화 모델[5]을 사용하였다. 이미지와 목표 상태를 입력하여 여섯 항목을 성공·실패·판단 불가로 판정하였다. 평가 입력은 이미지와 목표 상태로 한정하였다. 얼굴 유사도는 InsightFace buffalo_l[6]의 코사인 유사도로 측정하였다.</w:t>
       </w:r>
     </w:p>
     <w:p>
@@ -688,6 +696,30 @@
     </w:p>
     <w:p>
       <w:pPr>
+        <w:pStyle w:val="Heading2"/>
+      </w:pPr>
+      <w:r>
+        <w:t>11. 누적 요청과 현재 편집 조건의 이미지 비교</w:t>
+      </w:r>
+    </w:p>
+    <w:p>
+      <w:pPr>
+        <w:jc w:val="both"/>
+      </w:pPr>
+      <w:r>
+        <w:t>한 번 추출하는 방법의 대화 세 개를 이미지 생성 단계로 연결하였다. 각 대화의 요청 네 개를 처리한 마지막 조건을 실제 인물 두 명에게 적용하였다. 입력은 시간 순서대로 나열한 전체 요청, Qwen3 최초 응답을 단순 적용한 현재 상태, 같은 응답에 지시 검사를 적용한 현재 상태의 세 종류이다. 세 대화·두 인물·세 입력 방식의 18조건을 생성 전에 고정하였다. 정답 상태는 이미지 평가에만 사용하였다. 모든 조건은 최초 사진에서 한 번 생성하였고, 조건별 첫 출력을 보존하였다. 도구의 내부 모델 버전과 시드는 비공개이다.</w:t>
+      </w:r>
+    </w:p>
+    <w:p>
+      <w:pPr>
+        <w:jc w:val="both"/>
+      </w:pPr>
+      <w:r>
+        <w:t>프롬프트 길이는 같은 보존 문구를 포함한 전체 문자열을 고정 Qwen3 토크나이저로 측정하였다. 각 대화에서 요청이 하나씩 추가될 때마다 길이를 측정해 총 12개 요청 묶음을 비교하고, 마지막 요청의 이미지 18장을 생성하였다. 토큰 수는 문자열 길이 비교에 사용하였다. 얼굴 코사인 유사도는 앞선 이미지 실험과 같은 InsightFace buffalo_l로 계산하였다. 얼굴 랜드마크를 기준으로 원본과 출력을 각각 112×112로 정렬하고 MAE·SSIM·LPIPS도 계산하였다. 이 정렬은 초기 합성 인물 실험의 고정 얼굴 영역과 다른 전처리이다. 여섯 편집 목표는 Qwen2.5-VL-3B로 한 번 평가하고 원문·형식 오류를 보존하였다. 평가 모델에는 생성 방식과 프롬프트를 제공하지 않았다. 이는 기존 텍스트 검증의 이미지 후속 실험이다.</w:t>
+      </w:r>
+    </w:p>
+    <w:p>
+      <w:pPr>
         <w:pStyle w:val="Heading1"/>
       </w:pPr>
       <w:r>
@@ -699,7 +731,15 @@
         <w:pStyle w:val="Heading2"/>
       </w:pPr>
       <w:r>
-        <w:t>1. 유지 규칙과 삭제 규칙의 효과</w:t>
+        <w:t>1. 초기 반복 편집의 얼굴 보존 지표</w:t>
+      </w:r>
+    </w:p>
+    <w:p>
+      <w:pPr>
+        <w:jc w:val="both"/>
+      </w:pPr>
+      <w:r>
+        <w:t>순차 편집의 위치 보정 얼굴 LPIPS 평균은 1단계 0.042116, 5단계 0.173505, 10단계 0.364015였다. 합성 인물 6명의 순차 편집 10단계 최종 출력과 원본 기반 최종 출력을 같은 요구에서 비교하였다. 표 1은 얼굴 위치를 보정한 LPIPS이다.</w:t>
       </w:r>
     </w:p>
     <w:p>
@@ -711,7 +751,605 @@
         <w:jc w:val="center"/>
       </w:pPr>
       <w:r>
-        <w:t>표 1. 유지 규칙과 삭제 규칙의 비교</w:t>
+        <w:t>표 1. 초기 6인물 실험의 위치 보정 얼굴 LPIPS</w:t>
+      </w:r>
+    </w:p>
+    <w:tbl>
+      <w:tblPr>
+        <w:tblW w:type="auto" w:w="0"/>
+        <w:tblLayout w:type="fixed"/>
+        <w:tblLook w:firstColumn="1" w:firstRow="1" w:lastColumn="0" w:lastRow="0" w:noHBand="0" w:noVBand="1" w:val="04A0"/>
+      </w:tblPr>
+      <w:tblGrid>
+        <w:gridCol w:w="1417"/>
+        <w:gridCol w:w="1602"/>
+        <w:gridCol w:w="1602"/>
+      </w:tblGrid>
+      <w:tr>
+        <w:trPr>
+          <w:cantSplit/>
+          <w:tblHeader/>
+        </w:trPr>
+        <w:tc>
+          <w:tcPr>
+            <w:tcW w:type="dxa" w:w="1417"/>
+            <w:tcMar>
+              <w:left w:w="45" w:type="dxa"/>
+              <w:right w:w="45" w:type="dxa"/>
+            </w:tcMar>
+            <w:tcBorders>
+              <w:bottom w:val="single" w:sz="5"/>
+            </w:tcBorders>
+          </w:tcPr>
+          <w:p>
+            <w:pPr>
+              <w:keepNext/>
+              <w:spacing w:after="60" w:before="60" w:line="240" w:lineRule="auto"/>
+              <w:ind w:firstLine="0"/>
+              <w:jc w:val="left"/>
+            </w:pPr>
+            <w:r>
+              <w:rPr>
+                <w:b/>
+                <w:sz w:val="16"/>
+              </w:rPr>
+              <w:t>인물</w:t>
+            </w:r>
+          </w:p>
+        </w:tc>
+        <w:tc>
+          <w:tcPr>
+            <w:tcW w:type="dxa" w:w="1602"/>
+            <w:tcMar>
+              <w:left w:w="45" w:type="dxa"/>
+              <w:right w:w="45" w:type="dxa"/>
+            </w:tcMar>
+            <w:tcBorders>
+              <w:bottom w:val="single" w:sz="5"/>
+            </w:tcBorders>
+          </w:tcPr>
+          <w:p>
+            <w:pPr>
+              <w:keepNext/>
+              <w:spacing w:after="60" w:before="60" w:line="240" w:lineRule="auto"/>
+              <w:ind w:firstLine="0"/>
+              <w:jc w:val="center"/>
+            </w:pPr>
+            <w:r>
+              <w:rPr>
+                <w:b/>
+                <w:sz w:val="16"/>
+              </w:rPr>
+              <w:t>순차 편집</w:t>
+            </w:r>
+          </w:p>
+        </w:tc>
+        <w:tc>
+          <w:tcPr>
+            <w:tcW w:type="dxa" w:w="1602"/>
+            <w:tcMar>
+              <w:left w:w="45" w:type="dxa"/>
+              <w:right w:w="45" w:type="dxa"/>
+            </w:tcMar>
+            <w:tcBorders>
+              <w:bottom w:val="single" w:sz="5"/>
+            </w:tcBorders>
+          </w:tcPr>
+          <w:p>
+            <w:pPr>
+              <w:keepNext/>
+              <w:spacing w:after="60" w:before="60" w:line="240" w:lineRule="auto"/>
+              <w:ind w:firstLine="0"/>
+              <w:jc w:val="center"/>
+            </w:pPr>
+            <w:r>
+              <w:rPr>
+                <w:b/>
+                <w:sz w:val="16"/>
+              </w:rPr>
+              <w:t>원본 기반 재생성</w:t>
+            </w:r>
+          </w:p>
+        </w:tc>
+      </w:tr>
+      <w:tr>
+        <w:trPr>
+          <w:cantSplit/>
+        </w:trPr>
+        <w:tc>
+          <w:tcPr>
+            <w:tcW w:type="dxa" w:w="1417"/>
+            <w:tcMar>
+              <w:left w:w="45" w:type="dxa"/>
+              <w:right w:w="45" w:type="dxa"/>
+            </w:tcMar>
+          </w:tcPr>
+          <w:p>
+            <w:pPr>
+              <w:keepNext/>
+              <w:spacing w:after="60" w:before="60" w:line="240" w:lineRule="auto"/>
+              <w:ind w:firstLine="0"/>
+              <w:jc w:val="left"/>
+            </w:pPr>
+            <w:r>
+              <w:rPr>
+                <w:b w:val="0"/>
+                <w:sz w:val="16"/>
+              </w:rPr>
+              <w:t>P01</w:t>
+            </w:r>
+          </w:p>
+        </w:tc>
+        <w:tc>
+          <w:tcPr>
+            <w:tcW w:type="dxa" w:w="1602"/>
+            <w:tcMar>
+              <w:left w:w="45" w:type="dxa"/>
+              <w:right w:w="45" w:type="dxa"/>
+            </w:tcMar>
+          </w:tcPr>
+          <w:p>
+            <w:pPr>
+              <w:keepNext/>
+              <w:spacing w:after="60" w:before="60" w:line="240" w:lineRule="auto"/>
+              <w:ind w:firstLine="0"/>
+              <w:jc w:val="center"/>
+            </w:pPr>
+            <w:r>
+              <w:rPr>
+                <w:b w:val="0"/>
+                <w:sz w:val="16"/>
+              </w:rPr>
+              <w:t>0.261778</w:t>
+            </w:r>
+          </w:p>
+        </w:tc>
+        <w:tc>
+          <w:tcPr>
+            <w:tcW w:type="dxa" w:w="1602"/>
+            <w:tcMar>
+              <w:left w:w="45" w:type="dxa"/>
+              <w:right w:w="45" w:type="dxa"/>
+            </w:tcMar>
+          </w:tcPr>
+          <w:p>
+            <w:pPr>
+              <w:keepNext/>
+              <w:spacing w:after="60" w:before="60" w:line="240" w:lineRule="auto"/>
+              <w:ind w:firstLine="0"/>
+              <w:jc w:val="center"/>
+            </w:pPr>
+            <w:r>
+              <w:rPr>
+                <w:b w:val="0"/>
+                <w:sz w:val="16"/>
+              </w:rPr>
+              <w:t>0.170199</w:t>
+            </w:r>
+          </w:p>
+        </w:tc>
+      </w:tr>
+      <w:tr>
+        <w:trPr>
+          <w:cantSplit/>
+        </w:trPr>
+        <w:tc>
+          <w:tcPr>
+            <w:tcW w:type="dxa" w:w="1417"/>
+            <w:tcMar>
+              <w:left w:w="45" w:type="dxa"/>
+              <w:right w:w="45" w:type="dxa"/>
+            </w:tcMar>
+          </w:tcPr>
+          <w:p>
+            <w:pPr>
+              <w:keepNext/>
+              <w:spacing w:after="60" w:before="60" w:line="240" w:lineRule="auto"/>
+              <w:ind w:firstLine="0"/>
+              <w:jc w:val="left"/>
+            </w:pPr>
+            <w:r>
+              <w:rPr>
+                <w:b w:val="0"/>
+                <w:sz w:val="16"/>
+              </w:rPr>
+              <w:t>P02</w:t>
+            </w:r>
+          </w:p>
+        </w:tc>
+        <w:tc>
+          <w:tcPr>
+            <w:tcW w:type="dxa" w:w="1602"/>
+            <w:tcMar>
+              <w:left w:w="45" w:type="dxa"/>
+              <w:right w:w="45" w:type="dxa"/>
+            </w:tcMar>
+          </w:tcPr>
+          <w:p>
+            <w:pPr>
+              <w:keepNext/>
+              <w:spacing w:after="60" w:before="60" w:line="240" w:lineRule="auto"/>
+              <w:ind w:firstLine="0"/>
+              <w:jc w:val="center"/>
+            </w:pPr>
+            <w:r>
+              <w:rPr>
+                <w:b w:val="0"/>
+                <w:sz w:val="16"/>
+              </w:rPr>
+              <w:t>0.260761</w:t>
+            </w:r>
+          </w:p>
+        </w:tc>
+        <w:tc>
+          <w:tcPr>
+            <w:tcW w:type="dxa" w:w="1602"/>
+            <w:tcMar>
+              <w:left w:w="45" w:type="dxa"/>
+              <w:right w:w="45" w:type="dxa"/>
+            </w:tcMar>
+          </w:tcPr>
+          <w:p>
+            <w:pPr>
+              <w:keepNext/>
+              <w:spacing w:after="60" w:before="60" w:line="240" w:lineRule="auto"/>
+              <w:ind w:firstLine="0"/>
+              <w:jc w:val="center"/>
+            </w:pPr>
+            <w:r>
+              <w:rPr>
+                <w:b w:val="0"/>
+                <w:sz w:val="16"/>
+              </w:rPr>
+              <w:t>0.117232</w:t>
+            </w:r>
+          </w:p>
+        </w:tc>
+      </w:tr>
+      <w:tr>
+        <w:trPr>
+          <w:cantSplit/>
+        </w:trPr>
+        <w:tc>
+          <w:tcPr>
+            <w:tcW w:type="dxa" w:w="1417"/>
+            <w:tcMar>
+              <w:left w:w="45" w:type="dxa"/>
+              <w:right w:w="45" w:type="dxa"/>
+            </w:tcMar>
+          </w:tcPr>
+          <w:p>
+            <w:pPr>
+              <w:keepNext/>
+              <w:spacing w:after="60" w:before="60" w:line="240" w:lineRule="auto"/>
+              <w:ind w:firstLine="0"/>
+              <w:jc w:val="left"/>
+            </w:pPr>
+            <w:r>
+              <w:rPr>
+                <w:b w:val="0"/>
+                <w:sz w:val="16"/>
+              </w:rPr>
+              <w:t>P03</w:t>
+            </w:r>
+          </w:p>
+        </w:tc>
+        <w:tc>
+          <w:tcPr>
+            <w:tcW w:type="dxa" w:w="1602"/>
+            <w:tcMar>
+              <w:left w:w="45" w:type="dxa"/>
+              <w:right w:w="45" w:type="dxa"/>
+            </w:tcMar>
+          </w:tcPr>
+          <w:p>
+            <w:pPr>
+              <w:keepNext/>
+              <w:spacing w:after="60" w:before="60" w:line="240" w:lineRule="auto"/>
+              <w:ind w:firstLine="0"/>
+              <w:jc w:val="center"/>
+            </w:pPr>
+            <w:r>
+              <w:rPr>
+                <w:b w:val="0"/>
+                <w:sz w:val="16"/>
+              </w:rPr>
+              <w:t>0.345599</w:t>
+            </w:r>
+          </w:p>
+        </w:tc>
+        <w:tc>
+          <w:tcPr>
+            <w:tcW w:type="dxa" w:w="1602"/>
+            <w:tcMar>
+              <w:left w:w="45" w:type="dxa"/>
+              <w:right w:w="45" w:type="dxa"/>
+            </w:tcMar>
+          </w:tcPr>
+          <w:p>
+            <w:pPr>
+              <w:keepNext/>
+              <w:spacing w:after="60" w:before="60" w:line="240" w:lineRule="auto"/>
+              <w:ind w:firstLine="0"/>
+              <w:jc w:val="center"/>
+            </w:pPr>
+            <w:r>
+              <w:rPr>
+                <w:b w:val="0"/>
+                <w:sz w:val="16"/>
+              </w:rPr>
+              <w:t>0.210225</w:t>
+            </w:r>
+          </w:p>
+        </w:tc>
+      </w:tr>
+      <w:tr>
+        <w:trPr>
+          <w:cantSplit/>
+        </w:trPr>
+        <w:tc>
+          <w:tcPr>
+            <w:tcW w:type="dxa" w:w="1417"/>
+            <w:tcMar>
+              <w:left w:w="45" w:type="dxa"/>
+              <w:right w:w="45" w:type="dxa"/>
+            </w:tcMar>
+          </w:tcPr>
+          <w:p>
+            <w:pPr>
+              <w:keepNext/>
+              <w:spacing w:after="60" w:before="60" w:line="240" w:lineRule="auto"/>
+              <w:ind w:firstLine="0"/>
+              <w:jc w:val="left"/>
+            </w:pPr>
+            <w:r>
+              <w:rPr>
+                <w:b w:val="0"/>
+                <w:sz w:val="16"/>
+              </w:rPr>
+              <w:t>P04</w:t>
+            </w:r>
+          </w:p>
+        </w:tc>
+        <w:tc>
+          <w:tcPr>
+            <w:tcW w:type="dxa" w:w="1602"/>
+            <w:tcMar>
+              <w:left w:w="45" w:type="dxa"/>
+              <w:right w:w="45" w:type="dxa"/>
+            </w:tcMar>
+          </w:tcPr>
+          <w:p>
+            <w:pPr>
+              <w:keepNext/>
+              <w:spacing w:after="60" w:before="60" w:line="240" w:lineRule="auto"/>
+              <w:ind w:firstLine="0"/>
+              <w:jc w:val="center"/>
+            </w:pPr>
+            <w:r>
+              <w:rPr>
+                <w:b w:val="0"/>
+                <w:sz w:val="16"/>
+              </w:rPr>
+              <w:t>0.312155</w:t>
+            </w:r>
+          </w:p>
+        </w:tc>
+        <w:tc>
+          <w:tcPr>
+            <w:tcW w:type="dxa" w:w="1602"/>
+            <w:tcMar>
+              <w:left w:w="45" w:type="dxa"/>
+              <w:right w:w="45" w:type="dxa"/>
+            </w:tcMar>
+          </w:tcPr>
+          <w:p>
+            <w:pPr>
+              <w:keepNext/>
+              <w:spacing w:after="60" w:before="60" w:line="240" w:lineRule="auto"/>
+              <w:ind w:firstLine="0"/>
+              <w:jc w:val="center"/>
+            </w:pPr>
+            <w:r>
+              <w:rPr>
+                <w:b w:val="0"/>
+                <w:sz w:val="16"/>
+              </w:rPr>
+              <w:t>0.192125</w:t>
+            </w:r>
+          </w:p>
+        </w:tc>
+      </w:tr>
+      <w:tr>
+        <w:trPr>
+          <w:cantSplit/>
+        </w:trPr>
+        <w:tc>
+          <w:tcPr>
+            <w:tcW w:type="dxa" w:w="1417"/>
+            <w:tcMar>
+              <w:left w:w="45" w:type="dxa"/>
+              <w:right w:w="45" w:type="dxa"/>
+            </w:tcMar>
+          </w:tcPr>
+          <w:p>
+            <w:pPr>
+              <w:keepNext/>
+              <w:spacing w:after="60" w:before="60" w:line="240" w:lineRule="auto"/>
+              <w:ind w:firstLine="0"/>
+              <w:jc w:val="left"/>
+            </w:pPr>
+            <w:r>
+              <w:rPr>
+                <w:b w:val="0"/>
+                <w:sz w:val="16"/>
+              </w:rPr>
+              <w:t>P05</w:t>
+            </w:r>
+          </w:p>
+        </w:tc>
+        <w:tc>
+          <w:tcPr>
+            <w:tcW w:type="dxa" w:w="1602"/>
+            <w:tcMar>
+              <w:left w:w="45" w:type="dxa"/>
+              <w:right w:w="45" w:type="dxa"/>
+            </w:tcMar>
+          </w:tcPr>
+          <w:p>
+            <w:pPr>
+              <w:keepNext/>
+              <w:spacing w:after="60" w:before="60" w:line="240" w:lineRule="auto"/>
+              <w:ind w:firstLine="0"/>
+              <w:jc w:val="center"/>
+            </w:pPr>
+            <w:r>
+              <w:rPr>
+                <w:b w:val="0"/>
+                <w:sz w:val="16"/>
+              </w:rPr>
+              <w:t>0.613747</w:t>
+            </w:r>
+          </w:p>
+        </w:tc>
+        <w:tc>
+          <w:tcPr>
+            <w:tcW w:type="dxa" w:w="1602"/>
+            <w:tcMar>
+              <w:left w:w="45" w:type="dxa"/>
+              <w:right w:w="45" w:type="dxa"/>
+            </w:tcMar>
+          </w:tcPr>
+          <w:p>
+            <w:pPr>
+              <w:keepNext/>
+              <w:spacing w:after="60" w:before="60" w:line="240" w:lineRule="auto"/>
+              <w:ind w:firstLine="0"/>
+              <w:jc w:val="center"/>
+            </w:pPr>
+            <w:r>
+              <w:rPr>
+                <w:b w:val="0"/>
+                <w:sz w:val="16"/>
+              </w:rPr>
+              <w:t>0.577223</w:t>
+            </w:r>
+          </w:p>
+        </w:tc>
+      </w:tr>
+      <w:tr>
+        <w:trPr>
+          <w:cantSplit/>
+        </w:trPr>
+        <w:tc>
+          <w:tcPr>
+            <w:tcW w:type="dxa" w:w="1417"/>
+            <w:tcMar>
+              <w:left w:w="45" w:type="dxa"/>
+              <w:right w:w="45" w:type="dxa"/>
+            </w:tcMar>
+            <w:tcBorders>
+              <w:bottom w:val="single" w:sz="5"/>
+            </w:tcBorders>
+          </w:tcPr>
+          <w:p>
+            <w:pPr>
+              <w:keepNext w:val="0"/>
+              <w:spacing w:after="60" w:before="60" w:line="240" w:lineRule="auto"/>
+              <w:ind w:firstLine="0"/>
+              <w:jc w:val="left"/>
+            </w:pPr>
+            <w:r>
+              <w:rPr>
+                <w:b w:val="0"/>
+                <w:sz w:val="16"/>
+              </w:rPr>
+              <w:t>P06</w:t>
+            </w:r>
+          </w:p>
+        </w:tc>
+        <w:tc>
+          <w:tcPr>
+            <w:tcW w:type="dxa" w:w="1602"/>
+            <w:tcMar>
+              <w:left w:w="45" w:type="dxa"/>
+              <w:right w:w="45" w:type="dxa"/>
+            </w:tcMar>
+            <w:tcBorders>
+              <w:bottom w:val="single" w:sz="5"/>
+            </w:tcBorders>
+          </w:tcPr>
+          <w:p>
+            <w:pPr>
+              <w:keepNext w:val="0"/>
+              <w:spacing w:after="60" w:before="60" w:line="240" w:lineRule="auto"/>
+              <w:ind w:firstLine="0"/>
+              <w:jc w:val="center"/>
+            </w:pPr>
+            <w:r>
+              <w:rPr>
+                <w:b w:val="0"/>
+                <w:sz w:val="16"/>
+              </w:rPr>
+              <w:t>0.390048</w:t>
+            </w:r>
+          </w:p>
+        </w:tc>
+        <w:tc>
+          <w:tcPr>
+            <w:tcW w:type="dxa" w:w="1602"/>
+            <w:tcMar>
+              <w:left w:w="45" w:type="dxa"/>
+              <w:right w:w="45" w:type="dxa"/>
+            </w:tcMar>
+            <w:tcBorders>
+              <w:bottom w:val="single" w:sz="5"/>
+            </w:tcBorders>
+          </w:tcPr>
+          <w:p>
+            <w:pPr>
+              <w:keepNext w:val="0"/>
+              <w:spacing w:after="60" w:before="60" w:line="240" w:lineRule="auto"/>
+              <w:ind w:firstLine="0"/>
+              <w:jc w:val="center"/>
+            </w:pPr>
+            <w:r>
+              <w:rPr>
+                <w:b w:val="0"/>
+                <w:sz w:val="16"/>
+              </w:rPr>
+              <w:t>0.246848</w:t>
+            </w:r>
+          </w:p>
+        </w:tc>
+      </w:tr>
+    </w:tbl>
+    <w:p>
+      <w:pPr>
+        <w:jc w:val="both"/>
+      </w:pPr>
+      <w:r>
+        <w:t>위치 보정 후 MAE·SSIM·LPIPS는 모두 6/6쌍에서 원본 기반 방식에 유리하였다. 위치 보정 전에는 각 지표가 5/6쌍에서 같은 방향이었다. sigma 1과 6에서도 세 지표 모두 6/6쌍에서 같은 방향을 유지하였다. 저장된 지표와 재계산 값의 최대 절대오차는 0이었다. 지표는 얼굴 위치·색·조명과 형태의 차이를 함께 반영한다. 이 결과를 바탕으로 현재 요청을 상태로 정리하여 원본에 적용하는 방법을 구성하였다.</w:t>
+      </w:r>
+    </w:p>
+    <w:p>
+      <w:pPr>
+        <w:pStyle w:val="Heading2"/>
+      </w:pPr>
+      <w:r>
+        <w:t>2. 유지 규칙과 삭제 규칙의 효과</w:t>
+      </w:r>
+    </w:p>
+    <w:p>
+      <w:pPr>
+        <w:pStyle w:val="Caption"/>
+        <w:keepNext/>
+        <w:spacing w:before="100"/>
+        <w:ind w:firstLine="0"/>
+        <w:jc w:val="center"/>
+      </w:pPr>
+      <w:r>
+        <w:t>표 2. 유지 규칙과 삭제 규칙의 비교</w:t>
       </w:r>
     </w:p>
     <w:tbl>
@@ -1405,7 +2043,7 @@
         <w:pStyle w:val="Heading2"/>
       </w:pPr>
       <w:r>
-        <w:t>2. 유지와 삭제의 상호 보완 사례</w:t>
+        <w:t>3. 유지와 삭제의 상호 보완 사례</w:t>
       </w:r>
     </w:p>
     <w:p>
@@ -1421,7 +2059,7 @@
         <w:pStyle w:val="Heading2"/>
       </w:pPr>
       <w:r>
-        <w:t>3. 새 대화에서의 재검증</w:t>
+        <w:t>4. 새 대화에서의 재검증</w:t>
       </w:r>
     </w:p>
     <w:p>
@@ -1429,7 +2067,7 @@
         <w:jc w:val="both"/>
       </w:pPr>
       <w:r>
-        <w:t>규칙 비교 자료에 항목별 적용과 유지·삭제를 결합한 사후 재계산은 32/32였다. 추론 전에 확정한 새 대화 8개, 요청 32개에 같은 코드를 적용하여 재검증하였다. 모든 방법은 추출·재검토 응답 64개를 공유하였다(표 2).</w:t>
+        <w:t>규칙 비교 자료에 항목별 적용과 유지·삭제를 결합한 사후 재계산은 32/32였다. 추론 전에 확정한 새 대화 8개, 요청 32개에 같은 코드를 적용하여 재검증하였다. 모든 방법은 추출·재검토 응답 64개를 공유하였다(표 3).</w:t>
       </w:r>
     </w:p>
     <w:p>
@@ -1441,7 +2079,7 @@
         <w:jc w:val="center"/>
       </w:pPr>
       <w:r>
-        <w:t>표 2. 새 대화에서 항목별 적용의 효과</w:t>
+        <w:t>표 3. 새 대화에서 항목별 적용의 효과</w:t>
       </w:r>
     </w:p>
     <w:tbl>
@@ -2147,7 +2785,7 @@
         <w:pStyle w:val="Heading2"/>
       </w:pPr>
       <w:r>
-        <w:t>4. 이미지 편집 결과</w:t>
+        <w:t>5. 이미지 편집 결과</w:t>
       </w:r>
     </w:p>
     <w:p>
@@ -2289,7 +2927,7 @@
         <w:jc w:val="center"/>
       </w:pPr>
       <w:r>
-        <w:t>표 3. 3B 모델의 이미지 평가</w:t>
+        <w:t>표 4. 3B 모델의 이미지 평가</w:t>
       </w:r>
     </w:p>
     <w:tbl>
@@ -2753,7 +3391,7 @@
         <w:jc w:val="center"/>
       </w:pPr>
       <w:r>
-        <w:t>표 4. 7B 모델의 사후 이미지 평가</w:t>
+        <w:t>표 5. 7B 모델의 사후 이미지 평가</w:t>
       </w:r>
     </w:p>
     <w:tbl>
@@ -3112,7 +3750,7 @@
         <w:jc w:val="center"/>
       </w:pPr>
       <w:r>
-        <w:t>표 5. 입력이 다른 네 쌍의 목표 충족 수</w:t>
+        <w:t>표 6. 입력이 다른 네 쌍의 목표 충족 수</w:t>
       </w:r>
     </w:p>
     <w:tbl>
@@ -3814,7 +4452,7 @@
         <w:pStyle w:val="Heading2"/>
       </w:pPr>
       <w:r>
-        <w:t>5. 복합 요청에서의 삭제와 복원 혼동</w:t>
+        <w:t>6. 복합 요청에서의 삭제와 복원 혼동</w:t>
       </w:r>
     </w:p>
     <w:p>
@@ -3826,7 +4464,7 @@
         <w:jc w:val="center"/>
       </w:pPr>
       <w:r>
-        <w:t>표 6. 복합 요청 실험의 조건별 전체 상태 일치율</w:t>
+        <w:t>표 7. 복합 요청 실험의 조건별 전체 상태 일치율</w:t>
       </w:r>
     </w:p>
     <w:tbl>
@@ -4276,7 +4914,7 @@
         <w:jc w:val="both"/>
       </w:pPr>
       <w:r>
-        <w:t>표 6은 요청 처리 후 아홉 항목이 모두 정답과 일치한 비율이다. 세 방법 모두 표정·몸 방향·손동작은 조건별 48항목을 정확히 처리하였다. 혼합 조건의 항목별 일치율은 최초 추출과 재검토가 각각 124/144, 규칙 보정이 144/144였다. 최종 상태 일치율은 각각 0/4, 0/4, 4/4였다.</w:t>
+        <w:t>표 7은 요청 처리 후 아홉 항목이 모두 정답과 일치한 비율이다. 세 방법 모두 표정·몸 방향·손동작은 조건별 48항목을 정확히 처리하였다. 혼합 조건의 항목별 일치율은 최초 추출과 재검토가 각각 124/144, 규칙 보정이 144/144였다. 최종 상태 일치율은 각각 0/4, 0/4, 4/4였다.</w:t>
       </w:r>
     </w:p>
     <w:p>
@@ -4308,7 +4946,7 @@
         <w:pStyle w:val="Heading2"/>
       </w:pPr>
       <w:r>
-        <w:t>6. 복합 요청 이미지의 평가 오류</w:t>
+        <w:t>7. 복합 요청 이미지의 평가 오류</w:t>
       </w:r>
     </w:p>
     <w:p>
@@ -4332,7 +4970,7 @@
         <w:pStyle w:val="Heading2"/>
       </w:pPr>
       <w:r>
-        <w:t>7. 표현 변화와 구절 정규화의 효과</w:t>
+        <w:t>8. 표현 변화와 구절 정규화의 효과</w:t>
       </w:r>
     </w:p>
     <w:p>
@@ -4368,7 +5006,7 @@
         <w:jc w:val="center"/>
       </w:pPr>
       <w:r>
-        <w:t>표 7. 구절 정규화와 항목별 적용의 새 대화 검증</w:t>
+        <w:t>표 8. 구절 정규화와 항목별 적용의 새 대화 검증</w:t>
       </w:r>
     </w:p>
     <w:tbl>
@@ -5179,7 +5817,7 @@
         <w:jc w:val="both"/>
       </w:pPr>
       <w:r>
-        <w:t>표 7의 추가 오류 수는 기준 방법이 맞았으나 해당 방법 적용 후 틀린 요청 수다. 구절 정규화는 기준보다 요청 일곱 개, 기존 유지·삭제보다 여섯 개를 더 맞혔다. 차이는 첫째·둘째·넷째 대화에서 나타났고 셋째 대화는 모든 방법이 네 요청을 모두 맞혔다. 정규화만 사용한 결과와 항목별 적용을 결합한 결과는 같았다. 이 새 대화에서는 구절 정규화만으로 결합 방법과 같은 결과를 얻었다.</w:t>
+        <w:t>표 8의 추가 오류 수는 기준 방법이 맞았으나 해당 방법 적용 후 틀린 요청 수다. 구절 정규화는 기준보다 요청 일곱 개, 기존 유지·삭제보다 여섯 개를 더 맞혔다. 차이는 첫째·둘째·넷째 대화에서 나타났고 셋째 대화는 모든 방법이 네 요청을 모두 맞혔다. 정규화만 사용한 결과와 항목별 적용을 결합한 결과는 같았다. 이 새 대화에서는 구절 정규화만으로 결합 방법과 같은 결과를 얻었다.</w:t>
       </w:r>
     </w:p>
     <w:p>
@@ -5195,7 +5833,7 @@
         <w:pStyle w:val="Heading2"/>
       </w:pPr>
       <w:r>
-        <w:t>8. 문장 구조에 따른 처리 차이</w:t>
+        <w:t>9. 문장 구조에 따른 처리 차이</w:t>
       </w:r>
     </w:p>
     <w:p>
@@ -5203,7 +5841,7 @@
         <w:jc w:val="both"/>
       </w:pPr>
       <w:r>
-        <w:t>같은 목표를 네 구조로 요청한 대조에서 전체 상태 일치율은 기준 18/36, 기존 유지·삭제 26/36, 구절 정규화 36/36이었다. 항목별 적용만 사용하면 26/36, 정규화와 결합하면 36/36으로 앞선 새 대화 검증과 같은 구성요소별 차이가 나타났다. 초기 설정은 모든 방법이 12회 모두 맞혔다. 표 8은 복원과 유지를 함께 요청한 두 번째 단계에서 세 목표 구성의 상태가 모두 맞았는지 비교한 결과다.</w:t>
+        <w:t>같은 목표를 네 구조로 요청한 대조에서 전체 상태 일치율은 기준 18/36, 기존 유지·삭제 26/36, 구절 정규화 36/36이었다. 항목별 적용만 사용하면 26/36, 정규화와 결합하면 36/36으로 앞선 새 대화 검증과 같은 구성요소별 차이가 나타났다. 초기 설정은 모든 방법이 12회 모두 맞혔다. 표 9은 복원과 유지를 함께 요청한 두 번째 단계에서 세 목표 구성의 상태가 모두 맞았는지 비교한 결과다.</w:t>
       </w:r>
     </w:p>
     <w:p>
@@ -5215,7 +5853,7 @@
         <w:jc w:val="center"/>
       </w:pPr>
       <w:r>
-        <w:t>표 8. 같은 복원·유지 목표의 문장 구조별 전체 상태 일치율</w:t>
+        <w:t>표 9. 같은 복원·유지 목표의 문장 구조별 전체 상태 일치율</w:t>
       </w:r>
     </w:p>
     <w:tbl>
@@ -5766,7 +6404,7 @@
         <w:jc w:val="both"/>
       </w:pPr>
       <w:r>
-        <w:t>기존 유지·삭제 규칙은 unchanged를 포함한 leaving 구절을 처리하였으나 preserving 연결에서는 세 구성 모두 틀렸다. bring back 구조에서도 세 구성 중 한 구성만 맞혔다. 정규화는 네 구조 모두에서 세 구성을 맞혔다. 다음 변경 요청을 처리한 뒤에도 결과는 표 8과 같았다. 앞서 생긴 상태 오류가 다음 요청까지 남았기 때문이다.</w:t>
+        <w:t>기존 유지·삭제 규칙은 unchanged를 포함한 leaving 구절을 처리하였으나 preserving 연결에서는 세 구성 모두 틀렸다. bring back 구조에서도 세 구성 중 한 구성만 맞혔다. 정규화는 네 구조 모두에서 세 구성을 맞혔다. 다음 변경 요청을 처리한 뒤에도 결과는 표 9과 같았다. 앞서 생긴 상태 오류가 다음 요청까지 남았기 때문이다.</w:t>
       </w:r>
     </w:p>
     <w:p>
@@ -5782,7 +6420,7 @@
         <w:pStyle w:val="Heading2"/>
       </w:pPr>
       <w:r>
-        <w:t>9. 표현과 지시 순서에 따른 처리 결과</w:t>
+        <w:t>10. 표현과 지시 순서에 따른 처리 결과</w:t>
       </w:r>
     </w:p>
     <w:p>
@@ -5798,7 +6436,7 @@
         <w:jc w:val="both"/>
       </w:pPr>
       <w:r>
-        <w:t>표 9는 표현을 바꾼 두 번째와 세 번째 요청만 비교한 결과다. 각 유형에는 네 편집 조건의 요청 두 개씩, 총 여덟 개가 포함된다.</w:t>
+        <w:t>표 10는 표현을 바꾼 두 번째와 세 번째 요청만 비교한 결과다. 각 유형에는 네 편집 조건의 요청 두 개씩, 총 여덟 개가 포함된다.</w:t>
       </w:r>
     </w:p>
     <w:p>
@@ -5810,7 +6448,7 @@
         <w:jc w:val="center"/>
       </w:pPr>
       <w:r>
-        <w:t>표 9. 표현 유형별 복원과 삭제 요청의 전체 상태 일치율</w:t>
+        <w:t>표 10. 표현 유형별 복원과 삭제 요청의 전체 상태 일치율</w:t>
       </w:r>
     </w:p>
     <w:tbl>
@@ -6379,7 +7017,7 @@
         <w:pStyle w:val="Heading2"/>
       </w:pPr>
       <w:r>
-        <w:t>10. 복원 표현 개선의 두 모델 검증</w:t>
+        <w:t>11. 복원 표현 개선의 두 모델 검증</w:t>
       </w:r>
     </w:p>
     <w:p>
@@ -6387,7 +7025,7 @@
         <w:jc w:val="both"/>
       </w:pPr>
       <w:r>
-        <w:t>앞선 48개 요청을 개발 자료로 사용하여 재계산한 결과, 기존 정규화 36/48에서 복원 표현 개선 48/48로 증가하였다. 구현을 고정한 뒤 새로운 요청 32개를 두 모델에 각각 적용한 결과를 표 10에 제시하였다.</w:t>
+        <w:t>앞선 48개 요청을 개발 자료로 사용하여 재계산한 결과, 기존 정규화 36/48에서 복원 표현 개선 48/48로 증가하였다. 구현을 고정한 뒤 새로운 요청 32개를 두 모델에 각각 적용한 결과를 표 11에 제시하였다.</w:t>
       </w:r>
     </w:p>
     <w:p>
@@ -6399,7 +7037,7 @@
         <w:jc w:val="center"/>
       </w:pPr>
       <w:r>
-        <w:t>표 10. 복원 표현 개선의 모델별 전체 상태 일치율</w:t>
+        <w:t>표 11. 복원 표현 개선의 모델별 전체 상태 일치율</w:t>
       </w:r>
     </w:p>
     <w:tbl>
@@ -7139,7 +7777,7 @@
         <w:pStyle w:val="Heading2"/>
       </w:pPr>
       <w:r>
-        <w:t>11. 실행 대상 검사의 효과와 재검토 오류</w:t>
+        <w:t>12. 실행 대상 검사의 효과와 재검토 오류</w:t>
       </w:r>
     </w:p>
     <w:p>
@@ -7147,7 +7785,7 @@
         <w:jc w:val="both"/>
       </w:pPr>
       <w:r>
-        <w:t>위 32개를 개발 자료로 사용하여 실행 대상 검사를 추가한 재계산 결과는 Qwen3 32/32, Llama 19/32였다. 새 요청 16개로 수행한 검증 결과는 표 11과 같다.</w:t>
+        <w:t>위 32개를 개발 자료로 사용하여 실행 대상 검사를 추가한 재계산 결과는 Qwen3 32/32, Llama 19/32였다. 새 요청 16개로 수행한 검증 결과는 표 12과 같다.</w:t>
       </w:r>
     </w:p>
     <w:p>
@@ -7159,7 +7797,7 @@
         <w:jc w:val="center"/>
       </w:pPr>
       <w:r>
-        <w:t>표 11. 실행 대상 검사의 새 요청 검증</w:t>
+        <w:t>표 12. 실행 대상 검사의 새 요청 검증</w:t>
       </w:r>
     </w:p>
     <w:tbl>
@@ -7522,7 +8160,7 @@
         <w:pStyle w:val="Heading2"/>
       </w:pPr>
       <w:r>
-        <w:t>12. 한 번 추출하는 방법의 정확도와 호출 횟수</w:t>
+        <w:t>13. 한 번 추출하는 방법의 정확도와 호출 횟수</w:t>
       </w:r>
     </w:p>
     <w:p>
@@ -7530,7 +8168,7 @@
         <w:jc w:val="both"/>
       </w:pPr>
       <w:r>
-        <w:t>32개 개발 자료에서 최초 응답에만 최종 지시 검사를 적용하면 Qwen3 32/32, Llama 27/32였다. 추출·재검토 응답을 함께 사용하면 각각 32/32와 19/32였다. 이를 바탕으로 코드를 고정하고 새 요청 12개에서 비교한 결과를 표 12에 제시하였다.</w:t>
+        <w:t>32개 개발 자료에서 최초 응답에만 최종 지시 검사를 적용하면 Qwen3 32/32, Llama 27/32였다. 추출·재검토 응답을 함께 사용하면 각각 32/32와 19/32였다. 이를 바탕으로 코드를 고정하고 새 요청 12개에서 비교한 결과를 표 13에 제시하였다.</w:t>
       </w:r>
     </w:p>
     <w:p>
@@ -7542,7 +8180,7 @@
         <w:jc w:val="center"/>
       </w:pPr>
       <w:r>
-        <w:t>표 12. 새 요청에서의 전체 상태 일치율과 필요한 모델 호출 수</w:t>
+        <w:t>표 13. 새 요청에서의 전체 상태 일치율과 필요한 모델 호출 수</w:t>
       </w:r>
     </w:p>
     <w:tbl>
@@ -8207,10 +8845,1719 @@
     </w:p>
     <w:p>
       <w:pPr>
+        <w:pStyle w:val="Heading2"/>
+      </w:pPr>
+      <w:r>
+        <w:t>14. 현재 조건 정리에 따른 프롬프트 길이</w:t>
+      </w:r>
+    </w:p>
+    <w:p>
+      <w:pPr>
+        <w:pStyle w:val="Caption"/>
+        <w:keepNext/>
+        <w:spacing w:before="100"/>
+        <w:ind w:firstLine="0"/>
+        <w:jc w:val="center"/>
+      </w:pPr>
+      <w:r>
+        <w:t>표 14. 마지막 요청에서 전체 프롬프트의 평균 길이</w:t>
+      </w:r>
+    </w:p>
+    <w:tbl>
+      <w:tblPr>
+        <w:tblW w:type="auto" w:w="0"/>
+        <w:tblLayout w:type="fixed"/>
+        <w:tblLook w:firstColumn="1" w:firstRow="1" w:lastColumn="0" w:lastRow="0" w:noHBand="0" w:noVBand="1" w:val="04A0"/>
+      </w:tblPr>
+      <w:tblGrid>
+        <w:gridCol w:w="1417"/>
+        <w:gridCol w:w="1068"/>
+        <w:gridCol w:w="1068"/>
+        <w:gridCol w:w="1068"/>
+      </w:tblGrid>
+      <w:tr>
+        <w:trPr>
+          <w:cantSplit/>
+          <w:tblHeader/>
+        </w:trPr>
+        <w:tc>
+          <w:tcPr>
+            <w:tcW w:type="dxa" w:w="1417"/>
+            <w:tcMar>
+              <w:left w:w="45" w:type="dxa"/>
+              <w:right w:w="45" w:type="dxa"/>
+            </w:tcMar>
+            <w:tcBorders>
+              <w:bottom w:val="single" w:sz="5"/>
+            </w:tcBorders>
+          </w:tcPr>
+          <w:p>
+            <w:pPr>
+              <w:keepNext/>
+              <w:spacing w:after="60" w:before="60" w:line="240" w:lineRule="auto"/>
+              <w:ind w:firstLine="0"/>
+              <w:jc w:val="left"/>
+            </w:pPr>
+            <w:r>
+              <w:rPr>
+                <w:b/>
+                <w:sz w:val="16"/>
+              </w:rPr>
+              <w:t>입력 방식</w:t>
+            </w:r>
+          </w:p>
+        </w:tc>
+        <w:tc>
+          <w:tcPr>
+            <w:tcW w:type="dxa" w:w="1068"/>
+            <w:tcMar>
+              <w:left w:w="45" w:type="dxa"/>
+              <w:right w:w="45" w:type="dxa"/>
+            </w:tcMar>
+            <w:tcBorders>
+              <w:bottom w:val="single" w:sz="5"/>
+            </w:tcBorders>
+          </w:tcPr>
+          <w:p>
+            <w:pPr>
+              <w:keepNext/>
+              <w:spacing w:after="60" w:before="60" w:line="240" w:lineRule="auto"/>
+              <w:ind w:firstLine="0"/>
+              <w:jc w:val="center"/>
+            </w:pPr>
+            <w:r>
+              <w:rPr>
+                <w:b/>
+                <w:sz w:val="16"/>
+              </w:rPr>
+              <w:t>평균 문자 수</w:t>
+            </w:r>
+          </w:p>
+        </w:tc>
+        <w:tc>
+          <w:tcPr>
+            <w:tcW w:type="dxa" w:w="1068"/>
+            <w:tcMar>
+              <w:left w:w="45" w:type="dxa"/>
+              <w:right w:w="45" w:type="dxa"/>
+            </w:tcMar>
+            <w:tcBorders>
+              <w:bottom w:val="single" w:sz="5"/>
+            </w:tcBorders>
+          </w:tcPr>
+          <w:p>
+            <w:pPr>
+              <w:keepNext/>
+              <w:spacing w:after="60" w:before="60" w:line="240" w:lineRule="auto"/>
+              <w:ind w:firstLine="0"/>
+              <w:jc w:val="center"/>
+            </w:pPr>
+            <w:r>
+              <w:rPr>
+                <w:b/>
+                <w:sz w:val="16"/>
+              </w:rPr>
+              <w:t>평균 단어 수</w:t>
+            </w:r>
+          </w:p>
+        </w:tc>
+        <w:tc>
+          <w:tcPr>
+            <w:tcW w:type="dxa" w:w="1068"/>
+            <w:tcMar>
+              <w:left w:w="45" w:type="dxa"/>
+              <w:right w:w="45" w:type="dxa"/>
+            </w:tcMar>
+            <w:tcBorders>
+              <w:bottom w:val="single" w:sz="5"/>
+            </w:tcBorders>
+          </w:tcPr>
+          <w:p>
+            <w:pPr>
+              <w:keepNext/>
+              <w:spacing w:after="60" w:before="60" w:line="240" w:lineRule="auto"/>
+              <w:ind w:firstLine="0"/>
+              <w:jc w:val="center"/>
+            </w:pPr>
+            <w:r>
+              <w:rPr>
+                <w:b/>
+                <w:sz w:val="16"/>
+              </w:rPr>
+              <w:t>평균 토큰 수</w:t>
+            </w:r>
+          </w:p>
+        </w:tc>
+      </w:tr>
+      <w:tr>
+        <w:trPr>
+          <w:cantSplit/>
+        </w:trPr>
+        <w:tc>
+          <w:tcPr>
+            <w:tcW w:type="dxa" w:w="1417"/>
+            <w:tcMar>
+              <w:left w:w="45" w:type="dxa"/>
+              <w:right w:w="45" w:type="dxa"/>
+            </w:tcMar>
+          </w:tcPr>
+          <w:p>
+            <w:pPr>
+              <w:keepNext/>
+              <w:spacing w:after="60" w:before="60" w:line="240" w:lineRule="auto"/>
+              <w:ind w:firstLine="0"/>
+              <w:jc w:val="left"/>
+            </w:pPr>
+            <w:r>
+              <w:rPr>
+                <w:b w:val="0"/>
+                <w:sz w:val="16"/>
+              </w:rPr>
+              <w:t>전체 요청 이력</w:t>
+            </w:r>
+          </w:p>
+        </w:tc>
+        <w:tc>
+          <w:tcPr>
+            <w:tcW w:type="dxa" w:w="1068"/>
+            <w:tcMar>
+              <w:left w:w="45" w:type="dxa"/>
+              <w:right w:w="45" w:type="dxa"/>
+            </w:tcMar>
+          </w:tcPr>
+          <w:p>
+            <w:pPr>
+              <w:keepNext/>
+              <w:spacing w:after="60" w:before="60" w:line="240" w:lineRule="auto"/>
+              <w:ind w:firstLine="0"/>
+              <w:jc w:val="center"/>
+            </w:pPr>
+            <w:r>
+              <w:rPr>
+                <w:b w:val="0"/>
+                <w:sz w:val="16"/>
+              </w:rPr>
+              <w:t>958.67</w:t>
+            </w:r>
+          </w:p>
+        </w:tc>
+        <w:tc>
+          <w:tcPr>
+            <w:tcW w:type="dxa" w:w="1068"/>
+            <w:tcMar>
+              <w:left w:w="45" w:type="dxa"/>
+              <w:right w:w="45" w:type="dxa"/>
+            </w:tcMar>
+          </w:tcPr>
+          <w:p>
+            <w:pPr>
+              <w:keepNext/>
+              <w:spacing w:after="60" w:before="60" w:line="240" w:lineRule="auto"/>
+              <w:ind w:firstLine="0"/>
+              <w:jc w:val="center"/>
+            </w:pPr>
+            <w:r>
+              <w:rPr>
+                <w:b w:val="0"/>
+                <w:sz w:val="16"/>
+              </w:rPr>
+              <w:t>156.33</w:t>
+            </w:r>
+          </w:p>
+        </w:tc>
+        <w:tc>
+          <w:tcPr>
+            <w:tcW w:type="dxa" w:w="1068"/>
+            <w:tcMar>
+              <w:left w:w="45" w:type="dxa"/>
+              <w:right w:w="45" w:type="dxa"/>
+            </w:tcMar>
+          </w:tcPr>
+          <w:p>
+            <w:pPr>
+              <w:keepNext/>
+              <w:spacing w:after="60" w:before="60" w:line="240" w:lineRule="auto"/>
+              <w:ind w:firstLine="0"/>
+              <w:jc w:val="center"/>
+            </w:pPr>
+            <w:r>
+              <w:rPr>
+                <w:b w:val="0"/>
+                <w:sz w:val="16"/>
+              </w:rPr>
+              <w:t>204.00</w:t>
+            </w:r>
+          </w:p>
+        </w:tc>
+      </w:tr>
+      <w:tr>
+        <w:trPr>
+          <w:cantSplit/>
+        </w:trPr>
+        <w:tc>
+          <w:tcPr>
+            <w:tcW w:type="dxa" w:w="1417"/>
+            <w:tcMar>
+              <w:left w:w="45" w:type="dxa"/>
+              <w:right w:w="45" w:type="dxa"/>
+            </w:tcMar>
+          </w:tcPr>
+          <w:p>
+            <w:pPr>
+              <w:keepNext/>
+              <w:spacing w:after="60" w:before="60" w:line="240" w:lineRule="auto"/>
+              <w:ind w:firstLine="0"/>
+              <w:jc w:val="left"/>
+            </w:pPr>
+            <w:r>
+              <w:rPr>
+                <w:b w:val="0"/>
+                <w:sz w:val="16"/>
+              </w:rPr>
+              <w:t>검사 전 현재 조건</w:t>
+            </w:r>
+          </w:p>
+        </w:tc>
+        <w:tc>
+          <w:tcPr>
+            <w:tcW w:type="dxa" w:w="1068"/>
+            <w:tcMar>
+              <w:left w:w="45" w:type="dxa"/>
+              <w:right w:w="45" w:type="dxa"/>
+            </w:tcMar>
+          </w:tcPr>
+          <w:p>
+            <w:pPr>
+              <w:keepNext/>
+              <w:spacing w:after="60" w:before="60" w:line="240" w:lineRule="auto"/>
+              <w:ind w:firstLine="0"/>
+              <w:jc w:val="center"/>
+            </w:pPr>
+            <w:r>
+              <w:rPr>
+                <w:b w:val="0"/>
+                <w:sz w:val="16"/>
+              </w:rPr>
+              <w:t>624.33</w:t>
+            </w:r>
+          </w:p>
+        </w:tc>
+        <w:tc>
+          <w:tcPr>
+            <w:tcW w:type="dxa" w:w="1068"/>
+            <w:tcMar>
+              <w:left w:w="45" w:type="dxa"/>
+              <w:right w:w="45" w:type="dxa"/>
+            </w:tcMar>
+          </w:tcPr>
+          <w:p>
+            <w:pPr>
+              <w:keepNext/>
+              <w:spacing w:after="60" w:before="60" w:line="240" w:lineRule="auto"/>
+              <w:ind w:firstLine="0"/>
+              <w:jc w:val="center"/>
+            </w:pPr>
+            <w:r>
+              <w:rPr>
+                <w:b w:val="0"/>
+                <w:sz w:val="16"/>
+              </w:rPr>
+              <w:t>101.33</w:t>
+            </w:r>
+          </w:p>
+        </w:tc>
+        <w:tc>
+          <w:tcPr>
+            <w:tcW w:type="dxa" w:w="1068"/>
+            <w:tcMar>
+              <w:left w:w="45" w:type="dxa"/>
+              <w:right w:w="45" w:type="dxa"/>
+            </w:tcMar>
+          </w:tcPr>
+          <w:p>
+            <w:pPr>
+              <w:keepNext/>
+              <w:spacing w:after="60" w:before="60" w:line="240" w:lineRule="auto"/>
+              <w:ind w:firstLine="0"/>
+              <w:jc w:val="center"/>
+            </w:pPr>
+            <w:r>
+              <w:rPr>
+                <w:b w:val="0"/>
+                <w:sz w:val="16"/>
+              </w:rPr>
+              <w:t>133.33</w:t>
+            </w:r>
+          </w:p>
+        </w:tc>
+      </w:tr>
+      <w:tr>
+        <w:trPr>
+          <w:cantSplit/>
+        </w:trPr>
+        <w:tc>
+          <w:tcPr>
+            <w:tcW w:type="dxa" w:w="1417"/>
+            <w:tcMar>
+              <w:left w:w="45" w:type="dxa"/>
+              <w:right w:w="45" w:type="dxa"/>
+            </w:tcMar>
+            <w:tcBorders>
+              <w:bottom w:val="single" w:sz="5"/>
+            </w:tcBorders>
+          </w:tcPr>
+          <w:p>
+            <w:pPr>
+              <w:keepNext w:val="0"/>
+              <w:spacing w:after="60" w:before="60" w:line="240" w:lineRule="auto"/>
+              <w:ind w:firstLine="0"/>
+              <w:jc w:val="left"/>
+            </w:pPr>
+            <w:r>
+              <w:rPr>
+                <w:b w:val="0"/>
+                <w:sz w:val="16"/>
+              </w:rPr>
+              <w:t>지시 검사 후 현재 조건</w:t>
+            </w:r>
+          </w:p>
+        </w:tc>
+        <w:tc>
+          <w:tcPr>
+            <w:tcW w:type="dxa" w:w="1068"/>
+            <w:tcMar>
+              <w:left w:w="45" w:type="dxa"/>
+              <w:right w:w="45" w:type="dxa"/>
+            </w:tcMar>
+            <w:tcBorders>
+              <w:bottom w:val="single" w:sz="5"/>
+            </w:tcBorders>
+          </w:tcPr>
+          <w:p>
+            <w:pPr>
+              <w:keepNext w:val="0"/>
+              <w:spacing w:after="60" w:before="60" w:line="240" w:lineRule="auto"/>
+              <w:ind w:firstLine="0"/>
+              <w:jc w:val="center"/>
+            </w:pPr>
+            <w:r>
+              <w:rPr>
+                <w:b w:val="0"/>
+                <w:sz w:val="16"/>
+              </w:rPr>
+              <w:t>581.00</w:t>
+            </w:r>
+          </w:p>
+        </w:tc>
+        <w:tc>
+          <w:tcPr>
+            <w:tcW w:type="dxa" w:w="1068"/>
+            <w:tcMar>
+              <w:left w:w="45" w:type="dxa"/>
+              <w:right w:w="45" w:type="dxa"/>
+            </w:tcMar>
+            <w:tcBorders>
+              <w:bottom w:val="single" w:sz="5"/>
+            </w:tcBorders>
+          </w:tcPr>
+          <w:p>
+            <w:pPr>
+              <w:keepNext w:val="0"/>
+              <w:spacing w:after="60" w:before="60" w:line="240" w:lineRule="auto"/>
+              <w:ind w:firstLine="0"/>
+              <w:jc w:val="center"/>
+            </w:pPr>
+            <w:r>
+              <w:rPr>
+                <w:b w:val="0"/>
+                <w:sz w:val="16"/>
+              </w:rPr>
+              <w:t>93.67</w:t>
+            </w:r>
+          </w:p>
+        </w:tc>
+        <w:tc>
+          <w:tcPr>
+            <w:tcW w:type="dxa" w:w="1068"/>
+            <w:tcMar>
+              <w:left w:w="45" w:type="dxa"/>
+              <w:right w:w="45" w:type="dxa"/>
+            </w:tcMar>
+            <w:tcBorders>
+              <w:bottom w:val="single" w:sz="5"/>
+            </w:tcBorders>
+          </w:tcPr>
+          <w:p>
+            <w:pPr>
+              <w:keepNext w:val="0"/>
+              <w:spacing w:after="60" w:before="60" w:line="240" w:lineRule="auto"/>
+              <w:ind w:firstLine="0"/>
+              <w:jc w:val="center"/>
+            </w:pPr>
+            <w:r>
+              <w:rPr>
+                <w:b w:val="0"/>
+                <w:sz w:val="16"/>
+              </w:rPr>
+              <w:t>122.67</w:t>
+            </w:r>
+          </w:p>
+        </w:tc>
+      </w:tr>
+    </w:tbl>
+    <w:p>
+      <w:pPr>
+        <w:jc w:val="both"/>
+      </w:pPr>
+      <w:r>
+        <w:t>표 14는 세 대화의 마지막 요청에서 공통 보존 문구까지 포함한 전체 프롬프트 길이이다. 전체 이력의 평균 204.00토큰은 지시 검사 후 122.67토큰으로 39.87% 감소하였다. 중간 요청을 포함한 12개 묶음의 평균은 168.75토큰과 129.25토큰이었다. 첫 요청에서는 상태를 항목별로 명시한 표현이 전체 이력보다 길었고, 두 번째 요청부터는 세 대화 모두 현재 조건 표현이 짧았다. 이는 과거 요청을 현재 값으로 대체한 효과이다. 검사 전 조건도 짧지만 잘못 추출한 값을 포함하므로 길이와 상태 정확도를 함께 비교하였다.</w:t>
+      </w:r>
+    </w:p>
+    <w:p>
+      <w:pPr>
+        <w:pStyle w:val="Heading2"/>
+      </w:pPr>
+      <w:r>
+        <w:t>15. 후속 이미지의 요청 충족과 얼굴 지표</w:t>
+      </w:r>
+    </w:p>
+    <w:p>
+      <w:pPr>
+        <w:pStyle w:val="Caption"/>
+        <w:keepNext/>
+        <w:spacing w:before="100"/>
+        <w:ind w:firstLine="0"/>
+        <w:jc w:val="center"/>
+      </w:pPr>
+      <w:r>
+        <w:t>표 15. 후속 이미지의 두 AI 모델별 요청 충족 평가</w:t>
+      </w:r>
+    </w:p>
+    <w:tbl>
+      <w:tblPr>
+        <w:tblW w:type="auto" w:w="0"/>
+        <w:tblLayout w:type="fixed"/>
+        <w:tblLook w:firstColumn="1" w:firstRow="1" w:lastColumn="0" w:lastRow="0" w:noHBand="0" w:noVBand="1" w:val="04A0"/>
+      </w:tblPr>
+      <w:tblGrid>
+        <w:gridCol w:w="1417"/>
+        <w:gridCol w:w="801"/>
+        <w:gridCol w:w="801"/>
+        <w:gridCol w:w="801"/>
+        <w:gridCol w:w="801"/>
+      </w:tblGrid>
+      <w:tr>
+        <w:trPr>
+          <w:cantSplit/>
+          <w:tblHeader/>
+        </w:trPr>
+        <w:tc>
+          <w:tcPr>
+            <w:tcW w:type="dxa" w:w="1417"/>
+            <w:tcMar>
+              <w:left w:w="45" w:type="dxa"/>
+              <w:right w:w="45" w:type="dxa"/>
+            </w:tcMar>
+            <w:tcBorders>
+              <w:bottom w:val="single" w:sz="5"/>
+            </w:tcBorders>
+          </w:tcPr>
+          <w:p>
+            <w:pPr>
+              <w:keepNext/>
+              <w:spacing w:after="60" w:before="60" w:line="240" w:lineRule="auto"/>
+              <w:ind w:firstLine="0"/>
+              <w:jc w:val="left"/>
+            </w:pPr>
+            <w:r>
+              <w:rPr>
+                <w:b/>
+                <w:sz w:val="16"/>
+              </w:rPr>
+              <w:t>입력 방식</w:t>
+            </w:r>
+          </w:p>
+        </w:tc>
+        <w:tc>
+          <w:tcPr>
+            <w:tcW w:type="dxa" w:w="801"/>
+            <w:tcMar>
+              <w:left w:w="45" w:type="dxa"/>
+              <w:right w:w="45" w:type="dxa"/>
+            </w:tcMar>
+            <w:tcBorders>
+              <w:bottom w:val="single" w:sz="5"/>
+            </w:tcBorders>
+          </w:tcPr>
+          <w:p>
+            <w:pPr>
+              <w:keepNext/>
+              <w:spacing w:after="60" w:before="60" w:line="240" w:lineRule="auto"/>
+              <w:ind w:firstLine="0"/>
+              <w:jc w:val="center"/>
+            </w:pPr>
+            <w:r>
+              <w:rPr>
+                <w:b/>
+                <w:sz w:val="16"/>
+              </w:rPr>
+              <w:t>3B 충족</w:t>
+            </w:r>
+          </w:p>
+        </w:tc>
+        <w:tc>
+          <w:tcPr>
+            <w:tcW w:type="dxa" w:w="801"/>
+            <w:tcMar>
+              <w:left w:w="45" w:type="dxa"/>
+              <w:right w:w="45" w:type="dxa"/>
+            </w:tcMar>
+            <w:tcBorders>
+              <w:bottom w:val="single" w:sz="5"/>
+            </w:tcBorders>
+          </w:tcPr>
+          <w:p>
+            <w:pPr>
+              <w:keepNext/>
+              <w:spacing w:after="60" w:before="60" w:line="240" w:lineRule="auto"/>
+              <w:ind w:firstLine="0"/>
+              <w:jc w:val="center"/>
+            </w:pPr>
+            <w:r>
+              <w:rPr>
+                <w:b/>
+                <w:sz w:val="16"/>
+              </w:rPr>
+              <w:t>판단 불가</w:t>
+            </w:r>
+          </w:p>
+        </w:tc>
+        <w:tc>
+          <w:tcPr>
+            <w:tcW w:type="dxa" w:w="801"/>
+            <w:tcMar>
+              <w:left w:w="45" w:type="dxa"/>
+              <w:right w:w="45" w:type="dxa"/>
+            </w:tcMar>
+            <w:tcBorders>
+              <w:bottom w:val="single" w:sz="5"/>
+            </w:tcBorders>
+          </w:tcPr>
+          <w:p>
+            <w:pPr>
+              <w:keepNext/>
+              <w:spacing w:after="60" w:before="60" w:line="240" w:lineRule="auto"/>
+              <w:ind w:firstLine="0"/>
+              <w:jc w:val="center"/>
+            </w:pPr>
+            <w:r>
+              <w:rPr>
+                <w:b/>
+                <w:sz w:val="16"/>
+              </w:rPr>
+              <w:t>7B 충족</w:t>
+            </w:r>
+          </w:p>
+        </w:tc>
+        <w:tc>
+          <w:tcPr>
+            <w:tcW w:type="dxa" w:w="801"/>
+            <w:tcMar>
+              <w:left w:w="45" w:type="dxa"/>
+              <w:right w:w="45" w:type="dxa"/>
+            </w:tcMar>
+            <w:tcBorders>
+              <w:bottom w:val="single" w:sz="5"/>
+            </w:tcBorders>
+          </w:tcPr>
+          <w:p>
+            <w:pPr>
+              <w:keepNext/>
+              <w:spacing w:after="60" w:before="60" w:line="240" w:lineRule="auto"/>
+              <w:ind w:firstLine="0"/>
+              <w:jc w:val="center"/>
+            </w:pPr>
+            <w:r>
+              <w:rPr>
+                <w:b/>
+                <w:sz w:val="16"/>
+              </w:rPr>
+              <w:t>판단 불가</w:t>
+            </w:r>
+          </w:p>
+        </w:tc>
+      </w:tr>
+      <w:tr>
+        <w:trPr>
+          <w:cantSplit/>
+        </w:trPr>
+        <w:tc>
+          <w:tcPr>
+            <w:tcW w:type="dxa" w:w="1417"/>
+            <w:tcMar>
+              <w:left w:w="45" w:type="dxa"/>
+              <w:right w:w="45" w:type="dxa"/>
+            </w:tcMar>
+          </w:tcPr>
+          <w:p>
+            <w:pPr>
+              <w:keepNext/>
+              <w:spacing w:after="60" w:before="60" w:line="240" w:lineRule="auto"/>
+              <w:ind w:firstLine="0"/>
+              <w:jc w:val="left"/>
+            </w:pPr>
+            <w:r>
+              <w:rPr>
+                <w:b w:val="0"/>
+                <w:sz w:val="16"/>
+              </w:rPr>
+              <w:t>전체 요청 이력</w:t>
+            </w:r>
+          </w:p>
+        </w:tc>
+        <w:tc>
+          <w:tcPr>
+            <w:tcW w:type="dxa" w:w="801"/>
+            <w:tcMar>
+              <w:left w:w="45" w:type="dxa"/>
+              <w:right w:w="45" w:type="dxa"/>
+            </w:tcMar>
+          </w:tcPr>
+          <w:p>
+            <w:pPr>
+              <w:keepNext/>
+              <w:spacing w:after="60" w:before="60" w:line="240" w:lineRule="auto"/>
+              <w:ind w:firstLine="0"/>
+              <w:jc w:val="center"/>
+            </w:pPr>
+            <w:r>
+              <w:rPr>
+                <w:b w:val="0"/>
+                <w:sz w:val="16"/>
+              </w:rPr>
+              <w:t>29/36</w:t>
+            </w:r>
+          </w:p>
+        </w:tc>
+        <w:tc>
+          <w:tcPr>
+            <w:tcW w:type="dxa" w:w="801"/>
+            <w:tcMar>
+              <w:left w:w="45" w:type="dxa"/>
+              <w:right w:w="45" w:type="dxa"/>
+            </w:tcMar>
+          </w:tcPr>
+          <w:p>
+            <w:pPr>
+              <w:keepNext/>
+              <w:spacing w:after="60" w:before="60" w:line="240" w:lineRule="auto"/>
+              <w:ind w:firstLine="0"/>
+              <w:jc w:val="center"/>
+            </w:pPr>
+            <w:r>
+              <w:rPr>
+                <w:b w:val="0"/>
+                <w:sz w:val="16"/>
+              </w:rPr>
+              <w:t>6</w:t>
+            </w:r>
+          </w:p>
+        </w:tc>
+        <w:tc>
+          <w:tcPr>
+            <w:tcW w:type="dxa" w:w="801"/>
+            <w:tcMar>
+              <w:left w:w="45" w:type="dxa"/>
+              <w:right w:w="45" w:type="dxa"/>
+            </w:tcMar>
+          </w:tcPr>
+          <w:p>
+            <w:pPr>
+              <w:keepNext/>
+              <w:spacing w:after="60" w:before="60" w:line="240" w:lineRule="auto"/>
+              <w:ind w:firstLine="0"/>
+              <w:jc w:val="center"/>
+            </w:pPr>
+            <w:r>
+              <w:rPr>
+                <w:b w:val="0"/>
+                <w:sz w:val="16"/>
+              </w:rPr>
+              <w:t>34/36</w:t>
+            </w:r>
+          </w:p>
+        </w:tc>
+        <w:tc>
+          <w:tcPr>
+            <w:tcW w:type="dxa" w:w="801"/>
+            <w:tcMar>
+              <w:left w:w="45" w:type="dxa"/>
+              <w:right w:w="45" w:type="dxa"/>
+            </w:tcMar>
+          </w:tcPr>
+          <w:p>
+            <w:pPr>
+              <w:keepNext/>
+              <w:spacing w:after="60" w:before="60" w:line="240" w:lineRule="auto"/>
+              <w:ind w:firstLine="0"/>
+              <w:jc w:val="center"/>
+            </w:pPr>
+            <w:r>
+              <w:rPr>
+                <w:b w:val="0"/>
+                <w:sz w:val="16"/>
+              </w:rPr>
+              <w:t>0</w:t>
+            </w:r>
+          </w:p>
+        </w:tc>
+      </w:tr>
+      <w:tr>
+        <w:trPr>
+          <w:cantSplit/>
+        </w:trPr>
+        <w:tc>
+          <w:tcPr>
+            <w:tcW w:type="dxa" w:w="1417"/>
+            <w:tcMar>
+              <w:left w:w="45" w:type="dxa"/>
+              <w:right w:w="45" w:type="dxa"/>
+            </w:tcMar>
+          </w:tcPr>
+          <w:p>
+            <w:pPr>
+              <w:keepNext/>
+              <w:spacing w:after="60" w:before="60" w:line="240" w:lineRule="auto"/>
+              <w:ind w:firstLine="0"/>
+              <w:jc w:val="left"/>
+            </w:pPr>
+            <w:r>
+              <w:rPr>
+                <w:b w:val="0"/>
+                <w:sz w:val="16"/>
+              </w:rPr>
+              <w:t>검사 전 현재 조건</w:t>
+            </w:r>
+          </w:p>
+        </w:tc>
+        <w:tc>
+          <w:tcPr>
+            <w:tcW w:type="dxa" w:w="801"/>
+            <w:tcMar>
+              <w:left w:w="45" w:type="dxa"/>
+              <w:right w:w="45" w:type="dxa"/>
+            </w:tcMar>
+          </w:tcPr>
+          <w:p>
+            <w:pPr>
+              <w:keepNext/>
+              <w:spacing w:after="60" w:before="60" w:line="240" w:lineRule="auto"/>
+              <w:ind w:firstLine="0"/>
+              <w:jc w:val="center"/>
+            </w:pPr>
+            <w:r>
+              <w:rPr>
+                <w:b w:val="0"/>
+                <w:sz w:val="16"/>
+              </w:rPr>
+              <w:t>18/36</w:t>
+            </w:r>
+          </w:p>
+        </w:tc>
+        <w:tc>
+          <w:tcPr>
+            <w:tcW w:type="dxa" w:w="801"/>
+            <w:tcMar>
+              <w:left w:w="45" w:type="dxa"/>
+              <w:right w:w="45" w:type="dxa"/>
+            </w:tcMar>
+          </w:tcPr>
+          <w:p>
+            <w:pPr>
+              <w:keepNext/>
+              <w:spacing w:after="60" w:before="60" w:line="240" w:lineRule="auto"/>
+              <w:ind w:firstLine="0"/>
+              <w:jc w:val="center"/>
+            </w:pPr>
+            <w:r>
+              <w:rPr>
+                <w:b w:val="0"/>
+                <w:sz w:val="16"/>
+              </w:rPr>
+              <w:t>18</w:t>
+            </w:r>
+          </w:p>
+        </w:tc>
+        <w:tc>
+          <w:tcPr>
+            <w:tcW w:type="dxa" w:w="801"/>
+            <w:tcMar>
+              <w:left w:w="45" w:type="dxa"/>
+              <w:right w:w="45" w:type="dxa"/>
+            </w:tcMar>
+          </w:tcPr>
+          <w:p>
+            <w:pPr>
+              <w:keepNext/>
+              <w:spacing w:after="60" w:before="60" w:line="240" w:lineRule="auto"/>
+              <w:ind w:firstLine="0"/>
+              <w:jc w:val="center"/>
+            </w:pPr>
+            <w:r>
+              <w:rPr>
+                <w:b w:val="0"/>
+                <w:sz w:val="16"/>
+              </w:rPr>
+              <w:t>24/36</w:t>
+            </w:r>
+          </w:p>
+        </w:tc>
+        <w:tc>
+          <w:tcPr>
+            <w:tcW w:type="dxa" w:w="801"/>
+            <w:tcMar>
+              <w:left w:w="45" w:type="dxa"/>
+              <w:right w:w="45" w:type="dxa"/>
+            </w:tcMar>
+          </w:tcPr>
+          <w:p>
+            <w:pPr>
+              <w:keepNext/>
+              <w:spacing w:after="60" w:before="60" w:line="240" w:lineRule="auto"/>
+              <w:ind w:firstLine="0"/>
+              <w:jc w:val="center"/>
+            </w:pPr>
+            <w:r>
+              <w:rPr>
+                <w:b w:val="0"/>
+                <w:sz w:val="16"/>
+              </w:rPr>
+              <w:t>2</w:t>
+            </w:r>
+          </w:p>
+        </w:tc>
+      </w:tr>
+      <w:tr>
+        <w:trPr>
+          <w:cantSplit/>
+        </w:trPr>
+        <w:tc>
+          <w:tcPr>
+            <w:tcW w:type="dxa" w:w="1417"/>
+            <w:tcMar>
+              <w:left w:w="45" w:type="dxa"/>
+              <w:right w:w="45" w:type="dxa"/>
+            </w:tcMar>
+            <w:tcBorders>
+              <w:bottom w:val="single" w:sz="5"/>
+            </w:tcBorders>
+          </w:tcPr>
+          <w:p>
+            <w:pPr>
+              <w:keepNext w:val="0"/>
+              <w:spacing w:after="60" w:before="60" w:line="240" w:lineRule="auto"/>
+              <w:ind w:firstLine="0"/>
+              <w:jc w:val="left"/>
+            </w:pPr>
+            <w:r>
+              <w:rPr>
+                <w:b w:val="0"/>
+                <w:sz w:val="16"/>
+              </w:rPr>
+              <w:t>지시 검사 후 현재 조건</w:t>
+            </w:r>
+          </w:p>
+        </w:tc>
+        <w:tc>
+          <w:tcPr>
+            <w:tcW w:type="dxa" w:w="801"/>
+            <w:tcMar>
+              <w:left w:w="45" w:type="dxa"/>
+              <w:right w:w="45" w:type="dxa"/>
+            </w:tcMar>
+            <w:tcBorders>
+              <w:bottom w:val="single" w:sz="5"/>
+            </w:tcBorders>
+          </w:tcPr>
+          <w:p>
+            <w:pPr>
+              <w:keepNext w:val="0"/>
+              <w:spacing w:after="60" w:before="60" w:line="240" w:lineRule="auto"/>
+              <w:ind w:firstLine="0"/>
+              <w:jc w:val="center"/>
+            </w:pPr>
+            <w:r>
+              <w:rPr>
+                <w:b w:val="0"/>
+                <w:sz w:val="16"/>
+              </w:rPr>
+              <w:t>30/36</w:t>
+            </w:r>
+          </w:p>
+        </w:tc>
+        <w:tc>
+          <w:tcPr>
+            <w:tcW w:type="dxa" w:w="801"/>
+            <w:tcMar>
+              <w:left w:w="45" w:type="dxa"/>
+              <w:right w:w="45" w:type="dxa"/>
+            </w:tcMar>
+            <w:tcBorders>
+              <w:bottom w:val="single" w:sz="5"/>
+            </w:tcBorders>
+          </w:tcPr>
+          <w:p>
+            <w:pPr>
+              <w:keepNext w:val="0"/>
+              <w:spacing w:after="60" w:before="60" w:line="240" w:lineRule="auto"/>
+              <w:ind w:firstLine="0"/>
+              <w:jc w:val="center"/>
+            </w:pPr>
+            <w:r>
+              <w:rPr>
+                <w:b w:val="0"/>
+                <w:sz w:val="16"/>
+              </w:rPr>
+              <w:t>6</w:t>
+            </w:r>
+          </w:p>
+        </w:tc>
+        <w:tc>
+          <w:tcPr>
+            <w:tcW w:type="dxa" w:w="801"/>
+            <w:tcMar>
+              <w:left w:w="45" w:type="dxa"/>
+              <w:right w:w="45" w:type="dxa"/>
+            </w:tcMar>
+            <w:tcBorders>
+              <w:bottom w:val="single" w:sz="5"/>
+            </w:tcBorders>
+          </w:tcPr>
+          <w:p>
+            <w:pPr>
+              <w:keepNext w:val="0"/>
+              <w:spacing w:after="60" w:before="60" w:line="240" w:lineRule="auto"/>
+              <w:ind w:firstLine="0"/>
+              <w:jc w:val="center"/>
+            </w:pPr>
+            <w:r>
+              <w:rPr>
+                <w:b w:val="0"/>
+                <w:sz w:val="16"/>
+              </w:rPr>
+              <w:t>36/36</w:t>
+            </w:r>
+          </w:p>
+        </w:tc>
+        <w:tc>
+          <w:tcPr>
+            <w:tcW w:type="dxa" w:w="801"/>
+            <w:tcMar>
+              <w:left w:w="45" w:type="dxa"/>
+              <w:right w:w="45" w:type="dxa"/>
+            </w:tcMar>
+            <w:tcBorders>
+              <w:bottom w:val="single" w:sz="5"/>
+            </w:tcBorders>
+          </w:tcPr>
+          <w:p>
+            <w:pPr>
+              <w:keepNext w:val="0"/>
+              <w:spacing w:after="60" w:before="60" w:line="240" w:lineRule="auto"/>
+              <w:ind w:firstLine="0"/>
+              <w:jc w:val="center"/>
+            </w:pPr>
+            <w:r>
+              <w:rPr>
+                <w:b w:val="0"/>
+                <w:sz w:val="16"/>
+              </w:rPr>
+              <w:t>0</w:t>
+            </w:r>
+          </w:p>
+        </w:tc>
+      </w:tr>
+    </w:tbl>
+    <w:p>
+      <w:pPr>
+        <w:jc w:val="both"/>
+      </w:pPr>
+      <w:r>
+        <w:t>각 입력 방식의 분모 36은 인물 두 명·대화 세 개의 이미지 여섯 장에서 여섯 목표를 평가한 항목 수이다. 3B 평가에서는 형식 오류 5개가 발생하였다. 형식 오류와 판단 불가는 성공에 포함하지 않고 분모에 유지하였다. 검사 전 조건의 회색 스웨터와 금색 핀을 흰 상의·핀 없음으로 설명한 응답도 있었다. 3B 평가의 오류를 관찰한 뒤 같은 18개 이미지·목표 쌍 전체를 7B 모델로 한 번 추가 평가하였다. 두 평가의 전체 점수 일치는 75/108이며, 양쪽 모두 성공·실패를 반환한 78개에서는 73/78였다. 이 7B 평가는 사후 진단이며 3B 점수와 별도로 제시하였다.</w:t>
+      </w:r>
+    </w:p>
+    <w:p>
+      <w:pPr>
+        <w:pStyle w:val="Caption"/>
+        <w:keepNext/>
+        <w:spacing w:before="100"/>
+        <w:ind w:firstLine="0"/>
+        <w:jc w:val="center"/>
+      </w:pPr>
+      <w:r>
+        <w:t>표 16. 후속 이미지의 원본 대비 얼굴 지표</w:t>
+      </w:r>
+    </w:p>
+    <w:tbl>
+      <w:tblPr>
+        <w:tblW w:type="auto" w:w="0"/>
+        <w:tblLayout w:type="fixed"/>
+        <w:tblLook w:firstColumn="1" w:firstRow="1" w:lastColumn="0" w:lastRow="0" w:noHBand="0" w:noVBand="1" w:val="04A0"/>
+      </w:tblPr>
+      <w:tblGrid>
+        <w:gridCol w:w="1417"/>
+        <w:gridCol w:w="801"/>
+        <w:gridCol w:w="801"/>
+        <w:gridCol w:w="801"/>
+        <w:gridCol w:w="801"/>
+      </w:tblGrid>
+      <w:tr>
+        <w:trPr>
+          <w:cantSplit/>
+          <w:tblHeader/>
+        </w:trPr>
+        <w:tc>
+          <w:tcPr>
+            <w:tcW w:type="dxa" w:w="1417"/>
+            <w:tcMar>
+              <w:left w:w="45" w:type="dxa"/>
+              <w:right w:w="45" w:type="dxa"/>
+            </w:tcMar>
+            <w:tcBorders>
+              <w:bottom w:val="single" w:sz="5"/>
+            </w:tcBorders>
+          </w:tcPr>
+          <w:p>
+            <w:pPr>
+              <w:keepNext/>
+              <w:spacing w:after="60" w:before="60" w:line="240" w:lineRule="auto"/>
+              <w:ind w:firstLine="0"/>
+              <w:jc w:val="left"/>
+            </w:pPr>
+            <w:r>
+              <w:rPr>
+                <w:b/>
+                <w:sz w:val="16"/>
+              </w:rPr>
+              <w:t>입력 방식</w:t>
+            </w:r>
+          </w:p>
+        </w:tc>
+        <w:tc>
+          <w:tcPr>
+            <w:tcW w:type="dxa" w:w="801"/>
+            <w:tcMar>
+              <w:left w:w="45" w:type="dxa"/>
+              <w:right w:w="45" w:type="dxa"/>
+            </w:tcMar>
+            <w:tcBorders>
+              <w:bottom w:val="single" w:sz="5"/>
+            </w:tcBorders>
+          </w:tcPr>
+          <w:p>
+            <w:pPr>
+              <w:keepNext/>
+              <w:spacing w:after="60" w:before="60" w:line="240" w:lineRule="auto"/>
+              <w:ind w:firstLine="0"/>
+              <w:jc w:val="center"/>
+            </w:pPr>
+            <w:r>
+              <w:rPr>
+                <w:b/>
+                <w:sz w:val="16"/>
+              </w:rPr>
+              <w:t>얼굴</w:t>
+              <w:br/>
+              <w:t>코사인</w:t>
+            </w:r>
+          </w:p>
+        </w:tc>
+        <w:tc>
+          <w:tcPr>
+            <w:tcW w:type="dxa" w:w="801"/>
+            <w:tcMar>
+              <w:left w:w="45" w:type="dxa"/>
+              <w:right w:w="45" w:type="dxa"/>
+            </w:tcMar>
+            <w:tcBorders>
+              <w:bottom w:val="single" w:sz="5"/>
+            </w:tcBorders>
+          </w:tcPr>
+          <w:p>
+            <w:pPr>
+              <w:keepNext/>
+              <w:spacing w:after="60" w:before="60" w:line="240" w:lineRule="auto"/>
+              <w:ind w:firstLine="0"/>
+              <w:jc w:val="center"/>
+            </w:pPr>
+            <w:r>
+              <w:rPr>
+                <w:b/>
+                <w:sz w:val="16"/>
+              </w:rPr>
+              <w:t>MAE</w:t>
+            </w:r>
+          </w:p>
+        </w:tc>
+        <w:tc>
+          <w:tcPr>
+            <w:tcW w:type="dxa" w:w="801"/>
+            <w:tcMar>
+              <w:left w:w="45" w:type="dxa"/>
+              <w:right w:w="45" w:type="dxa"/>
+            </w:tcMar>
+            <w:tcBorders>
+              <w:bottom w:val="single" w:sz="5"/>
+            </w:tcBorders>
+          </w:tcPr>
+          <w:p>
+            <w:pPr>
+              <w:keepNext/>
+              <w:spacing w:after="60" w:before="60" w:line="240" w:lineRule="auto"/>
+              <w:ind w:firstLine="0"/>
+              <w:jc w:val="center"/>
+            </w:pPr>
+            <w:r>
+              <w:rPr>
+                <w:b/>
+                <w:sz w:val="16"/>
+              </w:rPr>
+              <w:t>SSIM</w:t>
+            </w:r>
+          </w:p>
+        </w:tc>
+        <w:tc>
+          <w:tcPr>
+            <w:tcW w:type="dxa" w:w="801"/>
+            <w:tcMar>
+              <w:left w:w="45" w:type="dxa"/>
+              <w:right w:w="45" w:type="dxa"/>
+            </w:tcMar>
+            <w:tcBorders>
+              <w:bottom w:val="single" w:sz="5"/>
+            </w:tcBorders>
+          </w:tcPr>
+          <w:p>
+            <w:pPr>
+              <w:keepNext/>
+              <w:spacing w:after="60" w:before="60" w:line="240" w:lineRule="auto"/>
+              <w:ind w:firstLine="0"/>
+              <w:jc w:val="center"/>
+            </w:pPr>
+            <w:r>
+              <w:rPr>
+                <w:b/>
+                <w:sz w:val="16"/>
+              </w:rPr>
+              <w:t>LPIPS</w:t>
+            </w:r>
+          </w:p>
+        </w:tc>
+      </w:tr>
+      <w:tr>
+        <w:trPr>
+          <w:cantSplit/>
+        </w:trPr>
+        <w:tc>
+          <w:tcPr>
+            <w:tcW w:type="dxa" w:w="1417"/>
+            <w:tcMar>
+              <w:left w:w="45" w:type="dxa"/>
+              <w:right w:w="45" w:type="dxa"/>
+            </w:tcMar>
+          </w:tcPr>
+          <w:p>
+            <w:pPr>
+              <w:keepNext/>
+              <w:spacing w:after="60" w:before="60" w:line="240" w:lineRule="auto"/>
+              <w:ind w:firstLine="0"/>
+              <w:jc w:val="left"/>
+            </w:pPr>
+            <w:r>
+              <w:rPr>
+                <w:b w:val="0"/>
+                <w:sz w:val="16"/>
+              </w:rPr>
+              <w:t>전체 요청 이력</w:t>
+            </w:r>
+          </w:p>
+        </w:tc>
+        <w:tc>
+          <w:tcPr>
+            <w:tcW w:type="dxa" w:w="801"/>
+            <w:tcMar>
+              <w:left w:w="45" w:type="dxa"/>
+              <w:right w:w="45" w:type="dxa"/>
+            </w:tcMar>
+          </w:tcPr>
+          <w:p>
+            <w:pPr>
+              <w:keepNext/>
+              <w:spacing w:after="60" w:before="60" w:line="240" w:lineRule="auto"/>
+              <w:ind w:firstLine="0"/>
+              <w:jc w:val="center"/>
+            </w:pPr>
+            <w:r>
+              <w:rPr>
+                <w:b w:val="0"/>
+                <w:sz w:val="16"/>
+              </w:rPr>
+              <w:t>0.919842</w:t>
+            </w:r>
+          </w:p>
+        </w:tc>
+        <w:tc>
+          <w:tcPr>
+            <w:tcW w:type="dxa" w:w="801"/>
+            <w:tcMar>
+              <w:left w:w="45" w:type="dxa"/>
+              <w:right w:w="45" w:type="dxa"/>
+            </w:tcMar>
+          </w:tcPr>
+          <w:p>
+            <w:pPr>
+              <w:keepNext/>
+              <w:spacing w:after="60" w:before="60" w:line="240" w:lineRule="auto"/>
+              <w:ind w:firstLine="0"/>
+              <w:jc w:val="center"/>
+            </w:pPr>
+            <w:r>
+              <w:rPr>
+                <w:b w:val="0"/>
+                <w:sz w:val="16"/>
+              </w:rPr>
+              <w:t>0.072179</w:t>
+            </w:r>
+          </w:p>
+        </w:tc>
+        <w:tc>
+          <w:tcPr>
+            <w:tcW w:type="dxa" w:w="801"/>
+            <w:tcMar>
+              <w:left w:w="45" w:type="dxa"/>
+              <w:right w:w="45" w:type="dxa"/>
+            </w:tcMar>
+          </w:tcPr>
+          <w:p>
+            <w:pPr>
+              <w:keepNext/>
+              <w:spacing w:after="60" w:before="60" w:line="240" w:lineRule="auto"/>
+              <w:ind w:firstLine="0"/>
+              <w:jc w:val="center"/>
+            </w:pPr>
+            <w:r>
+              <w:rPr>
+                <w:b w:val="0"/>
+                <w:sz w:val="16"/>
+              </w:rPr>
+              <w:t>0.789038</w:t>
+            </w:r>
+          </w:p>
+        </w:tc>
+        <w:tc>
+          <w:tcPr>
+            <w:tcW w:type="dxa" w:w="801"/>
+            <w:tcMar>
+              <w:left w:w="45" w:type="dxa"/>
+              <w:right w:w="45" w:type="dxa"/>
+            </w:tcMar>
+          </w:tcPr>
+          <w:p>
+            <w:pPr>
+              <w:keepNext/>
+              <w:spacing w:after="60" w:before="60" w:line="240" w:lineRule="auto"/>
+              <w:ind w:firstLine="0"/>
+              <w:jc w:val="center"/>
+            </w:pPr>
+            <w:r>
+              <w:rPr>
+                <w:b w:val="0"/>
+                <w:sz w:val="16"/>
+              </w:rPr>
+              <w:t>0.095158</w:t>
+            </w:r>
+          </w:p>
+        </w:tc>
+      </w:tr>
+      <w:tr>
+        <w:trPr>
+          <w:cantSplit/>
+        </w:trPr>
+        <w:tc>
+          <w:tcPr>
+            <w:tcW w:type="dxa" w:w="1417"/>
+            <w:tcMar>
+              <w:left w:w="45" w:type="dxa"/>
+              <w:right w:w="45" w:type="dxa"/>
+            </w:tcMar>
+          </w:tcPr>
+          <w:p>
+            <w:pPr>
+              <w:keepNext/>
+              <w:spacing w:after="60" w:before="60" w:line="240" w:lineRule="auto"/>
+              <w:ind w:firstLine="0"/>
+              <w:jc w:val="left"/>
+            </w:pPr>
+            <w:r>
+              <w:rPr>
+                <w:b w:val="0"/>
+                <w:sz w:val="16"/>
+              </w:rPr>
+              <w:t>검사 전 현재 조건</w:t>
+            </w:r>
+          </w:p>
+        </w:tc>
+        <w:tc>
+          <w:tcPr>
+            <w:tcW w:type="dxa" w:w="801"/>
+            <w:tcMar>
+              <w:left w:w="45" w:type="dxa"/>
+              <w:right w:w="45" w:type="dxa"/>
+            </w:tcMar>
+          </w:tcPr>
+          <w:p>
+            <w:pPr>
+              <w:keepNext/>
+              <w:spacing w:after="60" w:before="60" w:line="240" w:lineRule="auto"/>
+              <w:ind w:firstLine="0"/>
+              <w:jc w:val="center"/>
+            </w:pPr>
+            <w:r>
+              <w:rPr>
+                <w:b w:val="0"/>
+                <w:sz w:val="16"/>
+              </w:rPr>
+              <w:t>0.901997</w:t>
+            </w:r>
+          </w:p>
+        </w:tc>
+        <w:tc>
+          <w:tcPr>
+            <w:tcW w:type="dxa" w:w="801"/>
+            <w:tcMar>
+              <w:left w:w="45" w:type="dxa"/>
+              <w:right w:w="45" w:type="dxa"/>
+            </w:tcMar>
+          </w:tcPr>
+          <w:p>
+            <w:pPr>
+              <w:keepNext/>
+              <w:spacing w:after="60" w:before="60" w:line="240" w:lineRule="auto"/>
+              <w:ind w:firstLine="0"/>
+              <w:jc w:val="center"/>
+            </w:pPr>
+            <w:r>
+              <w:rPr>
+                <w:b w:val="0"/>
+                <w:sz w:val="16"/>
+              </w:rPr>
+              <w:t>0.086795</w:t>
+            </w:r>
+          </w:p>
+        </w:tc>
+        <w:tc>
+          <w:tcPr>
+            <w:tcW w:type="dxa" w:w="801"/>
+            <w:tcMar>
+              <w:left w:w="45" w:type="dxa"/>
+              <w:right w:w="45" w:type="dxa"/>
+            </w:tcMar>
+          </w:tcPr>
+          <w:p>
+            <w:pPr>
+              <w:keepNext/>
+              <w:spacing w:after="60" w:before="60" w:line="240" w:lineRule="auto"/>
+              <w:ind w:firstLine="0"/>
+              <w:jc w:val="center"/>
+            </w:pPr>
+            <w:r>
+              <w:rPr>
+                <w:b w:val="0"/>
+                <w:sz w:val="16"/>
+              </w:rPr>
+              <w:t>0.748089</w:t>
+            </w:r>
+          </w:p>
+        </w:tc>
+        <w:tc>
+          <w:tcPr>
+            <w:tcW w:type="dxa" w:w="801"/>
+            <w:tcMar>
+              <w:left w:w="45" w:type="dxa"/>
+              <w:right w:w="45" w:type="dxa"/>
+            </w:tcMar>
+          </w:tcPr>
+          <w:p>
+            <w:pPr>
+              <w:keepNext/>
+              <w:spacing w:after="60" w:before="60" w:line="240" w:lineRule="auto"/>
+              <w:ind w:firstLine="0"/>
+              <w:jc w:val="center"/>
+            </w:pPr>
+            <w:r>
+              <w:rPr>
+                <w:b w:val="0"/>
+                <w:sz w:val="16"/>
+              </w:rPr>
+              <w:t>0.109213</w:t>
+            </w:r>
+          </w:p>
+        </w:tc>
+      </w:tr>
+      <w:tr>
+        <w:trPr>
+          <w:cantSplit/>
+        </w:trPr>
+        <w:tc>
+          <w:tcPr>
+            <w:tcW w:type="dxa" w:w="1417"/>
+            <w:tcMar>
+              <w:left w:w="45" w:type="dxa"/>
+              <w:right w:w="45" w:type="dxa"/>
+            </w:tcMar>
+            <w:tcBorders>
+              <w:bottom w:val="single" w:sz="5"/>
+            </w:tcBorders>
+          </w:tcPr>
+          <w:p>
+            <w:pPr>
+              <w:keepNext w:val="0"/>
+              <w:spacing w:after="60" w:before="60" w:line="240" w:lineRule="auto"/>
+              <w:ind w:firstLine="0"/>
+              <w:jc w:val="left"/>
+            </w:pPr>
+            <w:r>
+              <w:rPr>
+                <w:b w:val="0"/>
+                <w:sz w:val="16"/>
+              </w:rPr>
+              <w:t>지시 검사 후 현재 조건</w:t>
+            </w:r>
+          </w:p>
+        </w:tc>
+        <w:tc>
+          <w:tcPr>
+            <w:tcW w:type="dxa" w:w="801"/>
+            <w:tcMar>
+              <w:left w:w="45" w:type="dxa"/>
+              <w:right w:w="45" w:type="dxa"/>
+            </w:tcMar>
+            <w:tcBorders>
+              <w:bottom w:val="single" w:sz="5"/>
+            </w:tcBorders>
+          </w:tcPr>
+          <w:p>
+            <w:pPr>
+              <w:keepNext w:val="0"/>
+              <w:spacing w:after="60" w:before="60" w:line="240" w:lineRule="auto"/>
+              <w:ind w:firstLine="0"/>
+              <w:jc w:val="center"/>
+            </w:pPr>
+            <w:r>
+              <w:rPr>
+                <w:b w:val="0"/>
+                <w:sz w:val="16"/>
+              </w:rPr>
+              <w:t>0.923318</w:t>
+            </w:r>
+          </w:p>
+        </w:tc>
+        <w:tc>
+          <w:tcPr>
+            <w:tcW w:type="dxa" w:w="801"/>
+            <w:tcMar>
+              <w:left w:w="45" w:type="dxa"/>
+              <w:right w:w="45" w:type="dxa"/>
+            </w:tcMar>
+            <w:tcBorders>
+              <w:bottom w:val="single" w:sz="5"/>
+            </w:tcBorders>
+          </w:tcPr>
+          <w:p>
+            <w:pPr>
+              <w:keepNext w:val="0"/>
+              <w:spacing w:after="60" w:before="60" w:line="240" w:lineRule="auto"/>
+              <w:ind w:firstLine="0"/>
+              <w:jc w:val="center"/>
+            </w:pPr>
+            <w:r>
+              <w:rPr>
+                <w:b w:val="0"/>
+                <w:sz w:val="16"/>
+              </w:rPr>
+              <w:t>0.095572</w:t>
+            </w:r>
+          </w:p>
+        </w:tc>
+        <w:tc>
+          <w:tcPr>
+            <w:tcW w:type="dxa" w:w="801"/>
+            <w:tcMar>
+              <w:left w:w="45" w:type="dxa"/>
+              <w:right w:w="45" w:type="dxa"/>
+            </w:tcMar>
+            <w:tcBorders>
+              <w:bottom w:val="single" w:sz="5"/>
+            </w:tcBorders>
+          </w:tcPr>
+          <w:p>
+            <w:pPr>
+              <w:keepNext w:val="0"/>
+              <w:spacing w:after="60" w:before="60" w:line="240" w:lineRule="auto"/>
+              <w:ind w:firstLine="0"/>
+              <w:jc w:val="center"/>
+            </w:pPr>
+            <w:r>
+              <w:rPr>
+                <w:b w:val="0"/>
+                <w:sz w:val="16"/>
+              </w:rPr>
+              <w:t>0.754197</w:t>
+            </w:r>
+          </w:p>
+        </w:tc>
+        <w:tc>
+          <w:tcPr>
+            <w:tcW w:type="dxa" w:w="801"/>
+            <w:tcMar>
+              <w:left w:w="45" w:type="dxa"/>
+              <w:right w:w="45" w:type="dxa"/>
+            </w:tcMar>
+            <w:tcBorders>
+              <w:bottom w:val="single" w:sz="5"/>
+            </w:tcBorders>
+          </w:tcPr>
+          <w:p>
+            <w:pPr>
+              <w:keepNext w:val="0"/>
+              <w:spacing w:after="60" w:before="60" w:line="240" w:lineRule="auto"/>
+              <w:ind w:firstLine="0"/>
+              <w:jc w:val="center"/>
+            </w:pPr>
+            <w:r>
+              <w:rPr>
+                <w:b w:val="0"/>
+                <w:sz w:val="16"/>
+              </w:rPr>
+              <w:t>0.106698</w:t>
+            </w:r>
+          </w:p>
+        </w:tc>
+      </w:tr>
+    </w:tbl>
+    <w:p>
+      <w:pPr>
+        <w:jc w:val="both"/>
+      </w:pPr>
+      <w:r>
+        <w:t>모든 출력 18장에서 얼굴이 하나씩 검출되었다. 표 16의 코사인은 얼굴 특징 벡터의 유사도이며, MAE·SSIM·LPIPS는 랜드마크로 정렬한 112×112 얼굴의 평균이다. 지시 검사 후 조건은 검사 전 조건보다 얼굴 코사인·SSIM·LPIPS 평균이 유리하고 MAE 평균은 불리하였다. 전체 요청 이력과 비교하면 얼굴 코사인 평균은 높았으나 MAE·SSIM·LPIPS는 불리하였다. 따라서 프롬프트 길이 감소와 얼굴 보존 지표의 변화는 분리하여 보고한다. 조건당 첫 출력 한 장을 사용한 여섯 대응 사례의 기술통계이며, 도구의 생성 시드는 통제되지 않았다.</w:t>
+      </w:r>
+    </w:p>
+    <w:p>
+      <w:pPr>
+        <w:spacing w:after="0" w:before="0" w:line="20" w:lineRule="exact"/>
+        <w:sectPr>
+          <w:type w:val="continuous"/>
+          <w:pgSz w:w="11906" w:h="16838"/>
+          <w:pgMar w:top="1134" w:right="1134" w:bottom="1134" w:left="1134" w:header="720" w:footer="720" w:gutter="0"/>
+          <w:cols w:space="397" w:num="2"/>
+          <w:docGrid w:linePitch="360"/>
+        </w:sectPr>
+      </w:pPr>
+    </w:p>
+    <w:p>
+      <w:pPr>
+        <w:pStyle w:val="Heading2"/>
+      </w:pPr>
+      <w:r>
+        <w:t>16. 조건부 지시와 인용문을 포함한 이미지 비교</w:t>
+      </w:r>
+    </w:p>
+    <w:p>
+      <w:pPr>
+        <w:keepNext/>
+        <w:spacing w:line="240" w:lineRule="auto"/>
+        <w:ind w:firstLine="0"/>
+        <w:jc w:val="center"/>
+      </w:pPr>
+      <w:r>
+        <w:drawing>
+          <wp:inline xmlns:a="http://schemas.openxmlformats.org/drawingml/2006/main" xmlns:pic="http://schemas.openxmlformats.org/drawingml/2006/picture">
+            <wp:extent cx="5760000" cy="3072000"/>
+            <wp:docPr id="3" name="Picture 3" descr="그림 3 전체 요청 이력, 검사 전 현재 조건, 지시 검사 후 현재 조건의 생성 결과"/>
+            <wp:cNvGraphicFramePr>
+              <a:graphicFrameLocks noChangeAspect="1"/>
+            </wp:cNvGraphicFramePr>
+            <a:graphic>
+              <a:graphicData uri="http://schemas.openxmlformats.org/drawingml/2006/picture">
+                <pic:pic>
+                  <pic:nvPicPr>
+                    <pic:cNvPr id="0" name="prompt-state-image-s2.png"/>
+                    <pic:cNvPicPr/>
+                  </pic:nvPicPr>
+                  <pic:blipFill>
+                    <a:blip r:embed="rId11"/>
+                    <a:stretch>
+                      <a:fillRect/>
+                    </a:stretch>
+                  </pic:blipFill>
+                  <pic:spPr>
+                    <a:xfrm>
+                      <a:off x="0" y="0"/>
+                      <a:ext cx="5760000" cy="3072000"/>
+                    </a:xfrm>
+                    <a:prstGeom prst="rect"/>
+                  </pic:spPr>
+                </pic:pic>
+              </a:graphicData>
+            </a:graphic>
+          </wp:inline>
+        </w:drawing>
+      </w:r>
+    </w:p>
+    <w:p>
+      <w:pPr>
+        <w:pStyle w:val="Caption"/>
+        <w:ind w:firstLine="0"/>
+      </w:pPr>
+      <w:r>
+        <w:t>그림 3 전체 요청 이력, 검사 전 현재 조건, 지시 검사 후 현재 조건의 생성 결과</w:t>
+      </w:r>
+    </w:p>
+    <w:p>
+      <w:pPr>
+        <w:spacing w:after="0" w:before="0" w:line="20" w:lineRule="exact"/>
+        <w:sectPr>
+          <w:type w:val="continuous"/>
+          <w:pgSz w:w="11906" w:h="16838"/>
+          <w:pgMar w:top="1134" w:right="1134" w:bottom="1134" w:left="1134" w:header="720" w:footer="720" w:gutter="0"/>
+          <w:cols w:space="397" w:num="1"/>
+          <w:docGrid w:linePitch="360"/>
+        </w:sectPr>
+      </w:pPr>
+    </w:p>
+    <w:p>
+      <w:pPr>
+        <w:jc w:val="both"/>
+      </w:pPr>
+      <w:r>
+        <w:t>그림 3은 실제 인물 R02에 조건부 지시와 인용문을 포함한 대화를 적용한 예이다. 왼쪽부터 전체 이력, 검사 전 조건, 검사 후 조건이다. 목표는 녹색 재킷, 원래 흰 상의, 파란 핀, 원본의 목걸이 없는 상태, 도서관과 돌 벤치이다. 검사 전 조건에는 인용문의 재킷 복원과 조건부 벤치 삭제가 남아 있었고, 검사 후에는 직접 지시만 반영하였다. 각 사진은 원본에서 따로 생성하였다. 표 15와 16의 집계는 이 예시와 나머지 두 대화를 모두 포함한다.</w:t>
+      </w:r>
+    </w:p>
+    <w:p>
+      <w:pPr>
         <w:pStyle w:val="Heading1"/>
       </w:pPr>
       <w:r>
         <w:t>VI. 논의</w:t>
+      </w:r>
+    </w:p>
+    <w:p>
+      <w:pPr>
+        <w:jc w:val="both"/>
+      </w:pPr>
+      <w:r>
+        <w:t>초기 실험은 직전 출력의 재편집과 최초 원본의 재사용을 비교하였다. 그 결과에 따라 원본을 재사용하는 구성을 선택하고, 후속 실험에서는 원본에 전달할 조건을 정확하고 간결하게 정리하는 방법을 검사하였다. 마지막 요청에서 프롬프트는 평균 39.87% 짧아졌지만 얼굴 지표의 방향은 서로 달랐다. 요청 정리의 정확성과 입력 길이, 실제 출력의 얼굴 보존을 각각 측정해야 한다.</w:t>
       </w:r>
     </w:p>
     <w:p>
@@ -8242,7 +10589,7 @@
         <w:jc w:val="both"/>
       </w:pPr>
       <w:r>
-        <w:t>이미지 실험은 인물 2명과 생성 도구 하나를 사용하였고, 비교 64쌍 중 60쌍이 같은 출력을 공유하였다. 두 AI 평가 모두 설명과 점수의 불일치가 나타났다. 이미지 분석에서는 개별 편집 결과와 두 평가 모델의 판정 차이를 비교하였다. 얼굴 특징 벡터의 코사인 유사도는 입력이 다른 네 쌍 중 두 쌍에서 상승하고 두 쌍에서 하락하였다.</w:t>
+        <w:t>앞선 유지·삭제 이미지 실험은 인물 2명과 생성 도구 하나를 사용하였고, 비교 64쌍 중 60쌍이 같은 출력을 공유하였다. 두 AI 평가 모두 설명과 점수의 불일치가 나타났다. 이미지 분석에서는 개별 편집 결과와 두 평가 모델의 판정 차이를 비교하였다. 얼굴 특징 벡터의 코사인 유사도는 입력이 다른 네 쌍 중 두 쌍에서 상승하고 두 쌍에서 하락하였다.</w:t>
       </w:r>
     </w:p>
     <w:p>
@@ -8290,6 +10637,14 @@
         <w:jc w:val="both"/>
       </w:pPr>
       <w:r>
+        <w:t>초기 합성 인물 6명의 10단계 편집에서 원본 기반 재생성은 얼굴 위치를 보정한 세 지표 모두 6/6쌍에서 순차 최종 출력보다 원본에 가까웠다. 이에 따라 원본에 적용할 현재 편집 조건을 정확하게 정리하는 방법을 연구하였다.</w:t>
+      </w:r>
+    </w:p>
+    <w:p>
+      <w:pPr>
+        <w:jc w:val="both"/>
+      </w:pPr>
+      <w:r>
         <w:t>반복 인물 이미지 편집에서 변경 사항을 한 번 추출한 뒤 지시 구절을 확인하여 상태를 갱신하는 방법을 구현하였다. 원본 복원과 유지 대상을 구분하고, 현재 실행할 지시와 부정·조건·인용 표현을 구분한다. 같은 항목의 뒤 직접 지시를 적용한 후 저장한 조건으로 이미지 편집 프롬프트를 작성한다.</w:t>
       </w:r>
     </w:p>
@@ -8298,7 +10653,7 @@
         <w:jc w:val="both"/>
       </w:pPr>
       <w:r>
-        <w:t>새 요청 12개에서 동일한 최초 응답을 단순 JSON으로 적용하면 Qwen3와 Llama 모두 3/12였고, 제안 방법은 모두 12/12였다. 재검토와 지시 검사를 함께 사용하면 각각 12/12와 4/12였다. 이 검증에서 요청당 모델 호출을 두 번에서 한 번으로 줄이면서 같은 정확도 또는 더 높은 정확도를 얻었다. 지시 검사는 지원하는 표현의 적용 오류를 바로잡았고, 최초 응답만 사용하여 재검토가 정답을 잘못 바꾸는 사례를 피하였다. 검증 범위는 AI를 이용해 구성한 영어 대화와 명시한 여섯 상태 항목 및 문형이다.</w:t>
+        <w:t>새 요청 12개에서 동일한 최초 응답을 단순 JSON으로 적용하면 Qwen3와 Llama 모두 3/12였고, 제안 방법은 모두 12/12였다. 재검토와 지시 검사를 함께 사용하면 각각 12/12와 4/12였다. 이 검증에서 요청당 모델 호출을 두 번에서 한 번으로 줄이면서 같은 정확도 또는 더 높은 정확도를 얻었다. 지시 검사는 지원하는 표현의 적용 오류를 바로잡았고, 최초 응답만 사용하여 재검토가 정답을 잘못 바꾸는 사례를 피하였다. 검증 범위는 AI를 이용해 구성한 영어 대화와 명시한 여섯 상태 항목 및 문형이다. 실제 인물 두 명에게 세 대화의 마지막 요청을 적용한 이미지 18장을 추가 생성하였다. 전체 이력을 현재 조건으로 바꾸면 평균 프롬프트 길이는 204.00토큰에서 122.67토큰으로 줄었다. 7B 평가의 목표 충족 수는 전체 이력 34/36, 검사 전 조건 24/36, 검사 후 조건 36/36이었다. 얼굴 지표는 비교 방식과 측정 항목에 따라 방향이 달랐으며, AI 요청 충족 평가의 오류도 함께 기록하였다.</w:t>
       </w:r>
     </w:p>
     <w:p>
@@ -8397,6 +10752,16 @@
       </w:pPr>
       <w:r>
         <w:t>[9] Meta, “Llama 3.2 Model Card,” 2024. https://huggingface.co/meta-llama/Llama-3.2-3B-Instruct</w:t>
+      </w:r>
+    </w:p>
+    <w:p>
+      <w:pPr>
+        <w:keepLines/>
+        <w:ind w:firstLine="0"/>
+        <w:jc w:val="left"/>
+      </w:pPr>
+      <w:r>
+        <w:t>[10] R. Zhang et al., “The Unreasonable Effectiveness of Deep Features as a Perceptual Metric,” CVPR, 2018. https://arxiv.org/abs/1801.03924</w:t>
       </w:r>
     </w:p>
     <w:sectPr>

</xml_diff>

<commit_message>
Validate frozen method on 96 new requests and align thesis and slides
</commit_message>
<xml_diff>
--- a/paper/manuscript.inha.docx
+++ b/paper/manuscript.inha.docx
@@ -65,7 +65,7 @@
         <w:t xml:space="preserve">요약: </w:t>
       </w:r>
       <w:r>
-        <w:t>반복 이미지 편집에서 원본 사진을 재사용하려면 누적된 요청을 현재 편집 조건으로 정리해야 한다. 본 연구는 언어 모델이 한 번 추출한 변경 사항에 삭제·복원·유지 및 실행 대상 검사를 적용하는 방법을 제안한다. 합성 인물 6명의 10단계 편집에서 위치 보정 MAE·SSIM·LPIPS는 최종 6쌍 모두 원본 기반 재생성에 유리하였다. 새 합성 영어 요청 12개에서 Qwen3-4B와 Llama-3.2-3B-Instruct의 첫 응답을 단순 적용하면 전체 상태 일치율은 모두 3/12였고, 제안 방법은 모두 12/12였다. 실제 인물 두 명에게 세 대화를 적용한 이미지 18장에서는 전체 요청 이력을 현재 조건으로 바꾸어 평균 프롬프트 길이를 204.00토큰에서 122.67토큰으로 39.87% 줄였다. 7B AI 평가의 목표 충족 수는 전체 이력 34/36, 지시 검사 후 조건 36/36이었다. 얼굴 보존 지표의 변화 방향은 측정 항목에 따라 달랐다. 상태 갱신 평가는 여섯 편집 항목과 지정한 영어 문형의 합성 대화를 대상으로 하였다.</w:t>
+        <w:t>반복 이미지 편집에서 원본 사진을 재사용하려면 누적된 요청을 현재 편집 조건으로 정리해야 한다. 본 연구는 언어 모델이 한 번 추출한 변경 사항에 삭제·복원·유지 및 실행 대상 검사를 적용하는 방법을 제안한다. 합성 인물 6명의 10단계 편집에서 위치 보정 MAE·SSIM·LPIPS는 최종 6쌍 모두 원본 기반 재생성에 유리하였다. 새 합성 영어 요청 96개에서 Qwen3-4B의 전체 상태 일치는 첫 응답 단순 적용 52/96, 제안 방법 96/96이었고, Llama-3.2-3B-Instruct는 각각 27/96과 93/96이었다. 실제 인물 두 명에게 세 대화를 적용한 이미지 18장에서는 전체 요청 이력을 현재 조건으로 바꾸어 평균 프롬프트 길이를 204.00토큰에서 122.67토큰으로 39.87% 줄였다. 7B AI 평가의 목표 충족 수는 전체 이력 34/36, 지시 검사 후 조건 36/36이었다. 얼굴 보존 지표의 변화 방향은 측정 항목에 따라 달랐다. 상태 갱신 평가는 여섯 편집 항목과 지정한 영어 문형의 합성 대화를 대상으로 하였다.</w:t>
       </w:r>
     </w:p>
     <w:p>
@@ -79,7 +79,7 @@
         <w:t xml:space="preserve">Abstract: </w:t>
       </w:r>
       <w:r>
-        <w:t>Original-referenced portrait editing requires compiling accumulated requests into current editing conditions. We propose a method that extracts changes once and checks removal, restoration, preservation, and instruction eligibility. In an initial ten-step experiment on six synthetic people, original-referenced regeneration was closer to the source on all six final pairs using registered MAE, SSIM, and LPIPS. On twelve new synthetic English requests, applying the initial response directly matched 3/12 full reference states for both Qwen3-4B and Llama-3.2-3B-Instruct; the proposed method matched 12/12 for both. A follow-up comparison generated eighteen images from two real-person photographs and three dialogues. Compiling checked current conditions reduced the mean final prompt length from 204.00 to 122.67 tokens, a 39.87% reduction. A post-hoc Qwen2.5-VL-7B evaluator scored 34/36 target attributes for full request histories and 36/36 for checked conditions. Facial preservation metrics showed mixed directions across input forms. State-update evaluation used six editing attributes and supported English instruction forms in AI-generated synthetic dialogues.</w:t>
+        <w:t>Original-referenced portrait editing requires compiling accumulated requests into current editing conditions. We propose a method that extracts changes once and checks removal, restoration, preservation, and instruction eligibility. In an initial ten-step experiment on six synthetic people, original-referenced regeneration was closer to the source on all six final pairs using registered MAE, SSIM, and LPIPS. On 96 new synthetic English requests in twelve eight-request dialogues, direct application and the proposed method matched 52/96 and 96/96 full reference states for Qwen3-4B, and 27/96 and 93/96 for Llama-3.2-3B-Instruct, respectively. The implementation was frozen before evaluation. A follow-up comparison generated eighteen images from two real-person photographs and three dialogues. Compiling checked current conditions reduced the mean final prompt length from 204.00 to 122.67 tokens, a 39.87% reduction. A post-hoc Qwen2.5-VL-7B evaluator scored 34/36 target attributes for full request histories and 36/36 for checked conditions. Facial preservation metrics showed mixed directions across input forms. State-update evaluation used six editing attributes and supported English instruction forms in AI-generated synthetic dialogues.</w:t>
       </w:r>
     </w:p>
     <w:p>
@@ -297,7 +297,15 @@
         <w:jc w:val="both"/>
       </w:pPr>
       <w:r>
-        <w:t>상태 갱신 실험에는 AI를 이용해 작성한 합성 영어 대화를 사용하였다. 정답은 대화 작성 시 정한 항목별 변경을 초기 상태에 순서대로 적용하여 계산하였다. 개발 자료로 규칙을 수정한 뒤, 코드·요청·정답·모델 설정을 고정하고 별도의 대화로 검증하였다. 최종 비교는 세 대화의 서로 다른 요청 12개이며 Qwen3-4B와 Llama-3.2-3B-Instruct[4,9]에 같은 요청을 입력하였다. 모두 4비트 양자화 모델이고 온도 0, 최대 출력 260토큰, 공통 예시 7개를 사용하였다. 비교용 추출·재검토 응답은 모델별 24개, 총 48개를 저장하였다.</w:t>
+        <w:t>상태 갱신 실험에는 AI를 이용해 작성한 합성 영어 대화를 사용하였다. 정답은 대화 작성 시 정한 항목별 변경을 초기 상태에 순서대로 적용하여 계산하였다. 개발 자료로 규칙을 수정한 뒤, 코드·요청·정답·모델 설정을 고정하고 별도의 대화로 검증하였다. 앞선 비교는 세 대화의 서로 다른 요청 12개이며 Qwen3-4B와 Llama-3.2-3B-Instruct[4,9]에 같은 요청을 입력하였다. 모두 4비트 양자화 모델이고 온도 0, 최대 출력 260토큰, 공통 예시 7개를 사용하였다. 비교용 추출·재검토 응답은 모델별 24개, 총 48개를 저장하였다.</w:t>
+      </w:r>
+    </w:p>
+    <w:p>
+      <w:pPr>
+        <w:jc w:val="both"/>
+      </w:pPr>
+      <w:r>
+        <w:t>추가 검증은 코드와 모델 설정을 그대로 고정한 뒤 새 대화 12개에 요청을 여덟 개씩 적용한 96개이다. 네 가지 표현 틀에 세 가지 속성 조합을 배정하고 삭제·복원·유지·부정·인용·조건·뒤 직접 지시를 조합하였다. 조건문·명시된 인용문·부정 지시는 즉시 실행하지 않고, 뒤에 나온 직접 지시를 적용하는 정책으로 정답을 구성하였다. 중간 요청의 순서를 바꾸어 오류가 후속 상태에 미치는 영향도 관찰하였다. 모든 문장은 기존 검증 자료와 중복되지 않으며 정답은 채점에만 사용하였다. 두 모델에 동일한 96개를 각각 입력하여 최초 추출·재검토 응답 총 384개를 저장하였다.</w:t>
       </w:r>
     </w:p>
     <w:p>
@@ -345,6 +353,14 @@
         <w:jc w:val="both"/>
       </w:pPr>
       <w:r>
+        <w:t>추가 96개 검증에서는 요청의 대화 내 의존성을 고려하여 대화 12개를 단위로 20000회 복원 추출한 정확도 차이의 95% 백분위 구간을 계산하였다. 첫 응답 단순 적용과 제안 방법의 주 비교는 대화별 차이에 대한 4096개 부호 조합의 양측 무작위화 검정으로 분석하고, 두 모델의 p값에 Holm 보정을 적용하였다. 표현 틀을 공유하는 합성 자료 안에서의 변동을 측정하였다.</w:t>
+      </w:r>
+    </w:p>
+    <w:p>
+      <w:pPr>
+        <w:jc w:val="both"/>
+      </w:pPr>
+      <w:r>
         <w:t>초기 얼굴 지표는 인물별 원본에서 정한 320×360 영역의 MAE·SSIM·LPIPS[10]이다. 원본과 출력의 위치 차이는 NCC로 ±64픽셀 안에서 찾고, 평활화 sigma 3을 주 분석으로 사용하였다. MAE와 LPIPS는 작을수록, SSIM은 클수록 원본에 가깝다. sigma 1과 6도 함께 비교하였다. 원본·출력 해시를 대조하고 저장 지표를 재계산하였다.</w:t>
       </w:r>
     </w:p>
@@ -385,7 +401,7 @@
         <w:jc w:val="both"/>
       </w:pPr>
       <w:r>
-        <w:t>요청·정답·모델 응답, 생성 이미지와 실행 설정은 연구 저장소에 공개하였다. 개발 자료의 재계산과 새 대화 검증은 실험별로 구분하였다. 코드로 구성한 상태 검사 1323개와 저장 응답 24개의 재생으로 상태 갱신 및 프롬프트 작성의 일치도도 확인하였다.</w:t>
+        <w:t>요청·정답·모델 응답, 생성 이미지와 실행 설정은 연구 저장소에 공개하였다. 개발 자료의 재계산과 새 대화 검증은 실험별로 구분하였다. 코드로 구성한 상태 검사 1323개를 수행하였다. 기존 저장 응답 24개와 추가 검증의 첫 응답 192개를 실제 실행 코드에 재생하여 상태 갱신과 프롬프트 작성도 대조하였다.</w:t>
       </w:r>
     </w:p>
     <w:p>
@@ -1025,7 +1041,7 @@
         <w:jc w:val="both"/>
       </w:pPr>
       <w:r>
-        <w:t>최종 비교 결과를 표 2에 제시하였다. 첫 응답만 단순 적용하면 두 모델 모두 3/12였고, 같은 응답에 지시 검사를 적용하면 모두 12/12였다. 두 번 호출하여 같은 검사를 적용한 결과는 Qwen3 12/12, Llama 4/12였다.</w:t>
+        <w:t>기존 새 요청 12개에서는 첫 응답 단순 적용이 두 모델 모두 3/12, 제안 방법이 모두 12/12였다. 같은 구현을 고정하고 대화를 늘린 96개 요청의 결과는 표 2와 같다.</w:t>
       </w:r>
     </w:p>
     <w:p>
@@ -1037,7 +1053,7 @@
         <w:jc w:val="center"/>
       </w:pPr>
       <w:r>
-        <w:t>표 2. 한 번 추출하는 방법의 정확도와 모델 호출 수</w:t>
+        <w:t>표 2. 추가 96개 요청의 상태 일치와 호출 수</w:t>
       </w:r>
     </w:p>
     <w:tbl>
@@ -1192,107 +1208,6 @@
                 <w:b w:val="0"/>
                 <w:sz w:val="16"/>
               </w:rPr>
-              <w:t>기준 방법</w:t>
-            </w:r>
-          </w:p>
-        </w:tc>
-        <w:tc>
-          <w:tcPr>
-            <w:tcW w:type="dxa" w:w="1068"/>
-            <w:tcMar>
-              <w:left w:w="45" w:type="dxa"/>
-              <w:right w:w="45" w:type="dxa"/>
-            </w:tcMar>
-          </w:tcPr>
-          <w:p>
-            <w:pPr>
-              <w:keepNext/>
-              <w:spacing w:after="60" w:before="60" w:line="240" w:lineRule="auto"/>
-              <w:ind w:firstLine="0"/>
-              <w:jc w:val="center"/>
-            </w:pPr>
-            <w:r>
-              <w:rPr>
-                <w:b w:val="0"/>
-                <w:sz w:val="16"/>
-              </w:rPr>
-              <w:t>2</w:t>
-            </w:r>
-          </w:p>
-        </w:tc>
-        <w:tc>
-          <w:tcPr>
-            <w:tcW w:type="dxa" w:w="1068"/>
-            <w:tcMar>
-              <w:left w:w="45" w:type="dxa"/>
-              <w:right w:w="45" w:type="dxa"/>
-            </w:tcMar>
-          </w:tcPr>
-          <w:p>
-            <w:pPr>
-              <w:keepNext/>
-              <w:spacing w:after="60" w:before="60" w:line="240" w:lineRule="auto"/>
-              <w:ind w:firstLine="0"/>
-              <w:jc w:val="center"/>
-            </w:pPr>
-            <w:r>
-              <w:rPr>
-                <w:b w:val="0"/>
-                <w:sz w:val="16"/>
-              </w:rPr>
-              <w:t>3/12</w:t>
-            </w:r>
-          </w:p>
-        </w:tc>
-        <w:tc>
-          <w:tcPr>
-            <w:tcW w:type="dxa" w:w="1068"/>
-            <w:tcMar>
-              <w:left w:w="45" w:type="dxa"/>
-              <w:right w:w="45" w:type="dxa"/>
-            </w:tcMar>
-          </w:tcPr>
-          <w:p>
-            <w:pPr>
-              <w:keepNext/>
-              <w:spacing w:after="60" w:before="60" w:line="240" w:lineRule="auto"/>
-              <w:ind w:firstLine="0"/>
-              <w:jc w:val="center"/>
-            </w:pPr>
-            <w:r>
-              <w:rPr>
-                <w:b w:val="0"/>
-                <w:sz w:val="16"/>
-              </w:rPr>
-              <w:t>1/12</w:t>
-            </w:r>
-          </w:p>
-        </w:tc>
-      </w:tr>
-      <w:tr>
-        <w:trPr>
-          <w:cantSplit/>
-        </w:trPr>
-        <w:tc>
-          <w:tcPr>
-            <w:tcW w:type="dxa" w:w="1417"/>
-            <w:tcMar>
-              <w:left w:w="45" w:type="dxa"/>
-              <w:right w:w="45" w:type="dxa"/>
-            </w:tcMar>
-          </w:tcPr>
-          <w:p>
-            <w:pPr>
-              <w:keepNext/>
-              <w:spacing w:after="60" w:before="60" w:line="240" w:lineRule="auto"/>
-              <w:ind w:firstLine="0"/>
-              <w:jc w:val="left"/>
-            </w:pPr>
-            <w:r>
-              <w:rPr>
-                <w:b w:val="0"/>
-                <w:sz w:val="16"/>
-              </w:rPr>
               <w:t>첫 응답만 적용</w:t>
             </w:r>
           </w:p>
@@ -1341,7 +1256,7 @@
                 <w:b w:val="0"/>
                 <w:sz w:val="16"/>
               </w:rPr>
-              <w:t>3/12</w:t>
+              <w:t>52/96</w:t>
             </w:r>
           </w:p>
         </w:tc>
@@ -1365,7 +1280,7 @@
                 <w:b w:val="0"/>
                 <w:sz w:val="16"/>
               </w:rPr>
-              <w:t>3/12</w:t>
+              <w:t>27/96</w:t>
             </w:r>
           </w:p>
         </w:tc>
@@ -1442,7 +1357,7 @@
                 <w:b w:val="0"/>
                 <w:sz w:val="16"/>
               </w:rPr>
-              <w:t>3/12</w:t>
+              <w:t>48/96</w:t>
             </w:r>
           </w:p>
         </w:tc>
@@ -1466,7 +1381,7 @@
                 <w:b w:val="0"/>
                 <w:sz w:val="16"/>
               </w:rPr>
-              <w:t>1/12</w:t>
+              <w:t>9/96</w:t>
             </w:r>
           </w:p>
         </w:tc>
@@ -1543,7 +1458,7 @@
                 <w:b w:val="0"/>
                 <w:sz w:val="16"/>
               </w:rPr>
-              <w:t>12/12</w:t>
+              <w:t>96/96</w:t>
             </w:r>
           </w:p>
         </w:tc>
@@ -1567,7 +1482,7 @@
                 <w:b w:val="0"/>
                 <w:sz w:val="16"/>
               </w:rPr>
-              <w:t>4/12</w:t>
+              <w:t>44/96</w:t>
             </w:r>
           </w:p>
         </w:tc>
@@ -1653,7 +1568,7 @@
                 <w:b w:val="0"/>
                 <w:sz w:val="16"/>
               </w:rPr>
-              <w:t>12/12</w:t>
+              <w:t>96/96</w:t>
             </w:r>
           </w:p>
         </w:tc>
@@ -1680,7 +1595,7 @@
                 <w:b w:val="0"/>
                 <w:sz w:val="16"/>
               </w:rPr>
-              <w:t>12/12</w:t>
+              <w:t>93/96</w:t>
             </w:r>
           </w:p>
         </w:tc>
@@ -1691,7 +1606,1237 @@
         <w:jc w:val="both"/>
       </w:pPr>
       <w:r>
-        <w:t>제안 방법은 두 모델 모두 항목별 72/72, 최종 상태 3/3이었고 기준 방법이 맞았던 요청을 새로 틀린 경우는 0개였다. Llama에서는 첫 응답으로 맞힌 요청 여덟 개를 재검토 결합이 틀렸으며, 반대 경우는 없었다. 이 비교에서는 첫 응답 선택과 지시 검사가 함께 정확도에 기여하였다.</w:t>
+        <w:t>제안 방법의 항목별 일치는 Qwen3 576/576, Llama 573/576이며, 최종 상태 일치는 각각 12/12와 9/12였다.</w:t>
+      </w:r>
+    </w:p>
+    <w:p>
+      <w:pPr>
+        <w:jc w:val="both"/>
+      </w:pPr>
+      <w:r>
+        <w:t>Qwen3에서 첫 응답 단순 적용 대비 정확도 차이는 45.83%p였으며 대화 단위 95% 구간은 31.25–59.38%p, Holm 보정 p값은 0.001953이었다.</w:t>
+      </w:r>
+    </w:p>
+    <w:p>
+      <w:pPr>
+        <w:jc w:val="both"/>
+      </w:pPr>
+      <w:r>
+        <w:t>Llama에서 첫 응답 단순 적용 대비 정확도 차이는 68.75%p였으며 대화 단위 95% 구간은 62.50–75.00%p, Holm 보정 p값은 0.000977이었다.</w:t>
+      </w:r>
+    </w:p>
+    <w:p>
+      <w:pPr>
+        <w:jc w:val="both"/>
+      </w:pPr>
+      <w:r>
+        <w:t>요청 유형별 결과를 표 3에 제시하였다. 대화별 일치 건수와 실패한 요청의 정답·관측 상태도 함께 보존하였다.</w:t>
+      </w:r>
+    </w:p>
+    <w:p>
+      <w:pPr>
+        <w:pStyle w:val="Caption"/>
+        <w:keepNext/>
+        <w:spacing w:before="100"/>
+        <w:ind w:firstLine="0"/>
+        <w:jc w:val="center"/>
+      </w:pPr>
+      <w:r>
+        <w:t>표 3. 추가 검증의 요청 유형별 전체 상태 일치</w:t>
+      </w:r>
+    </w:p>
+    <w:tbl>
+      <w:tblPr>
+        <w:tblW w:type="auto" w:w="0"/>
+        <w:tblLayout w:type="fixed"/>
+        <w:tblLook w:firstColumn="1" w:firstRow="1" w:lastColumn="0" w:lastRow="0" w:noHBand="0" w:noVBand="1" w:val="04A0"/>
+      </w:tblPr>
+      <w:tblGrid>
+        <w:gridCol w:w="1417"/>
+        <w:gridCol w:w="801"/>
+        <w:gridCol w:w="801"/>
+        <w:gridCol w:w="801"/>
+        <w:gridCol w:w="801"/>
+      </w:tblGrid>
+      <w:tr>
+        <w:trPr>
+          <w:cantSplit/>
+          <w:tblHeader/>
+        </w:trPr>
+        <w:tc>
+          <w:tcPr>
+            <w:tcW w:type="dxa" w:w="1417"/>
+            <w:tcMar>
+              <w:left w:w="45" w:type="dxa"/>
+              <w:right w:w="45" w:type="dxa"/>
+            </w:tcMar>
+            <w:tcBorders>
+              <w:bottom w:val="single" w:sz="5"/>
+            </w:tcBorders>
+          </w:tcPr>
+          <w:p>
+            <w:pPr>
+              <w:keepNext/>
+              <w:spacing w:after="60" w:before="60" w:line="240" w:lineRule="auto"/>
+              <w:ind w:firstLine="0"/>
+              <w:jc w:val="left"/>
+            </w:pPr>
+            <w:r>
+              <w:rPr>
+                <w:b/>
+                <w:sz w:val="16"/>
+              </w:rPr>
+              <w:t>요청 유형</w:t>
+            </w:r>
+          </w:p>
+        </w:tc>
+        <w:tc>
+          <w:tcPr>
+            <w:tcW w:type="dxa" w:w="801"/>
+            <w:tcMar>
+              <w:left w:w="45" w:type="dxa"/>
+              <w:right w:w="45" w:type="dxa"/>
+            </w:tcMar>
+            <w:tcBorders>
+              <w:bottom w:val="single" w:sz="5"/>
+            </w:tcBorders>
+          </w:tcPr>
+          <w:p>
+            <w:pPr>
+              <w:keepNext/>
+              <w:spacing w:after="60" w:before="60" w:line="240" w:lineRule="auto"/>
+              <w:ind w:firstLine="0"/>
+              <w:jc w:val="center"/>
+            </w:pPr>
+            <w:r>
+              <w:rPr>
+                <w:b/>
+                <w:sz w:val="16"/>
+              </w:rPr>
+              <w:t>Qwen3</w:t>
+              <w:br/>
+              <w:t>단순</w:t>
+            </w:r>
+          </w:p>
+        </w:tc>
+        <w:tc>
+          <w:tcPr>
+            <w:tcW w:type="dxa" w:w="801"/>
+            <w:tcMar>
+              <w:left w:w="45" w:type="dxa"/>
+              <w:right w:w="45" w:type="dxa"/>
+            </w:tcMar>
+            <w:tcBorders>
+              <w:bottom w:val="single" w:sz="5"/>
+            </w:tcBorders>
+          </w:tcPr>
+          <w:p>
+            <w:pPr>
+              <w:keepNext/>
+              <w:spacing w:after="60" w:before="60" w:line="240" w:lineRule="auto"/>
+              <w:ind w:firstLine="0"/>
+              <w:jc w:val="center"/>
+            </w:pPr>
+            <w:r>
+              <w:rPr>
+                <w:b/>
+                <w:sz w:val="16"/>
+              </w:rPr>
+              <w:t>Qwen3</w:t>
+              <w:br/>
+              <w:t>검사</w:t>
+            </w:r>
+          </w:p>
+        </w:tc>
+        <w:tc>
+          <w:tcPr>
+            <w:tcW w:type="dxa" w:w="801"/>
+            <w:tcMar>
+              <w:left w:w="45" w:type="dxa"/>
+              <w:right w:w="45" w:type="dxa"/>
+            </w:tcMar>
+            <w:tcBorders>
+              <w:bottom w:val="single" w:sz="5"/>
+            </w:tcBorders>
+          </w:tcPr>
+          <w:p>
+            <w:pPr>
+              <w:keepNext/>
+              <w:spacing w:after="60" w:before="60" w:line="240" w:lineRule="auto"/>
+              <w:ind w:firstLine="0"/>
+              <w:jc w:val="center"/>
+            </w:pPr>
+            <w:r>
+              <w:rPr>
+                <w:b/>
+                <w:sz w:val="16"/>
+              </w:rPr>
+              <w:t>Llama</w:t>
+              <w:br/>
+              <w:t>단순</w:t>
+            </w:r>
+          </w:p>
+        </w:tc>
+        <w:tc>
+          <w:tcPr>
+            <w:tcW w:type="dxa" w:w="801"/>
+            <w:tcMar>
+              <w:left w:w="45" w:type="dxa"/>
+              <w:right w:w="45" w:type="dxa"/>
+            </w:tcMar>
+            <w:tcBorders>
+              <w:bottom w:val="single" w:sz="5"/>
+            </w:tcBorders>
+          </w:tcPr>
+          <w:p>
+            <w:pPr>
+              <w:keepNext/>
+              <w:spacing w:after="60" w:before="60" w:line="240" w:lineRule="auto"/>
+              <w:ind w:firstLine="0"/>
+              <w:jc w:val="center"/>
+            </w:pPr>
+            <w:r>
+              <w:rPr>
+                <w:b/>
+                <w:sz w:val="16"/>
+              </w:rPr>
+              <w:t>Llama</w:t>
+              <w:br/>
+              <w:t>검사</w:t>
+            </w:r>
+          </w:p>
+        </w:tc>
+      </w:tr>
+      <w:tr>
+        <w:trPr>
+          <w:cantSplit/>
+        </w:trPr>
+        <w:tc>
+          <w:tcPr>
+            <w:tcW w:type="dxa" w:w="1417"/>
+            <w:tcMar>
+              <w:left w:w="45" w:type="dxa"/>
+              <w:right w:w="45" w:type="dxa"/>
+            </w:tcMar>
+          </w:tcPr>
+          <w:p>
+            <w:pPr>
+              <w:keepNext/>
+              <w:spacing w:after="60" w:before="60" w:line="240" w:lineRule="auto"/>
+              <w:ind w:firstLine="0"/>
+              <w:jc w:val="left"/>
+            </w:pPr>
+            <w:r>
+              <w:rPr>
+                <w:b w:val="0"/>
+                <w:sz w:val="16"/>
+              </w:rPr>
+              <w:t>초기 설정</w:t>
+            </w:r>
+          </w:p>
+        </w:tc>
+        <w:tc>
+          <w:tcPr>
+            <w:tcW w:type="dxa" w:w="801"/>
+            <w:tcMar>
+              <w:left w:w="45" w:type="dxa"/>
+              <w:right w:w="45" w:type="dxa"/>
+            </w:tcMar>
+          </w:tcPr>
+          <w:p>
+            <w:pPr>
+              <w:keepNext/>
+              <w:spacing w:after="60" w:before="60" w:line="240" w:lineRule="auto"/>
+              <w:ind w:firstLine="0"/>
+              <w:jc w:val="center"/>
+            </w:pPr>
+            <w:r>
+              <w:rPr>
+                <w:b w:val="0"/>
+                <w:sz w:val="16"/>
+              </w:rPr>
+              <w:t>12/12</w:t>
+            </w:r>
+          </w:p>
+        </w:tc>
+        <w:tc>
+          <w:tcPr>
+            <w:tcW w:type="dxa" w:w="801"/>
+            <w:tcMar>
+              <w:left w:w="45" w:type="dxa"/>
+              <w:right w:w="45" w:type="dxa"/>
+            </w:tcMar>
+          </w:tcPr>
+          <w:p>
+            <w:pPr>
+              <w:keepNext/>
+              <w:spacing w:after="60" w:before="60" w:line="240" w:lineRule="auto"/>
+              <w:ind w:firstLine="0"/>
+              <w:jc w:val="center"/>
+            </w:pPr>
+            <w:r>
+              <w:rPr>
+                <w:b w:val="0"/>
+                <w:sz w:val="16"/>
+              </w:rPr>
+              <w:t>12/12</w:t>
+            </w:r>
+          </w:p>
+        </w:tc>
+        <w:tc>
+          <w:tcPr>
+            <w:tcW w:type="dxa" w:w="801"/>
+            <w:tcMar>
+              <w:left w:w="45" w:type="dxa"/>
+              <w:right w:w="45" w:type="dxa"/>
+            </w:tcMar>
+          </w:tcPr>
+          <w:p>
+            <w:pPr>
+              <w:keepNext/>
+              <w:spacing w:after="60" w:before="60" w:line="240" w:lineRule="auto"/>
+              <w:ind w:firstLine="0"/>
+              <w:jc w:val="center"/>
+            </w:pPr>
+            <w:r>
+              <w:rPr>
+                <w:b w:val="0"/>
+                <w:sz w:val="16"/>
+              </w:rPr>
+              <w:t>12/12</w:t>
+            </w:r>
+          </w:p>
+        </w:tc>
+        <w:tc>
+          <w:tcPr>
+            <w:tcW w:type="dxa" w:w="801"/>
+            <w:tcMar>
+              <w:left w:w="45" w:type="dxa"/>
+              <w:right w:w="45" w:type="dxa"/>
+            </w:tcMar>
+          </w:tcPr>
+          <w:p>
+            <w:pPr>
+              <w:keepNext/>
+              <w:spacing w:after="60" w:before="60" w:line="240" w:lineRule="auto"/>
+              <w:ind w:firstLine="0"/>
+              <w:jc w:val="center"/>
+            </w:pPr>
+            <w:r>
+              <w:rPr>
+                <w:b w:val="0"/>
+                <w:sz w:val="16"/>
+              </w:rPr>
+              <w:t>12/12</w:t>
+            </w:r>
+          </w:p>
+        </w:tc>
+      </w:tr>
+      <w:tr>
+        <w:trPr>
+          <w:cantSplit/>
+        </w:trPr>
+        <w:tc>
+          <w:tcPr>
+            <w:tcW w:type="dxa" w:w="1417"/>
+            <w:tcMar>
+              <w:left w:w="45" w:type="dxa"/>
+              <w:right w:w="45" w:type="dxa"/>
+            </w:tcMar>
+          </w:tcPr>
+          <w:p>
+            <w:pPr>
+              <w:keepNext/>
+              <w:spacing w:after="60" w:before="60" w:line="240" w:lineRule="auto"/>
+              <w:ind w:firstLine="0"/>
+              <w:jc w:val="left"/>
+            </w:pPr>
+            <w:r>
+              <w:rPr>
+                <w:b w:val="0"/>
+                <w:sz w:val="16"/>
+              </w:rPr>
+              <w:t>두 항목 변경</w:t>
+            </w:r>
+          </w:p>
+        </w:tc>
+        <w:tc>
+          <w:tcPr>
+            <w:tcW w:type="dxa" w:w="801"/>
+            <w:tcMar>
+              <w:left w:w="45" w:type="dxa"/>
+              <w:right w:w="45" w:type="dxa"/>
+            </w:tcMar>
+          </w:tcPr>
+          <w:p>
+            <w:pPr>
+              <w:keepNext/>
+              <w:spacing w:after="60" w:before="60" w:line="240" w:lineRule="auto"/>
+              <w:ind w:firstLine="0"/>
+              <w:jc w:val="center"/>
+            </w:pPr>
+            <w:r>
+              <w:rPr>
+                <w:b w:val="0"/>
+                <w:sz w:val="16"/>
+              </w:rPr>
+              <w:t>3/12</w:t>
+            </w:r>
+          </w:p>
+        </w:tc>
+        <w:tc>
+          <w:tcPr>
+            <w:tcW w:type="dxa" w:w="801"/>
+            <w:tcMar>
+              <w:left w:w="45" w:type="dxa"/>
+              <w:right w:w="45" w:type="dxa"/>
+            </w:tcMar>
+          </w:tcPr>
+          <w:p>
+            <w:pPr>
+              <w:keepNext/>
+              <w:spacing w:after="60" w:before="60" w:line="240" w:lineRule="auto"/>
+              <w:ind w:firstLine="0"/>
+              <w:jc w:val="center"/>
+            </w:pPr>
+            <w:r>
+              <w:rPr>
+                <w:b w:val="0"/>
+                <w:sz w:val="16"/>
+              </w:rPr>
+              <w:t>12/12</w:t>
+            </w:r>
+          </w:p>
+        </w:tc>
+        <w:tc>
+          <w:tcPr>
+            <w:tcW w:type="dxa" w:w="801"/>
+            <w:tcMar>
+              <w:left w:w="45" w:type="dxa"/>
+              <w:right w:w="45" w:type="dxa"/>
+            </w:tcMar>
+          </w:tcPr>
+          <w:p>
+            <w:pPr>
+              <w:keepNext/>
+              <w:spacing w:after="60" w:before="60" w:line="240" w:lineRule="auto"/>
+              <w:ind w:firstLine="0"/>
+              <w:jc w:val="center"/>
+            </w:pPr>
+            <w:r>
+              <w:rPr>
+                <w:b w:val="0"/>
+                <w:sz w:val="16"/>
+              </w:rPr>
+              <w:t>1/12</w:t>
+            </w:r>
+          </w:p>
+        </w:tc>
+        <w:tc>
+          <w:tcPr>
+            <w:tcW w:type="dxa" w:w="801"/>
+            <w:tcMar>
+              <w:left w:w="45" w:type="dxa"/>
+              <w:right w:w="45" w:type="dxa"/>
+            </w:tcMar>
+          </w:tcPr>
+          <w:p>
+            <w:pPr>
+              <w:keepNext/>
+              <w:spacing w:after="60" w:before="60" w:line="240" w:lineRule="auto"/>
+              <w:ind w:firstLine="0"/>
+              <w:jc w:val="center"/>
+            </w:pPr>
+            <w:r>
+              <w:rPr>
+                <w:b w:val="0"/>
+                <w:sz w:val="16"/>
+              </w:rPr>
+              <w:t>12/12</w:t>
+            </w:r>
+          </w:p>
+        </w:tc>
+      </w:tr>
+      <w:tr>
+        <w:trPr>
+          <w:cantSplit/>
+        </w:trPr>
+        <w:tc>
+          <w:tcPr>
+            <w:tcW w:type="dxa" w:w="1417"/>
+            <w:tcMar>
+              <w:left w:w="45" w:type="dxa"/>
+              <w:right w:w="45" w:type="dxa"/>
+            </w:tcMar>
+          </w:tcPr>
+          <w:p>
+            <w:pPr>
+              <w:keepNext/>
+              <w:spacing w:after="60" w:before="60" w:line="240" w:lineRule="auto"/>
+              <w:ind w:firstLine="0"/>
+              <w:jc w:val="left"/>
+            </w:pPr>
+            <w:r>
+              <w:rPr>
+                <w:b w:val="0"/>
+                <w:sz w:val="16"/>
+              </w:rPr>
+              <w:t>삭제·유지</w:t>
+            </w:r>
+          </w:p>
+        </w:tc>
+        <w:tc>
+          <w:tcPr>
+            <w:tcW w:type="dxa" w:w="801"/>
+            <w:tcMar>
+              <w:left w:w="45" w:type="dxa"/>
+              <w:right w:w="45" w:type="dxa"/>
+            </w:tcMar>
+          </w:tcPr>
+          <w:p>
+            <w:pPr>
+              <w:keepNext/>
+              <w:spacing w:after="60" w:before="60" w:line="240" w:lineRule="auto"/>
+              <w:ind w:firstLine="0"/>
+              <w:jc w:val="center"/>
+            </w:pPr>
+            <w:r>
+              <w:rPr>
+                <w:b w:val="0"/>
+                <w:sz w:val="16"/>
+              </w:rPr>
+              <w:t>6/12</w:t>
+            </w:r>
+          </w:p>
+        </w:tc>
+        <w:tc>
+          <w:tcPr>
+            <w:tcW w:type="dxa" w:w="801"/>
+            <w:tcMar>
+              <w:left w:w="45" w:type="dxa"/>
+              <w:right w:w="45" w:type="dxa"/>
+            </w:tcMar>
+          </w:tcPr>
+          <w:p>
+            <w:pPr>
+              <w:keepNext/>
+              <w:spacing w:after="60" w:before="60" w:line="240" w:lineRule="auto"/>
+              <w:ind w:firstLine="0"/>
+              <w:jc w:val="center"/>
+            </w:pPr>
+            <w:r>
+              <w:rPr>
+                <w:b w:val="0"/>
+                <w:sz w:val="16"/>
+              </w:rPr>
+              <w:t>12/12</w:t>
+            </w:r>
+          </w:p>
+        </w:tc>
+        <w:tc>
+          <w:tcPr>
+            <w:tcW w:type="dxa" w:w="801"/>
+            <w:tcMar>
+              <w:left w:w="45" w:type="dxa"/>
+              <w:right w:w="45" w:type="dxa"/>
+            </w:tcMar>
+          </w:tcPr>
+          <w:p>
+            <w:pPr>
+              <w:keepNext/>
+              <w:spacing w:after="60" w:before="60" w:line="240" w:lineRule="auto"/>
+              <w:ind w:firstLine="0"/>
+              <w:jc w:val="center"/>
+            </w:pPr>
+            <w:r>
+              <w:rPr>
+                <w:b w:val="0"/>
+                <w:sz w:val="16"/>
+              </w:rPr>
+              <w:t>5/12</w:t>
+            </w:r>
+          </w:p>
+        </w:tc>
+        <w:tc>
+          <w:tcPr>
+            <w:tcW w:type="dxa" w:w="801"/>
+            <w:tcMar>
+              <w:left w:w="45" w:type="dxa"/>
+              <w:right w:w="45" w:type="dxa"/>
+            </w:tcMar>
+          </w:tcPr>
+          <w:p>
+            <w:pPr>
+              <w:keepNext/>
+              <w:spacing w:after="60" w:before="60" w:line="240" w:lineRule="auto"/>
+              <w:ind w:firstLine="0"/>
+              <w:jc w:val="center"/>
+            </w:pPr>
+            <w:r>
+              <w:rPr>
+                <w:b w:val="0"/>
+                <w:sz w:val="16"/>
+              </w:rPr>
+              <w:t>12/12</w:t>
+            </w:r>
+          </w:p>
+        </w:tc>
+      </w:tr>
+      <w:tr>
+        <w:trPr>
+          <w:cantSplit/>
+        </w:trPr>
+        <w:tc>
+          <w:tcPr>
+            <w:tcW w:type="dxa" w:w="1417"/>
+            <w:tcMar>
+              <w:left w:w="45" w:type="dxa"/>
+              <w:right w:w="45" w:type="dxa"/>
+            </w:tcMar>
+          </w:tcPr>
+          <w:p>
+            <w:pPr>
+              <w:keepNext/>
+              <w:spacing w:after="60" w:before="60" w:line="240" w:lineRule="auto"/>
+              <w:ind w:firstLine="0"/>
+              <w:jc w:val="left"/>
+            </w:pPr>
+            <w:r>
+              <w:rPr>
+                <w:b w:val="0"/>
+                <w:sz w:val="16"/>
+              </w:rPr>
+              <w:t>복원·유지</w:t>
+            </w:r>
+          </w:p>
+        </w:tc>
+        <w:tc>
+          <w:tcPr>
+            <w:tcW w:type="dxa" w:w="801"/>
+            <w:tcMar>
+              <w:left w:w="45" w:type="dxa"/>
+              <w:right w:w="45" w:type="dxa"/>
+            </w:tcMar>
+          </w:tcPr>
+          <w:p>
+            <w:pPr>
+              <w:keepNext/>
+              <w:spacing w:after="60" w:before="60" w:line="240" w:lineRule="auto"/>
+              <w:ind w:firstLine="0"/>
+              <w:jc w:val="center"/>
+            </w:pPr>
+            <w:r>
+              <w:rPr>
+                <w:b w:val="0"/>
+                <w:sz w:val="16"/>
+              </w:rPr>
+              <w:t>9/12</w:t>
+            </w:r>
+          </w:p>
+        </w:tc>
+        <w:tc>
+          <w:tcPr>
+            <w:tcW w:type="dxa" w:w="801"/>
+            <w:tcMar>
+              <w:left w:w="45" w:type="dxa"/>
+              <w:right w:w="45" w:type="dxa"/>
+            </w:tcMar>
+          </w:tcPr>
+          <w:p>
+            <w:pPr>
+              <w:keepNext/>
+              <w:spacing w:after="60" w:before="60" w:line="240" w:lineRule="auto"/>
+              <w:ind w:firstLine="0"/>
+              <w:jc w:val="center"/>
+            </w:pPr>
+            <w:r>
+              <w:rPr>
+                <w:b w:val="0"/>
+                <w:sz w:val="16"/>
+              </w:rPr>
+              <w:t>12/12</w:t>
+            </w:r>
+          </w:p>
+        </w:tc>
+        <w:tc>
+          <w:tcPr>
+            <w:tcW w:type="dxa" w:w="801"/>
+            <w:tcMar>
+              <w:left w:w="45" w:type="dxa"/>
+              <w:right w:w="45" w:type="dxa"/>
+            </w:tcMar>
+          </w:tcPr>
+          <w:p>
+            <w:pPr>
+              <w:keepNext/>
+              <w:spacing w:after="60" w:before="60" w:line="240" w:lineRule="auto"/>
+              <w:ind w:firstLine="0"/>
+              <w:jc w:val="center"/>
+            </w:pPr>
+            <w:r>
+              <w:rPr>
+                <w:b w:val="0"/>
+                <w:sz w:val="16"/>
+              </w:rPr>
+              <w:t>2/12</w:t>
+            </w:r>
+          </w:p>
+        </w:tc>
+        <w:tc>
+          <w:tcPr>
+            <w:tcW w:type="dxa" w:w="801"/>
+            <w:tcMar>
+              <w:left w:w="45" w:type="dxa"/>
+              <w:right w:w="45" w:type="dxa"/>
+            </w:tcMar>
+          </w:tcPr>
+          <w:p>
+            <w:pPr>
+              <w:keepNext/>
+              <w:spacing w:after="60" w:before="60" w:line="240" w:lineRule="auto"/>
+              <w:ind w:firstLine="0"/>
+              <w:jc w:val="center"/>
+            </w:pPr>
+            <w:r>
+              <w:rPr>
+                <w:b w:val="0"/>
+                <w:sz w:val="16"/>
+              </w:rPr>
+              <w:t>12/12</w:t>
+            </w:r>
+          </w:p>
+        </w:tc>
+      </w:tr>
+      <w:tr>
+        <w:trPr>
+          <w:cantSplit/>
+        </w:trPr>
+        <w:tc>
+          <w:tcPr>
+            <w:tcW w:type="dxa" w:w="1417"/>
+            <w:tcMar>
+              <w:left w:w="45" w:type="dxa"/>
+              <w:right w:w="45" w:type="dxa"/>
+            </w:tcMar>
+          </w:tcPr>
+          <w:p>
+            <w:pPr>
+              <w:keepNext/>
+              <w:spacing w:after="60" w:before="60" w:line="240" w:lineRule="auto"/>
+              <w:ind w:firstLine="0"/>
+              <w:jc w:val="left"/>
+            </w:pPr>
+            <w:r>
+              <w:rPr>
+                <w:b w:val="0"/>
+                <w:sz w:val="16"/>
+              </w:rPr>
+              <w:t>부정 지시</w:t>
+            </w:r>
+          </w:p>
+        </w:tc>
+        <w:tc>
+          <w:tcPr>
+            <w:tcW w:type="dxa" w:w="801"/>
+            <w:tcMar>
+              <w:left w:w="45" w:type="dxa"/>
+              <w:right w:w="45" w:type="dxa"/>
+            </w:tcMar>
+          </w:tcPr>
+          <w:p>
+            <w:pPr>
+              <w:keepNext/>
+              <w:spacing w:after="60" w:before="60" w:line="240" w:lineRule="auto"/>
+              <w:ind w:firstLine="0"/>
+              <w:jc w:val="center"/>
+            </w:pPr>
+            <w:r>
+              <w:rPr>
+                <w:b w:val="0"/>
+                <w:sz w:val="16"/>
+              </w:rPr>
+              <w:t>10/12</w:t>
+            </w:r>
+          </w:p>
+        </w:tc>
+        <w:tc>
+          <w:tcPr>
+            <w:tcW w:type="dxa" w:w="801"/>
+            <w:tcMar>
+              <w:left w:w="45" w:type="dxa"/>
+              <w:right w:w="45" w:type="dxa"/>
+            </w:tcMar>
+          </w:tcPr>
+          <w:p>
+            <w:pPr>
+              <w:keepNext/>
+              <w:spacing w:after="60" w:before="60" w:line="240" w:lineRule="auto"/>
+              <w:ind w:firstLine="0"/>
+              <w:jc w:val="center"/>
+            </w:pPr>
+            <w:r>
+              <w:rPr>
+                <w:b w:val="0"/>
+                <w:sz w:val="16"/>
+              </w:rPr>
+              <w:t>12/12</w:t>
+            </w:r>
+          </w:p>
+        </w:tc>
+        <w:tc>
+          <w:tcPr>
+            <w:tcW w:type="dxa" w:w="801"/>
+            <w:tcMar>
+              <w:left w:w="45" w:type="dxa"/>
+              <w:right w:w="45" w:type="dxa"/>
+            </w:tcMar>
+          </w:tcPr>
+          <w:p>
+            <w:pPr>
+              <w:keepNext/>
+              <w:spacing w:after="60" w:before="60" w:line="240" w:lineRule="auto"/>
+              <w:ind w:firstLine="0"/>
+              <w:jc w:val="center"/>
+            </w:pPr>
+            <w:r>
+              <w:rPr>
+                <w:b w:val="0"/>
+                <w:sz w:val="16"/>
+              </w:rPr>
+              <w:t>5/12</w:t>
+            </w:r>
+          </w:p>
+        </w:tc>
+        <w:tc>
+          <w:tcPr>
+            <w:tcW w:type="dxa" w:w="801"/>
+            <w:tcMar>
+              <w:left w:w="45" w:type="dxa"/>
+              <w:right w:w="45" w:type="dxa"/>
+            </w:tcMar>
+          </w:tcPr>
+          <w:p>
+            <w:pPr>
+              <w:keepNext/>
+              <w:spacing w:after="60" w:before="60" w:line="240" w:lineRule="auto"/>
+              <w:ind w:firstLine="0"/>
+              <w:jc w:val="center"/>
+            </w:pPr>
+            <w:r>
+              <w:rPr>
+                <w:b w:val="0"/>
+                <w:sz w:val="16"/>
+              </w:rPr>
+              <w:t>12/12</w:t>
+            </w:r>
+          </w:p>
+        </w:tc>
+      </w:tr>
+      <w:tr>
+        <w:trPr>
+          <w:cantSplit/>
+        </w:trPr>
+        <w:tc>
+          <w:tcPr>
+            <w:tcW w:type="dxa" w:w="1417"/>
+            <w:tcMar>
+              <w:left w:w="45" w:type="dxa"/>
+              <w:right w:w="45" w:type="dxa"/>
+            </w:tcMar>
+          </w:tcPr>
+          <w:p>
+            <w:pPr>
+              <w:keepNext/>
+              <w:spacing w:after="60" w:before="60" w:line="240" w:lineRule="auto"/>
+              <w:ind w:firstLine="0"/>
+              <w:jc w:val="left"/>
+            </w:pPr>
+            <w:r>
+              <w:rPr>
+                <w:b w:val="0"/>
+                <w:sz w:val="16"/>
+              </w:rPr>
+              <w:t>인용문</w:t>
+            </w:r>
+          </w:p>
+        </w:tc>
+        <w:tc>
+          <w:tcPr>
+            <w:tcW w:type="dxa" w:w="801"/>
+            <w:tcMar>
+              <w:left w:w="45" w:type="dxa"/>
+              <w:right w:w="45" w:type="dxa"/>
+            </w:tcMar>
+          </w:tcPr>
+          <w:p>
+            <w:pPr>
+              <w:keepNext/>
+              <w:spacing w:after="60" w:before="60" w:line="240" w:lineRule="auto"/>
+              <w:ind w:firstLine="0"/>
+              <w:jc w:val="center"/>
+            </w:pPr>
+            <w:r>
+              <w:rPr>
+                <w:b w:val="0"/>
+                <w:sz w:val="16"/>
+              </w:rPr>
+              <w:t>5/12</w:t>
+            </w:r>
+          </w:p>
+        </w:tc>
+        <w:tc>
+          <w:tcPr>
+            <w:tcW w:type="dxa" w:w="801"/>
+            <w:tcMar>
+              <w:left w:w="45" w:type="dxa"/>
+              <w:right w:w="45" w:type="dxa"/>
+            </w:tcMar>
+          </w:tcPr>
+          <w:p>
+            <w:pPr>
+              <w:keepNext/>
+              <w:spacing w:after="60" w:before="60" w:line="240" w:lineRule="auto"/>
+              <w:ind w:firstLine="0"/>
+              <w:jc w:val="center"/>
+            </w:pPr>
+            <w:r>
+              <w:rPr>
+                <w:b w:val="0"/>
+                <w:sz w:val="16"/>
+              </w:rPr>
+              <w:t>12/12</w:t>
+            </w:r>
+          </w:p>
+        </w:tc>
+        <w:tc>
+          <w:tcPr>
+            <w:tcW w:type="dxa" w:w="801"/>
+            <w:tcMar>
+              <w:left w:w="45" w:type="dxa"/>
+              <w:right w:w="45" w:type="dxa"/>
+            </w:tcMar>
+          </w:tcPr>
+          <w:p>
+            <w:pPr>
+              <w:keepNext/>
+              <w:spacing w:after="60" w:before="60" w:line="240" w:lineRule="auto"/>
+              <w:ind w:firstLine="0"/>
+              <w:jc w:val="center"/>
+            </w:pPr>
+            <w:r>
+              <w:rPr>
+                <w:b w:val="0"/>
+                <w:sz w:val="16"/>
+              </w:rPr>
+              <w:t>1/12</w:t>
+            </w:r>
+          </w:p>
+        </w:tc>
+        <w:tc>
+          <w:tcPr>
+            <w:tcW w:type="dxa" w:w="801"/>
+            <w:tcMar>
+              <w:left w:w="45" w:type="dxa"/>
+              <w:right w:w="45" w:type="dxa"/>
+            </w:tcMar>
+          </w:tcPr>
+          <w:p>
+            <w:pPr>
+              <w:keepNext/>
+              <w:spacing w:after="60" w:before="60" w:line="240" w:lineRule="auto"/>
+              <w:ind w:firstLine="0"/>
+              <w:jc w:val="center"/>
+            </w:pPr>
+            <w:r>
+              <w:rPr>
+                <w:b w:val="0"/>
+                <w:sz w:val="16"/>
+              </w:rPr>
+              <w:t>12/12</w:t>
+            </w:r>
+          </w:p>
+        </w:tc>
+      </w:tr>
+      <w:tr>
+        <w:trPr>
+          <w:cantSplit/>
+        </w:trPr>
+        <w:tc>
+          <w:tcPr>
+            <w:tcW w:type="dxa" w:w="1417"/>
+            <w:tcMar>
+              <w:left w:w="45" w:type="dxa"/>
+              <w:right w:w="45" w:type="dxa"/>
+            </w:tcMar>
+          </w:tcPr>
+          <w:p>
+            <w:pPr>
+              <w:keepNext/>
+              <w:spacing w:after="60" w:before="60" w:line="240" w:lineRule="auto"/>
+              <w:ind w:firstLine="0"/>
+              <w:jc w:val="left"/>
+            </w:pPr>
+            <w:r>
+              <w:rPr>
+                <w:b w:val="0"/>
+                <w:sz w:val="16"/>
+              </w:rPr>
+              <w:t>조건문</w:t>
+            </w:r>
+          </w:p>
+        </w:tc>
+        <w:tc>
+          <w:tcPr>
+            <w:tcW w:type="dxa" w:w="801"/>
+            <w:tcMar>
+              <w:left w:w="45" w:type="dxa"/>
+              <w:right w:w="45" w:type="dxa"/>
+            </w:tcMar>
+          </w:tcPr>
+          <w:p>
+            <w:pPr>
+              <w:keepNext/>
+              <w:spacing w:after="60" w:before="60" w:line="240" w:lineRule="auto"/>
+              <w:ind w:firstLine="0"/>
+              <w:jc w:val="center"/>
+            </w:pPr>
+            <w:r>
+              <w:rPr>
+                <w:b w:val="0"/>
+                <w:sz w:val="16"/>
+              </w:rPr>
+              <w:t>2/12</w:t>
+            </w:r>
+          </w:p>
+        </w:tc>
+        <w:tc>
+          <w:tcPr>
+            <w:tcW w:type="dxa" w:w="801"/>
+            <w:tcMar>
+              <w:left w:w="45" w:type="dxa"/>
+              <w:right w:w="45" w:type="dxa"/>
+            </w:tcMar>
+          </w:tcPr>
+          <w:p>
+            <w:pPr>
+              <w:keepNext/>
+              <w:spacing w:after="60" w:before="60" w:line="240" w:lineRule="auto"/>
+              <w:ind w:firstLine="0"/>
+              <w:jc w:val="center"/>
+            </w:pPr>
+            <w:r>
+              <w:rPr>
+                <w:b w:val="0"/>
+                <w:sz w:val="16"/>
+              </w:rPr>
+              <w:t>12/12</w:t>
+            </w:r>
+          </w:p>
+        </w:tc>
+        <w:tc>
+          <w:tcPr>
+            <w:tcW w:type="dxa" w:w="801"/>
+            <w:tcMar>
+              <w:left w:w="45" w:type="dxa"/>
+              <w:right w:w="45" w:type="dxa"/>
+            </w:tcMar>
+          </w:tcPr>
+          <w:p>
+            <w:pPr>
+              <w:keepNext/>
+              <w:spacing w:after="60" w:before="60" w:line="240" w:lineRule="auto"/>
+              <w:ind w:firstLine="0"/>
+              <w:jc w:val="center"/>
+            </w:pPr>
+            <w:r>
+              <w:rPr>
+                <w:b w:val="0"/>
+                <w:sz w:val="16"/>
+              </w:rPr>
+              <w:t>0/12</w:t>
+            </w:r>
+          </w:p>
+        </w:tc>
+        <w:tc>
+          <w:tcPr>
+            <w:tcW w:type="dxa" w:w="801"/>
+            <w:tcMar>
+              <w:left w:w="45" w:type="dxa"/>
+              <w:right w:w="45" w:type="dxa"/>
+            </w:tcMar>
+          </w:tcPr>
+          <w:p>
+            <w:pPr>
+              <w:keepNext/>
+              <w:spacing w:after="60" w:before="60" w:line="240" w:lineRule="auto"/>
+              <w:ind w:firstLine="0"/>
+              <w:jc w:val="center"/>
+            </w:pPr>
+            <w:r>
+              <w:rPr>
+                <w:b w:val="0"/>
+                <w:sz w:val="16"/>
+              </w:rPr>
+              <w:t>12/12</w:t>
+            </w:r>
+          </w:p>
+        </w:tc>
+      </w:tr>
+      <w:tr>
+        <w:trPr>
+          <w:cantSplit/>
+        </w:trPr>
+        <w:tc>
+          <w:tcPr>
+            <w:tcW w:type="dxa" w:w="1417"/>
+            <w:tcMar>
+              <w:left w:w="45" w:type="dxa"/>
+              <w:right w:w="45" w:type="dxa"/>
+            </w:tcMar>
+            <w:tcBorders>
+              <w:bottom w:val="single" w:sz="5"/>
+            </w:tcBorders>
+          </w:tcPr>
+          <w:p>
+            <w:pPr>
+              <w:keepNext w:val="0"/>
+              <w:spacing w:after="60" w:before="60" w:line="240" w:lineRule="auto"/>
+              <w:ind w:firstLine="0"/>
+              <w:jc w:val="left"/>
+            </w:pPr>
+            <w:r>
+              <w:rPr>
+                <w:b w:val="0"/>
+                <w:sz w:val="16"/>
+              </w:rPr>
+              <w:t>뒤 직접 지시</w:t>
+            </w:r>
+          </w:p>
+        </w:tc>
+        <w:tc>
+          <w:tcPr>
+            <w:tcW w:type="dxa" w:w="801"/>
+            <w:tcMar>
+              <w:left w:w="45" w:type="dxa"/>
+              <w:right w:w="45" w:type="dxa"/>
+            </w:tcMar>
+            <w:tcBorders>
+              <w:bottom w:val="single" w:sz="5"/>
+            </w:tcBorders>
+          </w:tcPr>
+          <w:p>
+            <w:pPr>
+              <w:keepNext w:val="0"/>
+              <w:spacing w:after="60" w:before="60" w:line="240" w:lineRule="auto"/>
+              <w:ind w:firstLine="0"/>
+              <w:jc w:val="center"/>
+            </w:pPr>
+            <w:r>
+              <w:rPr>
+                <w:b w:val="0"/>
+                <w:sz w:val="16"/>
+              </w:rPr>
+              <w:t>5/12</w:t>
+            </w:r>
+          </w:p>
+        </w:tc>
+        <w:tc>
+          <w:tcPr>
+            <w:tcW w:type="dxa" w:w="801"/>
+            <w:tcMar>
+              <w:left w:w="45" w:type="dxa"/>
+              <w:right w:w="45" w:type="dxa"/>
+            </w:tcMar>
+            <w:tcBorders>
+              <w:bottom w:val="single" w:sz="5"/>
+            </w:tcBorders>
+          </w:tcPr>
+          <w:p>
+            <w:pPr>
+              <w:keepNext w:val="0"/>
+              <w:spacing w:after="60" w:before="60" w:line="240" w:lineRule="auto"/>
+              <w:ind w:firstLine="0"/>
+              <w:jc w:val="center"/>
+            </w:pPr>
+            <w:r>
+              <w:rPr>
+                <w:b w:val="0"/>
+                <w:sz w:val="16"/>
+              </w:rPr>
+              <w:t>12/12</w:t>
+            </w:r>
+          </w:p>
+        </w:tc>
+        <w:tc>
+          <w:tcPr>
+            <w:tcW w:type="dxa" w:w="801"/>
+            <w:tcMar>
+              <w:left w:w="45" w:type="dxa"/>
+              <w:right w:w="45" w:type="dxa"/>
+            </w:tcMar>
+            <w:tcBorders>
+              <w:bottom w:val="single" w:sz="5"/>
+            </w:tcBorders>
+          </w:tcPr>
+          <w:p>
+            <w:pPr>
+              <w:keepNext w:val="0"/>
+              <w:spacing w:after="60" w:before="60" w:line="240" w:lineRule="auto"/>
+              <w:ind w:firstLine="0"/>
+              <w:jc w:val="center"/>
+            </w:pPr>
+            <w:r>
+              <w:rPr>
+                <w:b w:val="0"/>
+                <w:sz w:val="16"/>
+              </w:rPr>
+              <w:t>1/12</w:t>
+            </w:r>
+          </w:p>
+        </w:tc>
+        <w:tc>
+          <w:tcPr>
+            <w:tcW w:type="dxa" w:w="801"/>
+            <w:tcMar>
+              <w:left w:w="45" w:type="dxa"/>
+              <w:right w:w="45" w:type="dxa"/>
+            </w:tcMar>
+            <w:tcBorders>
+              <w:bottom w:val="single" w:sz="5"/>
+            </w:tcBorders>
+          </w:tcPr>
+          <w:p>
+            <w:pPr>
+              <w:keepNext w:val="0"/>
+              <w:spacing w:after="60" w:before="60" w:line="240" w:lineRule="auto"/>
+              <w:ind w:firstLine="0"/>
+              <w:jc w:val="center"/>
+            </w:pPr>
+            <w:r>
+              <w:rPr>
+                <w:b w:val="0"/>
+                <w:sz w:val="16"/>
+              </w:rPr>
+              <w:t>9/12</w:t>
+            </w:r>
+          </w:p>
+        </w:tc>
+      </w:tr>
+    </w:tbl>
+    <w:p>
+      <w:pPr>
+        <w:jc w:val="both"/>
+      </w:pPr>
+      <w:r>
+        <w:t>Llama의 오류 세 개는 같은 표현 틀의 마지막 요청에서 발생하였다. 인용문 뒤에 재킷을 원본 사진의 모습으로 복원하라고 직접 지시했으나, 모델은 재킷을 녹색으로 추출하였다. 검사는 근거 없는 색 변경을 거부했지만 해당 복원 표현도 인식하지 못하여 직전 재킷 값이 남았다. 이 세 오류는 세 대화의 최종 상태에도 반영되었다.</w:t>
+      </w:r>
+    </w:p>
+    <w:p>
+      <w:pPr>
+        <w:jc w:val="both"/>
+      </w:pPr>
+      <w:r>
+        <w:t>제안 방법은 모델의 첫 응답을 사용하므로 상태 갱신에 모델 호출 한 번이 필요하다. 추출·재검토와 검사 결합은 두 번 호출한 응답에 같은 후처리를 적용한 비교이다.</w:t>
       </w:r>
     </w:p>
     <w:p>
@@ -1707,7 +2852,7 @@
         <w:jc w:val="both"/>
       </w:pPr>
       <w:r>
-        <w:t>유지·삭제 규칙의 비교는 표 3과 같다. 두 규칙의 결합은 기준보다 요청 두 개를 더 맞혔고, 유지 위반은 한 개에서 0개로 줄었다. 차이는 한 대화의 두 요청에서 발생하였다. 식물 삭제를 빠뜨린 오류와 배경까지 원본으로 돌린 오류를 각각 바로잡은 결과이다.</w:t>
+        <w:t>유지·삭제 규칙의 비교는 표 4와 같다. 두 규칙의 결합은 기준보다 요청 두 개를 더 맞혔고, 유지 위반은 한 개에서 0개로 줄었다. 차이는 한 대화의 두 요청에서 발생하였다. 식물 삭제를 빠뜨린 오류와 배경까지 원본으로 돌린 오류를 각각 바로잡은 결과이다.</w:t>
       </w:r>
     </w:p>
     <w:p>
@@ -1719,7 +2864,7 @@
         <w:jc w:val="center"/>
       </w:pPr>
       <w:r>
-        <w:t>표 3. 유지·삭제 규칙의 구성요소 비교</w:t>
+        <w:t>표 4. 유지·삭제 규칙의 구성요소 비교</w:t>
       </w:r>
     </w:p>
     <w:tbl>
@@ -2403,7 +3548,7 @@
         <w:jc w:val="both"/>
       </w:pPr>
       <w:r>
-        <w:t>추가 검증 결과는 표 4에 정리하였다. 이 표는 단계별 구현을 별도의 대화에서 비교한 결과이며, 서로 다른 자료의 정확도를 직접 순위화한 표가 아니다.</w:t>
+        <w:t>추가 검증 결과는 표 5에 정리하였다. 이 표는 단계별 구현을 별도의 대화에서 비교한 결과이며, 서로 다른 자료의 정확도를 직접 순위화한 표가 아니다.</w:t>
       </w:r>
     </w:p>
     <w:p>
@@ -2415,7 +3560,7 @@
         <w:jc w:val="center"/>
       </w:pPr>
       <w:r>
-        <w:t>표 4. 추가 대화에서의 상태 갱신 검증</w:t>
+        <w:t>표 5. 추가 대화에서의 상태 갱신 검증</w:t>
       </w:r>
     </w:p>
     <w:tbl>
@@ -3617,7 +4762,7 @@
         <w:jc w:val="both"/>
       </w:pPr>
       <w:r>
-        <w:t>아홉 항목의 전체 상태 일치율은 표 5와 같다. 표정·몸 방향·손동작은 모든 방법에서 정확히 추출되었다. 속성 지시를 섞은 조건에서는 식물과 목걸이 삭제를 원본 복원으로 해석한 오류가 재검토에도 남았다.</w:t>
+        <w:t>아홉 항목의 전체 상태 일치율은 표 6과 같다. 표정·몸 방향·손동작은 모든 방법에서 정확히 추출되었다. 속성 지시를 섞은 조건에서는 식물과 목걸이 삭제를 원본 복원으로 해석한 오류가 재검토에도 남았다.</w:t>
       </w:r>
     </w:p>
     <w:p>
@@ -3629,7 +4774,7 @@
         <w:jc w:val="center"/>
       </w:pPr>
       <w:r>
-        <w:t>표 5. 복합 요청의 전체 상태 일치율</w:t>
+        <w:t>표 6. 복합 요청의 전체 상태 일치율</w:t>
       </w:r>
     </w:p>
     <w:tbl>
@@ -4190,7 +5335,7 @@
         <w:jc w:val="center"/>
       </w:pPr>
       <w:r>
-        <w:t>표 6. 유지·삭제 규칙의 AI 이미지 평가</w:t>
+        <w:t>표 7. 유지·삭제 규칙의 AI 이미지 평가</w:t>
       </w:r>
     </w:p>
     <w:tbl>
@@ -4543,7 +5688,7 @@
         <w:jc w:val="both"/>
       </w:pPr>
       <w:r>
-        <w:t>표 6은 각 방법의 64조건에서 여섯 목표를 평가한 결과이다. 3B에서 증가한 성공 항목 8개 중 6개는 판단 불가에서, 2개는 실패에서 바뀌었다. 7B에서도 설명과 점수가 모순된 응답이 있었다. 두 평가 모두 실패에서 성공으로 바뀐 항목은 R02의 배경 한 개였다. 얼굴 코사인 평균은 기준 0.910458, 결합 0.910535였으며, 입력이 다른 네 쌍 중 두 쌍은 증가하고 두 쌍은 감소하였다.</w:t>
+        <w:t>표 7은 각 방법의 64조건에서 여섯 목표를 평가한 결과이다. 3B에서 증가한 성공 항목 8개 중 6개는 판단 불가에서, 2개는 실패에서 바뀌었다. 7B에서도 설명과 점수가 모순된 응답이 있었다. 두 평가 모두 실패에서 성공으로 바뀐 항목은 R02의 배경 한 개였다. 얼굴 코사인 평균은 기준 0.910458, 결합 0.910535였으며, 입력이 다른 네 쌍 중 두 쌍은 증가하고 두 쌍은 감소하였다.</w:t>
       </w:r>
     </w:p>
     <w:p>
@@ -4559,7 +5704,7 @@
         <w:jc w:val="both"/>
       </w:pPr>
       <w:r>
-        <w:t>세 대화의 마지막 요청에서 프롬프트 길이는 표 7과 같다. 지시 검사 후 조건은 전체 이력보다 평균 39.87% 짧았다. 중간 요청을 포함한 12개 묶음의 평균은 전체 이력 168.75토큰, 검사 후 조건 129.25토큰이었다. 첫 요청에서는 항목을 명시한 상태 표현이 더 길었고, 두 번째 요청부터 세 대화 모두 현재 조건 표현이 짧았다.</w:t>
+        <w:t>세 대화의 마지막 요청에서 프롬프트 길이는 표 8과 같다. 지시 검사 후 조건은 전체 이력보다 평균 39.87% 짧았다. 중간 요청을 포함한 12개 묶음의 평균은 전체 이력 168.75토큰, 검사 후 조건 129.25토큰이었다. 첫 요청에서는 항목을 명시한 상태 표현이 더 길었고, 두 번째 요청부터 세 대화 모두 현재 조건 표현이 짧았다.</w:t>
       </w:r>
     </w:p>
     <w:p>
@@ -4571,7 +5716,7 @@
         <w:jc w:val="center"/>
       </w:pPr>
       <w:r>
-        <w:t>표 7. 최종 프롬프트의 평균 길이</w:t>
+        <w:t>표 8. 최종 프롬프트의 평균 길이</w:t>
       </w:r>
     </w:p>
     <w:tbl>
@@ -5021,7 +6166,7 @@
         <w:jc w:val="both"/>
       </w:pPr>
       <w:r>
-        <w:t>18개 생성 이미지의 목표 충족 평가는 표 8과 같다. 각 방식의 분모 36은 인물 두 명·대화 세 개의 이미지 여섯 장에서 여섯 목표를 평가한 항목 수이다.</w:t>
+        <w:t>18개 생성 이미지의 목표 충족 평가는 표 9와 같다. 각 방식의 분모 36은 인물 두 명·대화 세 개의 이미지 여섯 장에서 여섯 목표를 평가한 항목 수이다.</w:t>
       </w:r>
     </w:p>
     <w:p>
@@ -5033,7 +6178,7 @@
         <w:jc w:val="center"/>
       </w:pPr>
       <w:r>
-        <w:t>표 8. 후속 이미지의 AI 목표 충족 평가</w:t>
+        <w:t>표 9. 후속 이미지의 AI 목표 충족 평가</w:t>
       </w:r>
     </w:p>
     <w:tbl>
@@ -5598,7 +6743,7 @@
         <w:jc w:val="center"/>
       </w:pPr>
       <w:r>
-        <w:t>표 9. 후속 이미지의 원본 대비 얼굴 지표</w:t>
+        <w:t>표 10. 후속 이미지의 원본 대비 얼굴 지표</w:t>
       </w:r>
     </w:p>
     <w:tbl>
@@ -6153,7 +7298,7 @@
         <w:jc w:val="both"/>
       </w:pPr>
       <w:r>
-        <w:t>모든 출력에서 얼굴이 하나씩 검출되었다. 검사 후 조건은 검사 전 조건보다 얼굴 코사인·SSIM·LPIPS 평균이 유리하고 MAE는 불리하였다. 전체 이력과 비교하면 코사인은 높았으나 MAE·SSIM·LPIPS는 불리하였다. 표 9는 조건당 첫 출력 한 장을 사용한 여섯 대응 사례의 평균이다.</w:t>
+        <w:t>모든 출력에서 얼굴이 하나씩 검출되었다. 검사 후 조건은 검사 전 조건보다 얼굴 코사인·SSIM·LPIPS 평균이 유리하고 MAE는 불리하였다. 전체 이력과 비교하면 코사인은 높았으나 MAE·SSIM·LPIPS는 불리하였다. 표 10은 조건당 첫 출력 한 장을 사용한 여섯 대응 사례의 평균이다.</w:t>
       </w:r>
     </w:p>
     <w:p>
@@ -6244,7 +7389,7 @@
         <w:jc w:val="both"/>
       </w:pPr>
       <w:r>
-        <w:t>그림 2는 조건부 지시와 인용문을 포함한 대화를 R02에 적용한 예이다. 목표는 녹색 재킷, 원래 흰 상의, 파란 핀, 목걸이 없음, 도서관과 돌 벤치이다. 검사 전 조건에는 인용문의 재킷 복원과 조건부 벤치 삭제가 남아 있었다. 검사 후에는 직접 지시만 반영하였다. 표 7–9의 집계는 이 예와 나머지 두 대화를 모두 포함한다.</w:t>
+        <w:t>그림 2는 조건부 지시와 인용문을 포함한 대화를 R02에 적용한 예이다. 목표는 녹색 재킷, 원래 흰 상의, 파란 핀, 목걸이 없음, 도서관과 돌 벤치이다. 검사 전 조건에는 인용문의 재킷 복원과 조건부 벤치 삭제가 남아 있었다. 검사 후에는 직접 지시만 반영하였다. 표 8–10의 집계는 이 예와 나머지 두 대화를 모두 포함한다.</w:t>
       </w:r>
     </w:p>
     <w:p>
@@ -6284,7 +7429,7 @@
         <w:jc w:val="both"/>
       </w:pPr>
       <w:r>
-        <w:t>상태 갱신 결과는 지정한 영어 표현과 편집 항목에서 얻었다. 복원 표현 확장 전의 0/8과 Llama의 0/16은 어휘 처리와 응답 선택에 따른 적용 범위를 보여준다. 오류가 시작된 요청과 후속 상태를 함께 보면 구현의 적용 범위가 드러난다.</w:t>
+        <w:t>추가 96개 검증은 요청 수를 늘리고 대화 길이를 여덟 개로 확장하여 같은 구현을 다시 평가한 결과이다. 네 가지 표현 틀에 속성 조합을 바꾼 자료이며, 대화 단위 구간도 이 구성 안에서의 변동을 나타낸다. 상태 갱신 결과는 지정한 영어 표현과 편집 항목에서 얻었다. 복원 표현 확장 전의 0/8과 Llama의 0/16은 어휘 처리와 응답 선택에 따른 적용 범위를 보여준다. 오류가 시작된 요청과 후속 상태를 함께 보면 구현의 적용 범위가 드러난다.</w:t>
       </w:r>
     </w:p>
     <w:p>
@@ -6308,7 +7453,7 @@
         <w:jc w:val="both"/>
       </w:pPr>
       <w:r>
-        <w:t>새 요청 12개에서 두 모델 모두 첫 응답의 단순 적용은 3/12, 제안 방법은 12/12였다. 같은 검사를 두 번 호출한 응답에 적용하면 Qwen3는 12/12, Llama는 4/12였으며, 제안 방법은 요청당 한 번의 호출로 같은 정확도 또는 더 높은 정확도를 얻었다.</w:t>
+        <w:t>추가 요청 96개에서 첫 응답 단순 적용과 제안 방법의 전체 상태 일치는 Qwen3 52/96과 96/96, Llama 27/96과 93/96이었다. 제안 방법의 모델 호출은 요청당 한 번이며, 대화 길이를 여덟 개로 늘린 조건에서도 같은 구현을 비교하였다.</w:t>
       </w:r>
     </w:p>
     <w:p>
@@ -6427,11 +7572,23 @@
         <w:t>[10] R. Zhang et al., “The Unreasonable Effectiveness of Deep Features as a Perceptual Metric,” CVPR, 2018. https://arxiv.org/abs/1801.03924</w:t>
       </w:r>
     </w:p>
+    <w:p>
+      <w:pPr>
+        <w:spacing w:after="0" w:before="0" w:line="20" w:lineRule="exact"/>
+        <w:sectPr>
+          <w:type w:val="continuous"/>
+          <w:pgSz w:w="11906" w:h="16838"/>
+          <w:pgMar w:top="1134" w:right="1134" w:bottom="1134" w:left="1134" w:header="720" w:footer="720" w:gutter="0"/>
+          <w:cols w:space="397" w:num="2"/>
+          <w:docGrid w:linePitch="360"/>
+        </w:sectPr>
+      </w:pPr>
+    </w:p>
     <w:sectPr>
       <w:type w:val="continuous"/>
       <w:pgSz w:w="11906" w:h="16838"/>
       <w:pgMar w:top="1134" w:right="1134" w:bottom="1134" w:left="1134" w:header="720" w:footer="720" w:gutter="0"/>
-      <w:cols w:space="397" w:num="2"/>
+      <w:cols w:space="397" w:num="1"/>
       <w:docGrid w:linePitch="360"/>
     </w:sectPr>
   </w:body>

</xml_diff>

<commit_message>
Develop thesis introduction and related work following supervisor feedback
</commit_message>
<xml_diff>
--- a/paper/manuscript.inha.docx
+++ b/paper/manuscript.inha.docx
@@ -121,7 +121,7 @@
         <w:jc w:val="both"/>
       </w:pPr>
       <w:r>
-        <w:t>사진을 여러 번 편집할 때는 새 변경 사항을 반영하면서 앞서 정한 조건도 유지해야 한다. 예를 들어 목걸이를 삭제하고 배경을 유지하라는 요청에서는 목걸이만 없어져야 한다. 삭제를 원본 복원으로 잘못 처리하거나 배경까지 바꾸면 사용자가 다시 수정해야 한다.</w:t>
+        <w:t>자연어 지시를 이용한 이미지 편집은 사용자가 원하는 변화를 문장으로 입력하고, 입력 사진의 일부 속성을 수정하는 방식이다. InstructPix2Pix는 입력 이미지와 편집 지시를 함께 조건으로 사용하는 모델을 제시하였으며[1], ChatEdit는 얼굴 이미지 편집을 여러 차례의 대화로 확장하였다[2]. 이러한 편집 환경에서는 한 번의 요청을 반영하는 능력과 함께, 대화가 이어지는 동안 사용자가 유지하거나 취소한 조건을 구분하는 능력이 요구된다.</w:t>
       </w:r>
     </w:p>
     <w:p>
@@ -129,7 +129,7 @@
         <w:jc w:val="both"/>
       </w:pPr>
       <w:r>
-        <w:t>초기 이미지 실험에서는 합성 인물 6명에게 장신구·의상·배경을 10단계에 걸쳐 편집하였다. 최종 요구가 같은 순차 편집과 원본 기반 재생성을 비교하자, 얼굴 위치를 보정한 세 지표 모두 6쌍에서 원본 기반 방식에 유리하였다. 이에 따라 원본 사진에 현재 편집 조건을 적용하는 구성을 사용하였다.</w:t>
+        <w:t>인물 사진의 반복 편집에서는 변경할 속성과 보존할 속성이 동시에 존재한다. 사용자는 재킷이나 장신구, 배경을 바꾸면서도 얼굴과 자세는 유지하기를 원할 수 있다. 또한 새 요청이 앞선 요청을 대체하기도 한다. 은색 목걸이를 추가한 뒤 금색으로 바꾸고 다시 제거하도록 요청했다면, 마지막 편집에는 목걸이가 없어야 한다. 반면 목걸이를 최초 사진의 모습으로 되돌리라는 요청은 원본의 목걸이를 보존하는 지시이다. 대상이 같은 문장이라도 삭제와 원본 복원은 서로 다른 결과를 요구한다.</w:t>
       </w:r>
     </w:p>
     <w:p>
@@ -137,7 +137,47 @@
         <w:jc w:val="both"/>
       </w:pPr>
       <w:r>
-        <w:t>원본을 재사용하려면 대화에 남은 요청을 정리해야 한다. 은색 목걸이 추가, 금색으로 변경, 목걸이 삭제를 차례로 요청했다면 최종 조건에는 ‘목걸이 없음’만 남아야 한다. 본 연구는 이 과정을 항목별 상태 갱신과 프롬프트 작성으로 나눈다. 언어 모델이 추출한 값을 적용하기 전에 지시의 대상과 범위를 검사하고, 저장한 현재 조건으로 편집 프롬프트를 작성한다. 상태 정확도, 모델 호출 수, 프롬프트 길이와 생성 이미지의 지표를 각각 비교한다.</w:t>
+        <w:t>편집을 반복하는 방법은 입력 이미지의 선택에 따라 나눌 수 있다. 순차 편집은 직전 출력을 다음 편집의 입력으로 사용하므로 앞선 결과를 자연스럽게 이어갈 수 있다. 다만 출력에 생긴 변화도 다음 입력에 포함된다. 원본 기반 재생성은 최초 사진에 현재의 전체 편집 조건을 적용한다. ChatEdit는 원본 이미지를 편집하는 구조를 통해 오류 누적과 속성 망각을 다루었다[2]. 본 연구의 초기 합성 인물 실험에서도 동일한 최종 요구를 적용한 여섯 쌍의 위치 보정 얼굴 지표가 원본 기반 방식에 유리하였다. 이를 바탕으로 최초 사진을 재사용하되, 그 사진에 전달할 편집 조건을 관리하는 문제에 초점을 맞추었다.</w:t>
+      </w:r>
+    </w:p>
+    <w:p>
+      <w:pPr>
+        <w:jc w:val="both"/>
+      </w:pPr>
+      <w:r>
+        <w:t>원본을 재사용할 때 이전 요청을 모두 전달하면, 이미지 생성 모델이 대화 전체에서 현재 유효한 요구를 다시 판단해야 한다. 반대로 마지막 요청만 전달하면 앞서 지정한 의상이나 배경이 누락될 수 있다. 따라서 전체 이력과 마지막 문장 사이에서, 지금도 유효한 편집 내용을 명시적으로 표현할 필요가 있다. 본 연구에서는 재킷·상의·핀·목걸이·배경·소품의 값을 각각 저장하고, 새 요청이 들어오면 변경할 항목만 갱신한다. 이렇게 저장한 항목과 값의 집합을 편집 상태라 정의한다. 이미지 생성에는 원본 사진과 현재 편집 상태를 문장으로 변환한 프롬프트를 사용한다.</w:t>
+      </w:r>
+    </w:p>
+    <w:p>
+      <w:pPr>
+        <w:jc w:val="both"/>
+      </w:pPr>
+      <w:r>
+        <w:t>편집 상태를 저장하더라도 새 요청의 의미를 잘못 적용하면 오류가 남는다. 예를 들어 “목걸이를 없애고 배경은 유지하라”는 요청에서 언어 모델이 두 항목을 모두 원본 복원으로 추출하면, 목걸이가 다시 생기거나 배경이 이전과 달라질 수 있다. 캡션에 인용된 편집 문장을 실제 명령으로 적용하는 경우도 구분해야 한다. 상태 갱신에는 속성값의 추출뿐 아니라 지시의 동작, 적용 대상, 실행 여부를 확인하는 절차가 함께 요구된다.</w:t>
+      </w:r>
+    </w:p>
+    <w:p>
+      <w:pPr>
+        <w:jc w:val="both"/>
+      </w:pPr>
+      <w:r>
+        <w:t>본 연구는 언어 모델이 한 번 추출한 변경 사항에 코드로 작성한 지시 검사를 적용하는 방법을 제안한다. 삭제는 대상의 부재로, 원본 복원은 최초 사진의 모습으로, 유지는 직전에 저장된 값의 보존으로 처리한다. 또한 지시 구절을 분리하고, 부정문·조건문·명시된 인용문의 적용 범위를 확인한다. 언어 모델은 변경 사항을 추출하고, 프로그램은 저장된 상태에 이를 반영하는 역할을 담당한다. 이 구조에서 별도의 재검토 호출이 정확도에 미치는 영향도 함께 비교한다.</w:t>
+      </w:r>
+    </w:p>
+    <w:p>
+      <w:pPr>
+        <w:jc w:val="both"/>
+      </w:pPr>
+      <w:r>
+        <w:t>실험은 편집 상태의 정확도와 이미지 생성 결과를 나누어 평가한다. 먼저 두 언어 모델에 동일한 새 요청 96개를 입력하여 전체 상태와 항목별 일치율을 측정한다. 다음으로 실제 인물 사진에 전체 요청 이력, 검사 전 현재 조건, 지시 검사 후 현재 조건을 각각 적용하여 프롬프트 길이와 생성 결과를 비교한다. 이를 통해 지시 검사가 요청 해석의 오류를 줄이는지, 현재 조건만으로 입력을 구성했을 때 편집 목표와 얼굴 보존 지표가 어떻게 달라지는지 분석한다.</w:t>
+      </w:r>
+    </w:p>
+    <w:p>
+      <w:pPr>
+        <w:jc w:val="both"/>
+      </w:pPr>
+      <w:r>
+        <w:t>본 논문의 구성은 다음과 같다. 2장에서는 자연어 이미지 편집, 대화 상태 추적, 모델 응답의 재검토에 관한 연구를 살펴본다. 3장에서는 편집 상태의 표현과 지시 검사 방법을 설명하고, 4장에서는 실험 자료와 평가 지표를 제시한다. 5장에서는 상태 갱신과 이미지 비교 결과를 분석하며, 6장과 7장에서 결과의 의미와 결론을 기술한다.</w:t>
       </w:r>
     </w:p>
     <w:p>
@@ -150,10 +190,10 @@
     </w:p>
     <w:p>
       <w:pPr>
-        <w:jc w:val="both"/>
+        <w:pStyle w:val="Heading2"/>
       </w:pPr>
       <w:r>
-        <w:t>ChatEdit는 대화에서 편집 상태를 추적하고 이를 얼굴 이미지 편집에 사용하는 구조를 제시하였다[1]. SOM-DST는 상태 갱신 동작을 예측하고 필요한 값만 생성한다[2]. 본 연구도 항목별 상태를 저장하며, 모델이 추출한 값에 지시 검사를 적용하여 삭제·복원·유지의 혼동을 줄인다.</w:t>
+        <w:t>1. 자연어 지시를 이용한 이미지 편집</w:t>
       </w:r>
     </w:p>
     <w:p>
@@ -161,7 +201,119 @@
         <w:jc w:val="both"/>
       </w:pPr>
       <w:r>
-        <w:t>Self-Refine은 모델의 피드백으로 응답을 반복 수정하는 방법이다[3]. 본 연구에서는 한 차례 재검토한 응답과 첫 응답에 같은 지시 검사를 적용하여, 재검토에 따른 정확도와 호출 수의 차이를 비교한다.</w:t>
+        <w:t>InstructPix2Pix는 입력 이미지와 편집 지시를 이용하여 수정된 이미지를 생성하는 조건부 확산 모델이다[1]. 언어 모델과 이미지 생성 모델로 편집 예제를 합성하고, 이를 이용해 자연어 지시를 따르는 편집 모델을 학습한다. 이 연구는 사용자가 목표 이미지 전체를 묘사하는 대신, 현재 이미지에 가할 변화를 문장으로 제시하는 방식을 다룬다.</w:t>
+      </w:r>
+    </w:p>
+    <w:p>
+      <w:pPr>
+        <w:jc w:val="both"/>
+      </w:pPr>
+      <w:r>
+        <w:t>실제 편집 요청의 다양성을 평가하기 위한 자료도 제안되었다. MagicBrush는 원본 이미지·편집 지시·목표 이미지로 이루어진 수작업 주석 자료이며, 한 차례의 편집과 여러 차례 이어지는 편집을 포함한다[3]. 자연어 이미지 편집을 평가할 때에는 생성 결과가 지시한 변화를 반영하는지와 원본의 다른 내용을 얼마나 보존하는지를 함께 살펴야 한다. 본 연구에서도 요청 충족 평가와 얼굴 보존 지표를 나누어 측정한다.</w:t>
+      </w:r>
+    </w:p>
+    <w:p>
+      <w:pPr>
+        <w:jc w:val="both"/>
+      </w:pPr>
+      <w:r>
+        <w:t>앞의 연구들은 이미지와 지시를 연결하는 학습 및 평가의 기반을 제공한다. 본 연구는 이 중 이미지 생성에 앞서 입력 지시를 구성하는 과정에 초점을 둔다. 사용자의 요청을 항목별로 저장한 뒤 마지막에 유효한 조건만 전달함으로써, 이미 취소된 값과 유지할 값을 구분한다. 따라서 비교 대상은 편집 모델의 학습 방식보다, 같은 원본에 제공하는 세 가지 입력 방식이다.</w:t>
+      </w:r>
+    </w:p>
+    <w:p>
+      <w:pPr>
+        <w:pStyle w:val="Heading2"/>
+      </w:pPr>
+      <w:r>
+        <w:t>2. 대화를 이용한 얼굴 이미지 편집</w:t>
+      </w:r>
+    </w:p>
+    <w:p>
+      <w:pPr>
+        <w:jc w:val="both"/>
+      </w:pPr>
+      <w:r>
+        <w:t>ChatEdit는 얼굴 이미지 편집을 위한 대화 자료와, 대화 처리 모듈 및 이미지 편집 모듈로 구성된 구조를 제안하였다[2]. 대화 처리 모듈은 전체 이력에서 현재 요청을 추적하고 응답을 생성하며, 이미지 편집 모듈은 추적한 요구를 최초 이미지에 적용한다. 직전 출력 대신 최초 이미지를 사용하는 설계는 반복 편집 중의 오류 누적과 속성 망각을 다루기 위한 것이다.</w:t>
+      </w:r>
+    </w:p>
+    <w:p>
+      <w:pPr>
+        <w:jc w:val="both"/>
+      </w:pPr>
+      <w:r>
+        <w:t>이 구조는 대화에서 얻은 요구와 이미지 편집을 연결한다는 점에서 본 연구와 관련된다. 본 연구에서도 최초 사진을 재사용하고, 이미지 생성에 필요한 조건을 언어 처리 단계에서 관리한다. 여기서 검증하는 문제는 원본 재사용 자체보다, 저장된 조건에 새 요청을 반영할 때 발생하는 삭제·복원·유지의 혼동이다. 동일한 추출 응답에 지시 검사를 적용한 경우와 적용하지 않은 경우를 비교하여 이 처리의 효과를 살핀다.</w:t>
+      </w:r>
+    </w:p>
+    <w:p>
+      <w:pPr>
+        <w:jc w:val="both"/>
+      </w:pPr>
+      <w:r>
+        <w:t>본 연구의 편집 상태는 지정한 여섯 항목의 값을 명시적으로 저장한다. 따라서 오류를 추적할 때 이미지의 인상만으로 판단하는 대신, 어느 요청에서 어떤 항목이 정답과 달라졌는지 확인할 수 있다. 생성된 이미지의 편집 목표 충족 여부는 이 상태 평가와 별도로 분석한다.</w:t>
+      </w:r>
+    </w:p>
+    <w:p>
+      <w:pPr>
+        <w:pStyle w:val="Heading2"/>
+      </w:pPr>
+      <w:r>
+        <w:t>3. 항목별 대화 상태 갱신</w:t>
+      </w:r>
+    </w:p>
+    <w:p>
+      <w:pPr>
+        <w:jc w:val="both"/>
+      </w:pPr>
+      <w:r>
+        <w:t>대화 상태 추적은 대화 중에 나타난 사용자의 목표를 항목과 값으로 유지하는 과제이다. SOM-DST는 대화 상태를 고정된 크기의 메모리로 보고, 항목별 갱신 동작을 예측한 뒤 필요한 값만 생성하는 방법을 제안하였다[4]. 전체 상태를 매번 새로 생성하는 대신 변경할 부분을 선택하여 갱신한다는 점이 특징이다. 이 연구는 상태 갱신 동작의 정확도가 최종 상태 추적 성능과 연결됨을 분석하였다.</w:t>
+      </w:r>
+    </w:p>
+    <w:p>
+      <w:pPr>
+        <w:jc w:val="both"/>
+      </w:pPr>
+      <w:r>
+        <w:t>인물 이미지 편집에서도 새 요청에 언급되지 않은 속성은 직전 값을 유지하고, 변경 대상만 갱신해야 한다. 본 연구는 이러한 선택적 갱신의 관점을 적용하여 언어 모델이 새 요청의 변경 사항만 추출하도록 구성한다. 다만 대상은 인물 편집을 위한 제한된 속성이며, 삭제·원본 복원·유지는 각각 ‘없음’·‘원본’·‘직전 값 보존’으로 정의한다. 예를 들어 같은 목걸이를 대상으로 하더라도 제거하는 동작과 원본의 목걸이로 되돌리는 동작을 상태값에서 구분한다.</w:t>
+      </w:r>
+    </w:p>
+    <w:p>
+      <w:pPr>
+        <w:jc w:val="both"/>
+      </w:pPr>
+      <w:r>
+        <w:t>변경 사항을 구조화된 값으로 얻는 것만으로는 지시의 적용 범위가 결정되지 않는다. “목걸이를 원본으로 돌리되 배경은 유지하라”는 문장에서는 복원과 유지가 서로 다른 항목에 적용되어야 한다. 이에 본 연구는 항목별 상태 저장에 지시 구절의 분리와 적용 대상 검사를 결합한다. 이 과정을 통해 값 추출의 오류와 저장 상태의 갱신 오류를 구분하여 분석한다.</w:t>
+      </w:r>
+    </w:p>
+    <w:p>
+      <w:pPr>
+        <w:pStyle w:val="Heading2"/>
+      </w:pPr>
+      <w:r>
+        <w:t>4. 언어 모델 응답의 재검토</w:t>
+      </w:r>
+    </w:p>
+    <w:p>
+      <w:pPr>
+        <w:jc w:val="both"/>
+      </w:pPr>
+      <w:r>
+        <w:t>Self-Refine은 모델이 생성한 첫 응답에 대해 스스로 피드백을 만들고, 이를 이용해 응답을 반복 수정하는 방법이다[5]. 추가 학습 없이 생성·피드백·수정을 수행하며, 여러 언어 과제에서 응답 개선을 평가하였다. 이러한 접근은 첫 응답에 오류가 있을 때 같은 모델의 재검토를 이용하는 비교 조건의 배경이 된다.</w:t>
+      </w:r>
+    </w:p>
+    <w:p>
+      <w:pPr>
+        <w:jc w:val="both"/>
+      </w:pPr>
+      <w:r>
+        <w:t>편집 상태의 갱신에서는 재검토가 변경값을 고치는 동시에, 이미 올바른 항목을 누락하거나 불필요한 변경을 추가할 수도 있다. 따라서 응답을 다시 생성하는 과정과, 생성된 응답을 상태에 적용하기 전에 검사하는 과정을 나누어 비교할 수 있다. 본 연구에서는 한 차례 재검토한 응답을 우선 사용하는 방법과 첫 응답만 사용하는 방법에 동일한 지시 검사를 적용한다. 이는 재검토 응답 선택의 영향과 코드 검사의 영향을 같은 입력에서 비교하기 위한 구성이다.</w:t>
+      </w:r>
+    </w:p>
+    <w:p>
+      <w:pPr>
+        <w:jc w:val="both"/>
+      </w:pPr>
+      <w:r>
+        <w:t>본 연구의 재검토 조건은 새 요청과 첫 추출 결과를 다시 입력하여 수정된 JSON을 얻는 한 차례의 절차이다. 이를 통해 편집 상태 갱신에서 한 차례의 응답 재검토를 사용하는 조건과 첫 응답에 코드 검사를 적용하는 조건의 차이를 분석한다.</w:t>
       </w:r>
     </w:p>
     <w:p>
@@ -169,7 +321,7 @@
         <w:pStyle w:val="Heading1"/>
       </w:pPr>
       <w:r>
-        <w:t>III. 방법</w:t>
+        <w:t>III. 제안 방법</w:t>
       </w:r>
     </w:p>
     <w:p>
@@ -177,7 +329,7 @@
         <w:pStyle w:val="Heading2"/>
       </w:pPr>
       <w:r>
-        <w:t>1. 편집 상태와 처리 절차</w:t>
+        <w:t>1. 편집 상태의 표현과 처리 절차</w:t>
       </w:r>
     </w:p>
     <w:p>
@@ -185,7 +337,7 @@
         <w:jc w:val="both"/>
       </w:pPr>
       <w:r>
-        <w:t>편집 상태에는 재킷·상의·핀·목걸이·배경·소품의 여섯 항목을 저장한다. 각 값은 지정된 속성, ‘원본’ 또는 제거 가능한 항목의 ‘없음’이다. ‘원본’은 최초 사진의 모습이며, ‘없음’은 대상을 제거한 상태이다. 처음에는 모든 항목을 ‘원본’으로 설정한다.</w:t>
+        <w:t>반복 편집의 입력은 최초 사진, 직전까지 저장한 편집 상태, 새 편집 요청으로 구성한다. 출력은 요청을 반영한 새 상태와 이미지 생성 프롬프트이다. 편집 상태에는 재킷·상의·핀·목걸이·배경·소품의 여섯 항목을 저장한다. 각 값은 지정된 속성, ‘원본’ 또는 제거 가능한 항목의 ‘없음’이다. ‘원본’은 최초 사진의 모습이며, ‘없음’은 대상을 제거한 상태이다. 처음에는 모든 항목을 ‘원본’으로 설정한다.</w:t>
       </w:r>
     </w:p>
     <w:p>
@@ -193,7 +345,7 @@
         <w:jc w:val="both"/>
       </w:pPr>
       <w:r>
-        <w:t>요청을 받으면 언어 모델이 변경할 항목과 값을 JSON으로 한 번 추출한다. 프로그램은 허용된 값을 항목별로 검사하고, 직전 상태를 복사한 뒤 변경 사항을 반영한다. 이어서 현재 요청의 삭제·복원·유지 대상과 실행할 지시를 확인한다. 최종 상태와 적용 근거를 저장하고, 현재 조건을 문장으로 바꾸어 원본 사진과 함께 이미지 생성 도구에 전달한다.</w:t>
+        <w:t>상태 갱신은 변경 사항 추출, 값 검증, 지시 검사, 프롬프트 작성의 순서로 수행한다. 요청을 받으면 언어 모델이 변경할 항목과 값을 JSON 형식의 변경 목록으로 한 번 추출한다. 프로그램은 허용된 값을 항목별로 검사하고, 직전 상태를 복사한 뒤 변경 사항을 반영한다. 이어서 현재 요청의 삭제·복원·유지 대상과 실행할 지시를 확인한다. 최종 상태와 적용 근거를 저장하고, 현재 조건을 문장으로 바꾸어 원본 사진과 함께 이미지 생성 도구에 전달한다.</w:t>
       </w:r>
     </w:p>
     <w:p>
@@ -249,7 +401,7 @@
         <w:pStyle w:val="Heading2"/>
       </w:pPr>
       <w:r>
-        <w:t>4. 비교 방법과 프롬프트 작성</w:t>
+        <w:t>4. 응답 선택과 프롬프트 작성</w:t>
       </w:r>
     </w:p>
     <w:p>
@@ -257,7 +409,7 @@
         <w:jc w:val="both"/>
       </w:pPr>
       <w:r>
-        <w:t>기준 방법은 변경 사항 추출과 한 차례 재검토에 모델을 두 번 호출한다. 비교 조건은 첫 응답만 단순 적용하는 방법, 유효한 재검토 응답을 우선 적용하는 방법, 두 응답에 지시 검사를 결합하는 방법, 첫 응답에만 검사를 결합하는 제안 방법이다. 같은 요청에서 얻은 응답을 공유하여 응답 선택과 후처리의 차이를 비교한다.</w:t>
+        <w:t>응답 선택과 지시 검사의 영향을 구분하기 위해 모델 응답의 수와 검사 적용 여부를 달리한다. 개발 단계의 기준 방법은 변경 사항 추출과 한 차례 재검토에 모델을 두 번 호출한다. 비교 조건은 첫 응답만 단순 적용하는 방법, 유효한 재검토 응답을 우선 적용하는 방법, 두 응답에 지시 검사를 결합하는 방법, 첫 응답에만 검사를 결합하는 제안 방법이다. 같은 요청에서 얻은 응답을 공유하여 응답 선택과 후처리의 차이를 비교한다.</w:t>
       </w:r>
     </w:p>
     <w:p>
@@ -281,7 +433,7 @@
         <w:pStyle w:val="Heading2"/>
       </w:pPr>
       <w:r>
-        <w:t>1. 자료와 비교 구성</w:t>
+        <w:t>1. 실험 자료와 비교 조건</w:t>
       </w:r>
     </w:p>
     <w:p>
@@ -289,7 +441,7 @@
         <w:jc w:val="both"/>
       </w:pPr>
       <w:r>
-        <w:t>초기 이미지 실험은 합성 인물 6명에게 동일한 순서의 편집 10단계를 적용한 자료이다. 순차 편집은 직전 출력에, 원본 기반 재생성은 최초 사진에 같은 최종 요구를 적용한다. 얼굴·표정·자세와 인물 조명은 유지하도록 요청하였다. 출력 크기는 1024×1536이며 순차 출력 60장과 원본 기반 최종 출력 6장을 분석하였다.</w:t>
+        <w:t>실험은 원본 기반 구성의 얼굴 보존 비교, 편집 상태 갱신의 정확도 평가, 실제 인물의 이미지 생성 비교로 구성하였다. 원본 기반 구성의 비교에는 합성 인물 6명에게 동일한 순서의 편집 10단계를 적용한 자료를 사용하였다. 순차 편집은 직전 출력에, 원본 기반 재생성은 최초 사진에 같은 최종 요구를 적용한다. 얼굴·표정·자세와 인물 조명은 유지하도록 요청하였다. 출력 크기는 1024×1536이며 순차 출력 60장과 원본 기반 최종 출력 6장을 분석하였다.</w:t>
       </w:r>
     </w:p>
     <w:p>
@@ -297,7 +449,7 @@
         <w:jc w:val="both"/>
       </w:pPr>
       <w:r>
-        <w:t>상태 갱신 실험에는 AI를 이용해 작성한 합성 영어 대화를 사용하였다. 정답은 대화 작성 시 정한 항목별 변경을 초기 상태에 순서대로 적용하여 계산하였다. 개발 자료로 규칙을 수정한 뒤, 코드·요청·정답·모델 설정을 고정하고 별도의 대화로 검증하였다. 앞선 비교는 세 대화의 서로 다른 요청 12개이며 Qwen3-4B와 Llama-3.2-3B-Instruct[4,9]에 같은 요청을 입력하였다. 모두 4비트 양자화 모델이고 온도 0, 최대 출력 260토큰, 공통 예시 7개를 사용하였다. 비교용 추출·재검토 응답은 모델별 24개, 총 48개를 저장하였다.</w:t>
+        <w:t>상태 갱신 실험에는 AI를 이용해 작성한 합성 영어 대화를 사용하였다. 정답은 대화 작성 시 정한 항목별 변경을 초기 상태에 순서대로 적용하여 계산하였다. 개발 자료로 규칙을 수정한 뒤, 코드·요청·정답·모델 설정을 고정하고 별도의 대화로 검증하였다. 앞선 비교는 세 대화의 서로 다른 요청 12개이며 Qwen3-4B와 Llama-3.2-3B-Instruct[6,7]에 같은 요청을 입력하였다. 모두 4비트 양자화 모델이고 온도 0, 최대 출력 260토큰, 공통 예시 7개를 사용하였다. 비교용 추출·재검토 응답은 모델별 24개, 총 48개를 저장하였다.</w:t>
       </w:r>
     </w:p>
     <w:p>
@@ -305,7 +457,7 @@
         <w:jc w:val="both"/>
       </w:pPr>
       <w:r>
-        <w:t>추가 검증은 코드와 모델 설정을 그대로 고정한 뒤 새 대화 12개에 요청을 여덟 개씩 적용한 96개이다. 네 가지 표현 틀에 세 가지 속성 조합을 배정하고 삭제·복원·유지·부정·인용·조건·뒤 직접 지시를 조합하였다. 조건문·명시된 인용문·부정 지시는 즉시 실행하지 않고, 뒤에 나온 직접 지시를 적용하는 정책으로 정답을 구성하였다. 중간 요청의 순서를 바꾸어 오류가 후속 상태에 미치는 영향도 관찰하였다. 모든 문장은 기존 검증 자료와 중복되지 않으며 정답은 채점에만 사용하였다. 두 모델에 동일한 96개를 각각 입력하여 최초 추출·재검토 응답 총 384개를 저장하였다.</w:t>
+        <w:t>주 비교 자료는 코드와 모델 설정을 그대로 고정한 뒤 새 대화 12개에 요청을 여덟 개씩 적용한 96개이다. 네 가지 표현 틀에 세 가지 속성 조합을 배정하고 삭제·복원·유지·부정·인용·조건·뒤 직접 지시를 조합하였다. 조건문·명시된 인용문·부정 지시는 즉시 실행하지 않고, 뒤에 나온 직접 지시를 적용하는 정책으로 정답을 구성하였다. 중간 요청의 순서를 바꾸어 오류가 후속 상태에 미치는 영향도 관찰하였다. 모든 문장은 기존 검증 자료와 중복되지 않으며 정답은 채점에만 사용하였다. 두 모델에 동일한 96개를 각각 입력하여 최초 추출·재검토 응답 총 384개를 저장하였다.</w:t>
       </w:r>
     </w:p>
     <w:p>
@@ -321,7 +473,7 @@
         <w:jc w:val="both"/>
       </w:pPr>
       <w:r>
-        <w:t>실제 인물 원본은 Pexels에 공개된 Monstera Production의 사진 두 장이다[7,8]. R01과 R02를 각각 512×336, 512×768 크기로 입력하였다. 앞선 유지·삭제 이미지 실험은 요청 32개·인물 두 명·두 방법의 128조건이다. 같은 원본과 프롬프트는 이미지를 공유하여 실제 출력은 66장이며, 방법 간 64쌍 중 입력이 다른 경우는 4쌍이다.</w:t>
+        <w:t>실제 인물 원본은 Pexels에 공개된 Monstera Production의 사진 두 장이다[8,9]. R01과 R02를 각각 512×336, 512×768 크기로 입력하였다. 앞선 유지·삭제 이미지 실험은 요청 32개·인물 두 명·두 방법의 128조건이다. 같은 원본과 프롬프트는 이미지를 공유하여 실제 출력은 66장이며, 방법 간 64쌍 중 입력이 다른 경우는 4쌍이다.</w:t>
       </w:r>
     </w:p>
     <w:p>
@@ -353,7 +505,7 @@
         <w:jc w:val="both"/>
       </w:pPr>
       <w:r>
-        <w:t>추가 96개 검증에서는 요청의 대화 내 의존성을 고려하여 대화 12개를 단위로 20000회 복원 추출한 정확도 차이의 95% 백분위 구간을 계산하였다. 첫 응답 단순 적용과 제안 방법의 주 비교는 대화별 차이에 대한 4096개 부호 조합의 양측 무작위화 검정으로 분석하고, 두 모델의 p값에 Holm 보정을 적용하였다. 표현 틀을 공유하는 합성 자료 안에서의 변동을 측정하였다.</w:t>
+        <w:t>96개 요청의 주 비교에서는 대화 내 의존성을 고려하여 대화 12개를 단위로 20000회 복원 추출한 정확도 차이의 95% 백분위 구간을 계산하였다. 첫 응답 단순 적용과 제안 방법의 주 비교는 대화별 차이에 대한 4096개 부호 조합의 양측 무작위화 검정으로 분석하고, 두 모델의 p값에 Holm 보정을 적용하였다. 표현 틀을 공유하는 합성 자료 안에서의 변동을 측정하였다.</w:t>
       </w:r>
     </w:p>
     <w:p>
@@ -369,7 +521,7 @@
         <w:jc w:val="both"/>
       </w:pPr>
       <w:r>
-        <w:t>실제 인물의 얼굴 코사인 유사도는 InsightFace buffalo_l[6]로 측정하였다. 후속 이미지 18장은 랜드마크로 원본과 출력을 각각 112×112로 정렬한 뒤 MAE·SSIM·LPIPS도 계산하였다. 이 수치는 초기 실험의 320×360 영역과 전처리가 다르다.</w:t>
+        <w:t>실제 인물의 얼굴 코사인 유사도는 InsightFace buffalo_l[11]로 측정하였다. 후속 이미지 18장은 랜드마크로 원본과 출력을 각각 112×112로 정렬한 뒤 MAE·SSIM·LPIPS도 계산하였다. 이 수치는 초기 실험의 320×360 영역과 전처리가 다르다.</w:t>
       </w:r>
     </w:p>
     <w:p>
@@ -377,7 +529,7 @@
         <w:jc w:val="both"/>
       </w:pPr>
       <w:r>
-        <w:t>편집 목표는 Qwen2.5-VL-3B의 4비트 모델[5]이 성공·실패·판단 불가로 한 번 평가하였다. 입력은 이미지와 여섯 목표이며 생성 방식과 프롬프트는 제공하지 않았다. 형식 오류와 판독 불가는 분모에 남기고 성공에서 제외하였다. 3B 응답의 오류를 관찰한 뒤 같은 이미지·목표 전체를 Qwen2.5-VL-7B로 사후 평가하였다. 두 평가의 원문과 점수를 각각 보존하였다.</w:t>
+        <w:t>편집 목표는 Qwen2.5-VL-3B의 4비트 모델[12]이 성공·실패·판단 불가로 한 번 평가하였다. 입력은 이미지와 여섯 목표이며 생성 방식과 프롬프트는 제공하지 않았다. 형식 오류와 판독 불가는 분모에 남기고 성공에서 제외하였다. 3B 응답의 오류를 관찰한 뒤 같은 이미지·목표 전체를 Qwen2.5-VL-7B로 사후 평가하였다. 두 평가의 원문과 점수를 각각 보존하였다.</w:t>
       </w:r>
     </w:p>
     <w:p>
@@ -427,7 +579,7 @@
         <w:pStyle w:val="Heading2"/>
       </w:pPr>
       <w:r>
-        <w:t>1. 반복 편집과 원본 기반 재생성</w:t>
+        <w:t>1. 입력 이미지 선택에 따른 얼굴 보존</w:t>
       </w:r>
     </w:p>
     <w:p>
@@ -1041,7 +1193,7 @@
         <w:jc w:val="both"/>
       </w:pPr>
       <w:r>
-        <w:t>기존 새 요청 12개에서는 첫 응답 단순 적용이 두 모델 모두 3/12, 제안 방법이 모두 12/12였다. 같은 구현을 고정하고 대화를 늘린 96개 요청의 결과는 표 2와 같다.</w:t>
+        <w:t>새 요청 96개에서 응답 선택과 지시 검사 적용 여부에 따른 전체 상태 일치율을 표 2에 제시하였다. 첫 응답만 단순 적용한 경우와 제안 방법은 같은 최초 추출 결과를 사용하므로, 두 조건의 차이는 지시 검사에 해당한다. 두 번 호출하는 조건은 같은 요청에 대한 재검토 응답을 추가로 사용한다. 별도의 기본 검증 요청 12개에서는 첫 응답 단순 적용이 두 모델 모두 3/12, 제안 방법이 모두 12/12였다.</w:t>
       </w:r>
     </w:p>
     <w:p>
@@ -1053,7 +1205,7 @@
         <w:jc w:val="center"/>
       </w:pPr>
       <w:r>
-        <w:t>표 2. 추가 96개 요청의 상태 일치와 호출 수</w:t>
+        <w:t>표 2. 96개 요청의 상태 일치와 호출 수</w:t>
       </w:r>
     </w:p>
     <w:tbl>
@@ -1614,7 +1766,7 @@
         <w:jc w:val="both"/>
       </w:pPr>
       <w:r>
-        <w:t>Qwen3에서 첫 응답 단순 적용 대비 정확도 차이는 45.83%p였으며 대화 단위 95% 구간은 31.25–59.38%p, Holm 보정 p값은 0.001953이었다.</w:t>
+        <w:t>두 모델 모두 첫 응답에 지시 검사를 적용했을 때 전체 상태 일치율이 높아졌다. Qwen3에서 첫 응답 단순 적용 대비 정확도 차이는 45.83%p였으며 대화 단위 95% 구간은 31.25–59.38%p, Holm 보정 p값은 0.001953이었다.</w:t>
       </w:r>
     </w:p>
     <w:p>
@@ -1642,7 +1794,7 @@
         <w:jc w:val="center"/>
       </w:pPr>
       <w:r>
-        <w:t>표 3. 추가 검증의 요청 유형별 전체 상태 일치</w:t>
+        <w:t>표 3. 요청 유형별 전체 상태 일치</w:t>
       </w:r>
     </w:p>
     <w:tbl>
@@ -3548,7 +3700,7 @@
         <w:jc w:val="both"/>
       </w:pPr>
       <w:r>
-        <w:t>추가 검증 결과는 표 5에 정리하였다. 이 표는 단계별 구현을 별도의 대화에서 비교한 결과이며, 서로 다른 자료의 정확도를 직접 순위화한 표가 아니다.</w:t>
+        <w:t>표 5는 유지·삭제 규칙, 지시 구절의 분리, 복원 표현, 실행 대상 검사의 구성요소별 검증 결과이다. 각 행은 해당 구현을 고정한 뒤 별도의 대화에 적용한 비교를 나타낸다.</w:t>
       </w:r>
     </w:p>
     <w:p>
@@ -3560,7 +3712,7 @@
         <w:jc w:val="center"/>
       </w:pPr>
       <w:r>
-        <w:t>표 5. 추가 대화에서의 상태 갱신 검증</w:t>
+        <w:t>표 5. 지시 검사 구성요소별 상태 갱신 검증</w:t>
       </w:r>
     </w:p>
     <w:tbl>
@@ -5224,7 +5376,7 @@
         <w:jc w:val="both"/>
       </w:pPr>
       <w:r>
-        <w:t>혼합 조건의 항목별 일치율은 최초 추출과 재검토가 각각 124/144, 규칙 보정은 144/144였다. 삭제 규칙만 적용한 사후 재계산도 요청 48개를 모두 맞혔다. 포즈를 제외한 짧은 대조 요청 8개에서도 최초 추출과 재검토는 각각 7/8이었다. 따라서 이 오류는 포즈 추가보다 삭제·복원 지시의 결합과 관련되었다.</w:t>
+        <w:t>혼합 조건의 항목별 일치율은 최초 추출과 재검토가 각각 124/144, 규칙 보정은 144/144였다. 삭제 규칙만 적용한 사후 재계산도 요청 48개를 모두 맞혔다. 포즈를 제외한 짧은 대조 요청 8개에서도 최초 추출과 재검토는 각각 7/8이었다. 이는 혼합 조건에서 관찰한 오류가 몸 방향 자체보다 삭제·복원 지시의 결합에서 발생했음을 뒷받침한다.</w:t>
       </w:r>
     </w:p>
     <w:p>
@@ -5252,7 +5404,7 @@
         <w:pStyle w:val="Heading2"/>
       </w:pPr>
       <w:r>
-        <w:t>5. 유지·삭제 규칙의 이미지 비교</w:t>
+        <w:t>5. 유지와 삭제 처리에 따른 생성 결과</w:t>
       </w:r>
     </w:p>
     <w:p>
@@ -5696,7 +5848,7 @@
         <w:pStyle w:val="Heading2"/>
       </w:pPr>
       <w:r>
-        <w:t>6. 현재 조건 정리와 생성 이미지</w:t>
+        <w:t>6. 프롬프트 구성에 따른 길이와 편집 목표 충족</w:t>
       </w:r>
     </w:p>
     <w:p>
@@ -7318,7 +7470,7 @@
         <w:pStyle w:val="Heading2"/>
       </w:pPr>
       <w:r>
-        <w:t>7. 생성 결과의 예</w:t>
+        <w:t>7. 조건문과 인용문을 포함한 편집 사례</w:t>
       </w:r>
     </w:p>
     <w:p>
@@ -7402,10 +7554,10 @@
     </w:p>
     <w:p>
       <w:pPr>
-        <w:jc w:val="both"/>
+        <w:pStyle w:val="Heading2"/>
       </w:pPr>
       <w:r>
-        <w:t>초기 실험은 원본을 재사용하는 구성을 선택한 근거이며, 후속 실험은 원본에 전달할 조건을 정리하는 방법의 비교이다. 현재 조건만 전달하면 취소된 값을 지우고 요청 이력의 증가에 따른 입력 길이를 줄일 수 있다. 이번 세 대화에서는 마지막 프롬프트를 39.87% 줄이면서 7B 평가의 목표 충족 수가 34/36에서 36/36으로 증가하였다.</w:t>
+        <w:t>1. 편집 상태 갱신에서 지시 검사의 역할</w:t>
       </w:r>
     </w:p>
     <w:p>
@@ -7413,7 +7565,7 @@
         <w:jc w:val="both"/>
       </w:pPr>
       <w:r>
-        <w:t>상태 오류는 모델의 추출과 후처리 양쪽에서 발생하였다. 유지 지시를 넓게 적용하면 잘못된 이전 값도 보존할 수 있고, 복원 지시의 범위를 넓게 잡으면 유지할 항목까지 원본으로 바꾼다. 지시의 동작과 적용 대상을 함께 검사해야 하는 이유이다. 또한 재검토가 정확한 첫 응답을 바꾼 사례는 호출을 추가하는 것만으로 오류를 줄일 수 없음을 보여준다.</w:t>
+        <w:t>전체 상태 일치율의 차이는 언어 모델이 추출한 값과 이를 저장하는 절차를 함께 설계해야 함을 보여준다. 동일한 첫 응답을 사용했을 때 Qwen3는 52/96에서 96/96, Llama는 27/96에서 93/96으로 높아졌다. 따라서 이 비교에서 얻은 개선은 더 많은 모델 응답을 생성한 결과보다, 추출값에 지시 검사를 적용한 효과로 볼 수 있다. 특히 항목을 바꾸는 동작과 그대로 두는 동작이 함께 등장하는 요청에서 적용 대상을 구분하는 처리가 중요하였다.</w:t>
       </w:r>
     </w:p>
     <w:p>
@@ -7421,7 +7573,7 @@
         <w:jc w:val="both"/>
       </w:pPr>
       <w:r>
-        <w:t>요청 충족과 얼굴 보존은 다른 평가 항목이다. 프롬프트가 짧아진 후 코사인 평균은 높았지만 MAE·SSIM·LPIPS는 전체 이력보다 불리하였다. 이 이미지 비교는 인물 두 명, 대화 세 개, 시드가 노출되지 않는 도구의 첫 출력에 대한 기술통계이다. AI 평가도 형식 오류와 설명·점수 모순을 보였으므로 점수와 원문을 함께 제시하였다.</w:t>
+        <w:t>유지와 복원은 모두 이전 정보를 참조하지만, 참조하는 시점이 다르다. 유지는 직전에 저장된 값을, 원본 복원은 최초 사진의 모습을 참조한다. 유지 규칙을 넓게 적용하면 잘못 저장된 값도 그대로 남고, 복원 대상을 넓게 잡으면 유지할 항목까지 원본으로 바뀐다. 구성요소 검증에서 관찰한 오류는 이러한 동작을 하나의 값 변경으로 묶기보다, 동작과 대상의 조합으로 처리할 필요가 있음을 보여준다.</w:t>
       </w:r>
     </w:p>
     <w:p>
@@ -7429,7 +7581,71 @@
         <w:jc w:val="both"/>
       </w:pPr>
       <w:r>
-        <w:t>추가 96개 검증은 요청 수를 늘리고 대화 길이를 여덟 개로 확장하여 같은 구현을 다시 평가한 결과이다. 네 가지 표현 틀에 속성 조합을 바꾼 자료이며, 대화 단위 구간도 이 구성 안에서의 변동을 나타낸다. 상태 갱신 결과는 지정한 영어 표현과 편집 항목에서 얻었다. 복원 표현 확장 전의 0/8과 Llama의 0/16은 어휘 처리와 응답 선택에 따른 적용 범위를 보여준다. 오류가 시작된 요청과 후속 상태를 함께 보면 구현의 적용 범위가 드러난다.</w:t>
+        <w:t>응답의 재검토도 같은 관점에서 해석할 수 있다. Qwen3에서는 첫 응답과 재검토에 검사를 적용한 결과가 모두 96/96이었지만, Llama에서는 각각 93/96과 44/96이었다. 재검토 응답에서 일부 초기 설정이 누락되면 이후 요청이 다른 항목을 바꾸더라도 빠진 값은 회복되지 않을 수 있다. 첫 응답과 코드 검사를 결합하는 구성은 이런 응답 교체를 줄이면서 요청당 한 번의 모델 호출로 상태를 갱신한다.</w:t>
+      </w:r>
+    </w:p>
+    <w:p>
+      <w:pPr>
+        <w:pStyle w:val="Heading2"/>
+      </w:pPr>
+      <w:r>
+        <w:t>2. 프롬프트 간결화와 생성 이미지의 관계</w:t>
+      </w:r>
+    </w:p>
+    <w:p>
+      <w:pPr>
+        <w:jc w:val="both"/>
+      </w:pPr>
+      <w:r>
+        <w:t>원본 기반 재생성에서는 현재 유효한 조건을 모두 전달해야 한다. 전체 요청 이력은 변경 과정을 보존하는 반면, 현재 조건은 그 과정에서 취소되거나 대체된 값을 제외한다. 세 대화의 마지막 프롬프트 길이는 전체 이력 평균 204.00토큰에서 지시 검사 후 122.67토큰으로 39.87% 감소하였다. 첫 요청에서는 상태를 명시하는 문장이 더 길었으나 요청이 누적된 이후에는 현재 조건을 전달하는 방식이 짧았다. 입력 길이의 이점은 대화 이력의 축적과 함께 나타난 결과이다.</w:t>
+      </w:r>
+    </w:p>
+    <w:p>
+      <w:pPr>
+        <w:jc w:val="both"/>
+      </w:pPr>
+      <w:r>
+        <w:t>생성 이미지의 목표 충족은 프롬프트 길이와 별도로 해석해야 한다. 7B 평가의 성공 항목은 전체 이력 34/36, 검사 전 조건 24/36, 검사 후 조건 36/36이었다. 검사 전 조건이 더 짧으면서도 성공 항목이 적었다는 점은, 문장을 줄이는 것만으로 편집 요구가 정확해지지는 않음을 보여준다. 이 비교에서 현재 조건의 정확성을 확보하는 과정이 입력 간결화와 함께 작용하였다.</w:t>
+      </w:r>
+    </w:p>
+    <w:p>
+      <w:pPr>
+        <w:jc w:val="both"/>
+      </w:pPr>
+      <w:r>
+        <w:t>얼굴 보존 지표는 다른 양상을 보였다. 검사 후 조건의 얼굴 코사인 평균은 전체 이력보다 높았지만, 정렬 MAE·SSIM·LPIPS는 전체 이력에 유리하였다. 얼굴 특징의 유사도와 픽셀·구조 차이는 서로 다른 측정값이다. 따라서 본 실험은 지시 검사에 따른 상태 정확도와 프롬프트 길이의 개선을 뒷받침하며, 얼굴 보존의 변화는 각 지표의 방향을 함께 제시하는 것이 적절하다.</w:t>
+      </w:r>
+    </w:p>
+    <w:p>
+      <w:pPr>
+        <w:pStyle w:val="Heading2"/>
+      </w:pPr>
+      <w:r>
+        <w:t>3. 자료 구성과 결과의 적용 범위</w:t>
+      </w:r>
+    </w:p>
+    <w:p>
+      <w:pPr>
+        <w:jc w:val="both"/>
+      </w:pPr>
+      <w:r>
+        <w:t>96개 요청은 네 가지 표현 틀에 속성 조합과 중간 지시 순서를 달리한 합성 영어 대화이다. 대화마다 여덟 요청을 이어서 적용하므로 앞선 상태 오류가 후속 결과에 미치는 영향까지 포함한다. 대화 단위로 계산한 구간과 대응 검정은 이러한 자료 구성 안에서 관찰된 정확도 차이를 나타낸다. 속성값과 동작의 조합을 통제한 검증이라는 점에서, 임의의 사용자 발화를 표집한 실험과 구분된다.</w:t>
+      </w:r>
+    </w:p>
+    <w:p>
+      <w:pPr>
+        <w:jc w:val="both"/>
+      </w:pPr>
+      <w:r>
+        <w:t>Llama의 세 오류는 인용문 뒤에 나온 원본 복원 표현에서 발생하였다. 잘못된 색 변경을 거부했더라도 복원 지시를 인식하지 못하면 직전 값이 남는다. 복원 표현 확장 전의 0/8과 재검토 응답의 초기 설정 오류가 이어진 0/16도 어휘 범위와 응답 선택이 결과에 미치는 영향을 보여준다. 지정한 여섯 항목과 지원 문형, 조건문·인용문을 실행하지 않는 처리 정책이 본 구현의 범위를 이룬다.</w:t>
+      </w:r>
+    </w:p>
+    <w:p>
+      <w:pPr>
+        <w:jc w:val="both"/>
+      </w:pPr>
+      <w:r>
+        <w:t>이미지 비교는 실제 인물 두 명과 세 대화에서 조건별 첫 출력 한 장을 사용한 여섯 대응 사례이다. 생성 도구의 내부 버전과 시드는 노출되지 않았으며, 얼굴 지표는 이 출력들의 기술통계이다. 또한 AI 평가에서는 형식 오류와 설명·점수 불일치가 관찰되었다. 이에 요청 해석의 정답 대조, 이미지의 목표 충족 판정, 얼굴 보존 지표를 구분하고 각각의 원자료와 판정 근거를 제시하였다.</w:t>
       </w:r>
     </w:p>
     <w:p>
@@ -7445,7 +7661,7 @@
         <w:jc w:val="both"/>
       </w:pPr>
       <w:r>
-        <w:t>반복 인물 이미지 편집에서 누적 요청을 현재 조건으로 정리하고, 한 번 추출한 변경 사항에 지시 검사를 적용하는 방법을 구현하였다. 초기 6인물 실험의 원본 기반 재생성 결과를 출발점으로 삭제·복원·유지를 구분하고, 부정·조건·인용 지시와 뒤의 직접 지시를 처리하였다.</w:t>
+        <w:t>본 연구는 반복 인물 이미지 편집에서 현재 유효한 편집 조건을 항목별로 저장하고, 언어 모델이 한 번 추출한 변경 사항에 지시 검사를 적용하는 방법을 제안하였다. 삭제는 대상의 부재로, 원본 복원은 최초 사진의 모습으로, 유지는 직전 값의 보존으로 구분하였다. 지시 구절의 분리와 부정·조건·인용 범위 검사로 각 동작의 적용 대상을 정하고, 갱신된 상태를 원본 사진에 적용할 프롬프트로 변환하였다.</w:t>
       </w:r>
     </w:p>
     <w:p>
@@ -7453,7 +7669,7 @@
         <w:jc w:val="both"/>
       </w:pPr>
       <w:r>
-        <w:t>추가 요청 96개에서 첫 응답 단순 적용과 제안 방법의 전체 상태 일치는 Qwen3 52/96과 96/96, Llama 27/96과 93/96이었다. 제안 방법의 모델 호출은 요청당 한 번이며, 대화 길이를 여덟 개로 늘린 조건에서도 같은 구현을 비교하였다.</w:t>
+        <w:t>새 합성 요청 96개에서 첫 응답 단순 적용과 제안 방법의 전체 상태 일치는 Qwen3 52/96과 96/96, Llama 27/96과 93/96이었다. 같은 추출 응답을 사용한 비교에서 지시 검사의 효과를 확인하였으며, 제안 방법은 상태 갱신에 요청당 한 번의 모델 호출을 사용하였다. Llama의 복원 표현 오류 세 개와 재검토 조건의 상태 누락은 코드의 어휘 처리와 응답 선택이 정확도에 영향을 주는 사례였다.</w:t>
       </w:r>
     </w:p>
     <w:p>
@@ -7461,7 +7677,7 @@
         <w:jc w:val="both"/>
       </w:pPr>
       <w:r>
-        <w:t>실제 인물 두 명의 생성 이미지 18장에서 최종 프롬프트 길이는 평균 204.00토큰에서 122.67토큰으로 줄었다. 7B 평가의 목표 충족 수는 전체 이력 34/36, 지시 검사 후 조건 36/36이었다. 얼굴 지표는 측정 항목에 따라 방향이 달랐다.</w:t>
+        <w:t>실제 인물 두 명의 생성 이미지 18장에서는 마지막 프롬프트 길이가 평균 204.00토큰에서 122.67토큰으로 감소하였고, 7B 평가의 목표 충족 수는 전체 이력 34/36에서 지시 검사 후 조건 36/36으로 높아졌다. 얼굴 보존 지표의 변화 방향은 측정 항목에 따라 달랐다. 이 결과는 원본 사진을 재사용하는 반복 편집에서, 변경 요청의 단순 축약과 함께 삭제·복원·유지의 의미를 보존하는 상태 갱신이 필요함을 보여준다.</w:t>
       </w:r>
     </w:p>
     <w:p>
@@ -7479,7 +7695,7 @@
         <w:jc w:val="left"/>
       </w:pPr>
       <w:r>
-        <w:t>[1] X. Cui et al., “ChatEdit: Towards Multi-Turn Interactive Facial Image Editing via Dialogue,” EMNLP, pp. 14567–14583, 2023. https://aclanthology.org/2023.emnlp-main.899/</w:t>
+        <w:t>[1] T. Brooks, A. Holynski, and A. A. Efros, “InstructPix2Pix: Learning to Follow Image Editing Instructions,” CVPR, 2023. https://arxiv.org/abs/2211.09800</w:t>
       </w:r>
     </w:p>
     <w:p>
@@ -7489,7 +7705,7 @@
         <w:jc w:val="left"/>
       </w:pPr>
       <w:r>
-        <w:t>[2] S. Kim et al., “Efficient Dialogue State Tracking by Selectively Overwriting Memory,” ACL, 2020. https://aclanthology.org/2020.acl-main.53/</w:t>
+        <w:t>[2] X. Cui et al., “ChatEdit: Towards Multi-Turn Interactive Facial Image Editing via Dialogue,” EMNLP, pp. 14567–14583, 2023. https://aclanthology.org/2023.emnlp-main.899/</w:t>
       </w:r>
     </w:p>
     <w:p>
@@ -7499,7 +7715,7 @@
         <w:jc w:val="left"/>
       </w:pPr>
       <w:r>
-        <w:t>[3] A. Madaan et al., “Self-Refine: Iterative Refinement with Self-Feedback,” 2023. https://arxiv.org/abs/2303.17651</w:t>
+        <w:t>[3] K. Zhang et al., “MagicBrush: A Manually Annotated Dataset for Instruction-Guided Image Editing,” NeurIPS, vol. 36, 2023. https://papers.neurips.cc/paper_files/paper/2023/hash/64008fa30cba9b4d1ab1bd3bd3d57d61-Abstract-Datasets_and_Benchmarks.html</w:t>
       </w:r>
     </w:p>
     <w:p>
@@ -7509,7 +7725,7 @@
         <w:jc w:val="left"/>
       </w:pPr>
       <w:r>
-        <w:t>[4] A. Yang et al., “Qwen3 Technical Report,” arXiv:2505.09388, 2025. https://arxiv.org/abs/2505.09388</w:t>
+        <w:t>[4] S. Kim et al., “Efficient Dialogue State Tracking by Selectively Overwriting Memory,” ACL, pp. 567–582, 2020. https://aclanthology.org/2020.acl-main.53/</w:t>
       </w:r>
     </w:p>
     <w:p>
@@ -7519,7 +7735,7 @@
         <w:jc w:val="left"/>
       </w:pPr>
       <w:r>
-        <w:t>[5] S. Bai et al., “Qwen2.5-VL Technical Report,” arXiv:2502.13923, 2025. https://arxiv.org/abs/2502.13923</w:t>
+        <w:t>[5] A. Madaan et al., “Self-Refine: Iterative Refinement with Self-Feedback,” 2023. https://arxiv.org/abs/2303.17651</w:t>
       </w:r>
     </w:p>
     <w:p>
@@ -7529,7 +7745,7 @@
         <w:jc w:val="left"/>
       </w:pPr>
       <w:r>
-        <w:t>[6] InsightFace Contributors, “Model Zoo,” InsightFace. https://github.com/deepinsight/insightface/tree/master/model_zoo</w:t>
+        <w:t>[6] A. Yang et al., “Qwen3 Technical Report,” arXiv:2505.09388, 2025. https://arxiv.org/abs/2505.09388</w:t>
       </w:r>
     </w:p>
     <w:p>
@@ -7539,7 +7755,7 @@
         <w:jc w:val="left"/>
       </w:pPr>
       <w:r>
-        <w:t>[7] Monstera Production, “Confident black man in studio,” Pexels, photo 6311573. https://www.pexels.com/photo/confident-black-man-in-studio-6311573/</w:t>
+        <w:t>[7] Meta, “Llama 3.2 Model Card,” 2024. https://huggingface.co/meta-llama/Llama-3.2-3B-Instruct</w:t>
       </w:r>
     </w:p>
     <w:p>
@@ -7549,7 +7765,7 @@
         <w:jc w:val="left"/>
       </w:pPr>
       <w:r>
-        <w:t>[8] Monstera Production, “Cheerful black woman in studio,” Pexels, photo 6311581. https://www.pexels.com/photo/cheerful-black-woman-in-studio-6311581/</w:t>
+        <w:t>[8] Monstera Production, “Confident black man in studio,” Pexels, photo 6311573. https://www.pexels.com/photo/confident-black-man-in-studio-6311573/</w:t>
       </w:r>
     </w:p>
     <w:p>
@@ -7559,7 +7775,7 @@
         <w:jc w:val="left"/>
       </w:pPr>
       <w:r>
-        <w:t>[9] Meta, “Llama 3.2 Model Card,” 2024. https://huggingface.co/meta-llama/Llama-3.2-3B-Instruct</w:t>
+        <w:t>[9] Monstera Production, “Cheerful black woman in studio,” Pexels, photo 6311581. https://www.pexels.com/photo/cheerful-black-woman-in-studio-6311581/</w:t>
       </w:r>
     </w:p>
     <w:p>
@@ -7570,6 +7786,26 @@
       </w:pPr>
       <w:r>
         <w:t>[10] R. Zhang et al., “The Unreasonable Effectiveness of Deep Features as a Perceptual Metric,” CVPR, 2018. https://arxiv.org/abs/1801.03924</w:t>
+      </w:r>
+    </w:p>
+    <w:p>
+      <w:pPr>
+        <w:keepLines/>
+        <w:ind w:firstLine="0"/>
+        <w:jc w:val="left"/>
+      </w:pPr>
+      <w:r>
+        <w:t>[11] InsightFace Contributors, “Model Zoo,” InsightFace. https://github.com/deepinsight/insightface/tree/master/model_zoo</w:t>
+      </w:r>
+    </w:p>
+    <w:p>
+      <w:pPr>
+        <w:keepLines/>
+        <w:ind w:firstLine="0"/>
+        <w:jc w:val="left"/>
+      </w:pPr>
+      <w:r>
+        <w:t>[12] S. Bai et al., “Qwen2.5-VL Technical Report,” arXiv:2502.13923, 2025. https://arxiv.org/abs/2502.13923</w:t>
       </w:r>
     </w:p>
     <w:p>

</xml_diff>

<commit_message>
Restructure thesis around state update method and main evidence
</commit_message>
<xml_diff>
--- a/paper/manuscript.inha.docx
+++ b/paper/manuscript.inha.docx
@@ -65,7 +65,7 @@
         <w:t xml:space="preserve">요약: </w:t>
       </w:r>
       <w:r>
-        <w:t>반복 이미지 편집에서 원본 사진을 재사용하려면 누적된 요청을 현재 편집 조건으로 정리해야 한다. 본 연구는 언어 모델이 한 번 추출한 변경 사항에 삭제·복원·유지 및 실행 대상 검사를 적용하는 방법을 제안한다. 합성 인물 6명의 10단계 편집에서 위치 보정 MAE·SSIM·LPIPS는 최종 6쌍 모두 원본 기반 재생성에 유리하였다. 새 합성 영어 요청 96개에서 Qwen3-4B의 전체 상태 일치는 첫 응답 단순 적용 52/96, 제안 방법 96/96이었고, Llama-3.2-3B-Instruct는 각각 27/96과 93/96이었다. 실제 인물 두 명에게 세 대화를 적용한 이미지 18장에서는 전체 요청 이력을 현재 조건으로 바꾸어 평균 프롬프트 길이를 204.00토큰에서 122.67토큰으로 39.87% 줄였다. 7B AI 평가의 목표 충족 수는 전체 이력 34/36, 지시 검사 후 조건 36/36이었다. 얼굴 보존 지표의 변화 방향은 측정 항목에 따라 달랐다. 상태 갱신 평가는 여섯 편집 항목과 지정한 영어 문형의 합성 대화를 대상으로 하였다.</w:t>
+        <w:t>반복 인물 이미지 편집에서는 새 요청을 반영하면서 앞서 지정한 조건을 유지하거나 취소해야 한다. 본 연구는 편집 조건을 항목별로 저장하고, 언어 모델이 한 번 추출한 변경 내용에 코드 검사를 적용하여 상태를 갱신하는 방법을 제안한다. 검사는 추출값의 유효성, 삭제·복원·유지의 적용 대상, 부정문·조건문·인용문의 실행 여부를 확인한다. 합성 영어 대화 12개의 요청 96개에서 동일한 최초 응답을 단순 적용한 방법과 비교하였다. 전체 상태 일치는 Qwen3-4B의 경우 52/96에서 96/96으로, Llama-3.2-3B-Instruct의 경우 27/96에서 93/96으로 증가하였다. 제안 방법은 요청당 한 번의 모델 호출로 상태를 갱신하였다. 실제 인물 사진 두 장과 대화 세 개에 적용한 이미지 18장에서는 전체 요청 이력 대신 검사 후 저장한 조건을 전달하여 마지막 프롬프트의 평균 길이를 204.00토큰에서 122.67토큰으로 줄였다. Qwen2.5-VL-7B의 편집 목표 충족 판정은 각각 34/36과 36/36이었으며 얼굴 보존 지표는 측정 항목에 따라 다른 양상을 보였다. 결과는 여섯 편집 항목과 지정한 영어 문형에서, 추출된 변경값을 요청의 동작과 적용 범위에 따라 검사하는 방식의 효과를 보여준다.</w:t>
       </w:r>
     </w:p>
     <w:p>
@@ -79,7 +79,7 @@
         <w:t xml:space="preserve">Abstract: </w:t>
       </w:r>
       <w:r>
-        <w:t>Original-referenced portrait editing requires compiling accumulated requests into current editing conditions. We propose a method that extracts changes once and checks removal, restoration, preservation, and instruction eligibility. In an initial ten-step experiment on six synthetic people, original-referenced regeneration was closer to the source on all six final pairs using registered MAE, SSIM, and LPIPS. On 96 new synthetic English requests in twelve eight-request dialogues, direct application and the proposed method matched 52/96 and 96/96 full reference states for Qwen3-4B, and 27/96 and 93/96 for Llama-3.2-3B-Instruct, respectively. The implementation was frozen before evaluation. A follow-up comparison generated eighteen images from two real-person photographs and three dialogues. Compiling checked current conditions reduced the mean final prompt length from 204.00 to 122.67 tokens, a 39.87% reduction. A post-hoc Qwen2.5-VL-7B evaluator scored 34/36 target attributes for full request histories and 36/36 for checked conditions. Facial preservation metrics showed mixed directions across input forms. State-update evaluation used six editing attributes and supported English instruction forms in AI-generated synthetic dialogues.</w:t>
+        <w:t>Iterative portrait editing requires updating new requests while preserving or cancelling earlier conditions. We propose a method that stores editing conditions by attribute and validates changes extracted in a single language-model call. The checks cover value validity, the targets of removal, restoration and preservation, and whether negated, conditional or quoted instructions should be executed. We evaluated 96 synthetic English requests in twelve dialogues by reusing the same initial model responses across methods. Compared with directly applying those responses, the proposed method increased exact state matches from 52/96 to 96/96 for Qwen3-4B and from 27/96 to 93/96 for Llama-3.2-3B-Instruct. Each state update required one model call. A comparison of eighteen images generated from two real-person photographs and three dialogues reduced the mean final prompt length from 204.00 to 122.67 tokens by replacing full request histories with validated stored conditions. A post-hoc Qwen2.5-VL-7B evaluation found 34/36 satisfied target attributes for full histories and 36/36 for validated conditions. Facial preservation metrics varied across input methods. The results demonstrate the effect of checking extracted values against instruction actions and scope within six editing attributes, specified English forms and a predefined state-update policy.</w:t>
       </w:r>
     </w:p>
     <w:p>
@@ -100,7 +100,7 @@
       <w:pPr>
         <w:spacing w:after="0" w:before="0" w:line="20" w:lineRule="exact"/>
         <w:sectPr>
-          <w:footerReference w:type="default" r:id="rId11"/>
+          <w:footerReference w:type="default" r:id="rId12"/>
           <w:pgSz w:w="11906" w:h="16838"/>
           <w:pgMar w:top="1134" w:right="1134" w:bottom="1134" w:left="1134" w:header="720" w:footer="720" w:gutter="0"/>
           <w:cols w:space="720"/>
@@ -121,7 +121,7 @@
         <w:jc w:val="both"/>
       </w:pPr>
       <w:r>
-        <w:t>자연어 지시를 이용한 이미지 편집은 사용자가 원하는 변화를 문장으로 입력하고, 입력 사진의 일부 속성을 수정하는 방식이다. InstructPix2Pix는 입력 이미지와 편집 지시를 함께 조건으로 사용하는 모델을 제시하였으며[1], ChatEdit는 얼굴 이미지 편집을 여러 차례의 대화로 확장하였다[2]. 이러한 편집 환경에서는 한 번의 요청을 반영하는 능력과 함께, 대화가 이어지는 동안 사용자가 유지하거나 취소한 조건을 구분하는 능력이 요구된다.</w:t>
+        <w:t>자연어 지시를 이용한 이미지 편집은 사용자가 원하는 변화를 문장으로 입력하여 사진의 일부 속성을 수정하는 기술이다. InstructPix2Pix는 입력 이미지와 편집 지시를 함께 조건으로 사용하는 모델을 제시하였으며[1], ChatEdit는 얼굴 이미지 편집을 여러 차례의 대화로 확장하였다[2]. 대화를 통한 편집에서는 새로 추가한 요구와 앞서 지정한 조건이 함께 결과에 반영되어야 한다. 사용자가 의상이나 배경을 수정하는 동안 얼굴과 자세를 보존하고자 한다면, 변경할 속성과 유지할 속성을 구분하는 처리가 필요하다.</w:t>
       </w:r>
     </w:p>
     <w:p>
@@ -129,7 +129,7 @@
         <w:jc w:val="both"/>
       </w:pPr>
       <w:r>
-        <w:t>인물 사진의 반복 편집에서는 변경할 속성과 보존할 속성이 동시에 존재한다. 사용자는 재킷이나 장신구, 배경을 바꾸면서도 얼굴과 자세는 유지하기를 원할 수 있다. 또한 새 요청이 앞선 요청을 대체하기도 한다. 은색 목걸이를 추가한 뒤 금색으로 바꾸고 다시 제거하도록 요청했다면, 마지막 편집에는 목걸이가 없어야 한다. 반면 목걸이를 최초 사진의 모습으로 되돌리라는 요청은 원본의 목걸이를 보존하는 지시이다. 대상이 같은 문장이라도 삭제와 원본 복원은 서로 다른 결과를 요구한다.</w:t>
+        <w:t>반복 요청은 같은 항목에 서로 다른 요구를 남길 수 있다. 은색 목걸이를 추가한 뒤 금색으로 바꾸고 다시 제거하도록 요청했다면 마지막 결과에는 목걸이가 없어야 한다. 반면 최초 사진의 모습으로 되돌리라는 요청은 원본에 있던 목걸이를 복원하는 의미이다. 이전 요청을 모두 전달하는 방식에서는 이미지 생성 모델이 이러한 변경 과정을 해석하여 마지막에 유효한 조건을 결정해야 한다. 마지막 요청만 전달하는 방식에서는 앞서 지정한 의상이나 배경이 누락될 수 있다.</w:t>
       </w:r>
     </w:p>
     <w:p>
@@ -137,7 +137,7 @@
         <w:jc w:val="both"/>
       </w:pPr>
       <w:r>
-        <w:t>편집을 반복하는 방법은 입력 이미지의 선택에 따라 나눌 수 있다. 순차 편집은 직전 출력을 다음 편집의 입력으로 사용하므로 앞선 결과를 자연스럽게 이어갈 수 있다. 다만 출력에 생긴 변화도 다음 입력에 포함된다. 원본 기반 재생성은 최초 사진에 현재의 전체 편집 조건을 적용한다. ChatEdit는 원본 이미지를 편집하는 구조를 통해 오류 누적과 속성 망각을 다루었다[2]. 본 연구의 초기 합성 인물 실험에서도 동일한 최종 요구를 적용한 여섯 쌍의 위치 보정 얼굴 지표가 원본 기반 방식에 유리하였다. 이를 바탕으로 최초 사진을 재사용하되, 그 사진에 전달할 편집 조건을 관리하는 문제에 초점을 맞추었다.</w:t>
+        <w:t>입력 이미지의 선택도 반복 편집의 결과에 영향을 준다. 직전 출력을 다시 편집하면 출력에 생긴 얼굴이나 색상의 변화가 다음 입력에 포함된다. 최초 사진에 현재 조건을 적용하는 원본 기반 재생성은 매번 같은 이미지를 참조한다. ChatEdit도 원본 이미지를 편집하는 구조를 통해 오류 누적과 속성 망각을 다루었다[2]. 본 연구의 초기 합성 인물 실험에서 확인한 얼굴 보존 결과를 바탕으로, 원본을 재사용할 때 전달할 편집 조건을 정확하게 구성하는 문제를 연구 대상으로 삼았다.</w:t>
       </w:r>
     </w:p>
     <w:p>
@@ -145,7 +145,7 @@
         <w:jc w:val="both"/>
       </w:pPr>
       <w:r>
-        <w:t>원본을 재사용할 때 이전 요청을 모두 전달하면, 이미지 생성 모델이 대화 전체에서 현재 유효한 요구를 다시 판단해야 한다. 반대로 마지막 요청만 전달하면 앞서 지정한 의상이나 배경이 누락될 수 있다. 따라서 전체 이력과 마지막 문장 사이에서, 지금도 유효한 편집 내용을 명시적으로 표현할 필요가 있다. 본 연구에서는 재킷·상의·핀·목걸이·배경·소품의 값을 각각 저장하고, 새 요청이 들어오면 변경할 항목만 갱신한다. 이렇게 저장한 항목과 값의 집합을 편집 상태라 정의한다. 이미지 생성에는 원본 사진과 현재 편집 상태를 문장으로 변환한 프롬프트를 사용한다.</w:t>
+        <w:t>이를 위해 재킷·상의·핀·목걸이·배경·소품의 값을 각각 저장하고, 새 요청이 들어올 때 해당 항목을 갱신한다. 이 항목과 값의 집합을 편집 상태라 정의한다. 편집 상태는 현재 요구를 직접 표현하지만, 언어 모델이 추출한 변경값을 잘못 저장하면 이후 요청에서도 오류가 이어진다. 예를 들어 목걸이 삭제를 원본 복원으로 해석하거나, 배경 유지 지시를 놓치면 저장된 조건이 사용자의 요구와 달라진다. 인용된 문장을 실제 편집 지시로 적용하는 경우도 같은 문제를 일으킨다.</w:t>
       </w:r>
     </w:p>
     <w:p>
@@ -153,7 +153,7 @@
         <w:jc w:val="both"/>
       </w:pPr>
       <w:r>
-        <w:t>편집 상태를 저장하더라도 새 요청의 의미를 잘못 적용하면 오류가 남는다. 예를 들어 “목걸이를 없애고 배경은 유지하라”는 요청에서 언어 모델이 두 항목을 모두 원본 복원으로 추출하면, 목걸이가 다시 생기거나 배경이 이전과 달라질 수 있다. 캡션에 인용된 편집 문장을 실제 명령으로 적용하는 경우도 구분해야 한다. 상태 갱신에는 속성값의 추출뿐 아니라 지시의 동작, 적용 대상, 실행 여부를 확인하는 절차가 함께 요구된다.</w:t>
+        <w:t>본 연구는 언어 모델의 변경값 추출과 프로그램의 상태 갱신을 분리한다. 모델은 새 요청에서 변경할 항목과 값을 한 번 추출하고, 프로그램은 그 값의 유효성과 요청의 동작·적용 범위를 검사한다. 삭제·원본 복원·유지를 서로 다른 처리로 정의하고, 부정문·조건문·명시된 인용문을 즉시 실행할 지시와 구분한다. 갱신된 상태는 현재 조건만 포함한 프롬프트로 변환하여 최초 사진에 적용한다.</w:t>
       </w:r>
     </w:p>
     <w:p>
@@ -161,7 +161,7 @@
         <w:jc w:val="both"/>
       </w:pPr>
       <w:r>
-        <w:t>본 연구는 언어 모델이 한 번 추출한 변경 사항에 코드로 작성한 지시 검사를 적용하는 방법을 제안한다. 삭제는 대상의 부재로, 원본 복원은 최초 사진의 모습으로, 유지는 직전에 저장된 값의 보존으로 처리한다. 또한 지시 구절을 분리하고, 부정문·조건문·명시된 인용문의 적용 범위를 확인한다. 언어 모델은 변경 사항을 추출하고, 프로그램은 저장된 상태에 이를 반영하는 역할을 담당한다. 이 구조에서 별도의 재검토 호출이 정확도에 미치는 영향도 함께 비교한다.</w:t>
+        <w:t>연구의 주된 검증 대상은 동일한 추출 응답에 코드 검사를 적용했을 때의 상태 정확도이다. 두 언어 모델에 같은 합성 요청 96개를 입력하고, 첫 응답의 단순 적용, 한 차례 재검토, 지시 검사의 조합을 비교한다. 실제 인물 사진에서는 전체 요청 이력과 저장된 조건을 각각 전달하여 입력 길이와 편집 목표 충족을 분석한다. 이 구성으로 요청 해석 후의 상태 갱신 효과와 이미지 생성 단계의 결과를 연결한다.</w:t>
       </w:r>
     </w:p>
     <w:p>
@@ -169,15 +169,7 @@
         <w:jc w:val="both"/>
       </w:pPr>
       <w:r>
-        <w:t>실험은 편집 상태의 정확도와 이미지 생성 결과를 나누어 평가한다. 먼저 두 언어 모델에 동일한 새 요청 96개를 입력하여 전체 상태와 항목별 일치율을 측정한다. 다음으로 실제 인물 사진에 전체 요청 이력, 검사 전 현재 조건, 지시 검사 후 현재 조건을 각각 적용하여 프롬프트 길이와 생성 결과를 비교한다. 이를 통해 지시 검사가 요청 해석의 오류를 줄이는지, 현재 조건만으로 입력을 구성했을 때 편집 목표와 얼굴 보존 지표가 어떻게 달라지는지 분석한다.</w:t>
-      </w:r>
-    </w:p>
-    <w:p>
-      <w:pPr>
-        <w:jc w:val="both"/>
-      </w:pPr>
-      <w:r>
-        <w:t>본 논문의 구성은 다음과 같다. 2장에서는 자연어 이미지 편집, 대화 상태 추적, 모델 응답의 재검토에 관한 연구를 살펴본다. 3장에서는 편집 상태의 표현과 지시 검사 방법을 설명하고, 4장에서는 실험 자료와 평가 지표를 제시한다. 5장에서는 상태 갱신과 이미지 비교 결과를 분석하며, 6장과 7장에서 결과의 의미와 결론을 기술한다.</w:t>
+        <w:t>2장에서는 자연어 이미지 편집과 대화 상태 갱신에 관한 연구를 살펴본다. 3장은 제안 방법의 처리 절차, 4장은 비교 조건과 평가 지표를 설명한다. 5장은 상태 갱신 및 이미지 비교 결과를 제시하고, 6장과 7장은 결과의 해석과 결론을 기술한다.</w:t>
       </w:r>
     </w:p>
     <w:p>
@@ -201,7 +193,7 @@
         <w:jc w:val="both"/>
       </w:pPr>
       <w:r>
-        <w:t>InstructPix2Pix는 입력 이미지와 편집 지시를 이용하여 수정된 이미지를 생성하는 조건부 확산 모델이다[1]. 언어 모델과 이미지 생성 모델로 편집 예제를 합성하고, 이를 이용해 자연어 지시를 따르는 편집 모델을 학습한다. 이 연구는 사용자가 목표 이미지 전체를 묘사하는 대신, 현재 이미지에 가할 변화를 문장으로 제시하는 방식을 다룬다.</w:t>
+        <w:t>InstructPix2Pix는 입력 이미지와 편집 지시를 조건으로 수정된 이미지를 생성하는 확산 모델이다[1]. 언어 모델과 이미지 생성 모델을 이용해 편집 예제를 합성하고, 이를 바탕으로 지시에 따른 이미지 변환을 학습한다. 목표 이미지 전체를 새로 기술하는 대신 현재 이미지에 가할 변화를 문장으로 지정한다는 점에서 대화형 편집의 기반이 된다.</w:t>
       </w:r>
     </w:p>
     <w:p>
@@ -209,7 +201,7 @@
         <w:jc w:val="both"/>
       </w:pPr>
       <w:r>
-        <w:t>실제 편집 요청의 다양성을 평가하기 위한 자료도 제안되었다. MagicBrush는 원본 이미지·편집 지시·목표 이미지로 이루어진 수작업 주석 자료이며, 한 차례의 편집과 여러 차례 이어지는 편집을 포함한다[3]. 자연어 이미지 편집을 평가할 때에는 생성 결과가 지시한 변화를 반영하는지와 원본의 다른 내용을 얼마나 보존하는지를 함께 살펴야 한다. 본 연구에서도 요청 충족 평가와 얼굴 보존 지표를 나누어 측정한다.</w:t>
+        <w:t>MagicBrush는 원본 이미지, 편집 지시, 목표 이미지로 구성된 수작업 주석 자료를 제시하였다[3]. 한 차례의 편집과 여러 차례 이어지는 편집을 포함하여 자연어 요청에 따른 이미지 변화를 평가한다. 이러한 편집 과제에서는 지시한 변화의 반영과 원본 내용의 보존이 함께 고려된다. 의상을 바꾸는 요청을 충족하더라도 얼굴이 달라질 수 있으므로, 요청 충족과 얼굴 보존은 별도의 기준으로 측정할 필요가 있다.</w:t>
       </w:r>
     </w:p>
     <w:p>
@@ -217,7 +209,7 @@
         <w:jc w:val="both"/>
       </w:pPr>
       <w:r>
-        <w:t>앞의 연구들은 이미지와 지시를 연결하는 학습 및 평가의 기반을 제공한다. 본 연구는 이 중 이미지 생성에 앞서 입력 지시를 구성하는 과정에 초점을 둔다. 사용자의 요청을 항목별로 저장한 뒤 마지막에 유효한 조건만 전달함으로써, 이미 취소된 값과 유지할 값을 구분한다. 따라서 비교 대상은 편집 모델의 학습 방식보다, 같은 원본에 제공하는 세 가지 입력 방식이다.</w:t>
+        <w:t>이미지 편집 모델에 전달하는 지시는 단일 변경 문장일 수도 있고, 여러 요청을 반영한 최종 조건일 수도 있다. 여러 요청이 누적되면 어느 값을 현재 조건으로 사용할지 결정하는 단계가 추가된다. 본 연구는 이 입력 구성 과정에 초점을 두며, 같은 원본 사진에 전달하는 조건의 정확성과 길이를 평가한다.</w:t>
       </w:r>
     </w:p>
     <w:p>
@@ -233,7 +225,7 @@
         <w:jc w:val="both"/>
       </w:pPr>
       <w:r>
-        <w:t>ChatEdit는 얼굴 이미지 편집을 위한 대화 자료와, 대화 처리 모듈 및 이미지 편집 모듈로 구성된 구조를 제안하였다[2]. 대화 처리 모듈은 전체 이력에서 현재 요청을 추적하고 응답을 생성하며, 이미지 편집 모듈은 추적한 요구를 최초 이미지에 적용한다. 직전 출력 대신 최초 이미지를 사용하는 설계는 반복 편집 중의 오류 누적과 속성 망각을 다루기 위한 것이다.</w:t>
+        <w:t>ChatEdit는 얼굴 이미지 편집을 위한 대화 자료와 대화 처리 및 이미지 편집 모듈을 제안하였다[2]. 대화 처리 모듈은 전체 이력에서 현재 요구를 추적하고 응답을 생성하며, 이미지 편집 모듈은 추적한 요구를 최초 이미지에 적용한다. 최초 이미지를 재사용하는 설계는 반복 편집 중의 오류 누적과 속성 망각을 다루기 위한 것이다.</w:t>
       </w:r>
     </w:p>
     <w:p>
@@ -241,7 +233,7 @@
         <w:jc w:val="both"/>
       </w:pPr>
       <w:r>
-        <w:t>이 구조는 대화에서 얻은 요구와 이미지 편집을 연결한다는 점에서 본 연구와 관련된다. 본 연구에서도 최초 사진을 재사용하고, 이미지 생성에 필요한 조건을 언어 처리 단계에서 관리한다. 여기서 검증하는 문제는 원본 재사용 자체보다, 저장된 조건에 새 요청을 반영할 때 발생하는 삭제·복원·유지의 혼동이다. 동일한 추출 응답에 지시 검사를 적용한 경우와 적용하지 않은 경우를 비교하여 이 처리의 효과를 살핀다.</w:t>
+        <w:t>대화의 요구를 추적한 뒤 원본을 편집하는 구조에서는, 생성 모듈에 전달할 조건이 정확해야 한다. 특히 같은 항목을 여러 번 바꾸는 대화는 마지막 변경값뿐 아니라 앞선 값을 유지하는지, 제거하는지, 원본으로 되돌리는지도 구분해야 한다. 예를 들어 ‘목걸이 없음’과 ‘원본 목걸이’는 원본 사진에 목걸이가 있는 경우 서로 다른 조건이다.</w:t>
       </w:r>
     </w:p>
     <w:p>
@@ -249,7 +241,7 @@
         <w:jc w:val="both"/>
       </w:pPr>
       <w:r>
-        <w:t>본 연구의 편집 상태는 지정한 여섯 항목의 값을 명시적으로 저장한다. 따라서 오류를 추적할 때 이미지의 인상만으로 판단하는 대신, 어느 요청에서 어떤 항목이 정답과 달라졌는지 확인할 수 있다. 생성된 이미지의 편집 목표 충족 여부는 이 상태 평가와 별도로 분석한다.</w:t>
+        <w:t>본 연구는 원본 기반 편집 구조 안에서 변경값을 저장하는 절차를 구체화한다. 지정한 항목의 상태를 명시적으로 유지하고, 추출 응답에 지시 검사를 적용한 경우와 단순 적용한 경우를 비교한다. 이를 통해 어느 요청에서 어떤 항목이 달라졌는지 상태 수준에서 확인하고, 그 상태를 이용한 생성 결과를 분석한다.</w:t>
       </w:r>
     </w:p>
     <w:p>
@@ -265,7 +257,7 @@
         <w:jc w:val="both"/>
       </w:pPr>
       <w:r>
-        <w:t>대화 상태 추적은 대화 중에 나타난 사용자의 목표를 항목과 값으로 유지하는 과제이다. SOM-DST는 대화 상태를 고정된 크기의 메모리로 보고, 항목별 갱신 동작을 예측한 뒤 필요한 값만 생성하는 방법을 제안하였다[4]. 전체 상태를 매번 새로 생성하는 대신 변경할 부분을 선택하여 갱신한다는 점이 특징이다. 이 연구는 상태 갱신 동작의 정확도가 최종 상태 추적 성능과 연결됨을 분석하였다.</w:t>
+        <w:t>대화 상태 추적은 대화에 나타난 사용자의 목표를 항목과 값으로 유지하는 과제이다. SOM-DST는 대화 상태를 고정된 크기의 메모리로 표현하고, 항목별 갱신 동작을 예측한 뒤 필요한 값만 생성하는 방법을 제안하였다[4]. 전체 상태를 매번 새로 생성하는 대신 변경할 부분을 선택하는 구조이며, 갱신 동작의 정확도가 상태 추적 성능에 미치는 영향을 분석하였다.</w:t>
       </w:r>
     </w:p>
     <w:p>
@@ -273,7 +265,7 @@
         <w:jc w:val="both"/>
       </w:pPr>
       <w:r>
-        <w:t>인물 이미지 편집에서도 새 요청에 언급되지 않은 속성은 직전 값을 유지하고, 변경 대상만 갱신해야 한다. 본 연구는 이러한 선택적 갱신의 관점을 적용하여 언어 모델이 새 요청의 변경 사항만 추출하도록 구성한다. 다만 대상은 인물 편집을 위한 제한된 속성이며, 삭제·원본 복원·유지는 각각 ‘없음’·‘원본’·‘직전 값 보존’으로 정의한다. 예를 들어 같은 목걸이를 대상으로 하더라도 제거하는 동작과 원본의 목걸이로 되돌리는 동작을 상태값에서 구분한다.</w:t>
+        <w:t>인물 편집에서도 새 요청이 지정한 속성은 바꾸고 나머지는 유지해야 한다. 다만 편집 상태에는 최초 사진을 참조하는 원본 복원과 직전 저장값을 참조하는 유지가 함께 존재한다. 따라서 값의 추출과 함께 참조 시점 및 적용 대상을 정해야 한다. “목걸이를 원본으로 돌리되 배경은 유지하라”는 요청에서는 복원과 유지가 서로 다른 항목에 적용된다.</w:t>
       </w:r>
     </w:p>
     <w:p>
@@ -281,7 +273,7 @@
         <w:jc w:val="both"/>
       </w:pPr>
       <w:r>
-        <w:t>변경 사항을 구조화된 값으로 얻는 것만으로는 지시의 적용 범위가 결정되지 않는다. “목걸이를 원본으로 돌리되 배경은 유지하라”는 문장에서는 복원과 유지가 서로 다른 항목에 적용되어야 한다. 이에 본 연구는 항목별 상태 저장에 지시 구절의 분리와 적용 대상 검사를 결합한다. 이 과정을 통해 값 추출의 오류와 저장 상태의 갱신 오류를 구분하여 분석한다.</w:t>
+        <w:t>본 연구는 선택적 상태 갱신의 관점에서 언어 모델이 변경할 항목만 추출하도록 구성한다. 이후 코드가 허용된 값과 요청의 어휘를 확인하고, 삭제·복원·유지의 대상을 검사한다. 상태 표현과 검사 범위를 여섯 편집 항목으로 정하여, 값 추출과 상태 반영 과정에서 발생한 오류를 추적한다.</w:t>
       </w:r>
     </w:p>
     <w:p>
@@ -297,7 +289,7 @@
         <w:jc w:val="both"/>
       </w:pPr>
       <w:r>
-        <w:t>Self-Refine은 모델이 생성한 첫 응답에 대해 스스로 피드백을 만들고, 이를 이용해 응답을 반복 수정하는 방법이다[5]. 추가 학습 없이 생성·피드백·수정을 수행하며, 여러 언어 과제에서 응답 개선을 평가하였다. 이러한 접근은 첫 응답에 오류가 있을 때 같은 모델의 재검토를 이용하는 비교 조건의 배경이 된다.</w:t>
+        <w:t>Self-Refine은 모델이 생성한 첫 응답에 대해 스스로 피드백을 만들고 이를 이용해 응답을 반복 수정하는 방법이다[5]. 추가 학습 없이 생성·피드백·수정을 수행하며 여러 언어 과제에서 응답 개선을 평가하였다. 첫 응답에 오류가 있을 때 재검토를 이용하는 접근은 편집 상태 추출에도 적용할 수 있다.</w:t>
       </w:r>
     </w:p>
     <w:p>
@@ -305,7 +297,7 @@
         <w:jc w:val="both"/>
       </w:pPr>
       <w:r>
-        <w:t>편집 상태의 갱신에서는 재검토가 변경값을 고치는 동시에, 이미 올바른 항목을 누락하거나 불필요한 변경을 추가할 수도 있다. 따라서 응답을 다시 생성하는 과정과, 생성된 응답을 상태에 적용하기 전에 검사하는 과정을 나누어 비교할 수 있다. 본 연구에서는 한 차례 재검토한 응답을 우선 사용하는 방법과 첫 응답만 사용하는 방법에 동일한 지시 검사를 적용한다. 이는 재검토 응답 선택의 영향과 코드 검사의 영향을 같은 입력에서 비교하기 위한 구성이다.</w:t>
+        <w:t>상태 갱신에서 재검토 응답을 채택하면 잘못된 값을 고칠 수 있지만, 처음에 올바르게 추출한 항목이 누락될 수도 있다. 어느 응답을 저장할지 선택하는 과정이 이후 상태에 영향을 주므로, 호출 횟수와 응답 적용 방식을 함께 비교해야 한다. 본 연구의 재검토 조건은 새 요청과 최초 추출 결과를 다시 입력하여 수정된 JSON을 얻는 한 차례의 절차이다. 같은 최초 응답과 재검토 응답을 비교 조건들이 공유하도록 하여 응답 선택과 코드 검사의 영향을 분석한다.</w:t>
       </w:r>
     </w:p>
     <w:p>
@@ -313,7 +305,7 @@
         <w:jc w:val="both"/>
       </w:pPr>
       <w:r>
-        <w:t>본 연구의 재검토 조건은 새 요청과 첫 추출 결과를 다시 입력하여 수정된 JSON을 얻는 한 차례의 절차이다. 이를 통해 편집 상태 갱신에서 한 차례의 응답 재검토를 사용하는 조건과 첫 응답에 코드 검사를 적용하는 조건의 차이를 분석한다.</w:t>
+        <w:t>이상의 연구를 바탕으로, 본 연구는 반복 인물 편집의 입력을 구성하는 과정에서 추출값과 실행할 지시의 관계를 검증한다. 원본 기반 생성과 항목별 상태 저장을 사용하고, 그 사이의 갱신 단계에 값 검증과 지시 적용 범위 검사를 결합하는 것이 제안 방법의 중심이다.</w:t>
       </w:r>
     </w:p>
     <w:p>
@@ -329,7 +321,7 @@
         <w:pStyle w:val="Heading2"/>
       </w:pPr>
       <w:r>
-        <w:t>1. 편집 상태의 표현과 처리 절차</w:t>
+        <w:t>1. 편집 상태와 전체 처리 구조</w:t>
       </w:r>
     </w:p>
     <w:p>
@@ -337,7 +329,98 @@
         <w:jc w:val="both"/>
       </w:pPr>
       <w:r>
-        <w:t>반복 편집의 입력은 최초 사진, 직전까지 저장한 편집 상태, 새 편집 요청으로 구성한다. 출력은 요청을 반영한 새 상태와 이미지 생성 프롬프트이다. 편집 상태에는 재킷·상의·핀·목걸이·배경·소품의 여섯 항목을 저장한다. 각 값은 지정된 속성, ‘원본’ 또는 제거 가능한 항목의 ‘없음’이다. ‘원본’은 최초 사진의 모습이며, ‘없음’은 대상을 제거한 상태이다. 처음에는 모든 항목을 ‘원본’으로 설정한다.</w:t>
+        <w:t>편집 상태는 재킷·상의·핀·목걸이·배경·소품의 여섯 항목으로 구성한다. 각 항목은 미리 정한 속성값 또는 ‘원본’을 가지며, 제거 가능한 항목에는 ‘없음’을 허용한다. ‘원본’은 최초 사진에 나타난 모습, ‘없음’은 대상의 부재를 뜻한다. 처음에는 모든 항목을 ‘원본’으로 설정하고 요청을 처리할 때마다 상태를 갱신한다.</w:t>
+      </w:r>
+    </w:p>
+    <w:p>
+      <w:pPr>
+        <w:spacing w:after="0" w:before="0" w:line="20" w:lineRule="exact"/>
+        <w:sectPr>
+          <w:type w:val="continuous"/>
+          <w:pgSz w:w="11906" w:h="16838"/>
+          <w:pgMar w:top="1134" w:right="1134" w:bottom="1134" w:left="1134" w:header="720" w:footer="720" w:gutter="0"/>
+          <w:cols w:space="397" w:num="2"/>
+          <w:docGrid w:linePitch="360"/>
+        </w:sectPr>
+      </w:pPr>
+    </w:p>
+    <w:p>
+      <w:pPr>
+        <w:keepNext/>
+        <w:spacing w:line="240" w:lineRule="auto"/>
+        <w:ind w:firstLine="0"/>
+        <w:jc w:val="center"/>
+      </w:pPr>
+      <w:r>
+        <w:drawing>
+          <wp:inline xmlns:a="http://schemas.openxmlformats.org/drawingml/2006/main" xmlns:pic="http://schemas.openxmlformats.org/drawingml/2006/picture">
+            <wp:extent cx="5760000" cy="1691429"/>
+            <wp:docPr id="1" name="Picture 1" descr="그림 1 변경 내용 추출과 지시 검사를 이용한 편집 조건 구성"/>
+            <wp:cNvGraphicFramePr>
+              <a:graphicFrameLocks noChangeAspect="1"/>
+            </wp:cNvGraphicFramePr>
+            <a:graphic>
+              <a:graphicData uri="http://schemas.openxmlformats.org/drawingml/2006/picture">
+                <pic:pic>
+                  <pic:nvPicPr>
+                    <pic:cNvPr id="0" name="instruction-pipeline.png"/>
+                    <pic:cNvPicPr/>
+                  </pic:nvPicPr>
+                  <pic:blipFill>
+                    <a:blip r:embed="rId9"/>
+                    <a:stretch>
+                      <a:fillRect/>
+                    </a:stretch>
+                  </pic:blipFill>
+                  <pic:spPr>
+                    <a:xfrm>
+                      <a:off x="0" y="0"/>
+                      <a:ext cx="5760000" cy="1691429"/>
+                    </a:xfrm>
+                    <a:prstGeom prst="rect"/>
+                  </pic:spPr>
+                </pic:pic>
+              </a:graphicData>
+            </a:graphic>
+          </wp:inline>
+        </w:drawing>
+      </w:r>
+    </w:p>
+    <w:p>
+      <w:pPr>
+        <w:pStyle w:val="Caption"/>
+        <w:ind w:firstLine="0"/>
+      </w:pPr>
+      <w:r>
+        <w:t>그림 1 변경 내용 추출과 지시 검사를 이용한 편집 조건 구성</w:t>
+      </w:r>
+    </w:p>
+    <w:p>
+      <w:pPr>
+        <w:spacing w:after="0" w:before="0" w:line="20" w:lineRule="exact"/>
+        <w:sectPr>
+          <w:type w:val="continuous"/>
+          <w:pgSz w:w="11906" w:h="16838"/>
+          <w:pgMar w:top="1134" w:right="1134" w:bottom="1134" w:left="1134" w:header="720" w:footer="720" w:gutter="0"/>
+          <w:cols w:space="397" w:num="1"/>
+          <w:docGrid w:linePitch="360"/>
+        </w:sectPr>
+      </w:pPr>
+    </w:p>
+    <w:p>
+      <w:pPr>
+        <w:jc w:val="both"/>
+      </w:pPr>
+      <w:r>
+        <w:t>그림 1은 전체 처리 구조이다. 언어 모델에는 새 요청과 고정된 지침·예시를 입력한다. 모델은 변경할 항목과 값을 JSON으로 반환한다. 직전 편집 상태는 코드 검사 단계에서 참조하며, 모델의 입력에는 포함하지 않는다. 프로그램은 요청에 대한 추출 응답을 검사하여 상태를 갱신하고, 그 결과를 이미지 생성 프롬프트로 변환한다.</w:t>
+      </w:r>
+    </w:p>
+    <w:p>
+      <w:pPr>
+        <w:pStyle w:val="Heading2"/>
+      </w:pPr>
+      <w:r>
+        <w:t>2. 추출값과 지시 적용 범위의 검사</w:t>
       </w:r>
     </w:p>
     <w:p>
@@ -345,7 +428,31 @@
         <w:jc w:val="both"/>
       </w:pPr>
       <w:r>
-        <w:t>상태 갱신은 변경 사항 추출, 값 검증, 지시 검사, 프롬프트 작성의 순서로 수행한다. 요청을 받으면 언어 모델이 변경할 항목과 값을 JSON 형식의 변경 목록으로 한 번 추출한다. 프로그램은 허용된 값을 항목별로 검사하고, 직전 상태를 복사한 뒤 변경 사항을 반영한다. 이어서 현재 요청의 삭제·복원·유지 대상과 실행할 지시를 확인한다. 최종 상태와 적용 근거를 저장하고, 현재 조건을 문장으로 바꾸어 원본 사진과 함께 이미지 생성 도구에 전달한다.</w:t>
+        <w:t>프로그램은 지원 문형을 정규화한 요청을 검사에 사용한다. 추출 응답의 중복 키, 항목 이름, 허용값과 요청 내 근거 어휘를 확인한다. 직전 값과 같은 변경은 제외하며, 남은 변경 중 하나라도 유효하지 않으면 해당 응답 전체를 적용하지 않는다. 사용할 수 있는 응답의 변경 내용을 직전 상태의 사본에 반영한 뒤, 삭제·원본 복원·유지 및 실행 대상 규칙을 적용한다. 응답이 거부된 경우에도 이 규칙으로 확인한 지시는 처리한다.</w:t>
+      </w:r>
+    </w:p>
+    <w:p>
+      <w:pPr>
+        <w:jc w:val="both"/>
+      </w:pPr>
+      <w:r>
+        <w:t>삭제는 대상을 ‘없음’으로, 원본 복원은 ‘원본’으로 바꾼다. 유지는 모델의 추출값을 적용하기 전의 상태를 보존한다. 이 처리는 요청의 동사와 항목 이름을 대응시켜 수행한다. 예를 들어 목걸이 삭제와 배경 유지가 함께 등장하면 목걸이만 제거하고 직전 배경을 남긴다. keep the necklace off처럼 부재를 지정한 구절은 단순 유지와 구분한다.</w:t>
+      </w:r>
+    </w:p>
+    <w:p>
+      <w:pPr>
+        <w:jc w:val="both"/>
+      </w:pPr>
+      <w:r>
+        <w:t>하나의 문장에 여러 동작이 있으면 지시 구절을 분리한다. 복원 지시 뒤의 leaving·preserving 구절을 유지 지시로 해석하고, 지원하는 bring back 및 source photo 표현을 표준 복원 표현으로 바꾼다. 이를 구절 정규화라 한다. 적용 범위가 명확한 어휘와 문형을 대상으로 하며, 인용부호가 포함된 요청은 인용 내용의 변형을 피하도록 이 정규화를 생략한다.</w:t>
+      </w:r>
+    </w:p>
+    <w:p>
+      <w:pPr>
+        <w:jc w:val="both"/>
+      </w:pPr>
+      <w:r>
+        <w:t>마지막으로 부정문, if를 포함한 조건문, 캡션이나 인용문으로 명시된 부분을 검사한다. 항목의 마지막 언급이 해당 범위에 있으면 직전 값을 보존한다. 같은 항목의 직접 지시가 그 뒤에 나오면 직접 지시를 따른다. 부정 구절의 범위는 다음 동작 지시가 시작되는 곳에서 끝난다. 조건문은 조건의 충족 여부와 관계없이 즉시 실행을 보류하도록 정의하였다. 유지 지시도 직전 저장값을 기준으로 처리하며, 유지 구절에 속성값이 함께 쓰여 있어도 직전 값을 우선한다. 이 두 규칙은 본 실험에서 사용하는 상태 갱신 정책이다.</w:t>
       </w:r>
     </w:p>
     <w:p>
@@ -353,7 +460,7 @@
         <w:pStyle w:val="Heading2"/>
       </w:pPr>
       <w:r>
-        <w:t>2. 삭제·복원·유지 검사</w:t>
+        <w:t>3. 실제 요청의 처리 예</w:t>
       </w:r>
     </w:p>
     <w:p>
@@ -361,7 +468,7 @@
         <w:jc w:val="both"/>
       </w:pPr>
       <w:r>
-        <w:t>삭제는 대상을 ‘없음’으로 바꾸고, 복원은 ‘원본’으로 바꾼다. 유지는 모델 응답을 적용하기 전의 값을 보존한다. 직전 배경이 파란색인 상태에서 배경 유지와 목걸이 삭제를 요청했다면, 모델이 두 항목을 모두 ‘원본’으로 추출해도 배경은 파란색, 목걸이는 ‘없음’으로 보정한다.</w:t>
+        <w:t>96개 요청의 검증 자료에서 다음 요청에 대한 Qwen3의 응답을 살펴본다. 요청은 ‘Quoted text: "Restore the beige blazer". Keep the garden background unchanged.’이며, 직전 상태에는 베이지색 재킷과 정원 배경이 저장되어 있었다. 모델은 재킷을 ‘원본’, 배경을 ‘유지’로 추출하였다. 이 응답을 단순 적용하면 인용된 복원 문장 때문에 재킷이 원본으로 바뀐다.</w:t>
       </w:r>
     </w:p>
     <w:p>
@@ -369,7 +476,7 @@
         <w:jc w:val="both"/>
       </w:pPr>
       <w:r>
-        <w:t>지시 동사와 항목 이름을 확인하여 적용 범위를 나눈다. 원본 복원 뒤의 leaving·preserving 구절은 유지 지시로 분리하고, bring back이나 source photo를 포함한 지원 표현은 표준 복원 지시로 바꾼다. 이 처리를 구절 정규화라 한다. keep the necklace off처럼 값 변경을 뜻하는 구절은 단순 유지로 처리하지 않는다. 검사에는 지정한 어휘와 문형을 사용하고, 나머지 변경은 모델의 추출 결과를 따른다.</w:t>
+        <w:t>제안 방법은 재킷의 마지막 언급이 명시된 인용 범위에 있음을 확인하여 직전 값인 베이지색을 보존한다. 배경은 직접적인 유지 지시에 따라 정원으로 남는다. 상의·핀·목걸이·소품도 직전 값을 이어받아 여섯 항목이 모두 정답과 일치하였다. 이 사례는 추출 응답의 형식이 올바르더라도 실제로 실행할 지시인지 확인하는 과정이 필요함을 보여준다.</w:t>
       </w:r>
     </w:p>
     <w:p>
@@ -377,7 +484,7 @@
         <w:pStyle w:val="Heading2"/>
       </w:pPr>
       <w:r>
-        <w:t>3. 현재 실행할 지시의 구분</w:t>
+        <w:t>4. 응답 선택과 이미지 생성</w:t>
       </w:r>
     </w:p>
     <w:p>
@@ -385,7 +492,7 @@
         <w:jc w:val="both"/>
       </w:pPr>
       <w:r>
-        <w:t>부정 동작, if가 포함된 조건문, 캡션이나 인용문이라고 명시한 문장의 인용 범위를 검사한다. 항목의 마지막 언급이 이 범위 안에 있으면 직전 값을 보존한다. 같은 항목에 대한 직접 지시가 뒤에 나오면 그 지시를 적용한다. 부정 구절의 범위는 다음 동작 지시가 시작되는 곳에서 끝난다.</w:t>
+        <w:t>비교 실험에서는 첫 응답만 사용하는 조건과 한 차례 재검토한 응답을 우선 사용하는 조건을 구성한다. 재검토를 사용하는 경우에는 재검토 응답을 먼저 검사하고, 사용할 수 없으면 최초 응답을 확인한다. 두 응답의 값을 합치는 방식이 아니라 응답 후보의 선택 순서를 달리한 비교이다. 제안 방법은 최초 응답 하나에 값 검증과 지시 검사를 적용하므로 요청당 모델 호출 한 번이 필요하다.</w:t>
       </w:r>
     </w:p>
     <w:p>
@@ -393,31 +500,7 @@
         <w:jc w:val="both"/>
       </w:pPr>
       <w:r>
-        <w:t>예를 들어 캡션 속 “Remove the pin”은 핀 삭제로 적용하지 않지만, 뒤에서 실제로 핀을 삭제하라고 요청하면 삭제한다. 다른 항목의 직접 변경도 함께 반영한다. 검사 결과에는 적용 항목과 근거 구절을 남긴다.</w:t>
-      </w:r>
-    </w:p>
-    <w:p>
-      <w:pPr>
-        <w:pStyle w:val="Heading2"/>
-      </w:pPr>
-      <w:r>
-        <w:t>4. 응답 선택과 프롬프트 작성</w:t>
-      </w:r>
-    </w:p>
-    <w:p>
-      <w:pPr>
-        <w:jc w:val="both"/>
-      </w:pPr>
-      <w:r>
-        <w:t>응답 선택과 지시 검사의 영향을 구분하기 위해 모델 응답의 수와 검사 적용 여부를 달리한다. 개발 단계의 기준 방법은 변경 사항 추출과 한 차례 재검토에 모델을 두 번 호출한다. 비교 조건은 첫 응답만 단순 적용하는 방법, 유효한 재검토 응답을 우선 적용하는 방법, 두 응답에 지시 검사를 결합하는 방법, 첫 응답에만 검사를 결합하는 제안 방법이다. 같은 요청에서 얻은 응답을 공유하여 응답 선택과 후처리의 차이를 비교한다.</w:t>
-      </w:r>
-    </w:p>
-    <w:p>
-      <w:pPr>
-        <w:jc w:val="both"/>
-      </w:pPr>
-      <w:r>
-        <w:t>프롬프트에는 저장된 현재 조건만 적는다. 변경된 이전 값과 취소한 조건을 지우고, 얼굴·표정·자세·인물 조명·카메라 구도에 대한 공통 보존 문구를 붙인다. 원본 사진에서 생성하므로 ‘원본’인 항목은 최초 사진의 모습을 유지하도록 기술한다. 지시 검사는 코드로 수행하며 제안 방법의 모델 호출은 요청당 한 번이다.</w:t>
+        <w:t>최종 프롬프트에는 항목별로 저장한 현재 조건을 적고, 얼굴·표정·자세·인물 조명·카메라 구도를 보존하도록 공통 문구를 붙인다. ‘원본’인 항목은 최초 사진의 모습을 따르도록 기술한다. 이미지 생성에는 이 프롬프트와 최초 사진을 함께 전달한다. 따라서 앞선 요청에서 취소되거나 대체된 값은 다음 생성의 입력에 남지 않는다.</w:t>
       </w:r>
     </w:p>
     <w:p>
@@ -433,7 +516,7 @@
         <w:pStyle w:val="Heading2"/>
       </w:pPr>
       <w:r>
-        <w:t>1. 실험 자료와 비교 조건</w:t>
+        <w:t>1. 비교 조건과 실험 자료</w:t>
       </w:r>
     </w:p>
     <w:p>
@@ -441,7 +524,7 @@
         <w:jc w:val="both"/>
       </w:pPr>
       <w:r>
-        <w:t>실험은 원본 기반 구성의 얼굴 보존 비교, 편집 상태 갱신의 정확도 평가, 실제 인물의 이미지 생성 비교로 구성하였다. 원본 기반 구성의 비교에는 합성 인물 6명에게 동일한 순서의 편집 10단계를 적용한 자료를 사용하였다. 순차 편집은 직전 출력에, 원본 기반 재생성은 최초 사진에 같은 최종 요구를 적용한다. 얼굴·표정·자세와 인물 조명은 유지하도록 요청하였다. 출력 크기는 1024×1536이며 순차 출력 60장과 원본 기반 최종 출력 6장을 분석하였다.</w:t>
+        <w:t>주 실험은 동일한 추출 응답에 대한 상태 갱신 방식을 비교한다. 첫 응답 단순 적용, 재검토 응답 우선 적용, 추출·재검토와 검사 결합, 한 번 추출과 검사 결합의 네 조건을 사용하였다. Qwen3-4B와 Llama-3.2-3B-Instruct[6,7]의 4비트 양자화 모델에 온도 0, 최대 출력 260토큰, 공통 예시 7개를 적용하였다. 비교 조건들은 저장된 최초·재검토 응답을 공유하고, 각 조건에서 갱신한 상태를 다음 요청으로 이어갔다.</w:t>
       </w:r>
     </w:p>
     <w:p>
@@ -449,7 +532,7 @@
         <w:jc w:val="both"/>
       </w:pPr>
       <w:r>
-        <w:t>상태 갱신 실험에는 AI를 이용해 작성한 합성 영어 대화를 사용하였다. 정답은 대화 작성 시 정한 항목별 변경을 초기 상태에 순서대로 적용하여 계산하였다. 개발 자료로 규칙을 수정한 뒤, 코드·요청·정답·모델 설정을 고정하고 별도의 대화로 검증하였다. 앞선 비교는 세 대화의 서로 다른 요청 12개이며 Qwen3-4B와 Llama-3.2-3B-Instruct[6,7]에 같은 요청을 입력하였다. 모두 4비트 양자화 모델이고 온도 0, 최대 출력 260토큰, 공통 예시 7개를 사용하였다. 비교용 추출·재검토 응답은 모델별 24개, 총 48개를 저장하였다.</w:t>
+        <w:t>자료는 AI를 이용해 작성한 합성 영어 대화 12개이며, 대화마다 요청 여덟 개를 순서대로 적용하여 총 96개를 평가하였다. 네 가지 표현 틀에 세 가지 속성 조합을 배정하고 초기 설정, 두 항목 변경, 삭제·유지, 복원·유지, 부정 지시, 인용문, 조건문, 인용문 뒤의 직접 지시를 포함하였다. 중간 요청의 순서도 달리하였다. 개발 후 코드·모델 설정·검증 요청·정답을 고정하였으며, 검증 문장은 기존 자료와 중복되지 않는다.</w:t>
       </w:r>
     </w:p>
     <w:p>
@@ -457,7 +540,7 @@
         <w:jc w:val="both"/>
       </w:pPr>
       <w:r>
-        <w:t>주 비교 자료는 코드와 모델 설정을 그대로 고정한 뒤 새 대화 12개에 요청을 여덟 개씩 적용한 96개이다. 네 가지 표현 틀에 세 가지 속성 조합을 배정하고 삭제·복원·유지·부정·인용·조건·뒤 직접 지시를 조합하였다. 조건문·명시된 인용문·부정 지시는 즉시 실행하지 않고, 뒤에 나온 직접 지시를 적용하는 정책으로 정답을 구성하였다. 중간 요청의 순서를 바꾸어 오류가 후속 상태에 미치는 영향도 관찰하였다. 모든 문장은 기존 검증 자료와 중복되지 않으며 정답은 채점에만 사용하였다. 두 모델에 동일한 96개를 각각 입력하여 최초 추출·재검토 응답 총 384개를 저장하였다.</w:t>
+        <w:t>정답은 대화 작성 시 정한 항목별 변경을 초기 상태에 차례로 적용하여 구성하였다. 조건문 보류, 인용문 및 부정 지시의 실행 제외, 직전 값 유지의 정책은 3장의 정의를 따른다. 따라서 전체 상태 일치는 이 정책에 따라 계산한 정답과의 일치이다. 정답은 채점에만 사용하고, 두 모델에 동일한 96개 요청을 각각 입력하여 최초·재검토 응답 384개를 저장하였다. 앞선 기본 검증에는 별도의 세 대화, 요청 12개를 사용하였다.</w:t>
       </w:r>
     </w:p>
     <w:p>
@@ -465,7 +548,7 @@
         <w:jc w:val="both"/>
       </w:pPr>
       <w:r>
-        <w:t>구성요소 검증은 유지·삭제, 지시 구절의 분리, 복원 표현, 부정·조건·인용 지시를 차례로 다룬다. 각 검증에는 그 단계에서 고정한 구현을 적용하였다. 문장 구조 대조의 요청 36개는 서로 다른 문장 18개, 표현·순서 변경의 요청 48개는 서로 다른 문장 32개로 구성하였다. 같은 초기 설정과 후속 요청을 반복한 경우를 독립된 문장으로 세지 않았다. 복합 요청 실험은 별도 구현으로 여섯 항목에 몸 방향·손동작·표정을 더한 아홉 항목을 평가하였다. 요청 조건 세 종류와 목표 구성 네 개의 요청 네 개씩, 총 48개를 사용하였다. Qwen3-4B에 온도 0, 최대 출력 320토큰, 공통 예시 두 개를 적용하였다.</w:t>
+        <w:t>지시 검사 구성요소의 효과는 유지·삭제, 구절 분리, 복원 표현, 실행 대상 검사에 관한 기존 비교에서 분석하였다. 각 비교는 해당 단계의 구현을 고정한 뒤 별도의 대화에 적용하였다. 문장 구조 비교의 요청 36개는 고유 문장 18개, 표현과 순서 변경의 요청 48개는 고유 문장 32개를 포함한다. 표정·포즈 실험은 별도 구현으로 몸 방향·손동작·표정을 더한 아홉 항목을 평가하였다. 요청 조건 세 종류와 목표 구성 네 개에 요청을 네 개씩 적용한 48개이며, Qwen3-4B에 온도 0, 최대 출력 320토큰과 공통 예시 두 개를 사용하였다.</w:t>
       </w:r>
     </w:p>
     <w:p>
@@ -473,7 +556,7 @@
         <w:jc w:val="both"/>
       </w:pPr>
       <w:r>
-        <w:t>실제 인물 원본은 Pexels에 공개된 Monstera Production의 사진 두 장이다[8,9]. R01과 R02를 각각 512×336, 512×768 크기로 입력하였다. 앞선 유지·삭제 이미지 실험은 요청 32개·인물 두 명·두 방법의 128조건이다. 같은 원본과 프롬프트는 이미지를 공유하여 실제 출력은 66장이며, 방법 간 64쌍 중 입력이 다른 경우는 4쌍이다.</w:t>
+        <w:t>입력 이미지 선택의 근거로는 합성 인물 6명에게 같은 10단계 편집을 적용한 초기 자료를 사용하였다. 순차 편집은 직전 출력을 입력으로 사용하고, 원본 기반 방식은 최초 사진에 같은 최종 요구를 적용하였다. 얼굴·표정·자세·인물 조명은 유지하도록 요청하였다. 크기 1024×1536의 순차 출력 60장과 원본 기반 최종 출력 6장을 비교하였다.</w:t>
       </w:r>
     </w:p>
     <w:p>
@@ -481,7 +564,15 @@
         <w:jc w:val="both"/>
       </w:pPr>
       <w:r>
-        <w:t>최종 방법의 이미지 비교에는 기존 세 대화의 마지막 요청을 사용하였다. 전체 요청 이력, Qwen3의 첫 응답을 단순 적용한 현재 조건, 같은 응답에 지시 검사를 적용한 현재 조건을 두 인물에게 각각 적용해 18장을 생성하였다. 모든 조건은 최초 원본에서 생성하고 첫 성공 출력을 보존하였다. 이미지 도구의 내부 모델 버전과 시드는 비공개이다. 정답 상태는 평가에만 사용하였다.</w:t>
+        <w:t>실제 인물 사진은 Pexels에 공개된 Monstera Production의 두 장이다[8,9]. R01과 R02를 각각 512×336, 512×768 크기로 입력하였다. 기존 세 대화의 마지막 요청에 대해 전체 요청 이력, 검사 없이 저장한 조건, 검사 후 저장한 조건을 구성하여 총 18장을 생성하였다. 두 상태 조건은 같은 Qwen3 최초 응답을 사용하였다. 모든 조건은 최초 사진에서 생성하였고 조건별로 정상 생성된 첫 이미지를 사용하였다. 이미지는 내장 imagegen 도구로 생성하였으며, 내부 모델 버전과 시드는 노출되지 않았다.</w:t>
+      </w:r>
+    </w:p>
+    <w:p>
+      <w:pPr>
+        <w:jc w:val="both"/>
+      </w:pPr>
+      <w:r>
+        <w:t>보조 이미지 비교는 유지·삭제 규칙의 요청 32개에 인물 두 명과 두 방법을 적용한 128조건이다. 같은 원본과 프롬프트는 이미지를 공유하여 실제 출력은 66장이며, 방법 간 64쌍 중 입력이 다른 경우는 4쌍이다.</w:t>
       </w:r>
     </w:p>
     <w:p>
@@ -497,7 +588,7 @@
         <w:jc w:val="both"/>
       </w:pPr>
       <w:r>
-        <w:t>전체 상태 일치율은 요청 처리 후 모든 항목이 정답과 일치한 요청의 비율이다. 항목별 일치율은 전체 평가 항목 중 정답과 일치한 비율이며, 최종 상태 일치율은 마지막 요청에서 모든 항목이 맞은 대화의 비율이다. 유지 위반은 직전까지 맞았고 현재 요청에서도 보존해야 하는 값을 잘못 바꾼 횟수이다. 결과는 일치 건수/평가 건수로 표기하고, 같은 대화에 속한 요청의 의존성을 고려하여 건수와 비율을 비교하였다.</w:t>
+        <w:t>전체 상태 일치율은 요청 처리 후 평가 대상 항목이 모두 정답과 일치한 요청의 비율이다. 주 실험은 여섯 항목, 표정·포즈 실험은 아홉 항목을 평가한다. 항목별 일치율은 전체 평가 항목 중 정답과 일치한 비율, 최종 상태 일치율은 마지막 요청에서 모든 항목이 맞은 대화의 비율이다. 유지 위반은 직전까지 맞았고 현재 요청에서도 보존해야 하는 값을 잘못 바꾼 횟수이다. 표에는 일치 건수와 평가 건수를 함께 표시하였다.</w:t>
       </w:r>
     </w:p>
     <w:p>
@@ -505,7 +596,7 @@
         <w:jc w:val="both"/>
       </w:pPr>
       <w:r>
-        <w:t>96개 요청의 주 비교에서는 대화 내 의존성을 고려하여 대화 12개를 단위로 20000회 복원 추출한 정확도 차이의 95% 백분위 구간을 계산하였다. 첫 응답 단순 적용과 제안 방법의 주 비교는 대화별 차이에 대한 4096개 부호 조합의 양측 무작위화 검정으로 분석하고, 두 모델의 p값에 Holm 보정을 적용하였다. 표현 틀을 공유하는 합성 자료 안에서의 변동을 측정하였다.</w:t>
+        <w:t>같은 대화의 요청들은 앞선 상태를 이어받으므로 대화 12개를 단위로 정확도 차이를 분석하였다. 대화를 20000회 복원 추출하여 95% 백분위 구간을 계산하고, 대화별 차이의 4096개 부호 조합을 이용한 양측 무작위화 검정을 수행하였다. 첫 응답 단순 적용과 제안 방법의 비교에 대해 두 모델의 p값에 Holm 보정을 적용하였다. 이 구간과 검정은 표현 틀을 공유하는 합성 자료 안의 변동을 나타낸다.</w:t>
       </w:r>
     </w:p>
     <w:p>
@@ -513,7 +604,7 @@
         <w:jc w:val="both"/>
       </w:pPr>
       <w:r>
-        <w:t>초기 얼굴 지표는 인물별 원본에서 정한 320×360 영역의 MAE·SSIM·LPIPS[10]이다. 원본과 출력의 위치 차이는 NCC로 ±64픽셀 안에서 찾고, 평활화 sigma 3을 주 분석으로 사용하였다. MAE와 LPIPS는 작을수록, SSIM은 클수록 원본에 가깝다. sigma 1과 6도 함께 비교하였다. 원본·출력 해시를 대조하고 저장 지표를 재계산하였다.</w:t>
+        <w:t>초기 얼굴 비교에는 원본에서 정한 320×360 영역의 평균절대오차(MAE), 구조적 유사도(SSIM), 심층 특징 기반 지각적 거리(LPIPS)[10]를 사용하였다. 원본과 출력의 위치 차이는 정규화 상호상관(NCC)으로 ±64픽셀 범위에서 찾고, 평활화 sigma 3을 적용하였다. sigma 1과 6도 함께 확인하였다. MAE와 LPIPS는 낮을수록, SSIM은 높을수록 원본에 가깝다. 실제 인물의 얼굴 코사인 유사도는 InsightFace buffalo_l[11]로 측정하였고 높을수록 특징이 유사하다. 후속 이미지 18장은 얼굴 랜드마크로 각각 112×112에 정렬한 뒤 MAE, SSIM, LPIPS를 계산하였다. 두 이미지 실험은 얼굴 영역과 전처리가 다르므로 각각 해석한다.</w:t>
       </w:r>
     </w:p>
     <w:p>
@@ -521,7 +612,7 @@
         <w:jc w:val="both"/>
       </w:pPr>
       <w:r>
-        <w:t>실제 인물의 얼굴 코사인 유사도는 InsightFace buffalo_l[11]로 측정하였다. 후속 이미지 18장은 랜드마크로 원본과 출력을 각각 112×112로 정렬한 뒤 MAE·SSIM·LPIPS도 계산하였다. 이 수치는 초기 실험의 320×360 영역과 전처리가 다르다.</w:t>
+        <w:t>편집 목표는 Qwen2.5-VL-3B의 4비트 모델[12]이 성공·실패·판단 불가로 한 번 평가하였다. 이미지와 여섯 목표를 입력하고 생성 방식과 프롬프트는 제공하지 않았다. 형식 오류와 판독 불가는 분모에 포함하되 성공으로 집계하지 않았다. 3B 응답의 오류를 관찰한 뒤 같은 이미지·목표 전체를 Qwen2.5-VL-7B로 사후 평가하였다. 두 평가의 원문과 점수는 각각 기록하였다.</w:t>
       </w:r>
     </w:p>
     <w:p>
@@ -529,15 +620,7 @@
         <w:jc w:val="both"/>
       </w:pPr>
       <w:r>
-        <w:t>편집 목표는 Qwen2.5-VL-3B의 4비트 모델[12]이 성공·실패·판단 불가로 한 번 평가하였다. 입력은 이미지와 여섯 목표이며 생성 방식과 프롬프트는 제공하지 않았다. 형식 오류와 판독 불가는 분모에 남기고 성공에서 제외하였다. 3B 응답의 오류를 관찰한 뒤 같은 이미지·목표 전체를 Qwen2.5-VL-7B로 사후 평가하였다. 두 평가의 원문과 점수를 각각 보존하였다.</w:t>
-      </w:r>
-    </w:p>
-    <w:p>
-      <w:pPr>
-        <w:jc w:val="both"/>
-      </w:pPr>
-      <w:r>
-        <w:t>프롬프트 길이는 공통 보존 문구를 포함한 문자열의 문자 수·단어 수·고정 Qwen3 토크나이저의 토큰 수이다. 세 대화에서 요청이 추가될 때마다 총 12개 묶음을 측정하였다. 모델 호출 수는 상태 갱신에 필요한 횟수이며, 시간과 요금은 측정하지 않았다.</w:t>
+        <w:t>프롬프트 길이는 공통 보존 문구를 포함한 문자열의 문자 수·단어 수·고정 Qwen3 토크나이저의 토큰 수로 측정하였다. 세 대화에서 요청이 추가될 때마다 총 12개 묶음을 비교하였다. 모델 호출 수는 상태 갱신에 필요한 횟수이다.</w:t>
       </w:r>
     </w:p>
     <w:p>
@@ -553,7 +636,7 @@
         <w:jc w:val="both"/>
       </w:pPr>
       <w:r>
-        <w:t>요청·정답·모델 응답, 생성 이미지와 실행 설정은 연구 저장소에 공개하였다. 개발 자료의 재계산과 새 대화 검증은 실험별로 구분하였다. 코드로 구성한 상태 검사 1323개를 수행하였다. 기존 저장 응답 24개와 추가 검증의 첫 응답 192개를 실제 실행 코드에 재생하여 상태 갱신과 프롬프트 작성도 대조하였다.</w:t>
+        <w:t>요청·정답·모델 응답, 생성 이미지, 실행 설정과 비교별 상세 결과는 연구 저장소에 공개하였다. 코드로 구성한 상태 검사 1323개를 수행하고, 기존 저장 응답 24개 및 주 검증의 첫 응답 192개를 실제 실행 코드에 재생하여 실험 구현과 대조하였다. 이 검사는 구현의 일치 여부를 확인한 것이다.</w:t>
       </w:r>
     </w:p>
     <w:p>
@@ -571,7 +654,7 @@
         <w:pStyle w:val="Heading1"/>
       </w:pPr>
       <w:r>
-        <w:t>V. 결과</w:t>
+        <w:t>V. 실험 결과</w:t>
       </w:r>
     </w:p>
     <w:p>
@@ -579,7 +662,7 @@
         <w:pStyle w:val="Heading2"/>
       </w:pPr>
       <w:r>
-        <w:t>1. 입력 이미지 선택에 따른 얼굴 보존</w:t>
+        <w:t>1. 상태 갱신의 정확도</w:t>
       </w:r>
     </w:p>
     <w:p>
@@ -587,7 +670,7 @@
         <w:jc w:val="both"/>
       </w:pPr>
       <w:r>
-        <w:t>순차 편집의 위치 보정 LPIPS 평균은 1단계 0.042116, 5단계 0.173505, 10단계 0.364015였다. 같은 최종 요구를 적용한 원본 기반 결과와의 비교는 표 1과 같다.</w:t>
+        <w:t>표 1은 96개 요청에서 응답 선택과 지시 검사 적용 여부를 비교한 결과이다. 첫 응답을 단순 적용하면 Qwen3는 52/96, Llama는 27/96이었으며, 같은 최초 응답에 검사를 적용한 제안 방법은 각각 96/96과 93/96이었다. 별도의 기본 검증 요청 12개에서도 첫 응답 단순 적용은 두 모델 모두 3/12, 제안 방법은 모두 12/12였다.</w:t>
       </w:r>
     </w:p>
     <w:p>
@@ -599,613 +682,7 @@
         <w:jc w:val="center"/>
       </w:pPr>
       <w:r>
-        <w:t>표 1. 원본 기반 재생성과 순차 편집의 위치 보정 LPIPS</w:t>
-      </w:r>
-    </w:p>
-    <w:tbl>
-      <w:tblPr>
-        <w:tblW w:type="auto" w:w="0"/>
-        <w:tblLayout w:type="fixed"/>
-        <w:tblLook w:firstColumn="1" w:firstRow="1" w:lastColumn="0" w:lastRow="0" w:noHBand="0" w:noVBand="1" w:val="04A0"/>
-      </w:tblPr>
-      <w:tblGrid>
-        <w:gridCol w:w="1417"/>
-        <w:gridCol w:w="1602"/>
-        <w:gridCol w:w="1602"/>
-      </w:tblGrid>
-      <w:tr>
-        <w:trPr>
-          <w:cantSplit/>
-          <w:tblHeader/>
-        </w:trPr>
-        <w:tc>
-          <w:tcPr>
-            <w:tcW w:type="dxa" w:w="1417"/>
-            <w:tcMar>
-              <w:left w:w="45" w:type="dxa"/>
-              <w:right w:w="45" w:type="dxa"/>
-            </w:tcMar>
-            <w:tcBorders>
-              <w:bottom w:val="single" w:sz="5"/>
-            </w:tcBorders>
-          </w:tcPr>
-          <w:p>
-            <w:pPr>
-              <w:keepNext/>
-              <w:spacing w:after="60" w:before="60" w:line="240" w:lineRule="auto"/>
-              <w:ind w:firstLine="0"/>
-              <w:jc w:val="left"/>
-            </w:pPr>
-            <w:r>
-              <w:rPr>
-                <w:b/>
-                <w:sz w:val="16"/>
-              </w:rPr>
-              <w:t>인물</w:t>
-            </w:r>
-          </w:p>
-        </w:tc>
-        <w:tc>
-          <w:tcPr>
-            <w:tcW w:type="dxa" w:w="1602"/>
-            <w:tcMar>
-              <w:left w:w="45" w:type="dxa"/>
-              <w:right w:w="45" w:type="dxa"/>
-            </w:tcMar>
-            <w:tcBorders>
-              <w:bottom w:val="single" w:sz="5"/>
-            </w:tcBorders>
-          </w:tcPr>
-          <w:p>
-            <w:pPr>
-              <w:keepNext/>
-              <w:spacing w:after="60" w:before="60" w:line="240" w:lineRule="auto"/>
-              <w:ind w:firstLine="0"/>
-              <w:jc w:val="center"/>
-            </w:pPr>
-            <w:r>
-              <w:rPr>
-                <w:b/>
-                <w:sz w:val="16"/>
-              </w:rPr>
-              <w:t>순차 편집</w:t>
-            </w:r>
-          </w:p>
-        </w:tc>
-        <w:tc>
-          <w:tcPr>
-            <w:tcW w:type="dxa" w:w="1602"/>
-            <w:tcMar>
-              <w:left w:w="45" w:type="dxa"/>
-              <w:right w:w="45" w:type="dxa"/>
-            </w:tcMar>
-            <w:tcBorders>
-              <w:bottom w:val="single" w:sz="5"/>
-            </w:tcBorders>
-          </w:tcPr>
-          <w:p>
-            <w:pPr>
-              <w:keepNext/>
-              <w:spacing w:after="60" w:before="60" w:line="240" w:lineRule="auto"/>
-              <w:ind w:firstLine="0"/>
-              <w:jc w:val="center"/>
-            </w:pPr>
-            <w:r>
-              <w:rPr>
-                <w:b/>
-                <w:sz w:val="16"/>
-              </w:rPr>
-              <w:t>원본 기반 재생성</w:t>
-            </w:r>
-          </w:p>
-        </w:tc>
-      </w:tr>
-      <w:tr>
-        <w:trPr>
-          <w:cantSplit/>
-        </w:trPr>
-        <w:tc>
-          <w:tcPr>
-            <w:tcW w:type="dxa" w:w="1417"/>
-            <w:tcMar>
-              <w:left w:w="45" w:type="dxa"/>
-              <w:right w:w="45" w:type="dxa"/>
-            </w:tcMar>
-          </w:tcPr>
-          <w:p>
-            <w:pPr>
-              <w:keepNext/>
-              <w:spacing w:after="60" w:before="60" w:line="240" w:lineRule="auto"/>
-              <w:ind w:firstLine="0"/>
-              <w:jc w:val="left"/>
-            </w:pPr>
-            <w:r>
-              <w:rPr>
-                <w:b w:val="0"/>
-                <w:sz w:val="16"/>
-              </w:rPr>
-              <w:t>P01</w:t>
-            </w:r>
-          </w:p>
-        </w:tc>
-        <w:tc>
-          <w:tcPr>
-            <w:tcW w:type="dxa" w:w="1602"/>
-            <w:tcMar>
-              <w:left w:w="45" w:type="dxa"/>
-              <w:right w:w="45" w:type="dxa"/>
-            </w:tcMar>
-          </w:tcPr>
-          <w:p>
-            <w:pPr>
-              <w:keepNext/>
-              <w:spacing w:after="60" w:before="60" w:line="240" w:lineRule="auto"/>
-              <w:ind w:firstLine="0"/>
-              <w:jc w:val="center"/>
-            </w:pPr>
-            <w:r>
-              <w:rPr>
-                <w:b w:val="0"/>
-                <w:sz w:val="16"/>
-              </w:rPr>
-              <w:t>0.261778</w:t>
-            </w:r>
-          </w:p>
-        </w:tc>
-        <w:tc>
-          <w:tcPr>
-            <w:tcW w:type="dxa" w:w="1602"/>
-            <w:tcMar>
-              <w:left w:w="45" w:type="dxa"/>
-              <w:right w:w="45" w:type="dxa"/>
-            </w:tcMar>
-          </w:tcPr>
-          <w:p>
-            <w:pPr>
-              <w:keepNext/>
-              <w:spacing w:after="60" w:before="60" w:line="240" w:lineRule="auto"/>
-              <w:ind w:firstLine="0"/>
-              <w:jc w:val="center"/>
-            </w:pPr>
-            <w:r>
-              <w:rPr>
-                <w:b w:val="0"/>
-                <w:sz w:val="16"/>
-              </w:rPr>
-              <w:t>0.170199</w:t>
-            </w:r>
-          </w:p>
-        </w:tc>
-      </w:tr>
-      <w:tr>
-        <w:trPr>
-          <w:cantSplit/>
-        </w:trPr>
-        <w:tc>
-          <w:tcPr>
-            <w:tcW w:type="dxa" w:w="1417"/>
-            <w:tcMar>
-              <w:left w:w="45" w:type="dxa"/>
-              <w:right w:w="45" w:type="dxa"/>
-            </w:tcMar>
-          </w:tcPr>
-          <w:p>
-            <w:pPr>
-              <w:keepNext/>
-              <w:spacing w:after="60" w:before="60" w:line="240" w:lineRule="auto"/>
-              <w:ind w:firstLine="0"/>
-              <w:jc w:val="left"/>
-            </w:pPr>
-            <w:r>
-              <w:rPr>
-                <w:b w:val="0"/>
-                <w:sz w:val="16"/>
-              </w:rPr>
-              <w:t>P02</w:t>
-            </w:r>
-          </w:p>
-        </w:tc>
-        <w:tc>
-          <w:tcPr>
-            <w:tcW w:type="dxa" w:w="1602"/>
-            <w:tcMar>
-              <w:left w:w="45" w:type="dxa"/>
-              <w:right w:w="45" w:type="dxa"/>
-            </w:tcMar>
-          </w:tcPr>
-          <w:p>
-            <w:pPr>
-              <w:keepNext/>
-              <w:spacing w:after="60" w:before="60" w:line="240" w:lineRule="auto"/>
-              <w:ind w:firstLine="0"/>
-              <w:jc w:val="center"/>
-            </w:pPr>
-            <w:r>
-              <w:rPr>
-                <w:b w:val="0"/>
-                <w:sz w:val="16"/>
-              </w:rPr>
-              <w:t>0.260761</w:t>
-            </w:r>
-          </w:p>
-        </w:tc>
-        <w:tc>
-          <w:tcPr>
-            <w:tcW w:type="dxa" w:w="1602"/>
-            <w:tcMar>
-              <w:left w:w="45" w:type="dxa"/>
-              <w:right w:w="45" w:type="dxa"/>
-            </w:tcMar>
-          </w:tcPr>
-          <w:p>
-            <w:pPr>
-              <w:keepNext/>
-              <w:spacing w:after="60" w:before="60" w:line="240" w:lineRule="auto"/>
-              <w:ind w:firstLine="0"/>
-              <w:jc w:val="center"/>
-            </w:pPr>
-            <w:r>
-              <w:rPr>
-                <w:b w:val="0"/>
-                <w:sz w:val="16"/>
-              </w:rPr>
-              <w:t>0.117232</w:t>
-            </w:r>
-          </w:p>
-        </w:tc>
-      </w:tr>
-      <w:tr>
-        <w:trPr>
-          <w:cantSplit/>
-        </w:trPr>
-        <w:tc>
-          <w:tcPr>
-            <w:tcW w:type="dxa" w:w="1417"/>
-            <w:tcMar>
-              <w:left w:w="45" w:type="dxa"/>
-              <w:right w:w="45" w:type="dxa"/>
-            </w:tcMar>
-          </w:tcPr>
-          <w:p>
-            <w:pPr>
-              <w:keepNext/>
-              <w:spacing w:after="60" w:before="60" w:line="240" w:lineRule="auto"/>
-              <w:ind w:firstLine="0"/>
-              <w:jc w:val="left"/>
-            </w:pPr>
-            <w:r>
-              <w:rPr>
-                <w:b w:val="0"/>
-                <w:sz w:val="16"/>
-              </w:rPr>
-              <w:t>P03</w:t>
-            </w:r>
-          </w:p>
-        </w:tc>
-        <w:tc>
-          <w:tcPr>
-            <w:tcW w:type="dxa" w:w="1602"/>
-            <w:tcMar>
-              <w:left w:w="45" w:type="dxa"/>
-              <w:right w:w="45" w:type="dxa"/>
-            </w:tcMar>
-          </w:tcPr>
-          <w:p>
-            <w:pPr>
-              <w:keepNext/>
-              <w:spacing w:after="60" w:before="60" w:line="240" w:lineRule="auto"/>
-              <w:ind w:firstLine="0"/>
-              <w:jc w:val="center"/>
-            </w:pPr>
-            <w:r>
-              <w:rPr>
-                <w:b w:val="0"/>
-                <w:sz w:val="16"/>
-              </w:rPr>
-              <w:t>0.345599</w:t>
-            </w:r>
-          </w:p>
-        </w:tc>
-        <w:tc>
-          <w:tcPr>
-            <w:tcW w:type="dxa" w:w="1602"/>
-            <w:tcMar>
-              <w:left w:w="45" w:type="dxa"/>
-              <w:right w:w="45" w:type="dxa"/>
-            </w:tcMar>
-          </w:tcPr>
-          <w:p>
-            <w:pPr>
-              <w:keepNext/>
-              <w:spacing w:after="60" w:before="60" w:line="240" w:lineRule="auto"/>
-              <w:ind w:firstLine="0"/>
-              <w:jc w:val="center"/>
-            </w:pPr>
-            <w:r>
-              <w:rPr>
-                <w:b w:val="0"/>
-                <w:sz w:val="16"/>
-              </w:rPr>
-              <w:t>0.210225</w:t>
-            </w:r>
-          </w:p>
-        </w:tc>
-      </w:tr>
-      <w:tr>
-        <w:trPr>
-          <w:cantSplit/>
-        </w:trPr>
-        <w:tc>
-          <w:tcPr>
-            <w:tcW w:type="dxa" w:w="1417"/>
-            <w:tcMar>
-              <w:left w:w="45" w:type="dxa"/>
-              <w:right w:w="45" w:type="dxa"/>
-            </w:tcMar>
-          </w:tcPr>
-          <w:p>
-            <w:pPr>
-              <w:keepNext/>
-              <w:spacing w:after="60" w:before="60" w:line="240" w:lineRule="auto"/>
-              <w:ind w:firstLine="0"/>
-              <w:jc w:val="left"/>
-            </w:pPr>
-            <w:r>
-              <w:rPr>
-                <w:b w:val="0"/>
-                <w:sz w:val="16"/>
-              </w:rPr>
-              <w:t>P04</w:t>
-            </w:r>
-          </w:p>
-        </w:tc>
-        <w:tc>
-          <w:tcPr>
-            <w:tcW w:type="dxa" w:w="1602"/>
-            <w:tcMar>
-              <w:left w:w="45" w:type="dxa"/>
-              <w:right w:w="45" w:type="dxa"/>
-            </w:tcMar>
-          </w:tcPr>
-          <w:p>
-            <w:pPr>
-              <w:keepNext/>
-              <w:spacing w:after="60" w:before="60" w:line="240" w:lineRule="auto"/>
-              <w:ind w:firstLine="0"/>
-              <w:jc w:val="center"/>
-            </w:pPr>
-            <w:r>
-              <w:rPr>
-                <w:b w:val="0"/>
-                <w:sz w:val="16"/>
-              </w:rPr>
-              <w:t>0.312155</w:t>
-            </w:r>
-          </w:p>
-        </w:tc>
-        <w:tc>
-          <w:tcPr>
-            <w:tcW w:type="dxa" w:w="1602"/>
-            <w:tcMar>
-              <w:left w:w="45" w:type="dxa"/>
-              <w:right w:w="45" w:type="dxa"/>
-            </w:tcMar>
-          </w:tcPr>
-          <w:p>
-            <w:pPr>
-              <w:keepNext/>
-              <w:spacing w:after="60" w:before="60" w:line="240" w:lineRule="auto"/>
-              <w:ind w:firstLine="0"/>
-              <w:jc w:val="center"/>
-            </w:pPr>
-            <w:r>
-              <w:rPr>
-                <w:b w:val="0"/>
-                <w:sz w:val="16"/>
-              </w:rPr>
-              <w:t>0.192125</w:t>
-            </w:r>
-          </w:p>
-        </w:tc>
-      </w:tr>
-      <w:tr>
-        <w:trPr>
-          <w:cantSplit/>
-        </w:trPr>
-        <w:tc>
-          <w:tcPr>
-            <w:tcW w:type="dxa" w:w="1417"/>
-            <w:tcMar>
-              <w:left w:w="45" w:type="dxa"/>
-              <w:right w:w="45" w:type="dxa"/>
-            </w:tcMar>
-          </w:tcPr>
-          <w:p>
-            <w:pPr>
-              <w:keepNext/>
-              <w:spacing w:after="60" w:before="60" w:line="240" w:lineRule="auto"/>
-              <w:ind w:firstLine="0"/>
-              <w:jc w:val="left"/>
-            </w:pPr>
-            <w:r>
-              <w:rPr>
-                <w:b w:val="0"/>
-                <w:sz w:val="16"/>
-              </w:rPr>
-              <w:t>P05</w:t>
-            </w:r>
-          </w:p>
-        </w:tc>
-        <w:tc>
-          <w:tcPr>
-            <w:tcW w:type="dxa" w:w="1602"/>
-            <w:tcMar>
-              <w:left w:w="45" w:type="dxa"/>
-              <w:right w:w="45" w:type="dxa"/>
-            </w:tcMar>
-          </w:tcPr>
-          <w:p>
-            <w:pPr>
-              <w:keepNext/>
-              <w:spacing w:after="60" w:before="60" w:line="240" w:lineRule="auto"/>
-              <w:ind w:firstLine="0"/>
-              <w:jc w:val="center"/>
-            </w:pPr>
-            <w:r>
-              <w:rPr>
-                <w:b w:val="0"/>
-                <w:sz w:val="16"/>
-              </w:rPr>
-              <w:t>0.613747</w:t>
-            </w:r>
-          </w:p>
-        </w:tc>
-        <w:tc>
-          <w:tcPr>
-            <w:tcW w:type="dxa" w:w="1602"/>
-            <w:tcMar>
-              <w:left w:w="45" w:type="dxa"/>
-              <w:right w:w="45" w:type="dxa"/>
-            </w:tcMar>
-          </w:tcPr>
-          <w:p>
-            <w:pPr>
-              <w:keepNext/>
-              <w:spacing w:after="60" w:before="60" w:line="240" w:lineRule="auto"/>
-              <w:ind w:firstLine="0"/>
-              <w:jc w:val="center"/>
-            </w:pPr>
-            <w:r>
-              <w:rPr>
-                <w:b w:val="0"/>
-                <w:sz w:val="16"/>
-              </w:rPr>
-              <w:t>0.577223</w:t>
-            </w:r>
-          </w:p>
-        </w:tc>
-      </w:tr>
-      <w:tr>
-        <w:trPr>
-          <w:cantSplit/>
-        </w:trPr>
-        <w:tc>
-          <w:tcPr>
-            <w:tcW w:type="dxa" w:w="1417"/>
-            <w:tcMar>
-              <w:left w:w="45" w:type="dxa"/>
-              <w:right w:w="45" w:type="dxa"/>
-            </w:tcMar>
-            <w:tcBorders>
-              <w:bottom w:val="single" w:sz="5"/>
-            </w:tcBorders>
-          </w:tcPr>
-          <w:p>
-            <w:pPr>
-              <w:keepNext w:val="0"/>
-              <w:spacing w:after="60" w:before="60" w:line="240" w:lineRule="auto"/>
-              <w:ind w:firstLine="0"/>
-              <w:jc w:val="left"/>
-            </w:pPr>
-            <w:r>
-              <w:rPr>
-                <w:b w:val="0"/>
-                <w:sz w:val="16"/>
-              </w:rPr>
-              <w:t>P06</w:t>
-            </w:r>
-          </w:p>
-        </w:tc>
-        <w:tc>
-          <w:tcPr>
-            <w:tcW w:type="dxa" w:w="1602"/>
-            <w:tcMar>
-              <w:left w:w="45" w:type="dxa"/>
-              <w:right w:w="45" w:type="dxa"/>
-            </w:tcMar>
-            <w:tcBorders>
-              <w:bottom w:val="single" w:sz="5"/>
-            </w:tcBorders>
-          </w:tcPr>
-          <w:p>
-            <w:pPr>
-              <w:keepNext w:val="0"/>
-              <w:spacing w:after="60" w:before="60" w:line="240" w:lineRule="auto"/>
-              <w:ind w:firstLine="0"/>
-              <w:jc w:val="center"/>
-            </w:pPr>
-            <w:r>
-              <w:rPr>
-                <w:b w:val="0"/>
-                <w:sz w:val="16"/>
-              </w:rPr>
-              <w:t>0.390048</w:t>
-            </w:r>
-          </w:p>
-        </w:tc>
-        <w:tc>
-          <w:tcPr>
-            <w:tcW w:type="dxa" w:w="1602"/>
-            <w:tcMar>
-              <w:left w:w="45" w:type="dxa"/>
-              <w:right w:w="45" w:type="dxa"/>
-            </w:tcMar>
-            <w:tcBorders>
-              <w:bottom w:val="single" w:sz="5"/>
-            </w:tcBorders>
-          </w:tcPr>
-          <w:p>
-            <w:pPr>
-              <w:keepNext w:val="0"/>
-              <w:spacing w:after="60" w:before="60" w:line="240" w:lineRule="auto"/>
-              <w:ind w:firstLine="0"/>
-              <w:jc w:val="center"/>
-            </w:pPr>
-            <w:r>
-              <w:rPr>
-                <w:b w:val="0"/>
-                <w:sz w:val="16"/>
-              </w:rPr>
-              <w:t>0.246848</w:t>
-            </w:r>
-          </w:p>
-        </w:tc>
-      </w:tr>
-    </w:tbl>
-    <w:p>
-      <w:pPr>
-        <w:jc w:val="both"/>
-      </w:pPr>
-      <w:r>
-        <w:t>위치 보정 MAE·SSIM·LPIPS는 모두 6/6쌍에서 원본 기반 방식에 유리하였다. 보정 전에는 각 지표가 5/6쌍에서 같은 방향이었으며, sigma 1과 6에서도 보정 후의 방향은 유지되었다. 지표에는 얼굴의 형태뿐 아니라 위치·색·조명 변화도 반영된다.</w:t>
-      </w:r>
-    </w:p>
-    <w:p>
-      <w:pPr>
-        <w:pStyle w:val="Heading2"/>
-      </w:pPr>
-      <w:r>
-        <w:t>2. 한 번 추출하는 방법의 정확도</w:t>
-      </w:r>
-    </w:p>
-    <w:p>
-      <w:pPr>
-        <w:jc w:val="both"/>
-      </w:pPr>
-      <w:r>
-        <w:t>새 요청 96개에서 응답 선택과 지시 검사 적용 여부에 따른 전체 상태 일치율을 표 2에 제시하였다. 첫 응답만 단순 적용한 경우와 제안 방법은 같은 최초 추출 결과를 사용하므로, 두 조건의 차이는 지시 검사에 해당한다. 두 번 호출하는 조건은 같은 요청에 대한 재검토 응답을 추가로 사용한다. 별도의 기본 검증 요청 12개에서는 첫 응답 단순 적용이 두 모델 모두 3/12, 제안 방법이 모두 12/12였다.</w:t>
-      </w:r>
-    </w:p>
-    <w:p>
-      <w:pPr>
-        <w:pStyle w:val="Caption"/>
-        <w:keepNext/>
-        <w:spacing w:before="100"/>
-        <w:ind w:firstLine="0"/>
-        <w:jc w:val="center"/>
-      </w:pPr>
-      <w:r>
-        <w:t>표 2. 96개 요청의 상태 일치와 호출 수</w:t>
+        <w:t>표 1. 96개 요청의 전체 상태 일치와 모델 호출 수</w:t>
       </w:r>
     </w:p>
     <w:tbl>
@@ -1758,7 +1235,7 @@
         <w:jc w:val="both"/>
       </w:pPr>
       <w:r>
-        <w:t>제안 방법의 항목별 일치는 Qwen3 576/576, Llama 573/576이며, 최종 상태 일치는 각각 12/12와 9/12였다.</w:t>
+        <w:t>제안 방법의 항목별 일치는 Qwen3 576/576, Llama 573/576이며 최종 상태 일치는 각각 12/12와 9/12였다. 첫 응답 단순 적용 대비 정확도 차이는 Qwen3 45.83%p, Llama 68.75%p였다. 대화 단위 95% 구간은 각각 31.25–59.38%p와 62.50–75.00%p이며, Holm 보정 p값은 각각 0.001953과 0.000977이었다.</w:t>
       </w:r>
     </w:p>
     <w:p>
@@ -1766,7 +1243,15 @@
         <w:jc w:val="both"/>
       </w:pPr>
       <w:r>
-        <w:t>두 모델 모두 첫 응답에 지시 검사를 적용했을 때 전체 상태 일치율이 높아졌다. Qwen3에서 첫 응답 단순 적용 대비 정확도 차이는 45.83%p였으며 대화 단위 95% 구간은 31.25–59.38%p, Holm 보정 p값은 0.001953이었다.</w:t>
+        <w:t>재검토 응답을 우선 적용하면 첫 응답 단순 적용보다 일치 건수가 줄었다. 검사를 결합한 경우에도 Llama의 추출·재검토 조건은 44/96으로, 최초 응답에만 검사를 적용한 93/96보다 낮았다. Qwen3는 두 검사 조건이 모두 96/96이었다. 이 비교에서 호출을 한 번 더 사용하는 것보다 어떤 응답에 검사를 적용하는지가 결과에 영향을 주었다.</w:t>
+      </w:r>
+    </w:p>
+    <w:p>
+      <w:pPr>
+        <w:pStyle w:val="Heading2"/>
+      </w:pPr>
+      <w:r>
+        <w:t>2. 요청 유형과 오류 원인</w:t>
       </w:r>
     </w:p>
     <w:p>
@@ -1774,15 +1259,7 @@
         <w:jc w:val="both"/>
       </w:pPr>
       <w:r>
-        <w:t>Llama에서 첫 응답 단순 적용 대비 정확도 차이는 68.75%p였으며 대화 단위 95% 구간은 62.50–75.00%p, Holm 보정 p값은 0.000977이었다.</w:t>
-      </w:r>
-    </w:p>
-    <w:p>
-      <w:pPr>
-        <w:jc w:val="both"/>
-      </w:pPr>
-      <w:r>
-        <w:t>요청 유형별 결과를 표 3에 제시하였다. 대화별 일치 건수와 실패한 요청의 정답·관측 상태도 함께 보존하였다.</w:t>
+        <w:t>표 2는 요청 유형별 전체 상태 일치 결과이다. 초기 설정은 두 모델의 첫 응답이 모두 맞았지만, 여러 항목을 변경하거나 실행할 지시를 구분하는 후속 요청에서는 단순 적용의 오류가 나타났다. 제안 방법은 Qwen3의 모든 유형에서 정답과 일치하였고, Llama에서는 인용문 뒤에 직접 지시가 오는 유형의 오류 세 개가 남았다.</w:t>
       </w:r>
     </w:p>
     <w:p>
@@ -1794,7 +1271,7 @@
         <w:jc w:val="center"/>
       </w:pPr>
       <w:r>
-        <w:t>표 3. 요청 유형별 전체 상태 일치</w:t>
+        <w:t>표 2. 요청 유형별 전체 상태 일치</w:t>
       </w:r>
     </w:p>
     <w:tbl>
@@ -2861,7 +2338,9 @@
                 <w:b w:val="0"/>
                 <w:sz w:val="16"/>
               </w:rPr>
-              <w:t>뒤 직접 지시</w:t>
+              <w:t>인용문 뒤의</w:t>
+              <w:br/>
+              <w:t>직접 지시</w:t>
             </w:r>
           </w:p>
         </w:tc>
@@ -2980,7 +2459,7 @@
         <w:jc w:val="both"/>
       </w:pPr>
       <w:r>
-        <w:t>Llama의 오류 세 개는 같은 표현 틀의 마지막 요청에서 발생하였다. 인용문 뒤에 재킷을 원본 사진의 모습으로 복원하라고 직접 지시했으나, 모델은 재킷을 녹색으로 추출하였다. 검사는 근거 없는 색 변경을 거부했지만 해당 복원 표현도 인식하지 못하여 직전 재킷 값이 남았다. 이 세 오류는 세 대화의 최종 상태에도 반영되었다.</w:t>
+        <w:t>Llama의 세 오류는 같은 표현 틀의 마지막 요청에서 발생하였다. 인용문 뒤에 재킷을 원본 사진의 모습으로 복원하라고 직접 지시했으나 모델은 녹색으로 추출하였다. 검사는 요청에 근거가 없는 색 변경을 거부하였다. 해당 요청은 인용부호가 포함되어 구절 정규화가 생략되었고, 뒤에 나온 복원 표현도 기존 규칙에서 처리하지 못하였다. 그 결과 직전 재킷 값이 남았으며 세 대화의 최종 상태도 정답과 달랐다. 이는 잘못된 변경값을 거부하는 처리와 올바른 복원값을 결정하는 처리가 모두 필요함을 보여준다.</w:t>
       </w:r>
     </w:p>
     <w:p>
@@ -2988,23 +2467,7 @@
         <w:jc w:val="both"/>
       </w:pPr>
       <w:r>
-        <w:t>제안 방법은 모델의 첫 응답을 사용하므로 상태 갱신에 모델 호출 한 번이 필요하다. 추출·재검토와 검사 결합은 두 번 호출한 응답에 같은 후처리를 적용한 비교이다.</w:t>
-      </w:r>
-    </w:p>
-    <w:p>
-      <w:pPr>
-        <w:pStyle w:val="Heading2"/>
-      </w:pPr>
-      <w:r>
-        <w:t>3. 구성요소별 검증</w:t>
-      </w:r>
-    </w:p>
-    <w:p>
-      <w:pPr>
-        <w:jc w:val="both"/>
-      </w:pPr>
-      <w:r>
-        <w:t>유지·삭제 규칙의 비교는 표 4와 같다. 두 규칙의 결합은 기준보다 요청 두 개를 더 맞혔고, 유지 위반은 한 개에서 0개로 줄었다. 차이는 한 대화의 두 요청에서 발생하였다. 식물 삭제를 빠뜨린 오류와 배경까지 원본으로 돌린 오류를 각각 바로잡은 결과이다.</w:t>
+        <w:t>유지와 삭제의 역할은 요청 32개의 구성요소 비교에서 확인하였다(표 3). 기준 방법은 추출·재검토 응답에 값 검증과 원본 복원 처리를 적용한 기존 구현이며, 이 구현에서 유지·삭제 규칙의 적용 여부만 달리하였다. 삭제 규칙은 식물 제거 누락을 바로잡았고, 유지 규칙은 보존할 배경까지 원본으로 바뀌는 오류를 막았다. 두 규칙을 결합했을 때 한 대화의 두 요청이 추가로 정답과 일치하였다.</w:t>
       </w:r>
     </w:p>
     <w:p>
@@ -3016,7 +2479,7 @@
         <w:jc w:val="center"/>
       </w:pPr>
       <w:r>
-        <w:t>표 4. 유지·삭제 규칙의 구성요소 비교</w:t>
+        <w:t>표 3. 유지 및 삭제 규칙의 구성요소 비교</w:t>
       </w:r>
     </w:p>
     <w:tbl>
@@ -3700,1197 +3163,7 @@
         <w:jc w:val="both"/>
       </w:pPr>
       <w:r>
-        <w:t>표 5는 유지·삭제 규칙, 지시 구절의 분리, 복원 표현, 실행 대상 검사의 구성요소별 검증 결과이다. 각 행은 해당 구현을 고정한 뒤 별도의 대화에 적용한 비교를 나타낸다.</w:t>
-      </w:r>
-    </w:p>
-    <w:p>
-      <w:pPr>
-        <w:pStyle w:val="Caption"/>
-        <w:keepNext/>
-        <w:spacing w:before="100"/>
-        <w:ind w:firstLine="0"/>
-        <w:jc w:val="center"/>
-      </w:pPr>
-      <w:r>
-        <w:t>표 5. 지시 검사 구성요소별 상태 갱신 검증</w:t>
-      </w:r>
-    </w:p>
-    <w:tbl>
-      <w:tblPr>
-        <w:tblW w:type="auto" w:w="0"/>
-        <w:tblLayout w:type="fixed"/>
-        <w:tblLook w:firstColumn="1" w:firstRow="1" w:lastColumn="0" w:lastRow="0" w:noHBand="0" w:noVBand="1" w:val="04A0"/>
-      </w:tblPr>
-      <w:tblGrid>
-        <w:gridCol w:w="1417"/>
-        <w:gridCol w:w="801"/>
-        <w:gridCol w:w="801"/>
-        <w:gridCol w:w="801"/>
-        <w:gridCol w:w="801"/>
-      </w:tblGrid>
-      <w:tr>
-        <w:trPr>
-          <w:cantSplit/>
-          <w:tblHeader/>
-        </w:trPr>
-        <w:tc>
-          <w:tcPr>
-            <w:tcW w:type="dxa" w:w="1417"/>
-            <w:tcMar>
-              <w:left w:w="45" w:type="dxa"/>
-              <w:right w:w="45" w:type="dxa"/>
-            </w:tcMar>
-            <w:tcBorders>
-              <w:bottom w:val="single" w:sz="5"/>
-            </w:tcBorders>
-          </w:tcPr>
-          <w:p>
-            <w:pPr>
-              <w:keepNext/>
-              <w:spacing w:after="60" w:before="60" w:line="240" w:lineRule="auto"/>
-              <w:ind w:firstLine="0"/>
-              <w:jc w:val="left"/>
-            </w:pPr>
-            <w:r>
-              <w:rPr>
-                <w:b/>
-                <w:sz w:val="16"/>
-              </w:rPr>
-              <w:t>검증 내용</w:t>
-            </w:r>
-          </w:p>
-        </w:tc>
-        <w:tc>
-          <w:tcPr>
-            <w:tcW w:type="dxa" w:w="801"/>
-            <w:tcMar>
-              <w:left w:w="45" w:type="dxa"/>
-              <w:right w:w="45" w:type="dxa"/>
-            </w:tcMar>
-            <w:tcBorders>
-              <w:bottom w:val="single" w:sz="5"/>
-            </w:tcBorders>
-          </w:tcPr>
-          <w:p>
-            <w:pPr>
-              <w:keepNext/>
-              <w:spacing w:after="60" w:before="60" w:line="240" w:lineRule="auto"/>
-              <w:ind w:firstLine="0"/>
-              <w:jc w:val="center"/>
-            </w:pPr>
-            <w:r>
-              <w:rPr>
-                <w:b/>
-                <w:sz w:val="16"/>
-              </w:rPr>
-              <w:t>모델</w:t>
-            </w:r>
-          </w:p>
-        </w:tc>
-        <w:tc>
-          <w:tcPr>
-            <w:tcW w:type="dxa" w:w="801"/>
-            <w:tcMar>
-              <w:left w:w="45" w:type="dxa"/>
-              <w:right w:w="45" w:type="dxa"/>
-            </w:tcMar>
-            <w:tcBorders>
-              <w:bottom w:val="single" w:sz="5"/>
-            </w:tcBorders>
-          </w:tcPr>
-          <w:p>
-            <w:pPr>
-              <w:keepNext/>
-              <w:spacing w:after="60" w:before="60" w:line="240" w:lineRule="auto"/>
-              <w:ind w:firstLine="0"/>
-              <w:jc w:val="center"/>
-            </w:pPr>
-            <w:r>
-              <w:rPr>
-                <w:b/>
-                <w:sz w:val="16"/>
-              </w:rPr>
-              <w:t>요청 수</w:t>
-            </w:r>
-          </w:p>
-        </w:tc>
-        <w:tc>
-          <w:tcPr>
-            <w:tcW w:type="dxa" w:w="801"/>
-            <w:tcMar>
-              <w:left w:w="45" w:type="dxa"/>
-              <w:right w:w="45" w:type="dxa"/>
-            </w:tcMar>
-            <w:tcBorders>
-              <w:bottom w:val="single" w:sz="5"/>
-            </w:tcBorders>
-          </w:tcPr>
-          <w:p>
-            <w:pPr>
-              <w:keepNext/>
-              <w:spacing w:after="60" w:before="60" w:line="240" w:lineRule="auto"/>
-              <w:ind w:firstLine="0"/>
-              <w:jc w:val="center"/>
-            </w:pPr>
-            <w:r>
-              <w:rPr>
-                <w:b/>
-                <w:sz w:val="16"/>
-              </w:rPr>
-              <w:t>기준</w:t>
-            </w:r>
-          </w:p>
-        </w:tc>
-        <w:tc>
-          <w:tcPr>
-            <w:tcW w:type="dxa" w:w="801"/>
-            <w:tcMar>
-              <w:left w:w="45" w:type="dxa"/>
-              <w:right w:w="45" w:type="dxa"/>
-            </w:tcMar>
-            <w:tcBorders>
-              <w:bottom w:val="single" w:sz="5"/>
-            </w:tcBorders>
-          </w:tcPr>
-          <w:p>
-            <w:pPr>
-              <w:keepNext/>
-              <w:spacing w:after="60" w:before="60" w:line="240" w:lineRule="auto"/>
-              <w:ind w:firstLine="0"/>
-              <w:jc w:val="center"/>
-            </w:pPr>
-            <w:r>
-              <w:rPr>
-                <w:b/>
-                <w:sz w:val="16"/>
-              </w:rPr>
-              <w:t>검사 적용</w:t>
-            </w:r>
-          </w:p>
-        </w:tc>
-      </w:tr>
-      <w:tr>
-        <w:trPr>
-          <w:cantSplit/>
-        </w:trPr>
-        <w:tc>
-          <w:tcPr>
-            <w:tcW w:type="dxa" w:w="1417"/>
-            <w:tcMar>
-              <w:left w:w="45" w:type="dxa"/>
-              <w:right w:w="45" w:type="dxa"/>
-            </w:tcMar>
-          </w:tcPr>
-          <w:p>
-            <w:pPr>
-              <w:keepNext/>
-              <w:spacing w:after="60" w:before="60" w:line="240" w:lineRule="auto"/>
-              <w:ind w:firstLine="0"/>
-              <w:jc w:val="left"/>
-            </w:pPr>
-            <w:r>
-              <w:rPr>
-                <w:b w:val="0"/>
-                <w:sz w:val="16"/>
-              </w:rPr>
-              <w:t>유지·삭제 재검증</w:t>
-            </w:r>
-          </w:p>
-        </w:tc>
-        <w:tc>
-          <w:tcPr>
-            <w:tcW w:type="dxa" w:w="801"/>
-            <w:tcMar>
-              <w:left w:w="45" w:type="dxa"/>
-              <w:right w:w="45" w:type="dxa"/>
-            </w:tcMar>
-          </w:tcPr>
-          <w:p>
-            <w:pPr>
-              <w:keepNext/>
-              <w:spacing w:after="60" w:before="60" w:line="240" w:lineRule="auto"/>
-              <w:ind w:firstLine="0"/>
-              <w:jc w:val="center"/>
-            </w:pPr>
-            <w:r>
-              <w:rPr>
-                <w:b w:val="0"/>
-                <w:sz w:val="16"/>
-              </w:rPr>
-              <w:t>Qwen3</w:t>
-            </w:r>
-          </w:p>
-        </w:tc>
-        <w:tc>
-          <w:tcPr>
-            <w:tcW w:type="dxa" w:w="801"/>
-            <w:tcMar>
-              <w:left w:w="45" w:type="dxa"/>
-              <w:right w:w="45" w:type="dxa"/>
-            </w:tcMar>
-          </w:tcPr>
-          <w:p>
-            <w:pPr>
-              <w:keepNext/>
-              <w:spacing w:after="60" w:before="60" w:line="240" w:lineRule="auto"/>
-              <w:ind w:firstLine="0"/>
-              <w:jc w:val="center"/>
-            </w:pPr>
-            <w:r>
-              <w:rPr>
-                <w:b w:val="0"/>
-                <w:sz w:val="16"/>
-              </w:rPr>
-              <w:t>32</w:t>
-            </w:r>
-          </w:p>
-        </w:tc>
-        <w:tc>
-          <w:tcPr>
-            <w:tcW w:type="dxa" w:w="801"/>
-            <w:tcMar>
-              <w:left w:w="45" w:type="dxa"/>
-              <w:right w:w="45" w:type="dxa"/>
-            </w:tcMar>
-          </w:tcPr>
-          <w:p>
-            <w:pPr>
-              <w:keepNext/>
-              <w:spacing w:after="60" w:before="60" w:line="240" w:lineRule="auto"/>
-              <w:ind w:firstLine="0"/>
-              <w:jc w:val="center"/>
-            </w:pPr>
-            <w:r>
-              <w:rPr>
-                <w:b w:val="0"/>
-                <w:sz w:val="16"/>
-              </w:rPr>
-              <w:t>28/32</w:t>
-            </w:r>
-          </w:p>
-        </w:tc>
-        <w:tc>
-          <w:tcPr>
-            <w:tcW w:type="dxa" w:w="801"/>
-            <w:tcMar>
-              <w:left w:w="45" w:type="dxa"/>
-              <w:right w:w="45" w:type="dxa"/>
-            </w:tcMar>
-          </w:tcPr>
-          <w:p>
-            <w:pPr>
-              <w:keepNext/>
-              <w:spacing w:after="60" w:before="60" w:line="240" w:lineRule="auto"/>
-              <w:ind w:firstLine="0"/>
-              <w:jc w:val="center"/>
-            </w:pPr>
-            <w:r>
-              <w:rPr>
-                <w:b w:val="0"/>
-                <w:sz w:val="16"/>
-              </w:rPr>
-              <w:t>29/32</w:t>
-            </w:r>
-          </w:p>
-        </w:tc>
-      </w:tr>
-      <w:tr>
-        <w:trPr>
-          <w:cantSplit/>
-        </w:trPr>
-        <w:tc>
-          <w:tcPr>
-            <w:tcW w:type="dxa" w:w="1417"/>
-            <w:tcMar>
-              <w:left w:w="45" w:type="dxa"/>
-              <w:right w:w="45" w:type="dxa"/>
-            </w:tcMar>
-          </w:tcPr>
-          <w:p>
-            <w:pPr>
-              <w:keepNext/>
-              <w:spacing w:after="60" w:before="60" w:line="240" w:lineRule="auto"/>
-              <w:ind w:firstLine="0"/>
-              <w:jc w:val="left"/>
-            </w:pPr>
-            <w:r>
-              <w:rPr>
-                <w:b w:val="0"/>
-                <w:sz w:val="16"/>
-              </w:rPr>
-              <w:t>구절 정규화</w:t>
-            </w:r>
-          </w:p>
-        </w:tc>
-        <w:tc>
-          <w:tcPr>
-            <w:tcW w:type="dxa" w:w="801"/>
-            <w:tcMar>
-              <w:left w:w="45" w:type="dxa"/>
-              <w:right w:w="45" w:type="dxa"/>
-            </w:tcMar>
-          </w:tcPr>
-          <w:p>
-            <w:pPr>
-              <w:keepNext/>
-              <w:spacing w:after="60" w:before="60" w:line="240" w:lineRule="auto"/>
-              <w:ind w:firstLine="0"/>
-              <w:jc w:val="center"/>
-            </w:pPr>
-            <w:r>
-              <w:rPr>
-                <w:b w:val="0"/>
-                <w:sz w:val="16"/>
-              </w:rPr>
-              <w:t>Qwen3</w:t>
-            </w:r>
-          </w:p>
-        </w:tc>
-        <w:tc>
-          <w:tcPr>
-            <w:tcW w:type="dxa" w:w="801"/>
-            <w:tcMar>
-              <w:left w:w="45" w:type="dxa"/>
-              <w:right w:w="45" w:type="dxa"/>
-            </w:tcMar>
-          </w:tcPr>
-          <w:p>
-            <w:pPr>
-              <w:keepNext/>
-              <w:spacing w:after="60" w:before="60" w:line="240" w:lineRule="auto"/>
-              <w:ind w:firstLine="0"/>
-              <w:jc w:val="center"/>
-            </w:pPr>
-            <w:r>
-              <w:rPr>
-                <w:b w:val="0"/>
-                <w:sz w:val="16"/>
-              </w:rPr>
-              <w:t>16</w:t>
-            </w:r>
-          </w:p>
-        </w:tc>
-        <w:tc>
-          <w:tcPr>
-            <w:tcW w:type="dxa" w:w="801"/>
-            <w:tcMar>
-              <w:left w:w="45" w:type="dxa"/>
-              <w:right w:w="45" w:type="dxa"/>
-            </w:tcMar>
-          </w:tcPr>
-          <w:p>
-            <w:pPr>
-              <w:keepNext/>
-              <w:spacing w:after="60" w:before="60" w:line="240" w:lineRule="auto"/>
-              <w:ind w:firstLine="0"/>
-              <w:jc w:val="center"/>
-            </w:pPr>
-            <w:r>
-              <w:rPr>
-                <w:b w:val="0"/>
-                <w:sz w:val="16"/>
-              </w:rPr>
-              <w:t>9/16</w:t>
-            </w:r>
-          </w:p>
-        </w:tc>
-        <w:tc>
-          <w:tcPr>
-            <w:tcW w:type="dxa" w:w="801"/>
-            <w:tcMar>
-              <w:left w:w="45" w:type="dxa"/>
-              <w:right w:w="45" w:type="dxa"/>
-            </w:tcMar>
-          </w:tcPr>
-          <w:p>
-            <w:pPr>
-              <w:keepNext/>
-              <w:spacing w:after="60" w:before="60" w:line="240" w:lineRule="auto"/>
-              <w:ind w:firstLine="0"/>
-              <w:jc w:val="center"/>
-            </w:pPr>
-            <w:r>
-              <w:rPr>
-                <w:b w:val="0"/>
-                <w:sz w:val="16"/>
-              </w:rPr>
-              <w:t>16/16</w:t>
-            </w:r>
-          </w:p>
-        </w:tc>
-      </w:tr>
-      <w:tr>
-        <w:trPr>
-          <w:cantSplit/>
-        </w:trPr>
-        <w:tc>
-          <w:tcPr>
-            <w:tcW w:type="dxa" w:w="1417"/>
-            <w:tcMar>
-              <w:left w:w="45" w:type="dxa"/>
-              <w:right w:w="45" w:type="dxa"/>
-            </w:tcMar>
-          </w:tcPr>
-          <w:p>
-            <w:pPr>
-              <w:keepNext/>
-              <w:spacing w:after="60" w:before="60" w:line="240" w:lineRule="auto"/>
-              <w:ind w:firstLine="0"/>
-              <w:jc w:val="left"/>
-            </w:pPr>
-            <w:r>
-              <w:rPr>
-                <w:b w:val="0"/>
-                <w:sz w:val="16"/>
-              </w:rPr>
-              <w:t>문장 구조 대조</w:t>
-            </w:r>
-          </w:p>
-        </w:tc>
-        <w:tc>
-          <w:tcPr>
-            <w:tcW w:type="dxa" w:w="801"/>
-            <w:tcMar>
-              <w:left w:w="45" w:type="dxa"/>
-              <w:right w:w="45" w:type="dxa"/>
-            </w:tcMar>
-          </w:tcPr>
-          <w:p>
-            <w:pPr>
-              <w:keepNext/>
-              <w:spacing w:after="60" w:before="60" w:line="240" w:lineRule="auto"/>
-              <w:ind w:firstLine="0"/>
-              <w:jc w:val="center"/>
-            </w:pPr>
-            <w:r>
-              <w:rPr>
-                <w:b w:val="0"/>
-                <w:sz w:val="16"/>
-              </w:rPr>
-              <w:t>Qwen3</w:t>
-            </w:r>
-          </w:p>
-        </w:tc>
-        <w:tc>
-          <w:tcPr>
-            <w:tcW w:type="dxa" w:w="801"/>
-            <w:tcMar>
-              <w:left w:w="45" w:type="dxa"/>
-              <w:right w:w="45" w:type="dxa"/>
-            </w:tcMar>
-          </w:tcPr>
-          <w:p>
-            <w:pPr>
-              <w:keepNext/>
-              <w:spacing w:after="60" w:before="60" w:line="240" w:lineRule="auto"/>
-              <w:ind w:firstLine="0"/>
-              <w:jc w:val="center"/>
-            </w:pPr>
-            <w:r>
-              <w:rPr>
-                <w:b w:val="0"/>
-                <w:sz w:val="16"/>
-              </w:rPr>
-              <w:t>36</w:t>
-            </w:r>
-          </w:p>
-        </w:tc>
-        <w:tc>
-          <w:tcPr>
-            <w:tcW w:type="dxa" w:w="801"/>
-            <w:tcMar>
-              <w:left w:w="45" w:type="dxa"/>
-              <w:right w:w="45" w:type="dxa"/>
-            </w:tcMar>
-          </w:tcPr>
-          <w:p>
-            <w:pPr>
-              <w:keepNext/>
-              <w:spacing w:after="60" w:before="60" w:line="240" w:lineRule="auto"/>
-              <w:ind w:firstLine="0"/>
-              <w:jc w:val="center"/>
-            </w:pPr>
-            <w:r>
-              <w:rPr>
-                <w:b w:val="0"/>
-                <w:sz w:val="16"/>
-              </w:rPr>
-              <w:t>18/36</w:t>
-            </w:r>
-          </w:p>
-        </w:tc>
-        <w:tc>
-          <w:tcPr>
-            <w:tcW w:type="dxa" w:w="801"/>
-            <w:tcMar>
-              <w:left w:w="45" w:type="dxa"/>
-              <w:right w:w="45" w:type="dxa"/>
-            </w:tcMar>
-          </w:tcPr>
-          <w:p>
-            <w:pPr>
-              <w:keepNext/>
-              <w:spacing w:after="60" w:before="60" w:line="240" w:lineRule="auto"/>
-              <w:ind w:firstLine="0"/>
-              <w:jc w:val="center"/>
-            </w:pPr>
-            <w:r>
-              <w:rPr>
-                <w:b w:val="0"/>
-                <w:sz w:val="16"/>
-              </w:rPr>
-              <w:t>36/36</w:t>
-            </w:r>
-          </w:p>
-        </w:tc>
-      </w:tr>
-      <w:tr>
-        <w:trPr>
-          <w:cantSplit/>
-        </w:trPr>
-        <w:tc>
-          <w:tcPr>
-            <w:tcW w:type="dxa" w:w="1417"/>
-            <w:tcMar>
-              <w:left w:w="45" w:type="dxa"/>
-              <w:right w:w="45" w:type="dxa"/>
-            </w:tcMar>
-          </w:tcPr>
-          <w:p>
-            <w:pPr>
-              <w:keepNext/>
-              <w:spacing w:after="60" w:before="60" w:line="240" w:lineRule="auto"/>
-              <w:ind w:firstLine="0"/>
-              <w:jc w:val="left"/>
-            </w:pPr>
-            <w:r>
-              <w:rPr>
-                <w:b w:val="0"/>
-                <w:sz w:val="16"/>
-              </w:rPr>
-              <w:t>표현·순서 변경</w:t>
-            </w:r>
-          </w:p>
-        </w:tc>
-        <w:tc>
-          <w:tcPr>
-            <w:tcW w:type="dxa" w:w="801"/>
-            <w:tcMar>
-              <w:left w:w="45" w:type="dxa"/>
-              <w:right w:w="45" w:type="dxa"/>
-            </w:tcMar>
-          </w:tcPr>
-          <w:p>
-            <w:pPr>
-              <w:keepNext/>
-              <w:spacing w:after="60" w:before="60" w:line="240" w:lineRule="auto"/>
-              <w:ind w:firstLine="0"/>
-              <w:jc w:val="center"/>
-            </w:pPr>
-            <w:r>
-              <w:rPr>
-                <w:b w:val="0"/>
-                <w:sz w:val="16"/>
-              </w:rPr>
-              <w:t>Qwen3</w:t>
-            </w:r>
-          </w:p>
-        </w:tc>
-        <w:tc>
-          <w:tcPr>
-            <w:tcW w:type="dxa" w:w="801"/>
-            <w:tcMar>
-              <w:left w:w="45" w:type="dxa"/>
-              <w:right w:w="45" w:type="dxa"/>
-            </w:tcMar>
-          </w:tcPr>
-          <w:p>
-            <w:pPr>
-              <w:keepNext/>
-              <w:spacing w:after="60" w:before="60" w:line="240" w:lineRule="auto"/>
-              <w:ind w:firstLine="0"/>
-              <w:jc w:val="center"/>
-            </w:pPr>
-            <w:r>
-              <w:rPr>
-                <w:b w:val="0"/>
-                <w:sz w:val="16"/>
-              </w:rPr>
-              <w:t>48</w:t>
-            </w:r>
-          </w:p>
-        </w:tc>
-        <w:tc>
-          <w:tcPr>
-            <w:tcW w:type="dxa" w:w="801"/>
-            <w:tcMar>
-              <w:left w:w="45" w:type="dxa"/>
-              <w:right w:w="45" w:type="dxa"/>
-            </w:tcMar>
-          </w:tcPr>
-          <w:p>
-            <w:pPr>
-              <w:keepNext/>
-              <w:spacing w:after="60" w:before="60" w:line="240" w:lineRule="auto"/>
-              <w:ind w:firstLine="0"/>
-              <w:jc w:val="center"/>
-            </w:pPr>
-            <w:r>
-              <w:rPr>
-                <w:b w:val="0"/>
-                <w:sz w:val="16"/>
-              </w:rPr>
-              <w:t>24/48</w:t>
-            </w:r>
-          </w:p>
-        </w:tc>
-        <w:tc>
-          <w:tcPr>
-            <w:tcW w:type="dxa" w:w="801"/>
-            <w:tcMar>
-              <w:left w:w="45" w:type="dxa"/>
-              <w:right w:w="45" w:type="dxa"/>
-            </w:tcMar>
-          </w:tcPr>
-          <w:p>
-            <w:pPr>
-              <w:keepNext/>
-              <w:spacing w:after="60" w:before="60" w:line="240" w:lineRule="auto"/>
-              <w:ind w:firstLine="0"/>
-              <w:jc w:val="center"/>
-            </w:pPr>
-            <w:r>
-              <w:rPr>
-                <w:b w:val="0"/>
-                <w:sz w:val="16"/>
-              </w:rPr>
-              <w:t>36/48</w:t>
-            </w:r>
-          </w:p>
-        </w:tc>
-      </w:tr>
-      <w:tr>
-        <w:trPr>
-          <w:cantSplit/>
-        </w:trPr>
-        <w:tc>
-          <w:tcPr>
-            <w:tcW w:type="dxa" w:w="1417"/>
-            <w:tcMar>
-              <w:left w:w="45" w:type="dxa"/>
-              <w:right w:w="45" w:type="dxa"/>
-            </w:tcMar>
-          </w:tcPr>
-          <w:p>
-            <w:pPr>
-              <w:keepNext/>
-              <w:spacing w:after="60" w:before="60" w:line="240" w:lineRule="auto"/>
-              <w:ind w:firstLine="0"/>
-              <w:jc w:val="left"/>
-            </w:pPr>
-            <w:r>
-              <w:rPr>
-                <w:b w:val="0"/>
-                <w:sz w:val="16"/>
-              </w:rPr>
-              <w:t>복원 표현 확장</w:t>
-            </w:r>
-          </w:p>
-        </w:tc>
-        <w:tc>
-          <w:tcPr>
-            <w:tcW w:type="dxa" w:w="801"/>
-            <w:tcMar>
-              <w:left w:w="45" w:type="dxa"/>
-              <w:right w:w="45" w:type="dxa"/>
-            </w:tcMar>
-          </w:tcPr>
-          <w:p>
-            <w:pPr>
-              <w:keepNext/>
-              <w:spacing w:after="60" w:before="60" w:line="240" w:lineRule="auto"/>
-              <w:ind w:firstLine="0"/>
-              <w:jc w:val="center"/>
-            </w:pPr>
-            <w:r>
-              <w:rPr>
-                <w:b w:val="0"/>
-                <w:sz w:val="16"/>
-              </w:rPr>
-              <w:t>Qwen3</w:t>
-            </w:r>
-          </w:p>
-        </w:tc>
-        <w:tc>
-          <w:tcPr>
-            <w:tcW w:type="dxa" w:w="801"/>
-            <w:tcMar>
-              <w:left w:w="45" w:type="dxa"/>
-              <w:right w:w="45" w:type="dxa"/>
-            </w:tcMar>
-          </w:tcPr>
-          <w:p>
-            <w:pPr>
-              <w:keepNext/>
-              <w:spacing w:after="60" w:before="60" w:line="240" w:lineRule="auto"/>
-              <w:ind w:firstLine="0"/>
-              <w:jc w:val="center"/>
-            </w:pPr>
-            <w:r>
-              <w:rPr>
-                <w:b w:val="0"/>
-                <w:sz w:val="16"/>
-              </w:rPr>
-              <w:t>32</w:t>
-            </w:r>
-          </w:p>
-        </w:tc>
-        <w:tc>
-          <w:tcPr>
-            <w:tcW w:type="dxa" w:w="801"/>
-            <w:tcMar>
-              <w:left w:w="45" w:type="dxa"/>
-              <w:right w:w="45" w:type="dxa"/>
-            </w:tcMar>
-          </w:tcPr>
-          <w:p>
-            <w:pPr>
-              <w:keepNext/>
-              <w:spacing w:after="60" w:before="60" w:line="240" w:lineRule="auto"/>
-              <w:ind w:firstLine="0"/>
-              <w:jc w:val="center"/>
-            </w:pPr>
-            <w:r>
-              <w:rPr>
-                <w:b w:val="0"/>
-                <w:sz w:val="16"/>
-              </w:rPr>
-              <w:t>14/32</w:t>
-            </w:r>
-          </w:p>
-        </w:tc>
-        <w:tc>
-          <w:tcPr>
-            <w:tcW w:type="dxa" w:w="801"/>
-            <w:tcMar>
-              <w:left w:w="45" w:type="dxa"/>
-              <w:right w:w="45" w:type="dxa"/>
-            </w:tcMar>
-          </w:tcPr>
-          <w:p>
-            <w:pPr>
-              <w:keepNext/>
-              <w:spacing w:after="60" w:before="60" w:line="240" w:lineRule="auto"/>
-              <w:ind w:firstLine="0"/>
-              <w:jc w:val="center"/>
-            </w:pPr>
-            <w:r>
-              <w:rPr>
-                <w:b w:val="0"/>
-                <w:sz w:val="16"/>
-              </w:rPr>
-              <w:t>28/32</w:t>
-            </w:r>
-          </w:p>
-        </w:tc>
-      </w:tr>
-      <w:tr>
-        <w:trPr>
-          <w:cantSplit/>
-        </w:trPr>
-        <w:tc>
-          <w:tcPr>
-            <w:tcW w:type="dxa" w:w="1417"/>
-            <w:tcMar>
-              <w:left w:w="45" w:type="dxa"/>
-              <w:right w:w="45" w:type="dxa"/>
-            </w:tcMar>
-          </w:tcPr>
-          <w:p>
-            <w:pPr>
-              <w:keepNext/>
-              <w:spacing w:after="60" w:before="60" w:line="240" w:lineRule="auto"/>
-              <w:ind w:firstLine="0"/>
-              <w:jc w:val="left"/>
-            </w:pPr>
-            <w:r>
-              <w:rPr>
-                <w:b w:val="0"/>
-                <w:sz w:val="16"/>
-              </w:rPr>
-              <w:t>복원 표현 확장</w:t>
-            </w:r>
-          </w:p>
-        </w:tc>
-        <w:tc>
-          <w:tcPr>
-            <w:tcW w:type="dxa" w:w="801"/>
-            <w:tcMar>
-              <w:left w:w="45" w:type="dxa"/>
-              <w:right w:w="45" w:type="dxa"/>
-            </w:tcMar>
-          </w:tcPr>
-          <w:p>
-            <w:pPr>
-              <w:keepNext/>
-              <w:spacing w:after="60" w:before="60" w:line="240" w:lineRule="auto"/>
-              <w:ind w:firstLine="0"/>
-              <w:jc w:val="center"/>
-            </w:pPr>
-            <w:r>
-              <w:rPr>
-                <w:b w:val="0"/>
-                <w:sz w:val="16"/>
-              </w:rPr>
-              <w:t>Llama</w:t>
-            </w:r>
-          </w:p>
-        </w:tc>
-        <w:tc>
-          <w:tcPr>
-            <w:tcW w:type="dxa" w:w="801"/>
-            <w:tcMar>
-              <w:left w:w="45" w:type="dxa"/>
-              <w:right w:w="45" w:type="dxa"/>
-            </w:tcMar>
-          </w:tcPr>
-          <w:p>
-            <w:pPr>
-              <w:keepNext/>
-              <w:spacing w:after="60" w:before="60" w:line="240" w:lineRule="auto"/>
-              <w:ind w:firstLine="0"/>
-              <w:jc w:val="center"/>
-            </w:pPr>
-            <w:r>
-              <w:rPr>
-                <w:b w:val="0"/>
-                <w:sz w:val="16"/>
-              </w:rPr>
-              <w:t>32</w:t>
-            </w:r>
-          </w:p>
-        </w:tc>
-        <w:tc>
-          <w:tcPr>
-            <w:tcW w:type="dxa" w:w="801"/>
-            <w:tcMar>
-              <w:left w:w="45" w:type="dxa"/>
-              <w:right w:w="45" w:type="dxa"/>
-            </w:tcMar>
-          </w:tcPr>
-          <w:p>
-            <w:pPr>
-              <w:keepNext/>
-              <w:spacing w:after="60" w:before="60" w:line="240" w:lineRule="auto"/>
-              <w:ind w:firstLine="0"/>
-              <w:jc w:val="center"/>
-            </w:pPr>
-            <w:r>
-              <w:rPr>
-                <w:b w:val="0"/>
-                <w:sz w:val="16"/>
-              </w:rPr>
-              <w:t>7/32</w:t>
-            </w:r>
-          </w:p>
-        </w:tc>
-        <w:tc>
-          <w:tcPr>
-            <w:tcW w:type="dxa" w:w="801"/>
-            <w:tcMar>
-              <w:left w:w="45" w:type="dxa"/>
-              <w:right w:w="45" w:type="dxa"/>
-            </w:tcMar>
-          </w:tcPr>
-          <w:p>
-            <w:pPr>
-              <w:keepNext/>
-              <w:spacing w:after="60" w:before="60" w:line="240" w:lineRule="auto"/>
-              <w:ind w:firstLine="0"/>
-              <w:jc w:val="center"/>
-            </w:pPr>
-            <w:r>
-              <w:rPr>
-                <w:b w:val="0"/>
-                <w:sz w:val="16"/>
-              </w:rPr>
-              <w:t>17/32</w:t>
-            </w:r>
-          </w:p>
-        </w:tc>
-      </w:tr>
-      <w:tr>
-        <w:trPr>
-          <w:cantSplit/>
-        </w:trPr>
-        <w:tc>
-          <w:tcPr>
-            <w:tcW w:type="dxa" w:w="1417"/>
-            <w:tcMar>
-              <w:left w:w="45" w:type="dxa"/>
-              <w:right w:w="45" w:type="dxa"/>
-            </w:tcMar>
-          </w:tcPr>
-          <w:p>
-            <w:pPr>
-              <w:keepNext/>
-              <w:spacing w:after="60" w:before="60" w:line="240" w:lineRule="auto"/>
-              <w:ind w:firstLine="0"/>
-              <w:jc w:val="left"/>
-            </w:pPr>
-            <w:r>
-              <w:rPr>
-                <w:b w:val="0"/>
-                <w:sz w:val="16"/>
-              </w:rPr>
-              <w:t>실행 대상 검사</w:t>
-            </w:r>
-          </w:p>
-        </w:tc>
-        <w:tc>
-          <w:tcPr>
-            <w:tcW w:type="dxa" w:w="801"/>
-            <w:tcMar>
-              <w:left w:w="45" w:type="dxa"/>
-              <w:right w:w="45" w:type="dxa"/>
-            </w:tcMar>
-          </w:tcPr>
-          <w:p>
-            <w:pPr>
-              <w:keepNext/>
-              <w:spacing w:after="60" w:before="60" w:line="240" w:lineRule="auto"/>
-              <w:ind w:firstLine="0"/>
-              <w:jc w:val="center"/>
-            </w:pPr>
-            <w:r>
-              <w:rPr>
-                <w:b w:val="0"/>
-                <w:sz w:val="16"/>
-              </w:rPr>
-              <w:t>Qwen3</w:t>
-            </w:r>
-          </w:p>
-        </w:tc>
-        <w:tc>
-          <w:tcPr>
-            <w:tcW w:type="dxa" w:w="801"/>
-            <w:tcMar>
-              <w:left w:w="45" w:type="dxa"/>
-              <w:right w:w="45" w:type="dxa"/>
-            </w:tcMar>
-          </w:tcPr>
-          <w:p>
-            <w:pPr>
-              <w:keepNext/>
-              <w:spacing w:after="60" w:before="60" w:line="240" w:lineRule="auto"/>
-              <w:ind w:firstLine="0"/>
-              <w:jc w:val="center"/>
-            </w:pPr>
-            <w:r>
-              <w:rPr>
-                <w:b w:val="0"/>
-                <w:sz w:val="16"/>
-              </w:rPr>
-              <w:t>16</w:t>
-            </w:r>
-          </w:p>
-        </w:tc>
-        <w:tc>
-          <w:tcPr>
-            <w:tcW w:type="dxa" w:w="801"/>
-            <w:tcMar>
-              <w:left w:w="45" w:type="dxa"/>
-              <w:right w:w="45" w:type="dxa"/>
-            </w:tcMar>
-          </w:tcPr>
-          <w:p>
-            <w:pPr>
-              <w:keepNext/>
-              <w:spacing w:after="60" w:before="60" w:line="240" w:lineRule="auto"/>
-              <w:ind w:firstLine="0"/>
-              <w:jc w:val="center"/>
-            </w:pPr>
-            <w:r>
-              <w:rPr>
-                <w:b w:val="0"/>
-                <w:sz w:val="16"/>
-              </w:rPr>
-              <w:t>9/16</w:t>
-            </w:r>
-          </w:p>
-        </w:tc>
-        <w:tc>
-          <w:tcPr>
-            <w:tcW w:type="dxa" w:w="801"/>
-            <w:tcMar>
-              <w:left w:w="45" w:type="dxa"/>
-              <w:right w:w="45" w:type="dxa"/>
-            </w:tcMar>
-          </w:tcPr>
-          <w:p>
-            <w:pPr>
-              <w:keepNext/>
-              <w:spacing w:after="60" w:before="60" w:line="240" w:lineRule="auto"/>
-              <w:ind w:firstLine="0"/>
-              <w:jc w:val="center"/>
-            </w:pPr>
-            <w:r>
-              <w:rPr>
-                <w:b w:val="0"/>
-                <w:sz w:val="16"/>
-              </w:rPr>
-              <w:t>16/16</w:t>
-            </w:r>
-          </w:p>
-        </w:tc>
-      </w:tr>
-      <w:tr>
-        <w:trPr>
-          <w:cantSplit/>
-        </w:trPr>
-        <w:tc>
-          <w:tcPr>
-            <w:tcW w:type="dxa" w:w="1417"/>
-            <w:tcMar>
-              <w:left w:w="45" w:type="dxa"/>
-              <w:right w:w="45" w:type="dxa"/>
-            </w:tcMar>
-            <w:tcBorders>
-              <w:bottom w:val="single" w:sz="5"/>
-            </w:tcBorders>
-          </w:tcPr>
-          <w:p>
-            <w:pPr>
-              <w:keepNext w:val="0"/>
-              <w:spacing w:after="60" w:before="60" w:line="240" w:lineRule="auto"/>
-              <w:ind w:firstLine="0"/>
-              <w:jc w:val="left"/>
-            </w:pPr>
-            <w:r>
-              <w:rPr>
-                <w:b w:val="0"/>
-                <w:sz w:val="16"/>
-              </w:rPr>
-              <w:t>실행 대상 검사</w:t>
-            </w:r>
-          </w:p>
-        </w:tc>
-        <w:tc>
-          <w:tcPr>
-            <w:tcW w:type="dxa" w:w="801"/>
-            <w:tcMar>
-              <w:left w:w="45" w:type="dxa"/>
-              <w:right w:w="45" w:type="dxa"/>
-            </w:tcMar>
-            <w:tcBorders>
-              <w:bottom w:val="single" w:sz="5"/>
-            </w:tcBorders>
-          </w:tcPr>
-          <w:p>
-            <w:pPr>
-              <w:keepNext w:val="0"/>
-              <w:spacing w:after="60" w:before="60" w:line="240" w:lineRule="auto"/>
-              <w:ind w:firstLine="0"/>
-              <w:jc w:val="center"/>
-            </w:pPr>
-            <w:r>
-              <w:rPr>
-                <w:b w:val="0"/>
-                <w:sz w:val="16"/>
-              </w:rPr>
-              <w:t>Llama</w:t>
-            </w:r>
-          </w:p>
-        </w:tc>
-        <w:tc>
-          <w:tcPr>
-            <w:tcW w:type="dxa" w:w="801"/>
-            <w:tcMar>
-              <w:left w:w="45" w:type="dxa"/>
-              <w:right w:w="45" w:type="dxa"/>
-            </w:tcMar>
-            <w:tcBorders>
-              <w:bottom w:val="single" w:sz="5"/>
-            </w:tcBorders>
-          </w:tcPr>
-          <w:p>
-            <w:pPr>
-              <w:keepNext w:val="0"/>
-              <w:spacing w:after="60" w:before="60" w:line="240" w:lineRule="auto"/>
-              <w:ind w:firstLine="0"/>
-              <w:jc w:val="center"/>
-            </w:pPr>
-            <w:r>
-              <w:rPr>
-                <w:b w:val="0"/>
-                <w:sz w:val="16"/>
-              </w:rPr>
-              <w:t>16</w:t>
-            </w:r>
-          </w:p>
-        </w:tc>
-        <w:tc>
-          <w:tcPr>
-            <w:tcW w:type="dxa" w:w="801"/>
-            <w:tcMar>
-              <w:left w:w="45" w:type="dxa"/>
-              <w:right w:w="45" w:type="dxa"/>
-            </w:tcMar>
-            <w:tcBorders>
-              <w:bottom w:val="single" w:sz="5"/>
-            </w:tcBorders>
-          </w:tcPr>
-          <w:p>
-            <w:pPr>
-              <w:keepNext w:val="0"/>
-              <w:spacing w:after="60" w:before="60" w:line="240" w:lineRule="auto"/>
-              <w:ind w:firstLine="0"/>
-              <w:jc w:val="center"/>
-            </w:pPr>
-            <w:r>
-              <w:rPr>
-                <w:b w:val="0"/>
-                <w:sz w:val="16"/>
-              </w:rPr>
-              <w:t>0/16</w:t>
-            </w:r>
-          </w:p>
-        </w:tc>
-        <w:tc>
-          <w:tcPr>
-            <w:tcW w:type="dxa" w:w="801"/>
-            <w:tcMar>
-              <w:left w:w="45" w:type="dxa"/>
-              <w:right w:w="45" w:type="dxa"/>
-            </w:tcMar>
-            <w:tcBorders>
-              <w:bottom w:val="single" w:sz="5"/>
-            </w:tcBorders>
-          </w:tcPr>
-          <w:p>
-            <w:pPr>
-              <w:keepNext w:val="0"/>
-              <w:spacing w:after="60" w:before="60" w:line="240" w:lineRule="auto"/>
-              <w:ind w:firstLine="0"/>
-              <w:jc w:val="center"/>
-            </w:pPr>
-            <w:r>
-              <w:rPr>
-                <w:b w:val="0"/>
-                <w:sz w:val="16"/>
-              </w:rPr>
-              <w:t>0/16</w:t>
-            </w:r>
-          </w:p>
-        </w:tc>
-      </w:tr>
-    </w:tbl>
-    <w:p>
-      <w:pPr>
-        <w:jc w:val="both"/>
-      </w:pPr>
-      <w:r>
-        <w:t>표현만 바꾼 개발 자료 32개에서 기존 규칙은 25/32였다. 복원 지시 뒤의 leaving·preserving 구절까지 복원 대상에 포함하거나 bring back을 복원으로 인식하지 못하였다. 구절 정규화는 이러한 적용 범위를 분리하였다. 그러나 표현·순서 변경 검증에서 규칙에 없는 복원 표현을 포함한 요청은 0/8이었다. 이를 분석해 복원 표현을 확장한 뒤 새 요청 32개로 검증하였다.</w:t>
+        <w:t>복원 표현의 적용 범위도 결과에 영향을 주었다. 구절을 분리한 비교에서는 Qwen3의 일치 건수가 9/16에서 16/16으로 증가하였지만, 표현과 순서를 바꾼 검증에서 기존 규칙에 없는 복원 표현은 0/8이었다. 복원 표현을 확장한 뒤 별도의 요청 32개에 적용한 결과는 Qwen3 14/32에서 28/32, Llama 7/32에서 17/32였다. 문장 구조를 분리하는 처리와 지원 어휘의 범위가 함께 작용한 결과이다.</w:t>
       </w:r>
     </w:p>
     <w:p>
@@ -4898,7 +3171,15 @@
         <w:jc w:val="both"/>
       </w:pPr>
       <w:r>
-        <w:t>실행 대상 검증에서 Qwen3는 조건부·인용 지시를 실행하는 오류가 줄었다. Llama는 네 대화의 초기 설정을 첫 응답에서는 모두 맞혔으나, 재검토가 목걸이 삭제 등 일부 항목만 반환하여 이후 요청까지 오류가 이어졌다. 그 결과 검사 전후 모두 0/16이었다. 이 실패를 바탕으로 첫 응답에만 검사를 적용하는 방법을 비교하였다.</w:t>
+        <w:t>실행 대상 검사 검증에서 Qwen3는 조건문·인용문을 실제 명령으로 적용하는 오류가 줄어 9/16에서 16/16으로 증가하였다. 같은 검증의 Llama는 검사 전후 모두 0/16이었다. 최초 응답이 맞혔던 초기 설정을 재검토 응답이 일부 항목만 남겨 반환하면서 후속 상태까지 오류가 이어졌다. 이러한 응답 선택의 영향은 표 1의 한 번 추출 조건을 비교하게 된 근거이다.</w:t>
+      </w:r>
+    </w:p>
+    <w:p>
+      <w:pPr>
+        <w:jc w:val="both"/>
+      </w:pPr>
+      <w:r>
+        <w:t>표정·포즈를 포함한 요청 48개에서는 표정만 지정한 조건과 표정·포즈 조건이 각각 모든 방법에서 16/16이었다. 삭제·복원 등의 속성 지시를 섞은 조건은 최초 추출과 재검토가 각각 4/16, 규칙 보정은 16/16이었고 항목별 일치는 각각 124/144, 124/144, 144/144였다. 삭제 규칙만 적용한 사후 재계산도 요청 48개가 모두 일치하였다. 포즈를 제외한 짧은 대조 요청 8개에서는 최초 추출과 재검토가 각각 7/8이었다. 관찰한 오류는 포즈값의 추출보다 삭제를 원본 복원으로 처리한 부분에 집중되었다. 정답 조건을 입력해 생성한 이미지 6장의 AI 평가에는 형식 오류 두 개와 몸 방향의 설명·점수 불일치가 있었다.</w:t>
       </w:r>
     </w:p>
     <w:p>
@@ -4906,7 +3187,7 @@
         <w:pStyle w:val="Heading2"/>
       </w:pPr>
       <w:r>
-        <w:t>4. 포즈·표정을 포함한 요청</w:t>
+        <w:t>3. 입력 이미지 선택과 유지 및 삭제의 적용</w:t>
       </w:r>
     </w:p>
     <w:p>
@@ -4914,477 +3195,7 @@
         <w:jc w:val="both"/>
       </w:pPr>
       <w:r>
-        <w:t>아홉 항목의 전체 상태 일치율은 표 6과 같다. 표정·몸 방향·손동작은 모든 방법에서 정확히 추출되었다. 속성 지시를 섞은 조건에서는 식물과 목걸이 삭제를 원본 복원으로 해석한 오류가 재검토에도 남았다.</w:t>
-      </w:r>
-    </w:p>
-    <w:p>
-      <w:pPr>
-        <w:pStyle w:val="Caption"/>
-        <w:keepNext/>
-        <w:spacing w:before="100"/>
-        <w:ind w:firstLine="0"/>
-        <w:jc w:val="center"/>
-      </w:pPr>
-      <w:r>
-        <w:t>표 6. 복합 요청의 전체 상태 일치율</w:t>
-      </w:r>
-    </w:p>
-    <w:tbl>
-      <w:tblPr>
-        <w:tblW w:type="auto" w:w="0"/>
-        <w:tblLayout w:type="fixed"/>
-        <w:tblLook w:firstColumn="1" w:firstRow="1" w:lastColumn="0" w:lastRow="0" w:noHBand="0" w:noVBand="1" w:val="04A0"/>
-      </w:tblPr>
-      <w:tblGrid>
-        <w:gridCol w:w="1417"/>
-        <w:gridCol w:w="1068"/>
-        <w:gridCol w:w="1068"/>
-        <w:gridCol w:w="1068"/>
-      </w:tblGrid>
-      <w:tr>
-        <w:trPr>
-          <w:cantSplit/>
-          <w:tblHeader/>
-        </w:trPr>
-        <w:tc>
-          <w:tcPr>
-            <w:tcW w:type="dxa" w:w="1417"/>
-            <w:tcMar>
-              <w:left w:w="45" w:type="dxa"/>
-              <w:right w:w="45" w:type="dxa"/>
-            </w:tcMar>
-            <w:tcBorders>
-              <w:bottom w:val="single" w:sz="5"/>
-            </w:tcBorders>
-          </w:tcPr>
-          <w:p>
-            <w:pPr>
-              <w:keepNext/>
-              <w:spacing w:after="60" w:before="60" w:line="240" w:lineRule="auto"/>
-              <w:ind w:firstLine="0"/>
-              <w:jc w:val="left"/>
-            </w:pPr>
-            <w:r>
-              <w:rPr>
-                <w:b/>
-                <w:sz w:val="16"/>
-              </w:rPr>
-              <w:t>요청 조건</w:t>
-            </w:r>
-          </w:p>
-        </w:tc>
-        <w:tc>
-          <w:tcPr>
-            <w:tcW w:type="dxa" w:w="1068"/>
-            <w:tcMar>
-              <w:left w:w="45" w:type="dxa"/>
-              <w:right w:w="45" w:type="dxa"/>
-            </w:tcMar>
-            <w:tcBorders>
-              <w:bottom w:val="single" w:sz="5"/>
-            </w:tcBorders>
-          </w:tcPr>
-          <w:p>
-            <w:pPr>
-              <w:keepNext/>
-              <w:spacing w:after="60" w:before="60" w:line="240" w:lineRule="auto"/>
-              <w:ind w:firstLine="0"/>
-              <w:jc w:val="center"/>
-            </w:pPr>
-            <w:r>
-              <w:rPr>
-                <w:b/>
-                <w:sz w:val="16"/>
-              </w:rPr>
-              <w:t>최초 추출</w:t>
-            </w:r>
-          </w:p>
-        </w:tc>
-        <w:tc>
-          <w:tcPr>
-            <w:tcW w:type="dxa" w:w="1068"/>
-            <w:tcMar>
-              <w:left w:w="45" w:type="dxa"/>
-              <w:right w:w="45" w:type="dxa"/>
-            </w:tcMar>
-            <w:tcBorders>
-              <w:bottom w:val="single" w:sz="5"/>
-            </w:tcBorders>
-          </w:tcPr>
-          <w:p>
-            <w:pPr>
-              <w:keepNext/>
-              <w:spacing w:after="60" w:before="60" w:line="240" w:lineRule="auto"/>
-              <w:ind w:firstLine="0"/>
-              <w:jc w:val="center"/>
-            </w:pPr>
-            <w:r>
-              <w:rPr>
-                <w:b/>
-                <w:sz w:val="16"/>
-              </w:rPr>
-              <w:t>재검토</w:t>
-            </w:r>
-          </w:p>
-        </w:tc>
-        <w:tc>
-          <w:tcPr>
-            <w:tcW w:type="dxa" w:w="1068"/>
-            <w:tcMar>
-              <w:left w:w="45" w:type="dxa"/>
-              <w:right w:w="45" w:type="dxa"/>
-            </w:tcMar>
-            <w:tcBorders>
-              <w:bottom w:val="single" w:sz="5"/>
-            </w:tcBorders>
-          </w:tcPr>
-          <w:p>
-            <w:pPr>
-              <w:keepNext/>
-              <w:spacing w:after="60" w:before="60" w:line="240" w:lineRule="auto"/>
-              <w:ind w:firstLine="0"/>
-              <w:jc w:val="center"/>
-            </w:pPr>
-            <w:r>
-              <w:rPr>
-                <w:b/>
-                <w:sz w:val="16"/>
-              </w:rPr>
-              <w:t>규칙 보정</w:t>
-            </w:r>
-          </w:p>
-        </w:tc>
-      </w:tr>
-      <w:tr>
-        <w:trPr>
-          <w:cantSplit/>
-        </w:trPr>
-        <w:tc>
-          <w:tcPr>
-            <w:tcW w:type="dxa" w:w="1417"/>
-            <w:tcMar>
-              <w:left w:w="45" w:type="dxa"/>
-              <w:right w:w="45" w:type="dxa"/>
-            </w:tcMar>
-          </w:tcPr>
-          <w:p>
-            <w:pPr>
-              <w:keepNext/>
-              <w:spacing w:after="60" w:before="60" w:line="240" w:lineRule="auto"/>
-              <w:ind w:firstLine="0"/>
-              <w:jc w:val="left"/>
-            </w:pPr>
-            <w:r>
-              <w:rPr>
-                <w:b w:val="0"/>
-                <w:sz w:val="16"/>
-              </w:rPr>
-              <w:t>표정</w:t>
-            </w:r>
-          </w:p>
-        </w:tc>
-        <w:tc>
-          <w:tcPr>
-            <w:tcW w:type="dxa" w:w="1068"/>
-            <w:tcMar>
-              <w:left w:w="45" w:type="dxa"/>
-              <w:right w:w="45" w:type="dxa"/>
-            </w:tcMar>
-          </w:tcPr>
-          <w:p>
-            <w:pPr>
-              <w:keepNext/>
-              <w:spacing w:after="60" w:before="60" w:line="240" w:lineRule="auto"/>
-              <w:ind w:firstLine="0"/>
-              <w:jc w:val="center"/>
-            </w:pPr>
-            <w:r>
-              <w:rPr>
-                <w:b w:val="0"/>
-                <w:sz w:val="16"/>
-              </w:rPr>
-              <w:t>16/16</w:t>
-            </w:r>
-          </w:p>
-        </w:tc>
-        <w:tc>
-          <w:tcPr>
-            <w:tcW w:type="dxa" w:w="1068"/>
-            <w:tcMar>
-              <w:left w:w="45" w:type="dxa"/>
-              <w:right w:w="45" w:type="dxa"/>
-            </w:tcMar>
-          </w:tcPr>
-          <w:p>
-            <w:pPr>
-              <w:keepNext/>
-              <w:spacing w:after="60" w:before="60" w:line="240" w:lineRule="auto"/>
-              <w:ind w:firstLine="0"/>
-              <w:jc w:val="center"/>
-            </w:pPr>
-            <w:r>
-              <w:rPr>
-                <w:b w:val="0"/>
-                <w:sz w:val="16"/>
-              </w:rPr>
-              <w:t>16/16</w:t>
-            </w:r>
-          </w:p>
-        </w:tc>
-        <w:tc>
-          <w:tcPr>
-            <w:tcW w:type="dxa" w:w="1068"/>
-            <w:tcMar>
-              <w:left w:w="45" w:type="dxa"/>
-              <w:right w:w="45" w:type="dxa"/>
-            </w:tcMar>
-          </w:tcPr>
-          <w:p>
-            <w:pPr>
-              <w:keepNext/>
-              <w:spacing w:after="60" w:before="60" w:line="240" w:lineRule="auto"/>
-              <w:ind w:firstLine="0"/>
-              <w:jc w:val="center"/>
-            </w:pPr>
-            <w:r>
-              <w:rPr>
-                <w:b w:val="0"/>
-                <w:sz w:val="16"/>
-              </w:rPr>
-              <w:t>16/16</w:t>
-            </w:r>
-          </w:p>
-        </w:tc>
-      </w:tr>
-      <w:tr>
-        <w:trPr>
-          <w:cantSplit/>
-        </w:trPr>
-        <w:tc>
-          <w:tcPr>
-            <w:tcW w:type="dxa" w:w="1417"/>
-            <w:tcMar>
-              <w:left w:w="45" w:type="dxa"/>
-              <w:right w:w="45" w:type="dxa"/>
-            </w:tcMar>
-          </w:tcPr>
-          <w:p>
-            <w:pPr>
-              <w:keepNext/>
-              <w:spacing w:after="60" w:before="60" w:line="240" w:lineRule="auto"/>
-              <w:ind w:firstLine="0"/>
-              <w:jc w:val="left"/>
-            </w:pPr>
-            <w:r>
-              <w:rPr>
-                <w:b w:val="0"/>
-                <w:sz w:val="16"/>
-              </w:rPr>
-              <w:t>표정·포즈</w:t>
-            </w:r>
-          </w:p>
-        </w:tc>
-        <w:tc>
-          <w:tcPr>
-            <w:tcW w:type="dxa" w:w="1068"/>
-            <w:tcMar>
-              <w:left w:w="45" w:type="dxa"/>
-              <w:right w:w="45" w:type="dxa"/>
-            </w:tcMar>
-          </w:tcPr>
-          <w:p>
-            <w:pPr>
-              <w:keepNext/>
-              <w:spacing w:after="60" w:before="60" w:line="240" w:lineRule="auto"/>
-              <w:ind w:firstLine="0"/>
-              <w:jc w:val="center"/>
-            </w:pPr>
-            <w:r>
-              <w:rPr>
-                <w:b w:val="0"/>
-                <w:sz w:val="16"/>
-              </w:rPr>
-              <w:t>16/16</w:t>
-            </w:r>
-          </w:p>
-        </w:tc>
-        <w:tc>
-          <w:tcPr>
-            <w:tcW w:type="dxa" w:w="1068"/>
-            <w:tcMar>
-              <w:left w:w="45" w:type="dxa"/>
-              <w:right w:w="45" w:type="dxa"/>
-            </w:tcMar>
-          </w:tcPr>
-          <w:p>
-            <w:pPr>
-              <w:keepNext/>
-              <w:spacing w:after="60" w:before="60" w:line="240" w:lineRule="auto"/>
-              <w:ind w:firstLine="0"/>
-              <w:jc w:val="center"/>
-            </w:pPr>
-            <w:r>
-              <w:rPr>
-                <w:b w:val="0"/>
-                <w:sz w:val="16"/>
-              </w:rPr>
-              <w:t>16/16</w:t>
-            </w:r>
-          </w:p>
-        </w:tc>
-        <w:tc>
-          <w:tcPr>
-            <w:tcW w:type="dxa" w:w="1068"/>
-            <w:tcMar>
-              <w:left w:w="45" w:type="dxa"/>
-              <w:right w:w="45" w:type="dxa"/>
-            </w:tcMar>
-          </w:tcPr>
-          <w:p>
-            <w:pPr>
-              <w:keepNext/>
-              <w:spacing w:after="60" w:before="60" w:line="240" w:lineRule="auto"/>
-              <w:ind w:firstLine="0"/>
-              <w:jc w:val="center"/>
-            </w:pPr>
-            <w:r>
-              <w:rPr>
-                <w:b w:val="0"/>
-                <w:sz w:val="16"/>
-              </w:rPr>
-              <w:t>16/16</w:t>
-            </w:r>
-          </w:p>
-        </w:tc>
-      </w:tr>
-      <w:tr>
-        <w:trPr>
-          <w:cantSplit/>
-        </w:trPr>
-        <w:tc>
-          <w:tcPr>
-            <w:tcW w:type="dxa" w:w="1417"/>
-            <w:tcMar>
-              <w:left w:w="45" w:type="dxa"/>
-              <w:right w:w="45" w:type="dxa"/>
-            </w:tcMar>
-            <w:tcBorders>
-              <w:bottom w:val="single" w:sz="5"/>
-            </w:tcBorders>
-          </w:tcPr>
-          <w:p>
-            <w:pPr>
-              <w:keepNext w:val="0"/>
-              <w:spacing w:after="60" w:before="60" w:line="240" w:lineRule="auto"/>
-              <w:ind w:firstLine="0"/>
-              <w:jc w:val="left"/>
-            </w:pPr>
-            <w:r>
-              <w:rPr>
-                <w:b w:val="0"/>
-                <w:sz w:val="16"/>
-              </w:rPr>
-              <w:t>속성 지시 혼합</w:t>
-            </w:r>
-          </w:p>
-        </w:tc>
-        <w:tc>
-          <w:tcPr>
-            <w:tcW w:type="dxa" w:w="1068"/>
-            <w:tcMar>
-              <w:left w:w="45" w:type="dxa"/>
-              <w:right w:w="45" w:type="dxa"/>
-            </w:tcMar>
-            <w:tcBorders>
-              <w:bottom w:val="single" w:sz="5"/>
-            </w:tcBorders>
-          </w:tcPr>
-          <w:p>
-            <w:pPr>
-              <w:keepNext w:val="0"/>
-              <w:spacing w:after="60" w:before="60" w:line="240" w:lineRule="auto"/>
-              <w:ind w:firstLine="0"/>
-              <w:jc w:val="center"/>
-            </w:pPr>
-            <w:r>
-              <w:rPr>
-                <w:b w:val="0"/>
-                <w:sz w:val="16"/>
-              </w:rPr>
-              <w:t>4/16</w:t>
-            </w:r>
-          </w:p>
-        </w:tc>
-        <w:tc>
-          <w:tcPr>
-            <w:tcW w:type="dxa" w:w="1068"/>
-            <w:tcMar>
-              <w:left w:w="45" w:type="dxa"/>
-              <w:right w:w="45" w:type="dxa"/>
-            </w:tcMar>
-            <w:tcBorders>
-              <w:bottom w:val="single" w:sz="5"/>
-            </w:tcBorders>
-          </w:tcPr>
-          <w:p>
-            <w:pPr>
-              <w:keepNext w:val="0"/>
-              <w:spacing w:after="60" w:before="60" w:line="240" w:lineRule="auto"/>
-              <w:ind w:firstLine="0"/>
-              <w:jc w:val="center"/>
-            </w:pPr>
-            <w:r>
-              <w:rPr>
-                <w:b w:val="0"/>
-                <w:sz w:val="16"/>
-              </w:rPr>
-              <w:t>4/16</w:t>
-            </w:r>
-          </w:p>
-        </w:tc>
-        <w:tc>
-          <w:tcPr>
-            <w:tcW w:type="dxa" w:w="1068"/>
-            <w:tcMar>
-              <w:left w:w="45" w:type="dxa"/>
-              <w:right w:w="45" w:type="dxa"/>
-            </w:tcMar>
-            <w:tcBorders>
-              <w:bottom w:val="single" w:sz="5"/>
-            </w:tcBorders>
-          </w:tcPr>
-          <w:p>
-            <w:pPr>
-              <w:keepNext w:val="0"/>
-              <w:spacing w:after="60" w:before="60" w:line="240" w:lineRule="auto"/>
-              <w:ind w:firstLine="0"/>
-              <w:jc w:val="center"/>
-            </w:pPr>
-            <w:r>
-              <w:rPr>
-                <w:b w:val="0"/>
-                <w:sz w:val="16"/>
-              </w:rPr>
-              <w:t>16/16</w:t>
-            </w:r>
-          </w:p>
-        </w:tc>
-      </w:tr>
-    </w:tbl>
-    <w:p>
-      <w:pPr>
-        <w:jc w:val="both"/>
-      </w:pPr>
-      <w:r>
-        <w:t>혼합 조건의 항목별 일치율은 최초 추출과 재검토가 각각 124/144, 규칙 보정은 144/144였다. 삭제 규칙만 적용한 사후 재계산도 요청 48개를 모두 맞혔다. 포즈를 제외한 짧은 대조 요청 8개에서도 최초 추출과 재검토는 각각 7/8이었다. 이는 혼합 조건에서 관찰한 오류가 몸 방향 자체보다 삭제·복원 지시의 결합에서 발생했음을 뒷받침한다.</w:t>
-      </w:r>
-    </w:p>
-    <w:p>
-      <w:pPr>
-        <w:jc w:val="both"/>
-      </w:pPr>
-      <w:r>
-        <w:t>정확한 요청을 직접 입력해 생성한 이미지 6장의 AI 평가에는 형식 오류 두 개와 몸 방향의 설명·점수 불일치가 있었다. 요청 해석의 정확도와 생성 이미지의 평가 결과를 분리하여 기록하였다.</w:t>
+        <w:t>초기 합성 인물 실험에서 순차 편집의 위치 보정 LPIPS 평균은 1단계 0.042116, 5단계 0.173505, 10단계 0.364015였다. 동일한 최종 요구를 적용한 원본 기반 재생성은 위치 보정 MAE, SSIM, LPIPS 모두 6/6쌍에서 순차 편집보다 원본에 가까웠다. 보정 전에는 각 지표가 5/6쌍에서 같은 방향이었으며, sigma 1과 6에서도 보정 후 방향이 유지되었다. 이 비교를 바탕으로 후속 생성에는 최초 사진과 현재 조건을 사용하는 구성을 채택하였다.</w:t>
       </w:r>
     </w:p>
     <w:p>
@@ -5401,14 +3212,6 @@
     </w:p>
     <w:p>
       <w:pPr>
-        <w:pStyle w:val="Heading2"/>
-      </w:pPr>
-      <w:r>
-        <w:t>5. 유지와 삭제 처리에 따른 생성 결과</w:t>
-      </w:r>
-    </w:p>
-    <w:p>
-      <w:pPr>
         <w:keepNext/>
         <w:spacing w:line="240" w:lineRule="auto"/>
         <w:ind w:firstLine="0"/>
@@ -5418,7 +3221,7 @@
         <w:drawing>
           <wp:inline xmlns:a="http://schemas.openxmlformats.org/drawingml/2006/main" xmlns:pic="http://schemas.openxmlformats.org/drawingml/2006/picture">
             <wp:extent cx="5760000" cy="1165599"/>
-            <wp:docPr id="1" name="Picture 1" descr="그림 1 식물 삭제와 배경 유지 요청의 편집 결과"/>
+            <wp:docPr id="2" name="Picture 2" descr="그림 2 식물 삭제와 배경 유지 요청의 편집 결과"/>
             <wp:cNvGraphicFramePr>
               <a:graphicFrameLocks noChangeAspect="1"/>
             </wp:cNvGraphicFramePr>
@@ -5430,7 +3233,7 @@
                     <pic:cNvPicPr/>
                   </pic:nvPicPr>
                   <pic:blipFill>
-                    <a:blip r:embed="rId9"/>
+                    <a:blip r:embed="rId10"/>
                     <a:stretch>
                       <a:fillRect/>
                     </a:stretch>
@@ -5455,7 +3258,7 @@
         <w:ind w:firstLine="0"/>
       </w:pPr>
       <w:r>
-        <w:t>그림 1 식물 삭제와 배경 유지 요청의 편집 결과</w:t>
+        <w:t>그림 2 식물 삭제와 배경 유지 요청의 편집 결과</w:t>
       </w:r>
     </w:p>
     <w:p>
@@ -5475,7 +3278,31 @@
         <w:jc w:val="both"/>
       </w:pPr>
       <w:r>
-        <w:t>그림 1은 R01의 두 요청을 비교한 예이다. 세 번째 요청에서 기준 출력에 남은 식물이 결합 출력에서는 사라진다. 네 번째 요청에서는 기준 출력에 원본 배경이 남고, 결합 출력에서는 앞서 정한 파란 배경이 유지된다.</w:t>
+        <w:t>그림 2는 표 3의 기준 방법과 유지·삭제 결합을 실제 인물 R01에 적용한 사례이다. 세 번째 요청에서는 기준 출력에 남은 식물이 규칙 결합 출력에서 사라지고, 네 번째 요청에서는 앞서 정한 파란 배경이 유지된다. 각 방법의 64조건에서 여섯 목표를 평가한 결과는 3B 기준 350/384와 결합 358/384, 7B 기준 372/384와 결합 374/384였다. 판단 불가는 3B에서 각각 20개와 13개, 7B에서 모두 0개였다.</w:t>
+      </w:r>
+    </w:p>
+    <w:p>
+      <w:pPr>
+        <w:jc w:val="both"/>
+      </w:pPr>
+      <w:r>
+        <w:t>3B에서 증가한 성공 항목 8개 중 6개는 판단 불가에서, 2개는 실패에서 바뀌었다. 7B에서도 설명과 점수가 모순된 응답이 있었으며, 두 평가에서 공통으로 실패에서 성공으로 바뀐 항목은 R02의 배경 한 개였다. 얼굴 코사인 평균은 기준 0.910458, 결합 0.910535였고 입력이 다른 네 쌍 중 두 쌍에서 증가하고 두 쌍에서 감소하였다. 이 사례는 상태 보정이 생성 조건을 바꾸는 과정을 보여주며, 이미지 집계에는 입력이 같은 쌍도 포함되어 있다.</w:t>
+      </w:r>
+    </w:p>
+    <w:p>
+      <w:pPr>
+        <w:pStyle w:val="Heading2"/>
+      </w:pPr>
+      <w:r>
+        <w:t>4. 프롬프트 길이와 편집 목표 충족</w:t>
+      </w:r>
+    </w:p>
+    <w:p>
+      <w:pPr>
+        <w:jc w:val="both"/>
+      </w:pPr>
+      <w:r>
+        <w:t>표 4는 세 대화의 마지막 요청에서 측정한 입력 길이이다. 검사 후 저장한 조건은 전체 요청 이력보다 평균 토큰 수가 39.87% 적었다. 중간 요청을 포함한 12개 묶음의 평균은 전체 이력 168.75토큰, 검사 후 조건 129.25토큰이었다. 첫 요청에서는 항목을 명시한 상태 표현이 더 길었으나, 두 번째 요청부터 세 대화 모두 저장한 조건을 전달하는 방식이 짧았다.</w:t>
       </w:r>
     </w:p>
     <w:p>
@@ -5487,388 +3314,7 @@
         <w:jc w:val="center"/>
       </w:pPr>
       <w:r>
-        <w:t>표 7. 유지·삭제 규칙의 AI 이미지 평가</w:t>
-      </w:r>
-    </w:p>
-    <w:tbl>
-      <w:tblPr>
-        <w:tblW w:type="auto" w:w="0"/>
-        <w:tblLayout w:type="fixed"/>
-        <w:tblLook w:firstColumn="1" w:firstRow="1" w:lastColumn="0" w:lastRow="0" w:noHBand="0" w:noVBand="1" w:val="04A0"/>
-      </w:tblPr>
-      <w:tblGrid>
-        <w:gridCol w:w="1417"/>
-        <w:gridCol w:w="1068"/>
-        <w:gridCol w:w="1068"/>
-        <w:gridCol w:w="1068"/>
-      </w:tblGrid>
-      <w:tr>
-        <w:trPr>
-          <w:cantSplit/>
-          <w:tblHeader/>
-        </w:trPr>
-        <w:tc>
-          <w:tcPr>
-            <w:tcW w:type="dxa" w:w="1417"/>
-            <w:tcMar>
-              <w:left w:w="45" w:type="dxa"/>
-              <w:right w:w="45" w:type="dxa"/>
-            </w:tcMar>
-            <w:tcBorders>
-              <w:bottom w:val="single" w:sz="5"/>
-            </w:tcBorders>
-          </w:tcPr>
-          <w:p>
-            <w:pPr>
-              <w:keepNext/>
-              <w:spacing w:after="60" w:before="60" w:line="240" w:lineRule="auto"/>
-              <w:ind w:firstLine="0"/>
-              <w:jc w:val="left"/>
-            </w:pPr>
-            <w:r>
-              <w:rPr>
-                <w:b/>
-                <w:sz w:val="16"/>
-              </w:rPr>
-              <w:t>평가 모델</w:t>
-            </w:r>
-          </w:p>
-        </w:tc>
-        <w:tc>
-          <w:tcPr>
-            <w:tcW w:type="dxa" w:w="1068"/>
-            <w:tcMar>
-              <w:left w:w="45" w:type="dxa"/>
-              <w:right w:w="45" w:type="dxa"/>
-            </w:tcMar>
-            <w:tcBorders>
-              <w:bottom w:val="single" w:sz="5"/>
-            </w:tcBorders>
-          </w:tcPr>
-          <w:p>
-            <w:pPr>
-              <w:keepNext/>
-              <w:spacing w:after="60" w:before="60" w:line="240" w:lineRule="auto"/>
-              <w:ind w:firstLine="0"/>
-              <w:jc w:val="center"/>
-            </w:pPr>
-            <w:r>
-              <w:rPr>
-                <w:b/>
-                <w:sz w:val="16"/>
-              </w:rPr>
-              <w:t>기준 방법</w:t>
-            </w:r>
-          </w:p>
-        </w:tc>
-        <w:tc>
-          <w:tcPr>
-            <w:tcW w:type="dxa" w:w="1068"/>
-            <w:tcMar>
-              <w:left w:w="45" w:type="dxa"/>
-              <w:right w:w="45" w:type="dxa"/>
-            </w:tcMar>
-            <w:tcBorders>
-              <w:bottom w:val="single" w:sz="5"/>
-            </w:tcBorders>
-          </w:tcPr>
-          <w:p>
-            <w:pPr>
-              <w:keepNext/>
-              <w:spacing w:after="60" w:before="60" w:line="240" w:lineRule="auto"/>
-              <w:ind w:firstLine="0"/>
-              <w:jc w:val="center"/>
-            </w:pPr>
-            <w:r>
-              <w:rPr>
-                <w:b/>
-                <w:sz w:val="16"/>
-              </w:rPr>
-              <w:t>유지·삭제</w:t>
-              <w:br/>
-              <w:t>결합</w:t>
-            </w:r>
-          </w:p>
-        </w:tc>
-        <w:tc>
-          <w:tcPr>
-            <w:tcW w:type="dxa" w:w="1068"/>
-            <w:tcMar>
-              <w:left w:w="45" w:type="dxa"/>
-              <w:right w:w="45" w:type="dxa"/>
-            </w:tcMar>
-            <w:tcBorders>
-              <w:bottom w:val="single" w:sz="5"/>
-            </w:tcBorders>
-          </w:tcPr>
-          <w:p>
-            <w:pPr>
-              <w:keepNext/>
-              <w:spacing w:after="60" w:before="60" w:line="240" w:lineRule="auto"/>
-              <w:ind w:firstLine="0"/>
-              <w:jc w:val="center"/>
-            </w:pPr>
-            <w:r>
-              <w:rPr>
-                <w:b/>
-                <w:sz w:val="16"/>
-              </w:rPr>
-              <w:t>판단 불가</w:t>
-              <w:br/>
-              <w:t>기준/결합</w:t>
-            </w:r>
-          </w:p>
-        </w:tc>
-      </w:tr>
-      <w:tr>
-        <w:trPr>
-          <w:cantSplit/>
-        </w:trPr>
-        <w:tc>
-          <w:tcPr>
-            <w:tcW w:type="dxa" w:w="1417"/>
-            <w:tcMar>
-              <w:left w:w="45" w:type="dxa"/>
-              <w:right w:w="45" w:type="dxa"/>
-            </w:tcMar>
-          </w:tcPr>
-          <w:p>
-            <w:pPr>
-              <w:keepNext/>
-              <w:spacing w:after="60" w:before="60" w:line="240" w:lineRule="auto"/>
-              <w:ind w:firstLine="0"/>
-              <w:jc w:val="left"/>
-            </w:pPr>
-            <w:r>
-              <w:rPr>
-                <w:b w:val="0"/>
-                <w:sz w:val="16"/>
-              </w:rPr>
-              <w:t>Qwen2.5-VL-3B</w:t>
-            </w:r>
-          </w:p>
-        </w:tc>
-        <w:tc>
-          <w:tcPr>
-            <w:tcW w:type="dxa" w:w="1068"/>
-            <w:tcMar>
-              <w:left w:w="45" w:type="dxa"/>
-              <w:right w:w="45" w:type="dxa"/>
-            </w:tcMar>
-          </w:tcPr>
-          <w:p>
-            <w:pPr>
-              <w:keepNext/>
-              <w:spacing w:after="60" w:before="60" w:line="240" w:lineRule="auto"/>
-              <w:ind w:firstLine="0"/>
-              <w:jc w:val="center"/>
-            </w:pPr>
-            <w:r>
-              <w:rPr>
-                <w:b w:val="0"/>
-                <w:sz w:val="16"/>
-              </w:rPr>
-              <w:t>350/384</w:t>
-            </w:r>
-          </w:p>
-        </w:tc>
-        <w:tc>
-          <w:tcPr>
-            <w:tcW w:type="dxa" w:w="1068"/>
-            <w:tcMar>
-              <w:left w:w="45" w:type="dxa"/>
-              <w:right w:w="45" w:type="dxa"/>
-            </w:tcMar>
-          </w:tcPr>
-          <w:p>
-            <w:pPr>
-              <w:keepNext/>
-              <w:spacing w:after="60" w:before="60" w:line="240" w:lineRule="auto"/>
-              <w:ind w:firstLine="0"/>
-              <w:jc w:val="center"/>
-            </w:pPr>
-            <w:r>
-              <w:rPr>
-                <w:b w:val="0"/>
-                <w:sz w:val="16"/>
-              </w:rPr>
-              <w:t>358/384</w:t>
-            </w:r>
-          </w:p>
-        </w:tc>
-        <w:tc>
-          <w:tcPr>
-            <w:tcW w:type="dxa" w:w="1068"/>
-            <w:tcMar>
-              <w:left w:w="45" w:type="dxa"/>
-              <w:right w:w="45" w:type="dxa"/>
-            </w:tcMar>
-          </w:tcPr>
-          <w:p>
-            <w:pPr>
-              <w:keepNext/>
-              <w:spacing w:after="60" w:before="60" w:line="240" w:lineRule="auto"/>
-              <w:ind w:firstLine="0"/>
-              <w:jc w:val="center"/>
-            </w:pPr>
-            <w:r>
-              <w:rPr>
-                <w:b w:val="0"/>
-                <w:sz w:val="16"/>
-              </w:rPr>
-              <w:t>20/13</w:t>
-            </w:r>
-          </w:p>
-        </w:tc>
-      </w:tr>
-      <w:tr>
-        <w:trPr>
-          <w:cantSplit/>
-        </w:trPr>
-        <w:tc>
-          <w:tcPr>
-            <w:tcW w:type="dxa" w:w="1417"/>
-            <w:tcMar>
-              <w:left w:w="45" w:type="dxa"/>
-              <w:right w:w="45" w:type="dxa"/>
-            </w:tcMar>
-            <w:tcBorders>
-              <w:bottom w:val="single" w:sz="5"/>
-            </w:tcBorders>
-          </w:tcPr>
-          <w:p>
-            <w:pPr>
-              <w:keepNext w:val="0"/>
-              <w:spacing w:after="60" w:before="60" w:line="240" w:lineRule="auto"/>
-              <w:ind w:firstLine="0"/>
-              <w:jc w:val="left"/>
-            </w:pPr>
-            <w:r>
-              <w:rPr>
-                <w:b w:val="0"/>
-                <w:sz w:val="16"/>
-              </w:rPr>
-              <w:t>Qwen2.5-VL-7B</w:t>
-            </w:r>
-          </w:p>
-        </w:tc>
-        <w:tc>
-          <w:tcPr>
-            <w:tcW w:type="dxa" w:w="1068"/>
-            <w:tcMar>
-              <w:left w:w="45" w:type="dxa"/>
-              <w:right w:w="45" w:type="dxa"/>
-            </w:tcMar>
-            <w:tcBorders>
-              <w:bottom w:val="single" w:sz="5"/>
-            </w:tcBorders>
-          </w:tcPr>
-          <w:p>
-            <w:pPr>
-              <w:keepNext w:val="0"/>
-              <w:spacing w:after="60" w:before="60" w:line="240" w:lineRule="auto"/>
-              <w:ind w:firstLine="0"/>
-              <w:jc w:val="center"/>
-            </w:pPr>
-            <w:r>
-              <w:rPr>
-                <w:b w:val="0"/>
-                <w:sz w:val="16"/>
-              </w:rPr>
-              <w:t>372/384</w:t>
-            </w:r>
-          </w:p>
-        </w:tc>
-        <w:tc>
-          <w:tcPr>
-            <w:tcW w:type="dxa" w:w="1068"/>
-            <w:tcMar>
-              <w:left w:w="45" w:type="dxa"/>
-              <w:right w:w="45" w:type="dxa"/>
-            </w:tcMar>
-            <w:tcBorders>
-              <w:bottom w:val="single" w:sz="5"/>
-            </w:tcBorders>
-          </w:tcPr>
-          <w:p>
-            <w:pPr>
-              <w:keepNext w:val="0"/>
-              <w:spacing w:after="60" w:before="60" w:line="240" w:lineRule="auto"/>
-              <w:ind w:firstLine="0"/>
-              <w:jc w:val="center"/>
-            </w:pPr>
-            <w:r>
-              <w:rPr>
-                <w:b w:val="0"/>
-                <w:sz w:val="16"/>
-              </w:rPr>
-              <w:t>374/384</w:t>
-            </w:r>
-          </w:p>
-        </w:tc>
-        <w:tc>
-          <w:tcPr>
-            <w:tcW w:type="dxa" w:w="1068"/>
-            <w:tcMar>
-              <w:left w:w="45" w:type="dxa"/>
-              <w:right w:w="45" w:type="dxa"/>
-            </w:tcMar>
-            <w:tcBorders>
-              <w:bottom w:val="single" w:sz="5"/>
-            </w:tcBorders>
-          </w:tcPr>
-          <w:p>
-            <w:pPr>
-              <w:keepNext w:val="0"/>
-              <w:spacing w:after="60" w:before="60" w:line="240" w:lineRule="auto"/>
-              <w:ind w:firstLine="0"/>
-              <w:jc w:val="center"/>
-            </w:pPr>
-            <w:r>
-              <w:rPr>
-                <w:b w:val="0"/>
-                <w:sz w:val="16"/>
-              </w:rPr>
-              <w:t>0/0</w:t>
-            </w:r>
-          </w:p>
-        </w:tc>
-      </w:tr>
-    </w:tbl>
-    <w:p>
-      <w:pPr>
-        <w:jc w:val="both"/>
-      </w:pPr>
-      <w:r>
-        <w:t>표 7은 각 방법의 64조건에서 여섯 목표를 평가한 결과이다. 3B에서 증가한 성공 항목 8개 중 6개는 판단 불가에서, 2개는 실패에서 바뀌었다. 7B에서도 설명과 점수가 모순된 응답이 있었다. 두 평가 모두 실패에서 성공으로 바뀐 항목은 R02의 배경 한 개였다. 얼굴 코사인 평균은 기준 0.910458, 결합 0.910535였으며, 입력이 다른 네 쌍 중 두 쌍은 증가하고 두 쌍은 감소하였다.</w:t>
-      </w:r>
-    </w:p>
-    <w:p>
-      <w:pPr>
-        <w:pStyle w:val="Heading2"/>
-      </w:pPr>
-      <w:r>
-        <w:t>6. 프롬프트 구성에 따른 길이와 편집 목표 충족</w:t>
-      </w:r>
-    </w:p>
-    <w:p>
-      <w:pPr>
-        <w:jc w:val="both"/>
-      </w:pPr>
-      <w:r>
-        <w:t>세 대화의 마지막 요청에서 프롬프트 길이는 표 8과 같다. 지시 검사 후 조건은 전체 이력보다 평균 39.87% 짧았다. 중간 요청을 포함한 12개 묶음의 평균은 전체 이력 168.75토큰, 검사 후 조건 129.25토큰이었다. 첫 요청에서는 항목을 명시한 상태 표현이 더 길었고, 두 번째 요청부터 세 대화 모두 현재 조건 표현이 짧았다.</w:t>
-      </w:r>
-    </w:p>
-    <w:p>
-      <w:pPr>
-        <w:pStyle w:val="Caption"/>
-        <w:keepNext/>
-        <w:spacing w:before="100"/>
-        <w:ind w:firstLine="0"/>
-        <w:jc w:val="center"/>
-      </w:pPr>
-      <w:r>
-        <w:t>표 8. 최종 프롬프트의 평균 길이</w:t>
+        <w:t>표 4. 최종 프롬프트의 평균 길이</w:t>
       </w:r>
     </w:p>
     <w:tbl>
@@ -6122,7 +3568,9 @@
                 <w:b w:val="0"/>
                 <w:sz w:val="16"/>
               </w:rPr>
-              <w:t>검사 전 현재 조건</w:t>
+              <w:t>검사 없이 저장한</w:t>
+              <w:br/>
+              <w:t>조건</w:t>
             </w:r>
           </w:p>
         </w:tc>
@@ -6226,7 +3674,9 @@
                 <w:b w:val="0"/>
                 <w:sz w:val="16"/>
               </w:rPr>
-              <w:t>지시 검사 후 현재 조건</w:t>
+              <w:t>검사 후 저장한</w:t>
+              <w:br/>
+              <w:t>조건</w:t>
             </w:r>
           </w:p>
         </w:tc>
@@ -6318,7 +3768,7 @@
         <w:jc w:val="both"/>
       </w:pPr>
       <w:r>
-        <w:t>18개 생성 이미지의 목표 충족 평가는 표 9와 같다. 각 방식의 분모 36은 인물 두 명·대화 세 개의 이미지 여섯 장에서 여섯 목표를 평가한 항목 수이다.</w:t>
+        <w:t>표 5는 세 입력 방식으로 생성한 18장의 편집 목표 충족 판정이다. 각 방식의 분모 36은 인물 두 명과 대화 세 개의 이미지 여섯 장에서 여섯 목표를 평가한 항목 수이다. 7B 평가에서 검사 후 조건은 전체 이력보다 성공 항목이 두 개 많았고, 검사 없이 저장한 조건보다 열두 개 많았다.</w:t>
       </w:r>
     </w:p>
     <w:p>
@@ -6330,7 +3780,7 @@
         <w:jc w:val="center"/>
       </w:pPr>
       <w:r>
-        <w:t>표 9. 후속 이미지의 AI 목표 충족 평가</w:t>
+        <w:t>표 5. 생성 이미지의 편집 목표 충족 평가</w:t>
       </w:r>
     </w:p>
     <w:tbl>
@@ -6636,7 +4086,9 @@
                 <w:b w:val="0"/>
                 <w:sz w:val="16"/>
               </w:rPr>
-              <w:t>검사 전 현재 조건</w:t>
+              <w:t>검사 없이 저장한</w:t>
+              <w:br/>
+              <w:t>조건</w:t>
             </w:r>
           </w:p>
         </w:tc>
@@ -6764,7 +4216,9 @@
                 <w:b w:val="0"/>
                 <w:sz w:val="16"/>
               </w:rPr>
-              <w:t>지시 검사 후 현재 조건</w:t>
+              <w:t>검사 후 저장한</w:t>
+              <w:br/>
+              <w:t>조건</w:t>
             </w:r>
           </w:p>
         </w:tc>
@@ -6883,7 +4337,23 @@
         <w:jc w:val="both"/>
       </w:pPr>
       <w:r>
-        <w:t>3B 평가에는 형식 오류 5개가 있었으며, 회색 스웨터와 금색 핀을 흰 상의·핀 없음으로 설명한 응답도 있었다. 7B 사후 평가는 전체 이력 34/36, 검사 전 조건 24/36, 검사 후 조건 36/36이었다. 두 평가의 전체 점수 일치는 75/108, 양쪽이 성공·실패를 반환한 항목의 일치는 73/78이었다.</w:t>
+        <w:t>3B 평가에는 형식 오류 5개와, 회색 스웨터·금색 핀을 흰 상의·핀 없음으로 설명한 사례가 있었다. 3B와 7B의 전체 점수 일치는 75/108, 양쪽이 성공·실패를 반환한 항목의 일치는 73/78이었다. 표 5는 이 판독 차이를 포함한 두 평가의 결과를 제시한다.</w:t>
+      </w:r>
+    </w:p>
+    <w:p>
+      <w:pPr>
+        <w:pStyle w:val="Heading2"/>
+      </w:pPr>
+      <w:r>
+        <w:t>5. 얼굴 보존과 생성 사례</w:t>
+      </w:r>
+    </w:p>
+    <w:p>
+      <w:pPr>
+        <w:jc w:val="both"/>
+      </w:pPr>
+      <w:r>
+        <w:t>후속 이미지 18장에서 얼굴은 모두 하나씩 검출되었다. 표 6은 각 방식의 첫 출력 여섯 장에 대한 얼굴 지표 평균이다. 검사 후 조건은 검사 없이 저장한 조건보다 코사인과 SSIM, LPIPS가 유리하고 MAE는 불리하였다. 전체 이력과 비교하면 코사인은 높았으나 MAE, SSIM, LPIPS는 불리하였다.</w:t>
       </w:r>
     </w:p>
     <w:p>
@@ -6895,7 +4365,7 @@
         <w:jc w:val="center"/>
       </w:pPr>
       <w:r>
-        <w:t>표 10. 후속 이미지의 원본 대비 얼굴 지표</w:t>
+        <w:t>표 6. 생성 이미지의 원본 대비 얼굴 지표</w:t>
       </w:r>
     </w:p>
     <w:tbl>
@@ -7203,7 +4673,9 @@
                 <w:b w:val="0"/>
                 <w:sz w:val="16"/>
               </w:rPr>
-              <w:t>검사 전 현재 조건</w:t>
+              <w:t>검사 없이 저장한</w:t>
+              <w:br/>
+              <w:t>조건</w:t>
             </w:r>
           </w:p>
         </w:tc>
@@ -7331,7 +4803,9 @@
                 <w:b w:val="0"/>
                 <w:sz w:val="16"/>
               </w:rPr>
-              <w:t>지시 검사 후 현재 조건</w:t>
+              <w:t>검사 후 저장한</w:t>
+              <w:br/>
+              <w:t>조건</w:t>
             </w:r>
           </w:p>
         </w:tc>
@@ -7447,14 +4921,6 @@
     </w:tbl>
     <w:p>
       <w:pPr>
-        <w:jc w:val="both"/>
-      </w:pPr>
-      <w:r>
-        <w:t>모든 출력에서 얼굴이 하나씩 검출되었다. 검사 후 조건은 검사 전 조건보다 얼굴 코사인·SSIM·LPIPS 평균이 유리하고 MAE는 불리하였다. 전체 이력과 비교하면 코사인은 높았으나 MAE·SSIM·LPIPS는 불리하였다. 표 10은 조건당 첫 출력 한 장을 사용한 여섯 대응 사례의 평균이다.</w:t>
-      </w:r>
-    </w:p>
-    <w:p>
-      <w:pPr>
         <w:spacing w:after="0" w:before="0" w:line="20" w:lineRule="exact"/>
         <w:sectPr>
           <w:type w:val="continuous"/>
@@ -7467,14 +4933,6 @@
     </w:p>
     <w:p>
       <w:pPr>
-        <w:pStyle w:val="Heading2"/>
-      </w:pPr>
-      <w:r>
-        <w:t>7. 조건문과 인용문을 포함한 편집 사례</w:t>
-      </w:r>
-    </w:p>
-    <w:p>
-      <w:pPr>
         <w:keepNext/>
         <w:spacing w:line="240" w:lineRule="auto"/>
         <w:ind w:firstLine="0"/>
@@ -7484,7 +4942,7 @@
         <w:drawing>
           <wp:inline xmlns:a="http://schemas.openxmlformats.org/drawingml/2006/main" xmlns:pic="http://schemas.openxmlformats.org/drawingml/2006/picture">
             <wp:extent cx="5760000" cy="3072000"/>
-            <wp:docPr id="2" name="Picture 2" descr="그림 2 전체 요청 이력, 검사 전 조건, 지시 검사 후 조건의 생성 결과"/>
+            <wp:docPr id="3" name="Picture 3" descr="그림 3 전체 요청 이력과 저장한 편집 조건에 따른 생성 결과"/>
             <wp:cNvGraphicFramePr>
               <a:graphicFrameLocks noChangeAspect="1"/>
             </wp:cNvGraphicFramePr>
@@ -7496,7 +4954,7 @@
                     <pic:cNvPicPr/>
                   </pic:nvPicPr>
                   <pic:blipFill>
-                    <a:blip r:embed="rId10"/>
+                    <a:blip r:embed="rId11"/>
                     <a:stretch>
                       <a:fillRect/>
                     </a:stretch>
@@ -7521,7 +4979,7 @@
         <w:ind w:firstLine="0"/>
       </w:pPr>
       <w:r>
-        <w:t>그림 2 전체 요청 이력, 검사 전 조건, 지시 검사 후 조건의 생성 결과</w:t>
+        <w:t>그림 3 전체 요청 이력과 저장한 편집 조건에 따른 생성 결과</w:t>
       </w:r>
     </w:p>
     <w:p>
@@ -7541,7 +4999,7 @@
         <w:jc w:val="both"/>
       </w:pPr>
       <w:r>
-        <w:t>그림 2는 조건부 지시와 인용문을 포함한 대화를 R02에 적용한 예이다. 목표는 녹색 재킷, 원래 흰 상의, 파란 핀, 목걸이 없음, 도서관과 돌 벤치이다. 검사 전 조건에는 인용문의 재킷 복원과 조건부 벤치 삭제가 남아 있었다. 검사 후에는 직접 지시만 반영하였다. 표 8–10의 집계는 이 예와 나머지 두 대화를 모두 포함한다.</w:t>
+        <w:t>그림 3은 조건문과 인용문을 포함한 대화를 R02에 적용한 예이다. 목표는 녹색 재킷, 파란 핀, 도서관과 돌 벤치를 적용하고 상의와 목걸이를 최초 사진의 모습으로 복원하는 것이다. 원본에는 흰 상의가 있고 목걸이는 없다. 검사 없이 저장한 조건에는 인용문의 재킷 복원과 조건부 벤치 삭제가 반영되었다. 검사 후에는 녹색 재킷과 벤치를 유지하였다. 표 4~6은 이 예와 나머지 두 대화를 모두 포함한다.</w:t>
       </w:r>
     </w:p>
     <w:p>
@@ -7557,7 +5015,7 @@
         <w:pStyle w:val="Heading2"/>
       </w:pPr>
       <w:r>
-        <w:t>1. 편집 상태 갱신에서 지시 검사의 역할</w:t>
+        <w:t>1. 추출값의 저장과 오류의 전파</w:t>
       </w:r>
     </w:p>
     <w:p>
@@ -7565,7 +5023,7 @@
         <w:jc w:val="both"/>
       </w:pPr>
       <w:r>
-        <w:t>전체 상태 일치율의 차이는 언어 모델이 추출한 값과 이를 저장하는 절차를 함께 설계해야 함을 보여준다. 동일한 첫 응답을 사용했을 때 Qwen3는 52/96에서 96/96, Llama는 27/96에서 93/96으로 높아졌다. 따라서 이 비교에서 얻은 개선은 더 많은 모델 응답을 생성한 결과보다, 추출값에 지시 검사를 적용한 효과로 볼 수 있다. 특히 항목을 바꾸는 동작과 그대로 두는 동작이 함께 등장하는 요청에서 적용 대상을 구분하는 처리가 중요하였다.</w:t>
+        <w:t>반복 편집에서는 한 요청의 잘못된 값이 다음 요청의 시작 상태가 된다. 이후 요청이 다른 항목만 바꾸면 이전 오류는 그대로 남는다. 이 때문에 전체 상태 정확도는 개별 요청의 추출 성능뿐 아니라 변경값을 채택하고 보존하는 절차에 영향을 받는다. 동일한 최초 응답을 사용한 주 비교는 값 검증과 지시 검사가 이러한 저장 오류를 줄였음을 보여준다.</w:t>
       </w:r>
     </w:p>
     <w:p>
@@ -7573,7 +5031,7 @@
         <w:jc w:val="both"/>
       </w:pPr>
       <w:r>
-        <w:t>유지와 복원은 모두 이전 정보를 참조하지만, 참조하는 시점이 다르다. 유지는 직전에 저장된 값을, 원본 복원은 최초 사진의 모습을 참조한다. 유지 규칙을 넓게 적용하면 잘못 저장된 값도 그대로 남고, 복원 대상을 넓게 잡으면 유지할 항목까지 원본으로 바뀐다. 구성요소 검증에서 관찰한 오류는 이러한 동작을 하나의 값 변경으로 묶기보다, 동작과 대상의 조합으로 처리할 필요가 있음을 보여준다.</w:t>
+        <w:t>유지와 원본 복원은 참조하는 시점이 다르다. 저장된 배경을 유지할 것인지 최초 사진의 배경으로 되돌릴 것인지를 구분하지 않으면, 유효한 속성값을 반환하더라도 잘못된 결과가 된다. 따라서 허용값 검사에 더해 동작과 대상의 관계를 확인해야 한다. 반대로 직전 값 자체가 틀렸다면 유지 규칙은 그 오류도 보존한다. 구성요소 비교의 사례들은 동작의 올바른 해석과 이전 상태의 정확성이 함께 필요함을 보여준다.</w:t>
       </w:r>
     </w:p>
     <w:p>
@@ -7581,7 +5039,7 @@
         <w:jc w:val="both"/>
       </w:pPr>
       <w:r>
-        <w:t>응답의 재검토도 같은 관점에서 해석할 수 있다. Qwen3에서는 첫 응답과 재검토에 검사를 적용한 결과가 모두 96/96이었지만, Llama에서는 각각 93/96과 44/96이었다. 재검토 응답에서 일부 초기 설정이 누락되면 이후 요청이 다른 항목을 바꾸더라도 빠진 값은 회복되지 않을 수 있다. 첫 응답과 코드 검사를 결합하는 구성은 이런 응답 교체를 줄이면서 요청당 한 번의 모델 호출로 상태를 갱신한다.</w:t>
+        <w:t>재검토는 응답을 교체하는 과정이므로 이미 맞은 항목을 잃을 가능성도 있다. 특히 초기 설정이 누락되면 이후 대화의 여러 요청이 영향을 받는다. 본 실험에서 최초 응답에 검사를 적용하는 방식이 Llama의 두 번 호출 조건보다 높은 정확도를 보인 것은, 호출 횟수의 증가가 상태 보존을 보장하지 않음을 보여준다. 다만 이는 본 연구의 한 차례 재검토 지침과 응답 선택 절차에서 얻은 결과이다.</w:t>
       </w:r>
     </w:p>
     <w:p>
@@ -7589,7 +5047,7 @@
         <w:pStyle w:val="Heading2"/>
       </w:pPr>
       <w:r>
-        <w:t>2. 프롬프트 간결화와 생성 이미지의 관계</w:t>
+        <w:t>2. 상태 정확도와 이미지 생성의 관계</w:t>
       </w:r>
     </w:p>
     <w:p>
@@ -7597,7 +5055,7 @@
         <w:jc w:val="both"/>
       </w:pPr>
       <w:r>
-        <w:t>원본 기반 재생성에서는 현재 유효한 조건을 모두 전달해야 한다. 전체 요청 이력은 변경 과정을 보존하는 반면, 현재 조건은 그 과정에서 취소되거나 대체된 값을 제외한다. 세 대화의 마지막 프롬프트 길이는 전체 이력 평균 204.00토큰에서 지시 검사 후 122.67토큰으로 39.87% 감소하였다. 첫 요청에서는 상태를 명시하는 문장이 더 길었으나 요청이 누적된 이후에는 현재 조건을 전달하는 방식이 짧았다. 입력 길이의 이점은 대화 이력의 축적과 함께 나타난 결과이다.</w:t>
+        <w:t>현재 조건을 저장하면 이미 취소되거나 대체된 값을 입력에서 제외할 수 있다. 프롬프트가 짧아지는 시점은 앞선 요청이 누적된 이후였으며, 첫 요청에서는 항목을 명시하는 문장이 오히려 더 길었다. 따라서 입력 길이 감소는 상태 표현 자체의 길이와 전체 이력의 증가가 함께 작용한 결과이다.</w:t>
       </w:r>
     </w:p>
     <w:p>
@@ -7605,7 +5063,7 @@
         <w:jc w:val="both"/>
       </w:pPr>
       <w:r>
-        <w:t>생성 이미지의 목표 충족은 프롬프트 길이와 별도로 해석해야 한다. 7B 평가의 성공 항목은 전체 이력 34/36, 검사 전 조건 24/36, 검사 후 조건 36/36이었다. 검사 전 조건이 더 짧으면서도 성공 항목이 적었다는 점은, 문장을 줄이는 것만으로 편집 요구가 정확해지지는 않음을 보여준다. 이 비교에서 현재 조건의 정확성을 확보하는 과정이 입력 간결화와 함께 작용하였다.</w:t>
+        <w:t>검사 없이 저장한 조건도 전체 이력보다 짧았지만 편집 목표의 성공 항목은 더 적었다. 이는 프롬프트를 간결하게 만드는 과정에서 잘못된 상태를 전달하면, 짧은 입력이 요청 충족으로 이어지지 않음을 보여준다. 제안 방법에서 지시 검사는 간결하게 전달할 조건의 정확성을 확보하는 역할을 한다.</w:t>
       </w:r>
     </w:p>
     <w:p>
@@ -7613,7 +5071,7 @@
         <w:jc w:val="both"/>
       </w:pPr>
       <w:r>
-        <w:t>얼굴 보존 지표는 다른 양상을 보였다. 검사 후 조건의 얼굴 코사인 평균은 전체 이력보다 높았지만, 정렬 MAE·SSIM·LPIPS는 전체 이력에 유리하였다. 얼굴 특징의 유사도와 픽셀·구조 차이는 서로 다른 측정값이다. 따라서 본 실험은 지시 검사에 따른 상태 정확도와 프롬프트 길이의 개선을 뒷받침하며, 얼굴 보존의 변화는 각 지표의 방향을 함께 제시하는 것이 적절하다.</w:t>
+        <w:t>얼굴 보존은 또 다른 측정 대상이다. 전체 이력과 검사 후 조건의 비교에서 얼굴 코사인과 MAE, SSIM, LPIPS는 서로 다른 방향을 보였다. 얼굴 코사인은 특징의 유사도, MAE는 픽셀 오차, SSIM과 LPIPS는 구조 및 지각적 차이를 측정하므로 각 지표의 방향을 함께 해석해야 한다. 초기 실험은 입력 이미지 선택의 근거이고, 후속 실험은 같은 원본에 전달하는 조건의 비교이다. 두 결과를 함께 보면 원본 재사용, 상태 정확도, 생성 이미지의 특성을 각각 평가해야 한다.</w:t>
       </w:r>
     </w:p>
     <w:p>
@@ -7621,7 +5079,7 @@
         <w:pStyle w:val="Heading2"/>
       </w:pPr>
       <w:r>
-        <w:t>3. 자료 구성과 결과의 적용 범위</w:t>
+        <w:t>3. 적용 범위와 평가의 해석</w:t>
       </w:r>
     </w:p>
     <w:p>
@@ -7629,7 +5087,7 @@
         <w:jc w:val="both"/>
       </w:pPr>
       <w:r>
-        <w:t>96개 요청은 네 가지 표현 틀에 속성 조합과 중간 지시 순서를 달리한 합성 영어 대화이다. 대화마다 여덟 요청을 이어서 적용하므로 앞선 상태 오류가 후속 결과에 미치는 영향까지 포함한다. 대화 단위로 계산한 구간과 대응 검정은 이러한 자료 구성 안에서 관찰된 정확도 차이를 나타낸다. 속성값과 동작의 조합을 통제한 검증이라는 점에서, 임의의 사용자 발화를 표집한 실험과 구분된다.</w:t>
+        <w:t>상태 갱신 평가는 여섯 항목과 네 가지 표현 틀로 구성한 합성 영어 대화를 대상으로 하였다. 요청마다 속성 조합과 지시 순서를 바꾸었지만 문장 구조는 공유한다. 따라서 대화 단위 구간과 검정은 이 자료에서의 방법 간 차이를 나타낸다. 조건문 보류와 직전 값 유지도 사전에 정의한 정책이다. 이 점수는 사전에 정의한 실행 정책에 따라 항목값을 갱신하고 보존하는지를 나타낸다.</w:t>
       </w:r>
     </w:p>
     <w:p>
@@ -7637,7 +5095,7 @@
         <w:jc w:val="both"/>
       </w:pPr>
       <w:r>
-        <w:t>Llama의 세 오류는 인용문 뒤에 나온 원본 복원 표현에서 발생하였다. 잘못된 색 변경을 거부했더라도 복원 지시를 인식하지 못하면 직전 값이 남는다. 복원 표현 확장 전의 0/8과 재검토 응답의 초기 설정 오류가 이어진 0/16도 어휘 범위와 응답 선택이 결과에 미치는 영향을 보여준다. 지정한 여섯 항목과 지원 문형, 조건문·인용문을 실행하지 않는 처리 정책이 본 구현의 범위를 이룬다.</w:t>
+        <w:t>Llama의 최종 세 오류는 추출값 검사가 잘못된 변경을 막은 뒤에도, 지원 문형에 포함되지 않은 복원 표현을 처리하지 못해 정답 상태에 도달하지 못한 사례이다. 이처럼 검사의 효과는 지원 어휘, 구절 분리, 지시 우선순위의 구현 범위에 의해 결정된다. 실험은 이 범위에서 같은 모델 응답을 어떻게 저장하는지가 정확도에 미치는 영향을 확인하였다.</w:t>
       </w:r>
     </w:p>
     <w:p>
@@ -7645,7 +5103,7 @@
         <w:jc w:val="both"/>
       </w:pPr>
       <w:r>
-        <w:t>이미지 비교는 실제 인물 두 명과 세 대화에서 조건별 첫 출력 한 장을 사용한 여섯 대응 사례이다. 생성 도구의 내부 버전과 시드는 노출되지 않았으며, 얼굴 지표는 이 출력들의 기술통계이다. 또한 AI 평가에서는 형식 오류와 설명·점수 불일치가 관찰되었다. 이에 요청 해석의 정답 대조, 이미지의 목표 충족 판정, 얼굴 보존 지표를 구분하고 각각의 원자료와 판정 근거를 제시하였다.</w:t>
+        <w:t>실제 인물 비교는 두 사진과 세 대화의 여섯 대응 사례에 대한 첫 출력이다. AI 평가의 형식 오류와 설명·점수 불일치, 얼굴 지표 간 차이를 함께 관찰하였다. 따라서 생성 결과는 상태 갱신 방법을 이미지 편집에 적용한 사례와 기술통계로 해석한다. 연구의 직접적인 근거는 정답 상태와의 비교이며, 이미지 결과는 그 조건을 전달했을 때 나타난 변화를 설명한다.</w:t>
       </w:r>
     </w:p>
     <w:p>
@@ -7661,7 +5119,7 @@
         <w:jc w:val="both"/>
       </w:pPr>
       <w:r>
-        <w:t>본 연구는 반복 인물 이미지 편집에서 현재 유효한 편집 조건을 항목별로 저장하고, 언어 모델이 한 번 추출한 변경 사항에 지시 검사를 적용하는 방법을 제안하였다. 삭제는 대상의 부재로, 원본 복원은 최초 사진의 모습으로, 유지는 직전 값의 보존으로 구분하였다. 지시 구절의 분리와 부정·조건·인용 범위 검사로 각 동작의 적용 대상을 정하고, 갱신된 상태를 원본 사진에 적용할 프롬프트로 변환하였다.</w:t>
+        <w:t>본 연구는 반복 인물 이미지 편집에서 언어 모델의 변경값 추출과 코드에 의한 상태 갱신을 분리하는 방법을 제안하였다. 추출값의 유효성과 삭제·복원·유지의 적용 대상을 검사하고, 실행할 지시를 구분하여 항목별 상태를 갱신하였다. 갱신한 조건은 최초 사진에 적용할 프롬프트로 변환하였다.</w:t>
       </w:r>
     </w:p>
     <w:p>
@@ -7669,7 +5127,7 @@
         <w:jc w:val="both"/>
       </w:pPr>
       <w:r>
-        <w:t>새 합성 요청 96개에서 첫 응답 단순 적용과 제안 방법의 전체 상태 일치는 Qwen3 52/96과 96/96, Llama 27/96과 93/96이었다. 같은 추출 응답을 사용한 비교에서 지시 검사의 효과를 확인하였으며, 제안 방법은 상태 갱신에 요청당 한 번의 모델 호출을 사용하였다. Llama의 복원 표현 오류 세 개와 재검토 조건의 상태 누락은 코드의 어휘 처리와 응답 선택이 정확도에 영향을 주는 사례였다.</w:t>
+        <w:t>새 합성 요청 96개에서 동일한 최초 응답을 단순 적용한 방법과 비교한 전체 상태 일치는 Qwen3 52/96에서 96/96, Llama 27/96에서 93/96으로 증가하였다. 요청당 한 번의 모델 호출을 사용하면서, 정의한 상태 갱신 정책에 대한 정확도를 높였다. 실제 인물 사진을 이용한 비교에서는 전체 요청 이력 대신 검사 후 저장한 조건을 전달하여 마지막 프롬프트의 평균 길이를 204.00토큰에서 122.67토큰으로 줄였다.</w:t>
       </w:r>
     </w:p>
     <w:p>
@@ -7677,7 +5135,7 @@
         <w:jc w:val="both"/>
       </w:pPr>
       <w:r>
-        <w:t>실제 인물 두 명의 생성 이미지 18장에서는 마지막 프롬프트 길이가 평균 204.00토큰에서 122.67토큰으로 감소하였고, 7B 평가의 목표 충족 수는 전체 이력 34/36에서 지시 검사 후 조건 36/36으로 높아졌다. 얼굴 보존 지표의 변화 방향은 측정 항목에 따라 달랐다. 이 결과는 원본 사진을 재사용하는 반복 편집에서, 변경 요청의 단순 축약과 함께 삭제·복원·유지의 의미를 보존하는 상태 갱신이 필요함을 보여준다.</w:t>
+        <w:t>이 결과는 반복 편집 시스템에서 변경값을 추출한 뒤 어떤 조건을 보존하고 실행할지 검사하는 절차의 필요성을 보여준다. 편집 항목을 명시적으로 저장하고 지시의 동작·대상·적용 범위를 함께 확인하는 구성이, 누적 요청으로부터 현재 편집 조건을 만드는 구현 방법이 될 수 있다.</w:t>
       </w:r>
     </w:p>
     <w:p>
@@ -7808,23 +5266,11 @@
         <w:t>[12] S. Bai et al., “Qwen2.5-VL Technical Report,” arXiv:2502.13923, 2025. https://arxiv.org/abs/2502.13923</w:t>
       </w:r>
     </w:p>
-    <w:p>
-      <w:pPr>
-        <w:spacing w:after="0" w:before="0" w:line="20" w:lineRule="exact"/>
-        <w:sectPr>
-          <w:type w:val="continuous"/>
-          <w:pgSz w:w="11906" w:h="16838"/>
-          <w:pgMar w:top="1134" w:right="1134" w:bottom="1134" w:left="1134" w:header="720" w:footer="720" w:gutter="0"/>
-          <w:cols w:space="397" w:num="2"/>
-          <w:docGrid w:linePitch="360"/>
-        </w:sectPr>
-      </w:pPr>
-    </w:p>
     <w:sectPr>
       <w:type w:val="continuous"/>
       <w:pgSz w:w="11906" w:h="16838"/>
       <w:pgMar w:top="1134" w:right="1134" w:bottom="1134" w:left="1134" w:header="720" w:footer="720" w:gutter="0"/>
-      <w:cols w:space="397" w:num="1"/>
+      <w:cols w:space="397" w:num="2"/>
       <w:docGrid w:linePitch="360"/>
     </w:sectPr>
   </w:body>

</xml_diff>